<commit_message>
adding half 2 parts
</commit_message>
<xml_diff>
--- a/Диплом мешков 23.106.docx
+++ b/Диплом мешков 23.106.docx
@@ -1199,67 +1199,22 @@
     </w:p>
     <w:p>
       <w:r>
-        <w:t>Развитие цифровых технологий и веб-приложений открывает новые возможности для создания инструментов, способных помогать пользователям в формулировании целей, их структурировании и поэтапной реализации как в индивидуальном, так и в командном режимах. Именно поэтому разработка программных решений, ориентированных на поддержку планирования и управления задачами, представляет собой актуальное направление в области информационных технологий.</w:t>
-      </w:r>
-    </w:p>
-    <w:p>
-      <w:r>
-        <w:t>Основная идея приложения заключается в создании инструмента, позволяющего вводить цель в свободной текстовой форме и получать структурированное представление возможных этапов её достижения. Предполагается, что система сможет формировать набор промежуточных шагов и подзадач, которые пользователь сможет просматривать, редактировать и адаптировать под собственные потребности.</w:t>
+        <w:t xml:space="preserve">Развитие цифровых технологий и веб-приложений открывает новые возможности для создания инструментов, способных помогать пользователям в формулировании целей, их структурировании и поэтапной реализации как в индивидуальном, так и в командном режимах. </w:t>
+      </w:r>
+    </w:p>
+    <w:p>
+      <w:r>
+        <w:t>Основная идея приложения заключается в создании инструмента, позволяющего вводить цель в свободной текстовой форме и получать структурированное представление возможных этапов её достижения с возможностью последующего ручного редактирования. Для реализации коллективного взаимодействия предусмотрены механизмы создания команд, общих списков задач и обмена планами между участниками, а также встроенные чаты для коммуникации в контексте текущих проектов.</w:t>
       </w:r>
       <w:r>
         <w:t xml:space="preserve"> </w:t>
       </w:r>
       <w:r>
-        <w:t xml:space="preserve">Гибкость редактирования является </w:t>
+        <w:t xml:space="preserve">Функциональность приложения охватывает регистрацию и аутентификацию пользователей, интерфейс ввода и декомпозиции целей, отслеживание прогресса и визуализацию </w:t>
       </w:r>
       <w:r>
         <w:lastRenderedPageBreak/>
-        <w:t>ключевым требованием, поскольку автоматически сгенерированные рекомендации не всегда полностью соответствуют индивидуальным предпочтениям или специфике конкретной ситуации.</w:t>
-      </w:r>
-      <w:r>
-        <w:t xml:space="preserve"> Такой подход ориентирован на поддержку процесса планирования и упрощение работы с крупными и абстрактными задачами. Для реализации коллективного взаимодействия в приложении </w:t>
-      </w:r>
-      <w:r>
-        <w:t>необходимы</w:t>
-      </w:r>
-      <w:r>
-        <w:t xml:space="preserve"> механизмы создания команд, формирования общих списков задач, а также возможность делиться личными планами с другими участниками, копировать их для последующей адаптации и самостоятельного редактирования. Коммуникация между пользователями обеспечивается средствами личных и командных чатов, что позволяет обсуждать ход выполнения задач непосредственно в контексте совместной работы.</w:t>
-      </w:r>
-    </w:p>
-    <w:p>
-      <w:r>
-        <w:t>В приложении планируется реализовать функции регистрации и аутентификации пользователей, интерфейс для ввода целей и редактирования плана действий, средства отслеживания прогресса выполнения задач и базовые элементы визуализации структуры целей.</w:t>
-      </w:r>
-      <w:r>
-        <w:t xml:space="preserve"> Такой набор функций позволяет охватить ключевые этапы работы с целями: от первичного формулирования и декомпозиции до контроля исполнения и анализа достигнутых результатов. При этом визуализация структуры целей способствует более целостному восприятию задачи и позволяет пользователю видеть связи между отдельными этапами, что особенно важно при работе со сложными многоуровневыми планами.</w:t>
-      </w:r>
-      <w:r>
-        <w:t xml:space="preserve"> </w:t>
-      </w:r>
-      <w:r>
-        <w:t xml:space="preserve">Для обеспечения удобного доступа </w:t>
-      </w:r>
-      <w:r>
-        <w:t>к функциям</w:t>
-      </w:r>
-      <w:r>
-        <w:t xml:space="preserve"> и наглядного представления информации о текущей деятельности пользователя в приложении предусмотрены отдельные страницы, соответствующие различным функциональным областям, что позволяет структурировать взаимодействие с системой и обеспечить интуитивно понятную навигацию. Для формирования предложений по декомпозиции целей предполагается использование</w:t>
-      </w:r>
-      <w:r>
-        <w:t xml:space="preserve"> </w:t>
-      </w:r>
-      <w:r>
-        <w:t>внешних языковых сервисов, доступ к которым осуществляется через специализированный программный интерфейс.</w:t>
-      </w:r>
-      <w:r>
-        <w:t xml:space="preserve"> </w:t>
-      </w:r>
-      <w:r>
-        <w:t xml:space="preserve">При этом система рассматривается как инструмент поддержки </w:t>
-      </w:r>
-      <w:r>
-        <w:lastRenderedPageBreak/>
-        <w:t>пользователя и формирования ориентировочных рекомендаций, которые могут служить отправной точкой для дальнейшего самостоятельного планирования.</w:t>
+        <w:t>структуры задач. Для генерации рекомендаций по декомпозиции предполагается использование внешних языковых сервисов через специализированный программный интерфейс. При этом система позиционируется как вспомогательный инструмент, формирующий ориентировочный план, который пользователь может адаптировать под индивидуальные потребности.</w:t>
       </w:r>
     </w:p>
     <w:p>
@@ -1272,10 +1227,10 @@
         <w:pStyle w:val="a4"/>
         <w:numPr>
           <w:ilvl w:val="0"/>
-          <w:numId w:val="2"/>
+          <w:numId w:val="5"/>
         </w:numPr>
         <w:spacing w:after="0" w:line="360" w:lineRule="auto"/>
-        <w:ind w:left="0" w:firstLine="709"/>
+        <w:ind w:left="11" w:firstLine="698"/>
         <w:rPr>
           <w:rFonts w:ascii="Times New Roman" w:hAnsi="Times New Roman"/>
         </w:rPr>
@@ -1292,10 +1247,10 @@
         <w:pStyle w:val="a4"/>
         <w:numPr>
           <w:ilvl w:val="0"/>
-          <w:numId w:val="2"/>
+          <w:numId w:val="5"/>
         </w:numPr>
         <w:spacing w:after="0" w:line="360" w:lineRule="auto"/>
-        <w:ind w:left="0" w:firstLine="709"/>
+        <w:ind w:left="11" w:firstLine="698"/>
         <w:rPr>
           <w:rFonts w:ascii="Times New Roman" w:hAnsi="Times New Roman"/>
         </w:rPr>
@@ -1312,10 +1267,10 @@
         <w:pStyle w:val="a4"/>
         <w:numPr>
           <w:ilvl w:val="0"/>
-          <w:numId w:val="2"/>
+          <w:numId w:val="5"/>
         </w:numPr>
         <w:spacing w:after="0" w:line="360" w:lineRule="auto"/>
-        <w:ind w:left="0" w:firstLine="709"/>
+        <w:ind w:left="11" w:firstLine="698"/>
         <w:rPr>
           <w:rFonts w:ascii="Times New Roman" w:hAnsi="Times New Roman"/>
         </w:rPr>
@@ -1332,10 +1287,10 @@
         <w:pStyle w:val="a4"/>
         <w:numPr>
           <w:ilvl w:val="0"/>
-          <w:numId w:val="2"/>
+          <w:numId w:val="5"/>
         </w:numPr>
         <w:spacing w:after="0" w:line="360" w:lineRule="auto"/>
-        <w:ind w:left="0" w:firstLine="709"/>
+        <w:ind w:left="11" w:firstLine="698"/>
         <w:rPr>
           <w:rFonts w:ascii="Times New Roman" w:hAnsi="Times New Roman"/>
         </w:rPr>
@@ -1364,10 +1319,10 @@
         <w:pStyle w:val="a4"/>
         <w:numPr>
           <w:ilvl w:val="0"/>
-          <w:numId w:val="2"/>
+          <w:numId w:val="5"/>
         </w:numPr>
         <w:spacing w:after="0" w:line="360" w:lineRule="auto"/>
-        <w:ind w:left="0" w:firstLine="709"/>
+        <w:ind w:left="11" w:firstLine="698"/>
         <w:rPr>
           <w:rFonts w:ascii="Times New Roman" w:hAnsi="Times New Roman"/>
         </w:rPr>
@@ -1384,10 +1339,10 @@
         <w:pStyle w:val="a4"/>
         <w:numPr>
           <w:ilvl w:val="0"/>
-          <w:numId w:val="2"/>
+          <w:numId w:val="5"/>
         </w:numPr>
         <w:spacing w:after="0" w:line="360" w:lineRule="auto"/>
-        <w:ind w:left="0" w:firstLine="709"/>
+        <w:ind w:left="11" w:firstLine="698"/>
         <w:rPr>
           <w:rFonts w:ascii="Times New Roman" w:hAnsi="Times New Roman"/>
         </w:rPr>
@@ -1404,10 +1359,10 @@
         <w:pStyle w:val="a4"/>
         <w:numPr>
           <w:ilvl w:val="0"/>
-          <w:numId w:val="2"/>
+          <w:numId w:val="5"/>
         </w:numPr>
         <w:spacing w:after="0" w:line="360" w:lineRule="auto"/>
-        <w:ind w:left="0" w:firstLine="709"/>
+        <w:ind w:left="11" w:firstLine="698"/>
         <w:rPr>
           <w:rFonts w:ascii="Times New Roman" w:hAnsi="Times New Roman"/>
         </w:rPr>
@@ -1424,11 +1379,11 @@
         <w:pStyle w:val="ds-markdown-paragraph"/>
         <w:numPr>
           <w:ilvl w:val="0"/>
-          <w:numId w:val="2"/>
+          <w:numId w:val="5"/>
         </w:numPr>
         <w:shd w:val="clear" w:color="auto" w:fill="FFFFFF"/>
         <w:spacing w:before="0" w:beforeAutospacing="0" w:after="0" w:afterAutospacing="0" w:line="360" w:lineRule="auto"/>
-        <w:ind w:left="0" w:firstLine="709"/>
+        <w:ind w:left="11" w:firstLine="698"/>
         <w:jc w:val="both"/>
         <w:rPr>
           <w:color w:val="0F1115"/>
@@ -1625,7 +1580,58 @@
         <w:rPr>
           <w:szCs w:val="28"/>
         </w:rPr>
-        <w:t>Развитие современных цифровых технологий позволяет создавать инструменты, которые могут помогать пользователю на этапе первоначального структурирования цели, а также поддерживать коллективное взаимодействие в процессе её достижения. Подобные системы способны анализировать текстовое описание задачи и предлагать возможные направления её разложения на более простые этапы, предоставляя пользователю ориентировочную структуру для дальнейшей работы. Дополнительно такие инструменты могут обеспечивать создание команд, совместное использование сформированных планов, механизмы копирования и адаптации структур задач между участниками, а также средства коммуникации для обсуждения хода выполнения. При этом все формируемые рекомендации рассматриваются не как точные инструкции или готовые решения, а как отправная точка, которую пользователь может дополнять, изменять или удалять в зависимости от собственных задач и условий выполнения работы. В командной работе аналогичный подход позволяет одному участнику поделиться своей структурой плана, а коллеги</w:t>
+        <w:t>Развитие современных цифровых технологий позволяет создавать инструменты, которые могут помогать пользователю на этапе первоначального структурирования цели, а также поддерживать коллективное взаимодействие в процессе её достижения. Подобные системы способны анализировать текстовое описание задачи и предлагать возможные направления её разложения на более простые этапы, предоставляя пользователю ориентировочную структуру для дальнейшей работы. Дополнительно такие инструменты могут обеспечивать создание команд, совместное использование сформированных планов, механизмы копирования и адаптации структур задач между участниками, а также средства коммуникации для обсуждения хода выполнения. При этом все формируемые рекомендации рассматриваются не как точные инструкции или готовые решения, а как отправная точка, которую пользователь может дополнять, изменять или удалять в зависимости от собственных задач и условий выполнения работы.</w:t>
+      </w:r>
+      <w:r>
+        <w:rPr>
+          <w:szCs w:val="28"/>
+        </w:rPr>
+        <w:t xml:space="preserve"> </w:t>
+      </w:r>
+      <w:r>
+        <w:rPr>
+          <w:szCs w:val="28"/>
+        </w:rPr>
+        <w:t>В результате система выступает не директивным предписанием, а гибкой средой поддержки, адаптируемой под индивидуальные или командные потребности.</w:t>
+      </w:r>
+      <w:r>
+        <w:t xml:space="preserve"> </w:t>
+      </w:r>
+      <w:r>
+        <w:rPr>
+          <w:szCs w:val="28"/>
+        </w:rPr>
+        <w:t>Б</w:t>
+      </w:r>
+      <w:r>
+        <w:rPr>
+          <w:szCs w:val="28"/>
+        </w:rPr>
+        <w:t>аланс между автоматизацией и свободой ручного управления позволяет сохранить</w:t>
+      </w:r>
+      <w:r>
+        <w:rPr>
+          <w:szCs w:val="28"/>
+        </w:rPr>
+        <w:t xml:space="preserve"> </w:t>
+      </w:r>
+      <w:r>
+        <w:rPr>
+          <w:szCs w:val="28"/>
+        </w:rPr>
+        <w:t>контроль над процессом планирования</w:t>
+      </w:r>
+      <w:r>
+        <w:rPr>
+          <w:szCs w:val="28"/>
+        </w:rPr>
+        <w:t xml:space="preserve">. </w:t>
+      </w:r>
+      <w:r>
+        <w:rPr>
+          <w:szCs w:val="28"/>
+        </w:rPr>
+        <w:t>В командной работе аналогичный подход позволяет одному участнику поделиться своей структурой плана, а коллеги</w:t>
       </w:r>
       <w:r>
         <w:rPr>
@@ -1639,27 +1645,6 @@
         </w:rPr>
         <w:t>скопировать её, адаптировать под свои задачи и вести собственный учёт выполнения, сохраняя при этом общий контекст совместного проекта и возможность оперативного обсуждения возникающих вопросов.</w:t>
       </w:r>
-    </w:p>
-    <w:p>
-      <w:pPr>
-        <w:rPr>
-          <w:szCs w:val="28"/>
-        </w:rPr>
-      </w:pPr>
-    </w:p>
-    <w:p>
-      <w:pPr>
-        <w:rPr>
-          <w:szCs w:val="28"/>
-        </w:rPr>
-      </w:pPr>
-    </w:p>
-    <w:p>
-      <w:pPr>
-        <w:rPr>
-          <w:szCs w:val="28"/>
-        </w:rPr>
-      </w:pPr>
     </w:p>
     <w:p>
       <w:pPr>
@@ -1680,10 +1665,25 @@
       <w:r>
         <w:t>В процессе проектирования веб-приложения для декомпозиции целей и поддержки командного взаимодействия была выполнена идентификация основных групп пользователей и описание решаемых ими функциональных задач. Анализ предметной области показал, что разрабатываемая система является самостоятельным и самодостаточным проектом, в связи с чем архитектурное решение не предусматривает выделения отдельной панели системного администрирования верхнего уровня.</w:t>
       </w:r>
-    </w:p>
-    <w:p>
-      <w:r>
-        <w:t>Управление правами доступа и функциональными возможностями полностью реализовано на уровне командных пространств, где административные функции делегированы создателям и руководителям команд. Система была разбита на логические модули, в рамках которых выделены следующие роли пользователей:</w:t>
+      <w:r>
+        <w:t xml:space="preserve"> </w:t>
+      </w:r>
+      <w:r>
+        <w:t>Это обусловлено ориентацией приложения на децентрализованную модель управления, при которой каждый пользователь или команда функционируют в рамках собственного изолированного рабочего пространства.</w:t>
+      </w:r>
+    </w:p>
+    <w:p>
+      <w:r>
+        <w:t>Управление правами доступа и функциональными возможностями полностью реализовано на уровне командных пространств, где административные функции делегированы создателям и руководителям команд.</w:t>
+      </w:r>
+      <w:r>
+        <w:t xml:space="preserve"> </w:t>
+      </w:r>
+      <w:r>
+        <w:t>Такой подход исключает необходимость вмешательства глобального администратора в повседневную деятельность пользователей и снижает сложность сопровождения системы в целом.</w:t>
+      </w:r>
+      <w:r>
+        <w:t xml:space="preserve"> Система была разбита на логические модули, в рамках которых выделены следующие роли пользователей:</w:t>
       </w:r>
     </w:p>
     <w:p>
@@ -1706,6 +1706,18 @@
         <w:rPr>
           <w:rFonts w:ascii="Times New Roman" w:hAnsi="Times New Roman"/>
         </w:rPr>
+        <w:t xml:space="preserve">, </w:t>
+      </w:r>
+      <w:r>
+        <w:rPr>
+          <w:rFonts w:ascii="Times New Roman" w:hAnsi="Times New Roman"/>
+        </w:rPr>
+        <w:t>данная роль является базовой и присваивается каждому зарегистрированному участнику системы по умолчанию</w:t>
+      </w:r>
+      <w:r>
+        <w:rPr>
+          <w:rFonts w:ascii="Times New Roman" w:hAnsi="Times New Roman"/>
+        </w:rPr>
         <w:t>;</w:t>
       </w:r>
     </w:p>
@@ -1725,6 +1737,15 @@
         </w:rPr>
         <w:t>администратор команды. Роль, наделенная расширенными правами управления ресурсами и составом конкретной команды. Пользователь, инициировавший создание команды, получает данную роль автоматически.</w:t>
       </w:r>
+      <w:r>
+        <w:t xml:space="preserve"> </w:t>
+      </w:r>
+      <w:r>
+        <w:rPr>
+          <w:rFonts w:ascii="Times New Roman" w:hAnsi="Times New Roman"/>
+        </w:rPr>
+        <w:t>Помимо создания команды, администратор может назначать других участников на эту роль, делегируя часть своих полномочий.</w:t>
+      </w:r>
     </w:p>
     <w:p>
       <w:pPr>
@@ -1739,50 +1760,9 @@
         <w:rPr>
           <w:rFonts w:ascii="Times New Roman" w:hAnsi="Times New Roman"/>
         </w:rPr>
+        <w:lastRenderedPageBreak/>
         <w:t>На рисунке 1.1 представлены функции авторизованного пользователя в контексте личного планирования и командного взаимодействия.</w:t>
       </w:r>
-    </w:p>
-    <w:p>
-      <w:pPr>
-        <w:pStyle w:val="a4"/>
-        <w:spacing w:line="360" w:lineRule="auto"/>
-        <w:ind w:left="709" w:firstLine="0"/>
-      </w:pPr>
-    </w:p>
-    <w:p>
-      <w:pPr>
-        <w:pStyle w:val="a4"/>
-        <w:spacing w:line="360" w:lineRule="auto"/>
-        <w:ind w:left="709" w:firstLine="0"/>
-      </w:pPr>
-    </w:p>
-    <w:p>
-      <w:pPr>
-        <w:pStyle w:val="a4"/>
-        <w:spacing w:line="360" w:lineRule="auto"/>
-        <w:ind w:left="709" w:firstLine="0"/>
-      </w:pPr>
-    </w:p>
-    <w:p>
-      <w:pPr>
-        <w:pStyle w:val="a4"/>
-        <w:spacing w:line="360" w:lineRule="auto"/>
-        <w:ind w:left="709" w:firstLine="0"/>
-      </w:pPr>
-    </w:p>
-    <w:p>
-      <w:pPr>
-        <w:pStyle w:val="a4"/>
-        <w:spacing w:line="360" w:lineRule="auto"/>
-        <w:ind w:left="709" w:firstLine="0"/>
-      </w:pPr>
-    </w:p>
-    <w:p>
-      <w:pPr>
-        <w:pStyle w:val="a4"/>
-        <w:spacing w:line="360" w:lineRule="auto"/>
-        <w:ind w:left="709" w:firstLine="0"/>
-      </w:pPr>
     </w:p>
     <w:p>
       <w:pPr>
@@ -1795,12 +1775,11 @@
         <w:rPr>
           <w:noProof/>
         </w:rPr>
-        <w:lastRenderedPageBreak/>
         <w:drawing>
-          <wp:inline distT="0" distB="0" distL="0" distR="0" wp14:anchorId="11DB6930" wp14:editId="660E8A38">
-            <wp:extent cx="5229225" cy="5886158"/>
-            <wp:effectExtent l="19050" t="19050" r="9525" b="19685"/>
-            <wp:docPr id="1" name="Рисунок 1"/>
+          <wp:inline distT="0" distB="0" distL="0" distR="0" wp14:anchorId="5C68961E" wp14:editId="27B90CD3">
+            <wp:extent cx="4800600" cy="5400492"/>
+            <wp:effectExtent l="19050" t="19050" r="19050" b="10160"/>
+            <wp:docPr id="3" name="Рисунок 3"/>
             <wp:cNvGraphicFramePr>
               <a:graphicFrameLocks xmlns:a="http://schemas.openxmlformats.org/drawingml/2006/main" noChangeAspect="1"/>
             </wp:cNvGraphicFramePr>
@@ -1829,7 +1808,7 @@
                   <pic:spPr bwMode="auto">
                     <a:xfrm>
                       <a:off x="0" y="0"/>
-                      <a:ext cx="5240198" cy="5898510"/>
+                      <a:ext cx="4824181" cy="5427020"/>
                     </a:xfrm>
                     <a:prstGeom prst="rect">
                       <a:avLst/>
@@ -1867,13 +1846,7 @@
     </w:p>
     <w:p>
       <w:r>
-        <w:t>Пользователь запускает веб-приложение и выполняет вход в систему, используя свои учетные данные. После успешной аутентификации приложение готово к работе в двух основных направлениях: личное планирование и командное взаимодействие.</w:t>
-      </w:r>
-      <w:r>
-        <w:t xml:space="preserve"> </w:t>
-      </w:r>
-      <w:r>
-        <w:t xml:space="preserve">В области личного планирования авторизованный пользователь имеет возможность создавать и редактировать личные цели с применением механизма автоматической декомпозиции для упрощения структурирования сложных задач. Пользователь управляет этапами выполнения и подзадачами, </w:t>
+        <w:t xml:space="preserve">Пользователь запускает веб-приложение и выполняет вход в систему, используя свои учетные данные. После успешной аутентификации приложение готово к работе в двух основных направлениях: личное планирование и командное взаимодействие. В области личного планирования авторизованный пользователь имеет возможность создавать и редактировать личные цели с применением механизма автоматической декомпозиции для упрощения структурирования сложных задач. Пользователь управляет этапами выполнения и подзадачами, </w:t>
       </w:r>
       <w:r>
         <w:lastRenderedPageBreak/>
@@ -1882,7 +1855,7 @@
     </w:p>
     <w:p>
       <w:r>
-        <w:t>В рамках командного взаимодействия пользователь может создавать новые команды (автоматически получая при этом статус администратора созданной группы) или вступать в уже существующие. Для обеспечения прозрачности совместной работы доступен просмотр и копирование планов других участников команды. Взаимодействие между пользователями осуществляется посредством личных и командных чатов. Система обеспечивает отслеживание персональной статистики выполнения задач и своевременную отправку уведомлений о событиях в рамках целей и команд.</w:t>
+        <w:t>В рамках командного взаимодействия пользователь может создавать новые команды или вступать в уже существующие. Для обеспечения прозрачности совместной работы доступен просмотр и копирование планов других участников команды. Взаимодействие между пользователями осуществляется посредством личных и командных чатов. Система обеспечивает отслеживание персональной статистики выполнения задач и своевременную отправку уведомлений о событиях в рамках целей и команд.</w:t>
       </w:r>
       <w:r>
         <w:t xml:space="preserve"> </w:t>
@@ -1900,10 +1873,10 @@
           <w:noProof/>
         </w:rPr>
         <w:drawing>
-          <wp:inline distT="0" distB="0" distL="0" distR="0" wp14:anchorId="31A2F444" wp14:editId="467EE05F">
-            <wp:extent cx="5290623" cy="5095875"/>
-            <wp:effectExtent l="19050" t="19050" r="24765" b="9525"/>
-            <wp:docPr id="2" name="Рисунок 2"/>
+          <wp:inline distT="0" distB="0" distL="0" distR="0" wp14:anchorId="71C0EF98" wp14:editId="2346E2F9">
+            <wp:extent cx="5543638" cy="5343525"/>
+            <wp:effectExtent l="19050" t="19050" r="19050" b="9525"/>
+            <wp:docPr id="5" name="Рисунок 5"/>
             <wp:cNvGraphicFramePr>
               <a:graphicFrameLocks xmlns:a="http://schemas.openxmlformats.org/drawingml/2006/main" noChangeAspect="1"/>
             </wp:cNvGraphicFramePr>
@@ -1911,7 +1884,7 @@
               <a:graphicData uri="http://schemas.openxmlformats.org/drawingml/2006/picture">
                 <pic:pic xmlns:pic="http://schemas.openxmlformats.org/drawingml/2006/picture">
                   <pic:nvPicPr>
-                    <pic:cNvPr id="0" name="Picture 2"/>
+                    <pic:cNvPr id="0" name="Picture 3"/>
                     <pic:cNvPicPr>
                       <a:picLocks noChangeAspect="1" noChangeArrowheads="1"/>
                     </pic:cNvPicPr>
@@ -1932,7 +1905,7 @@
                   <pic:spPr bwMode="auto">
                     <a:xfrm>
                       <a:off x="0" y="0"/>
-                      <a:ext cx="5318246" cy="5122481"/>
+                      <a:ext cx="5577219" cy="5375893"/>
                     </a:xfrm>
                     <a:prstGeom prst="rect">
                       <a:avLst/>
@@ -2018,13 +1991,7 @@
         <w:t>»</w:t>
       </w:r>
       <w:r>
-        <w:t xml:space="preserve"> </w:t>
-      </w:r>
-      <w:r>
-        <w:t>–</w:t>
-      </w:r>
-      <w:r>
-        <w:t xml:space="preserve"> </w:t>
+        <w:t xml:space="preserve"> – </w:t>
       </w:r>
       <w:r>
         <w:t>широко распространенный сервис для управления персональными задачами и командными проектами, поддерживающий функционал декомпозиции целей на подзадачи и гибкую систему приоритезации.</w:t>
@@ -2036,7 +2003,7 @@
       </w:r>
       <w:r>
         <w:lastRenderedPageBreak/>
-        <w:t>мониторинга прогресса выполнения. Пользовательский интерфейс ориентирован на оперативный обзор текущих задач с возможностью фильтрации по дням, проектам и меткам. Система функционирует в формате кроссплатформенного веб-приложения и мобильных клиентов. На рисунках 1.4 и 1.5 представлен дизайн главной страницы представления списка задач и интерфейс детальной настройки задачи соответственно.</w:t>
+        <w:t>мониторинга прогресса выполнения. Пользовательский интерфейс ориентирован на оперативный обзор текущих задач с возможностью фильтрации по дням, проектам и меткам. На рисунках 1.4 и 1.5 представлен дизайн главной страницы представления списка задач и интерфейс детальной настройки задачи соответственно.</w:t>
       </w:r>
     </w:p>
     <w:p>
@@ -2044,10 +2011,13 @@
         <w:jc w:val="center"/>
       </w:pPr>
       <w:r>
+        <w:rPr>
+          <w:noProof/>
+        </w:rPr>
         <w:drawing>
-          <wp:inline distT="0" distB="0" distL="0" distR="0" wp14:anchorId="24BE6562" wp14:editId="1DCE29E5">
-            <wp:extent cx="4925682" cy="6210300"/>
-            <wp:effectExtent l="19050" t="19050" r="27940" b="19050"/>
+          <wp:inline distT="0" distB="0" distL="0" distR="0" wp14:anchorId="24BE6562" wp14:editId="4CAAAFE3">
+            <wp:extent cx="3369409" cy="4248150"/>
+            <wp:effectExtent l="19050" t="19050" r="21590" b="19050"/>
             <wp:docPr id="11" name="Рисунок 11"/>
             <wp:cNvGraphicFramePr>
               <a:graphicFrameLocks xmlns:a="http://schemas.openxmlformats.org/drawingml/2006/main" noChangeAspect="1"/>
@@ -2068,7 +2038,7 @@
                   <pic:spPr>
                     <a:xfrm>
                       <a:off x="0" y="0"/>
-                      <a:ext cx="4951318" cy="6242622"/>
+                      <a:ext cx="3406908" cy="4295429"/>
                     </a:xfrm>
                     <a:prstGeom prst="rect">
                       <a:avLst/>
@@ -2091,10 +2061,10 @@
         <w:jc w:val="center"/>
       </w:pPr>
       <w:r>
-        <w:t xml:space="preserve">Рисунок 1.4 – Главная страница </w:t>
-      </w:r>
-      <w:r>
-        <w:t xml:space="preserve">вывода списка задач </w:t>
+        <w:t>Рисунок 1.4 – Главная страница</w:t>
+      </w:r>
+      <w:r>
+        <w:t xml:space="preserve"> списка задач </w:t>
       </w:r>
       <w:r>
         <w:t>«</w:t>
@@ -2113,11 +2083,13 @@
         <w:jc w:val="center"/>
       </w:pPr>
       <w:r>
-        <w:lastRenderedPageBreak/>
+        <w:rPr>
+          <w:noProof/>
+        </w:rPr>
         <w:drawing>
-          <wp:inline distT="0" distB="0" distL="0" distR="0" wp14:anchorId="70FBA66A" wp14:editId="54EBA65E">
-            <wp:extent cx="4951730" cy="2435103"/>
-            <wp:effectExtent l="19050" t="19050" r="20320" b="22860"/>
+          <wp:inline distT="0" distB="0" distL="0" distR="0" wp14:anchorId="70FBA66A" wp14:editId="7F9BC517">
+            <wp:extent cx="4619625" cy="2271785"/>
+            <wp:effectExtent l="19050" t="19050" r="9525" b="14605"/>
             <wp:docPr id="4" name="Рисунок 4"/>
             <wp:cNvGraphicFramePr>
               <a:graphicFrameLocks xmlns:a="http://schemas.openxmlformats.org/drawingml/2006/main" noChangeAspect="1"/>
@@ -2138,7 +2110,7 @@
                   <pic:spPr>
                     <a:xfrm>
                       <a:off x="0" y="0"/>
-                      <a:ext cx="4988147" cy="2453012"/>
+                      <a:ext cx="4668937" cy="2296035"/>
                     </a:xfrm>
                     <a:prstGeom prst="rect">
                       <a:avLst/>
@@ -2161,25 +2133,7 @@
         <w:jc w:val="center"/>
       </w:pPr>
       <w:r>
-        <w:t>Рисунок 1.</w:t>
-      </w:r>
-      <w:r>
-        <w:t>5</w:t>
-      </w:r>
-      <w:r>
-        <w:t xml:space="preserve"> – </w:t>
-      </w:r>
-      <w:r>
-        <w:t>Детальная</w:t>
-      </w:r>
-      <w:r>
-        <w:t xml:space="preserve"> страница задач</w:t>
-      </w:r>
-      <w:r>
-        <w:t>и</w:t>
-      </w:r>
-      <w:r>
-        <w:t xml:space="preserve"> в </w:t>
+        <w:t xml:space="preserve">Рисунок 1.5 – Детальная страница задачи в </w:t>
       </w:r>
       <w:r>
         <w:t>«</w:t>
@@ -2195,6 +2149,7 @@
     </w:p>
     <w:p>
       <w:r>
+        <w:lastRenderedPageBreak/>
         <w:t>Рассмотрим систему «</w:t>
       </w:r>
       <w:proofErr w:type="spellStart"/>
@@ -2665,11 +2620,68 @@
         <w:spacing w:before="240"/>
       </w:pPr>
       <w:r>
-        <w:t xml:space="preserve">Проведенный анализ функциональных возможностей сервиса позволяет сделать следующий вывод: несмотря на наличие базовых механизмов декомпозиции и интуитивно понятный интерфейс, подавляющее большинство ключевых функций, необходимых для полноценной командной работы и детального планирования, доступно исключительно в рамках коммерческой </w:t>
-      </w:r>
+        <w:t>Проведенный анализ функциональных возможностей сервиса позволяет сделать следующий вывод: несмотря на наличие базовых механизмов декомпозиции и интуитивно понятный интерфейс, подавляющее большинство ключевых функций, необходимых для полноценной командной работы и детального планирования, доступно исключительно в рамках коммерческой подписки. Свободная версия приложения характеризуется существенными функциональными ограничениями, что снижает эффективность его применения в качестве универсального инструмента командного целеполагания в рамках разрабатываемого проекта.</w:t>
+      </w:r>
+    </w:p>
+    <w:p>
+      <w:pPr>
+        <w:spacing w:before="120"/>
+      </w:pPr>
+      <w:r>
+        <w:t>Следующей рассматриваемой системой является «</w:t>
+      </w:r>
+      <w:proofErr w:type="spellStart"/>
+      <w:r>
+        <w:t>Notion</w:t>
+      </w:r>
+      <w:proofErr w:type="spellEnd"/>
+      <w:r>
+        <w:t>» – универсальная платформа для организации рабочего пространства, сочетающая в себе функционал управления базами данных, создания структурированных страниц и применения шаблонов проектирования для планирования деятельности.</w:t>
+      </w:r>
+      <w:r>
+        <w:t xml:space="preserve"> </w:t>
+      </w:r>
+    </w:p>
+    <w:p>
+      <w:pPr>
+        <w:spacing w:before="120"/>
+      </w:pPr>
       <w:r>
         <w:lastRenderedPageBreak/>
-        <w:t>подписки. Свободная версия приложения характеризуется существенными функциональными ограничениями, что снижает эффективность его применения в качестве универсального инструмента командного целеполагания в рамках разрабатываемого проекта.</w:t>
+        <w:t>Отличительной особенностью данного сервиса выступает распространенный подход к построению пользовательских систем целеполагания и отслеживания задач, реализуемый посредством гибкого инструментария. Пользователь имеет возможность создавать связанные таблицы и</w:t>
+      </w:r>
+      <w:r>
+        <w:t xml:space="preserve"> </w:t>
+      </w:r>
+      <w:r>
+        <w:t>доски, обеспечивающие наглядную декомпозицию стратегических целей на промежуточные этапы и конкретные задачи. Гибкость платформы позволяет адаптировать рабочее пространство под специфику как индивидуального, так и командного планирования.</w:t>
+      </w:r>
+      <w:r>
+        <w:t xml:space="preserve"> </w:t>
+      </w:r>
+      <w:r>
+        <w:t>Возможность настройки пользовательских свойств и атрибутов для каждого типа данных даёт пользователю полный контроль над структурой хранимой информации и способами её отображения.</w:t>
+      </w:r>
+      <w:r>
+        <w:t xml:space="preserve"> Кроме того, в системе реализован ИИ-ассистент, оказывающий поддержку в декомпозиции поставленных целей на составляющие задачи.</w:t>
+      </w:r>
+      <w:r>
+        <w:t xml:space="preserve"> </w:t>
+      </w:r>
+      <w:r>
+        <w:t>Функциональность ассистента интегрирована непосредственно в рабочее окружение, что избавляет пользователя от необходимости переключения между различными приложениями или сервисами для получения рекомендаций по структурированию целей.</w:t>
+      </w:r>
+      <w:r>
+        <w:t xml:space="preserve"> </w:t>
+      </w:r>
+      <w:r>
+        <w:t>Важным аспектом является поддержка версионности изменений, обеспечивающая возможность восстановления предыдущих редакций планов и отслеживания хронологии работы над целями. Платформа также предоставляет доступ к обширной библиотеке шаблонов, созданных сообществом, что ускоряет процесс развертывания типовых конфигураций для ведения личных и командных проектов.</w:t>
+      </w:r>
+      <w:r>
+        <w:t xml:space="preserve"> </w:t>
+      </w:r>
+      <w:r>
+        <w:t>Наличие готовых решений для различных сценариев использования снижает порог входа для новых пользователей и позволяет быстрее адаптировать инструмент под конкретные задачи</w:t>
       </w:r>
     </w:p>
     <w:p>
@@ -2677,7 +2689,13 @@
         <w:spacing w:before="120"/>
       </w:pPr>
       <w:r>
-        <w:t>Следующей рассматриваемой системой является «</w:t>
+        <w:t>Для обеспечения бесперебойного доступа к данным сервис функционирует в формате кроссплатформенного решения, синхронизируя информацию между веб-версией, настольными клиентами и мобильными устройствами.</w:t>
+      </w:r>
+      <w:r>
+        <w:t xml:space="preserve"> </w:t>
+      </w:r>
+      <w:r>
+        <w:t>На рисунках 1.6 и 1.7 представлен дизайн главной страницы представления списка задач и интерфейс чата, обеспечивающего взаимодействие пользователя с ИИ-ассистентом в среде «</w:t>
       </w:r>
       <w:proofErr w:type="spellStart"/>
       <w:r>
@@ -2685,67 +2703,22 @@
       </w:r>
       <w:proofErr w:type="spellEnd"/>
       <w:r>
-        <w:t>» – универсальная платформа для организации рабочего пространства, сочетающая в себе функционал управления базами данных, создания структурированных страниц и применения шаблонов проектирования для планирования деятельности.</w:t>
-      </w:r>
-      <w:r>
-        <w:t xml:space="preserve"> </w:t>
-      </w:r>
-    </w:p>
-    <w:p>
-      <w:pPr>
-        <w:spacing w:before="120"/>
-      </w:pPr>
-      <w:r>
-        <w:t>Отличительной особенностью данного сервиса выступает распространенный подход к построению пользовательских систем целеполагания и отслеживания задач, реализуемый посредством гибкого инструментария. Пользователь имеет возможность создавать связанные таблицы и</w:t>
-      </w:r>
-      <w:r>
-        <w:t xml:space="preserve"> </w:t>
-      </w:r>
-      <w:r>
-        <w:t>доски, обеспечивающие наглядную декомпозицию стратегических целей на промежуточные этапы и конкретные задачи. Гибкость платформы позволяет адаптировать рабочее пространство под специфику как индивидуального, так и командного планирования. Кроме того, в системе реализован ИИ-ассистент, оказывающий поддержку в декомпозиции поставленных целей на составляющие задачи.</w:t>
-      </w:r>
-      <w:r>
-        <w:t xml:space="preserve"> </w:t>
-      </w:r>
-      <w:r>
-        <w:t xml:space="preserve">Важным аспектом является поддержка версионности изменений, обеспечивающая возможность восстановления предыдущих редакций планов и отслеживания хронологии работы над целями. Платформа также предоставляет доступ к обширной библиотеке шаблонов, созданных сообществом, что ускоряет процесс развертывания типовых конфигураций для ведения личных и командных проектов. </w:t>
-      </w:r>
-    </w:p>
-    <w:p>
-      <w:pPr>
-        <w:spacing w:before="120"/>
-      </w:pPr>
-      <w:r>
-        <w:t>Для обеспечения бесперебойного доступа к данным сервис функционирует в формате кроссплатформенного решения, синхронизируя информацию между веб-версией, настольными клиентами и мобильными устройствами.</w:t>
-      </w:r>
-      <w:r>
-        <w:t xml:space="preserve"> </w:t>
-      </w:r>
-      <w:r>
-        <w:t xml:space="preserve">На рисунках 1.6 и 1.7 представлен дизайн главной страницы представления списка задач и </w:t>
-      </w:r>
-      <w:r>
+        <w:t>», соответственно.</w:t>
+      </w:r>
+    </w:p>
+    <w:p>
+      <w:pPr>
+        <w:jc w:val="center"/>
+      </w:pPr>
+      <w:r>
+        <w:rPr>
+          <w:noProof/>
+        </w:rPr>
         <w:lastRenderedPageBreak/>
-        <w:t>интерфейс чата, обеспечивающего взаимодействие пользователя с ИИ-ассистентом в среде «</w:t>
-      </w:r>
-      <w:proofErr w:type="spellStart"/>
-      <w:r>
-        <w:t>Notion</w:t>
-      </w:r>
-      <w:proofErr w:type="spellEnd"/>
-      <w:r>
-        <w:t>», соответственно.</w:t>
-      </w:r>
-    </w:p>
-    <w:p>
-      <w:pPr>
-        <w:jc w:val="center"/>
-      </w:pPr>
-      <w:r>
         <w:drawing>
-          <wp:inline distT="0" distB="0" distL="0" distR="0" wp14:anchorId="3CAD68F4" wp14:editId="6C67C872">
-            <wp:extent cx="5751135" cy="3743325"/>
-            <wp:effectExtent l="19050" t="19050" r="21590" b="9525"/>
+          <wp:inline distT="0" distB="0" distL="0" distR="0" wp14:anchorId="3CAD68F4" wp14:editId="6755029E">
+            <wp:extent cx="5736501" cy="3733800"/>
+            <wp:effectExtent l="19050" t="19050" r="17145" b="19050"/>
             <wp:docPr id="9" name="Рисунок 9"/>
             <wp:cNvGraphicFramePr>
               <a:graphicFrameLocks xmlns:a="http://schemas.openxmlformats.org/drawingml/2006/main" noChangeAspect="1"/>
@@ -2766,7 +2739,7 @@
                   <pic:spPr>
                     <a:xfrm>
                       <a:off x="0" y="0"/>
-                      <a:ext cx="5761367" cy="3749985"/>
+                      <a:ext cx="5752125" cy="3743970"/>
                     </a:xfrm>
                     <a:prstGeom prst="rect">
                       <a:avLst/>
@@ -2789,13 +2762,7 @@
         <w:jc w:val="center"/>
       </w:pPr>
       <w:r>
-        <w:t>Рисунок 1.</w:t>
-      </w:r>
-      <w:r>
-        <w:t>6</w:t>
-      </w:r>
-      <w:r>
-        <w:t xml:space="preserve"> – Главная страница списка задач в </w:t>
+        <w:t xml:space="preserve">Рисунок 1.6 – Главная страница списка задач в </w:t>
       </w:r>
       <w:r>
         <w:t>«</w:t>
@@ -2814,10 +2781,13 @@
         <w:jc w:val="center"/>
       </w:pPr>
       <w:r>
+        <w:rPr>
+          <w:noProof/>
+        </w:rPr>
         <w:drawing>
-          <wp:inline distT="0" distB="0" distL="0" distR="0" wp14:anchorId="660A1CCD" wp14:editId="795AA787">
-            <wp:extent cx="5477389" cy="3552825"/>
-            <wp:effectExtent l="19050" t="19050" r="28575" b="9525"/>
+          <wp:inline distT="0" distB="0" distL="0" distR="0" wp14:anchorId="660A1CCD" wp14:editId="41FEAA70">
+            <wp:extent cx="5727029" cy="3714750"/>
+            <wp:effectExtent l="19050" t="19050" r="26670" b="19050"/>
             <wp:docPr id="10" name="Рисунок 10"/>
             <wp:cNvGraphicFramePr>
               <a:graphicFrameLocks xmlns:a="http://schemas.openxmlformats.org/drawingml/2006/main" noChangeAspect="1"/>
@@ -2838,7 +2808,7 @@
                   <pic:spPr>
                     <a:xfrm>
                       <a:off x="0" y="0"/>
-                      <a:ext cx="5485286" cy="3557947"/>
+                      <a:ext cx="5741025" cy="3723829"/>
                     </a:xfrm>
                     <a:prstGeom prst="rect">
                       <a:avLst/>
@@ -2861,13 +2831,13 @@
         <w:jc w:val="center"/>
       </w:pPr>
       <w:r>
-        <w:t>Рисунок 1.</w:t>
-      </w:r>
-      <w:r>
-        <w:t>7</w:t>
-      </w:r>
-      <w:r>
-        <w:t xml:space="preserve"> – Детальная страница задачи в </w:t>
+        <w:t>Рисунок 1.7 –</w:t>
+      </w:r>
+      <w:r>
+        <w:t xml:space="preserve">Страница взаимодействия с ИИ </w:t>
+      </w:r>
+      <w:r>
+        <w:t xml:space="preserve">в </w:t>
       </w:r>
       <w:r>
         <w:t>«</w:t>
@@ -2883,8 +2853,11 @@
     </w:p>
     <w:p>
       <w:r>
+        <w:t xml:space="preserve">В процессе работы пользователь имеет возможность вести структурированные базы данных, содержащие сведения о целях, задачах и </w:t>
+      </w:r>
+      <w:r>
         <w:lastRenderedPageBreak/>
-        <w:t>В процессе работы пользователь имеет возможность вести структурированные базы данных, содержащие сведения о целях, задачах и проектах, с возможностью установления реляционных связей между соответствующими сущностями. Для визуального представления информации предусмотрен широкий спектр режимов отображения, включающий табличное представление,</w:t>
+        <w:t>проектах, с возможностью установления реляционных связей между соответствующими сущностями. Для визуального представления информации предусмотрен широкий спектр режимов отображения, включающий табличное представление,</w:t>
       </w:r>
       <w:r>
         <w:t xml:space="preserve"> </w:t>
@@ -2925,13 +2898,7 @@
         <w:ind w:firstLine="0"/>
       </w:pPr>
       <w:r>
-        <w:t>Таблица 1.</w:t>
-      </w:r>
-      <w:r>
-        <w:t>2</w:t>
-      </w:r>
-      <w:r>
-        <w:t xml:space="preserve"> – Оценка категорий системы «</w:t>
+        <w:t>Таблица 1.2 – Оценка категорий системы «</w:t>
       </w:r>
       <w:proofErr w:type="spellStart"/>
       <w:r>
@@ -3360,11 +3327,23 @@
       </w:r>
       <w:proofErr w:type="spellEnd"/>
       <w:r>
-        <w:t xml:space="preserve">» — визуальный инструмент управления задачами и проектами на основе досок и карточек. Он широко используется для командной работы и позволяет организовать </w:t>
+        <w:t>»</w:t>
+      </w:r>
+      <w:r>
+        <w:t xml:space="preserve"> </w:t>
+      </w:r>
+      <w:r>
+        <w:t>–</w:t>
+      </w:r>
+      <w:r>
+        <w:t xml:space="preserve"> </w:t>
+      </w:r>
+      <w:r>
+        <w:t xml:space="preserve">визуальный инструмент управления задачами и проектами на основе досок и карточек. Он широко используется для командной работы и позволяет организовать декомпозицию целей на задачи и этапы, а также отслеживать их выполнение в </w:t>
       </w:r>
       <w:r>
         <w:lastRenderedPageBreak/>
-        <w:t>декомпозицию целей на задачи и этапы, а также отслеживать их выполнение в наглядной форме.</w:t>
+        <w:t>наглядной форме.</w:t>
       </w:r>
       <w:r>
         <w:t xml:space="preserve"> </w:t>
@@ -3377,12 +3356,6 @@
       </w:r>
       <w:r>
         <w:t xml:space="preserve"> 1.</w:t>
-      </w:r>
-      <w:r>
-        <w:t>8</w:t>
-      </w:r>
-      <w:r>
-        <w:t xml:space="preserve"> </w:t>
       </w:r>
       <w:r>
         <w:t>8</w:t>
@@ -3485,12 +3458,33 @@
     </w:p>
     <w:p>
       <w:r>
-        <w:t>Пользователь создаёт доски, на них — списки этапов, а внутри списков — карточки задач. Карточки можно перемещать между списками, что удобно для визуального отслеживания прогресса.</w:t>
+        <w:t>Пользователь создаёт доски, на них</w:t>
       </w:r>
       <w:r>
         <w:t xml:space="preserve"> </w:t>
       </w:r>
       <w:r>
+        <w:t>–</w:t>
+      </w:r>
+      <w:r>
+        <w:t xml:space="preserve"> </w:t>
+      </w:r>
+      <w:r>
+        <w:t>списки этапов, а внутри списков</w:t>
+      </w:r>
+      <w:r>
+        <w:t xml:space="preserve"> </w:t>
+      </w:r>
+      <w:r>
+        <w:t>–</w:t>
+      </w:r>
+      <w:r>
+        <w:t xml:space="preserve"> карточки задач. Карточки можно перемещать между списками, что удобно для визуального отслеживания прогресса.</w:t>
+      </w:r>
+      <w:r>
+        <w:t xml:space="preserve"> </w:t>
+      </w:r>
+      <w:r>
         <w:t>Рассмотрим систему «</w:t>
       </w:r>
       <w:proofErr w:type="spellStart"/>
@@ -3519,13 +3513,7 @@
         <w:ind w:firstLine="0"/>
       </w:pPr>
       <w:r>
-        <w:t>Таблица 1.</w:t>
-      </w:r>
-      <w:r>
-        <w:t>3</w:t>
-      </w:r>
-      <w:r>
-        <w:t xml:space="preserve"> – Оценка категорий системы «</w:t>
+        <w:t>Таблица 1.3 – Оценка категорий системы «</w:t>
       </w:r>
       <w:proofErr w:type="spellStart"/>
       <w:r>
@@ -3753,6 +3741,11 @@
       <w:pPr>
         <w:ind w:firstLine="0"/>
       </w:pPr>
+    </w:p>
+    <w:p>
+      <w:pPr>
+        <w:ind w:firstLine="0"/>
+      </w:pPr>
       <w:r>
         <w:lastRenderedPageBreak/>
         <w:t>Продолжение таблицы 1.3</w:t>
@@ -4033,17 +4026,7 @@
     <w:p/>
     <w:p>
       <w:r>
-        <w:t>Проведя анализ нескольких систем, можно отметить, что существующие решения предлагают широкий набор функций для управления задачами и визуального планирования. При этом специализированные средства автоматической декомпозиции цели с помощью искусственного интеллекта встречаются редко или доступны только в виде отдельных интеграций, пользователю зачастую приходится самостоятельно проектировать структуру целей, подцелей и задач, а визуальное представление планов</w:t>
-      </w:r>
-      <w:r>
-        <w:t xml:space="preserve"> </w:t>
-      </w:r>
-      <w:r>
-        <w:t xml:space="preserve">не всегда объединяется с удобным хранением истории взаимодействия и командной работой в единой модели данных. При разработке новой системы для декомпозиции целей планируется внедрить наиболее значимые и положительные аспекты из рассмотренных сервисов: наглядное представление списка задач, простую работу со статусами и этапами, совместную работу и управление доступом. При этом ключевым отличием разрабатываемого решения станет автоматическая генерация структурированного плана с помощью искусственного интеллекта на основе текстового описания цели, ведение истории взаимодействия </w:t>
-      </w:r>
-      <w:r>
-        <w:lastRenderedPageBreak/>
-        <w:t>с ИИ с сохранением сгенерированных списков задач, а также поддержка как личного, так и командного использования в рамках единой системы.</w:t>
+        <w:t>Проведя анализ нескольких систем, можно отметить, что существующие решения предлагают широкий набор функций для управления задачами и визуального планирования. При этом специализированные средства автоматической декомпозиции цели с помощью искусственного интеллекта встречаются редко или доступны только в виде отдельных интеграций, пользователю зачастую приходится самостоятельно проектировать структуру целей, подцелей и задач. При разработке новой системы для декомпозиции целей планируется внедрить наиболее значимые и положительные аспекты из рассмотренных сервисов: наглядное представление списка задач, простую работу со статусами и этапами, совместную работу и управление доступом. При этом ключевым отличием разрабатываемого решения станет автоматическая генерация структурированного плана с помощью искусственного интеллекта на основе текстового описания цели, ведение истории взаимодействия с ИИ с сохранением сгенерированных списков задач, а также поддержка как личного, так и командного использования в рамках единой системы.</w:t>
       </w:r>
     </w:p>
     <w:p>
@@ -4058,6 +4041,7 @@
           <w:b/>
           <w:bCs/>
         </w:rPr>
+        <w:lastRenderedPageBreak/>
         <w:t>1.4 Проектирование информационной системы</w:t>
       </w:r>
     </w:p>
@@ -4308,25 +4292,33 @@
     </w:p>
     <w:p>
       <w:r>
-        <w:t xml:space="preserve">Для наглядного отображения функциональных возможностей и взаимодействия компонентов </w:t>
-      </w:r>
-      <w:r>
-        <w:t>системы.</w:t>
-      </w:r>
-      <w:r>
-        <w:t xml:space="preserve"> На рисунке 1.7 представлена диаграмма последовательности «Генерация списка задач с использованием ИИ»</w:t>
-      </w:r>
-    </w:p>
-    <w:p>
+        <w:t>Приведённый перечень функций отражает ключевые сценарии взаимодействия пользователя с приложением и формирует основу для дальнейшей детализации программных модулей. Каждая из указанных операций предполагает реализацию соответствующего интерфейсного компонента и серверной логики обработки данных.</w:t>
+      </w:r>
+    </w:p>
+    <w:p>
+      <w:r>
+        <w:t>Для наглядного отображения функциональных возможностей и взаимодействия компонентов системы</w:t>
+      </w:r>
+      <w:r>
+        <w:t>, были разработаны графические схемы, иллюстрирующие последовательность выполнения ключевых операций и обмен между различными частями приложения</w:t>
+      </w:r>
+      <w:r>
+        <w:t>. На рисунке 1.7 представлена диаграмма последовательности «Генерация списка задач с использованием ИИ»</w:t>
+      </w:r>
+    </w:p>
+    <w:p>
+      <w:pPr>
+        <w:jc w:val="center"/>
+      </w:pPr>
       <w:r>
         <w:rPr>
           <w:noProof/>
         </w:rPr>
         <w:lastRenderedPageBreak/>
         <w:drawing>
-          <wp:inline distT="0" distB="0" distL="0" distR="0" wp14:anchorId="3C13DB1D" wp14:editId="0C8EE7A4">
-            <wp:extent cx="5523865" cy="3812873"/>
-            <wp:effectExtent l="19050" t="19050" r="19685" b="16510"/>
+          <wp:inline distT="0" distB="0" distL="0" distR="0" wp14:anchorId="3C13DB1D" wp14:editId="157A6B34">
+            <wp:extent cx="5809488" cy="4010025"/>
+            <wp:effectExtent l="19050" t="19050" r="20320" b="9525"/>
             <wp:docPr id="25" name="Рисунок 25"/>
             <wp:cNvGraphicFramePr>
               <a:graphicFrameLocks xmlns:a="http://schemas.openxmlformats.org/drawingml/2006/main" noChangeAspect="1"/>
@@ -4347,7 +4339,7 @@
                   <pic:spPr>
                     <a:xfrm>
                       <a:off x="0" y="0"/>
-                      <a:ext cx="5531495" cy="3818139"/>
+                      <a:ext cx="5823931" cy="4019995"/>
                     </a:xfrm>
                     <a:prstGeom prst="rect">
                       <a:avLst/>
@@ -4370,19 +4362,7 @@
         <w:jc w:val="center"/>
       </w:pPr>
       <w:r>
-        <w:t>Рисунок 1.</w:t>
-      </w:r>
-      <w:r>
-        <w:t>7</w:t>
-      </w:r>
-      <w:r>
-        <w:t xml:space="preserve"> – Диаграмма </w:t>
-      </w:r>
-      <w:r>
-        <w:t>последовательности</w:t>
-      </w:r>
-      <w:r>
-        <w:t xml:space="preserve"> «</w:t>
+        <w:t>Рисунок 1.7 – Диаграмма последовательности «</w:t>
       </w:r>
       <w:r>
         <w:t>Генерация списка задач с использованием ИИ</w:t>
@@ -4411,10 +4391,7 @@
         <w:t>API</w:t>
       </w:r>
       <w:r>
-        <w:t>,</w:t>
-      </w:r>
-      <w:r>
-        <w:t xml:space="preserve"> который, в свою очередь, обращается к AI‑сервису с подготовленным </w:t>
+        <w:t xml:space="preserve">, который, в свою очередь, обращается к AI‑сервису с подготовленным </w:t>
       </w:r>
       <w:r>
         <w:t>руководством общения с пользователем в виде набора текстовых правил</w:t>
@@ -4445,7 +4422,6 @@
         <w:t xml:space="preserve"> принадлежавших одному списку задач</w:t>
       </w:r>
     </w:p>
-    <w:p/>
     <w:p>
       <w:r>
         <w:rPr>
@@ -4453,9 +4429,9 @@
         </w:rPr>
         <w:lastRenderedPageBreak/>
         <w:drawing>
-          <wp:inline distT="0" distB="0" distL="0" distR="0" wp14:anchorId="64E7EDE3" wp14:editId="6178A78A">
-            <wp:extent cx="5630361" cy="4505325"/>
-            <wp:effectExtent l="19050" t="19050" r="27940" b="9525"/>
+          <wp:inline distT="0" distB="0" distL="0" distR="0" wp14:anchorId="64E7EDE3" wp14:editId="27431349">
+            <wp:extent cx="5689879" cy="4552950"/>
+            <wp:effectExtent l="19050" t="19050" r="25400" b="19050"/>
             <wp:docPr id="26" name="Рисунок 26"/>
             <wp:cNvGraphicFramePr>
               <a:graphicFrameLocks xmlns:a="http://schemas.openxmlformats.org/drawingml/2006/main" noChangeAspect="1"/>
@@ -4485,7 +4461,7 @@
                   <pic:spPr bwMode="auto">
                     <a:xfrm>
                       <a:off x="0" y="0"/>
-                      <a:ext cx="5634246" cy="4508434"/>
+                      <a:ext cx="5699228" cy="4560431"/>
                     </a:xfrm>
                     <a:prstGeom prst="rect">
                       <a:avLst/>
@@ -4515,42 +4491,18 @@
         <w:rPr>
           <w:color w:val="000000" w:themeColor="text1"/>
         </w:rPr>
-        <w:t>Рисунок 1.</w:t>
+        <w:t>Рисунок 1.8 – Диаграмма деятельности «</w:t>
       </w:r>
       <w:r>
         <w:rPr>
           <w:color w:val="000000" w:themeColor="text1"/>
         </w:rPr>
-        <w:t>8</w:t>
+        <w:t>Вывод задач списка</w:t>
       </w:r>
       <w:r>
         <w:rPr>
           <w:color w:val="000000" w:themeColor="text1"/>
         </w:rPr>
-        <w:t xml:space="preserve"> – Диаграмма </w:t>
-      </w:r>
-      <w:r>
-        <w:rPr>
-          <w:color w:val="000000" w:themeColor="text1"/>
-        </w:rPr>
-        <w:t>деятельности</w:t>
-      </w:r>
-      <w:r>
-        <w:rPr>
-          <w:color w:val="000000" w:themeColor="text1"/>
-        </w:rPr>
-        <w:t xml:space="preserve"> «</w:t>
-      </w:r>
-      <w:r>
-        <w:rPr>
-          <w:color w:val="000000" w:themeColor="text1"/>
-        </w:rPr>
-        <w:t>Вывод задач списка</w:t>
-      </w:r>
-      <w:r>
-        <w:rPr>
-          <w:color w:val="000000" w:themeColor="text1"/>
-        </w:rPr>
         <w:t>»</w:t>
       </w:r>
     </w:p>
@@ -4574,7 +4526,16 @@
         <w:t>выводит</w:t>
       </w:r>
       <w:r>
-        <w:t xml:space="preserve"> отображение задач в интерфейсе. При успешном завершении операции пользователь видит </w:t>
+        <w:t xml:space="preserve"> отображение задач в интерфейсе.</w:t>
+      </w:r>
+      <w:r>
+        <w:t xml:space="preserve"> </w:t>
+      </w:r>
+      <w:r>
+        <w:t>При этом клиентская часть приложения формирует структурированное представление полученной информации, группируя задачи в соответствии с их статусом выполнения и заданным порядком следования.</w:t>
+      </w:r>
+      <w:r>
+        <w:t xml:space="preserve"> При успешном завершении операции пользователь видит </w:t>
       </w:r>
       <w:r>
         <w:t>задачи,</w:t>
@@ -4591,17 +4552,18 @@
       <w:r>
         <w:t>.</w:t>
       </w:r>
+      <w:r>
+        <w:t xml:space="preserve"> </w:t>
+      </w:r>
+      <w:r>
+        <w:t>Наличие актуального перечня задач в едином интерфейсе способствует формированию целостного представления о текущем состоянии работы</w:t>
+      </w:r>
     </w:p>
     <w:p>
       <w:r>
         <w:t>На рисунке 1.9 представлена диаграмма развертывания системы, демонстрирующая физическое расположение и взаимодействие основных компонентов.</w:t>
       </w:r>
     </w:p>
-    <w:p/>
-    <w:p/>
-    <w:p/>
-    <w:p/>
-    <w:p/>
     <w:p>
       <w:r>
         <w:rPr>
@@ -4609,9 +4571,9 @@
         </w:rPr>
         <w:lastRenderedPageBreak/>
         <w:drawing>
-          <wp:inline distT="0" distB="0" distL="0" distR="0" wp14:anchorId="4CF7630C" wp14:editId="4D13379F">
-            <wp:extent cx="5561965" cy="4505197"/>
-            <wp:effectExtent l="19050" t="19050" r="19685" b="10160"/>
+          <wp:inline distT="0" distB="0" distL="0" distR="0" wp14:anchorId="4CF7630C" wp14:editId="3C2FB676">
+            <wp:extent cx="5679715" cy="4600575"/>
+            <wp:effectExtent l="19050" t="19050" r="16510" b="9525"/>
             <wp:docPr id="27" name="Рисунок 27"/>
             <wp:cNvGraphicFramePr>
               <a:graphicFrameLocks xmlns:a="http://schemas.openxmlformats.org/drawingml/2006/main" noChangeAspect="1"/>
@@ -4641,7 +4603,7 @@
                   <pic:spPr bwMode="auto">
                     <a:xfrm>
                       <a:off x="0" y="0"/>
-                      <a:ext cx="5567676" cy="4509823"/>
+                      <a:ext cx="5689418" cy="4608435"/>
                     </a:xfrm>
                     <a:prstGeom prst="rect">
                       <a:avLst/>
@@ -4671,19 +4633,19 @@
         <w:rPr>
           <w:color w:val="000000" w:themeColor="text1"/>
         </w:rPr>
-        <w:t>Рисунок 1.</w:t>
+        <w:t>Рисунок 1.9 –</w:t>
       </w:r>
       <w:r>
         <w:rPr>
           <w:color w:val="000000" w:themeColor="text1"/>
         </w:rPr>
-        <w:t>9</w:t>
+        <w:t xml:space="preserve"> Д</w:t>
       </w:r>
       <w:r>
         <w:rPr>
           <w:color w:val="000000" w:themeColor="text1"/>
         </w:rPr>
-        <w:t xml:space="preserve"> – Диаграмма деятельности «диаграмма развертывания системы»</w:t>
+        <w:t>иаграмма развертывания системы</w:t>
       </w:r>
     </w:p>
     <w:p>
@@ -4772,27 +4734,151 @@
     </w:p>
     <w:p>
       <w:r>
-        <w:t xml:space="preserve">Для разработки серверной части системы декомпозиции целей </w:t>
+        <w:t>Для разработки серверной части системы декомпозиции целей</w:t>
+      </w:r>
+      <w:r>
+        <w:t xml:space="preserve">, </w:t>
+      </w:r>
+      <w:r>
+        <w:t xml:space="preserve">в качестве основного фреймворка выбран </w:t>
       </w:r>
       <w:proofErr w:type="spellStart"/>
       <w:r>
-        <w:t>TargetLayer</w:t>
+        <w:t>FastAPI</w:t>
       </w:r>
       <w:proofErr w:type="spellEnd"/>
       <w:r>
-        <w:t xml:space="preserve"> в качестве основного фреймворка выбран </w:t>
+        <w:t>, представляющий собой современный высокопроизводительный инструмент для создания веб‑API на языке Python.</w:t>
+      </w:r>
+      <w:r>
+        <w:t xml:space="preserve"> </w:t>
       </w:r>
       <w:proofErr w:type="spellStart"/>
       <w:r>
+        <w:lastRenderedPageBreak/>
         <w:t>FastAPI</w:t>
       </w:r>
       <w:proofErr w:type="spellEnd"/>
       <w:r>
-        <w:t xml:space="preserve">, представляющий собой современный высокопроизводительный инструмент для создания веб‑API на </w:t>
+        <w:t xml:space="preserve"> обеспечивает декларативное описание маршрутов и схем данных с использованием аннотаций типов, что повышает читаемость и надёжность кода. Встроенная поддержка асинхронного ввода‑вывода позволяет эффективно обрабатывать большое количество одновременных запросов, что особенно важно при обращении к внешнему AI‑сервису для генерации списка задач и при работе с базой данных.</w:t>
+      </w:r>
+    </w:p>
+    <w:p>
+      <w:r>
+        <w:t xml:space="preserve">Дополнительным преимуществом </w:t>
+      </w:r>
+      <w:proofErr w:type="spellStart"/>
+      <w:r>
+        <w:t>FastAPI</w:t>
+      </w:r>
+      <w:proofErr w:type="spellEnd"/>
+      <w:r>
+        <w:t xml:space="preserve"> является автоматическая генерация документации по API в формате </w:t>
+      </w:r>
+      <w:proofErr w:type="spellStart"/>
+      <w:r>
+        <w:t>OpenAPI</w:t>
+      </w:r>
+      <w:proofErr w:type="spellEnd"/>
+      <w:r>
+        <w:t>/</w:t>
+      </w:r>
+      <w:proofErr w:type="spellStart"/>
+      <w:r>
+        <w:t>Swagger</w:t>
+      </w:r>
+      <w:proofErr w:type="spellEnd"/>
+      <w:r>
+        <w:t xml:space="preserve">. Это упрощает тестирование и отладку серверной части, а также облегчает интеграцию с клиентскими приложениями, </w:t>
+      </w:r>
+      <w:r>
+        <w:t xml:space="preserve">имеется возможность </w:t>
+      </w:r>
+      <w:r>
+        <w:t>получа</w:t>
+      </w:r>
+      <w:r>
+        <w:t>ть</w:t>
+      </w:r>
+      <w:r>
+        <w:t xml:space="preserve"> наглядное и структурированное описание доступных </w:t>
+      </w:r>
+      <w:r>
+        <w:t>точек выхода</w:t>
+      </w:r>
+      <w:r>
+        <w:t xml:space="preserve"> и форматов данных. Для обработки кросс‑доменных запросов и интеграции с веб‑клиентом в </w:t>
+      </w:r>
+      <w:proofErr w:type="spellStart"/>
+      <w:r>
+        <w:t>FastAPI</w:t>
+      </w:r>
+      <w:proofErr w:type="spellEnd"/>
+      <w:r>
+        <w:t xml:space="preserve"> настроена поддержка CORS, что обеспечивает корректное взаимодействие браузерного приложения с сервером.</w:t>
+      </w:r>
+    </w:p>
+    <w:p>
+      <w:r>
+        <w:t xml:space="preserve">В качестве языка программирования для серверной части использован Python, который сочетает в себе простоту синтаксиса и широкие возможности для разработки веб‑сервисов и работы с искусственным интеллектом. Богатая экосистема библиотек и фреймворков на Python позволяет эффективно реализовывать аутентификацию, работу с базами данных, интеграцию с внешними API и логику бизнес‑процессов. Python используется для описания моделей данных, схем валидации, бизнес‑логики по управлению целями, </w:t>
+      </w:r>
+      <w:r>
+        <w:t>списками задач</w:t>
+      </w:r>
+      <w:r>
+        <w:t xml:space="preserve"> и задачами, а также для взаимодействия с AI‑сервисом через HTTP‑клиент.</w:t>
+      </w:r>
+    </w:p>
+    <w:p>
+      <w:r>
+        <w:t xml:space="preserve">Для хранения данных в системе используется реляционная база данных </w:t>
+      </w:r>
+      <w:proofErr w:type="spellStart"/>
+      <w:r>
+        <w:t>PostgreSQL</w:t>
+      </w:r>
+      <w:proofErr w:type="spellEnd"/>
+      <w:r>
+        <w:t xml:space="preserve">, обеспечивающая надёжное и масштабируемое хранение структурированной информации. В базе данных сохраняются учётные записи пользователей, сведения о целях, </w:t>
+      </w:r>
+      <w:r>
+        <w:t>списках целей</w:t>
+      </w:r>
+      <w:r>
+        <w:t xml:space="preserve"> и задачах, данные о командах и доступах, а также история взаимодействия с ИИ. </w:t>
+      </w:r>
+      <w:r>
+        <w:t xml:space="preserve">Выбор </w:t>
+      </w:r>
+      <w:proofErr w:type="spellStart"/>
+      <w:r>
+        <w:t>PostgreSQL</w:t>
+      </w:r>
+      <w:proofErr w:type="spellEnd"/>
+      <w:r>
+        <w:t xml:space="preserve"> обусловлен её высокой надёжностью, поддержкой сложных запросов и транзакций, а также </w:t>
       </w:r>
       <w:r>
         <w:lastRenderedPageBreak/>
-        <w:t xml:space="preserve">языке Python. </w:t>
+        <w:t>наличием развитых механизмов обеспечения целостности данных, что критически важно при работе</w:t>
+      </w:r>
+      <w:r>
+        <w:t xml:space="preserve"> </w:t>
+      </w:r>
+      <w:r>
+        <w:t xml:space="preserve">Взаимодействие с </w:t>
+      </w:r>
+      <w:r>
+        <w:t xml:space="preserve">базой данных </w:t>
+      </w:r>
+      <w:r>
+        <w:t>реализовано с помощью асинхронных средств доступа и ORM‑моделей, что позволяет комбинировать удобство объектного представления данных с преимуществами реляционного хранилища. Такой подход облегчает проектирование структуры данных и поддержание согласованности информации в системе.</w:t>
+      </w:r>
+      <w:r>
+        <w:t xml:space="preserve"> </w:t>
+      </w:r>
+      <w:r>
+        <w:t xml:space="preserve">Использование асинхронного драйвера в сочетании с возможностями </w:t>
       </w:r>
       <w:proofErr w:type="spellStart"/>
       <w:r>
@@ -4800,485 +4886,2266 @@
       </w:r>
       <w:proofErr w:type="spellEnd"/>
       <w:r>
-        <w:t xml:space="preserve"> обеспечивает декларативное описание маршрутов и схем данных с использованием аннотаций типов, что повышает читаемость и надёжность кода. Встроенная поддержка асинхронного ввода‑вывода позволяет эффективно обрабатывать большое количество одновременных запросов, что особенно важно при обращении к внешнему AI‑сервису для генерации списка задач и при работе с базой данных.</w:t>
-      </w:r>
-    </w:p>
-    <w:p>
-      <w:r>
-        <w:t xml:space="preserve">Дополнительным преимуществом </w:t>
+        <w:t xml:space="preserve"> позволяет избежать блокировок при выполнении длительных операций чтения и записи, сохраняя отзывчивость сервера даже при одновременной работе множества пользователей.</w:t>
+      </w:r>
+    </w:p>
+    <w:p>
+      <w:r>
+        <w:t xml:space="preserve">Для разработки клиентской части системы </w:t>
+      </w:r>
+      <w:r>
+        <w:t xml:space="preserve">выбраны </w:t>
       </w:r>
       <w:proofErr w:type="spellStart"/>
       <w:r>
+        <w:t>TypeScript</w:t>
+      </w:r>
+      <w:proofErr w:type="spellEnd"/>
+      <w:r>
+        <w:t xml:space="preserve">, </w:t>
+      </w:r>
+      <w:proofErr w:type="spellStart"/>
+      <w:r>
+        <w:t>React</w:t>
+      </w:r>
+      <w:proofErr w:type="spellEnd"/>
+      <w:r>
+        <w:t xml:space="preserve">, </w:t>
+      </w:r>
+      <w:proofErr w:type="spellStart"/>
+      <w:r>
+        <w:t>Vite</w:t>
+      </w:r>
+      <w:proofErr w:type="spellEnd"/>
+      <w:r>
+        <w:t xml:space="preserve">. </w:t>
+      </w:r>
+      <w:proofErr w:type="spellStart"/>
+      <w:r>
+        <w:t>TypeScript</w:t>
+      </w:r>
+      <w:proofErr w:type="spellEnd"/>
+      <w:r>
+        <w:t xml:space="preserve"> является надстройкой над JavaScript с поддержкой статической типизации, что позволяет на ранних этапах разработки выявлять большое количество ошибок и повышать надёжность клиентского кода. Использование типов упрощает сопровождение проекта, делает интерфейсы между компонентами более явными и облегчает рефакторинг.</w:t>
+      </w:r>
+    </w:p>
+    <w:p>
+      <w:r>
+        <w:t xml:space="preserve">Фреймворк </w:t>
+      </w:r>
+      <w:proofErr w:type="spellStart"/>
+      <w:r>
+        <w:t>React</w:t>
+      </w:r>
+      <w:proofErr w:type="spellEnd"/>
+      <w:r>
+        <w:t xml:space="preserve"> применяется для построения веб‑приложения, в котором реализованы страницы аутентификации, работа с личными и командными </w:t>
+      </w:r>
+      <w:r>
+        <w:t>списками задач</w:t>
+      </w:r>
+      <w:r>
+        <w:t xml:space="preserve">, чат с ИИ, поиск пользователей и управление командами. Компонентный подход </w:t>
+      </w:r>
+      <w:proofErr w:type="spellStart"/>
+      <w:r>
+        <w:t>React</w:t>
+      </w:r>
+      <w:proofErr w:type="spellEnd"/>
+      <w:r>
+        <w:t xml:space="preserve"> позволяет разбить интерфейс на </w:t>
+      </w:r>
+      <w:proofErr w:type="spellStart"/>
+      <w:r>
+        <w:t>переиспользуемые</w:t>
+      </w:r>
+      <w:proofErr w:type="spellEnd"/>
+      <w:r>
+        <w:t xml:space="preserve"> элементы, что ускоряет разработку и улучшает структурированность кода. Благодаря этому обеспечивается гибкое отображение списков задач, истории взаимодействия с ИИ и различных состояний интерфейса в зависимости от действий пользователя.</w:t>
+      </w:r>
+      <w:r>
+        <w:t xml:space="preserve"> О</w:t>
+      </w:r>
+      <w:r>
+        <w:t>бновление интерфейса на основе изменения состояния компонентов делает работу с приложением плавной, что положительно сказывается на пользовательском опыте.</w:t>
+      </w:r>
+    </w:p>
+    <w:p>
+      <w:r>
+        <w:t xml:space="preserve">Сборка и локальная разработка </w:t>
+      </w:r>
+      <w:proofErr w:type="spellStart"/>
+      <w:r>
+        <w:t>фронтенда</w:t>
+      </w:r>
+      <w:proofErr w:type="spellEnd"/>
+      <w:r>
+        <w:t xml:space="preserve"> выполняются с помощью инструмента </w:t>
+      </w:r>
+      <w:proofErr w:type="spellStart"/>
+      <w:r>
+        <w:t>Vite</w:t>
+      </w:r>
+      <w:proofErr w:type="spellEnd"/>
+      <w:r>
+        <w:t xml:space="preserve">, который обеспечивает быструю перезагрузку модулей и оптимизированную сборку проекта. </w:t>
+      </w:r>
+      <w:proofErr w:type="spellStart"/>
+      <w:r>
+        <w:t>Vite</w:t>
+      </w:r>
+      <w:proofErr w:type="spellEnd"/>
+      <w:r>
+        <w:t xml:space="preserve"> упрощает настройку </w:t>
+      </w:r>
+      <w:r>
+        <w:t>просмотра работы</w:t>
+      </w:r>
+      <w:r>
+        <w:t xml:space="preserve"> запросов к </w:t>
+      </w:r>
+      <w:r>
+        <w:t>серверу</w:t>
+      </w:r>
+      <w:r>
+        <w:t xml:space="preserve">, что позволяет в процессе разработки обращаться к реальному </w:t>
+      </w:r>
+      <w:r>
+        <w:lastRenderedPageBreak/>
+        <w:t>серверу</w:t>
+      </w:r>
+      <w:r>
+        <w:t xml:space="preserve"> по специальному адресу</w:t>
+      </w:r>
+      <w:r>
+        <w:t>, не изменяя клиентский код. Это создаёт удобную и производительную среду для разработки и тестирования веб‑интерфейса.</w:t>
+      </w:r>
+      <w:r>
+        <w:t xml:space="preserve"> </w:t>
+      </w:r>
+      <w:r>
+        <w:t>Высокая скорость сборки и мгновенное отражение изменений в браузере существенно ускоряют итеративный процесс доработки пользовательского интерфейса и отладки клиентской логики.</w:t>
+      </w:r>
+    </w:p>
+    <w:p>
+      <w:r>
+        <w:t xml:space="preserve">Для стилизации пользовательского интерфейса веб‑приложения используется </w:t>
+      </w:r>
+      <w:proofErr w:type="spellStart"/>
+      <w:r>
+        <w:t>Tailwind</w:t>
+      </w:r>
+      <w:proofErr w:type="spellEnd"/>
+      <w:r>
+        <w:t xml:space="preserve"> CSS, представляющий собой утилитарный CSS‑фреймворк. </w:t>
+      </w:r>
+      <w:r>
+        <w:t>Н</w:t>
+      </w:r>
+      <w:r>
+        <w:t>абор готовых классов для настройки отступов, цветов, шрифтов, сеток и других параметров оформления. Такой подход позволяет описывать внешний вид компонентов прямо в разметке, сокращать объём и быстро создавать современный адаптивный интерфейс. Модульность и гибкость дают возможность легко изменять и развивать дизайн без существенных изменений в структуре приложения.</w:t>
+      </w:r>
+    </w:p>
+    <w:p>
+      <w:pPr>
+        <w:rPr>
+          <w:rFonts w:cs="Times New Roman"/>
+        </w:rPr>
+      </w:pPr>
+      <w:r>
+        <w:rPr>
+          <w:rFonts w:cs="Times New Roman"/>
+        </w:rPr>
+        <w:t>Взаимодействие с внешним сервисом искусственного интеллекта реализовано через специализированный сервисный класс на стороне</w:t>
+      </w:r>
+      <w:r>
+        <w:rPr>
+          <w:rFonts w:cs="Times New Roman"/>
+        </w:rPr>
+        <w:t xml:space="preserve"> сервера</w:t>
+      </w:r>
+      <w:r>
+        <w:rPr>
+          <w:rFonts w:cs="Times New Roman"/>
+        </w:rPr>
+        <w:t xml:space="preserve">. Для этого используется HTTP‑клиент с поддержкой асинхронных запросов, который отправляет </w:t>
+      </w:r>
+      <w:r>
+        <w:rPr>
+          <w:rFonts w:cs="Times New Roman"/>
+        </w:rPr>
+        <w:t>системные правила общения</w:t>
+      </w:r>
+      <w:r>
+        <w:rPr>
+          <w:rFonts w:cs="Times New Roman"/>
+        </w:rPr>
+        <w:t xml:space="preserve"> и текст цели в AI‑сервис и получает структурированный ответ в формате JSON. Обработчик на стороне </w:t>
+      </w:r>
+      <w:proofErr w:type="spellStart"/>
+      <w:r>
+        <w:rPr>
+          <w:rFonts w:cs="Times New Roman"/>
+        </w:rPr>
         <w:t>FastAPI</w:t>
       </w:r>
       <w:proofErr w:type="spellEnd"/>
       <w:r>
-        <w:t xml:space="preserve"> является автоматическая генерация документации по API в формате </w:t>
+        <w:rPr>
+          <w:rFonts w:cs="Times New Roman"/>
+        </w:rPr>
+        <w:t xml:space="preserve"> проводит валидацию ответа, преобразует его в внутренние структуры данных и сохраняет результаты в базе данных. Такой подход обеспечивает чёткое разделение ответственности: Python‑</w:t>
       </w:r>
       <w:proofErr w:type="spellStart"/>
       <w:r>
-        <w:t>OpenAPI</w:t>
+        <w:rPr>
+          <w:rFonts w:cs="Times New Roman"/>
+        </w:rPr>
+        <w:t>backend</w:t>
       </w:r>
       <w:proofErr w:type="spellEnd"/>
       <w:r>
-        <w:t>/</w:t>
+        <w:rPr>
+          <w:rFonts w:cs="Times New Roman"/>
+        </w:rPr>
+        <w:t xml:space="preserve"> отвечает за бизнес‑логику и хранение данных, а внешний AI‑сервис – за генерацию содержания задач на основе пользовательской цели.</w:t>
+      </w:r>
+    </w:p>
+    <w:p>
+      <w:pPr>
+        <w:rPr>
+          <w:rFonts w:cs="Times New Roman"/>
+        </w:rPr>
+      </w:pPr>
+      <w:r>
+        <w:rPr>
+          <w:rFonts w:cs="Times New Roman"/>
+        </w:rPr>
+        <w:t xml:space="preserve">В совокупности выбранный </w:t>
+      </w:r>
+      <w:r>
+        <w:rPr>
+          <w:rFonts w:cs="Times New Roman"/>
+        </w:rPr>
+        <w:t>список</w:t>
+      </w:r>
+      <w:r>
+        <w:rPr>
+          <w:rFonts w:cs="Times New Roman"/>
+        </w:rPr>
+        <w:t xml:space="preserve"> технологий </w:t>
+      </w:r>
+      <w:r>
+        <w:t>–</w:t>
+      </w:r>
+      <w:r>
+        <w:rPr>
+          <w:rFonts w:cs="Times New Roman"/>
+        </w:rPr>
+        <w:t xml:space="preserve"> </w:t>
       </w:r>
       <w:proofErr w:type="spellStart"/>
       <w:r>
-        <w:t>Swagger</w:t>
+        <w:rPr>
+          <w:rFonts w:cs="Times New Roman"/>
+        </w:rPr>
+        <w:t>FastAPI</w:t>
       </w:r>
       <w:proofErr w:type="spellEnd"/>
       <w:r>
-        <w:t xml:space="preserve">. Это упрощает тестирование и отладку серверной части, а также облегчает интеграцию с клиентскими приложениями, </w:t>
-      </w:r>
-      <w:r>
-        <w:t xml:space="preserve">имеется возможность </w:t>
-      </w:r>
-      <w:r>
-        <w:t>получа</w:t>
-      </w:r>
-      <w:r>
-        <w:t>ть</w:t>
-      </w:r>
-      <w:r>
-        <w:t xml:space="preserve"> наглядное и структурированное описание доступных </w:t>
+        <w:rPr>
+          <w:rFonts w:cs="Times New Roman"/>
+        </w:rPr>
+        <w:t xml:space="preserve"> и Python для серверной части, </w:t>
       </w:r>
       <w:proofErr w:type="spellStart"/>
       <w:r>
-        <w:t>эндпоинтов</w:t>
+        <w:rPr>
+          <w:rFonts w:cs="Times New Roman"/>
+        </w:rPr>
+        <w:t>PostgreSQL</w:t>
       </w:r>
       <w:proofErr w:type="spellEnd"/>
       <w:r>
-        <w:t xml:space="preserve"> и форматов данных. Для обработки кросс‑доменных запросов и интеграции с веб‑клиентом в </w:t>
+        <w:rPr>
+          <w:rFonts w:cs="Times New Roman"/>
+        </w:rPr>
+        <w:t xml:space="preserve"> для хранения данных, </w:t>
       </w:r>
       <w:proofErr w:type="spellStart"/>
       <w:r>
-        <w:t>FastAPI</w:t>
+        <w:rPr>
+          <w:rFonts w:cs="Times New Roman"/>
+        </w:rPr>
+        <w:t>TypeScript</w:t>
       </w:r>
       <w:proofErr w:type="spellEnd"/>
       <w:r>
-        <w:t xml:space="preserve"> настроена поддержка CORS, что обеспечивает корректное взаимодействие браузерного приложения с сервером.</w:t>
-      </w:r>
-    </w:p>
-    <w:p>
-      <w:r>
-        <w:t xml:space="preserve">В качестве языка программирования для серверной части использован Python, который сочетает в себе простоту синтаксиса и широкие возможности для разработки веб‑сервисов и работы с искусственным интеллектом. Богатая экосистема библиотек и фреймворков на Python позволяет эффективно реализовывать аутентификацию, работу с базами данных, интеграцию с внешними API и логику бизнес‑процессов. В проекте </w:t>
+        <w:rPr>
+          <w:rFonts w:cs="Times New Roman"/>
+        </w:rPr>
+        <w:t xml:space="preserve">, </w:t>
       </w:r>
       <w:proofErr w:type="spellStart"/>
       <w:r>
-        <w:t>TargetLayer</w:t>
+        <w:rPr>
+          <w:rFonts w:cs="Times New Roman"/>
+        </w:rPr>
+        <w:t>React</w:t>
       </w:r>
       <w:proofErr w:type="spellEnd"/>
       <w:r>
-        <w:t xml:space="preserve"> Python используется для описания моделей данных, схем валидации, бизнес‑логики по управлению целями, </w:t>
-      </w:r>
-      <w:r>
+        <w:rPr>
+          <w:rFonts w:cs="Times New Roman"/>
+        </w:rPr>
+        <w:t xml:space="preserve">, </w:t>
+      </w:r>
+      <w:proofErr w:type="spellStart"/>
+      <w:r>
+        <w:rPr>
+          <w:rFonts w:cs="Times New Roman"/>
+        </w:rPr>
+        <w:t>Vite</w:t>
+      </w:r>
+      <w:proofErr w:type="spellEnd"/>
+      <w:r>
+        <w:rPr>
+          <w:rFonts w:cs="Times New Roman"/>
+        </w:rPr>
+        <w:t xml:space="preserve"> и </w:t>
+      </w:r>
+      <w:proofErr w:type="spellStart"/>
+      <w:r>
+        <w:rPr>
+          <w:rFonts w:cs="Times New Roman"/>
+        </w:rPr>
+        <w:t>Tailwind</w:t>
+      </w:r>
+      <w:proofErr w:type="spellEnd"/>
+      <w:r>
+        <w:rPr>
+          <w:rFonts w:cs="Times New Roman"/>
+        </w:rPr>
+        <w:t xml:space="preserve"> CSS для веб‑клиента, а также интеграция с внешним AI‑сервисом </w:t>
+      </w:r>
+      <w:r>
+        <w:t>–</w:t>
+      </w:r>
+      <w:r>
+        <w:rPr>
+          <w:rFonts w:cs="Times New Roman"/>
+        </w:rPr>
+        <w:t xml:space="preserve"> обеспечивает надёжную основу для разработки, масштабирования и сопровождения системы декомпозиции целей, обеспечивая удобный интерфейс для пользователей и гибкую архитектуру для дальнейшего развития функционала.</w:t>
+      </w:r>
+    </w:p>
+    <w:p>
+      <w:pPr>
+        <w:rPr>
+          <w:rFonts w:cs="Times New Roman"/>
+          <w:b/>
+          <w:bCs/>
+          <w:sz w:val="32"/>
+          <w:szCs w:val="32"/>
+        </w:rPr>
+      </w:pPr>
+      <w:r>
+        <w:rPr>
+          <w:rFonts w:cs="Times New Roman"/>
+          <w:b/>
+          <w:bCs/>
+          <w:sz w:val="32"/>
+          <w:szCs w:val="32"/>
+        </w:rPr>
+        <w:lastRenderedPageBreak/>
+        <w:t>2 Технологический раздел</w:t>
+      </w:r>
+    </w:p>
+    <w:p>
+      <w:pPr>
+        <w:rPr>
+          <w:rFonts w:cs="Times New Roman"/>
+          <w:b/>
+          <w:bCs/>
+          <w:szCs w:val="28"/>
+        </w:rPr>
+      </w:pPr>
+      <w:r>
+        <w:rPr>
+          <w:rFonts w:cs="Times New Roman"/>
+          <w:b/>
+          <w:bCs/>
+          <w:szCs w:val="28"/>
+        </w:rPr>
+        <w:t>2.1 Структура базы данных</w:t>
+      </w:r>
+    </w:p>
+    <w:p>
+      <w:pPr>
+        <w:rPr>
+          <w:rFonts w:cs="Times New Roman"/>
+          <w:szCs w:val="28"/>
+        </w:rPr>
+      </w:pPr>
+      <w:r>
+        <w:rPr>
+          <w:rFonts w:cs="Times New Roman"/>
+          <w:szCs w:val="28"/>
+        </w:rPr>
+        <w:t xml:space="preserve">При анализе предметной области сервиса </w:t>
+      </w:r>
+      <w:r>
+        <w:rPr>
+          <w:rFonts w:cs="Times New Roman"/>
+          <w:szCs w:val="28"/>
+        </w:rPr>
+        <w:t>«</w:t>
+      </w:r>
+      <w:r>
+        <w:rPr>
+          <w:rFonts w:cs="Times New Roman"/>
+          <w:szCs w:val="28"/>
+        </w:rPr>
+        <w:t>декомпозиции целей с ИИ</w:t>
+      </w:r>
+      <w:r>
+        <w:rPr>
+          <w:rFonts w:cs="Times New Roman"/>
+          <w:szCs w:val="28"/>
+        </w:rPr>
+        <w:t>»</w:t>
+      </w:r>
+      <w:r>
+        <w:rPr>
+          <w:rFonts w:cs="Times New Roman"/>
+          <w:szCs w:val="28"/>
+        </w:rPr>
+        <w:t xml:space="preserve"> были выделены следующие сущности:</w:t>
+      </w:r>
+    </w:p>
+    <w:p>
+      <w:pPr>
+        <w:pStyle w:val="a4"/>
+        <w:numPr>
+          <w:ilvl w:val="0"/>
+          <w:numId w:val="7"/>
+        </w:numPr>
+        <w:spacing w:line="360" w:lineRule="auto"/>
+        <w:ind w:left="0" w:firstLine="709"/>
+        <w:rPr>
+          <w:rFonts w:ascii="Times New Roman" w:hAnsi="Times New Roman"/>
+          <w:szCs w:val="28"/>
+        </w:rPr>
+      </w:pPr>
+      <w:r>
+        <w:rPr>
+          <w:rFonts w:ascii="Times New Roman" w:hAnsi="Times New Roman"/>
+          <w:szCs w:val="28"/>
+        </w:rPr>
+        <w:t>пользователи (</w:t>
+      </w:r>
+      <w:r>
+        <w:rPr>
+          <w:rFonts w:ascii="Times New Roman" w:hAnsi="Times New Roman"/>
+          <w:szCs w:val="28"/>
+          <w:lang w:val="en-US"/>
+        </w:rPr>
+        <w:t>Users</w:t>
+      </w:r>
+      <w:r>
+        <w:rPr>
+          <w:rFonts w:ascii="Times New Roman" w:hAnsi="Times New Roman"/>
+          <w:szCs w:val="28"/>
+        </w:rPr>
+        <w:t xml:space="preserve">): </w:t>
+      </w:r>
+      <w:r>
+        <w:rPr>
+          <w:rFonts w:ascii="Times New Roman" w:hAnsi="Times New Roman"/>
+          <w:color w:val="1F2328"/>
+          <w:szCs w:val="28"/>
+          <w:shd w:val="clear" w:color="auto" w:fill="FFFFFF"/>
+        </w:rPr>
+        <w:t>содержит информацию об учетной записи пользователя: уникальный идентификатор, логин, имя, фамилию, отчество, адрес электронной почты, хэш пароля для аутентификации, ссылку на фотографию профиля, а также даты создания и последнего обновления записи</w:t>
+      </w:r>
+      <w:r>
+        <w:rPr>
+          <w:rFonts w:ascii="Times New Roman" w:hAnsi="Times New Roman"/>
+          <w:color w:val="1F2328"/>
+          <w:szCs w:val="28"/>
+          <w:shd w:val="clear" w:color="auto" w:fill="FFFFFF"/>
+        </w:rPr>
+        <w:t>;</w:t>
+      </w:r>
+    </w:p>
+    <w:p>
+      <w:pPr>
+        <w:pStyle w:val="a4"/>
+        <w:numPr>
+          <w:ilvl w:val="0"/>
+          <w:numId w:val="7"/>
+        </w:numPr>
+        <w:spacing w:line="360" w:lineRule="auto"/>
+        <w:ind w:left="0" w:firstLine="709"/>
+        <w:rPr>
+          <w:rFonts w:ascii="Times New Roman" w:hAnsi="Times New Roman"/>
+          <w:szCs w:val="28"/>
+        </w:rPr>
+      </w:pPr>
+      <w:r>
+        <w:rPr>
+          <w:rFonts w:ascii="Times New Roman" w:hAnsi="Times New Roman"/>
+          <w:szCs w:val="28"/>
+        </w:rPr>
+        <w:t>цели (</w:t>
+      </w:r>
+      <w:proofErr w:type="spellStart"/>
+      <w:r>
+        <w:rPr>
+          <w:rFonts w:ascii="Times New Roman" w:hAnsi="Times New Roman"/>
+          <w:szCs w:val="28"/>
+        </w:rPr>
+        <w:t>Goals</w:t>
+      </w:r>
+      <w:proofErr w:type="spellEnd"/>
+      <w:r>
+        <w:rPr>
+          <w:rFonts w:ascii="Times New Roman" w:hAnsi="Times New Roman"/>
+          <w:szCs w:val="28"/>
+        </w:rPr>
+        <w:t>): содержит информацию о цели пользовател</w:t>
+      </w:r>
+      <w:r>
+        <w:rPr>
+          <w:rFonts w:ascii="Times New Roman" w:hAnsi="Times New Roman"/>
+          <w:szCs w:val="28"/>
+        </w:rPr>
+        <w:t>я,</w:t>
+      </w:r>
+      <w:r>
+        <w:rPr>
+          <w:rFonts w:ascii="Times New Roman" w:hAnsi="Times New Roman"/>
+          <w:szCs w:val="28"/>
+        </w:rPr>
+        <w:t xml:space="preserve"> заголовок, описание, дату создания. </w:t>
+      </w:r>
+    </w:p>
+    <w:p>
+      <w:pPr>
+        <w:pStyle w:val="a4"/>
+        <w:numPr>
+          <w:ilvl w:val="0"/>
+          <w:numId w:val="7"/>
+        </w:numPr>
+        <w:spacing w:line="360" w:lineRule="auto"/>
+        <w:ind w:left="0" w:firstLine="709"/>
+        <w:rPr>
+          <w:rFonts w:ascii="Times New Roman" w:hAnsi="Times New Roman"/>
+          <w:szCs w:val="28"/>
+        </w:rPr>
+      </w:pPr>
+      <w:r>
+        <w:rPr>
+          <w:rFonts w:ascii="Times New Roman" w:hAnsi="Times New Roman"/>
+          <w:szCs w:val="28"/>
+        </w:rPr>
+        <w:t xml:space="preserve">списки задач </w:t>
+      </w:r>
+      <w:r>
+        <w:rPr>
+          <w:rFonts w:ascii="Times New Roman" w:hAnsi="Times New Roman"/>
+          <w:szCs w:val="28"/>
+        </w:rPr>
+        <w:t>(</w:t>
+      </w:r>
+      <w:proofErr w:type="spellStart"/>
+      <w:r>
+        <w:rPr>
+          <w:rFonts w:ascii="Times New Roman" w:hAnsi="Times New Roman"/>
+          <w:szCs w:val="28"/>
+        </w:rPr>
+        <w:t>Roadmaps</w:t>
+      </w:r>
+      <w:proofErr w:type="spellEnd"/>
+      <w:r>
+        <w:rPr>
+          <w:rFonts w:ascii="Times New Roman" w:hAnsi="Times New Roman"/>
+          <w:szCs w:val="28"/>
+        </w:rPr>
+        <w:t>): содержит информацию о плане достижения цели, даты создания</w:t>
+      </w:r>
+      <w:r>
+        <w:rPr>
+          <w:rFonts w:ascii="Times New Roman" w:hAnsi="Times New Roman"/>
+          <w:szCs w:val="28"/>
+        </w:rPr>
+        <w:t xml:space="preserve">, </w:t>
+      </w:r>
+      <w:r>
+        <w:rPr>
+          <w:rFonts w:ascii="Times New Roman" w:hAnsi="Times New Roman"/>
+          <w:szCs w:val="28"/>
+        </w:rPr>
+        <w:t>обновления, ссылку на цель и принадлежность команде</w:t>
+      </w:r>
+      <w:r>
+        <w:rPr>
+          <w:rFonts w:ascii="Times New Roman" w:hAnsi="Times New Roman"/>
+          <w:szCs w:val="28"/>
+        </w:rPr>
+        <w:t xml:space="preserve">. Списки </w:t>
+      </w:r>
+      <w:r>
+        <w:rPr>
+          <w:rFonts w:ascii="Times New Roman" w:hAnsi="Times New Roman"/>
+          <w:szCs w:val="28"/>
+        </w:rPr>
+        <w:t>включа</w:t>
+      </w:r>
+      <w:r>
+        <w:rPr>
+          <w:rFonts w:ascii="Times New Roman" w:hAnsi="Times New Roman"/>
+          <w:szCs w:val="28"/>
+        </w:rPr>
+        <w:t>ют</w:t>
+      </w:r>
+      <w:r>
+        <w:rPr>
+          <w:rFonts w:ascii="Times New Roman" w:hAnsi="Times New Roman"/>
+          <w:szCs w:val="28"/>
+        </w:rPr>
+        <w:t xml:space="preserve"> задач</w:t>
+      </w:r>
+      <w:r>
+        <w:rPr>
+          <w:rFonts w:ascii="Times New Roman" w:hAnsi="Times New Roman"/>
+          <w:szCs w:val="28"/>
+        </w:rPr>
+        <w:t>и</w:t>
+      </w:r>
+      <w:r>
+        <w:rPr>
+          <w:rFonts w:ascii="Times New Roman" w:hAnsi="Times New Roman"/>
+          <w:szCs w:val="28"/>
+        </w:rPr>
+        <w:t xml:space="preserve"> и мо</w:t>
+      </w:r>
+      <w:r>
+        <w:rPr>
+          <w:rFonts w:ascii="Times New Roman" w:hAnsi="Times New Roman"/>
+          <w:szCs w:val="28"/>
+        </w:rPr>
+        <w:t>гут</w:t>
+      </w:r>
+      <w:r>
+        <w:rPr>
+          <w:rFonts w:ascii="Times New Roman" w:hAnsi="Times New Roman"/>
+          <w:szCs w:val="28"/>
+        </w:rPr>
+        <w:t xml:space="preserve"> иметь записи доступа</w:t>
+      </w:r>
+      <w:r>
+        <w:rPr>
+          <w:rFonts w:ascii="Times New Roman" w:hAnsi="Times New Roman"/>
+          <w:szCs w:val="28"/>
+        </w:rPr>
+        <w:t xml:space="preserve"> и </w:t>
+      </w:r>
+      <w:r>
+        <w:rPr>
+          <w:rFonts w:ascii="Times New Roman" w:hAnsi="Times New Roman"/>
+          <w:szCs w:val="28"/>
+        </w:rPr>
+        <w:t>копирования</w:t>
+      </w:r>
+      <w:r>
+        <w:rPr>
+          <w:rFonts w:ascii="Times New Roman" w:hAnsi="Times New Roman"/>
+          <w:szCs w:val="28"/>
+        </w:rPr>
+        <w:t>;</w:t>
+      </w:r>
+    </w:p>
+    <w:p>
+      <w:pPr>
+        <w:pStyle w:val="a4"/>
+        <w:numPr>
+          <w:ilvl w:val="0"/>
+          <w:numId w:val="7"/>
+        </w:numPr>
+        <w:spacing w:line="360" w:lineRule="auto"/>
+        <w:ind w:left="0" w:firstLine="709"/>
+        <w:rPr>
+          <w:rFonts w:ascii="Times New Roman" w:hAnsi="Times New Roman"/>
+          <w:szCs w:val="28"/>
+        </w:rPr>
+      </w:pPr>
+      <w:r>
+        <w:rPr>
+          <w:rFonts w:ascii="Times New Roman" w:hAnsi="Times New Roman"/>
+          <w:szCs w:val="28"/>
+        </w:rPr>
+        <w:t>задачи (</w:t>
+      </w:r>
+      <w:proofErr w:type="spellStart"/>
+      <w:r>
+        <w:rPr>
+          <w:rFonts w:ascii="Times New Roman" w:hAnsi="Times New Roman"/>
+          <w:szCs w:val="28"/>
+        </w:rPr>
+        <w:t>Tasks</w:t>
+      </w:r>
+      <w:proofErr w:type="spellEnd"/>
+      <w:r>
+        <w:rPr>
+          <w:rFonts w:ascii="Times New Roman" w:hAnsi="Times New Roman"/>
+          <w:szCs w:val="28"/>
+        </w:rPr>
+        <w:t>): содержит информацию о шагах</w:t>
+      </w:r>
+      <w:r>
+        <w:rPr>
+          <w:rFonts w:ascii="Times New Roman" w:hAnsi="Times New Roman"/>
+          <w:szCs w:val="28"/>
+        </w:rPr>
+        <w:t xml:space="preserve"> </w:t>
+      </w:r>
+      <w:r>
+        <w:rPr>
+          <w:rFonts w:ascii="Times New Roman" w:hAnsi="Times New Roman"/>
+          <w:szCs w:val="28"/>
+        </w:rPr>
+        <w:t xml:space="preserve">списка, </w:t>
+      </w:r>
+      <w:r>
+        <w:rPr>
+          <w:rFonts w:ascii="Times New Roman" w:hAnsi="Times New Roman"/>
+          <w:szCs w:val="28"/>
+        </w:rPr>
+        <w:t>заголовок, описание</w:t>
+      </w:r>
+      <w:r>
+        <w:rPr>
+          <w:rFonts w:ascii="Times New Roman" w:hAnsi="Times New Roman"/>
+          <w:szCs w:val="28"/>
+        </w:rPr>
+        <w:t xml:space="preserve">, </w:t>
+      </w:r>
+      <w:r>
+        <w:rPr>
+          <w:rFonts w:ascii="Times New Roman" w:hAnsi="Times New Roman"/>
+          <w:szCs w:val="28"/>
+        </w:rPr>
+        <w:t xml:space="preserve">порядок выполнения, статус выполнения, дату выполнения, дату создания, а также ссылку на </w:t>
+      </w:r>
+      <w:r>
+        <w:rPr>
+          <w:rFonts w:ascii="Times New Roman" w:hAnsi="Times New Roman"/>
+          <w:szCs w:val="28"/>
+        </w:rPr>
+        <w:t>список задач</w:t>
+      </w:r>
+      <w:r>
+        <w:rPr>
+          <w:rFonts w:ascii="Times New Roman" w:hAnsi="Times New Roman"/>
+          <w:szCs w:val="28"/>
+        </w:rPr>
+        <w:t>;</w:t>
+      </w:r>
+    </w:p>
+    <w:p>
+      <w:pPr>
+        <w:pStyle w:val="a4"/>
+        <w:numPr>
+          <w:ilvl w:val="0"/>
+          <w:numId w:val="7"/>
+        </w:numPr>
+        <w:spacing w:line="360" w:lineRule="auto"/>
+        <w:ind w:left="0" w:firstLine="709"/>
+        <w:rPr>
+          <w:rFonts w:ascii="Times New Roman" w:hAnsi="Times New Roman"/>
+          <w:szCs w:val="28"/>
+        </w:rPr>
+      </w:pPr>
+      <w:r>
+        <w:rPr>
+          <w:rFonts w:ascii="Times New Roman" w:hAnsi="Times New Roman"/>
+          <w:szCs w:val="28"/>
+        </w:rPr>
+        <w:t>команды (</w:t>
+      </w:r>
+      <w:proofErr w:type="spellStart"/>
+      <w:r>
+        <w:rPr>
+          <w:rFonts w:ascii="Times New Roman" w:hAnsi="Times New Roman"/>
+          <w:szCs w:val="28"/>
+        </w:rPr>
+        <w:t>Teams</w:t>
+      </w:r>
+      <w:proofErr w:type="spellEnd"/>
+      <w:r>
+        <w:rPr>
+          <w:rFonts w:ascii="Times New Roman" w:hAnsi="Times New Roman"/>
+          <w:szCs w:val="28"/>
+        </w:rPr>
+        <w:t xml:space="preserve">): содержит информацию о рабочих группах пользователей, внутри которых можно совместно работать с </w:t>
+      </w:r>
+      <w:r>
+        <w:rPr>
+          <w:rFonts w:ascii="Times New Roman" w:hAnsi="Times New Roman"/>
+          <w:szCs w:val="28"/>
+        </w:rPr>
         <w:t>списками задач</w:t>
       </w:r>
       <w:r>
-        <w:t xml:space="preserve"> и задачами, а также для взаимодействия с AI‑сервисом через HTTP‑клиент.</w:t>
-      </w:r>
-    </w:p>
-    <w:p>
-      <w:r>
-        <w:t xml:space="preserve">Для хранения данных в системе используется реляционная база данных </w:t>
+        <w:rPr>
+          <w:rFonts w:ascii="Times New Roman" w:hAnsi="Times New Roman"/>
+          <w:szCs w:val="28"/>
+        </w:rPr>
+        <w:t>;</w:t>
+      </w:r>
+    </w:p>
+    <w:p>
+      <w:pPr>
+        <w:pStyle w:val="a4"/>
+        <w:numPr>
+          <w:ilvl w:val="0"/>
+          <w:numId w:val="7"/>
+        </w:numPr>
+        <w:spacing w:line="360" w:lineRule="auto"/>
+        <w:ind w:left="0" w:firstLine="709"/>
+        <w:rPr>
+          <w:rFonts w:ascii="Times New Roman" w:hAnsi="Times New Roman"/>
+          <w:szCs w:val="28"/>
+        </w:rPr>
+      </w:pPr>
+      <w:r>
+        <w:rPr>
+          <w:rFonts w:ascii="Times New Roman" w:hAnsi="Times New Roman"/>
+          <w:szCs w:val="28"/>
+        </w:rPr>
+        <w:t>участники команд (</w:t>
       </w:r>
       <w:proofErr w:type="spellStart"/>
       <w:r>
-        <w:t>PostgreSQL</w:t>
+        <w:rPr>
+          <w:rFonts w:ascii="Times New Roman" w:hAnsi="Times New Roman"/>
+          <w:szCs w:val="28"/>
+        </w:rPr>
+        <w:t>TeamMember</w:t>
       </w:r>
       <w:proofErr w:type="spellEnd"/>
       <w:r>
-        <w:t xml:space="preserve">, обеспечивающая надёжное и масштабируемое хранение структурированной информации. В базе данных сохраняются учётные записи пользователей, сведения о целях, </w:t>
-      </w:r>
-      <w:r>
-        <w:t>списках целей</w:t>
-      </w:r>
-      <w:r>
-        <w:t xml:space="preserve"> и задачах, данные о командах и доступах, а также история взаимодействия с ИИ. Взаимодействие с </w:t>
+        <w:rPr>
+          <w:rFonts w:ascii="Times New Roman" w:hAnsi="Times New Roman"/>
+          <w:szCs w:val="28"/>
+        </w:rPr>
+        <w:t>): содержит информацию о принадлежности пользователя к команде, а также параметры участия</w:t>
+      </w:r>
+      <w:r>
+        <w:rPr>
+          <w:rFonts w:ascii="Times New Roman" w:hAnsi="Times New Roman"/>
+          <w:szCs w:val="28"/>
+        </w:rPr>
+        <w:t>, такие как роль</w:t>
+      </w:r>
+      <w:r>
+        <w:rPr>
+          <w:rFonts w:ascii="Times New Roman" w:hAnsi="Times New Roman"/>
+          <w:szCs w:val="28"/>
+        </w:rPr>
+        <w:t>;</w:t>
+      </w:r>
+    </w:p>
+    <w:p>
+      <w:pPr>
+        <w:pStyle w:val="a4"/>
+        <w:numPr>
+          <w:ilvl w:val="0"/>
+          <w:numId w:val="7"/>
+        </w:numPr>
+        <w:spacing w:line="360" w:lineRule="auto"/>
+        <w:ind w:left="0" w:firstLine="709"/>
+        <w:rPr>
+          <w:rFonts w:ascii="Times New Roman" w:hAnsi="Times New Roman"/>
+          <w:szCs w:val="28"/>
+        </w:rPr>
+      </w:pPr>
+      <w:r>
+        <w:rPr>
+          <w:rFonts w:ascii="Times New Roman" w:hAnsi="Times New Roman"/>
+          <w:szCs w:val="28"/>
+        </w:rPr>
+        <w:t>роли в команде (</w:t>
       </w:r>
       <w:proofErr w:type="spellStart"/>
       <w:r>
-        <w:t>PostgreSQL</w:t>
+        <w:rPr>
+          <w:rFonts w:ascii="Times New Roman" w:hAnsi="Times New Roman"/>
+          <w:szCs w:val="28"/>
+        </w:rPr>
+        <w:t>TeamRole</w:t>
       </w:r>
       <w:proofErr w:type="spellEnd"/>
       <w:r>
-        <w:t xml:space="preserve"> реализовано с помощью асинхронных средств доступа и ORM‑моделей, что </w:t>
-      </w:r>
-      <w:r>
+        <w:rPr>
+          <w:rFonts w:ascii="Times New Roman" w:hAnsi="Times New Roman"/>
+          <w:szCs w:val="28"/>
+        </w:rPr>
+        <w:t>): содержит информацию о ролях</w:t>
+      </w:r>
+      <w:r>
+        <w:rPr>
+          <w:rFonts w:ascii="Times New Roman" w:hAnsi="Times New Roman"/>
+          <w:szCs w:val="28"/>
+        </w:rPr>
+        <w:t xml:space="preserve">, </w:t>
+      </w:r>
+      <w:r>
+        <w:rPr>
+          <w:rFonts w:ascii="Times New Roman" w:hAnsi="Times New Roman"/>
+          <w:szCs w:val="28"/>
+        </w:rPr>
+        <w:t>уровнях прав участника в рамках команды</w:t>
+      </w:r>
+      <w:r>
+        <w:rPr>
+          <w:rFonts w:ascii="Times New Roman" w:hAnsi="Times New Roman"/>
+          <w:szCs w:val="28"/>
+        </w:rPr>
+        <w:t>;</w:t>
+      </w:r>
+    </w:p>
+    <w:p>
+      <w:pPr>
+        <w:pStyle w:val="a4"/>
+        <w:numPr>
+          <w:ilvl w:val="0"/>
+          <w:numId w:val="7"/>
+        </w:numPr>
+        <w:spacing w:line="360" w:lineRule="auto"/>
+        <w:ind w:left="0" w:firstLine="709"/>
+        <w:rPr>
+          <w:rFonts w:ascii="Times New Roman" w:hAnsi="Times New Roman"/>
+          <w:szCs w:val="28"/>
+        </w:rPr>
+      </w:pPr>
+      <w:r>
+        <w:rPr>
+          <w:rFonts w:ascii="Times New Roman" w:hAnsi="Times New Roman"/>
+          <w:szCs w:val="28"/>
+        </w:rPr>
+        <w:t>ссылки доступа в команду (</w:t>
+      </w:r>
+      <w:proofErr w:type="spellStart"/>
+      <w:r>
+        <w:rPr>
+          <w:rFonts w:ascii="Times New Roman" w:hAnsi="Times New Roman"/>
+          <w:szCs w:val="28"/>
+        </w:rPr>
+        <w:t>TeamAccessLink</w:t>
+      </w:r>
+      <w:proofErr w:type="spellEnd"/>
+      <w:r>
+        <w:rPr>
+          <w:rFonts w:ascii="Times New Roman" w:hAnsi="Times New Roman"/>
+          <w:szCs w:val="28"/>
+        </w:rPr>
+        <w:t>): содержит информацию о пригласительных ссылках для присоединения к команде, включая пользователя создателя ссылки</w:t>
+      </w:r>
+      <w:r>
+        <w:rPr>
+          <w:rFonts w:ascii="Times New Roman" w:hAnsi="Times New Roman"/>
+          <w:szCs w:val="28"/>
+        </w:rPr>
+        <w:t>;</w:t>
+      </w:r>
+    </w:p>
+    <w:p>
+      <w:pPr>
+        <w:pStyle w:val="a4"/>
+        <w:numPr>
+          <w:ilvl w:val="0"/>
+          <w:numId w:val="7"/>
+        </w:numPr>
+        <w:spacing w:line="360" w:lineRule="auto"/>
+        <w:ind w:left="0" w:firstLine="709"/>
+        <w:rPr>
+          <w:rFonts w:ascii="Times New Roman" w:hAnsi="Times New Roman"/>
+          <w:szCs w:val="28"/>
+        </w:rPr>
+      </w:pPr>
+      <w:r>
+        <w:rPr>
+          <w:rFonts w:ascii="Times New Roman" w:hAnsi="Times New Roman"/>
+          <w:szCs w:val="28"/>
+        </w:rPr>
         <w:lastRenderedPageBreak/>
-        <w:t>позволяет комбинировать удобство объектного представления данных с преимуществами реляционного хранилища. Такой подход облегчает проектирование структуры данных и поддержание согласованности информации в системе.</w:t>
-      </w:r>
-    </w:p>
-    <w:p>
-      <w:r>
-        <w:t xml:space="preserve">Для разработки клиентской части системы выбран стек </w:t>
+        <w:t xml:space="preserve">доступ к </w:t>
+      </w:r>
+      <w:r>
+        <w:rPr>
+          <w:rFonts w:ascii="Times New Roman" w:hAnsi="Times New Roman"/>
+          <w:szCs w:val="28"/>
+        </w:rPr>
+        <w:t xml:space="preserve">спискам задач </w:t>
+      </w:r>
+      <w:r>
+        <w:rPr>
+          <w:rFonts w:ascii="Times New Roman" w:hAnsi="Times New Roman"/>
+          <w:szCs w:val="28"/>
+        </w:rPr>
+        <w:t>(</w:t>
       </w:r>
       <w:proofErr w:type="spellStart"/>
       <w:r>
-        <w:t>TypeScript</w:t>
+        <w:rPr>
+          <w:rFonts w:ascii="Times New Roman" w:hAnsi="Times New Roman"/>
+          <w:szCs w:val="28"/>
+        </w:rPr>
+        <w:t>RoadmapAccess</w:t>
       </w:r>
       <w:proofErr w:type="spellEnd"/>
       <w:r>
-        <w:t xml:space="preserve"> + </w:t>
+        <w:rPr>
+          <w:rFonts w:ascii="Times New Roman" w:hAnsi="Times New Roman"/>
+          <w:szCs w:val="28"/>
+        </w:rPr>
+        <w:t xml:space="preserve">): содержит информацию о правах доступа пользователя к </w:t>
+      </w:r>
+      <w:r>
+        <w:rPr>
+          <w:rFonts w:ascii="Times New Roman" w:hAnsi="Times New Roman"/>
+          <w:szCs w:val="28"/>
+        </w:rPr>
+        <w:t>списку целей</w:t>
+      </w:r>
+      <w:r>
+        <w:rPr>
+          <w:rFonts w:ascii="Times New Roman" w:hAnsi="Times New Roman"/>
+          <w:szCs w:val="28"/>
+        </w:rPr>
+        <w:t xml:space="preserve">. Это позволяет делиться </w:t>
+      </w:r>
+      <w:r>
+        <w:rPr>
+          <w:rFonts w:ascii="Times New Roman" w:hAnsi="Times New Roman"/>
+          <w:szCs w:val="28"/>
+        </w:rPr>
+        <w:t>списками</w:t>
+      </w:r>
+      <w:r>
+        <w:rPr>
+          <w:rFonts w:ascii="Times New Roman" w:hAnsi="Times New Roman"/>
+          <w:szCs w:val="28"/>
+        </w:rPr>
+        <w:t xml:space="preserve"> между участниками команды</w:t>
+      </w:r>
+      <w:r>
+        <w:rPr>
+          <w:rFonts w:ascii="Times New Roman" w:hAnsi="Times New Roman"/>
+          <w:szCs w:val="28"/>
+        </w:rPr>
+        <w:t>;</w:t>
+      </w:r>
+    </w:p>
+    <w:p>
+      <w:pPr>
+        <w:pStyle w:val="a4"/>
+        <w:numPr>
+          <w:ilvl w:val="0"/>
+          <w:numId w:val="7"/>
+        </w:numPr>
+        <w:spacing w:line="360" w:lineRule="auto"/>
+        <w:ind w:left="0" w:firstLine="709"/>
+        <w:rPr>
+          <w:rFonts w:ascii="Times New Roman" w:hAnsi="Times New Roman"/>
+          <w:szCs w:val="28"/>
+        </w:rPr>
+      </w:pPr>
+      <w:r>
+        <w:rPr>
+          <w:rFonts w:ascii="Times New Roman" w:hAnsi="Times New Roman"/>
+          <w:szCs w:val="28"/>
+        </w:rPr>
+        <w:t xml:space="preserve">копирование </w:t>
+      </w:r>
+      <w:r>
+        <w:rPr>
+          <w:rFonts w:ascii="Times New Roman" w:hAnsi="Times New Roman"/>
+          <w:szCs w:val="28"/>
+        </w:rPr>
+        <w:t>списка задач</w:t>
+      </w:r>
+      <w:r>
+        <w:rPr>
+          <w:rFonts w:ascii="Times New Roman" w:hAnsi="Times New Roman"/>
+          <w:szCs w:val="28"/>
+        </w:rPr>
+        <w:t xml:space="preserve"> (</w:t>
       </w:r>
       <w:proofErr w:type="spellStart"/>
       <w:r>
-        <w:t>React</w:t>
+        <w:rPr>
+          <w:rFonts w:ascii="Times New Roman" w:hAnsi="Times New Roman"/>
+          <w:szCs w:val="28"/>
+        </w:rPr>
+        <w:t>RoadmapCopy</w:t>
       </w:r>
       <w:proofErr w:type="spellEnd"/>
       <w:r>
-        <w:t xml:space="preserve"> + </w:t>
+        <w:rPr>
+          <w:rFonts w:ascii="Times New Roman" w:hAnsi="Times New Roman"/>
+          <w:szCs w:val="28"/>
+        </w:rPr>
+        <w:t>): содержит информацию о</w:t>
+      </w:r>
+      <w:r>
+        <w:rPr>
+          <w:rFonts w:ascii="Times New Roman" w:hAnsi="Times New Roman"/>
+          <w:szCs w:val="28"/>
+        </w:rPr>
+        <w:t xml:space="preserve"> </w:t>
+      </w:r>
+      <w:r>
+        <w:rPr>
+          <w:rFonts w:ascii="Times New Roman" w:hAnsi="Times New Roman"/>
+          <w:szCs w:val="28"/>
+        </w:rPr>
+        <w:t>копировани</w:t>
+      </w:r>
+      <w:r>
+        <w:rPr>
+          <w:rFonts w:ascii="Times New Roman" w:hAnsi="Times New Roman"/>
+          <w:szCs w:val="28"/>
+        </w:rPr>
+        <w:t>и</w:t>
+      </w:r>
+      <w:r>
+        <w:rPr>
+          <w:rFonts w:ascii="Times New Roman" w:hAnsi="Times New Roman"/>
+          <w:szCs w:val="28"/>
+        </w:rPr>
+        <w:t>,</w:t>
+      </w:r>
+      <w:r>
+        <w:rPr>
+          <w:rFonts w:ascii="Times New Roman" w:hAnsi="Times New Roman"/>
+          <w:szCs w:val="28"/>
+        </w:rPr>
+        <w:t xml:space="preserve"> </w:t>
+      </w:r>
+      <w:r>
+        <w:rPr>
+          <w:rFonts w:ascii="Times New Roman" w:hAnsi="Times New Roman"/>
+          <w:szCs w:val="28"/>
+        </w:rPr>
+        <w:t>связ</w:t>
+      </w:r>
+      <w:r>
+        <w:rPr>
+          <w:rFonts w:ascii="Times New Roman" w:hAnsi="Times New Roman"/>
+          <w:szCs w:val="28"/>
+        </w:rPr>
+        <w:t>и</w:t>
+      </w:r>
+      <w:r>
+        <w:rPr>
+          <w:rFonts w:ascii="Times New Roman" w:hAnsi="Times New Roman"/>
+          <w:szCs w:val="28"/>
+        </w:rPr>
+        <w:t xml:space="preserve"> оригинала и новой копии</w:t>
+      </w:r>
+      <w:r>
+        <w:rPr>
+          <w:rFonts w:ascii="Times New Roman" w:hAnsi="Times New Roman"/>
+          <w:szCs w:val="28"/>
+        </w:rPr>
+        <w:t>;</w:t>
+      </w:r>
+    </w:p>
+    <w:p>
+      <w:pPr>
+        <w:pStyle w:val="a4"/>
+        <w:numPr>
+          <w:ilvl w:val="0"/>
+          <w:numId w:val="7"/>
+        </w:numPr>
+        <w:spacing w:line="360" w:lineRule="auto"/>
+        <w:ind w:left="0" w:firstLine="709"/>
+        <w:rPr>
+          <w:rFonts w:ascii="Times New Roman" w:hAnsi="Times New Roman"/>
+          <w:szCs w:val="28"/>
+        </w:rPr>
+      </w:pPr>
+      <w:r>
+        <w:rPr>
+          <w:rFonts w:ascii="Times New Roman" w:hAnsi="Times New Roman"/>
+          <w:szCs w:val="28"/>
+        </w:rPr>
+        <w:t>чаты (</w:t>
       </w:r>
       <w:proofErr w:type="spellStart"/>
       <w:r>
-        <w:t>Vite</w:t>
+        <w:rPr>
+          <w:rFonts w:ascii="Times New Roman" w:hAnsi="Times New Roman"/>
+          <w:szCs w:val="28"/>
+        </w:rPr>
+        <w:t>Chat</w:t>
       </w:r>
       <w:proofErr w:type="spellEnd"/>
       <w:r>
+        <w:rPr>
+          <w:rFonts w:ascii="Times New Roman" w:hAnsi="Times New Roman"/>
+          <w:szCs w:val="28"/>
+        </w:rPr>
+        <w:t>): содержит информацию о чатах, к которым подключаются пользователи</w:t>
+      </w:r>
+      <w:r>
+        <w:rPr>
+          <w:rFonts w:ascii="Times New Roman" w:hAnsi="Times New Roman"/>
+          <w:szCs w:val="28"/>
+        </w:rPr>
+        <w:t>;</w:t>
+      </w:r>
+    </w:p>
+    <w:p>
+      <w:pPr>
+        <w:pStyle w:val="a4"/>
+        <w:numPr>
+          <w:ilvl w:val="0"/>
+          <w:numId w:val="7"/>
+        </w:numPr>
+        <w:spacing w:line="360" w:lineRule="auto"/>
+        <w:ind w:left="0" w:firstLine="709"/>
+        <w:rPr>
+          <w:rFonts w:ascii="Times New Roman" w:hAnsi="Times New Roman"/>
+          <w:szCs w:val="28"/>
+        </w:rPr>
+      </w:pPr>
+      <w:r>
+        <w:rPr>
+          <w:rFonts w:ascii="Times New Roman" w:hAnsi="Times New Roman"/>
+          <w:szCs w:val="28"/>
+        </w:rPr>
+        <w:t>участники чатов (</w:t>
+      </w:r>
+      <w:proofErr w:type="spellStart"/>
+      <w:r>
+        <w:rPr>
+          <w:rFonts w:ascii="Times New Roman" w:hAnsi="Times New Roman"/>
+          <w:szCs w:val="28"/>
+        </w:rPr>
+        <w:t>ChatParticipant</w:t>
+      </w:r>
+      <w:proofErr w:type="spellEnd"/>
+      <w:r>
+        <w:rPr>
+          <w:rFonts w:ascii="Times New Roman" w:hAnsi="Times New Roman"/>
+          <w:szCs w:val="28"/>
+        </w:rPr>
+        <w:t>): содержит информацию о составе чата</w:t>
+      </w:r>
+      <w:r>
+        <w:rPr>
+          <w:rFonts w:ascii="Times New Roman" w:hAnsi="Times New Roman"/>
+          <w:szCs w:val="28"/>
+        </w:rPr>
+        <w:t>;</w:t>
+      </w:r>
+    </w:p>
+    <w:p>
+      <w:pPr>
+        <w:pStyle w:val="a4"/>
+        <w:numPr>
+          <w:ilvl w:val="0"/>
+          <w:numId w:val="7"/>
+        </w:numPr>
+        <w:spacing w:line="360" w:lineRule="auto"/>
+        <w:ind w:left="0" w:firstLine="709"/>
+        <w:rPr>
+          <w:rFonts w:ascii="Times New Roman" w:hAnsi="Times New Roman"/>
+          <w:szCs w:val="28"/>
+        </w:rPr>
+      </w:pPr>
+      <w:r>
+        <w:rPr>
+          <w:rFonts w:ascii="Times New Roman" w:hAnsi="Times New Roman"/>
+          <w:szCs w:val="28"/>
+        </w:rPr>
+        <w:t>сообщения (Message): содержит информацию о сообщениях пользователей в чатах</w:t>
+      </w:r>
+      <w:r>
+        <w:rPr>
+          <w:rFonts w:ascii="Times New Roman" w:hAnsi="Times New Roman"/>
+          <w:szCs w:val="28"/>
+        </w:rPr>
+        <w:t>;</w:t>
+      </w:r>
+    </w:p>
+    <w:p>
+      <w:pPr>
+        <w:pStyle w:val="a4"/>
+        <w:numPr>
+          <w:ilvl w:val="0"/>
+          <w:numId w:val="7"/>
+        </w:numPr>
+        <w:spacing w:line="360" w:lineRule="auto"/>
+        <w:ind w:left="0" w:firstLine="709"/>
+        <w:rPr>
+          <w:rFonts w:ascii="Times New Roman" w:hAnsi="Times New Roman"/>
+          <w:szCs w:val="28"/>
+        </w:rPr>
+      </w:pPr>
+      <w:r>
+        <w:rPr>
+          <w:rFonts w:ascii="Times New Roman" w:hAnsi="Times New Roman"/>
+          <w:szCs w:val="28"/>
+        </w:rPr>
+        <w:t>ИИ диалоги (</w:t>
+      </w:r>
+      <w:proofErr w:type="spellStart"/>
+      <w:r>
+        <w:rPr>
+          <w:rFonts w:ascii="Times New Roman" w:hAnsi="Times New Roman"/>
+          <w:szCs w:val="28"/>
+        </w:rPr>
+        <w:t>AIConversation</w:t>
+      </w:r>
+      <w:proofErr w:type="spellEnd"/>
+      <w:r>
+        <w:rPr>
+          <w:rFonts w:ascii="Times New Roman" w:hAnsi="Times New Roman"/>
+          <w:szCs w:val="28"/>
+        </w:rPr>
+        <w:t>): содержит информацию о сессиях общения пользователя с ИИ</w:t>
+      </w:r>
+      <w:r>
+        <w:rPr>
+          <w:rFonts w:ascii="Times New Roman" w:hAnsi="Times New Roman"/>
+          <w:szCs w:val="28"/>
+        </w:rPr>
+        <w:t>;</w:t>
+      </w:r>
+    </w:p>
+    <w:p>
+      <w:pPr>
+        <w:pStyle w:val="a4"/>
+        <w:numPr>
+          <w:ilvl w:val="0"/>
+          <w:numId w:val="7"/>
+        </w:numPr>
+        <w:spacing w:line="360" w:lineRule="auto"/>
+        <w:ind w:left="0" w:firstLine="709"/>
+        <w:rPr>
+          <w:rFonts w:ascii="Times New Roman" w:hAnsi="Times New Roman"/>
+          <w:szCs w:val="28"/>
+        </w:rPr>
+      </w:pPr>
+      <w:r>
+        <w:rPr>
+          <w:rFonts w:ascii="Times New Roman" w:hAnsi="Times New Roman"/>
+          <w:szCs w:val="28"/>
+        </w:rPr>
+        <w:t>сообщения ИИ диалога (</w:t>
+      </w:r>
+      <w:proofErr w:type="spellStart"/>
+      <w:r>
+        <w:rPr>
+          <w:rFonts w:ascii="Times New Roman" w:hAnsi="Times New Roman"/>
+          <w:szCs w:val="28"/>
+        </w:rPr>
+        <w:t>AIMessage</w:t>
+      </w:r>
+      <w:proofErr w:type="spellEnd"/>
+      <w:r>
+        <w:rPr>
+          <w:rFonts w:ascii="Times New Roman" w:hAnsi="Times New Roman"/>
+          <w:szCs w:val="28"/>
+        </w:rPr>
+        <w:t>): содержит информацию о сообщениях</w:t>
+      </w:r>
+      <w:r>
+        <w:rPr>
+          <w:rFonts w:ascii="Times New Roman" w:hAnsi="Times New Roman"/>
+          <w:szCs w:val="28"/>
+        </w:rPr>
+        <w:t>;</w:t>
+      </w:r>
+    </w:p>
+    <w:p>
+      <w:pPr>
+        <w:pStyle w:val="a4"/>
+        <w:numPr>
+          <w:ilvl w:val="0"/>
+          <w:numId w:val="7"/>
+        </w:numPr>
+        <w:spacing w:line="360" w:lineRule="auto"/>
+        <w:ind w:left="0" w:firstLine="709"/>
+        <w:rPr>
+          <w:rFonts w:ascii="Times New Roman" w:hAnsi="Times New Roman"/>
+          <w:szCs w:val="28"/>
+        </w:rPr>
+      </w:pPr>
+      <w:r>
+        <w:rPr>
+          <w:rFonts w:ascii="Times New Roman" w:hAnsi="Times New Roman"/>
+          <w:szCs w:val="28"/>
+        </w:rPr>
+        <w:t>роли сообщений ИИ (</w:t>
+      </w:r>
+      <w:proofErr w:type="spellStart"/>
+      <w:r>
+        <w:rPr>
+          <w:rFonts w:ascii="Times New Roman" w:hAnsi="Times New Roman"/>
+          <w:szCs w:val="28"/>
+        </w:rPr>
+        <w:t>AIMessageRole</w:t>
+      </w:r>
+      <w:proofErr w:type="spellEnd"/>
+      <w:r>
+        <w:rPr>
+          <w:rFonts w:ascii="Times New Roman" w:hAnsi="Times New Roman"/>
+          <w:szCs w:val="28"/>
+        </w:rPr>
+        <w:t>):</w:t>
+      </w:r>
+      <w:r>
+        <w:rPr>
+          <w:rFonts w:ascii="Times New Roman" w:hAnsi="Times New Roman"/>
+          <w:szCs w:val="28"/>
+        </w:rPr>
+        <w:t xml:space="preserve"> </w:t>
+      </w:r>
+      <w:r>
+        <w:rPr>
+          <w:rFonts w:ascii="Times New Roman" w:hAnsi="Times New Roman"/>
+          <w:szCs w:val="28"/>
+        </w:rPr>
+        <w:t>модель, содержащая информацию о</w:t>
+      </w:r>
+      <w:r>
+        <w:rPr>
+          <w:rFonts w:ascii="Times New Roman" w:hAnsi="Times New Roman"/>
+          <w:szCs w:val="28"/>
+        </w:rPr>
+        <w:t xml:space="preserve"> </w:t>
+      </w:r>
+      <w:r>
+        <w:rPr>
+          <w:rFonts w:ascii="Times New Roman" w:hAnsi="Times New Roman"/>
+          <w:szCs w:val="28"/>
+        </w:rPr>
+        <w:t>роли сообщения в</w:t>
+      </w:r>
+      <w:r>
+        <w:rPr>
+          <w:rFonts w:ascii="Times New Roman" w:hAnsi="Times New Roman"/>
+          <w:szCs w:val="28"/>
+        </w:rPr>
+        <w:t xml:space="preserve"> </w:t>
+      </w:r>
+      <w:r>
+        <w:rPr>
+          <w:rFonts w:ascii="Times New Roman" w:hAnsi="Times New Roman"/>
+          <w:szCs w:val="28"/>
+        </w:rPr>
+        <w:t>диалоге.</w:t>
+      </w:r>
+    </w:p>
+    <w:p>
+      <w:pPr>
+        <w:pStyle w:val="a4"/>
+        <w:spacing w:line="360" w:lineRule="auto"/>
+        <w:ind w:left="0"/>
+        <w:rPr>
+          <w:rFonts w:ascii="Times New Roman" w:hAnsi="Times New Roman"/>
+          <w:szCs w:val="28"/>
+        </w:rPr>
+      </w:pPr>
+      <w:r>
+        <w:rPr>
+          <w:rFonts w:ascii="Times New Roman" w:hAnsi="Times New Roman"/>
+          <w:szCs w:val="28"/>
+        </w:rPr>
+        <w:t>ER-диаграмма связей между сущностями вынесена в приложение Б</w:t>
+      </w:r>
+      <w:r>
+        <w:rPr>
+          <w:rFonts w:ascii="Times New Roman" w:hAnsi="Times New Roman"/>
+          <w:szCs w:val="28"/>
+        </w:rPr>
+        <w:t>,</w:t>
+      </w:r>
+      <w:r>
+        <w:rPr>
+          <w:rFonts w:ascii="Times New Roman" w:hAnsi="Times New Roman"/>
+          <w:szCs w:val="28"/>
+        </w:rPr>
+        <w:t xml:space="preserve"> словарь данных с типами полей и ограничениями представлен в таблице приложения В</w:t>
+      </w:r>
+      <w:r>
+        <w:rPr>
+          <w:rFonts w:ascii="Times New Roman" w:hAnsi="Times New Roman"/>
+          <w:szCs w:val="28"/>
+        </w:rPr>
+        <w:t>.</w:t>
+      </w:r>
+    </w:p>
+    <w:p>
+      <w:pPr>
+        <w:pStyle w:val="a4"/>
+        <w:spacing w:line="360" w:lineRule="auto"/>
+        <w:ind w:left="0"/>
+        <w:rPr>
+          <w:rFonts w:ascii="Times New Roman" w:hAnsi="Times New Roman"/>
+          <w:b/>
+          <w:bCs/>
+          <w:szCs w:val="28"/>
+        </w:rPr>
+      </w:pPr>
+      <w:r>
+        <w:rPr>
+          <w:rFonts w:ascii="Times New Roman" w:hAnsi="Times New Roman"/>
+          <w:b/>
+          <w:bCs/>
+          <w:szCs w:val="28"/>
+        </w:rPr>
+        <w:t>2.2 Разработка форм выходных документов</w:t>
+      </w:r>
+    </w:p>
+    <w:p>
+      <w:pPr>
+        <w:pStyle w:val="a4"/>
+        <w:spacing w:line="360" w:lineRule="auto"/>
+        <w:ind w:left="0"/>
+        <w:rPr>
+          <w:rFonts w:ascii="Times New Roman" w:hAnsi="Times New Roman"/>
+          <w:szCs w:val="28"/>
+        </w:rPr>
+      </w:pPr>
+      <w:r>
+        <w:rPr>
+          <w:rFonts w:ascii="Times New Roman" w:hAnsi="Times New Roman"/>
+          <w:szCs w:val="28"/>
+        </w:rPr>
+        <w:t>В системе имеются следующие выходные шаблоны:</w:t>
+      </w:r>
+    </w:p>
+    <w:p>
+      <w:pPr>
+        <w:pStyle w:val="a4"/>
+        <w:numPr>
+          <w:ilvl w:val="0"/>
+          <w:numId w:val="9"/>
+        </w:numPr>
+        <w:spacing w:line="360" w:lineRule="auto"/>
+        <w:ind w:left="0" w:firstLine="709"/>
+        <w:rPr>
+          <w:rFonts w:ascii="Times New Roman" w:hAnsi="Times New Roman"/>
+          <w:szCs w:val="28"/>
+        </w:rPr>
+      </w:pPr>
+      <w:r>
+        <w:rPr>
+          <w:rFonts w:ascii="Times New Roman" w:hAnsi="Times New Roman"/>
+          <w:szCs w:val="28"/>
+        </w:rPr>
+        <w:t>шаблон профиля пользователя;</w:t>
+      </w:r>
+    </w:p>
+    <w:p>
+      <w:pPr>
+        <w:pStyle w:val="a4"/>
+        <w:numPr>
+          <w:ilvl w:val="0"/>
+          <w:numId w:val="9"/>
+        </w:numPr>
+        <w:spacing w:line="360" w:lineRule="auto"/>
+        <w:ind w:left="0" w:firstLine="709"/>
+        <w:rPr>
+          <w:rFonts w:ascii="Times New Roman" w:hAnsi="Times New Roman"/>
+          <w:szCs w:val="28"/>
+        </w:rPr>
+      </w:pPr>
+      <w:r>
+        <w:rPr>
+          <w:rFonts w:ascii="Times New Roman" w:hAnsi="Times New Roman"/>
+          <w:szCs w:val="28"/>
+        </w:rPr>
+        <w:t>шаблон цели;</w:t>
+      </w:r>
+    </w:p>
+    <w:p>
+      <w:pPr>
+        <w:pStyle w:val="a4"/>
+        <w:numPr>
+          <w:ilvl w:val="0"/>
+          <w:numId w:val="9"/>
+        </w:numPr>
+        <w:spacing w:line="360" w:lineRule="auto"/>
+        <w:ind w:left="0" w:firstLine="709"/>
+        <w:rPr>
+          <w:rFonts w:ascii="Times New Roman" w:hAnsi="Times New Roman"/>
+          <w:szCs w:val="28"/>
+        </w:rPr>
+      </w:pPr>
+      <w:r>
+        <w:rPr>
+          <w:rFonts w:ascii="Times New Roman" w:hAnsi="Times New Roman"/>
+          <w:szCs w:val="28"/>
+        </w:rPr>
+        <w:t>шаблон списка задач</w:t>
+      </w:r>
+      <w:r>
+        <w:rPr>
+          <w:rFonts w:ascii="Times New Roman" w:hAnsi="Times New Roman"/>
+          <w:szCs w:val="28"/>
+          <w:lang w:val="en-US"/>
+        </w:rPr>
+        <w:t>;</w:t>
+      </w:r>
+    </w:p>
+    <w:p>
+      <w:pPr>
+        <w:pStyle w:val="a4"/>
+        <w:numPr>
+          <w:ilvl w:val="0"/>
+          <w:numId w:val="9"/>
+        </w:numPr>
+        <w:spacing w:line="360" w:lineRule="auto"/>
+        <w:ind w:left="0" w:firstLine="709"/>
+        <w:rPr>
+          <w:rFonts w:ascii="Times New Roman" w:hAnsi="Times New Roman"/>
+          <w:szCs w:val="28"/>
+        </w:rPr>
+      </w:pPr>
+      <w:r>
+        <w:rPr>
+          <w:rFonts w:ascii="Times New Roman" w:hAnsi="Times New Roman"/>
+          <w:szCs w:val="28"/>
+        </w:rPr>
+        <w:t>шаблон задачи</w:t>
+      </w:r>
+      <w:r>
+        <w:rPr>
+          <w:rFonts w:ascii="Times New Roman" w:hAnsi="Times New Roman"/>
+          <w:szCs w:val="28"/>
+          <w:lang w:val="en-US"/>
+        </w:rPr>
+        <w:t>;</w:t>
+      </w:r>
+    </w:p>
+    <w:p>
+      <w:pPr>
+        <w:pStyle w:val="a4"/>
+        <w:numPr>
+          <w:ilvl w:val="0"/>
+          <w:numId w:val="9"/>
+        </w:numPr>
+        <w:spacing w:line="360" w:lineRule="auto"/>
+        <w:ind w:left="0" w:firstLine="709"/>
+        <w:rPr>
+          <w:rFonts w:ascii="Times New Roman" w:hAnsi="Times New Roman"/>
+          <w:szCs w:val="28"/>
+        </w:rPr>
+      </w:pPr>
+      <w:r>
+        <w:rPr>
+          <w:rFonts w:ascii="Times New Roman" w:hAnsi="Times New Roman"/>
+          <w:szCs w:val="28"/>
+        </w:rPr>
+        <w:t>шаблон истории чата</w:t>
+      </w:r>
+      <w:r>
+        <w:rPr>
+          <w:rFonts w:ascii="Times New Roman" w:hAnsi="Times New Roman"/>
+          <w:szCs w:val="28"/>
+          <w:lang w:val="en-US"/>
+        </w:rPr>
+        <w:t>;</w:t>
+      </w:r>
+    </w:p>
+    <w:p>
+      <w:pPr>
+        <w:pStyle w:val="a4"/>
+        <w:numPr>
+          <w:ilvl w:val="0"/>
+          <w:numId w:val="9"/>
+        </w:numPr>
+        <w:spacing w:line="360" w:lineRule="auto"/>
+        <w:ind w:left="0" w:firstLine="709"/>
+        <w:rPr>
+          <w:rFonts w:ascii="Times New Roman" w:hAnsi="Times New Roman"/>
+          <w:szCs w:val="28"/>
+        </w:rPr>
+      </w:pPr>
+      <w:r>
+        <w:rPr>
+          <w:rFonts w:ascii="Times New Roman" w:hAnsi="Times New Roman"/>
+          <w:szCs w:val="28"/>
+        </w:rPr>
+        <w:t>шаблон истории диалога с ИИ.</w:t>
+      </w:r>
+    </w:p>
+    <w:p>
+      <w:pPr>
+        <w:rPr>
+          <w:szCs w:val="28"/>
+        </w:rPr>
+      </w:pPr>
+      <w:r>
+        <w:rPr>
+          <w:szCs w:val="28"/>
+        </w:rPr>
+        <w:t xml:space="preserve">Шаблон </w:t>
+      </w:r>
+      <w:r>
+        <w:rPr>
+          <w:szCs w:val="28"/>
+        </w:rPr>
+        <w:t>списка задач</w:t>
+      </w:r>
+      <w:r>
+        <w:rPr>
+          <w:szCs w:val="28"/>
+        </w:rPr>
+        <w:t xml:space="preserve"> представлен в приложении. В шаблоне </w:t>
+      </w:r>
+      <w:r>
+        <w:rPr>
+          <w:szCs w:val="28"/>
+        </w:rPr>
+        <w:t xml:space="preserve">списка задач </w:t>
+      </w:r>
+      <w:r>
+        <w:rPr>
+          <w:szCs w:val="28"/>
+        </w:rPr>
+        <w:t>представлены следующие элементы:</w:t>
+      </w:r>
+    </w:p>
+    <w:p>
+      <w:pPr>
+        <w:rPr>
+          <w:szCs w:val="28"/>
+        </w:rPr>
+      </w:pPr>
+      <w:r>
+        <w:rPr>
+          <w:szCs w:val="28"/>
+        </w:rPr>
+        <w:lastRenderedPageBreak/>
+        <w:t>− идентификатор и наименование цели, для которой сформирован план;</w:t>
+      </w:r>
+    </w:p>
+    <w:p>
+      <w:pPr>
+        <w:rPr>
+          <w:szCs w:val="28"/>
+        </w:rPr>
+      </w:pPr>
+      <w:r>
+        <w:rPr>
+          <w:szCs w:val="28"/>
+        </w:rPr>
+        <w:t xml:space="preserve">− статус выполнения </w:t>
+      </w:r>
+      <w:r>
+        <w:rPr>
+          <w:szCs w:val="28"/>
+        </w:rPr>
+        <w:t>списка задач</w:t>
+      </w:r>
+      <w:r>
+        <w:rPr>
+          <w:szCs w:val="28"/>
+        </w:rPr>
+        <w:t>;</w:t>
+      </w:r>
+    </w:p>
+    <w:p>
+      <w:pPr>
+        <w:rPr>
+          <w:szCs w:val="28"/>
+        </w:rPr>
+      </w:pPr>
+      <w:r>
+        <w:rPr>
+          <w:szCs w:val="28"/>
+        </w:rPr>
+        <w:t>− дата и время создания и последнего обновления;</w:t>
+      </w:r>
+    </w:p>
+    <w:p>
+      <w:pPr>
+        <w:rPr>
+          <w:szCs w:val="28"/>
+        </w:rPr>
+      </w:pPr>
+      <w:r>
+        <w:rPr>
+          <w:szCs w:val="28"/>
+        </w:rPr>
+        <w:t>− принадлежность к команде (при наличии командного режима работы);</w:t>
+      </w:r>
+    </w:p>
+    <w:p>
+      <w:pPr>
+        <w:rPr>
+          <w:szCs w:val="28"/>
+        </w:rPr>
+      </w:pPr>
+      <w:r>
+        <w:rPr>
+          <w:szCs w:val="28"/>
+        </w:rPr>
+        <w:t>− список задач: содержит перечень шагов плана с порядком выполнения, названием, описанием и отметкой о выполнении;</w:t>
+      </w:r>
+    </w:p>
+    <w:p>
+      <w:pPr>
+        <w:rPr>
+          <w:szCs w:val="28"/>
+        </w:rPr>
+      </w:pPr>
+      <w:r>
+        <w:rPr>
+          <w:szCs w:val="28"/>
+        </w:rPr>
+        <w:t>− прогресс выполнения: отображается через количество выполненных задач и (при наличии) дату завершения отдельных задач.</w:t>
+      </w:r>
+    </w:p>
+    <w:p>
+      <w:pPr>
+        <w:rPr>
+          <w:szCs w:val="28"/>
+        </w:rPr>
+      </w:pPr>
+      <w:r>
+        <w:rPr>
+          <w:szCs w:val="28"/>
+        </w:rPr>
+        <w:t xml:space="preserve">Шаблон </w:t>
+      </w:r>
+      <w:r>
+        <w:rPr>
+          <w:szCs w:val="28"/>
+        </w:rPr>
+        <w:t>списка задач</w:t>
+      </w:r>
+      <w:r>
+        <w:rPr>
+          <w:szCs w:val="28"/>
+        </w:rPr>
+        <w:t xml:space="preserve"> предоставляет всю необходимую информацию о текущем плане достижения цели. Он позволяет просматривать структуру плана, последовательность шагов и степень готовности</w:t>
+      </w:r>
+      <w:r>
+        <w:rPr>
+          <w:szCs w:val="28"/>
+        </w:rPr>
+        <w:t>.</w:t>
+      </w:r>
+    </w:p>
+    <w:p>
+      <w:r>
+        <w:rPr>
+          <w:szCs w:val="28"/>
+        </w:rPr>
+        <w:t>В шаблонах профиля пользователя, цели и списка задач предусмотрены настраиваемые поля, которые пользователь может убрать либо добавить</w:t>
+      </w:r>
+      <w:r>
+        <w:rPr>
+          <w:szCs w:val="28"/>
+        </w:rPr>
         <w:t xml:space="preserve">. </w:t>
       </w:r>
-      <w:proofErr w:type="spellStart"/>
-      <w:r>
-        <w:t>TypeScript</w:t>
-      </w:r>
-      <w:proofErr w:type="spellEnd"/>
-      <w:r>
-        <w:t xml:space="preserve"> является надстройкой над JavaScript с поддержкой статической типизации, что позволяет на ранних этапах разработки выявлять большое количество ошибок и повышать надёжность клиентского кода. Использование типов упрощает сопровождение проекта, делает интерфейсы и контракты между компонентами более явными и облегчает рефакторинг.</w:t>
-      </w:r>
-    </w:p>
-    <w:p>
-      <w:r>
-        <w:t xml:space="preserve">Фреймворк </w:t>
-      </w:r>
-      <w:proofErr w:type="spellStart"/>
-      <w:r>
-        <w:t>React</w:t>
-      </w:r>
-      <w:proofErr w:type="spellEnd"/>
-      <w:r>
-        <w:t xml:space="preserve"> применяется для построения одностраничного веб‑приложения (SPA), в котором реализованы страницы аутентификации, работа с личными и командными </w:t>
-      </w:r>
-      <w:r>
-        <w:t>списками задач</w:t>
-      </w:r>
-      <w:r>
-        <w:t xml:space="preserve">, чат с ИИ, поиск пользователей и управление командами. Компонентный подход </w:t>
-      </w:r>
-      <w:proofErr w:type="spellStart"/>
-      <w:r>
-        <w:t>React</w:t>
-      </w:r>
-      <w:proofErr w:type="spellEnd"/>
-      <w:r>
-        <w:t xml:space="preserve"> позволяет разбить интерфейс на </w:t>
-      </w:r>
-      <w:proofErr w:type="spellStart"/>
-      <w:r>
-        <w:t>переиспользуемые</w:t>
-      </w:r>
-      <w:proofErr w:type="spellEnd"/>
-      <w:r>
-        <w:t xml:space="preserve"> элементы, что ускоряет разработку и улучшает структурированность кода. Благодаря этому обеспечивается гибкое отображение списков задач, истории взаимодействия с ИИ и различных состояний интерфейса в зависимости от действий пользователя.</w:t>
-      </w:r>
-    </w:p>
-    <w:p>
-      <w:r>
-        <w:t xml:space="preserve">Сборка и локальная разработка </w:t>
-      </w:r>
-      <w:proofErr w:type="spellStart"/>
-      <w:r>
-        <w:t>фронтенда</w:t>
-      </w:r>
-      <w:proofErr w:type="spellEnd"/>
-      <w:r>
-        <w:t xml:space="preserve"> выполняются с помощью инструмента </w:t>
-      </w:r>
-      <w:proofErr w:type="spellStart"/>
-      <w:r>
-        <w:t>Vite</w:t>
-      </w:r>
-      <w:proofErr w:type="spellEnd"/>
-      <w:r>
-        <w:t>, который обеспечивает быструю перезагрузку модулей и оптимизированную сборку проекта для</w:t>
-      </w:r>
-      <w:r>
-        <w:t xml:space="preserve"> состояния готового проекта</w:t>
-      </w:r>
-      <w:r>
-        <w:t xml:space="preserve">. </w:t>
-      </w:r>
-      <w:proofErr w:type="spellStart"/>
-      <w:r>
-        <w:t>Vite</w:t>
-      </w:r>
-      <w:proofErr w:type="spellEnd"/>
-      <w:r>
-        <w:t xml:space="preserve"> упрощает настройку </w:t>
-      </w:r>
-      <w:r>
-        <w:t>просмотра работы</w:t>
-      </w:r>
-      <w:r>
-        <w:t xml:space="preserve"> запросов к </w:t>
-      </w:r>
-      <w:proofErr w:type="spellStart"/>
-      <w:r>
-        <w:t>backend</w:t>
-      </w:r>
-      <w:proofErr w:type="spellEnd"/>
-      <w:r>
-        <w:t>‑API, что позволяет в процессе разработки обращаться к реальному серверу по путям /</w:t>
-      </w:r>
-      <w:proofErr w:type="spellStart"/>
-      <w:r>
-        <w:t>api</w:t>
-      </w:r>
-      <w:proofErr w:type="spellEnd"/>
-      <w:r>
-        <w:t xml:space="preserve"> и /</w:t>
-      </w:r>
-      <w:proofErr w:type="spellStart"/>
-      <w:r>
-        <w:t>uploads</w:t>
-      </w:r>
-      <w:proofErr w:type="spellEnd"/>
-      <w:r>
-        <w:t>, не изменяя клиентский код. Это создаёт удобную и производительную среду для разработки и тестирования веб‑интерфейса.</w:t>
-      </w:r>
-    </w:p>
-    <w:p>
-      <w:r>
-        <w:t xml:space="preserve">Для стилизации пользовательского интерфейса веб‑приложения используется </w:t>
-      </w:r>
-      <w:proofErr w:type="spellStart"/>
-      <w:r>
-        <w:t>Tailwind</w:t>
-      </w:r>
-      <w:proofErr w:type="spellEnd"/>
-      <w:r>
-        <w:t xml:space="preserve"> CSS, представляющий собой утилитарный CSS‑фреймворк. </w:t>
-      </w:r>
-      <w:proofErr w:type="spellStart"/>
-      <w:r>
-        <w:t>Tailwind</w:t>
-      </w:r>
-      <w:proofErr w:type="spellEnd"/>
-      <w:r>
-        <w:t xml:space="preserve"> предоставляет набор готовых классов для настройки отступов, цветов, шрифтов, сеток и других параметров оформления. Такой подход </w:t>
-      </w:r>
-      <w:r>
+      <w:r>
+        <w:rPr>
+          <w:szCs w:val="28"/>
+        </w:rPr>
+        <w:t>Шаблоны истории чата и истории диалога с ИИ формируют документ с полной хронологией сообщений, что позволяет сохранять результаты обсуждений и историю формирования рекомендаций ИИ.</w:t>
+      </w:r>
+      <w:r>
+        <w:rPr>
+          <w:szCs w:val="28"/>
+        </w:rPr>
+        <w:t xml:space="preserve"> </w:t>
+      </w:r>
+      <w:r>
+        <w:t>Шаблоны представлены в приложении Г на рисунках Г.2 и Г.3 соответственно.</w:t>
+      </w:r>
+    </w:p>
+    <w:p>
+      <w:pPr>
+        <w:rPr>
+          <w:b/>
+          <w:bCs/>
+        </w:rPr>
+      </w:pPr>
+      <w:r>
+        <w:rPr>
+          <w:b/>
+          <w:bCs/>
+        </w:rPr>
+        <w:t>2.3 Разработка структуры программного продукта</w:t>
+      </w:r>
+    </w:p>
+    <w:p>
+      <w:pPr>
+        <w:rPr>
+          <w:szCs w:val="28"/>
+        </w:rPr>
+      </w:pPr>
+      <w:r>
+        <w:rPr>
+          <w:szCs w:val="28"/>
+        </w:rPr>
+        <w:t>Так как система представляет собой веб‑приложение, была составлена функциональная схема веб‑клиента, включающая публичную часть (до авторизации) и внутреннюю часть (после авторизации).</w:t>
+      </w:r>
+      <w:r>
+        <w:rPr>
+          <w:szCs w:val="28"/>
+        </w:rPr>
+        <w:t xml:space="preserve"> </w:t>
+      </w:r>
+      <w:r>
+        <w:rPr>
+          <w:szCs w:val="28"/>
+        </w:rPr>
+        <w:t xml:space="preserve">После запуска приложения пользователь попадает в окно публичной части, откуда ему доступны окна «Авторизация», «Регистрация», «Восстановление пароля», а также окно «Ошибочного пути» (страница 404) и окно «Краткой информации» о системе. В окне «Авторизация» пользователь вводит учетные данные и выполняет вход в систему. В окне «Регистрация» пользователь создает новую учетную запись, после чего может перейти к авторизации. Окно «Восстановление пароля» позволяет инициировать восстановление доступа к аккаунту в случае утери пароля. Окно «Ошибочного пути» отображается при переходе на </w:t>
+      </w:r>
+      <w:r>
+        <w:rPr>
+          <w:szCs w:val="28"/>
+        </w:rPr>
         <w:lastRenderedPageBreak/>
-        <w:t xml:space="preserve">позволяет описывать внешний вид компонентов прямо в разметке, сокращать объём собственных CSS‑файлов и быстро создавать современный адаптивный интерфейс. Модульность и гибкость </w:t>
-      </w:r>
-      <w:proofErr w:type="spellStart"/>
-      <w:r>
-        <w:t>Tailwind</w:t>
-      </w:r>
-      <w:proofErr w:type="spellEnd"/>
-      <w:r>
-        <w:t xml:space="preserve"> CSS дают возможность легко изменять и развивать дизайн без существенных изменений в структуре приложения.</w:t>
-      </w:r>
-    </w:p>
-    <w:p>
-      <w:pPr>
+        <w:t>несуществующую страницу и предоставляет возможность вернуться к корректным разделам. Окно «Краткой информации» предназначено для ознакомления пользователя с назначением и основными возможностями сервиса до выполнения входа.</w:t>
+      </w:r>
+      <w:r>
+        <w:rPr>
+          <w:szCs w:val="28"/>
+        </w:rPr>
+        <w:t xml:space="preserve"> </w:t>
+      </w:r>
+      <w:r>
+        <w:rPr>
+          <w:szCs w:val="28"/>
+        </w:rPr>
+        <w:t>На рисунке 2.1 изображена функциональная схема публичной части веб‑приложения.</w:t>
+      </w:r>
+    </w:p>
+    <w:p>
+      <w:pPr>
+        <w:rPr>
+          <w:szCs w:val="28"/>
+        </w:rPr>
+      </w:pPr>
+      <w:r>
+        <w:rPr>
+          <w:noProof/>
+        </w:rPr>
+        <w:drawing>
+          <wp:inline distT="0" distB="0" distL="0" distR="0" wp14:anchorId="48712E1C" wp14:editId="50267012">
+            <wp:extent cx="5724525" cy="3629025"/>
+            <wp:effectExtent l="19050" t="19050" r="28575" b="28575"/>
+            <wp:docPr id="1" name="Рисунок 1"/>
+            <wp:cNvGraphicFramePr>
+              <a:graphicFrameLocks xmlns:a="http://schemas.openxmlformats.org/drawingml/2006/main" noChangeAspect="1"/>
+            </wp:cNvGraphicFramePr>
+            <a:graphic xmlns:a="http://schemas.openxmlformats.org/drawingml/2006/main">
+              <a:graphicData uri="http://schemas.openxmlformats.org/drawingml/2006/picture">
+                <pic:pic xmlns:pic="http://schemas.openxmlformats.org/drawingml/2006/picture">
+                  <pic:nvPicPr>
+                    <pic:cNvPr id="0" name="Picture 1"/>
+                    <pic:cNvPicPr>
+                      <a:picLocks noChangeAspect="1" noChangeArrowheads="1"/>
+                    </pic:cNvPicPr>
+                  </pic:nvPicPr>
+                  <pic:blipFill>
+                    <a:blip r:embed="rId20">
+                      <a:extLst>
+                        <a:ext uri="{28A0092B-C50C-407E-A947-70E740481C1C}">
+                          <a14:useLocalDpi xmlns:a14="http://schemas.microsoft.com/office/drawing/2010/main" val="0"/>
+                        </a:ext>
+                      </a:extLst>
+                    </a:blip>
+                    <a:srcRect/>
+                    <a:stretch>
+                      <a:fillRect/>
+                    </a:stretch>
+                  </pic:blipFill>
+                  <pic:spPr bwMode="auto">
+                    <a:xfrm>
+                      <a:off x="0" y="0"/>
+                      <a:ext cx="5724525" cy="3629025"/>
+                    </a:xfrm>
+                    <a:prstGeom prst="rect">
+                      <a:avLst/>
+                    </a:prstGeom>
+                    <a:noFill/>
+                    <a:ln>
+                      <a:solidFill>
+                        <a:schemeClr val="tx1"/>
+                      </a:solidFill>
+                    </a:ln>
+                  </pic:spPr>
+                </pic:pic>
+              </a:graphicData>
+            </a:graphic>
+          </wp:inline>
+        </w:drawing>
+      </w:r>
+    </w:p>
+    <w:p>
+      <w:pPr>
+        <w:jc w:val="center"/>
+        <w:rPr>
+          <w:color w:val="000000" w:themeColor="text1"/>
+        </w:rPr>
+      </w:pPr>
+      <w:r>
+        <w:rPr>
+          <w:color w:val="000000" w:themeColor="text1"/>
+        </w:rPr>
+        <w:t xml:space="preserve">Рисунок </w:t>
+      </w:r>
+      <w:r>
+        <w:rPr>
+          <w:color w:val="000000" w:themeColor="text1"/>
+        </w:rPr>
+        <w:t>2</w:t>
+      </w:r>
+      <w:r>
+        <w:rPr>
+          <w:color w:val="000000" w:themeColor="text1"/>
+        </w:rPr>
+        <w:t>.</w:t>
+      </w:r>
+      <w:r>
+        <w:rPr>
+          <w:color w:val="000000" w:themeColor="text1"/>
+        </w:rPr>
+        <w:t>1</w:t>
+      </w:r>
+      <w:r>
+        <w:rPr>
+          <w:color w:val="000000" w:themeColor="text1"/>
+        </w:rPr>
+        <w:t xml:space="preserve"> –</w:t>
+      </w:r>
+      <w:r>
+        <w:rPr>
+          <w:color w:val="000000" w:themeColor="text1"/>
+        </w:rPr>
+        <w:t xml:space="preserve"> </w:t>
+      </w:r>
+      <w:r>
+        <w:rPr>
+          <w:color w:val="000000" w:themeColor="text1"/>
+        </w:rPr>
+        <w:t>Функциональная схема публичной части веб-приложения</w:t>
+      </w:r>
+    </w:p>
+    <w:p>
+      <w:pPr>
+        <w:rPr>
+          <w:color w:val="000000" w:themeColor="text1"/>
+        </w:rPr>
+      </w:pPr>
+      <w:r>
+        <w:rPr>
+          <w:color w:val="000000" w:themeColor="text1"/>
+        </w:rPr>
+        <w:t>После успешной авторизации пользователю становится доступен основной функционал системы. Из внутренней части пользователь может перейти к следующим разделам: «Профиль», «Смена пароля», «Списки задач/дорожные карты», «Просмотр конкретного списка и его задач», «Команды», «Списки задач команды», «Чаты», «Просмотр конкретного чата», «Поиск пользователей», а также к окну интерфейса общения с ИИ‑чатом и истории ИИ‑диалогов.</w:t>
+      </w:r>
+      <w:r>
+        <w:rPr>
+          <w:color w:val="000000" w:themeColor="text1"/>
+        </w:rPr>
+        <w:t xml:space="preserve"> </w:t>
+      </w:r>
+      <w:r>
+        <w:rPr>
+          <w:color w:val="000000" w:themeColor="text1"/>
+        </w:rPr>
+        <w:t xml:space="preserve">Раздел «Профиль» предназначен для просмотра и редактирования данных пользователя. Из него пользователь может перейти в окно «Смена пароля», где выполняется обновление пароля для повышения безопасности учетной записи. Раздел «Списки задач» позволяет просматривать созданные пользователем планы и переходить к детальному окну выбранного списка, где отображаются задачи, их порядок и </w:t>
+      </w:r>
+      <w:r>
+        <w:rPr>
+          <w:color w:val="000000" w:themeColor="text1"/>
+        </w:rPr>
+        <w:lastRenderedPageBreak/>
+        <w:t>статус выполнения, а также выполняется управление задачами (добавление, изменение, отметка выполнения). Раздел «Команды» предоставляет возможность просматривать и создавать команды, а также переходить к командным данным. В окне «Списки задач команды» пользователь просматривает планы, доступные участникам команды, и использует их для с</w:t>
+      </w:r>
+      <w:r>
         <w:rPr>
           <w:rFonts w:cs="Times New Roman"/>
-        </w:rPr>
-      </w:pPr>
-      <w:r>
-        <w:rPr>
-          <w:rFonts w:cs="Times New Roman"/>
-        </w:rPr>
-        <w:t xml:space="preserve">Взаимодействие с внешним сервисом искусственного интеллекта реализовано через специализированный сервисный класс на стороне </w:t>
-      </w:r>
-      <w:proofErr w:type="spellStart"/>
-      <w:r>
-        <w:rPr>
-          <w:rFonts w:cs="Times New Roman"/>
-        </w:rPr>
-        <w:t>backend</w:t>
-      </w:r>
-      <w:proofErr w:type="spellEnd"/>
-      <w:r>
-        <w:rPr>
-          <w:rFonts w:cs="Times New Roman"/>
-        </w:rPr>
-        <w:t xml:space="preserve">‑приложения. Для этого используется HTTP‑клиент с поддержкой асинхронных запросов, который отправляет </w:t>
-      </w:r>
-      <w:proofErr w:type="spellStart"/>
-      <w:r>
-        <w:rPr>
-          <w:rFonts w:cs="Times New Roman"/>
-        </w:rPr>
-        <w:t>промт</w:t>
-      </w:r>
-      <w:proofErr w:type="spellEnd"/>
-      <w:r>
-        <w:rPr>
-          <w:rFonts w:cs="Times New Roman"/>
-        </w:rPr>
-        <w:t xml:space="preserve"> и текст цели в AI‑сервис и получает структурированный ответ в формате JSON. Обработчик на стороне </w:t>
-      </w:r>
-      <w:proofErr w:type="spellStart"/>
-      <w:r>
-        <w:rPr>
-          <w:rFonts w:cs="Times New Roman"/>
-        </w:rPr>
-        <w:t>FastAPI</w:t>
-      </w:r>
-      <w:proofErr w:type="spellEnd"/>
-      <w:r>
-        <w:rPr>
-          <w:rFonts w:cs="Times New Roman"/>
-        </w:rPr>
-        <w:t xml:space="preserve"> проводит валидацию ответа, преобразует его в внутренние структуры данных и сохраняет результа</w:t>
-      </w:r>
-      <w:r>
-        <w:rPr>
-          <w:rFonts w:cs="Times New Roman"/>
-        </w:rPr>
-        <w:t>т</w:t>
-      </w:r>
-      <w:r>
-        <w:rPr>
-          <w:rFonts w:cs="Times New Roman"/>
-        </w:rPr>
-        <w:t>ы в базе данных. Такой подход обеспечивает чёткое разделение ответственности: Python‑</w:t>
-      </w:r>
-      <w:proofErr w:type="spellStart"/>
-      <w:r>
-        <w:rPr>
-          <w:rFonts w:cs="Times New Roman"/>
-        </w:rPr>
-        <w:t>backend</w:t>
-      </w:r>
-      <w:proofErr w:type="spellEnd"/>
-      <w:r>
-        <w:rPr>
-          <w:rFonts w:cs="Times New Roman"/>
-        </w:rPr>
-        <w:t xml:space="preserve"> отвечает за бизнес‑логику и хранение данных, а внешний AI‑сервис </w:t>
-      </w:r>
-      <w:r>
-        <w:rPr>
-          <w:rFonts w:cs="Times New Roman"/>
-        </w:rPr>
-        <w:t>–</w:t>
-      </w:r>
-      <w:r>
-        <w:rPr>
-          <w:rFonts w:cs="Times New Roman"/>
-        </w:rPr>
-        <w:t xml:space="preserve"> за генерацию содержания задач на основе пользовательской цели.</w:t>
-      </w:r>
-    </w:p>
-    <w:p>
-      <w:pPr>
-        <w:rPr>
-          <w:rFonts w:cs="Times New Roman"/>
-        </w:rPr>
-      </w:pPr>
-      <w:r>
-        <w:rPr>
-          <w:rFonts w:cs="Times New Roman"/>
-        </w:rPr>
-        <w:t xml:space="preserve">В совокупности выбранный стек технологий — </w:t>
-      </w:r>
-      <w:proofErr w:type="spellStart"/>
-      <w:r>
-        <w:rPr>
-          <w:rFonts w:cs="Times New Roman"/>
-        </w:rPr>
-        <w:t>FastAPI</w:t>
-      </w:r>
-      <w:proofErr w:type="spellEnd"/>
-      <w:r>
-        <w:rPr>
-          <w:rFonts w:cs="Times New Roman"/>
-        </w:rPr>
-        <w:t xml:space="preserve"> и Python для серверной части, </w:t>
-      </w:r>
-      <w:proofErr w:type="spellStart"/>
-      <w:r>
-        <w:rPr>
-          <w:rFonts w:cs="Times New Roman"/>
-        </w:rPr>
-        <w:t>PostgreSQL</w:t>
-      </w:r>
-      <w:proofErr w:type="spellEnd"/>
-      <w:r>
-        <w:rPr>
-          <w:rFonts w:cs="Times New Roman"/>
-        </w:rPr>
-        <w:t xml:space="preserve"> для хранения данных, </w:t>
-      </w:r>
-      <w:proofErr w:type="spellStart"/>
-      <w:r>
-        <w:rPr>
-          <w:rFonts w:cs="Times New Roman"/>
-        </w:rPr>
-        <w:t>TypeScript</w:t>
-      </w:r>
-      <w:proofErr w:type="spellEnd"/>
-      <w:r>
-        <w:rPr>
-          <w:rFonts w:cs="Times New Roman"/>
-        </w:rPr>
-        <w:t xml:space="preserve">, </w:t>
-      </w:r>
-      <w:proofErr w:type="spellStart"/>
-      <w:r>
-        <w:rPr>
-          <w:rFonts w:cs="Times New Roman"/>
-        </w:rPr>
-        <w:t>React</w:t>
-      </w:r>
-      <w:proofErr w:type="spellEnd"/>
-      <w:r>
-        <w:rPr>
-          <w:rFonts w:cs="Times New Roman"/>
-        </w:rPr>
-        <w:t xml:space="preserve">, </w:t>
-      </w:r>
-      <w:proofErr w:type="spellStart"/>
-      <w:r>
-        <w:rPr>
-          <w:rFonts w:cs="Times New Roman"/>
-        </w:rPr>
-        <w:t>Vite</w:t>
-      </w:r>
-      <w:proofErr w:type="spellEnd"/>
-      <w:r>
-        <w:rPr>
-          <w:rFonts w:cs="Times New Roman"/>
-        </w:rPr>
-        <w:t xml:space="preserve"> и </w:t>
-      </w:r>
-      <w:proofErr w:type="spellStart"/>
-      <w:r>
-        <w:rPr>
-          <w:rFonts w:cs="Times New Roman"/>
-        </w:rPr>
-        <w:t>Tailwind</w:t>
-      </w:r>
-      <w:proofErr w:type="spellEnd"/>
-      <w:r>
-        <w:rPr>
-          <w:rFonts w:cs="Times New Roman"/>
-        </w:rPr>
-        <w:t xml:space="preserve"> CSS для веб‑клиента, а также интеграция с внешним AI‑сервисом — обеспечивает надёжную основу для разработки, масштабирования и сопровождения системы декомпозиции целей, обеспечивая удобный интерфейс для пользователей и гибкую архитектуру для дальнейшего развития функционала.</w:t>
-      </w:r>
-    </w:p>
-    <w:p>
-      <w:pPr>
-        <w:rPr>
-          <w:rFonts w:cs="Times New Roman"/>
-        </w:rPr>
-      </w:pPr>
+          <w:color w:val="000000" w:themeColor="text1"/>
+        </w:rPr>
+        <w:t>о</w:t>
+      </w:r>
+      <w:r>
+        <w:rPr>
+          <w:color w:val="000000" w:themeColor="text1"/>
+        </w:rPr>
+        <w:t>вместной работы. Раздел «Чаты» предназначен для общения: пользователь выбирает нужный диалог и переходит в окно конкретного чата для просмотра истории сообщений и отправки новых. Окно «Поиск пользователей» используется для поиска пользователей системы. Отдельный функциональный блок составляет интерфейс ИИ‑чата, который позволяет вести диалог с ИИ, получать рекомендации по декомпозиции целей и просматривать историю предыдущих обращений.</w:t>
+      </w:r>
+      <w:r>
+        <w:rPr>
+          <w:color w:val="000000" w:themeColor="text1"/>
+        </w:rPr>
+        <w:t xml:space="preserve"> </w:t>
+      </w:r>
+      <w:r>
+        <w:rPr>
+          <w:color w:val="000000" w:themeColor="text1"/>
+        </w:rPr>
+        <w:t>На рисунке 2.2 изображена функциональная схема внутренней части веб‑приложения</w:t>
+      </w:r>
+      <w:r>
+        <w:rPr>
+          <w:color w:val="000000" w:themeColor="text1"/>
+        </w:rPr>
+        <w:t>.</w:t>
+      </w:r>
+    </w:p>
+    <w:p>
+      <w:pPr>
+        <w:rPr>
+          <w:color w:val="000000" w:themeColor="text1"/>
+        </w:rPr>
+      </w:pPr>
+      <w:r>
+        <w:rPr>
+          <w:noProof/>
+        </w:rPr>
+        <w:drawing>
+          <wp:inline distT="0" distB="0" distL="0" distR="0" wp14:anchorId="373A1943" wp14:editId="0919EC28">
+            <wp:extent cx="5695315" cy="2687206"/>
+            <wp:effectExtent l="19050" t="19050" r="19685" b="18415"/>
+            <wp:docPr id="2" name="Рисунок 2"/>
+            <wp:cNvGraphicFramePr>
+              <a:graphicFrameLocks xmlns:a="http://schemas.openxmlformats.org/drawingml/2006/main" noChangeAspect="1"/>
+            </wp:cNvGraphicFramePr>
+            <a:graphic xmlns:a="http://schemas.openxmlformats.org/drawingml/2006/main">
+              <a:graphicData uri="http://schemas.openxmlformats.org/drawingml/2006/picture">
+                <pic:pic xmlns:pic="http://schemas.openxmlformats.org/drawingml/2006/picture">
+                  <pic:nvPicPr>
+                    <pic:cNvPr id="0" name="Picture 3"/>
+                    <pic:cNvPicPr>
+                      <a:picLocks noChangeAspect="1" noChangeArrowheads="1"/>
+                    </pic:cNvPicPr>
+                  </pic:nvPicPr>
+                  <pic:blipFill>
+                    <a:blip r:embed="rId21">
+                      <a:extLst>
+                        <a:ext uri="{28A0092B-C50C-407E-A947-70E740481C1C}">
+                          <a14:useLocalDpi xmlns:a14="http://schemas.microsoft.com/office/drawing/2010/main" val="0"/>
+                        </a:ext>
+                      </a:extLst>
+                    </a:blip>
+                    <a:srcRect/>
+                    <a:stretch>
+                      <a:fillRect/>
+                    </a:stretch>
+                  </pic:blipFill>
+                  <pic:spPr bwMode="auto">
+                    <a:xfrm>
+                      <a:off x="0" y="0"/>
+                      <a:ext cx="5702539" cy="2690615"/>
+                    </a:xfrm>
+                    <a:prstGeom prst="rect">
+                      <a:avLst/>
+                    </a:prstGeom>
+                    <a:noFill/>
+                    <a:ln>
+                      <a:solidFill>
+                        <a:schemeClr val="tx1"/>
+                      </a:solidFill>
+                    </a:ln>
+                  </pic:spPr>
+                </pic:pic>
+              </a:graphicData>
+            </a:graphic>
+          </wp:inline>
+        </w:drawing>
+      </w:r>
+    </w:p>
+    <w:p>
+      <w:pPr>
+        <w:jc w:val="center"/>
+        <w:rPr>
+          <w:color w:val="000000" w:themeColor="text1"/>
+        </w:rPr>
+      </w:pPr>
+      <w:r>
+        <w:rPr>
+          <w:color w:val="000000" w:themeColor="text1"/>
+        </w:rPr>
+        <w:t xml:space="preserve">Рисунок </w:t>
+      </w:r>
+      <w:r>
+        <w:rPr>
+          <w:color w:val="000000" w:themeColor="text1"/>
+        </w:rPr>
+        <w:t>2</w:t>
+      </w:r>
+      <w:r>
+        <w:rPr>
+          <w:color w:val="000000" w:themeColor="text1"/>
+        </w:rPr>
+        <w:t>.</w:t>
+      </w:r>
+      <w:r>
+        <w:rPr>
+          <w:color w:val="000000" w:themeColor="text1"/>
+        </w:rPr>
+        <w:t>2</w:t>
+      </w:r>
+      <w:r>
+        <w:rPr>
+          <w:color w:val="000000" w:themeColor="text1"/>
+        </w:rPr>
+        <w:t xml:space="preserve"> –</w:t>
+      </w:r>
+      <w:r>
+        <w:rPr>
+          <w:color w:val="000000" w:themeColor="text1"/>
+        </w:rPr>
+        <w:t xml:space="preserve"> Функциональная схема </w:t>
+      </w:r>
+      <w:r>
+        <w:rPr>
+          <w:color w:val="000000" w:themeColor="text1"/>
+        </w:rPr>
+        <w:t>внутренней</w:t>
+      </w:r>
+      <w:r>
+        <w:rPr>
+          <w:color w:val="000000" w:themeColor="text1"/>
+        </w:rPr>
+        <w:t xml:space="preserve"> части веб-приложения</w:t>
+      </w:r>
+    </w:p>
+    <w:p>
+      <w:pPr>
+        <w:rPr>
+          <w:b/>
+          <w:bCs/>
+          <w:szCs w:val="28"/>
+        </w:rPr>
+      </w:pPr>
+      <w:r>
+        <w:rPr>
+          <w:b/>
+          <w:bCs/>
+          <w:szCs w:val="28"/>
+        </w:rPr>
+        <w:t>2.4 Описание процедур и функций</w:t>
+      </w:r>
     </w:p>
     <w:sectPr>
-      <w:headerReference w:type="default" r:id="rId20"/>
+      <w:headerReference w:type="default" r:id="rId22"/>
       <w:pgSz w:w="11906" w:h="16838"/>
       <w:pgMar w:top="992" w:right="709" w:bottom="1843" w:left="1418" w:header="0" w:footer="567" w:gutter="0"/>
       <w:cols w:space="708"/>
@@ -10753,6 +12620,233 @@
     </w:lvl>
   </w:abstractNum>
   <w:abstractNum w:abstractNumId="2" w15:restartNumberingAfterBreak="0">
+    <w:nsid w:val="0CE85AD4"/>
+    <w:multiLevelType w:val="hybridMultilevel"/>
+    <w:tmpl w:val="7772AFD2"/>
+    <w:lvl w:ilvl="0" w:tplc="5DACF412">
+      <w:start w:val="1"/>
+      <w:numFmt w:val="bullet"/>
+      <w:suff w:val="space"/>
+      <w:lvlText w:val=""/>
+      <w:lvlJc w:val="left"/>
+      <w:pPr>
+        <w:ind w:left="1429" w:hanging="360"/>
+      </w:pPr>
+      <w:rPr>
+        <w:rFonts w:ascii="Symbol" w:hAnsi="Symbol" w:hint="default"/>
+      </w:rPr>
+    </w:lvl>
+    <w:lvl w:ilvl="1" w:tplc="FFFFFFFF" w:tentative="1">
+      <w:start w:val="1"/>
+      <w:numFmt w:val="bullet"/>
+      <w:lvlText w:val="o"/>
+      <w:lvlJc w:val="left"/>
+      <w:pPr>
+        <w:ind w:left="2149" w:hanging="360"/>
+      </w:pPr>
+      <w:rPr>
+        <w:rFonts w:ascii="Courier New" w:hAnsi="Courier New" w:cs="Courier New" w:hint="default"/>
+      </w:rPr>
+    </w:lvl>
+    <w:lvl w:ilvl="2" w:tplc="FFFFFFFF" w:tentative="1">
+      <w:start w:val="1"/>
+      <w:numFmt w:val="bullet"/>
+      <w:lvlText w:val=""/>
+      <w:lvlJc w:val="left"/>
+      <w:pPr>
+        <w:ind w:left="2869" w:hanging="360"/>
+      </w:pPr>
+      <w:rPr>
+        <w:rFonts w:ascii="Wingdings" w:hAnsi="Wingdings" w:hint="default"/>
+      </w:rPr>
+    </w:lvl>
+    <w:lvl w:ilvl="3" w:tplc="FFFFFFFF" w:tentative="1">
+      <w:start w:val="1"/>
+      <w:numFmt w:val="bullet"/>
+      <w:lvlText w:val=""/>
+      <w:lvlJc w:val="left"/>
+      <w:pPr>
+        <w:ind w:left="3589" w:hanging="360"/>
+      </w:pPr>
+      <w:rPr>
+        <w:rFonts w:ascii="Symbol" w:hAnsi="Symbol" w:hint="default"/>
+      </w:rPr>
+    </w:lvl>
+    <w:lvl w:ilvl="4" w:tplc="FFFFFFFF" w:tentative="1">
+      <w:start w:val="1"/>
+      <w:numFmt w:val="bullet"/>
+      <w:lvlText w:val="o"/>
+      <w:lvlJc w:val="left"/>
+      <w:pPr>
+        <w:ind w:left="4309" w:hanging="360"/>
+      </w:pPr>
+      <w:rPr>
+        <w:rFonts w:ascii="Courier New" w:hAnsi="Courier New" w:cs="Courier New" w:hint="default"/>
+      </w:rPr>
+    </w:lvl>
+    <w:lvl w:ilvl="5" w:tplc="FFFFFFFF" w:tentative="1">
+      <w:start w:val="1"/>
+      <w:numFmt w:val="bullet"/>
+      <w:lvlText w:val=""/>
+      <w:lvlJc w:val="left"/>
+      <w:pPr>
+        <w:ind w:left="5029" w:hanging="360"/>
+      </w:pPr>
+      <w:rPr>
+        <w:rFonts w:ascii="Wingdings" w:hAnsi="Wingdings" w:hint="default"/>
+      </w:rPr>
+    </w:lvl>
+    <w:lvl w:ilvl="6" w:tplc="FFFFFFFF" w:tentative="1">
+      <w:start w:val="1"/>
+      <w:numFmt w:val="bullet"/>
+      <w:lvlText w:val=""/>
+      <w:lvlJc w:val="left"/>
+      <w:pPr>
+        <w:ind w:left="5749" w:hanging="360"/>
+      </w:pPr>
+      <w:rPr>
+        <w:rFonts w:ascii="Symbol" w:hAnsi="Symbol" w:hint="default"/>
+      </w:rPr>
+    </w:lvl>
+    <w:lvl w:ilvl="7" w:tplc="FFFFFFFF" w:tentative="1">
+      <w:start w:val="1"/>
+      <w:numFmt w:val="bullet"/>
+      <w:lvlText w:val="o"/>
+      <w:lvlJc w:val="left"/>
+      <w:pPr>
+        <w:ind w:left="6469" w:hanging="360"/>
+      </w:pPr>
+      <w:rPr>
+        <w:rFonts w:ascii="Courier New" w:hAnsi="Courier New" w:cs="Courier New" w:hint="default"/>
+      </w:rPr>
+    </w:lvl>
+    <w:lvl w:ilvl="8" w:tplc="FFFFFFFF" w:tentative="1">
+      <w:start w:val="1"/>
+      <w:numFmt w:val="bullet"/>
+      <w:lvlText w:val=""/>
+      <w:lvlJc w:val="left"/>
+      <w:pPr>
+        <w:ind w:left="7189" w:hanging="360"/>
+      </w:pPr>
+      <w:rPr>
+        <w:rFonts w:ascii="Wingdings" w:hAnsi="Wingdings" w:hint="default"/>
+      </w:rPr>
+    </w:lvl>
+  </w:abstractNum>
+  <w:abstractNum w:abstractNumId="3" w15:restartNumberingAfterBreak="0">
+    <w:nsid w:val="234367D1"/>
+    <w:multiLevelType w:val="hybridMultilevel"/>
+    <w:tmpl w:val="0164C88A"/>
+    <w:lvl w:ilvl="0" w:tplc="0E38DF54">
+      <w:start w:val="1"/>
+      <w:numFmt w:val="bullet"/>
+      <w:lvlText w:val=""/>
+      <w:lvlJc w:val="left"/>
+      <w:pPr>
+        <w:ind w:left="1429" w:hanging="360"/>
+      </w:pPr>
+      <w:rPr>
+        <w:rFonts w:ascii="Symbol" w:hAnsi="Symbol" w:hint="default"/>
+      </w:rPr>
+    </w:lvl>
+    <w:lvl w:ilvl="1" w:tplc="04190003" w:tentative="1">
+      <w:start w:val="1"/>
+      <w:numFmt w:val="bullet"/>
+      <w:lvlText w:val="o"/>
+      <w:lvlJc w:val="left"/>
+      <w:pPr>
+        <w:ind w:left="2149" w:hanging="360"/>
+      </w:pPr>
+      <w:rPr>
+        <w:rFonts w:ascii="Courier New" w:hAnsi="Courier New" w:cs="Courier New" w:hint="default"/>
+      </w:rPr>
+    </w:lvl>
+    <w:lvl w:ilvl="2" w:tplc="04190005" w:tentative="1">
+      <w:start w:val="1"/>
+      <w:numFmt w:val="bullet"/>
+      <w:lvlText w:val=""/>
+      <w:lvlJc w:val="left"/>
+      <w:pPr>
+        <w:ind w:left="2869" w:hanging="360"/>
+      </w:pPr>
+      <w:rPr>
+        <w:rFonts w:ascii="Wingdings" w:hAnsi="Wingdings" w:hint="default"/>
+      </w:rPr>
+    </w:lvl>
+    <w:lvl w:ilvl="3" w:tplc="04190001" w:tentative="1">
+      <w:start w:val="1"/>
+      <w:numFmt w:val="bullet"/>
+      <w:lvlText w:val=""/>
+      <w:lvlJc w:val="left"/>
+      <w:pPr>
+        <w:ind w:left="3589" w:hanging="360"/>
+      </w:pPr>
+      <w:rPr>
+        <w:rFonts w:ascii="Symbol" w:hAnsi="Symbol" w:hint="default"/>
+      </w:rPr>
+    </w:lvl>
+    <w:lvl w:ilvl="4" w:tplc="04190003" w:tentative="1">
+      <w:start w:val="1"/>
+      <w:numFmt w:val="bullet"/>
+      <w:lvlText w:val="o"/>
+      <w:lvlJc w:val="left"/>
+      <w:pPr>
+        <w:ind w:left="4309" w:hanging="360"/>
+      </w:pPr>
+      <w:rPr>
+        <w:rFonts w:ascii="Courier New" w:hAnsi="Courier New" w:cs="Courier New" w:hint="default"/>
+      </w:rPr>
+    </w:lvl>
+    <w:lvl w:ilvl="5" w:tplc="04190005" w:tentative="1">
+      <w:start w:val="1"/>
+      <w:numFmt w:val="bullet"/>
+      <w:lvlText w:val=""/>
+      <w:lvlJc w:val="left"/>
+      <w:pPr>
+        <w:ind w:left="5029" w:hanging="360"/>
+      </w:pPr>
+      <w:rPr>
+        <w:rFonts w:ascii="Wingdings" w:hAnsi="Wingdings" w:hint="default"/>
+      </w:rPr>
+    </w:lvl>
+    <w:lvl w:ilvl="6" w:tplc="04190001" w:tentative="1">
+      <w:start w:val="1"/>
+      <w:numFmt w:val="bullet"/>
+      <w:lvlText w:val=""/>
+      <w:lvlJc w:val="left"/>
+      <w:pPr>
+        <w:ind w:left="5749" w:hanging="360"/>
+      </w:pPr>
+      <w:rPr>
+        <w:rFonts w:ascii="Symbol" w:hAnsi="Symbol" w:hint="default"/>
+      </w:rPr>
+    </w:lvl>
+    <w:lvl w:ilvl="7" w:tplc="04190003" w:tentative="1">
+      <w:start w:val="1"/>
+      <w:numFmt w:val="bullet"/>
+      <w:lvlText w:val="o"/>
+      <w:lvlJc w:val="left"/>
+      <w:pPr>
+        <w:ind w:left="6469" w:hanging="360"/>
+      </w:pPr>
+      <w:rPr>
+        <w:rFonts w:ascii="Courier New" w:hAnsi="Courier New" w:cs="Courier New" w:hint="default"/>
+      </w:rPr>
+    </w:lvl>
+    <w:lvl w:ilvl="8" w:tplc="04190005" w:tentative="1">
+      <w:start w:val="1"/>
+      <w:numFmt w:val="bullet"/>
+      <w:lvlText w:val=""/>
+      <w:lvlJc w:val="left"/>
+      <w:pPr>
+        <w:ind w:left="7189" w:hanging="360"/>
+      </w:pPr>
+      <w:rPr>
+        <w:rFonts w:ascii="Wingdings" w:hAnsi="Wingdings" w:hint="default"/>
+      </w:rPr>
+    </w:lvl>
+  </w:abstractNum>
+  <w:abstractNum w:abstractNumId="4" w15:restartNumberingAfterBreak="0">
     <w:nsid w:val="2A833014"/>
     <w:multiLevelType w:val="hybridMultilevel"/>
     <w:tmpl w:val="517455A2"/>
@@ -10866,7 +12960,234 @@
       </w:rPr>
     </w:lvl>
   </w:abstractNum>
-  <w:abstractNum w:abstractNumId="3" w15:restartNumberingAfterBreak="0">
+  <w:abstractNum w:abstractNumId="5" w15:restartNumberingAfterBreak="0">
+    <w:nsid w:val="4236506B"/>
+    <w:multiLevelType w:val="hybridMultilevel"/>
+    <w:tmpl w:val="B632188C"/>
+    <w:lvl w:ilvl="0" w:tplc="0E38DF54">
+      <w:start w:val="1"/>
+      <w:numFmt w:val="bullet"/>
+      <w:lvlText w:val=""/>
+      <w:lvlJc w:val="left"/>
+      <w:pPr>
+        <w:ind w:left="1429" w:hanging="360"/>
+      </w:pPr>
+      <w:rPr>
+        <w:rFonts w:ascii="Symbol" w:hAnsi="Symbol" w:hint="default"/>
+      </w:rPr>
+    </w:lvl>
+    <w:lvl w:ilvl="1" w:tplc="04190003" w:tentative="1">
+      <w:start w:val="1"/>
+      <w:numFmt w:val="bullet"/>
+      <w:lvlText w:val="o"/>
+      <w:lvlJc w:val="left"/>
+      <w:pPr>
+        <w:ind w:left="2149" w:hanging="360"/>
+      </w:pPr>
+      <w:rPr>
+        <w:rFonts w:ascii="Courier New" w:hAnsi="Courier New" w:cs="Courier New" w:hint="default"/>
+      </w:rPr>
+    </w:lvl>
+    <w:lvl w:ilvl="2" w:tplc="04190005" w:tentative="1">
+      <w:start w:val="1"/>
+      <w:numFmt w:val="bullet"/>
+      <w:lvlText w:val=""/>
+      <w:lvlJc w:val="left"/>
+      <w:pPr>
+        <w:ind w:left="2869" w:hanging="360"/>
+      </w:pPr>
+      <w:rPr>
+        <w:rFonts w:ascii="Wingdings" w:hAnsi="Wingdings" w:hint="default"/>
+      </w:rPr>
+    </w:lvl>
+    <w:lvl w:ilvl="3" w:tplc="04190001" w:tentative="1">
+      <w:start w:val="1"/>
+      <w:numFmt w:val="bullet"/>
+      <w:lvlText w:val=""/>
+      <w:lvlJc w:val="left"/>
+      <w:pPr>
+        <w:ind w:left="3589" w:hanging="360"/>
+      </w:pPr>
+      <w:rPr>
+        <w:rFonts w:ascii="Symbol" w:hAnsi="Symbol" w:hint="default"/>
+      </w:rPr>
+    </w:lvl>
+    <w:lvl w:ilvl="4" w:tplc="04190003" w:tentative="1">
+      <w:start w:val="1"/>
+      <w:numFmt w:val="bullet"/>
+      <w:lvlText w:val="o"/>
+      <w:lvlJc w:val="left"/>
+      <w:pPr>
+        <w:ind w:left="4309" w:hanging="360"/>
+      </w:pPr>
+      <w:rPr>
+        <w:rFonts w:ascii="Courier New" w:hAnsi="Courier New" w:cs="Courier New" w:hint="default"/>
+      </w:rPr>
+    </w:lvl>
+    <w:lvl w:ilvl="5" w:tplc="04190005" w:tentative="1">
+      <w:start w:val="1"/>
+      <w:numFmt w:val="bullet"/>
+      <w:lvlText w:val=""/>
+      <w:lvlJc w:val="left"/>
+      <w:pPr>
+        <w:ind w:left="5029" w:hanging="360"/>
+      </w:pPr>
+      <w:rPr>
+        <w:rFonts w:ascii="Wingdings" w:hAnsi="Wingdings" w:hint="default"/>
+      </w:rPr>
+    </w:lvl>
+    <w:lvl w:ilvl="6" w:tplc="04190001" w:tentative="1">
+      <w:start w:val="1"/>
+      <w:numFmt w:val="bullet"/>
+      <w:lvlText w:val=""/>
+      <w:lvlJc w:val="left"/>
+      <w:pPr>
+        <w:ind w:left="5749" w:hanging="360"/>
+      </w:pPr>
+      <w:rPr>
+        <w:rFonts w:ascii="Symbol" w:hAnsi="Symbol" w:hint="default"/>
+      </w:rPr>
+    </w:lvl>
+    <w:lvl w:ilvl="7" w:tplc="04190003" w:tentative="1">
+      <w:start w:val="1"/>
+      <w:numFmt w:val="bullet"/>
+      <w:lvlText w:val="o"/>
+      <w:lvlJc w:val="left"/>
+      <w:pPr>
+        <w:ind w:left="6469" w:hanging="360"/>
+      </w:pPr>
+      <w:rPr>
+        <w:rFonts w:ascii="Courier New" w:hAnsi="Courier New" w:cs="Courier New" w:hint="default"/>
+      </w:rPr>
+    </w:lvl>
+    <w:lvl w:ilvl="8" w:tplc="04190005" w:tentative="1">
+      <w:start w:val="1"/>
+      <w:numFmt w:val="bullet"/>
+      <w:lvlText w:val=""/>
+      <w:lvlJc w:val="left"/>
+      <w:pPr>
+        <w:ind w:left="7189" w:hanging="360"/>
+      </w:pPr>
+      <w:rPr>
+        <w:rFonts w:ascii="Wingdings" w:hAnsi="Wingdings" w:hint="default"/>
+      </w:rPr>
+    </w:lvl>
+  </w:abstractNum>
+  <w:abstractNum w:abstractNumId="6" w15:restartNumberingAfterBreak="0">
+    <w:nsid w:val="5AD2032B"/>
+    <w:multiLevelType w:val="hybridMultilevel"/>
+    <w:tmpl w:val="502C1680"/>
+    <w:lvl w:ilvl="0" w:tplc="CA243B98">
+      <w:start w:val="1"/>
+      <w:numFmt w:val="bullet"/>
+      <w:suff w:val="space"/>
+      <w:lvlText w:val=""/>
+      <w:lvlJc w:val="left"/>
+      <w:pPr>
+        <w:ind w:left="1429" w:hanging="360"/>
+      </w:pPr>
+      <w:rPr>
+        <w:rFonts w:ascii="Symbol" w:hAnsi="Symbol" w:hint="default"/>
+      </w:rPr>
+    </w:lvl>
+    <w:lvl w:ilvl="1" w:tplc="04190003" w:tentative="1">
+      <w:start w:val="1"/>
+      <w:numFmt w:val="bullet"/>
+      <w:lvlText w:val="o"/>
+      <w:lvlJc w:val="left"/>
+      <w:pPr>
+        <w:ind w:left="2149" w:hanging="360"/>
+      </w:pPr>
+      <w:rPr>
+        <w:rFonts w:ascii="Courier New" w:hAnsi="Courier New" w:cs="Courier New" w:hint="default"/>
+      </w:rPr>
+    </w:lvl>
+    <w:lvl w:ilvl="2" w:tplc="04190005" w:tentative="1">
+      <w:start w:val="1"/>
+      <w:numFmt w:val="bullet"/>
+      <w:lvlText w:val=""/>
+      <w:lvlJc w:val="left"/>
+      <w:pPr>
+        <w:ind w:left="2869" w:hanging="360"/>
+      </w:pPr>
+      <w:rPr>
+        <w:rFonts w:ascii="Wingdings" w:hAnsi="Wingdings" w:hint="default"/>
+      </w:rPr>
+    </w:lvl>
+    <w:lvl w:ilvl="3" w:tplc="04190001" w:tentative="1">
+      <w:start w:val="1"/>
+      <w:numFmt w:val="bullet"/>
+      <w:lvlText w:val=""/>
+      <w:lvlJc w:val="left"/>
+      <w:pPr>
+        <w:ind w:left="3589" w:hanging="360"/>
+      </w:pPr>
+      <w:rPr>
+        <w:rFonts w:ascii="Symbol" w:hAnsi="Symbol" w:hint="default"/>
+      </w:rPr>
+    </w:lvl>
+    <w:lvl w:ilvl="4" w:tplc="04190003" w:tentative="1">
+      <w:start w:val="1"/>
+      <w:numFmt w:val="bullet"/>
+      <w:lvlText w:val="o"/>
+      <w:lvlJc w:val="left"/>
+      <w:pPr>
+        <w:ind w:left="4309" w:hanging="360"/>
+      </w:pPr>
+      <w:rPr>
+        <w:rFonts w:ascii="Courier New" w:hAnsi="Courier New" w:cs="Courier New" w:hint="default"/>
+      </w:rPr>
+    </w:lvl>
+    <w:lvl w:ilvl="5" w:tplc="04190005" w:tentative="1">
+      <w:start w:val="1"/>
+      <w:numFmt w:val="bullet"/>
+      <w:lvlText w:val=""/>
+      <w:lvlJc w:val="left"/>
+      <w:pPr>
+        <w:ind w:left="5029" w:hanging="360"/>
+      </w:pPr>
+      <w:rPr>
+        <w:rFonts w:ascii="Wingdings" w:hAnsi="Wingdings" w:hint="default"/>
+      </w:rPr>
+    </w:lvl>
+    <w:lvl w:ilvl="6" w:tplc="04190001" w:tentative="1">
+      <w:start w:val="1"/>
+      <w:numFmt w:val="bullet"/>
+      <w:lvlText w:val=""/>
+      <w:lvlJc w:val="left"/>
+      <w:pPr>
+        <w:ind w:left="5749" w:hanging="360"/>
+      </w:pPr>
+      <w:rPr>
+        <w:rFonts w:ascii="Symbol" w:hAnsi="Symbol" w:hint="default"/>
+      </w:rPr>
+    </w:lvl>
+    <w:lvl w:ilvl="7" w:tplc="04190003" w:tentative="1">
+      <w:start w:val="1"/>
+      <w:numFmt w:val="bullet"/>
+      <w:lvlText w:val="o"/>
+      <w:lvlJc w:val="left"/>
+      <w:pPr>
+        <w:ind w:left="6469" w:hanging="360"/>
+      </w:pPr>
+      <w:rPr>
+        <w:rFonts w:ascii="Courier New" w:hAnsi="Courier New" w:cs="Courier New" w:hint="default"/>
+      </w:rPr>
+    </w:lvl>
+    <w:lvl w:ilvl="8" w:tplc="04190005" w:tentative="1">
+      <w:start w:val="1"/>
+      <w:numFmt w:val="bullet"/>
+      <w:lvlText w:val=""/>
+      <w:lvlJc w:val="left"/>
+      <w:pPr>
+        <w:ind w:left="7189" w:hanging="360"/>
+      </w:pPr>
+      <w:rPr>
+        <w:rFonts w:ascii="Wingdings" w:hAnsi="Wingdings" w:hint="default"/>
+      </w:rPr>
+    </w:lvl>
+  </w:abstractNum>
+  <w:abstractNum w:abstractNumId="7" w15:restartNumberingAfterBreak="0">
     <w:nsid w:val="5E9D081E"/>
     <w:multiLevelType w:val="multilevel"/>
     <w:tmpl w:val="31FAC168"/>
@@ -10958,17 +13279,146 @@
       </w:pPr>
     </w:lvl>
   </w:abstractNum>
+  <w:abstractNum w:abstractNumId="8" w15:restartNumberingAfterBreak="0">
+    <w:nsid w:val="6AB437FC"/>
+    <w:multiLevelType w:val="hybridMultilevel"/>
+    <w:tmpl w:val="D8FE15E4"/>
+    <w:lvl w:ilvl="0" w:tplc="3DB6C3B6">
+      <w:start w:val="1"/>
+      <w:numFmt w:val="bullet"/>
+      <w:suff w:val="space"/>
+      <w:lvlText w:val=""/>
+      <w:lvlJc w:val="left"/>
+      <w:pPr>
+        <w:ind w:left="1429" w:hanging="360"/>
+      </w:pPr>
+      <w:rPr>
+        <w:rFonts w:ascii="Symbol" w:hAnsi="Symbol" w:hint="default"/>
+      </w:rPr>
+    </w:lvl>
+    <w:lvl w:ilvl="1" w:tplc="04190003" w:tentative="1">
+      <w:start w:val="1"/>
+      <w:numFmt w:val="bullet"/>
+      <w:lvlText w:val="o"/>
+      <w:lvlJc w:val="left"/>
+      <w:pPr>
+        <w:ind w:left="2149" w:hanging="360"/>
+      </w:pPr>
+      <w:rPr>
+        <w:rFonts w:ascii="Courier New" w:hAnsi="Courier New" w:cs="Courier New" w:hint="default"/>
+      </w:rPr>
+    </w:lvl>
+    <w:lvl w:ilvl="2" w:tplc="04190005" w:tentative="1">
+      <w:start w:val="1"/>
+      <w:numFmt w:val="bullet"/>
+      <w:lvlText w:val=""/>
+      <w:lvlJc w:val="left"/>
+      <w:pPr>
+        <w:ind w:left="2869" w:hanging="360"/>
+      </w:pPr>
+      <w:rPr>
+        <w:rFonts w:ascii="Wingdings" w:hAnsi="Wingdings" w:hint="default"/>
+      </w:rPr>
+    </w:lvl>
+    <w:lvl w:ilvl="3" w:tplc="04190001" w:tentative="1">
+      <w:start w:val="1"/>
+      <w:numFmt w:val="bullet"/>
+      <w:lvlText w:val=""/>
+      <w:lvlJc w:val="left"/>
+      <w:pPr>
+        <w:ind w:left="3589" w:hanging="360"/>
+      </w:pPr>
+      <w:rPr>
+        <w:rFonts w:ascii="Symbol" w:hAnsi="Symbol" w:hint="default"/>
+      </w:rPr>
+    </w:lvl>
+    <w:lvl w:ilvl="4" w:tplc="04190003" w:tentative="1">
+      <w:start w:val="1"/>
+      <w:numFmt w:val="bullet"/>
+      <w:lvlText w:val="o"/>
+      <w:lvlJc w:val="left"/>
+      <w:pPr>
+        <w:ind w:left="4309" w:hanging="360"/>
+      </w:pPr>
+      <w:rPr>
+        <w:rFonts w:ascii="Courier New" w:hAnsi="Courier New" w:cs="Courier New" w:hint="default"/>
+      </w:rPr>
+    </w:lvl>
+    <w:lvl w:ilvl="5" w:tplc="04190005" w:tentative="1">
+      <w:start w:val="1"/>
+      <w:numFmt w:val="bullet"/>
+      <w:lvlText w:val=""/>
+      <w:lvlJc w:val="left"/>
+      <w:pPr>
+        <w:ind w:left="5029" w:hanging="360"/>
+      </w:pPr>
+      <w:rPr>
+        <w:rFonts w:ascii="Wingdings" w:hAnsi="Wingdings" w:hint="default"/>
+      </w:rPr>
+    </w:lvl>
+    <w:lvl w:ilvl="6" w:tplc="04190001" w:tentative="1">
+      <w:start w:val="1"/>
+      <w:numFmt w:val="bullet"/>
+      <w:lvlText w:val=""/>
+      <w:lvlJc w:val="left"/>
+      <w:pPr>
+        <w:ind w:left="5749" w:hanging="360"/>
+      </w:pPr>
+      <w:rPr>
+        <w:rFonts w:ascii="Symbol" w:hAnsi="Symbol" w:hint="default"/>
+      </w:rPr>
+    </w:lvl>
+    <w:lvl w:ilvl="7" w:tplc="04190003" w:tentative="1">
+      <w:start w:val="1"/>
+      <w:numFmt w:val="bullet"/>
+      <w:lvlText w:val="o"/>
+      <w:lvlJc w:val="left"/>
+      <w:pPr>
+        <w:ind w:left="6469" w:hanging="360"/>
+      </w:pPr>
+      <w:rPr>
+        <w:rFonts w:ascii="Courier New" w:hAnsi="Courier New" w:cs="Courier New" w:hint="default"/>
+      </w:rPr>
+    </w:lvl>
+    <w:lvl w:ilvl="8" w:tplc="04190005" w:tentative="1">
+      <w:start w:val="1"/>
+      <w:numFmt w:val="bullet"/>
+      <w:lvlText w:val=""/>
+      <w:lvlJc w:val="left"/>
+      <w:pPr>
+        <w:ind w:left="7189" w:hanging="360"/>
+      </w:pPr>
+      <w:rPr>
+        <w:rFonts w:ascii="Wingdings" w:hAnsi="Wingdings" w:hint="default"/>
+      </w:rPr>
+    </w:lvl>
+  </w:abstractNum>
   <w:num w:numId="1">
-    <w:abstractNumId w:val="3"/>
+    <w:abstractNumId w:val="7"/>
   </w:num>
   <w:num w:numId="2">
     <w:abstractNumId w:val="1"/>
   </w:num>
   <w:num w:numId="3">
-    <w:abstractNumId w:val="2"/>
+    <w:abstractNumId w:val="4"/>
   </w:num>
   <w:num w:numId="4">
     <w:abstractNumId w:val="0"/>
+  </w:num>
+  <w:num w:numId="5">
+    <w:abstractNumId w:val="2"/>
+  </w:num>
+  <w:num w:numId="6">
+    <w:abstractNumId w:val="5"/>
+  </w:num>
+  <w:num w:numId="7">
+    <w:abstractNumId w:val="6"/>
+  </w:num>
+  <w:num w:numId="8">
+    <w:abstractNumId w:val="3"/>
+  </w:num>
+  <w:num w:numId="9">
+    <w:abstractNumId w:val="8"/>
   </w:num>
   <w:numIdMacAtCleanup w:val="4"/>
 </w:numbering>
@@ -11373,7 +13823,7 @@
   <w:style w:type="paragraph" w:default="1" w:styleId="a">
     <w:name w:val="Normal"/>
     <w:qFormat/>
-    <w:rsid w:val="009228B0"/>
+    <w:rsid w:val="00346481"/>
     <w:pPr>
       <w:ind w:firstLine="709"/>
     </w:pPr>
@@ -11613,6 +14063,7 @@
   <w:style w:type="character" w:default="1" w:styleId="a0">
     <w:name w:val="Default Paragraph Font"/>
     <w:uiPriority w:val="1"/>
+    <w:semiHidden/>
     <w:unhideWhenUsed/>
   </w:style>
   <w:style w:type="table" w:default="1" w:styleId="a1">
@@ -12773,6 +15224,19 @@
       <w:lang w:eastAsia="ru-RU"/>
     </w:rPr>
   </w:style>
+  <w:style w:type="character" w:styleId="HTML1">
+    <w:name w:val="HTML Code"/>
+    <w:basedOn w:val="a0"/>
+    <w:uiPriority w:val="99"/>
+    <w:semiHidden/>
+    <w:unhideWhenUsed/>
+    <w:rsid w:val="006622F7"/>
+    <w:rPr>
+      <w:rFonts w:ascii="Courier New" w:eastAsia="Times New Roman" w:hAnsi="Courier New" w:cs="Courier New"/>
+      <w:sz w:val="20"/>
+      <w:szCs w:val="20"/>
+    </w:rPr>
+  </w:style>
 </w:styles>
 </file>
 

</xml_diff>

<commit_message>
adding full 2 part
</commit_message>
<xml_diff>
--- a/Диплом мешков 23.106.docx
+++ b/Диплом мешков 23.106.docx
@@ -81,6 +81,18 @@
         </w:rPr>
         <w:t xml:space="preserve"> </w:t>
       </w:r>
+    </w:p>
+    <w:p>
+      <w:pPr>
+        <w:spacing w:line="240" w:lineRule="auto"/>
+        <w:ind w:left="284" w:right="227" w:firstLine="0"/>
+        <w:jc w:val="center"/>
+        <w:rPr>
+          <w:rFonts w:eastAsia="Times New Roman"/>
+          <w:szCs w:val="28"/>
+          <w:lang w:eastAsia="ru-RU"/>
+        </w:rPr>
+      </w:pPr>
       <w:r>
         <w:rPr>
           <w:rFonts w:eastAsia="Times New Roman"/>
@@ -257,20 +269,11 @@
     </w:p>
     <w:p>
       <w:pPr>
-        <w:tabs>
-          <w:tab w:val="left" w:pos="142"/>
-        </w:tabs>
         <w:ind w:left="284" w:right="227" w:firstLine="0"/>
         <w:jc w:val="center"/>
-        <w:rPr>
-          <w:szCs w:val="28"/>
-        </w:rPr>
-      </w:pPr>
-      <w:r>
-        <w:rPr>
-          <w:szCs w:val="28"/>
-        </w:rPr>
-        <w:t>Отчёт к производственной практике</w:t>
+      </w:pPr>
+      <w:r>
+        <w:t xml:space="preserve">Пояснительная записка к дипломному проекту </w:t>
       </w:r>
     </w:p>
     <w:p>
@@ -763,11 +766,8 @@
             <w:rPr>
               <w:rFonts w:asciiTheme="minorHAnsi" w:eastAsiaTheme="minorEastAsia" w:hAnsiTheme="minorHAnsi"/>
               <w:noProof/>
-              <w:kern w:val="2"/>
-              <w:sz w:val="24"/>
-              <w:szCs w:val="24"/>
+              <w:sz w:val="22"/>
               <w:lang w:eastAsia="ru-RU"/>
-              <w14:ligatures w14:val="standardContextual"/>
             </w:rPr>
           </w:pPr>
           <w:r>
@@ -779,7 +779,7 @@
           <w:r>
             <w:fldChar w:fldCharType="separate"/>
           </w:r>
-          <w:hyperlink w:anchor="_Toc224602627" w:history="1">
+          <w:hyperlink w:anchor="_Toc229413272" w:history="1">
             <w:r>
               <w:rPr>
                 <w:rStyle w:val="ae"/>
@@ -806,7 +806,7 @@
                 <w:noProof/>
                 <w:webHidden/>
               </w:rPr>
-              <w:instrText xml:space="preserve"> PAGEREF _Toc224602627 \h </w:instrText>
+              <w:instrText xml:space="preserve"> PAGEREF _Toc229413272 \h </w:instrText>
             </w:r>
             <w:r>
               <w:rPr>
@@ -843,14 +843,11 @@
             <w:rPr>
               <w:rFonts w:asciiTheme="minorHAnsi" w:eastAsiaTheme="minorEastAsia" w:hAnsiTheme="minorHAnsi"/>
               <w:noProof/>
-              <w:kern w:val="2"/>
-              <w:sz w:val="24"/>
-              <w:szCs w:val="24"/>
+              <w:sz w:val="22"/>
               <w:lang w:eastAsia="ru-RU"/>
-              <w14:ligatures w14:val="standardContextual"/>
             </w:rPr>
           </w:pPr>
-          <w:hyperlink w:anchor="_Toc224602628" w:history="1">
+          <w:hyperlink w:anchor="_Toc229413273" w:history="1">
             <w:r>
               <w:rPr>
                 <w:rStyle w:val="ae"/>
@@ -877,7 +874,7 @@
                 <w:noProof/>
                 <w:webHidden/>
               </w:rPr>
-              <w:instrText xml:space="preserve"> PAGEREF _Toc224602628 \h </w:instrText>
+              <w:instrText xml:space="preserve"> PAGEREF _Toc229413273 \h </w:instrText>
             </w:r>
             <w:r>
               <w:rPr>
@@ -913,66 +910,54 @@
             <w:pStyle w:val="21"/>
             <w:rPr>
               <w:rFonts w:asciiTheme="minorHAnsi" w:eastAsiaTheme="minorEastAsia" w:hAnsiTheme="minorHAnsi"/>
-              <w:noProof/>
-              <w:kern w:val="2"/>
-              <w:sz w:val="24"/>
-              <w:szCs w:val="24"/>
+              <w:sz w:val="22"/>
               <w:lang w:eastAsia="ru-RU"/>
-              <w14:ligatures w14:val="standardContextual"/>
             </w:rPr>
           </w:pPr>
-          <w:hyperlink w:anchor="_Toc224602629" w:history="1">
+          <w:hyperlink w:anchor="_Toc229413274" w:history="1">
             <w:r>
               <w:rPr>
                 <w:rStyle w:val="ae"/>
-                <w:noProof/>
               </w:rPr>
               <w:t>1.1 Описание предметной области</w:t>
             </w:r>
             <w:r>
               <w:rPr>
-                <w:noProof/>
                 <w:webHidden/>
               </w:rPr>
               <w:tab/>
             </w:r>
             <w:r>
               <w:rPr>
-                <w:noProof/>
                 <w:webHidden/>
               </w:rPr>
               <w:fldChar w:fldCharType="begin"/>
             </w:r>
             <w:r>
               <w:rPr>
-                <w:noProof/>
                 <w:webHidden/>
               </w:rPr>
-              <w:instrText xml:space="preserve"> PAGEREF _Toc224602629 \h </w:instrText>
+              <w:instrText xml:space="preserve"> PAGEREF _Toc229413274 \h </w:instrText>
             </w:r>
             <w:r>
               <w:rPr>
-                <w:noProof/>
                 <w:webHidden/>
               </w:rPr>
             </w:r>
             <w:r>
               <w:rPr>
-                <w:noProof/>
                 <w:webHidden/>
               </w:rPr>
               <w:fldChar w:fldCharType="separate"/>
             </w:r>
             <w:r>
               <w:rPr>
-                <w:noProof/>
                 <w:webHidden/>
               </w:rPr>
               <w:t>5</w:t>
             </w:r>
             <w:r>
               <w:rPr>
-                <w:noProof/>
                 <w:webHidden/>
               </w:rPr>
               <w:fldChar w:fldCharType="end"/>
@@ -984,66 +969,233 @@
             <w:pStyle w:val="21"/>
             <w:rPr>
               <w:rFonts w:asciiTheme="minorHAnsi" w:eastAsiaTheme="minorEastAsia" w:hAnsiTheme="minorHAnsi"/>
-              <w:noProof/>
-              <w:kern w:val="2"/>
-              <w:sz w:val="24"/>
-              <w:szCs w:val="24"/>
+              <w:sz w:val="22"/>
               <w:lang w:eastAsia="ru-RU"/>
-              <w14:ligatures w14:val="standardContextual"/>
             </w:rPr>
           </w:pPr>
-          <w:hyperlink w:anchor="_Toc224602630" w:history="1">
+          <w:hyperlink w:anchor="_Toc229413275" w:history="1">
             <w:r>
               <w:rPr>
                 <w:rStyle w:val="ae"/>
-                <w:noProof/>
-              </w:rPr>
-              <w:t>1.2 Исходные данные</w:t>
+              </w:rPr>
+              <w:t>1.2 Определение функциональных задач пользователей</w:t>
             </w:r>
             <w:r>
               <w:rPr>
-                <w:noProof/>
                 <w:webHidden/>
               </w:rPr>
               <w:tab/>
             </w:r>
             <w:r>
               <w:rPr>
-                <w:noProof/>
                 <w:webHidden/>
               </w:rPr>
               <w:fldChar w:fldCharType="begin"/>
             </w:r>
             <w:r>
               <w:rPr>
-                <w:noProof/>
                 <w:webHidden/>
               </w:rPr>
-              <w:instrText xml:space="preserve"> PAGEREF _Toc224602630 \h </w:instrText>
+              <w:instrText xml:space="preserve"> PAGEREF _Toc229413275 \h </w:instrText>
             </w:r>
             <w:r>
               <w:rPr>
-                <w:noProof/>
                 <w:webHidden/>
               </w:rPr>
             </w:r>
             <w:r>
               <w:rPr>
-                <w:noProof/>
                 <w:webHidden/>
               </w:rPr>
               <w:fldChar w:fldCharType="separate"/>
             </w:r>
             <w:r>
               <w:rPr>
-                <w:noProof/>
                 <w:webHidden/>
               </w:rPr>
-              <w:t>7</w:t>
+              <w:t>8</w:t>
             </w:r>
             <w:r>
               <w:rPr>
-                <w:noProof/>
+                <w:webHidden/>
+              </w:rPr>
+              <w:fldChar w:fldCharType="end"/>
+            </w:r>
+          </w:hyperlink>
+        </w:p>
+        <w:p>
+          <w:pPr>
+            <w:pStyle w:val="21"/>
+            <w:rPr>
+              <w:rFonts w:asciiTheme="minorHAnsi" w:eastAsiaTheme="minorEastAsia" w:hAnsiTheme="minorHAnsi"/>
+              <w:sz w:val="22"/>
+              <w:lang w:eastAsia="ru-RU"/>
+            </w:rPr>
+          </w:pPr>
+          <w:hyperlink w:anchor="_Toc229413276" w:history="1">
+            <w:r>
+              <w:rPr>
+                <w:rStyle w:val="ae"/>
+              </w:rPr>
+              <w:t>1.3 Анализ аналогов и прототипов</w:t>
+            </w:r>
+            <w:r>
+              <w:rPr>
+                <w:webHidden/>
+              </w:rPr>
+              <w:tab/>
+            </w:r>
+            <w:r>
+              <w:rPr>
+                <w:webHidden/>
+              </w:rPr>
+              <w:fldChar w:fldCharType="begin"/>
+            </w:r>
+            <w:r>
+              <w:rPr>
+                <w:webHidden/>
+              </w:rPr>
+              <w:instrText xml:space="preserve"> PAGEREF _Toc229413276 \h </w:instrText>
+            </w:r>
+            <w:r>
+              <w:rPr>
+                <w:webHidden/>
+              </w:rPr>
+            </w:r>
+            <w:r>
+              <w:rPr>
+                <w:webHidden/>
+              </w:rPr>
+              <w:fldChar w:fldCharType="separate"/>
+            </w:r>
+            <w:r>
+              <w:rPr>
+                <w:webHidden/>
+              </w:rPr>
+              <w:t>11</w:t>
+            </w:r>
+            <w:r>
+              <w:rPr>
+                <w:webHidden/>
+              </w:rPr>
+              <w:fldChar w:fldCharType="end"/>
+            </w:r>
+          </w:hyperlink>
+        </w:p>
+        <w:p>
+          <w:pPr>
+            <w:pStyle w:val="21"/>
+            <w:rPr>
+              <w:rFonts w:asciiTheme="minorHAnsi" w:eastAsiaTheme="minorEastAsia" w:hAnsiTheme="minorHAnsi"/>
+              <w:sz w:val="22"/>
+              <w:lang w:eastAsia="ru-RU"/>
+            </w:rPr>
+          </w:pPr>
+          <w:hyperlink w:anchor="_Toc229413277" w:history="1">
+            <w:r>
+              <w:rPr>
+                <w:rStyle w:val="ae"/>
+                <w:bCs/>
+              </w:rPr>
+              <w:t>1.4 Проектирование информационной системы</w:t>
+            </w:r>
+            <w:r>
+              <w:rPr>
+                <w:webHidden/>
+              </w:rPr>
+              <w:tab/>
+            </w:r>
+            <w:r>
+              <w:rPr>
+                <w:webHidden/>
+              </w:rPr>
+              <w:fldChar w:fldCharType="begin"/>
+            </w:r>
+            <w:r>
+              <w:rPr>
+                <w:webHidden/>
+              </w:rPr>
+              <w:instrText xml:space="preserve"> PAGEREF _Toc229413277 \h </w:instrText>
+            </w:r>
+            <w:r>
+              <w:rPr>
+                <w:webHidden/>
+              </w:rPr>
+            </w:r>
+            <w:r>
+              <w:rPr>
+                <w:webHidden/>
+              </w:rPr>
+              <w:fldChar w:fldCharType="separate"/>
+            </w:r>
+            <w:r>
+              <w:rPr>
+                <w:webHidden/>
+              </w:rPr>
+              <w:t>17</w:t>
+            </w:r>
+            <w:r>
+              <w:rPr>
+                <w:webHidden/>
+              </w:rPr>
+              <w:fldChar w:fldCharType="end"/>
+            </w:r>
+          </w:hyperlink>
+        </w:p>
+        <w:p>
+          <w:pPr>
+            <w:pStyle w:val="21"/>
+            <w:rPr>
+              <w:rFonts w:asciiTheme="minorHAnsi" w:eastAsiaTheme="minorEastAsia" w:hAnsiTheme="minorHAnsi"/>
+              <w:sz w:val="22"/>
+              <w:lang w:eastAsia="ru-RU"/>
+            </w:rPr>
+          </w:pPr>
+          <w:hyperlink w:anchor="_Toc229413278" w:history="1">
+            <w:r>
+              <w:rPr>
+                <w:rStyle w:val="ae"/>
+                <w:bCs/>
+              </w:rPr>
+              <w:t>1.5 Анализ программных ресурсов, необходимых в работе</w:t>
+            </w:r>
+            <w:r>
+              <w:rPr>
+                <w:webHidden/>
+              </w:rPr>
+              <w:tab/>
+            </w:r>
+            <w:r>
+              <w:rPr>
+                <w:webHidden/>
+              </w:rPr>
+              <w:fldChar w:fldCharType="begin"/>
+            </w:r>
+            <w:r>
+              <w:rPr>
+                <w:webHidden/>
+              </w:rPr>
+              <w:instrText xml:space="preserve"> PAGEREF _Toc229413278 \h </w:instrText>
+            </w:r>
+            <w:r>
+              <w:rPr>
+                <w:webHidden/>
+              </w:rPr>
+            </w:r>
+            <w:r>
+              <w:rPr>
+                <w:webHidden/>
+              </w:rPr>
+              <w:fldChar w:fldCharType="separate"/>
+            </w:r>
+            <w:r>
+              <w:rPr>
+                <w:webHidden/>
+              </w:rPr>
+              <w:t>21</w:t>
+            </w:r>
+            <w:r>
+              <w:rPr>
                 <w:webHidden/>
               </w:rPr>
               <w:fldChar w:fldCharType="end"/>
@@ -1056,22 +1208,18 @@
             <w:rPr>
               <w:rFonts w:asciiTheme="minorHAnsi" w:eastAsiaTheme="minorEastAsia" w:hAnsiTheme="minorHAnsi"/>
               <w:noProof/>
-              <w:kern w:val="2"/>
-              <w:sz w:val="24"/>
-              <w:szCs w:val="24"/>
+              <w:sz w:val="22"/>
               <w:lang w:eastAsia="ru-RU"/>
-              <w14:ligatures w14:val="standardContextual"/>
             </w:rPr>
           </w:pPr>
-          <w:hyperlink w:anchor="_Toc224602631" w:history="1">
+          <w:hyperlink w:anchor="_Toc229413279" w:history="1">
             <w:r>
               <w:rPr>
                 <w:rStyle w:val="ae"/>
                 <w:rFonts w:cs="Times New Roman"/>
                 <w:noProof/>
-                <w:lang w:eastAsia="ru-RU"/>
-              </w:rPr>
-              <w:t>2 Определение функциональных задач пользователей</w:t>
+              </w:rPr>
+              <w:t>2 Технологический раздел</w:t>
             </w:r>
             <w:r>
               <w:rPr>
@@ -1092,7 +1240,7 @@
                 <w:noProof/>
                 <w:webHidden/>
               </w:rPr>
-              <w:instrText xml:space="preserve"> PAGEREF _Toc224602631 \h </w:instrText>
+              <w:instrText xml:space="preserve"> PAGEREF _Toc229413279 \h </w:instrText>
             </w:r>
             <w:r>
               <w:rPr>
@@ -1112,11 +1260,265 @@
                 <w:noProof/>
                 <w:webHidden/>
               </w:rPr>
-              <w:t>8</w:t>
+              <w:t>24</w:t>
             </w:r>
             <w:r>
               <w:rPr>
                 <w:noProof/>
+                <w:webHidden/>
+              </w:rPr>
+              <w:fldChar w:fldCharType="end"/>
+            </w:r>
+          </w:hyperlink>
+        </w:p>
+        <w:p>
+          <w:pPr>
+            <w:pStyle w:val="21"/>
+            <w:rPr>
+              <w:rFonts w:asciiTheme="minorHAnsi" w:eastAsiaTheme="minorEastAsia" w:hAnsiTheme="minorHAnsi"/>
+              <w:sz w:val="22"/>
+              <w:lang w:eastAsia="ru-RU"/>
+            </w:rPr>
+          </w:pPr>
+          <w:hyperlink w:anchor="_Toc229413280" w:history="1">
+            <w:r>
+              <w:rPr>
+                <w:rStyle w:val="ae"/>
+                <w:rFonts w:cs="Times New Roman"/>
+                <w:bCs/>
+              </w:rPr>
+              <w:t>2.1 Структура базы данных</w:t>
+            </w:r>
+            <w:r>
+              <w:rPr>
+                <w:webHidden/>
+              </w:rPr>
+              <w:tab/>
+            </w:r>
+            <w:r>
+              <w:rPr>
+                <w:webHidden/>
+              </w:rPr>
+              <w:fldChar w:fldCharType="begin"/>
+            </w:r>
+            <w:r>
+              <w:rPr>
+                <w:webHidden/>
+              </w:rPr>
+              <w:instrText xml:space="preserve"> PAGEREF _Toc229413280 \h </w:instrText>
+            </w:r>
+            <w:r>
+              <w:rPr>
+                <w:webHidden/>
+              </w:rPr>
+            </w:r>
+            <w:r>
+              <w:rPr>
+                <w:webHidden/>
+              </w:rPr>
+              <w:fldChar w:fldCharType="separate"/>
+            </w:r>
+            <w:r>
+              <w:rPr>
+                <w:webHidden/>
+              </w:rPr>
+              <w:t>24</w:t>
+            </w:r>
+            <w:r>
+              <w:rPr>
+                <w:webHidden/>
+              </w:rPr>
+              <w:fldChar w:fldCharType="end"/>
+            </w:r>
+          </w:hyperlink>
+        </w:p>
+        <w:p>
+          <w:pPr>
+            <w:pStyle w:val="21"/>
+            <w:rPr>
+              <w:rFonts w:asciiTheme="minorHAnsi" w:eastAsiaTheme="minorEastAsia" w:hAnsiTheme="minorHAnsi"/>
+              <w:sz w:val="22"/>
+              <w:lang w:eastAsia="ru-RU"/>
+            </w:rPr>
+          </w:pPr>
+          <w:hyperlink w:anchor="_Toc229413281" w:history="1">
+            <w:r>
+              <w:rPr>
+                <w:rStyle w:val="ae"/>
+              </w:rPr>
+              <w:t>2.2 Разработка интерфейса программного продукта</w:t>
+            </w:r>
+            <w:r>
+              <w:rPr>
+                <w:webHidden/>
+              </w:rPr>
+              <w:tab/>
+            </w:r>
+            <w:r>
+              <w:rPr>
+                <w:webHidden/>
+              </w:rPr>
+              <w:fldChar w:fldCharType="begin"/>
+            </w:r>
+            <w:r>
+              <w:rPr>
+                <w:webHidden/>
+              </w:rPr>
+              <w:instrText xml:space="preserve"> PAGEREF _Toc229413281 \h </w:instrText>
+            </w:r>
+            <w:r>
+              <w:rPr>
+                <w:webHidden/>
+              </w:rPr>
+            </w:r>
+            <w:r>
+              <w:rPr>
+                <w:webHidden/>
+              </w:rPr>
+              <w:fldChar w:fldCharType="separate"/>
+            </w:r>
+            <w:r>
+              <w:rPr>
+                <w:webHidden/>
+              </w:rPr>
+              <w:t>25</w:t>
+            </w:r>
+            <w:r>
+              <w:rPr>
+                <w:webHidden/>
+              </w:rPr>
+              <w:fldChar w:fldCharType="end"/>
+            </w:r>
+          </w:hyperlink>
+        </w:p>
+        <w:p>
+          <w:pPr>
+            <w:pStyle w:val="21"/>
+            <w:rPr>
+              <w:rFonts w:asciiTheme="minorHAnsi" w:eastAsiaTheme="minorEastAsia" w:hAnsiTheme="minorHAnsi"/>
+              <w:sz w:val="22"/>
+              <w:lang w:eastAsia="ru-RU"/>
+            </w:rPr>
+          </w:pPr>
+          <w:hyperlink w:anchor="_Toc229413282" w:history="1">
+            <w:r>
+              <w:rPr>
+                <w:rStyle w:val="ae"/>
+                <w:bCs/>
+              </w:rPr>
+              <w:t>2.3 Разработка структуры программного продукта</w:t>
+            </w:r>
+            <w:r>
+              <w:rPr>
+                <w:webHidden/>
+              </w:rPr>
+              <w:tab/>
+            </w:r>
+            <w:r>
+              <w:rPr>
+                <w:webHidden/>
+              </w:rPr>
+              <w:fldChar w:fldCharType="begin"/>
+            </w:r>
+            <w:r>
+              <w:rPr>
+                <w:webHidden/>
+              </w:rPr>
+              <w:instrText xml:space="preserve"> PAGEREF _Toc229413282 \h </w:instrText>
+            </w:r>
+            <w:r>
+              <w:rPr>
+                <w:webHidden/>
+              </w:rPr>
+            </w:r>
+            <w:r>
+              <w:rPr>
+                <w:webHidden/>
+              </w:rPr>
+              <w:fldChar w:fldCharType="separate"/>
+            </w:r>
+            <w:r>
+              <w:rPr>
+                <w:webHidden/>
+              </w:rPr>
+              <w:t>30</w:t>
+            </w:r>
+            <w:r>
+              <w:rPr>
+                <w:webHidden/>
+              </w:rPr>
+              <w:fldChar w:fldCharType="end"/>
+            </w:r>
+          </w:hyperlink>
+        </w:p>
+        <w:p>
+          <w:pPr>
+            <w:pStyle w:val="21"/>
+            <w:rPr>
+              <w:rFonts w:asciiTheme="minorHAnsi" w:eastAsiaTheme="minorEastAsia" w:hAnsiTheme="minorHAnsi"/>
+              <w:sz w:val="22"/>
+              <w:lang w:eastAsia="ru-RU"/>
+            </w:rPr>
+          </w:pPr>
+          <w:hyperlink w:anchor="_Toc229413283" w:history="1">
+            <w:r>
+              <w:rPr>
+                <w:rStyle w:val="ae"/>
+                <w:bCs/>
+              </w:rPr>
+              <w:t>2.4 Описание про</w:t>
+            </w:r>
+            <w:r>
+              <w:rPr>
+                <w:rStyle w:val="ae"/>
+                <w:bCs/>
+              </w:rPr>
+              <w:t>ц</w:t>
+            </w:r>
+            <w:r>
+              <w:rPr>
+                <w:rStyle w:val="ae"/>
+                <w:bCs/>
+              </w:rPr>
+              <w:t>едур и функций</w:t>
+            </w:r>
+            <w:r>
+              <w:rPr>
+                <w:webHidden/>
+              </w:rPr>
+              <w:tab/>
+            </w:r>
+            <w:r>
+              <w:rPr>
+                <w:webHidden/>
+              </w:rPr>
+              <w:fldChar w:fldCharType="begin"/>
+            </w:r>
+            <w:r>
+              <w:rPr>
+                <w:webHidden/>
+              </w:rPr>
+              <w:instrText xml:space="preserve"> PAGEREF _Toc229413283 \h </w:instrText>
+            </w:r>
+            <w:r>
+              <w:rPr>
+                <w:webHidden/>
+              </w:rPr>
+            </w:r>
+            <w:r>
+              <w:rPr>
+                <w:webHidden/>
+              </w:rPr>
+              <w:fldChar w:fldCharType="separate"/>
+            </w:r>
+            <w:r>
+              <w:rPr>
+                <w:webHidden/>
+              </w:rPr>
+              <w:t>32</w:t>
+            </w:r>
+            <w:r>
+              <w:rPr>
                 <w:webHidden/>
               </w:rPr>
               <w:fldChar w:fldCharType="end"/>
@@ -1172,7 +1574,7 @@
       <w:bookmarkStart w:id="2" w:name="_Toc219734903"/>
       <w:bookmarkStart w:id="3" w:name="_Toc219989844"/>
       <w:bookmarkStart w:id="4" w:name="_Toc219989923"/>
-      <w:bookmarkStart w:id="5" w:name="_Toc224602627"/>
+      <w:bookmarkStart w:id="5" w:name="_Toc229413272"/>
       <w:r>
         <w:lastRenderedPageBreak/>
         <w:t>Введени</w:t>
@@ -1422,7 +1824,7 @@
         <w:rPr>
           <w:rFonts w:ascii="Times New Roman" w:hAnsi="Times New Roman"/>
         </w:rPr>
-        <w:t>тут форма</w:t>
+        <w:t>разработать интерфейс программного продукта</w:t>
       </w:r>
       <w:r>
         <w:rPr>
@@ -1639,7 +2041,7 @@
       <w:pPr>
         <w:pStyle w:val="1"/>
       </w:pPr>
-      <w:bookmarkStart w:id="6" w:name="_Toc224602628"/>
+      <w:bookmarkStart w:id="6" w:name="_Toc229413273"/>
       <w:r>
         <w:lastRenderedPageBreak/>
         <w:t xml:space="preserve">1 </w:t>
@@ -1653,7 +2055,7 @@
       <w:pPr>
         <w:pStyle w:val="2"/>
       </w:pPr>
-      <w:bookmarkStart w:id="7" w:name="_Toc224602629"/>
+      <w:bookmarkStart w:id="7" w:name="_Toc229413274"/>
       <w:r>
         <w:t>1</w:t>
       </w:r>
@@ -1916,6 +2318,7 @@
       <w:pPr>
         <w:pStyle w:val="2"/>
       </w:pPr>
+      <w:bookmarkStart w:id="8" w:name="_Toc229413275"/>
       <w:r>
         <w:lastRenderedPageBreak/>
         <w:t>1</w:t>
@@ -1924,12 +2327,22 @@
         <w:t>.</w:t>
       </w:r>
       <w:r>
-        <w:t>2 Определение групп пользователей и их функциональных задач</w:t>
-      </w:r>
-    </w:p>
-    <w:p>
-      <w:r>
-        <w:t>В процессе проектирования веб-приложения для декомпозиции целей и поддержки командного взаимодействия была выполнена идентификация основных групп пользователей и описание решаемых ими функциональных задач. Анализ предметной области показал, что разрабатываемая система является самостоятельным и самодостаточным проектом, в связи с чем архитектурное решение не предусматривает выделения отдельной панели системного администрирования верхнего уровня.</w:t>
+        <w:t>2 Определение функциональных задач</w:t>
+      </w:r>
+      <w:r>
+        <w:t xml:space="preserve"> пользователей</w:t>
+      </w:r>
+      <w:bookmarkEnd w:id="8"/>
+    </w:p>
+    <w:p>
+      <w:r>
+        <w:t xml:space="preserve">В процессе проектирования веб-приложения для декомпозиции целей и поддержки командного взаимодействия была выполнена идентификация основных решаемых </w:t>
+      </w:r>
+      <w:r>
+        <w:t>пользователями</w:t>
+      </w:r>
+      <w:r>
+        <w:t xml:space="preserve"> функциональных задач. Анализ предметной области показал, что разрабатываемая система является самостоятельным и самодостаточным проектом, в связи с чем архитектурное решение не предусматривает выделения отдельной панели системного администрирования верхнего уровня.</w:t>
       </w:r>
       <w:r>
         <w:t xml:space="preserve"> </w:t>
@@ -2229,6 +2642,7 @@
       <w:pPr>
         <w:pStyle w:val="2"/>
       </w:pPr>
+      <w:bookmarkStart w:id="9" w:name="_Toc229413276"/>
       <w:r>
         <w:t>1</w:t>
       </w:r>
@@ -2238,6 +2652,7 @@
       <w:r>
         <w:t>3 Анализ аналогов и прототипов</w:t>
       </w:r>
+      <w:bookmarkEnd w:id="9"/>
     </w:p>
     <w:p>
       <w:pPr>
@@ -2470,13 +2885,7 @@
     <w:p>
       <w:r>
         <w:lastRenderedPageBreak/>
-        <w:t>Рассмотрим ключевые характеристики системы в обобщённом виде</w:t>
-      </w:r>
-      <w:r>
-        <w:t>, представленные на таблице 1.1</w:t>
-      </w:r>
-      <w:r>
-        <w:t>.</w:t>
+        <w:t>Рассмотрим ключевые характеристики системы в обобщённом виде, представленные на таблице 1.1.</w:t>
       </w:r>
     </w:p>
     <w:p>
@@ -3043,13 +3452,7 @@
     <w:p>
       <w:r>
         <w:lastRenderedPageBreak/>
-        <w:t>Рассмотрим ключевые характеристики системы в обобщённом виде, представленные на таблице 1.</w:t>
-      </w:r>
-      <w:r>
-        <w:t>2</w:t>
-      </w:r>
-      <w:r>
-        <w:t>.</w:t>
+        <w:t>Рассмотрим ключевые характеристики системы в обобщённом виде, представленные на таблице 1.2.</w:t>
       </w:r>
     </w:p>
     <w:p>
@@ -3440,10 +3843,7 @@
         <w:t xml:space="preserve"> К</w:t>
       </w:r>
       <w:r>
-        <w:t>аждая карточка может содержать подробную информацию о задаче, включая описание, комментарии и вложения, что обеспечивает централизованное хранение данных по проекту. Это позволяет участникам команды взаимодействовать в рамках единого рабочего пространства без необходимости использования сторонних инструментов.</w:t>
-      </w:r>
-      <w:r>
-        <w:t xml:space="preserve"> </w:t>
+        <w:t xml:space="preserve">аждая карточка может содержать подробную информацию о задаче, включая описание, комментарии и вложения, что обеспечивает централизованное хранение данных по проекту. Это позволяет участникам команды взаимодействовать в рамках единого рабочего пространства без необходимости использования сторонних инструментов. </w:t>
       </w:r>
       <w:r>
         <w:rPr>
@@ -3847,13 +4247,7 @@
         <w:t xml:space="preserve"> </w:t>
       </w:r>
       <w:r>
-        <w:t>Для обобщения результатов анализа представим сравнительную характеристику рассматриваемых систем по ключевым функциям. В таблице 1.</w:t>
-      </w:r>
-      <w:r>
-        <w:t>4</w:t>
-      </w:r>
-      <w:r>
-        <w:t xml:space="preserve"> приведено сопоставление сервисов, отражающее их основные возможности </w:t>
+        <w:t xml:space="preserve">Для обобщения результатов анализа представим сравнительную характеристику рассматриваемых систем по ключевым функциям. В таблице 1.4 приведено сопоставление сервисов, отражающее их основные возможности </w:t>
       </w:r>
     </w:p>
     <w:p>
@@ -3864,16 +4258,7 @@
         </w:rPr>
       </w:pPr>
       <w:r>
-        <w:t>Таблица 1.</w:t>
-      </w:r>
-      <w:r>
-        <w:t>4</w:t>
-      </w:r>
-      <w:r>
-        <w:t xml:space="preserve"> – </w:t>
-      </w:r>
-      <w:r>
-        <w:t>Общий анализ сервисов</w:t>
+        <w:t>Таблица 1.4 – Общий анализ сервисов</w:t>
       </w:r>
     </w:p>
     <w:tbl>
@@ -4471,19 +4856,21 @@
     </w:tbl>
     <w:p>
       <w:pPr>
-        <w:rPr>
-          <w:b/>
+        <w:pStyle w:val="2"/>
+        <w:rPr>
+          <w:b w:val="0"/>
           <w:bCs/>
         </w:rPr>
       </w:pPr>
-      <w:r>
-        <w:rPr>
-          <w:b/>
+      <w:bookmarkStart w:id="10" w:name="_Toc229413277"/>
+      <w:r>
+        <w:rPr>
           <w:bCs/>
         </w:rPr>
         <w:lastRenderedPageBreak/>
         <w:t>1.4 Проектирование информационной системы</w:t>
       </w:r>
+      <w:bookmarkEnd w:id="10"/>
     </w:p>
     <w:p>
       <w:r>
@@ -4756,9 +5143,9 @@
         </w:rPr>
         <w:lastRenderedPageBreak/>
         <w:drawing>
-          <wp:inline distT="0" distB="0" distL="0" distR="0" wp14:anchorId="318446D8" wp14:editId="043BEE7F">
-            <wp:extent cx="5791144" cy="4210050"/>
-            <wp:effectExtent l="19050" t="19050" r="19685" b="19050"/>
+          <wp:inline distT="0" distB="0" distL="0" distR="0" wp14:anchorId="318446D8" wp14:editId="5BC419B2">
+            <wp:extent cx="5814387" cy="4226947"/>
+            <wp:effectExtent l="19050" t="19050" r="15240" b="21590"/>
             <wp:docPr id="6" name="Рисунок 6"/>
             <wp:cNvGraphicFramePr>
               <a:graphicFrameLocks xmlns:a="http://schemas.openxmlformats.org/drawingml/2006/main" noChangeAspect="1"/>
@@ -4788,7 +5175,7 @@
                   <pic:spPr bwMode="auto">
                     <a:xfrm>
                       <a:off x="0" y="0"/>
-                      <a:ext cx="5791144" cy="4210050"/>
+                      <a:ext cx="5816034" cy="4228144"/>
                     </a:xfrm>
                     <a:prstGeom prst="rect">
                       <a:avLst/>
@@ -5152,19 +5539,21 @@
     </w:p>
     <w:p>
       <w:pPr>
-        <w:rPr>
-          <w:b/>
+        <w:pStyle w:val="2"/>
+        <w:rPr>
+          <w:b w:val="0"/>
           <w:bCs/>
         </w:rPr>
       </w:pPr>
-      <w:r>
-        <w:rPr>
-          <w:b/>
+      <w:bookmarkStart w:id="11" w:name="_Toc229413278"/>
+      <w:r>
+        <w:rPr>
           <w:bCs/>
         </w:rPr>
         <w:lastRenderedPageBreak/>
         <w:t>1.5 Анализ программных ресурсов, необходимых в работе</w:t>
       </w:r>
+      <w:bookmarkEnd w:id="11"/>
     </w:p>
     <w:p>
       <w:r>
@@ -5302,15 +5691,12 @@
       </w:r>
       <w:proofErr w:type="spellStart"/>
       <w:r>
+        <w:lastRenderedPageBreak/>
         <w:t>PostgreSQL</w:t>
       </w:r>
       <w:proofErr w:type="spellEnd"/>
       <w:r>
-        <w:t xml:space="preserve"> обеспечивает надежное хранение структурированных данных и </w:t>
-      </w:r>
-      <w:r>
-        <w:lastRenderedPageBreak/>
-        <w:t>поддерживает выполнение сложных запросов и транзакций. В контексте системы декомпозиции целей это важно, так как необходимо хранить информацию о пользователях, целях, списках задач, командах и правах доступа, а также историю взаимодействия с искусственным интеллектом. Использование реляционной модели позволяет обеспечить целостность данных и логическую связанность между различными сущностями системы. Взаимодействие с базой данных предполагается реализовать с использованием ORM (Object-</w:t>
+        <w:t xml:space="preserve"> обеспечивает надежное хранение структурированных данных и поддерживает выполнение сложных запросов и транзакций. В контексте системы декомпозиции целей это важно, так как необходимо хранить информацию о пользователях, целях, списках задач, командах и правах доступа, а также историю взаимодействия с искусственным интеллектом. Использование реляционной модели позволяет обеспечить целостность данных и логическую связанность между различными сущностями системы. Взаимодействие с базой данных предполагается реализовать с использованием ORM (Object-</w:t>
       </w:r>
       <w:proofErr w:type="spellStart"/>
       <w:r>
@@ -5547,44 +5933,43 @@
     </w:p>
     <w:p>
       <w:pPr>
+        <w:pStyle w:val="1"/>
         <w:rPr>
           <w:rFonts w:cs="Times New Roman"/>
-          <w:b/>
-          <w:bCs/>
-          <w:sz w:val="32"/>
-          <w:szCs w:val="32"/>
-        </w:rPr>
-      </w:pPr>
+          <w:b w:val="0"/>
+          <w:bCs w:val="0"/>
+        </w:rPr>
+      </w:pPr>
+      <w:bookmarkStart w:id="12" w:name="_Toc229413279"/>
       <w:r>
         <w:rPr>
           <w:rFonts w:cs="Times New Roman"/>
-          <w:b/>
-          <w:bCs/>
-          <w:sz w:val="32"/>
-          <w:szCs w:val="32"/>
         </w:rPr>
         <w:lastRenderedPageBreak/>
         <w:t>2 Технологический раздел</w:t>
       </w:r>
-    </w:p>
-    <w:p>
-      <w:pPr>
+      <w:bookmarkEnd w:id="12"/>
+    </w:p>
+    <w:p>
+      <w:pPr>
+        <w:pStyle w:val="2"/>
         <w:rPr>
           <w:rFonts w:cs="Times New Roman"/>
-          <w:b/>
+          <w:b w:val="0"/>
           <w:bCs/>
           <w:szCs w:val="28"/>
         </w:rPr>
       </w:pPr>
+      <w:bookmarkStart w:id="13" w:name="_Toc229413280"/>
       <w:r>
         <w:rPr>
           <w:rFonts w:cs="Times New Roman"/>
-          <w:b/>
           <w:bCs/>
           <w:szCs w:val="28"/>
         </w:rPr>
         <w:t>2.1 Структура базы данных</w:t>
       </w:r>
+      <w:bookmarkEnd w:id="13"/>
     </w:p>
     <w:p>
       <w:pPr>
@@ -6633,6 +7018,7 @@
         <w:pStyle w:val="a4"/>
         <w:spacing w:line="360" w:lineRule="auto"/>
         <w:ind w:left="0"/>
+        <w:outlineLvl w:val="1"/>
         <w:rPr>
           <w:rFonts w:ascii="Times New Roman" w:hAnsi="Times New Roman"/>
           <w:b/>
@@ -6640,6 +7026,7 @@
           <w:szCs w:val="28"/>
         </w:rPr>
       </w:pPr>
+      <w:bookmarkStart w:id="14" w:name="_Toc229413281"/>
       <w:r>
         <w:rPr>
           <w:rFonts w:ascii="Times New Roman" w:hAnsi="Times New Roman"/>
@@ -6656,7 +7043,17 @@
           <w:bCs/>
           <w:szCs w:val="28"/>
         </w:rPr>
-        <w:t>Структура и форматы представления результирующих данных</w:t>
+        <w:t>Разработка интерфейса программного продукта</w:t>
+      </w:r>
+      <w:bookmarkEnd w:id="14"/>
+      <w:r>
+        <w:rPr>
+          <w:rFonts w:ascii="Times New Roman" w:hAnsi="Times New Roman"/>
+          <w:b/>
+          <w:bCs/>
+          <w:szCs w:val="28"/>
+        </w:rPr>
+        <w:t xml:space="preserve"> </w:t>
       </w:r>
     </w:p>
     <w:p>
@@ -6674,7 +7071,23 @@
           <w:rFonts w:ascii="Times New Roman" w:hAnsi="Times New Roman"/>
           <w:szCs w:val="28"/>
         </w:rPr>
-        <w:t>В рамках работы системы декомпозиции целей пользователь получает структурированные данные, формируемые на основе введённой цели и последующей обработки с использованием искусственного интеллекта. Основным результатом является сформированный план достижения цели, который представляет собой иерархически организованную совокупность этапов и задач, а также сопутствующая информация, обеспечивающая взаимодействие пользователя с системой.</w:t>
+        <w:t xml:space="preserve">Дизайн веб-приложения был разработан в графическом редакторе </w:t>
+      </w:r>
+      <w:proofErr w:type="spellStart"/>
+      <w:r>
+        <w:rPr>
+          <w:rFonts w:ascii="Times New Roman" w:hAnsi="Times New Roman"/>
+          <w:szCs w:val="28"/>
+        </w:rPr>
+        <w:t>Figma</w:t>
+      </w:r>
+      <w:proofErr w:type="spellEnd"/>
+      <w:r>
+        <w:rPr>
+          <w:rFonts w:ascii="Times New Roman" w:hAnsi="Times New Roman"/>
+          <w:szCs w:val="28"/>
+        </w:rPr>
+        <w:t>. В процессе проектирования были определены основные пользовательские экраны и сценарии взаимодействия с системой. Особое внимание уделялось удобству интерфейса, минимализму и логичности расположения элементов, что обеспечивает комфортное использование приложения и снижает нагрузку на пользователя при длительной работе.</w:t>
       </w:r>
     </w:p>
     <w:p>
@@ -6692,23 +7105,21 @@
           <w:rFonts w:ascii="Times New Roman" w:hAnsi="Times New Roman"/>
           <w:szCs w:val="28"/>
         </w:rPr>
-        <w:t>Исходной точкой формирования результирующих данных является сущность «цель» (</w:t>
-      </w:r>
-      <w:proofErr w:type="spellStart"/>
-      <w:r>
-        <w:rPr>
-          <w:rFonts w:ascii="Times New Roman" w:hAnsi="Times New Roman"/>
-          <w:szCs w:val="28"/>
-        </w:rPr>
-        <w:t>Goals</w:t>
-      </w:r>
-      <w:proofErr w:type="spellEnd"/>
-      <w:r>
-        <w:rPr>
-          <w:rFonts w:ascii="Times New Roman" w:hAnsi="Times New Roman"/>
-          <w:szCs w:val="28"/>
-        </w:rPr>
-        <w:t xml:space="preserve">), содержащая текстовое описание задачи пользователя. </w:t>
+        <w:t>При разработке интерфейса было принято решение использовать цветовую палитру с преобладанием фиолетовых оттенков. Данное решение обусловлено</w:t>
+      </w:r>
+      <w:r>
+        <w:rPr>
+          <w:rFonts w:ascii="Times New Roman" w:hAnsi="Times New Roman"/>
+          <w:szCs w:val="28"/>
+        </w:rPr>
+        <w:t xml:space="preserve"> тем, что ф</w:t>
+      </w:r>
+      <w:r>
+        <w:rPr>
+          <w:rFonts w:ascii="Times New Roman" w:hAnsi="Times New Roman"/>
+          <w:szCs w:val="28"/>
+        </w:rPr>
+        <w:t xml:space="preserve">иолетовые кнопки или заголовки на тёмном фоне выглядят ярко, но не </w:t>
       </w:r>
       <w:r>
         <w:rPr>
@@ -6716,53 +7127,21 @@
           <w:szCs w:val="28"/>
         </w:rPr>
         <w:lastRenderedPageBreak/>
-        <w:t>На её основе формируется связанный список задач (</w:t>
-      </w:r>
-      <w:proofErr w:type="spellStart"/>
-      <w:r>
-        <w:rPr>
-          <w:rFonts w:ascii="Times New Roman" w:hAnsi="Times New Roman"/>
-          <w:szCs w:val="28"/>
-        </w:rPr>
-        <w:t>Roadmaps</w:t>
-      </w:r>
-      <w:proofErr w:type="spellEnd"/>
-      <w:r>
-        <w:rPr>
-          <w:rFonts w:ascii="Times New Roman" w:hAnsi="Times New Roman"/>
-          <w:szCs w:val="28"/>
-        </w:rPr>
-        <w:t xml:space="preserve">), который представляет собой основной объект, предоставляемый пользователю. Каждый </w:t>
-      </w:r>
-      <w:r>
-        <w:rPr>
-          <w:rFonts w:ascii="Times New Roman" w:hAnsi="Times New Roman"/>
-          <w:szCs w:val="28"/>
-        </w:rPr>
-        <w:t>список</w:t>
-      </w:r>
-      <w:r>
-        <w:rPr>
-          <w:rFonts w:ascii="Times New Roman" w:hAnsi="Times New Roman"/>
-          <w:szCs w:val="28"/>
-        </w:rPr>
-        <w:t xml:space="preserve"> содержит информацию о принадлежности к конкретной цели, а также включает в себя набор задач (</w:t>
-      </w:r>
-      <w:proofErr w:type="spellStart"/>
-      <w:r>
-        <w:rPr>
-          <w:rFonts w:ascii="Times New Roman" w:hAnsi="Times New Roman"/>
-          <w:szCs w:val="28"/>
-        </w:rPr>
-        <w:t>Tasks</w:t>
-      </w:r>
-      <w:proofErr w:type="spellEnd"/>
-      <w:r>
-        <w:rPr>
-          <w:rFonts w:ascii="Times New Roman" w:hAnsi="Times New Roman"/>
-          <w:szCs w:val="28"/>
-        </w:rPr>
-        <w:t>), упорядоченных в соответствии с логикой достижения результата. Задачи, в свою очередь, содержат название, описание, порядок выполнения, статус, что позволяет формировать последовательный и управляемый план действий.</w:t>
+        <w:t>агрессивно, и хорошо выделяются без болезненной подсветки</w:t>
+      </w:r>
+      <w:r>
+        <w:rPr>
+          <w:rFonts w:ascii="Times New Roman" w:hAnsi="Times New Roman"/>
+          <w:szCs w:val="28"/>
+        </w:rPr>
+        <w:t xml:space="preserve">, </w:t>
+      </w:r>
+      <w:r>
+        <w:rPr>
+          <w:rFonts w:ascii="Times New Roman" w:hAnsi="Times New Roman"/>
+          <w:szCs w:val="28"/>
+        </w:rPr>
+        <w:t>создают ощущение технологичности и современности, а сочетание светлых и тёмных тонов делает интерфейс комфортным для восприятия и снижает усталость глаз пользователя при длительной работе с системой.</w:t>
       </w:r>
     </w:p>
     <w:p>
@@ -6780,67 +7159,168 @@
           <w:rFonts w:ascii="Times New Roman" w:hAnsi="Times New Roman"/>
           <w:szCs w:val="28"/>
         </w:rPr>
-        <w:t xml:space="preserve">Формирование структуры </w:t>
-      </w:r>
-      <w:r>
-        <w:rPr>
-          <w:rFonts w:ascii="Times New Roman" w:hAnsi="Times New Roman"/>
-          <w:szCs w:val="28"/>
-        </w:rPr>
-        <w:t>списков задач</w:t>
-      </w:r>
-      <w:r>
-        <w:rPr>
-          <w:rFonts w:ascii="Times New Roman" w:hAnsi="Times New Roman"/>
-          <w:szCs w:val="28"/>
-        </w:rPr>
-        <w:t xml:space="preserve"> осуществляется на серверной стороне системы. Введённая пользователем цель передаётся в модуль обработки, где происходит взаимодействие с сервисом искусственного интеллекта в рамках сущностей </w:t>
-      </w:r>
-      <w:proofErr w:type="spellStart"/>
-      <w:r>
-        <w:rPr>
-          <w:rFonts w:ascii="Times New Roman" w:hAnsi="Times New Roman"/>
-          <w:szCs w:val="28"/>
-        </w:rPr>
-        <w:t>AIConversation</w:t>
-      </w:r>
-      <w:proofErr w:type="spellEnd"/>
-      <w:r>
-        <w:rPr>
-          <w:rFonts w:ascii="Times New Roman" w:hAnsi="Times New Roman"/>
-          <w:szCs w:val="28"/>
-        </w:rPr>
-        <w:t xml:space="preserve"> и </w:t>
-      </w:r>
-      <w:proofErr w:type="spellStart"/>
-      <w:r>
-        <w:rPr>
-          <w:rFonts w:ascii="Times New Roman" w:hAnsi="Times New Roman"/>
-          <w:szCs w:val="28"/>
-        </w:rPr>
-        <w:t>AIMessage</w:t>
-      </w:r>
-      <w:proofErr w:type="spellEnd"/>
-      <w:r>
-        <w:rPr>
-          <w:rFonts w:ascii="Times New Roman" w:hAnsi="Times New Roman"/>
-          <w:szCs w:val="28"/>
-        </w:rPr>
-        <w:t xml:space="preserve">. В ходе диалога формируется структурированный ответ, содержащий декомпозицию цели на отдельные шаги. Полученные данные проходят этап преобразования и сохраняются в базе данных в виде записей, связанных с соответствующим </w:t>
-      </w:r>
-      <w:r>
-        <w:rPr>
-          <w:rFonts w:ascii="Times New Roman" w:hAnsi="Times New Roman"/>
-          <w:szCs w:val="28"/>
-        </w:rPr>
-        <w:t>списком</w:t>
-      </w:r>
-      <w:r>
-        <w:rPr>
-          <w:rFonts w:ascii="Times New Roman" w:hAnsi="Times New Roman"/>
-          <w:szCs w:val="28"/>
-        </w:rPr>
-        <w:t xml:space="preserve"> и задачами. Такой подход обеспечивает сохранение истории взаимодействия пользователя с ИИ и возможность повторного использования ранее сгенерированных данных.</w:t>
+        <w:t xml:space="preserve">В структуру интерфейса вошли следующие основные </w:t>
+      </w:r>
+      <w:r>
+        <w:rPr>
+          <w:rFonts w:ascii="Times New Roman" w:hAnsi="Times New Roman"/>
+          <w:szCs w:val="28"/>
+        </w:rPr>
+        <w:t>экраны</w:t>
+      </w:r>
+      <w:r>
+        <w:rPr>
+          <w:rFonts w:ascii="Times New Roman" w:hAnsi="Times New Roman"/>
+          <w:szCs w:val="28"/>
+        </w:rPr>
+        <w:t>:</w:t>
+      </w:r>
+    </w:p>
+    <w:p>
+      <w:pPr>
+        <w:pStyle w:val="a4"/>
+        <w:numPr>
+          <w:ilvl w:val="0"/>
+          <w:numId w:val="13"/>
+        </w:numPr>
+        <w:spacing w:line="360" w:lineRule="auto"/>
+        <w:ind w:left="0" w:firstLine="709"/>
+        <w:rPr>
+          <w:rFonts w:ascii="Times New Roman" w:hAnsi="Times New Roman"/>
+          <w:szCs w:val="28"/>
+        </w:rPr>
+      </w:pPr>
+      <w:r>
+        <w:rPr>
+          <w:rFonts w:ascii="Times New Roman" w:hAnsi="Times New Roman"/>
+          <w:szCs w:val="28"/>
+        </w:rPr>
+        <w:t>страница аутентификации;</w:t>
+      </w:r>
+    </w:p>
+    <w:p>
+      <w:pPr>
+        <w:pStyle w:val="a4"/>
+        <w:numPr>
+          <w:ilvl w:val="0"/>
+          <w:numId w:val="13"/>
+        </w:numPr>
+        <w:spacing w:line="360" w:lineRule="auto"/>
+        <w:ind w:left="0" w:firstLine="709"/>
+        <w:rPr>
+          <w:rFonts w:ascii="Times New Roman" w:hAnsi="Times New Roman"/>
+          <w:szCs w:val="28"/>
+        </w:rPr>
+      </w:pPr>
+      <w:r>
+        <w:rPr>
+          <w:rFonts w:ascii="Times New Roman" w:hAnsi="Times New Roman"/>
+          <w:szCs w:val="28"/>
+        </w:rPr>
+        <w:t>страница AI-помощника</w:t>
+      </w:r>
+      <w:r>
+        <w:rPr>
+          <w:rFonts w:ascii="Times New Roman" w:hAnsi="Times New Roman"/>
+          <w:szCs w:val="28"/>
+          <w:lang w:val="en-US"/>
+        </w:rPr>
+        <w:t>;</w:t>
+      </w:r>
+    </w:p>
+    <w:p>
+      <w:pPr>
+        <w:pStyle w:val="a4"/>
+        <w:numPr>
+          <w:ilvl w:val="0"/>
+          <w:numId w:val="13"/>
+        </w:numPr>
+        <w:spacing w:line="360" w:lineRule="auto"/>
+        <w:ind w:left="0" w:firstLine="709"/>
+        <w:rPr>
+          <w:rFonts w:ascii="Times New Roman" w:hAnsi="Times New Roman"/>
+          <w:szCs w:val="28"/>
+        </w:rPr>
+      </w:pPr>
+      <w:r>
+        <w:rPr>
+          <w:rFonts w:ascii="Times New Roman" w:hAnsi="Times New Roman"/>
+          <w:szCs w:val="28"/>
+        </w:rPr>
+        <w:t>страница управления списками задач;</w:t>
+      </w:r>
+    </w:p>
+    <w:p>
+      <w:pPr>
+        <w:pStyle w:val="a4"/>
+        <w:numPr>
+          <w:ilvl w:val="0"/>
+          <w:numId w:val="13"/>
+        </w:numPr>
+        <w:spacing w:line="360" w:lineRule="auto"/>
+        <w:ind w:left="0" w:firstLine="709"/>
+        <w:rPr>
+          <w:rFonts w:ascii="Times New Roman" w:hAnsi="Times New Roman"/>
+          <w:szCs w:val="28"/>
+        </w:rPr>
+      </w:pPr>
+      <w:r>
+        <w:rPr>
+          <w:rFonts w:ascii="Times New Roman" w:hAnsi="Times New Roman"/>
+          <w:szCs w:val="28"/>
+        </w:rPr>
+        <w:t>страница профиля пользователя;</w:t>
+      </w:r>
+    </w:p>
+    <w:p>
+      <w:pPr>
+        <w:pStyle w:val="a4"/>
+        <w:numPr>
+          <w:ilvl w:val="0"/>
+          <w:numId w:val="13"/>
+        </w:numPr>
+        <w:spacing w:line="360" w:lineRule="auto"/>
+        <w:ind w:left="0" w:firstLine="709"/>
+        <w:rPr>
+          <w:rFonts w:ascii="Times New Roman" w:hAnsi="Times New Roman"/>
+          <w:szCs w:val="28"/>
+        </w:rPr>
+      </w:pPr>
+      <w:r>
+        <w:rPr>
+          <w:rFonts w:ascii="Times New Roman" w:hAnsi="Times New Roman"/>
+          <w:szCs w:val="28"/>
+        </w:rPr>
+        <w:t>страница для сообщений между пользователями</w:t>
+      </w:r>
+      <w:r>
+        <w:rPr>
+          <w:rFonts w:ascii="Times New Roman" w:hAnsi="Times New Roman"/>
+          <w:szCs w:val="28"/>
+        </w:rPr>
+        <w:t>;</w:t>
+      </w:r>
+    </w:p>
+    <w:p>
+      <w:pPr>
+        <w:pStyle w:val="a4"/>
+        <w:numPr>
+          <w:ilvl w:val="0"/>
+          <w:numId w:val="13"/>
+        </w:numPr>
+        <w:spacing w:line="360" w:lineRule="auto"/>
+        <w:ind w:left="0" w:firstLine="709"/>
+        <w:rPr>
+          <w:rFonts w:ascii="Times New Roman" w:hAnsi="Times New Roman"/>
+          <w:szCs w:val="28"/>
+        </w:rPr>
+      </w:pPr>
+      <w:r>
+        <w:rPr>
+          <w:rFonts w:ascii="Times New Roman" w:hAnsi="Times New Roman"/>
+          <w:szCs w:val="28"/>
+        </w:rPr>
+        <w:t>страница команд пользователя.</w:t>
       </w:r>
     </w:p>
     <w:p>
@@ -6858,21 +7338,7 @@
           <w:rFonts w:ascii="Times New Roman" w:hAnsi="Times New Roman"/>
           <w:szCs w:val="28"/>
         </w:rPr>
-        <w:t xml:space="preserve">Передача результирующих данных между серверной и клиентской частью осуществляется в формате JSON, что обеспечивает удобство последующей обработки на стороне интерфейса. Клиентское приложение получает структурированные данные </w:t>
-      </w:r>
-      <w:r>
-        <w:rPr>
-          <w:rFonts w:ascii="Times New Roman" w:hAnsi="Times New Roman"/>
-          <w:szCs w:val="28"/>
-        </w:rPr>
-        <w:t>списка задач</w:t>
-      </w:r>
-      <w:r>
-        <w:rPr>
-          <w:rFonts w:ascii="Times New Roman" w:hAnsi="Times New Roman"/>
-          <w:szCs w:val="28"/>
-        </w:rPr>
-        <w:t xml:space="preserve"> и преобразует их в визуальное представление, позволяющее пользователю взаимодействовать с задачами, отслеживать прогресс и управлять процессом выполнения.</w:t>
+        <w:t>Для веб-приложения также был разработан логотип, представленный на рисунке 2.1.</w:t>
       </w:r>
     </w:p>
     <w:p>
@@ -6880,117 +7346,106 @@
         <w:pStyle w:val="a4"/>
         <w:spacing w:line="360" w:lineRule="auto"/>
         <w:ind w:left="0"/>
-        <w:rPr>
-          <w:rFonts w:ascii="Times New Roman" w:hAnsi="Times New Roman"/>
-          <w:szCs w:val="28"/>
-        </w:rPr>
-      </w:pPr>
-      <w:r>
-        <w:rPr>
-          <w:rFonts w:ascii="Times New Roman" w:hAnsi="Times New Roman"/>
-          <w:szCs w:val="28"/>
-        </w:rPr>
-        <w:t xml:space="preserve">В пользовательском интерфейсе </w:t>
-      </w:r>
-      <w:r>
-        <w:rPr>
-          <w:rFonts w:ascii="Times New Roman" w:hAnsi="Times New Roman"/>
-          <w:szCs w:val="28"/>
-        </w:rPr>
-        <w:t>списка задач</w:t>
-      </w:r>
-      <w:r>
-        <w:rPr>
-          <w:rFonts w:ascii="Times New Roman" w:hAnsi="Times New Roman"/>
-          <w:szCs w:val="28"/>
-        </w:rPr>
-        <w:t xml:space="preserve"> отображается в виде структурированного списка задач, сгруппированных по логическим этапам. Каждая задача может изменять своё состояние, что фиксируется в системе и используется для расчёта общего прогресса выполнения. Прогресс определяется на основе количества завершённых задач относительно их общего числа и отображается пользователю в наглядной форме. Дополнительно реализована возможность работы в рамках команд (</w:t>
-      </w:r>
-      <w:proofErr w:type="spellStart"/>
-      <w:r>
-        <w:rPr>
-          <w:rFonts w:ascii="Times New Roman" w:hAnsi="Times New Roman"/>
-          <w:szCs w:val="28"/>
-        </w:rPr>
-        <w:t>Teams</w:t>
-      </w:r>
-      <w:proofErr w:type="spellEnd"/>
-      <w:r>
-        <w:rPr>
-          <w:rFonts w:ascii="Times New Roman" w:hAnsi="Times New Roman"/>
-          <w:szCs w:val="28"/>
-        </w:rPr>
-        <w:t xml:space="preserve">), где доступ к </w:t>
-      </w:r>
-      <w:r>
-        <w:rPr>
-          <w:rFonts w:ascii="Times New Roman" w:hAnsi="Times New Roman"/>
-          <w:szCs w:val="28"/>
-        </w:rPr>
-        <w:t>списку задач</w:t>
-      </w:r>
-      <w:r>
-        <w:rPr>
-          <w:rFonts w:ascii="Times New Roman" w:hAnsi="Times New Roman"/>
-          <w:szCs w:val="28"/>
-        </w:rPr>
-        <w:t xml:space="preserve"> </w:t>
-      </w:r>
-      <w:r>
-        <w:rPr>
-          <w:rFonts w:ascii="Times New Roman" w:hAnsi="Times New Roman"/>
-          <w:szCs w:val="28"/>
-        </w:rPr>
-        <w:lastRenderedPageBreak/>
-        <w:t xml:space="preserve">регулируется через сущности </w:t>
-      </w:r>
-      <w:proofErr w:type="spellStart"/>
-      <w:r>
-        <w:rPr>
-          <w:rFonts w:ascii="Times New Roman" w:hAnsi="Times New Roman"/>
-          <w:szCs w:val="28"/>
-        </w:rPr>
-        <w:t>TeamMember</w:t>
-      </w:r>
-      <w:proofErr w:type="spellEnd"/>
-      <w:r>
-        <w:rPr>
-          <w:rFonts w:ascii="Times New Roman" w:hAnsi="Times New Roman"/>
-          <w:szCs w:val="28"/>
-        </w:rPr>
-        <w:t xml:space="preserve">, </w:t>
-      </w:r>
-      <w:proofErr w:type="spellStart"/>
-      <w:r>
-        <w:rPr>
-          <w:rFonts w:ascii="Times New Roman" w:hAnsi="Times New Roman"/>
-          <w:szCs w:val="28"/>
-        </w:rPr>
-        <w:t>TeamRole</w:t>
-      </w:r>
-      <w:proofErr w:type="spellEnd"/>
-      <w:r>
-        <w:rPr>
-          <w:rFonts w:ascii="Times New Roman" w:hAnsi="Times New Roman"/>
-          <w:szCs w:val="28"/>
-        </w:rPr>
-        <w:t xml:space="preserve"> и </w:t>
-      </w:r>
-      <w:proofErr w:type="spellStart"/>
-      <w:r>
-        <w:rPr>
-          <w:rFonts w:ascii="Times New Roman" w:hAnsi="Times New Roman"/>
-          <w:szCs w:val="28"/>
-        </w:rPr>
-        <w:t>RoadmapAccess</w:t>
-      </w:r>
-      <w:proofErr w:type="spellEnd"/>
-      <w:r>
-        <w:rPr>
-          <w:rFonts w:ascii="Times New Roman" w:hAnsi="Times New Roman"/>
-          <w:szCs w:val="28"/>
-        </w:rPr>
-        <w:t>, что позволяет организовать совместную работу и разграничение прав пользователей.</w:t>
+        <w:jc w:val="center"/>
+        <w:rPr>
+          <w:rFonts w:ascii="Times New Roman" w:hAnsi="Times New Roman"/>
+          <w:b/>
+          <w:bCs/>
+          <w:szCs w:val="28"/>
+        </w:rPr>
+      </w:pPr>
+      <w:r>
+        <w:rPr>
+          <w:rFonts w:ascii="Times New Roman" w:hAnsi="Times New Roman"/>
+          <w:b/>
+          <w:bCs/>
+          <w:noProof/>
+          <w:szCs w:val="28"/>
+        </w:rPr>
+        <w:drawing>
+          <wp:inline distT="0" distB="0" distL="0" distR="0" wp14:anchorId="5C439D7D" wp14:editId="2FE35BBB">
+            <wp:extent cx="3369446" cy="3343275"/>
+            <wp:effectExtent l="19050" t="19050" r="21590" b="9525"/>
+            <wp:docPr id="4" name="Рисунок 4"/>
+            <wp:cNvGraphicFramePr>
+              <a:graphicFrameLocks xmlns:a="http://schemas.openxmlformats.org/drawingml/2006/main" noChangeAspect="1"/>
+            </wp:cNvGraphicFramePr>
+            <a:graphic xmlns:a="http://schemas.openxmlformats.org/drawingml/2006/main">
+              <a:graphicData uri="http://schemas.openxmlformats.org/drawingml/2006/picture">
+                <pic:pic xmlns:pic="http://schemas.openxmlformats.org/drawingml/2006/picture">
+                  <pic:nvPicPr>
+                    <pic:cNvPr id="1" name=""/>
+                    <pic:cNvPicPr/>
+                  </pic:nvPicPr>
+                  <pic:blipFill>
+                    <a:blip r:embed="rId20"/>
+                    <a:stretch>
+                      <a:fillRect/>
+                    </a:stretch>
+                  </pic:blipFill>
+                  <pic:spPr>
+                    <a:xfrm>
+                      <a:off x="0" y="0"/>
+                      <a:ext cx="3456312" cy="3429466"/>
+                    </a:xfrm>
+                    <a:prstGeom prst="rect">
+                      <a:avLst/>
+                    </a:prstGeom>
+                    <a:ln>
+                      <a:solidFill>
+                        <a:schemeClr val="tx1"/>
+                      </a:solidFill>
+                    </a:ln>
+                  </pic:spPr>
+                </pic:pic>
+              </a:graphicData>
+            </a:graphic>
+          </wp:inline>
+        </w:drawing>
+      </w:r>
+    </w:p>
+    <w:p>
+      <w:pPr>
+        <w:jc w:val="center"/>
+        <w:rPr>
+          <w:color w:val="000000" w:themeColor="text1"/>
+        </w:rPr>
+      </w:pPr>
+      <w:r>
+        <w:rPr>
+          <w:color w:val="000000" w:themeColor="text1"/>
+        </w:rPr>
+        <w:t xml:space="preserve">Рисунок </w:t>
+      </w:r>
+      <w:r>
+        <w:rPr>
+          <w:color w:val="000000" w:themeColor="text1"/>
+        </w:rPr>
+        <w:t>2</w:t>
+      </w:r>
+      <w:r>
+        <w:rPr>
+          <w:color w:val="000000" w:themeColor="text1"/>
+        </w:rPr>
+        <w:t>.</w:t>
+      </w:r>
+      <w:r>
+        <w:rPr>
+          <w:color w:val="000000" w:themeColor="text1"/>
+        </w:rPr>
+        <w:t>1</w:t>
+      </w:r>
+      <w:r>
+        <w:rPr>
+          <w:color w:val="000000" w:themeColor="text1"/>
+        </w:rPr>
+        <w:t xml:space="preserve"> –</w:t>
+      </w:r>
+      <w:r>
+        <w:rPr>
+          <w:color w:val="000000" w:themeColor="text1"/>
+        </w:rPr>
+        <w:t xml:space="preserve"> Логотип веб-приложения</w:t>
       </w:r>
     </w:p>
     <w:p>
@@ -6999,32 +7454,936 @@
         <w:spacing w:line="360" w:lineRule="auto"/>
         <w:ind w:left="0"/>
         <w:rPr>
-          <w:rFonts w:ascii="Times New Roman" w:hAnsi="Times New Roman"/>
-          <w:szCs w:val="28"/>
-        </w:rPr>
-      </w:pPr>
-      <w:r>
-        <w:rPr>
-          <w:rFonts w:ascii="Times New Roman" w:hAnsi="Times New Roman"/>
-          <w:szCs w:val="28"/>
-        </w:rPr>
-        <w:t>Таким образом, результирующие данные системы представляют собой совокупность взаимосвязанных сущностей, обеспечивающих полный цикл работы пользователя: от постановки цели и её декомпозиции с использованием искусственного интеллекта до визуального представления, выполнения задач и совместной работы.</w:t>
-      </w:r>
-    </w:p>
-    <w:p>
-      <w:pPr>
-        <w:rPr>
-          <w:b/>
+          <w:rFonts w:ascii="Times New Roman" w:eastAsiaTheme="minorHAnsi" w:hAnsi="Times New Roman" w:cstheme="minorBidi"/>
+          <w:color w:val="000000" w:themeColor="text1"/>
+        </w:rPr>
+      </w:pPr>
+      <w:r>
+        <w:rPr>
+          <w:rFonts w:ascii="Times New Roman" w:eastAsiaTheme="minorHAnsi" w:hAnsi="Times New Roman" w:cstheme="minorBidi"/>
+          <w:color w:val="000000" w:themeColor="text1"/>
+        </w:rPr>
+        <w:t xml:space="preserve">Логотип выполнен в виде стилизованного изображения планшета с чек-листом и мишени с стрелой, попадающей в центр, что символизирует постановку целей, выполнение задач и точное достижение результатов. Данный элемент </w:t>
+      </w:r>
+      <w:r>
+        <w:rPr>
+          <w:rFonts w:ascii="Times New Roman" w:eastAsiaTheme="minorHAnsi" w:hAnsi="Times New Roman" w:cstheme="minorBidi"/>
+          <w:color w:val="000000" w:themeColor="text1"/>
+        </w:rPr>
+        <w:lastRenderedPageBreak/>
+        <w:t xml:space="preserve">присутствует на всех основных страницах приложения и служит </w:t>
+      </w:r>
+      <w:r>
+        <w:rPr>
+          <w:rFonts w:ascii="Times New Roman" w:eastAsiaTheme="minorHAnsi" w:hAnsi="Times New Roman" w:cstheme="minorBidi"/>
+          <w:color w:val="000000" w:themeColor="text1"/>
+        </w:rPr>
+        <w:t xml:space="preserve">главной </w:t>
+      </w:r>
+      <w:r>
+        <w:rPr>
+          <w:rFonts w:ascii="Times New Roman" w:eastAsiaTheme="minorHAnsi" w:hAnsi="Times New Roman" w:cstheme="minorBidi"/>
+          <w:color w:val="000000" w:themeColor="text1"/>
+        </w:rPr>
+        <w:t>частью стиля системы.</w:t>
+      </w:r>
+    </w:p>
+    <w:p>
+      <w:pPr>
+        <w:pStyle w:val="a4"/>
+        <w:spacing w:line="360" w:lineRule="auto"/>
+        <w:ind w:left="0"/>
+        <w:rPr>
+          <w:rFonts w:ascii="Times New Roman" w:eastAsiaTheme="minorHAnsi" w:hAnsi="Times New Roman" w:cstheme="minorBidi"/>
+          <w:color w:val="000000" w:themeColor="text1"/>
+        </w:rPr>
+      </w:pPr>
+      <w:r>
+        <w:rPr>
+          <w:rFonts w:ascii="Times New Roman" w:eastAsiaTheme="minorHAnsi" w:hAnsi="Times New Roman" w:cstheme="minorBidi"/>
+          <w:color w:val="000000" w:themeColor="text1"/>
+        </w:rPr>
+        <w:t xml:space="preserve">Для обеспечения безопасного доступа к функционалу системы был разработан экран аутентификации, представленный на рисунке </w:t>
+      </w:r>
+      <w:r>
+        <w:rPr>
+          <w:rFonts w:ascii="Times New Roman" w:eastAsiaTheme="minorHAnsi" w:hAnsi="Times New Roman" w:cstheme="minorBidi"/>
+          <w:color w:val="000000" w:themeColor="text1"/>
+        </w:rPr>
+        <w:t>2</w:t>
+      </w:r>
+      <w:r>
+        <w:rPr>
+          <w:rFonts w:ascii="Times New Roman" w:eastAsiaTheme="minorHAnsi" w:hAnsi="Times New Roman" w:cstheme="minorBidi"/>
+          <w:color w:val="000000" w:themeColor="text1"/>
+        </w:rPr>
+        <w:t>.</w:t>
+      </w:r>
+      <w:r>
+        <w:rPr>
+          <w:rFonts w:ascii="Times New Roman" w:eastAsiaTheme="minorHAnsi" w:hAnsi="Times New Roman" w:cstheme="minorBidi"/>
+          <w:color w:val="000000" w:themeColor="text1"/>
+        </w:rPr>
+        <w:t>2</w:t>
+      </w:r>
+      <w:r>
+        <w:rPr>
+          <w:rFonts w:ascii="Times New Roman" w:eastAsiaTheme="minorHAnsi" w:hAnsi="Times New Roman" w:cstheme="minorBidi"/>
+          <w:color w:val="000000" w:themeColor="text1"/>
+        </w:rPr>
+        <w:t>.</w:t>
+      </w:r>
+    </w:p>
+    <w:p>
+      <w:pPr>
+        <w:pStyle w:val="a4"/>
+        <w:spacing w:line="360" w:lineRule="auto"/>
+        <w:ind w:left="0"/>
+        <w:rPr>
+          <w:rFonts w:ascii="Times New Roman" w:eastAsiaTheme="minorHAnsi" w:hAnsi="Times New Roman" w:cstheme="minorBidi"/>
+          <w:color w:val="000000" w:themeColor="text1"/>
+        </w:rPr>
+      </w:pPr>
+      <w:r>
+        <w:rPr>
+          <w:rFonts w:ascii="Times New Roman" w:eastAsiaTheme="minorHAnsi" w:hAnsi="Times New Roman" w:cstheme="minorBidi"/>
+          <w:noProof/>
+          <w:color w:val="000000" w:themeColor="text1"/>
+        </w:rPr>
+        <w:drawing>
+          <wp:inline distT="0" distB="0" distL="0" distR="0" wp14:anchorId="7E9D1AF9" wp14:editId="5E41A1BF">
+            <wp:extent cx="5829369" cy="4417778"/>
+            <wp:effectExtent l="19050" t="19050" r="19050" b="20955"/>
+            <wp:docPr id="9" name="Рисунок 9"/>
+            <wp:cNvGraphicFramePr>
+              <a:graphicFrameLocks xmlns:a="http://schemas.openxmlformats.org/drawingml/2006/main" noChangeAspect="1"/>
+            </wp:cNvGraphicFramePr>
+            <a:graphic xmlns:a="http://schemas.openxmlformats.org/drawingml/2006/main">
+              <a:graphicData uri="http://schemas.openxmlformats.org/drawingml/2006/picture">
+                <pic:pic xmlns:pic="http://schemas.openxmlformats.org/drawingml/2006/picture">
+                  <pic:nvPicPr>
+                    <pic:cNvPr id="1" name=""/>
+                    <pic:cNvPicPr/>
+                  </pic:nvPicPr>
+                  <pic:blipFill>
+                    <a:blip r:embed="rId21"/>
+                    <a:stretch>
+                      <a:fillRect/>
+                    </a:stretch>
+                  </pic:blipFill>
+                  <pic:spPr>
+                    <a:xfrm>
+                      <a:off x="0" y="0"/>
+                      <a:ext cx="5866586" cy="4445983"/>
+                    </a:xfrm>
+                    <a:prstGeom prst="rect">
+                      <a:avLst/>
+                    </a:prstGeom>
+                    <a:ln>
+                      <a:solidFill>
+                        <a:schemeClr val="tx1"/>
+                      </a:solidFill>
+                    </a:ln>
+                  </pic:spPr>
+                </pic:pic>
+              </a:graphicData>
+            </a:graphic>
+          </wp:inline>
+        </w:drawing>
+      </w:r>
+    </w:p>
+    <w:p>
+      <w:pPr>
+        <w:jc w:val="center"/>
+        <w:rPr>
+          <w:color w:val="000000" w:themeColor="text1"/>
+        </w:rPr>
+      </w:pPr>
+      <w:r>
+        <w:rPr>
+          <w:color w:val="000000" w:themeColor="text1"/>
+        </w:rPr>
+        <w:t xml:space="preserve">Рисунок </w:t>
+      </w:r>
+      <w:r>
+        <w:rPr>
+          <w:color w:val="000000" w:themeColor="text1"/>
+        </w:rPr>
+        <w:t>2</w:t>
+      </w:r>
+      <w:r>
+        <w:rPr>
+          <w:color w:val="000000" w:themeColor="text1"/>
+        </w:rPr>
+        <w:t>.</w:t>
+      </w:r>
+      <w:r>
+        <w:rPr>
+          <w:color w:val="000000" w:themeColor="text1"/>
+        </w:rPr>
+        <w:t>2</w:t>
+      </w:r>
+      <w:r>
+        <w:rPr>
+          <w:color w:val="000000" w:themeColor="text1"/>
+        </w:rPr>
+        <w:t xml:space="preserve"> –</w:t>
+      </w:r>
+      <w:r>
+        <w:rPr>
+          <w:color w:val="000000" w:themeColor="text1"/>
+        </w:rPr>
+        <w:t xml:space="preserve"> Экран аутентификации</w:t>
+      </w:r>
+    </w:p>
+    <w:p>
+      <w:pPr>
+        <w:rPr>
+          <w:color w:val="000000" w:themeColor="text1"/>
+        </w:rPr>
+      </w:pPr>
+      <w:r>
+        <w:rPr>
+          <w:color w:val="000000" w:themeColor="text1"/>
+        </w:rPr>
+        <w:t>Экран входа реализован с учётом требований удобства и простоты использования. Пользователь может выполнить вход в систему с помощью адреса электронной почты и пароля. Интерфейс оформлен в светлых тонах на фоне плавного градиента, что делает страницу визуально привлекательной и современной. Дополнительно предусмотрены ссылки для регистрации нового пользователя и восстановления пароля, что обеспечивает поддержку основных сценариев авторизации.</w:t>
+      </w:r>
+    </w:p>
+    <w:p>
+      <w:pPr>
+        <w:rPr>
+          <w:color w:val="000000" w:themeColor="text1"/>
+        </w:rPr>
+      </w:pPr>
+      <w:r>
+        <w:rPr>
+          <w:color w:val="000000" w:themeColor="text1"/>
+        </w:rPr>
+        <w:t xml:space="preserve">После успешной аутентификации пользователь получает доступ к персональному профилю, экран которого представлен на рисунке </w:t>
+      </w:r>
+      <w:r>
+        <w:rPr>
+          <w:color w:val="000000" w:themeColor="text1"/>
+        </w:rPr>
+        <w:t>2</w:t>
+      </w:r>
+      <w:r>
+        <w:rPr>
+          <w:color w:val="000000" w:themeColor="text1"/>
+        </w:rPr>
+        <w:t>.</w:t>
+      </w:r>
+      <w:r>
+        <w:rPr>
+          <w:color w:val="000000" w:themeColor="text1"/>
+        </w:rPr>
+        <w:t>3</w:t>
+      </w:r>
+      <w:r>
+        <w:rPr>
+          <w:color w:val="000000" w:themeColor="text1"/>
+        </w:rPr>
+        <w:t>.</w:t>
+      </w:r>
+    </w:p>
+    <w:p>
+      <w:pPr>
+        <w:rPr>
+          <w:color w:val="000000" w:themeColor="text1"/>
+        </w:rPr>
+      </w:pPr>
+      <w:r>
+        <w:rPr>
+          <w:noProof/>
+          <w:color w:val="000000" w:themeColor="text1"/>
+        </w:rPr>
+        <w:lastRenderedPageBreak/>
+        <w:drawing>
+          <wp:inline distT="0" distB="0" distL="0" distR="0" wp14:anchorId="71F55CCD" wp14:editId="5347372E">
+            <wp:extent cx="5889287" cy="2381250"/>
+            <wp:effectExtent l="0" t="0" r="0" b="0"/>
+            <wp:docPr id="11" name="Рисунок 11"/>
+            <wp:cNvGraphicFramePr>
+              <a:graphicFrameLocks xmlns:a="http://schemas.openxmlformats.org/drawingml/2006/main" noChangeAspect="1"/>
+            </wp:cNvGraphicFramePr>
+            <a:graphic xmlns:a="http://schemas.openxmlformats.org/drawingml/2006/main">
+              <a:graphicData uri="http://schemas.openxmlformats.org/drawingml/2006/picture">
+                <pic:pic xmlns:pic="http://schemas.openxmlformats.org/drawingml/2006/picture">
+                  <pic:nvPicPr>
+                    <pic:cNvPr id="1" name=""/>
+                    <pic:cNvPicPr/>
+                  </pic:nvPicPr>
+                  <pic:blipFill>
+                    <a:blip r:embed="rId22"/>
+                    <a:stretch>
+                      <a:fillRect/>
+                    </a:stretch>
+                  </pic:blipFill>
+                  <pic:spPr>
+                    <a:xfrm>
+                      <a:off x="0" y="0"/>
+                      <a:ext cx="5901958" cy="2386373"/>
+                    </a:xfrm>
+                    <a:prstGeom prst="rect">
+                      <a:avLst/>
+                    </a:prstGeom>
+                  </pic:spPr>
+                </pic:pic>
+              </a:graphicData>
+            </a:graphic>
+          </wp:inline>
+        </w:drawing>
+      </w:r>
+    </w:p>
+    <w:p>
+      <w:pPr>
+        <w:jc w:val="center"/>
+        <w:rPr>
+          <w:color w:val="000000" w:themeColor="text1"/>
+        </w:rPr>
+      </w:pPr>
+      <w:r>
+        <w:rPr>
+          <w:color w:val="000000" w:themeColor="text1"/>
+        </w:rPr>
+        <w:t xml:space="preserve">Рисунок </w:t>
+      </w:r>
+      <w:r>
+        <w:rPr>
+          <w:color w:val="000000" w:themeColor="text1"/>
+        </w:rPr>
+        <w:t>2</w:t>
+      </w:r>
+      <w:r>
+        <w:rPr>
+          <w:color w:val="000000" w:themeColor="text1"/>
+        </w:rPr>
+        <w:t>.</w:t>
+      </w:r>
+      <w:r>
+        <w:rPr>
+          <w:color w:val="000000" w:themeColor="text1"/>
+        </w:rPr>
+        <w:t>3</w:t>
+      </w:r>
+      <w:r>
+        <w:rPr>
+          <w:color w:val="000000" w:themeColor="text1"/>
+        </w:rPr>
+        <w:t xml:space="preserve"> –</w:t>
+      </w:r>
+      <w:r>
+        <w:rPr>
+          <w:color w:val="000000" w:themeColor="text1"/>
+        </w:rPr>
+        <w:t xml:space="preserve"> Экран профиля пользователя</w:t>
+      </w:r>
+    </w:p>
+    <w:p>
+      <w:r>
+        <w:t>Экран</w:t>
+      </w:r>
+      <w:r>
+        <w:t xml:space="preserve"> профиля содержит основную информацию об аккаунте пользователя. Дополнительно реализована возможность переключения между светлой и тёмной темой оформления интерфейса. Дизайн </w:t>
+      </w:r>
+      <w:r>
+        <w:t>экрана</w:t>
+      </w:r>
+      <w:r>
+        <w:t xml:space="preserve"> выполнен в лаконичном стиле, благодаря чему вся необходимая информация доступна пользователю с первого взгляда.</w:t>
+      </w:r>
+    </w:p>
+    <w:p>
+      <w:r>
+        <w:t xml:space="preserve">Для использования </w:t>
+      </w:r>
+      <w:r>
+        <w:t>AI-помощник</w:t>
+      </w:r>
+      <w:r>
+        <w:t>а разработан экран необходимого чата</w:t>
+      </w:r>
+      <w:r>
+        <w:t>, представленн</w:t>
+      </w:r>
+      <w:r>
+        <w:t>ый</w:t>
+      </w:r>
+      <w:r>
+        <w:t xml:space="preserve"> на рисунке </w:t>
+      </w:r>
+      <w:r>
+        <w:t>2</w:t>
+      </w:r>
+      <w:r>
+        <w:t>.</w:t>
+      </w:r>
+      <w:r>
+        <w:t>4</w:t>
+      </w:r>
+      <w:r>
+        <w:t>.</w:t>
+      </w:r>
+    </w:p>
+    <w:p>
+      <w:pPr>
+        <w:rPr>
+          <w:color w:val="000000" w:themeColor="text1"/>
+        </w:rPr>
+      </w:pPr>
+      <w:r>
+        <w:rPr>
+          <w:noProof/>
+          <w:color w:val="000000" w:themeColor="text1"/>
+        </w:rPr>
+        <w:drawing>
+          <wp:inline distT="0" distB="0" distL="0" distR="0" wp14:anchorId="119F932C" wp14:editId="6A7E4C70">
+            <wp:extent cx="5896243" cy="1971675"/>
+            <wp:effectExtent l="0" t="0" r="9525" b="0"/>
+            <wp:docPr id="15" name="Рисунок 15"/>
+            <wp:cNvGraphicFramePr>
+              <a:graphicFrameLocks xmlns:a="http://schemas.openxmlformats.org/drawingml/2006/main" noChangeAspect="1"/>
+            </wp:cNvGraphicFramePr>
+            <a:graphic xmlns:a="http://schemas.openxmlformats.org/drawingml/2006/main">
+              <a:graphicData uri="http://schemas.openxmlformats.org/drawingml/2006/picture">
+                <pic:pic xmlns:pic="http://schemas.openxmlformats.org/drawingml/2006/picture">
+                  <pic:nvPicPr>
+                    <pic:cNvPr id="1" name=""/>
+                    <pic:cNvPicPr/>
+                  </pic:nvPicPr>
+                  <pic:blipFill>
+                    <a:blip r:embed="rId23"/>
+                    <a:stretch>
+                      <a:fillRect/>
+                    </a:stretch>
+                  </pic:blipFill>
+                  <pic:spPr>
+                    <a:xfrm>
+                      <a:off x="0" y="0"/>
+                      <a:ext cx="5954314" cy="1991094"/>
+                    </a:xfrm>
+                    <a:prstGeom prst="rect">
+                      <a:avLst/>
+                    </a:prstGeom>
+                  </pic:spPr>
+                </pic:pic>
+              </a:graphicData>
+            </a:graphic>
+          </wp:inline>
+        </w:drawing>
+      </w:r>
+    </w:p>
+    <w:p>
+      <w:pPr>
+        <w:jc w:val="center"/>
+        <w:rPr>
+          <w:color w:val="000000" w:themeColor="text1"/>
+        </w:rPr>
+      </w:pPr>
+      <w:r>
+        <w:rPr>
+          <w:color w:val="000000" w:themeColor="text1"/>
+        </w:rPr>
+        <w:t xml:space="preserve">Рисунок </w:t>
+      </w:r>
+      <w:r>
+        <w:rPr>
+          <w:color w:val="000000" w:themeColor="text1"/>
+        </w:rPr>
+        <w:t>2</w:t>
+      </w:r>
+      <w:r>
+        <w:rPr>
+          <w:color w:val="000000" w:themeColor="text1"/>
+        </w:rPr>
+        <w:t>.</w:t>
+      </w:r>
+      <w:r>
+        <w:rPr>
+          <w:color w:val="000000" w:themeColor="text1"/>
+        </w:rPr>
+        <w:t>4</w:t>
+      </w:r>
+      <w:r>
+        <w:rPr>
+          <w:color w:val="000000" w:themeColor="text1"/>
+        </w:rPr>
+        <w:t xml:space="preserve"> –</w:t>
+      </w:r>
+      <w:r>
+        <w:rPr>
+          <w:color w:val="000000" w:themeColor="text1"/>
+        </w:rPr>
+        <w:t xml:space="preserve"> Экран </w:t>
+      </w:r>
+      <w:r>
+        <w:t>с AI-чатом и созданием целей</w:t>
+      </w:r>
+    </w:p>
+    <w:p>
+      <w:pPr>
+        <w:pStyle w:val="a4"/>
+        <w:spacing w:line="360" w:lineRule="auto"/>
+        <w:ind w:left="0"/>
+        <w:rPr>
+          <w:rFonts w:ascii="Times New Roman" w:hAnsi="Times New Roman"/>
+          <w:szCs w:val="28"/>
+        </w:rPr>
+      </w:pPr>
+      <w:r>
+        <w:rPr>
+          <w:rFonts w:ascii="Times New Roman" w:hAnsi="Times New Roman"/>
+          <w:szCs w:val="28"/>
+        </w:rPr>
+        <w:t xml:space="preserve">На данном экране пользователь взаимодействует с AI-помощником, который помогает формировать и декомпозировать цели на отдельные задачи. Интерфейс </w:t>
+      </w:r>
+      <w:r>
+        <w:rPr>
+          <w:rFonts w:ascii="Times New Roman" w:hAnsi="Times New Roman"/>
+          <w:szCs w:val="28"/>
+        </w:rPr>
+        <w:t>экрана</w:t>
+      </w:r>
+      <w:r>
+        <w:rPr>
+          <w:rFonts w:ascii="Times New Roman" w:hAnsi="Times New Roman"/>
+          <w:szCs w:val="28"/>
+        </w:rPr>
+        <w:t xml:space="preserve"> разделён на две основные области: чат с AI-ассистентом и форма создания новой цели. В форме предусмотрены поля для ввода названия и описания цели, а также кнопка «Создать </w:t>
+      </w:r>
+      <w:r>
+        <w:rPr>
+          <w:rFonts w:ascii="Times New Roman" w:hAnsi="Times New Roman"/>
+          <w:szCs w:val="28"/>
+        </w:rPr>
+        <w:t>список задач</w:t>
+      </w:r>
+      <w:r>
+        <w:rPr>
+          <w:rFonts w:ascii="Times New Roman" w:hAnsi="Times New Roman"/>
+          <w:szCs w:val="28"/>
+        </w:rPr>
+        <w:t xml:space="preserve">». Минималистичный </w:t>
+      </w:r>
+      <w:r>
+        <w:rPr>
+          <w:rFonts w:ascii="Times New Roman" w:hAnsi="Times New Roman"/>
+          <w:szCs w:val="28"/>
+        </w:rPr>
+        <w:lastRenderedPageBreak/>
+        <w:t xml:space="preserve">дизайн </w:t>
+      </w:r>
+      <w:r>
+        <w:rPr>
+          <w:rFonts w:ascii="Times New Roman" w:hAnsi="Times New Roman"/>
+          <w:szCs w:val="28"/>
+        </w:rPr>
+        <w:t>экрана</w:t>
+      </w:r>
+      <w:r>
+        <w:rPr>
+          <w:rFonts w:ascii="Times New Roman" w:hAnsi="Times New Roman"/>
+          <w:szCs w:val="28"/>
+        </w:rPr>
+        <w:t xml:space="preserve"> позволяет пользователю сосредоточиться на взаимодействии с системой без отвлекающих элементов.</w:t>
+      </w:r>
+    </w:p>
+    <w:p>
+      <w:pPr>
+        <w:pStyle w:val="a4"/>
+        <w:spacing w:line="360" w:lineRule="auto"/>
+        <w:ind w:left="0"/>
+        <w:rPr>
+          <w:rFonts w:ascii="Times New Roman" w:hAnsi="Times New Roman"/>
+          <w:szCs w:val="28"/>
+        </w:rPr>
+      </w:pPr>
+      <w:r>
+        <w:rPr>
+          <w:rFonts w:ascii="Times New Roman" w:hAnsi="Times New Roman"/>
+          <w:szCs w:val="28"/>
+        </w:rPr>
+        <w:t xml:space="preserve">Для удобного взаимодействия с задачами была разработана страница управления списками задач, представленная на рисунке </w:t>
+      </w:r>
+      <w:r>
+        <w:rPr>
+          <w:rFonts w:ascii="Times New Roman" w:hAnsi="Times New Roman"/>
+          <w:szCs w:val="28"/>
+        </w:rPr>
+        <w:t>2</w:t>
+      </w:r>
+      <w:r>
+        <w:rPr>
+          <w:rFonts w:ascii="Times New Roman" w:hAnsi="Times New Roman"/>
+          <w:szCs w:val="28"/>
+        </w:rPr>
+        <w:t>.5.</w:t>
+      </w:r>
+    </w:p>
+    <w:p>
+      <w:pPr>
+        <w:pStyle w:val="a4"/>
+        <w:spacing w:line="360" w:lineRule="auto"/>
+        <w:ind w:left="0"/>
+        <w:jc w:val="center"/>
+        <w:rPr>
+          <w:rFonts w:ascii="Times New Roman" w:hAnsi="Times New Roman"/>
+          <w:szCs w:val="28"/>
+        </w:rPr>
+      </w:pPr>
+      <w:r>
+        <w:rPr>
+          <w:rFonts w:ascii="Times New Roman" w:hAnsi="Times New Roman"/>
+          <w:noProof/>
+          <w:szCs w:val="28"/>
+        </w:rPr>
+        <w:drawing>
+          <wp:inline distT="0" distB="0" distL="0" distR="0" wp14:anchorId="12662E2E" wp14:editId="1CD86976">
+            <wp:extent cx="5805137" cy="2314575"/>
+            <wp:effectExtent l="0" t="0" r="5715" b="0"/>
+            <wp:docPr id="28" name="Рисунок 28"/>
+            <wp:cNvGraphicFramePr>
+              <a:graphicFrameLocks xmlns:a="http://schemas.openxmlformats.org/drawingml/2006/main" noChangeAspect="1"/>
+            </wp:cNvGraphicFramePr>
+            <a:graphic xmlns:a="http://schemas.openxmlformats.org/drawingml/2006/main">
+              <a:graphicData uri="http://schemas.openxmlformats.org/drawingml/2006/picture">
+                <pic:pic xmlns:pic="http://schemas.openxmlformats.org/drawingml/2006/picture">
+                  <pic:nvPicPr>
+                    <pic:cNvPr id="1" name=""/>
+                    <pic:cNvPicPr/>
+                  </pic:nvPicPr>
+                  <pic:blipFill>
+                    <a:blip r:embed="rId24"/>
+                    <a:stretch>
+                      <a:fillRect/>
+                    </a:stretch>
+                  </pic:blipFill>
+                  <pic:spPr>
+                    <a:xfrm>
+                      <a:off x="0" y="0"/>
+                      <a:ext cx="5823961" cy="2322080"/>
+                    </a:xfrm>
+                    <a:prstGeom prst="rect">
+                      <a:avLst/>
+                    </a:prstGeom>
+                  </pic:spPr>
+                </pic:pic>
+              </a:graphicData>
+            </a:graphic>
+          </wp:inline>
+        </w:drawing>
+      </w:r>
+    </w:p>
+    <w:p>
+      <w:pPr>
+        <w:jc w:val="center"/>
+      </w:pPr>
+      <w:r>
+        <w:rPr>
+          <w:color w:val="000000" w:themeColor="text1"/>
+        </w:rPr>
+        <w:t xml:space="preserve">Рисунок </w:t>
+      </w:r>
+      <w:r>
+        <w:rPr>
+          <w:color w:val="000000" w:themeColor="text1"/>
+        </w:rPr>
+        <w:t>2</w:t>
+      </w:r>
+      <w:r>
+        <w:rPr>
+          <w:color w:val="000000" w:themeColor="text1"/>
+        </w:rPr>
+        <w:t>.</w:t>
+      </w:r>
+      <w:r>
+        <w:rPr>
+          <w:color w:val="000000" w:themeColor="text1"/>
+        </w:rPr>
+        <w:t>5</w:t>
+      </w:r>
+      <w:r>
+        <w:rPr>
+          <w:color w:val="000000" w:themeColor="text1"/>
+        </w:rPr>
+        <w:t xml:space="preserve"> –</w:t>
+      </w:r>
+      <w:r>
+        <w:rPr>
+          <w:color w:val="000000" w:themeColor="text1"/>
+        </w:rPr>
+        <w:t xml:space="preserve"> </w:t>
+      </w:r>
+      <w:r>
+        <w:t>Экран управления списками задач</w:t>
+      </w:r>
+    </w:p>
+    <w:p>
+      <w:pPr>
+        <w:rPr>
+          <w:color w:val="000000" w:themeColor="text1"/>
+        </w:rPr>
+      </w:pPr>
+      <w:r>
+        <w:rPr>
+          <w:color w:val="000000" w:themeColor="text1"/>
+        </w:rPr>
+        <w:t>Данная страница отображает список целей пользователя</w:t>
+      </w:r>
+      <w:r>
+        <w:rPr>
+          <w:color w:val="000000" w:themeColor="text1"/>
+        </w:rPr>
+        <w:t xml:space="preserve"> с поставленной целью и необходимыми для этого задачами</w:t>
+      </w:r>
+      <w:r>
+        <w:rPr>
+          <w:color w:val="000000" w:themeColor="text1"/>
+        </w:rPr>
+        <w:t>. Для каждой задачи предусмотрен статус выполнения, позволяющий быстро отслеживать текущий прогресс</w:t>
+      </w:r>
+      <w:r>
+        <w:rPr>
+          <w:color w:val="000000" w:themeColor="text1"/>
+        </w:rPr>
+        <w:t>, на этой же странице представлен элемент для создания нового списка</w:t>
+      </w:r>
+      <w:r>
+        <w:rPr>
+          <w:color w:val="000000" w:themeColor="text1"/>
+        </w:rPr>
+        <w:t xml:space="preserve">. </w:t>
+      </w:r>
+    </w:p>
+    <w:p>
+      <w:r>
+        <w:t>Помимо индивидуальной работы с задачами, система предоставляет возможность взаимодействия пользователей в рамках команд. Для этого был разработан отдельный экран команд, представленный на рисунке 2.6.</w:t>
+      </w:r>
+    </w:p>
+    <w:p>
+      <w:pPr>
+        <w:rPr>
+          <w:color w:val="000000" w:themeColor="text1"/>
+        </w:rPr>
+      </w:pPr>
+      <w:r>
+        <w:rPr>
+          <w:noProof/>
+          <w:color w:val="000000" w:themeColor="text1"/>
+        </w:rPr>
+        <w:drawing>
+          <wp:inline distT="0" distB="0" distL="0" distR="0" wp14:anchorId="57F75C65" wp14:editId="08177C99">
+            <wp:extent cx="5892800" cy="2146852"/>
+            <wp:effectExtent l="0" t="0" r="0" b="6350"/>
+            <wp:docPr id="24" name="Рисунок 24"/>
+            <wp:cNvGraphicFramePr>
+              <a:graphicFrameLocks xmlns:a="http://schemas.openxmlformats.org/drawingml/2006/main" noChangeAspect="1"/>
+            </wp:cNvGraphicFramePr>
+            <a:graphic xmlns:a="http://schemas.openxmlformats.org/drawingml/2006/main">
+              <a:graphicData uri="http://schemas.openxmlformats.org/drawingml/2006/picture">
+                <pic:pic xmlns:pic="http://schemas.openxmlformats.org/drawingml/2006/picture">
+                  <pic:nvPicPr>
+                    <pic:cNvPr id="1" name=""/>
+                    <pic:cNvPicPr/>
+                  </pic:nvPicPr>
+                  <pic:blipFill>
+                    <a:blip r:embed="rId25"/>
+                    <a:stretch>
+                      <a:fillRect/>
+                    </a:stretch>
+                  </pic:blipFill>
+                  <pic:spPr>
+                    <a:xfrm>
+                      <a:off x="0" y="0"/>
+                      <a:ext cx="5995599" cy="2184304"/>
+                    </a:xfrm>
+                    <a:prstGeom prst="rect">
+                      <a:avLst/>
+                    </a:prstGeom>
+                  </pic:spPr>
+                </pic:pic>
+              </a:graphicData>
+            </a:graphic>
+          </wp:inline>
+        </w:drawing>
+      </w:r>
+    </w:p>
+    <w:p>
+      <w:pPr>
+        <w:jc w:val="center"/>
+      </w:pPr>
+      <w:r>
+        <w:rPr>
+          <w:color w:val="000000" w:themeColor="text1"/>
+        </w:rPr>
+        <w:t xml:space="preserve">Рисунок </w:t>
+      </w:r>
+      <w:r>
+        <w:rPr>
+          <w:color w:val="000000" w:themeColor="text1"/>
+        </w:rPr>
+        <w:t>2</w:t>
+      </w:r>
+      <w:r>
+        <w:rPr>
+          <w:color w:val="000000" w:themeColor="text1"/>
+        </w:rPr>
+        <w:t>.</w:t>
+      </w:r>
+      <w:r>
+        <w:rPr>
+          <w:color w:val="000000" w:themeColor="text1"/>
+        </w:rPr>
+        <w:t>6</w:t>
+      </w:r>
+      <w:r>
+        <w:rPr>
+          <w:color w:val="000000" w:themeColor="text1"/>
+        </w:rPr>
+        <w:t xml:space="preserve"> –</w:t>
+      </w:r>
+      <w:r>
+        <w:rPr>
+          <w:color w:val="000000" w:themeColor="text1"/>
+        </w:rPr>
+        <w:t xml:space="preserve"> </w:t>
+      </w:r>
+      <w:r>
+        <w:t>Экран команд пользователя</w:t>
+      </w:r>
+    </w:p>
+    <w:p>
+      <w:r>
+        <w:lastRenderedPageBreak/>
+        <w:t xml:space="preserve">На </w:t>
+      </w:r>
+      <w:r>
+        <w:t>экране</w:t>
+      </w:r>
+      <w:r>
+        <w:t xml:space="preserve"> команд отображаются команды, участником которых является пользователь. Для каждой команды выводится её название. </w:t>
+      </w:r>
+    </w:p>
+    <w:p>
+      <w:r>
+        <w:t>Для общения между пользователями разработан экран сообщений, представленный на рисунке 2.7.</w:t>
+      </w:r>
+    </w:p>
+    <w:p>
+      <w:pPr>
+        <w:jc w:val="center"/>
+      </w:pPr>
+      <w:r>
+        <w:rPr>
+          <w:noProof/>
+        </w:rPr>
+        <w:drawing>
+          <wp:inline distT="0" distB="0" distL="0" distR="0" wp14:anchorId="5D89BE2B" wp14:editId="30DDD353">
+            <wp:extent cx="5855335" cy="2122998"/>
+            <wp:effectExtent l="0" t="0" r="0" b="0"/>
+            <wp:docPr id="29" name="Рисунок 29"/>
+            <wp:cNvGraphicFramePr>
+              <a:graphicFrameLocks xmlns:a="http://schemas.openxmlformats.org/drawingml/2006/main" noChangeAspect="1"/>
+            </wp:cNvGraphicFramePr>
+            <a:graphic xmlns:a="http://schemas.openxmlformats.org/drawingml/2006/main">
+              <a:graphicData uri="http://schemas.openxmlformats.org/drawingml/2006/picture">
+                <pic:pic xmlns:pic="http://schemas.openxmlformats.org/drawingml/2006/picture">
+                  <pic:nvPicPr>
+                    <pic:cNvPr id="1" name=""/>
+                    <pic:cNvPicPr/>
+                  </pic:nvPicPr>
+                  <pic:blipFill>
+                    <a:blip r:embed="rId26"/>
+                    <a:stretch>
+                      <a:fillRect/>
+                    </a:stretch>
+                  </pic:blipFill>
+                  <pic:spPr>
+                    <a:xfrm>
+                      <a:off x="0" y="0"/>
+                      <a:ext cx="5902091" cy="2139951"/>
+                    </a:xfrm>
+                    <a:prstGeom prst="rect">
+                      <a:avLst/>
+                    </a:prstGeom>
+                  </pic:spPr>
+                </pic:pic>
+              </a:graphicData>
+            </a:graphic>
+          </wp:inline>
+        </w:drawing>
+      </w:r>
+    </w:p>
+    <w:p>
+      <w:pPr>
+        <w:jc w:val="center"/>
+      </w:pPr>
+      <w:r>
+        <w:rPr>
+          <w:color w:val="000000" w:themeColor="text1"/>
+        </w:rPr>
+        <w:t xml:space="preserve">Рисунок </w:t>
+      </w:r>
+      <w:r>
+        <w:rPr>
+          <w:color w:val="000000" w:themeColor="text1"/>
+        </w:rPr>
+        <w:t>2</w:t>
+      </w:r>
+      <w:r>
+        <w:rPr>
+          <w:color w:val="000000" w:themeColor="text1"/>
+        </w:rPr>
+        <w:t>.</w:t>
+      </w:r>
+      <w:r>
+        <w:rPr>
+          <w:color w:val="000000" w:themeColor="text1"/>
+        </w:rPr>
+        <w:t>7</w:t>
+      </w:r>
+      <w:r>
+        <w:rPr>
+          <w:color w:val="000000" w:themeColor="text1"/>
+        </w:rPr>
+        <w:t xml:space="preserve"> –</w:t>
+      </w:r>
+      <w:r>
+        <w:rPr>
+          <w:color w:val="000000" w:themeColor="text1"/>
+        </w:rPr>
+        <w:t xml:space="preserve"> </w:t>
+      </w:r>
+      <w:r>
+        <w:t>Экран сообщений между пользователями</w:t>
+      </w:r>
+    </w:p>
+    <w:p>
+      <w:r>
+        <w:t>На экране сообщений отображаются элементы для удобного перехода между необходимыми чатами, а также строка ввода сообщений и кнопку для отправления сообщений.</w:t>
+      </w:r>
+    </w:p>
+    <w:p>
+      <w:r>
+        <w:t>Таким образом, разработанные экраны интерфейса обеспечивают удобное взаимодействие пользователя с системой, поддерживают основные пользовательские сценарии и создают единый современный стиль веб-приложения.</w:t>
+      </w:r>
+    </w:p>
+    <w:p>
+      <w:pPr>
+        <w:pStyle w:val="2"/>
+        <w:rPr>
+          <w:b w:val="0"/>
           <w:bCs/>
         </w:rPr>
       </w:pPr>
-      <w:r>
-        <w:rPr>
-          <w:b/>
+      <w:bookmarkStart w:id="15" w:name="_Toc229413282"/>
+      <w:r>
+        <w:rPr>
           <w:bCs/>
         </w:rPr>
         <w:t>2.3 Разработка структуры программного продукта</w:t>
       </w:r>
+      <w:bookmarkEnd w:id="15"/>
     </w:p>
     <w:p>
       <w:pPr>
@@ -7050,10 +8409,11 @@
         <w:rPr>
           <w:noProof/>
         </w:rPr>
+        <w:lastRenderedPageBreak/>
         <w:drawing>
-          <wp:inline distT="0" distB="0" distL="0" distR="0" wp14:anchorId="48712E1C" wp14:editId="11520B3D">
-            <wp:extent cx="5424025" cy="3438525"/>
-            <wp:effectExtent l="19050" t="19050" r="24765" b="9525"/>
+          <wp:inline distT="0" distB="0" distL="0" distR="0" wp14:anchorId="48712E1C" wp14:editId="57C9906A">
+            <wp:extent cx="5650699" cy="3790950"/>
+            <wp:effectExtent l="19050" t="19050" r="26670" b="19050"/>
             <wp:docPr id="1" name="Рисунок 1"/>
             <wp:cNvGraphicFramePr>
               <a:graphicFrameLocks xmlns:a="http://schemas.openxmlformats.org/drawingml/2006/main" noChangeAspect="1"/>
@@ -7068,7 +8428,7 @@
                     </pic:cNvPicPr>
                   </pic:nvPicPr>
                   <pic:blipFill>
-                    <a:blip r:embed="rId20">
+                    <a:blip r:embed="rId27">
                       <a:extLst>
                         <a:ext uri="{28A0092B-C50C-407E-A947-70E740481C1C}">
                           <a14:useLocalDpi xmlns:a14="http://schemas.microsoft.com/office/drawing/2010/main" val="0"/>
@@ -7083,7 +8443,7 @@
                   <pic:spPr bwMode="auto">
                     <a:xfrm>
                       <a:off x="0" y="0"/>
-                      <a:ext cx="5426017" cy="3439788"/>
+                      <a:ext cx="5657116" cy="3795255"/>
                     </a:xfrm>
                     <a:prstGeom prst="rect">
                       <a:avLst/>
@@ -7131,7 +8491,7 @@
         <w:rPr>
           <w:color w:val="000000" w:themeColor="text1"/>
         </w:rPr>
-        <w:t>1</w:t>
+        <w:t>8</w:t>
       </w:r>
       <w:r>
         <w:rPr>
@@ -7157,8 +8517,14 @@
         <w:rPr>
           <w:color w:val="000000" w:themeColor="text1"/>
         </w:rPr>
+        <w:t xml:space="preserve">После успешной авторизации пользователю становится доступен основной функционал системы. Внутренняя часть включает разделы: «Профиль», «Смена пароля», «Списки задач», «Просмотр конкретного списка и его задач», «Команды», «Списки задач команды», «Чаты», «Просмотр конкретного чата», «Поиск пользователей», а также интерфейс общения с ИИ‑чатом и историю ИИ‑диалогов. В разделе «Профиль» пользователь просматривает и редактирует свои данные, а также может перейти к окну «Смена пароля» для обновления учетных данных. Раздел «Списки задач» отображает созданные пользователем планы и позволяет перейти к детальному просмотру конкретного списка, где выполняется управление задачами, их порядком и статусом выполнения. Через раздел «Команды» пользователь создает команды и переходит к их данным, а в окне «Списки задач команды» организуется совместная работа над планами. Раздел «Чаты» обеспечивает общение: пользователь выбирает диалог и переходит в окно конкретного чата для просмотра сообщений и отправки новых. Раздел «Поиск пользователей» служит для нахождения других участников </w:t>
+      </w:r>
+      <w:r>
+        <w:rPr>
+          <w:color w:val="000000" w:themeColor="text1"/>
+        </w:rPr>
         <w:lastRenderedPageBreak/>
-        <w:t>После успешной авторизации пользователю становится доступен основной функционал системы. Внутренняя часть включает разделы: «Профиль», «Смена пароля», «Списки задач», «Просмотр конкретного списка и его задач», «Команды», «Списки задач команды», «Чаты», «Просмотр конкретного чата», «Поиск пользователей», а также интерфейс общения с ИИ‑чатом и историю ИИ‑диалогов. В разделе «Профиль» пользователь просматривает и редактирует свои данные, а также может перейти к окну «Смена пароля» для обновления учетных данных. Раздел «Списки задач» отображает созданные пользователем планы и позволяет перейти к детальному просмотру конкретного списка, где выполняется управление задачами, их порядком и статусом выполнения. Через раздел «Команды» пользователь создает команды и переходит к их данным, а в окне «Списки задач команды» организуется совместная работа над планами. Раздел «Чаты» обеспечивает общение: пользователь выбирает диалог и переходит в окно конкретного чата для просмотра сообщений и отправки новых. Раздел «Поиск пользователей» служит для нахождения других участников системы. Отдельный блок составляет интерфейс ИИ‑чата, позволяющий вести диалог с ИИ, получать начальный список задач и просматривать историю предыдущих обращений. На рисунке 2.2 изображена функциональная схема внутренней части веб‑приложения.</w:t>
+        <w:t>системы. Отдельный блок составляет интерфейс ИИ‑чата, позволяющий вести диалог с ИИ, получать начальный список задач и просматривать историю предыдущих обращений. На рисунке 2.2 изображена функциональная схема внутренней части веб‑приложения.</w:t>
       </w:r>
     </w:p>
     <w:p>
@@ -7173,9 +8539,9 @@
           <w:noProof/>
         </w:rPr>
         <w:drawing>
-          <wp:inline distT="0" distB="0" distL="0" distR="0" wp14:anchorId="373A1943" wp14:editId="0E560C51">
-            <wp:extent cx="5734685" cy="2705782"/>
-            <wp:effectExtent l="19050" t="19050" r="18415" b="18415"/>
+          <wp:inline distT="0" distB="0" distL="0" distR="0" wp14:anchorId="373A1943" wp14:editId="514BD9BE">
+            <wp:extent cx="5812790" cy="2924175"/>
+            <wp:effectExtent l="19050" t="19050" r="16510" b="28575"/>
             <wp:docPr id="2" name="Рисунок 2"/>
             <wp:cNvGraphicFramePr>
               <a:graphicFrameLocks xmlns:a="http://schemas.openxmlformats.org/drawingml/2006/main" noChangeAspect="1"/>
@@ -7190,7 +8556,7 @@
                     </pic:cNvPicPr>
                   </pic:nvPicPr>
                   <pic:blipFill>
-                    <a:blip r:embed="rId21">
+                    <a:blip r:embed="rId28">
                       <a:extLst>
                         <a:ext uri="{28A0092B-C50C-407E-A947-70E740481C1C}">
                           <a14:useLocalDpi xmlns:a14="http://schemas.microsoft.com/office/drawing/2010/main" val="0"/>
@@ -7205,7 +8571,7 @@
                   <pic:spPr bwMode="auto">
                     <a:xfrm>
                       <a:off x="0" y="0"/>
-                      <a:ext cx="5769406" cy="2722164"/>
+                      <a:ext cx="5855922" cy="2945873"/>
                     </a:xfrm>
                     <a:prstGeom prst="rect">
                       <a:avLst/>
@@ -7253,41 +8619,1111 @@
         <w:rPr>
           <w:color w:val="000000" w:themeColor="text1"/>
         </w:rPr>
+        <w:t>9</w:t>
+      </w:r>
+      <w:r>
+        <w:rPr>
+          <w:color w:val="000000" w:themeColor="text1"/>
+        </w:rPr>
+        <w:t xml:space="preserve"> –</w:t>
+      </w:r>
+      <w:r>
+        <w:rPr>
+          <w:color w:val="000000" w:themeColor="text1"/>
+        </w:rPr>
+        <w:t xml:space="preserve"> Функциональная схема внутренней части веб-приложения</w:t>
+      </w:r>
+    </w:p>
+    <w:p>
+      <w:pPr>
+        <w:pStyle w:val="2"/>
+        <w:rPr>
+          <w:bCs/>
+          <w:szCs w:val="28"/>
+        </w:rPr>
+      </w:pPr>
+      <w:bookmarkStart w:id="16" w:name="_Toc229413283"/>
+      <w:r>
+        <w:rPr>
+          <w:bCs/>
+          <w:szCs w:val="28"/>
+        </w:rPr>
+        <w:t>2.4 Описание процедур и функций</w:t>
+      </w:r>
+      <w:bookmarkEnd w:id="16"/>
+    </w:p>
+    <w:p>
+      <w:pPr>
+        <w:rPr>
+          <w:lang w:eastAsia="ru-RU"/>
+        </w:rPr>
+      </w:pPr>
+      <w:r>
+        <w:rPr>
+          <w:lang w:eastAsia="ru-RU"/>
+        </w:rPr>
+        <w:t xml:space="preserve">В процессе разработки веб-приложения была реализована совокупность функций и процедур, обеспечивающих формирование </w:t>
+      </w:r>
+      <w:r>
+        <w:rPr>
+          <w:lang w:eastAsia="ru-RU"/>
+        </w:rPr>
+        <w:t>списков задач</w:t>
+      </w:r>
+      <w:r>
+        <w:rPr>
+          <w:lang w:eastAsia="ru-RU"/>
+        </w:rPr>
+        <w:t>, управление задачами, контроль доступа пользователей и взаимодействие с сервисом искусственного интеллекта. Архитектура приложения построена по принципу разделения ответственности между компонентами, благодаря чему обеспечивается масштабируемость системы, удобство сопровождения и устойчивость работы приложения при одновременной работе нескольких пользователей.</w:t>
+      </w:r>
+    </w:p>
+    <w:p>
+      <w:r>
+        <w:t>Одной из ключевых функций системы является автоматическое формировани</w:t>
+      </w:r>
+      <w:r>
+        <w:t>е</w:t>
+      </w:r>
+      <w:r>
+        <w:t xml:space="preserve"> </w:t>
+      </w:r>
+      <w:r>
+        <w:t>списка задач</w:t>
+      </w:r>
+      <w:r>
+        <w:t xml:space="preserve"> с использованием искусственного интеллекта. Для реализации данной возможности был разработан сервис </w:t>
+      </w:r>
+      <w:proofErr w:type="spellStart"/>
+      <w:r>
+        <w:rPr>
+          <w:rStyle w:val="HTML1"/>
+          <w:rFonts w:ascii="Times New Roman" w:eastAsiaTheme="minorHAnsi" w:hAnsi="Times New Roman" w:cs="Times New Roman"/>
+          <w:sz w:val="28"/>
+          <w:szCs w:val="28"/>
+        </w:rPr>
+        <w:t>AIRoadmapService</w:t>
+      </w:r>
+      <w:proofErr w:type="spellEnd"/>
+      <w:r>
+        <w:rPr>
+          <w:rFonts w:cs="Times New Roman"/>
+          <w:szCs w:val="28"/>
+        </w:rPr>
+        <w:t>,</w:t>
+      </w:r>
+      <w:r>
+        <w:t xml:space="preserve"> обеспечивающий взаимодействие серверной части приложения с внешним AI </w:t>
+      </w:r>
+      <w:r>
+        <w:lastRenderedPageBreak/>
+        <w:t>API. Основной задачей сервиса является обработка пользовательского запроса, формирование контекста диалога и получение структурированного набора задач для будуще</w:t>
+      </w:r>
+      <w:r>
+        <w:t>го списка</w:t>
+      </w:r>
+      <w:r>
+        <w:t>.</w:t>
+      </w:r>
+    </w:p>
+    <w:p>
+      <w:r>
+        <w:t xml:space="preserve">Перед отправкой запроса система формирует массив сообщений, содержащий системный </w:t>
+      </w:r>
+      <w:proofErr w:type="spellStart"/>
+      <w:r>
+        <w:t>промпт</w:t>
+      </w:r>
+      <w:proofErr w:type="spellEnd"/>
+      <w:r>
+        <w:t>, историю взаимодействия пользователя и текущее сообщение. Дополнительно задаются параметры генерации текста, включая используемую модель и ограничения на размер ответа. На рисунке 2.</w:t>
+      </w:r>
+      <w:r>
+        <w:t>10</w:t>
+      </w:r>
+      <w:r>
+        <w:t xml:space="preserve"> представлен фрагмент формирования запроса к сервису искусственного интеллекта.</w:t>
+      </w:r>
+    </w:p>
+    <w:p>
+      <w:pPr>
+        <w:jc w:val="center"/>
+        <w:rPr>
+          <w:lang w:eastAsia="ru-RU"/>
+        </w:rPr>
+      </w:pPr>
+      <w:r>
+        <w:rPr>
+          <w:lang w:eastAsia="ru-RU"/>
+        </w:rPr>
+        <w:drawing>
+          <wp:inline distT="0" distB="0" distL="0" distR="0" wp14:anchorId="285AC6F2" wp14:editId="4D33E319">
+            <wp:extent cx="4949496" cy="2735248"/>
+            <wp:effectExtent l="0" t="0" r="3810" b="8255"/>
+            <wp:docPr id="162236288" name="Рисунок 162236288"/>
+            <wp:cNvGraphicFramePr>
+              <a:graphicFrameLocks xmlns:a="http://schemas.openxmlformats.org/drawingml/2006/main" noChangeAspect="1"/>
+            </wp:cNvGraphicFramePr>
+            <a:graphic xmlns:a="http://schemas.openxmlformats.org/drawingml/2006/main">
+              <a:graphicData uri="http://schemas.openxmlformats.org/drawingml/2006/picture">
+                <pic:pic xmlns:pic="http://schemas.openxmlformats.org/drawingml/2006/picture">
+                  <pic:nvPicPr>
+                    <pic:cNvPr id="1" name=""/>
+                    <pic:cNvPicPr/>
+                  </pic:nvPicPr>
+                  <pic:blipFill>
+                    <a:blip r:embed="rId29"/>
+                    <a:stretch>
+                      <a:fillRect/>
+                    </a:stretch>
+                  </pic:blipFill>
+                  <pic:spPr>
+                    <a:xfrm>
+                      <a:off x="0" y="0"/>
+                      <a:ext cx="4961442" cy="2741850"/>
+                    </a:xfrm>
+                    <a:prstGeom prst="rect">
+                      <a:avLst/>
+                    </a:prstGeom>
+                  </pic:spPr>
+                </pic:pic>
+              </a:graphicData>
+            </a:graphic>
+          </wp:inline>
+        </w:drawing>
+      </w:r>
+    </w:p>
+    <w:p>
+      <w:pPr>
+        <w:jc w:val="center"/>
+        <w:rPr>
+          <w:color w:val="000000" w:themeColor="text1"/>
+        </w:rPr>
+      </w:pPr>
+      <w:r>
+        <w:rPr>
+          <w:color w:val="000000" w:themeColor="text1"/>
+        </w:rPr>
+        <w:t xml:space="preserve">Рисунок </w:t>
+      </w:r>
+      <w:r>
+        <w:rPr>
+          <w:color w:val="000000" w:themeColor="text1"/>
+        </w:rPr>
         <w:t>2</w:t>
       </w:r>
       <w:r>
         <w:rPr>
           <w:color w:val="000000" w:themeColor="text1"/>
         </w:rPr>
+        <w:t>.</w:t>
+      </w:r>
+      <w:r>
+        <w:rPr>
+          <w:color w:val="000000" w:themeColor="text1"/>
+        </w:rPr>
+        <w:t>10</w:t>
+      </w:r>
+      <w:r>
+        <w:rPr>
+          <w:color w:val="000000" w:themeColor="text1"/>
+        </w:rPr>
         <w:t xml:space="preserve"> –</w:t>
       </w:r>
       <w:r>
         <w:rPr>
           <w:color w:val="000000" w:themeColor="text1"/>
         </w:rPr>
-        <w:t xml:space="preserve"> Функциональная схема внутренней части веб-приложения</w:t>
-      </w:r>
-    </w:p>
-    <w:p>
-      <w:pPr>
-        <w:rPr>
-          <w:b/>
-          <w:bCs/>
-          <w:szCs w:val="28"/>
-        </w:rPr>
-      </w:pPr>
-      <w:r>
-        <w:rPr>
-          <w:b/>
-          <w:bCs/>
-          <w:szCs w:val="28"/>
-        </w:rPr>
+        <w:t xml:space="preserve"> </w:t>
+      </w:r>
+      <w:r>
+        <w:rPr>
+          <w:color w:val="000000" w:themeColor="text1"/>
+        </w:rPr>
+        <w:t>Формирование запроса к сервису ИИ</w:t>
+      </w:r>
+    </w:p>
+    <w:p>
+      <w:pPr>
+        <w:rPr>
+          <w:color w:val="000000" w:themeColor="text1"/>
+        </w:rPr>
+      </w:pPr>
+      <w:r>
+        <w:rPr>
+          <w:color w:val="000000" w:themeColor="text1"/>
+        </w:rPr>
+        <w:t xml:space="preserve">После формирования объекта запроса выполняется асинхронное обращение к AI сервису с использованием библиотеки </w:t>
+      </w:r>
+      <w:proofErr w:type="spellStart"/>
+      <w:r>
+        <w:rPr>
+          <w:color w:val="000000" w:themeColor="text1"/>
+        </w:rPr>
+        <w:t>httpx</w:t>
+      </w:r>
+      <w:proofErr w:type="spellEnd"/>
+      <w:r>
+        <w:rPr>
+          <w:color w:val="000000" w:themeColor="text1"/>
+        </w:rPr>
+        <w:t>. Применение асинхронных запросов позволяет избежать блокировки серверного потока во время ожидания ответа от внешнего сервиса, что положительно влияет на производительность приложения. После получения ответа система извлекает содержимое сообщения и преобразует его в JSON-структуру, содержащую название цели и список задач.</w:t>
+      </w:r>
+    </w:p>
+    <w:p>
+      <w:r>
+        <w:t xml:space="preserve">Для обеспечения возможности редактирования уже существующих </w:t>
+      </w:r>
+      <w:r>
+        <w:t xml:space="preserve">списков задач </w:t>
+      </w:r>
+      <w:r>
+        <w:t xml:space="preserve">реализован механизм формирования контекста текущего </w:t>
+      </w:r>
+      <w:r>
+        <w:t>списка</w:t>
+      </w:r>
+      <w:r>
+        <w:t xml:space="preserve">. При повторном обращении пользователя к AI сервису система передает информацию о текущей цели, описании и уже созданных задачах. Это позволяет </w:t>
+      </w:r>
+      <w:r>
         <w:lastRenderedPageBreak/>
-        <w:t>2.4 Описание процедур и функций</w:t>
-      </w:r>
+        <w:t>искусственному интеллекту учитывать существующую структуру</w:t>
+      </w:r>
+      <w:r>
+        <w:t xml:space="preserve"> </w:t>
+      </w:r>
+      <w:r>
+        <w:t>и корректно дополнять либо изменять её содержимое. На рисунке 2.</w:t>
+      </w:r>
+      <w:r>
+        <w:t>11</w:t>
+      </w:r>
+      <w:r>
+        <w:t xml:space="preserve"> представлен фрагмент формирования контекста.</w:t>
+      </w:r>
+    </w:p>
+    <w:p>
+      <w:pPr>
+        <w:rPr>
+          <w:color w:val="000000" w:themeColor="text1"/>
+        </w:rPr>
+      </w:pPr>
+      <w:r>
+        <w:rPr>
+          <w:color w:val="000000" w:themeColor="text1"/>
+        </w:rPr>
+        <w:drawing>
+          <wp:inline distT="0" distB="0" distL="0" distR="0" wp14:anchorId="27898816" wp14:editId="6A1FAEA6">
+            <wp:extent cx="5745737" cy="1590261"/>
+            <wp:effectExtent l="0" t="0" r="7620" b="0"/>
+            <wp:docPr id="162236292" name="Рисунок 162236292"/>
+            <wp:cNvGraphicFramePr>
+              <a:graphicFrameLocks xmlns:a="http://schemas.openxmlformats.org/drawingml/2006/main" noChangeAspect="1"/>
+            </wp:cNvGraphicFramePr>
+            <a:graphic xmlns:a="http://schemas.openxmlformats.org/drawingml/2006/main">
+              <a:graphicData uri="http://schemas.openxmlformats.org/drawingml/2006/picture">
+                <pic:pic xmlns:pic="http://schemas.openxmlformats.org/drawingml/2006/picture">
+                  <pic:nvPicPr>
+                    <pic:cNvPr id="1" name=""/>
+                    <pic:cNvPicPr/>
+                  </pic:nvPicPr>
+                  <pic:blipFill>
+                    <a:blip r:embed="rId30"/>
+                    <a:stretch>
+                      <a:fillRect/>
+                    </a:stretch>
+                  </pic:blipFill>
+                  <pic:spPr>
+                    <a:xfrm>
+                      <a:off x="0" y="0"/>
+                      <a:ext cx="5792063" cy="1603083"/>
+                    </a:xfrm>
+                    <a:prstGeom prst="rect">
+                      <a:avLst/>
+                    </a:prstGeom>
+                  </pic:spPr>
+                </pic:pic>
+              </a:graphicData>
+            </a:graphic>
+          </wp:inline>
+        </w:drawing>
+      </w:r>
+    </w:p>
+    <w:p>
+      <w:pPr>
+        <w:jc w:val="center"/>
+        <w:rPr>
+          <w:color w:val="000000" w:themeColor="text1"/>
+        </w:rPr>
+      </w:pPr>
+      <w:r>
+        <w:rPr>
+          <w:color w:val="000000" w:themeColor="text1"/>
+        </w:rPr>
+        <w:t xml:space="preserve">Рисунок </w:t>
+      </w:r>
+      <w:r>
+        <w:rPr>
+          <w:color w:val="000000" w:themeColor="text1"/>
+        </w:rPr>
+        <w:t>2</w:t>
+      </w:r>
+      <w:r>
+        <w:rPr>
+          <w:color w:val="000000" w:themeColor="text1"/>
+        </w:rPr>
+        <w:t>.</w:t>
+      </w:r>
+      <w:r>
+        <w:rPr>
+          <w:color w:val="000000" w:themeColor="text1"/>
+        </w:rPr>
+        <w:t>1</w:t>
+      </w:r>
+      <w:r>
+        <w:rPr>
+          <w:color w:val="000000" w:themeColor="text1"/>
+        </w:rPr>
+        <w:t>1</w:t>
+      </w:r>
+      <w:r>
+        <w:rPr>
+          <w:color w:val="000000" w:themeColor="text1"/>
+        </w:rPr>
+        <w:t xml:space="preserve"> –</w:t>
+      </w:r>
+      <w:r>
+        <w:rPr>
+          <w:color w:val="000000" w:themeColor="text1"/>
+        </w:rPr>
+        <w:t xml:space="preserve"> Формирование </w:t>
+      </w:r>
+      <w:r>
+        <w:rPr>
+          <w:color w:val="000000" w:themeColor="text1"/>
+        </w:rPr>
+        <w:t>контекста списка задач</w:t>
+      </w:r>
+    </w:p>
+    <w:p>
+      <w:pPr>
+        <w:rPr>
+          <w:color w:val="000000" w:themeColor="text1"/>
+        </w:rPr>
+      </w:pPr>
+      <w:r>
+        <w:rPr>
+          <w:color w:val="000000" w:themeColor="text1"/>
+        </w:rPr>
+        <w:t xml:space="preserve">Сформированный контекст добавляется к системному </w:t>
+      </w:r>
+      <w:r>
+        <w:rPr>
+          <w:color w:val="000000" w:themeColor="text1"/>
+        </w:rPr>
+        <w:t>своду правил</w:t>
+      </w:r>
+      <w:r>
+        <w:rPr>
+          <w:color w:val="000000" w:themeColor="text1"/>
+        </w:rPr>
+        <w:t xml:space="preserve"> перед отправкой запроса. Благодаря этому система способна не только создавать новые </w:t>
+      </w:r>
+      <w:r>
+        <w:rPr>
+          <w:color w:val="000000" w:themeColor="text1"/>
+        </w:rPr>
+        <w:t>списки задач</w:t>
+      </w:r>
+      <w:r>
+        <w:rPr>
+          <w:color w:val="000000" w:themeColor="text1"/>
+        </w:rPr>
+        <w:t>, но и выполнять редактирование уже существующих без потери ранее сформированных задач.</w:t>
+      </w:r>
+    </w:p>
+    <w:p>
+      <w:pPr>
+        <w:rPr>
+          <w:color w:val="000000" w:themeColor="text1"/>
+        </w:rPr>
+      </w:pPr>
+      <w:r>
+        <w:t xml:space="preserve">Важной частью серверной логики является механизм проверки доступа пользователя к дорожной карте. Перед выполнением операций редактирования, удаления или получения задач система проверяет существование </w:t>
+      </w:r>
+      <w:r>
+        <w:t>списка задач</w:t>
+      </w:r>
+      <w:r>
+        <w:t xml:space="preserve"> и принадлежность его текущему пользователю. На рисунке 2.</w:t>
+      </w:r>
+      <w:r>
+        <w:t>12</w:t>
+      </w:r>
+      <w:r>
+        <w:t xml:space="preserve"> представлен фрагмент процедуры проверки доступа.</w:t>
+      </w:r>
+    </w:p>
+    <w:p>
+      <w:pPr>
+        <w:jc w:val="center"/>
+        <w:rPr>
+          <w:lang w:eastAsia="ru-RU"/>
+        </w:rPr>
+      </w:pPr>
+      <w:r>
+        <w:rPr>
+          <w:lang w:eastAsia="ru-RU"/>
+        </w:rPr>
+        <w:drawing>
+          <wp:inline distT="0" distB="0" distL="0" distR="0" wp14:anchorId="408C69A2" wp14:editId="1CAF065B">
+            <wp:extent cx="5407493" cy="2846567"/>
+            <wp:effectExtent l="0" t="0" r="3175" b="0"/>
+            <wp:docPr id="162236293" name="Рисунок 162236293"/>
+            <wp:cNvGraphicFramePr>
+              <a:graphicFrameLocks xmlns:a="http://schemas.openxmlformats.org/drawingml/2006/main" noChangeAspect="1"/>
+            </wp:cNvGraphicFramePr>
+            <a:graphic xmlns:a="http://schemas.openxmlformats.org/drawingml/2006/main">
+              <a:graphicData uri="http://schemas.openxmlformats.org/drawingml/2006/picture">
+                <pic:pic xmlns:pic="http://schemas.openxmlformats.org/drawingml/2006/picture">
+                  <pic:nvPicPr>
+                    <pic:cNvPr id="1" name=""/>
+                    <pic:cNvPicPr/>
+                  </pic:nvPicPr>
+                  <pic:blipFill>
+                    <a:blip r:embed="rId31"/>
+                    <a:stretch>
+                      <a:fillRect/>
+                    </a:stretch>
+                  </pic:blipFill>
+                  <pic:spPr>
+                    <a:xfrm>
+                      <a:off x="0" y="0"/>
+                      <a:ext cx="5411831" cy="2848850"/>
+                    </a:xfrm>
+                    <a:prstGeom prst="rect">
+                      <a:avLst/>
+                    </a:prstGeom>
+                  </pic:spPr>
+                </pic:pic>
+              </a:graphicData>
+            </a:graphic>
+          </wp:inline>
+        </w:drawing>
+      </w:r>
+    </w:p>
+    <w:p>
+      <w:pPr>
+        <w:jc w:val="center"/>
+        <w:rPr>
+          <w:color w:val="000000" w:themeColor="text1"/>
+        </w:rPr>
+      </w:pPr>
+      <w:r>
+        <w:rPr>
+          <w:color w:val="000000" w:themeColor="text1"/>
+        </w:rPr>
+        <w:t xml:space="preserve">Рисунок </w:t>
+      </w:r>
+      <w:r>
+        <w:rPr>
+          <w:color w:val="000000" w:themeColor="text1"/>
+        </w:rPr>
+        <w:t>2</w:t>
+      </w:r>
+      <w:r>
+        <w:rPr>
+          <w:color w:val="000000" w:themeColor="text1"/>
+        </w:rPr>
+        <w:t>.</w:t>
+      </w:r>
+      <w:r>
+        <w:rPr>
+          <w:color w:val="000000" w:themeColor="text1"/>
+        </w:rPr>
+        <w:t>1</w:t>
+      </w:r>
+      <w:r>
+        <w:rPr>
+          <w:color w:val="000000" w:themeColor="text1"/>
+        </w:rPr>
+        <w:t>2</w:t>
+      </w:r>
+      <w:r>
+        <w:rPr>
+          <w:color w:val="000000" w:themeColor="text1"/>
+        </w:rPr>
+        <w:t xml:space="preserve"> –</w:t>
+      </w:r>
+      <w:r>
+        <w:rPr>
+          <w:color w:val="000000" w:themeColor="text1"/>
+        </w:rPr>
+        <w:t xml:space="preserve"> </w:t>
+      </w:r>
+      <w:r>
+        <w:rPr>
+          <w:color w:val="000000" w:themeColor="text1"/>
+        </w:rPr>
+        <w:t>Проверка доступа пользователя к списку задач</w:t>
+      </w:r>
+    </w:p>
+    <w:p>
+      <w:pPr>
+        <w:rPr>
+          <w:rFonts w:cs="Times New Roman"/>
+          <w:szCs w:val="28"/>
+        </w:rPr>
+      </w:pPr>
+      <w:r>
+        <w:rPr>
+          <w:rFonts w:cs="Times New Roman"/>
+          <w:szCs w:val="28"/>
+        </w:rPr>
+        <w:lastRenderedPageBreak/>
+        <w:t xml:space="preserve">В случае отсутствия </w:t>
+      </w:r>
+      <w:r>
+        <w:rPr>
+          <w:rFonts w:cs="Times New Roman"/>
+          <w:szCs w:val="28"/>
+        </w:rPr>
+        <w:t xml:space="preserve">списка задач </w:t>
+      </w:r>
+      <w:r>
+        <w:rPr>
+          <w:rFonts w:cs="Times New Roman"/>
+          <w:szCs w:val="28"/>
+        </w:rPr>
+        <w:t xml:space="preserve">система возвращает ошибку </w:t>
+      </w:r>
+      <w:r>
+        <w:rPr>
+          <w:rStyle w:val="HTML1"/>
+          <w:rFonts w:ascii="Times New Roman" w:eastAsiaTheme="minorHAnsi" w:hAnsi="Times New Roman" w:cs="Times New Roman"/>
+          <w:sz w:val="28"/>
+          <w:szCs w:val="28"/>
+        </w:rPr>
+        <w:t>404 NOT FOUND</w:t>
+      </w:r>
+      <w:r>
+        <w:rPr>
+          <w:rFonts w:cs="Times New Roman"/>
+          <w:szCs w:val="28"/>
+        </w:rPr>
+        <w:t xml:space="preserve">. Если пользователь не обладает необходимыми правами доступа, генерируется ошибка </w:t>
+      </w:r>
+      <w:r>
+        <w:rPr>
+          <w:rStyle w:val="HTML1"/>
+          <w:rFonts w:ascii="Times New Roman" w:eastAsiaTheme="minorHAnsi" w:hAnsi="Times New Roman" w:cs="Times New Roman"/>
+          <w:sz w:val="28"/>
+          <w:szCs w:val="28"/>
+        </w:rPr>
+        <w:t>403 FORBIDDEN</w:t>
+      </w:r>
+      <w:r>
+        <w:rPr>
+          <w:rFonts w:cs="Times New Roman"/>
+          <w:szCs w:val="28"/>
+        </w:rPr>
+        <w:t>. Реализация подобного механизма обеспечивает защиту пользовательских данных и предотвращает несанкционированное изменение информации.</w:t>
+      </w:r>
+    </w:p>
+    <w:p>
+      <w:pPr>
+        <w:rPr>
+          <w:rFonts w:cs="Times New Roman"/>
+          <w:color w:val="000000" w:themeColor="text1"/>
+          <w:szCs w:val="28"/>
+        </w:rPr>
+      </w:pPr>
+      <w:r>
+        <w:rPr>
+          <w:rFonts w:cs="Times New Roman"/>
+          <w:szCs w:val="28"/>
+        </w:rPr>
+        <w:t xml:space="preserve">Для управления содержимым дорожной карты реализованы процедуры создания, обновления и удаления задач. При создании новой задачи формируется объект типа </w:t>
+      </w:r>
+      <w:r>
+        <w:rPr>
+          <w:rStyle w:val="HTML1"/>
+          <w:rFonts w:ascii="Times New Roman" w:eastAsiaTheme="minorHAnsi" w:hAnsi="Times New Roman" w:cs="Times New Roman"/>
+          <w:sz w:val="28"/>
+          <w:szCs w:val="28"/>
+        </w:rPr>
+        <w:t>Task</w:t>
+      </w:r>
+      <w:r>
+        <w:rPr>
+          <w:rFonts w:cs="Times New Roman"/>
+          <w:szCs w:val="28"/>
+        </w:rPr>
+        <w:t>, содержащий название, описание, индекс сортировки и статус выполнения. После этого объект сохраняется в базе данных. На рисунке 2.</w:t>
+      </w:r>
+      <w:r>
+        <w:rPr>
+          <w:rFonts w:cs="Times New Roman"/>
+          <w:szCs w:val="28"/>
+        </w:rPr>
+        <w:t>13</w:t>
+      </w:r>
+      <w:r>
+        <w:rPr>
+          <w:rFonts w:cs="Times New Roman"/>
+          <w:szCs w:val="28"/>
+        </w:rPr>
+        <w:t xml:space="preserve"> представлен фрагмент создания задачи.</w:t>
+      </w:r>
+    </w:p>
+    <w:p>
+      <w:pPr>
+        <w:jc w:val="center"/>
+        <w:rPr>
+          <w:lang w:eastAsia="ru-RU"/>
+        </w:rPr>
+      </w:pPr>
+      <w:r>
+        <w:rPr>
+          <w:lang w:eastAsia="ru-RU"/>
+        </w:rPr>
+        <w:drawing>
+          <wp:inline distT="0" distB="0" distL="0" distR="0" wp14:anchorId="31A8DCAB" wp14:editId="169E58DA">
+            <wp:extent cx="3199542" cy="2631881"/>
+            <wp:effectExtent l="0" t="0" r="1270" b="0"/>
+            <wp:docPr id="162236294" name="Рисунок 162236294"/>
+            <wp:cNvGraphicFramePr>
+              <a:graphicFrameLocks xmlns:a="http://schemas.openxmlformats.org/drawingml/2006/main" noChangeAspect="1"/>
+            </wp:cNvGraphicFramePr>
+            <a:graphic xmlns:a="http://schemas.openxmlformats.org/drawingml/2006/main">
+              <a:graphicData uri="http://schemas.openxmlformats.org/drawingml/2006/picture">
+                <pic:pic xmlns:pic="http://schemas.openxmlformats.org/drawingml/2006/picture">
+                  <pic:nvPicPr>
+                    <pic:cNvPr id="1" name=""/>
+                    <pic:cNvPicPr/>
+                  </pic:nvPicPr>
+                  <pic:blipFill>
+                    <a:blip r:embed="rId32"/>
+                    <a:stretch>
+                      <a:fillRect/>
+                    </a:stretch>
+                  </pic:blipFill>
+                  <pic:spPr>
+                    <a:xfrm>
+                      <a:off x="0" y="0"/>
+                      <a:ext cx="3206266" cy="2637412"/>
+                    </a:xfrm>
+                    <a:prstGeom prst="rect">
+                      <a:avLst/>
+                    </a:prstGeom>
+                  </pic:spPr>
+                </pic:pic>
+              </a:graphicData>
+            </a:graphic>
+          </wp:inline>
+        </w:drawing>
+      </w:r>
+    </w:p>
+    <w:p>
+      <w:pPr>
+        <w:jc w:val="center"/>
+        <w:rPr>
+          <w:color w:val="000000" w:themeColor="text1"/>
+        </w:rPr>
+      </w:pPr>
+      <w:r>
+        <w:rPr>
+          <w:color w:val="000000" w:themeColor="text1"/>
+        </w:rPr>
+        <w:t xml:space="preserve">Рисунок </w:t>
+      </w:r>
+      <w:r>
+        <w:rPr>
+          <w:color w:val="000000" w:themeColor="text1"/>
+        </w:rPr>
+        <w:t>2</w:t>
+      </w:r>
+      <w:r>
+        <w:rPr>
+          <w:color w:val="000000" w:themeColor="text1"/>
+        </w:rPr>
+        <w:t>.</w:t>
+      </w:r>
+      <w:r>
+        <w:rPr>
+          <w:color w:val="000000" w:themeColor="text1"/>
+        </w:rPr>
+        <w:t>1</w:t>
+      </w:r>
+      <w:r>
+        <w:rPr>
+          <w:color w:val="000000" w:themeColor="text1"/>
+        </w:rPr>
+        <w:t>3</w:t>
+      </w:r>
+      <w:r>
+        <w:rPr>
+          <w:color w:val="000000" w:themeColor="text1"/>
+        </w:rPr>
+        <w:t xml:space="preserve"> –</w:t>
+      </w:r>
+      <w:r>
+        <w:rPr>
+          <w:color w:val="000000" w:themeColor="text1"/>
+        </w:rPr>
+        <w:t xml:space="preserve"> </w:t>
+      </w:r>
+      <w:r>
+        <w:rPr>
+          <w:color w:val="000000" w:themeColor="text1"/>
+        </w:rPr>
+        <w:t>Фрагмент создания задачи</w:t>
+      </w:r>
+    </w:p>
+    <w:p>
+      <w:r>
+        <w:t>После сохранения изменений выполняется обновление объекта задачи, что позволяет получить актуальные данные из базы данных, включая автоматически сформированный идентификатор записи. Использование отдельных сервисов для работы с задачами позволяет изолировать бизнес-логику от уровня маршрутизации и упростить дальнейшее сопровождение приложения.</w:t>
+      </w:r>
+    </w:p>
+    <w:p>
+      <w:r>
+        <w:t xml:space="preserve">Для отслеживания прогресса выполнения </w:t>
+      </w:r>
+      <w:r>
+        <w:t xml:space="preserve">списка задач </w:t>
+      </w:r>
+      <w:r>
+        <w:t>реализована процедура изменения статуса задачи. При изменении состояния система автоматически фиксирует дату и время завершения задачи. На рисунке 2.</w:t>
+      </w:r>
+      <w:r>
+        <w:t>14</w:t>
+      </w:r>
+      <w:r>
+        <w:t xml:space="preserve"> представлен фрагмент обновления статуса выполнения.</w:t>
+      </w:r>
+    </w:p>
+    <w:p>
+      <w:pPr>
+        <w:jc w:val="center"/>
+      </w:pPr>
+      <w:r>
+        <w:lastRenderedPageBreak/>
+        <w:drawing>
+          <wp:inline distT="0" distB="0" distL="0" distR="0" wp14:anchorId="01584CC0" wp14:editId="338513BA">
+            <wp:extent cx="5058481" cy="1533739"/>
+            <wp:effectExtent l="0" t="0" r="8890" b="9525"/>
+            <wp:docPr id="162236295" name="Рисунок 162236295"/>
+            <wp:cNvGraphicFramePr>
+              <a:graphicFrameLocks xmlns:a="http://schemas.openxmlformats.org/drawingml/2006/main" noChangeAspect="1"/>
+            </wp:cNvGraphicFramePr>
+            <a:graphic xmlns:a="http://schemas.openxmlformats.org/drawingml/2006/main">
+              <a:graphicData uri="http://schemas.openxmlformats.org/drawingml/2006/picture">
+                <pic:pic xmlns:pic="http://schemas.openxmlformats.org/drawingml/2006/picture">
+                  <pic:nvPicPr>
+                    <pic:cNvPr id="1" name=""/>
+                    <pic:cNvPicPr/>
+                  </pic:nvPicPr>
+                  <pic:blipFill>
+                    <a:blip r:embed="rId33"/>
+                    <a:stretch>
+                      <a:fillRect/>
+                    </a:stretch>
+                  </pic:blipFill>
+                  <pic:spPr>
+                    <a:xfrm>
+                      <a:off x="0" y="0"/>
+                      <a:ext cx="5058481" cy="1533739"/>
+                    </a:xfrm>
+                    <a:prstGeom prst="rect">
+                      <a:avLst/>
+                    </a:prstGeom>
+                  </pic:spPr>
+                </pic:pic>
+              </a:graphicData>
+            </a:graphic>
+          </wp:inline>
+        </w:drawing>
+      </w:r>
+    </w:p>
+    <w:p>
+      <w:pPr>
+        <w:jc w:val="center"/>
+        <w:rPr>
+          <w:color w:val="000000" w:themeColor="text1"/>
+        </w:rPr>
+      </w:pPr>
+      <w:r>
+        <w:rPr>
+          <w:color w:val="000000" w:themeColor="text1"/>
+        </w:rPr>
+        <w:t xml:space="preserve">Рисунок </w:t>
+      </w:r>
+      <w:r>
+        <w:rPr>
+          <w:color w:val="000000" w:themeColor="text1"/>
+        </w:rPr>
+        <w:t>2</w:t>
+      </w:r>
+      <w:r>
+        <w:rPr>
+          <w:color w:val="000000" w:themeColor="text1"/>
+        </w:rPr>
+        <w:t>.</w:t>
+      </w:r>
+      <w:r>
+        <w:rPr>
+          <w:color w:val="000000" w:themeColor="text1"/>
+        </w:rPr>
+        <w:t>1</w:t>
+      </w:r>
+      <w:r>
+        <w:rPr>
+          <w:color w:val="000000" w:themeColor="text1"/>
+        </w:rPr>
+        <w:t>4</w:t>
+      </w:r>
+      <w:r>
+        <w:rPr>
+          <w:color w:val="000000" w:themeColor="text1"/>
+        </w:rPr>
+        <w:t xml:space="preserve"> –</w:t>
+      </w:r>
+      <w:r>
+        <w:rPr>
+          <w:color w:val="000000" w:themeColor="text1"/>
+        </w:rPr>
+        <w:t xml:space="preserve"> Фрагмент </w:t>
+      </w:r>
+      <w:r>
+        <w:rPr>
+          <w:color w:val="000000" w:themeColor="text1"/>
+        </w:rPr>
+        <w:t>обновления статуса выполнения</w:t>
+      </w:r>
+    </w:p>
+    <w:p>
+      <w:pPr>
+        <w:rPr>
+          <w:rFonts w:cs="Times New Roman"/>
+          <w:szCs w:val="28"/>
+        </w:rPr>
+      </w:pPr>
+      <w:r>
+        <w:rPr>
+          <w:rFonts w:cs="Times New Roman"/>
+          <w:szCs w:val="28"/>
+        </w:rPr>
+        <w:t xml:space="preserve">Использование поля </w:t>
+      </w:r>
+      <w:proofErr w:type="spellStart"/>
+      <w:r>
+        <w:rPr>
+          <w:rStyle w:val="HTML1"/>
+          <w:rFonts w:ascii="Times New Roman" w:eastAsiaTheme="minorHAnsi" w:hAnsi="Times New Roman" w:cs="Times New Roman"/>
+          <w:sz w:val="28"/>
+          <w:szCs w:val="28"/>
+        </w:rPr>
+        <w:t>completed_at</w:t>
+      </w:r>
+      <w:proofErr w:type="spellEnd"/>
+      <w:r>
+        <w:rPr>
+          <w:rFonts w:cs="Times New Roman"/>
+          <w:szCs w:val="28"/>
+        </w:rPr>
+        <w:t xml:space="preserve"> позволяет хранить информацию о времени завершения этапов</w:t>
+      </w:r>
+      <w:r>
+        <w:rPr>
+          <w:rFonts w:cs="Times New Roman"/>
+          <w:szCs w:val="28"/>
+        </w:rPr>
+        <w:t xml:space="preserve"> списка задач</w:t>
+      </w:r>
+      <w:r>
+        <w:rPr>
+          <w:rFonts w:cs="Times New Roman"/>
+          <w:szCs w:val="28"/>
+        </w:rPr>
+        <w:t xml:space="preserve"> и в дальнейшем анализировать прогресс пользователя при достижении поставленной цели.</w:t>
+      </w:r>
+    </w:p>
+    <w:p>
+      <w:r>
+        <w:t xml:space="preserve">Взаимодействие клиентской и серверной частей приложения реализовано с использованием REST API интерфейса на базе фреймворка </w:t>
+      </w:r>
+      <w:proofErr w:type="spellStart"/>
+      <w:r>
+        <w:t>FastAPI</w:t>
+      </w:r>
+      <w:proofErr w:type="spellEnd"/>
+      <w:r>
+        <w:t>. Для каждого типа операции был реализован отдельный маршрут, обеспечивающий обработку HTTP-запросов и передачу данных между клиентом и сервером. На рисунке 2.</w:t>
+      </w:r>
+      <w:r>
+        <w:t xml:space="preserve">15 </w:t>
+      </w:r>
+      <w:r>
+        <w:t>представлен пример маршрута создания задачи.</w:t>
+      </w:r>
+    </w:p>
+    <w:p>
+      <w:pPr>
+        <w:jc w:val="center"/>
+        <w:rPr>
+          <w:rFonts w:cs="Times New Roman"/>
+          <w:color w:val="000000" w:themeColor="text1"/>
+          <w:szCs w:val="28"/>
+        </w:rPr>
+      </w:pPr>
+      <w:r>
+        <w:rPr>
+          <w:rFonts w:cs="Times New Roman"/>
+          <w:color w:val="000000" w:themeColor="text1"/>
+          <w:szCs w:val="28"/>
+        </w:rPr>
+        <w:drawing>
+          <wp:inline distT="0" distB="0" distL="0" distR="0" wp14:anchorId="0A795A9C" wp14:editId="6C95BF7A">
+            <wp:extent cx="4286848" cy="2248214"/>
+            <wp:effectExtent l="0" t="0" r="0" b="0"/>
+            <wp:docPr id="162236296" name="Рисунок 162236296"/>
+            <wp:cNvGraphicFramePr>
+              <a:graphicFrameLocks xmlns:a="http://schemas.openxmlformats.org/drawingml/2006/main" noChangeAspect="1"/>
+            </wp:cNvGraphicFramePr>
+            <a:graphic xmlns:a="http://schemas.openxmlformats.org/drawingml/2006/main">
+              <a:graphicData uri="http://schemas.openxmlformats.org/drawingml/2006/picture">
+                <pic:pic xmlns:pic="http://schemas.openxmlformats.org/drawingml/2006/picture">
+                  <pic:nvPicPr>
+                    <pic:cNvPr id="1" name=""/>
+                    <pic:cNvPicPr/>
+                  </pic:nvPicPr>
+                  <pic:blipFill>
+                    <a:blip r:embed="rId34"/>
+                    <a:stretch>
+                      <a:fillRect/>
+                    </a:stretch>
+                  </pic:blipFill>
+                  <pic:spPr>
+                    <a:xfrm>
+                      <a:off x="0" y="0"/>
+                      <a:ext cx="4286848" cy="2248214"/>
+                    </a:xfrm>
+                    <a:prstGeom prst="rect">
+                      <a:avLst/>
+                    </a:prstGeom>
+                  </pic:spPr>
+                </pic:pic>
+              </a:graphicData>
+            </a:graphic>
+          </wp:inline>
+        </w:drawing>
+      </w:r>
+    </w:p>
+    <w:p>
+      <w:pPr>
+        <w:jc w:val="center"/>
+        <w:rPr>
+          <w:color w:val="000000" w:themeColor="text1"/>
+        </w:rPr>
+      </w:pPr>
+      <w:r>
+        <w:rPr>
+          <w:color w:val="000000" w:themeColor="text1"/>
+        </w:rPr>
+        <w:t xml:space="preserve">Рисунок </w:t>
+      </w:r>
+      <w:r>
+        <w:rPr>
+          <w:color w:val="000000" w:themeColor="text1"/>
+        </w:rPr>
+        <w:t>2</w:t>
+      </w:r>
+      <w:r>
+        <w:rPr>
+          <w:color w:val="000000" w:themeColor="text1"/>
+        </w:rPr>
+        <w:t>.</w:t>
+      </w:r>
+      <w:r>
+        <w:rPr>
+          <w:color w:val="000000" w:themeColor="text1"/>
+        </w:rPr>
+        <w:t>1</w:t>
+      </w:r>
+      <w:r>
+        <w:rPr>
+          <w:color w:val="000000" w:themeColor="text1"/>
+        </w:rPr>
+        <w:t>5</w:t>
+      </w:r>
+      <w:r>
+        <w:rPr>
+          <w:color w:val="000000" w:themeColor="text1"/>
+        </w:rPr>
+        <w:t xml:space="preserve"> –</w:t>
+      </w:r>
+      <w:r>
+        <w:rPr>
+          <w:color w:val="000000" w:themeColor="text1"/>
+        </w:rPr>
+        <w:t xml:space="preserve"> </w:t>
+      </w:r>
+      <w:r>
+        <w:rPr>
+          <w:color w:val="000000" w:themeColor="text1"/>
+        </w:rPr>
+        <w:t>Маршрут создания задачи</w:t>
+      </w:r>
+    </w:p>
+    <w:p>
+      <w:r>
+        <w:t xml:space="preserve">Маршруты </w:t>
+      </w:r>
+      <w:proofErr w:type="spellStart"/>
+      <w:r>
+        <w:t>FastAPI</w:t>
+      </w:r>
+      <w:proofErr w:type="spellEnd"/>
+      <w:r>
+        <w:t xml:space="preserve"> обеспечивают автоматическую валидацию входных данных</w:t>
+      </w:r>
+      <w:r>
+        <w:t xml:space="preserve"> через специальную схему данных</w:t>
+      </w:r>
+      <w:r>
+        <w:t>, обработку авторизации пользователя и вызов соответствующих сервисов бизнес-логики. Использование REST архитектуры позволило разделить клиентскую и серверную части приложения, упростить масштабирование системы и обеспечить возможность дальнейшей интеграции с внешними сервисами.</w:t>
+      </w:r>
+    </w:p>
+    <w:p>
+      <w:pPr>
+        <w:pStyle w:val="1"/>
+      </w:pPr>
+      <w:r>
+        <w:lastRenderedPageBreak/>
+        <w:t xml:space="preserve">3 </w:t>
+      </w:r>
+      <w:r>
+        <w:t>Рекомендации по эксплуатации продукта</w:t>
+      </w:r>
+    </w:p>
+    <w:p/>
+    <w:p>
+      <w:pPr>
+        <w:rPr>
+          <w:color w:val="000000" w:themeColor="text1"/>
+        </w:rPr>
+      </w:pPr>
+    </w:p>
+    <w:p>
+      <w:pPr>
+        <w:jc w:val="center"/>
+        <w:rPr>
+          <w:lang w:eastAsia="ru-RU"/>
+        </w:rPr>
+      </w:pPr>
     </w:p>
     <w:sectPr>
-      <w:headerReference w:type="default" r:id="rId22"/>
+      <w:headerReference w:type="default" r:id="rId35"/>
       <w:pgSz w:w="11906" w:h="16838"/>
       <w:pgMar w:top="992" w:right="709" w:bottom="1843" w:left="1418" w:header="0" w:footer="567" w:gutter="0"/>
       <w:cols w:space="708"/>
@@ -13730,6 +16166,233 @@
       </w:rPr>
     </w:lvl>
   </w:abstractNum>
+  <w:abstractNum w:abstractNumId="11" w15:restartNumberingAfterBreak="0">
+    <w:nsid w:val="77F84960"/>
+    <w:multiLevelType w:val="hybridMultilevel"/>
+    <w:tmpl w:val="6DF4AF4C"/>
+    <w:lvl w:ilvl="0" w:tplc="09FEB212">
+      <w:start w:val="1"/>
+      <w:numFmt w:val="bullet"/>
+      <w:suff w:val="space"/>
+      <w:lvlText w:val=""/>
+      <w:lvlJc w:val="left"/>
+      <w:pPr>
+        <w:ind w:left="1429" w:hanging="360"/>
+      </w:pPr>
+      <w:rPr>
+        <w:rFonts w:ascii="Symbol" w:hAnsi="Symbol" w:hint="default"/>
+      </w:rPr>
+    </w:lvl>
+    <w:lvl w:ilvl="1" w:tplc="04190003" w:tentative="1">
+      <w:start w:val="1"/>
+      <w:numFmt w:val="bullet"/>
+      <w:lvlText w:val="o"/>
+      <w:lvlJc w:val="left"/>
+      <w:pPr>
+        <w:ind w:left="2149" w:hanging="360"/>
+      </w:pPr>
+      <w:rPr>
+        <w:rFonts w:ascii="Courier New" w:hAnsi="Courier New" w:cs="Courier New" w:hint="default"/>
+      </w:rPr>
+    </w:lvl>
+    <w:lvl w:ilvl="2" w:tplc="04190005" w:tentative="1">
+      <w:start w:val="1"/>
+      <w:numFmt w:val="bullet"/>
+      <w:lvlText w:val=""/>
+      <w:lvlJc w:val="left"/>
+      <w:pPr>
+        <w:ind w:left="2869" w:hanging="360"/>
+      </w:pPr>
+      <w:rPr>
+        <w:rFonts w:ascii="Wingdings" w:hAnsi="Wingdings" w:hint="default"/>
+      </w:rPr>
+    </w:lvl>
+    <w:lvl w:ilvl="3" w:tplc="04190001" w:tentative="1">
+      <w:start w:val="1"/>
+      <w:numFmt w:val="bullet"/>
+      <w:lvlText w:val=""/>
+      <w:lvlJc w:val="left"/>
+      <w:pPr>
+        <w:ind w:left="3589" w:hanging="360"/>
+      </w:pPr>
+      <w:rPr>
+        <w:rFonts w:ascii="Symbol" w:hAnsi="Symbol" w:hint="default"/>
+      </w:rPr>
+    </w:lvl>
+    <w:lvl w:ilvl="4" w:tplc="04190003" w:tentative="1">
+      <w:start w:val="1"/>
+      <w:numFmt w:val="bullet"/>
+      <w:lvlText w:val="o"/>
+      <w:lvlJc w:val="left"/>
+      <w:pPr>
+        <w:ind w:left="4309" w:hanging="360"/>
+      </w:pPr>
+      <w:rPr>
+        <w:rFonts w:ascii="Courier New" w:hAnsi="Courier New" w:cs="Courier New" w:hint="default"/>
+      </w:rPr>
+    </w:lvl>
+    <w:lvl w:ilvl="5" w:tplc="04190005" w:tentative="1">
+      <w:start w:val="1"/>
+      <w:numFmt w:val="bullet"/>
+      <w:lvlText w:val=""/>
+      <w:lvlJc w:val="left"/>
+      <w:pPr>
+        <w:ind w:left="5029" w:hanging="360"/>
+      </w:pPr>
+      <w:rPr>
+        <w:rFonts w:ascii="Wingdings" w:hAnsi="Wingdings" w:hint="default"/>
+      </w:rPr>
+    </w:lvl>
+    <w:lvl w:ilvl="6" w:tplc="04190001" w:tentative="1">
+      <w:start w:val="1"/>
+      <w:numFmt w:val="bullet"/>
+      <w:lvlText w:val=""/>
+      <w:lvlJc w:val="left"/>
+      <w:pPr>
+        <w:ind w:left="5749" w:hanging="360"/>
+      </w:pPr>
+      <w:rPr>
+        <w:rFonts w:ascii="Symbol" w:hAnsi="Symbol" w:hint="default"/>
+      </w:rPr>
+    </w:lvl>
+    <w:lvl w:ilvl="7" w:tplc="04190003" w:tentative="1">
+      <w:start w:val="1"/>
+      <w:numFmt w:val="bullet"/>
+      <w:lvlText w:val="o"/>
+      <w:lvlJc w:val="left"/>
+      <w:pPr>
+        <w:ind w:left="6469" w:hanging="360"/>
+      </w:pPr>
+      <w:rPr>
+        <w:rFonts w:ascii="Courier New" w:hAnsi="Courier New" w:cs="Courier New" w:hint="default"/>
+      </w:rPr>
+    </w:lvl>
+    <w:lvl w:ilvl="8" w:tplc="04190005" w:tentative="1">
+      <w:start w:val="1"/>
+      <w:numFmt w:val="bullet"/>
+      <w:lvlText w:val=""/>
+      <w:lvlJc w:val="left"/>
+      <w:pPr>
+        <w:ind w:left="7189" w:hanging="360"/>
+      </w:pPr>
+      <w:rPr>
+        <w:rFonts w:ascii="Wingdings" w:hAnsi="Wingdings" w:hint="default"/>
+      </w:rPr>
+    </w:lvl>
+  </w:abstractNum>
+  <w:abstractNum w:abstractNumId="12" w15:restartNumberingAfterBreak="0">
+    <w:nsid w:val="7E794327"/>
+    <w:multiLevelType w:val="hybridMultilevel"/>
+    <w:tmpl w:val="BFF0D868"/>
+    <w:lvl w:ilvl="0" w:tplc="AC1C3610">
+      <w:start w:val="1"/>
+      <w:numFmt w:val="bullet"/>
+      <w:lvlText w:val=""/>
+      <w:lvlJc w:val="left"/>
+      <w:pPr>
+        <w:ind w:left="1429" w:hanging="360"/>
+      </w:pPr>
+      <w:rPr>
+        <w:rFonts w:ascii="Symbol" w:hAnsi="Symbol" w:hint="default"/>
+      </w:rPr>
+    </w:lvl>
+    <w:lvl w:ilvl="1" w:tplc="04190003" w:tentative="1">
+      <w:start w:val="1"/>
+      <w:numFmt w:val="bullet"/>
+      <w:lvlText w:val="o"/>
+      <w:lvlJc w:val="left"/>
+      <w:pPr>
+        <w:ind w:left="2149" w:hanging="360"/>
+      </w:pPr>
+      <w:rPr>
+        <w:rFonts w:ascii="Courier New" w:hAnsi="Courier New" w:cs="Courier New" w:hint="default"/>
+      </w:rPr>
+    </w:lvl>
+    <w:lvl w:ilvl="2" w:tplc="04190005" w:tentative="1">
+      <w:start w:val="1"/>
+      <w:numFmt w:val="bullet"/>
+      <w:lvlText w:val=""/>
+      <w:lvlJc w:val="left"/>
+      <w:pPr>
+        <w:ind w:left="2869" w:hanging="360"/>
+      </w:pPr>
+      <w:rPr>
+        <w:rFonts w:ascii="Wingdings" w:hAnsi="Wingdings" w:hint="default"/>
+      </w:rPr>
+    </w:lvl>
+    <w:lvl w:ilvl="3" w:tplc="04190001" w:tentative="1">
+      <w:start w:val="1"/>
+      <w:numFmt w:val="bullet"/>
+      <w:lvlText w:val=""/>
+      <w:lvlJc w:val="left"/>
+      <w:pPr>
+        <w:ind w:left="3589" w:hanging="360"/>
+      </w:pPr>
+      <w:rPr>
+        <w:rFonts w:ascii="Symbol" w:hAnsi="Symbol" w:hint="default"/>
+      </w:rPr>
+    </w:lvl>
+    <w:lvl w:ilvl="4" w:tplc="04190003" w:tentative="1">
+      <w:start w:val="1"/>
+      <w:numFmt w:val="bullet"/>
+      <w:lvlText w:val="o"/>
+      <w:lvlJc w:val="left"/>
+      <w:pPr>
+        <w:ind w:left="4309" w:hanging="360"/>
+      </w:pPr>
+      <w:rPr>
+        <w:rFonts w:ascii="Courier New" w:hAnsi="Courier New" w:cs="Courier New" w:hint="default"/>
+      </w:rPr>
+    </w:lvl>
+    <w:lvl w:ilvl="5" w:tplc="04190005" w:tentative="1">
+      <w:start w:val="1"/>
+      <w:numFmt w:val="bullet"/>
+      <w:lvlText w:val=""/>
+      <w:lvlJc w:val="left"/>
+      <w:pPr>
+        <w:ind w:left="5029" w:hanging="360"/>
+      </w:pPr>
+      <w:rPr>
+        <w:rFonts w:ascii="Wingdings" w:hAnsi="Wingdings" w:hint="default"/>
+      </w:rPr>
+    </w:lvl>
+    <w:lvl w:ilvl="6" w:tplc="04190001" w:tentative="1">
+      <w:start w:val="1"/>
+      <w:numFmt w:val="bullet"/>
+      <w:lvlText w:val=""/>
+      <w:lvlJc w:val="left"/>
+      <w:pPr>
+        <w:ind w:left="5749" w:hanging="360"/>
+      </w:pPr>
+      <w:rPr>
+        <w:rFonts w:ascii="Symbol" w:hAnsi="Symbol" w:hint="default"/>
+      </w:rPr>
+    </w:lvl>
+    <w:lvl w:ilvl="7" w:tplc="04190003" w:tentative="1">
+      <w:start w:val="1"/>
+      <w:numFmt w:val="bullet"/>
+      <w:lvlText w:val="o"/>
+      <w:lvlJc w:val="left"/>
+      <w:pPr>
+        <w:ind w:left="6469" w:hanging="360"/>
+      </w:pPr>
+      <w:rPr>
+        <w:rFonts w:ascii="Courier New" w:hAnsi="Courier New" w:cs="Courier New" w:hint="default"/>
+      </w:rPr>
+    </w:lvl>
+    <w:lvl w:ilvl="8" w:tplc="04190005" w:tentative="1">
+      <w:start w:val="1"/>
+      <w:numFmt w:val="bullet"/>
+      <w:lvlText w:val=""/>
+      <w:lvlJc w:val="left"/>
+      <w:pPr>
+        <w:ind w:left="7189" w:hanging="360"/>
+      </w:pPr>
+      <w:rPr>
+        <w:rFonts w:ascii="Wingdings" w:hAnsi="Wingdings" w:hint="default"/>
+      </w:rPr>
+    </w:lvl>
+  </w:abstractNum>
   <w:num w:numId="1">
     <w:abstractNumId w:val="8"/>
   </w:num>
@@ -13762,6 +16425,12 @@
   </w:num>
   <w:num w:numId="11">
     <w:abstractNumId w:val="5"/>
+  </w:num>
+  <w:num w:numId="12">
+    <w:abstractNumId w:val="12"/>
+  </w:num>
+  <w:num w:numId="13">
+    <w:abstractNumId w:val="11"/>
   </w:num>
   <w:numIdMacAtCleanup w:val="4"/>
 </w:numbering>
@@ -14166,7 +16835,7 @@
   <w:style w:type="paragraph" w:default="1" w:styleId="a">
     <w:name w:val="Normal"/>
     <w:qFormat/>
-    <w:rsid w:val="00C84699"/>
+    <w:rsid w:val="00D21956"/>
     <w:pPr>
       <w:ind w:firstLine="709"/>
     </w:pPr>
@@ -14872,13 +17541,16 @@
     <w:autoRedefine/>
     <w:uiPriority w:val="39"/>
     <w:unhideWhenUsed/>
-    <w:rsid w:val="00471721"/>
+    <w:rsid w:val="006C4A41"/>
     <w:pPr>
       <w:tabs>
         <w:tab w:val="right" w:leader="dot" w:pos="9922"/>
       </w:tabs>
       <w:ind w:left="284" w:right="142" w:firstLine="283"/>
     </w:pPr>
+    <w:rPr>
+      <w:noProof/>
+    </w:rPr>
   </w:style>
   <w:style w:type="paragraph" w:styleId="af5">
     <w:name w:val="caption"/>

</xml_diff>

<commit_message>
nachal rukovodstvo i testi
</commit_message>
<xml_diff>
--- a/Диплом мешков 23.106.docx
+++ b/Диплом мешков 23.106.docx
@@ -278,45 +278,6 @@
     </w:p>
     <w:p>
       <w:pPr>
-        <w:ind w:left="284" w:right="227" w:firstLine="0"/>
-        <w:jc w:val="center"/>
-        <w:rPr>
-          <w:szCs w:val="28"/>
-        </w:rPr>
-      </w:pPr>
-      <w:r>
-        <w:rPr>
-          <w:szCs w:val="28"/>
-        </w:rPr>
-        <w:t>ПМ.0</w:t>
-      </w:r>
-      <w:r>
-        <w:rPr>
-          <w:szCs w:val="28"/>
-        </w:rPr>
-        <w:t>2</w:t>
-      </w:r>
-      <w:r>
-        <w:rPr>
-          <w:szCs w:val="28"/>
-        </w:rPr>
-        <w:t xml:space="preserve"> </w:t>
-      </w:r>
-      <w:r>
-        <w:rPr>
-          <w:szCs w:val="28"/>
-        </w:rPr>
-        <w:t>О</w:t>
-      </w:r>
-      <w:r>
-        <w:rPr>
-          <w:szCs w:val="28"/>
-        </w:rPr>
-        <w:t>существление интеграции программных модулей</w:t>
-      </w:r>
-    </w:p>
-    <w:p>
-      <w:pPr>
         <w:tabs>
           <w:tab w:val="left" w:pos="142"/>
         </w:tabs>
@@ -332,7 +293,63 @@
           <w:color w:val="000000" w:themeColor="text1"/>
           <w:szCs w:val="28"/>
         </w:rPr>
-        <w:t>МДК.02.01 Технология разработки программного обеспечения</w:t>
+        <w:t>НАТКиГ.</w:t>
+      </w:r>
+      <w:r>
+        <w:rPr>
+          <w:color w:val="000000" w:themeColor="text1"/>
+          <w:szCs w:val="28"/>
+        </w:rPr>
+        <w:t>1</w:t>
+      </w:r>
+      <w:r>
+        <w:rPr>
+          <w:color w:val="000000" w:themeColor="text1"/>
+          <w:szCs w:val="28"/>
+        </w:rPr>
+        <w:t>0</w:t>
+      </w:r>
+      <w:r>
+        <w:rPr>
+          <w:color w:val="000000" w:themeColor="text1"/>
+          <w:szCs w:val="28"/>
+        </w:rPr>
+        <w:t>1</w:t>
+      </w:r>
+      <w:r>
+        <w:rPr>
+          <w:color w:val="000000" w:themeColor="text1"/>
+          <w:szCs w:val="28"/>
+        </w:rPr>
+        <w:t>7</w:t>
+      </w:r>
+      <w:r>
+        <w:rPr>
+          <w:color w:val="000000" w:themeColor="text1"/>
+          <w:szCs w:val="28"/>
+        </w:rPr>
+        <w:t>00.</w:t>
+      </w:r>
+      <w:r>
+        <w:rPr>
+          <w:color w:val="000000" w:themeColor="text1"/>
+          <w:szCs w:val="28"/>
+        </w:rPr>
+        <w:t>0</w:t>
+      </w:r>
+      <w:r>
+        <w:rPr>
+          <w:color w:val="000000" w:themeColor="text1"/>
+          <w:szCs w:val="28"/>
+        </w:rPr>
+        <w:t>10</w:t>
+      </w:r>
+      <w:r>
+        <w:rPr>
+          <w:color w:val="000000" w:themeColor="text1"/>
+          <w:szCs w:val="28"/>
+        </w:rPr>
+        <w:t>.000ПЗ</w:t>
       </w:r>
     </w:p>
     <w:p>
@@ -343,66 +360,12 @@
         <w:ind w:left="284" w:right="227" w:firstLine="0"/>
         <w:jc w:val="center"/>
         <w:rPr>
-          <w:color w:val="000000" w:themeColor="text1"/>
-          <w:szCs w:val="28"/>
-        </w:rPr>
-      </w:pPr>
-      <w:r>
-        <w:rPr>
-          <w:color w:val="000000" w:themeColor="text1"/>
-          <w:szCs w:val="28"/>
-        </w:rPr>
-        <w:t>НАТКиГ.2</w:t>
-      </w:r>
-      <w:r>
-        <w:rPr>
-          <w:color w:val="000000" w:themeColor="text1"/>
-          <w:szCs w:val="28"/>
-        </w:rPr>
-        <w:t>0</w:t>
-      </w:r>
-      <w:r>
-        <w:rPr>
-          <w:color w:val="000000" w:themeColor="text1"/>
-          <w:szCs w:val="28"/>
-        </w:rPr>
-        <w:t>1</w:t>
-      </w:r>
-      <w:r>
-        <w:rPr>
-          <w:color w:val="000000" w:themeColor="text1"/>
-          <w:szCs w:val="28"/>
-        </w:rPr>
-        <w:t>7</w:t>
-      </w:r>
-      <w:r>
-        <w:rPr>
-          <w:color w:val="000000" w:themeColor="text1"/>
-          <w:szCs w:val="28"/>
-        </w:rPr>
-        <w:t>00.</w:t>
-      </w:r>
-      <w:r>
-        <w:rPr>
-          <w:color w:val="000000" w:themeColor="text1"/>
-          <w:szCs w:val="28"/>
-        </w:rPr>
-        <w:t>0</w:t>
-      </w:r>
-      <w:r>
-        <w:rPr>
-          <w:color w:val="000000" w:themeColor="text1"/>
-          <w:szCs w:val="28"/>
-        </w:rPr>
-        <w:t>10</w:t>
-      </w:r>
-      <w:r>
-        <w:rPr>
-          <w:color w:val="000000" w:themeColor="text1"/>
-          <w:szCs w:val="28"/>
-        </w:rPr>
-        <w:t>.000ПЗ</w:t>
-      </w:r>
+          <w:rFonts w:eastAsia="Times New Roman" w:cs="Times New Roman"/>
+          <w:caps/>
+          <w:szCs w:val="28"/>
+          <w:lang w:eastAsia="ru-RU"/>
+        </w:rPr>
+      </w:pPr>
     </w:p>
     <w:p>
       <w:pPr>
@@ -413,7 +376,8 @@
         <w:jc w:val="center"/>
         <w:rPr>
           <w:rFonts w:eastAsia="Times New Roman" w:cs="Times New Roman"/>
-          <w:caps/>
+          <w:i/>
+          <w:iCs/>
           <w:szCs w:val="28"/>
           <w:lang w:eastAsia="ru-RU"/>
         </w:rPr>
@@ -428,8 +392,6 @@
         <w:jc w:val="center"/>
         <w:rPr>
           <w:rFonts w:eastAsia="Times New Roman" w:cs="Times New Roman"/>
-          <w:i/>
-          <w:iCs/>
           <w:szCs w:val="28"/>
           <w:lang w:eastAsia="ru-RU"/>
         </w:rPr>
@@ -604,6 +566,21 @@
           <w:tab w:val="left" w:pos="142"/>
         </w:tabs>
         <w:ind w:right="227" w:firstLine="0"/>
+        <w:rPr>
+          <w:rFonts w:eastAsia="Times New Roman"/>
+          <w:szCs w:val="28"/>
+          <w:lang w:eastAsia="ru-RU"/>
+        </w:rPr>
+      </w:pPr>
+    </w:p>
+    <w:p>
+      <w:pPr>
+        <w:tabs>
+          <w:tab w:val="left" w:pos="142"/>
+        </w:tabs>
+        <w:spacing w:line="240" w:lineRule="auto"/>
+        <w:ind w:left="284" w:right="227" w:firstLine="0"/>
+        <w:jc w:val="center"/>
         <w:rPr>
           <w:rFonts w:eastAsia="Times New Roman"/>
           <w:szCs w:val="28"/>
@@ -1466,21 +1443,7 @@
                 <w:rStyle w:val="ae"/>
                 <w:bCs/>
               </w:rPr>
-              <w:t>2.4 Описание про</w:t>
-            </w:r>
-            <w:r>
-              <w:rPr>
-                <w:rStyle w:val="ae"/>
-                <w:bCs/>
-              </w:rPr>
-              <w:t>ц</w:t>
-            </w:r>
-            <w:r>
-              <w:rPr>
-                <w:rStyle w:val="ae"/>
-                <w:bCs/>
-              </w:rPr>
-              <w:t>едур и функций</w:t>
+              <w:t>2.4 Описание процедур и функций</w:t>
             </w:r>
             <w:r>
               <w:rPr>
@@ -1640,13 +1603,31 @@
         <w:rPr>
           <w:rFonts w:ascii="Times New Roman" w:hAnsi="Times New Roman"/>
         </w:rPr>
-        <w:t>в</w:t>
-      </w:r>
-      <w:r>
-        <w:rPr>
-          <w:rFonts w:ascii="Times New Roman" w:hAnsi="Times New Roman"/>
-        </w:rPr>
-        <w:t>ыполнить описание предметной области</w:t>
+        <w:t>изучить</w:t>
+      </w:r>
+      <w:r>
+        <w:rPr>
+          <w:rFonts w:ascii="Times New Roman" w:hAnsi="Times New Roman"/>
+        </w:rPr>
+        <w:t xml:space="preserve"> предметн</w:t>
+      </w:r>
+      <w:r>
+        <w:rPr>
+          <w:rFonts w:ascii="Times New Roman" w:hAnsi="Times New Roman"/>
+        </w:rPr>
+        <w:t>ую</w:t>
+      </w:r>
+      <w:r>
+        <w:rPr>
+          <w:rFonts w:ascii="Times New Roman" w:hAnsi="Times New Roman"/>
+        </w:rPr>
+        <w:t xml:space="preserve"> област</w:t>
+      </w:r>
+      <w:r>
+        <w:rPr>
+          <w:rFonts w:ascii="Times New Roman" w:hAnsi="Times New Roman"/>
+        </w:rPr>
+        <w:t>ь</w:t>
       </w:r>
       <w:r>
         <w:rPr>
@@ -1712,7 +1693,19 @@
         <w:rPr>
           <w:rFonts w:ascii="Times New Roman" w:hAnsi="Times New Roman"/>
         </w:rPr>
-        <w:t>ровести анализ аналогов и прототипов;</w:t>
+        <w:t>ровести анализ аналогов и прототипов</w:t>
+      </w:r>
+      <w:r>
+        <w:rPr>
+          <w:rFonts w:ascii="Times New Roman" w:hAnsi="Times New Roman"/>
+        </w:rPr>
+        <w:t xml:space="preserve"> с целью выявления положительных сторон</w:t>
+      </w:r>
+      <w:r>
+        <w:rPr>
+          <w:rFonts w:ascii="Times New Roman" w:hAnsi="Times New Roman"/>
+        </w:rPr>
+        <w:t>;</w:t>
       </w:r>
     </w:p>
     <w:p>
@@ -1824,12 +1817,41 @@
         <w:rPr>
           <w:rFonts w:ascii="Times New Roman" w:hAnsi="Times New Roman"/>
         </w:rPr>
-        <w:t>разработать интерфейс программного продукта</w:t>
-      </w:r>
-      <w:r>
-        <w:rPr>
-          <w:rFonts w:ascii="Times New Roman" w:hAnsi="Times New Roman"/>
-          <w:lang w:val="en-US"/>
+        <w:t>р</w:t>
+      </w:r>
+      <w:r>
+        <w:rPr>
+          <w:rFonts w:ascii="Times New Roman" w:hAnsi="Times New Roman"/>
+        </w:rPr>
+        <w:t>азработать</w:t>
+      </w:r>
+      <w:r>
+        <w:rPr>
+          <w:rFonts w:ascii="Times New Roman" w:hAnsi="Times New Roman"/>
+        </w:rPr>
+        <w:t xml:space="preserve"> интерфейс программного продукта, </w:t>
+      </w:r>
+      <w:r>
+        <w:rPr>
+          <w:rFonts w:ascii="Times New Roman" w:hAnsi="Times New Roman"/>
+        </w:rPr>
+        <w:t>структуру программного продукта</w:t>
+      </w:r>
+      <w:r>
+        <w:rPr>
+          <w:rFonts w:ascii="Times New Roman" w:hAnsi="Times New Roman"/>
+        </w:rPr>
+        <w:t xml:space="preserve">, алгоритмы обработки </w:t>
+      </w:r>
+      <w:r>
+        <w:rPr>
+          <w:rFonts w:ascii="Times New Roman" w:hAnsi="Times New Roman"/>
+        </w:rPr>
+        <w:t>информации, инструкции пользователям системы</w:t>
+      </w:r>
+      <w:r>
+        <w:rPr>
+          <w:rFonts w:ascii="Times New Roman" w:hAnsi="Times New Roman"/>
         </w:rPr>
         <w:t>;</w:t>
       </w:r>
@@ -1851,13 +1873,13 @@
         <w:rPr>
           <w:rFonts w:ascii="Times New Roman" w:hAnsi="Times New Roman"/>
         </w:rPr>
-        <w:t>р</w:t>
-      </w:r>
-      <w:r>
-        <w:rPr>
-          <w:rFonts w:ascii="Times New Roman" w:hAnsi="Times New Roman"/>
-        </w:rPr>
-        <w:t>азработать структуру программного продукта</w:t>
+        <w:t>в</w:t>
+      </w:r>
+      <w:r>
+        <w:rPr>
+          <w:rFonts w:ascii="Times New Roman" w:hAnsi="Times New Roman"/>
+        </w:rPr>
+        <w:t>ыбрать стратегию тестирования</w:t>
       </w:r>
       <w:r>
         <w:rPr>
@@ -1890,7 +1912,7 @@
         <w:rPr>
           <w:rFonts w:ascii="Times New Roman" w:hAnsi="Times New Roman"/>
         </w:rPr>
-        <w:t>азработать алгоритмы обработки информации</w:t>
+        <w:t>азработать сценарии тестирования</w:t>
       </w:r>
       <w:r>
         <w:rPr>
@@ -1917,105 +1939,6 @@
         <w:rPr>
           <w:rFonts w:ascii="Times New Roman" w:hAnsi="Times New Roman"/>
         </w:rPr>
-        <w:t>р</w:t>
-      </w:r>
-      <w:r>
-        <w:rPr>
-          <w:rFonts w:ascii="Times New Roman" w:hAnsi="Times New Roman"/>
-        </w:rPr>
-        <w:t>азработать инструкции пользователям системы</w:t>
-      </w:r>
-      <w:r>
-        <w:rPr>
-          <w:rFonts w:ascii="Times New Roman" w:hAnsi="Times New Roman"/>
-          <w:lang w:val="en-US"/>
-        </w:rPr>
-        <w:t>;</w:t>
-      </w:r>
-    </w:p>
-    <w:p>
-      <w:pPr>
-        <w:pStyle w:val="a4"/>
-        <w:numPr>
-          <w:ilvl w:val="0"/>
-          <w:numId w:val="11"/>
-        </w:numPr>
-        <w:spacing w:line="360" w:lineRule="auto"/>
-        <w:ind w:left="0" w:firstLine="709"/>
-        <w:rPr>
-          <w:rFonts w:ascii="Times New Roman" w:hAnsi="Times New Roman"/>
-        </w:rPr>
-      </w:pPr>
-      <w:r>
-        <w:rPr>
-          <w:rFonts w:ascii="Times New Roman" w:hAnsi="Times New Roman"/>
-        </w:rPr>
-        <w:t>в</w:t>
-      </w:r>
-      <w:r>
-        <w:rPr>
-          <w:rFonts w:ascii="Times New Roman" w:hAnsi="Times New Roman"/>
-        </w:rPr>
-        <w:t>ыбрать стратегию тестирования</w:t>
-      </w:r>
-      <w:r>
-        <w:rPr>
-          <w:rFonts w:ascii="Times New Roman" w:hAnsi="Times New Roman"/>
-          <w:lang w:val="en-US"/>
-        </w:rPr>
-        <w:t>;</w:t>
-      </w:r>
-    </w:p>
-    <w:p>
-      <w:pPr>
-        <w:pStyle w:val="a4"/>
-        <w:numPr>
-          <w:ilvl w:val="0"/>
-          <w:numId w:val="11"/>
-        </w:numPr>
-        <w:spacing w:line="360" w:lineRule="auto"/>
-        <w:ind w:left="0" w:firstLine="709"/>
-        <w:rPr>
-          <w:rFonts w:ascii="Times New Roman" w:hAnsi="Times New Roman"/>
-        </w:rPr>
-      </w:pPr>
-      <w:r>
-        <w:rPr>
-          <w:rFonts w:ascii="Times New Roman" w:hAnsi="Times New Roman"/>
-        </w:rPr>
-        <w:t>р</w:t>
-      </w:r>
-      <w:r>
-        <w:rPr>
-          <w:rFonts w:ascii="Times New Roman" w:hAnsi="Times New Roman"/>
-        </w:rPr>
-        <w:t>азработать сценарии тестирования</w:t>
-      </w:r>
-      <w:r>
-        <w:rPr>
-          <w:rFonts w:ascii="Times New Roman" w:hAnsi="Times New Roman"/>
-          <w:lang w:val="en-US"/>
-        </w:rPr>
-        <w:t>;</w:t>
-      </w:r>
-    </w:p>
-    <w:p>
-      <w:pPr>
-        <w:pStyle w:val="a4"/>
-        <w:numPr>
-          <w:ilvl w:val="0"/>
-          <w:numId w:val="11"/>
-        </w:numPr>
-        <w:spacing w:line="360" w:lineRule="auto"/>
-        <w:ind w:left="0" w:firstLine="709"/>
-        <w:rPr>
-          <w:rFonts w:ascii="Times New Roman" w:hAnsi="Times New Roman"/>
-        </w:rPr>
-      </w:pPr>
-      <w:r>
-        <w:rPr>
-          <w:rFonts w:ascii="Times New Roman" w:hAnsi="Times New Roman"/>
-        </w:rPr>
         <w:t>с</w:t>
       </w:r>
       <w:r>
@@ -2455,10 +2378,10 @@
           <w:noProof/>
         </w:rPr>
         <w:drawing>
-          <wp:inline distT="0" distB="0" distL="0" distR="0" wp14:anchorId="50098228" wp14:editId="178A0FFF">
-            <wp:extent cx="4792297" cy="5391150"/>
-            <wp:effectExtent l="19050" t="19050" r="27940" b="19050"/>
-            <wp:docPr id="7" name="Рисунок 7"/>
+          <wp:inline distT="0" distB="0" distL="0" distR="0" wp14:anchorId="7D9C773D" wp14:editId="75A5433A">
+            <wp:extent cx="5306958" cy="5761549"/>
+            <wp:effectExtent l="19050" t="19050" r="27305" b="10795"/>
+            <wp:docPr id="162236300" name="Рисунок 162236300"/>
             <wp:cNvGraphicFramePr>
               <a:graphicFrameLocks xmlns:a="http://schemas.openxmlformats.org/drawingml/2006/main" noChangeAspect="1"/>
             </wp:cNvGraphicFramePr>
@@ -2466,7 +2389,7 @@
               <a:graphicData uri="http://schemas.openxmlformats.org/drawingml/2006/picture">
                 <pic:pic xmlns:pic="http://schemas.openxmlformats.org/drawingml/2006/picture">
                   <pic:nvPicPr>
-                    <pic:cNvPr id="0" name="Picture 1"/>
+                    <pic:cNvPr id="0" name="Picture 15"/>
                     <pic:cNvPicPr>
                       <a:picLocks noChangeAspect="1" noChangeArrowheads="1"/>
                     </pic:cNvPicPr>
@@ -2487,7 +2410,7 @@
                   <pic:spPr bwMode="auto">
                     <a:xfrm>
                       <a:off x="0" y="0"/>
-                      <a:ext cx="4829970" cy="5433530"/>
+                      <a:ext cx="5366310" cy="5825985"/>
                     </a:xfrm>
                     <a:prstGeom prst="rect">
                       <a:avLst/>
@@ -2525,11 +2448,11 @@
     </w:p>
     <w:p>
       <w:r>
-        <w:t xml:space="preserve">Пользователь запускает веб-приложение и выполняет вход в систему, используя свои учетные данные. После успешной аутентификации приложение готово к работе в двух основных направлениях: личное планирование и командное взаимодействие. В области личного планирования авторизованный пользователь имеет возможность создавать и редактировать личные цели с применением механизма автоматической декомпозиции для упрощения структурирования сложных задач. Пользователь управляет этапами выполнения и подзадачами, </w:t>
+        <w:t xml:space="preserve">Пользователь запускает веб-приложение и выполняет вход в систему, используя свои учетные данные. После успешной аутентификации приложение готово к работе в двух основных направлениях: личное планирование и командное взаимодействие. В области личного планирования авторизованный пользователь имеет возможность создавать и редактировать личные цели с применением механизма автоматической декомпозиции для упрощения структурирования </w:t>
       </w:r>
       <w:r>
         <w:lastRenderedPageBreak/>
-        <w:t>отслеживает прогресс и использует встроенные средства визуализации для наглядного отображения структуры целей и текущего статуса их выполнения.</w:t>
+        <w:t>сложных задач. Пользователь управляет этапами выполнения и подзадачами, отслеживает прогресс и использует встроенные средства визуализации для наглядного отображения структуры целей и текущего статуса их выполнения.</w:t>
       </w:r>
     </w:p>
     <w:p>
@@ -2552,10 +2475,10 @@
           <w:noProof/>
         </w:rPr>
         <w:drawing>
-          <wp:inline distT="0" distB="0" distL="0" distR="0" wp14:anchorId="4B40737F" wp14:editId="7F068553">
-            <wp:extent cx="5343370" cy="5150485"/>
-            <wp:effectExtent l="19050" t="19050" r="10160" b="12065"/>
-            <wp:docPr id="8" name="Рисунок 8"/>
+          <wp:inline distT="0" distB="0" distL="0" distR="0" wp14:anchorId="2440725E" wp14:editId="56548281">
+            <wp:extent cx="5713191" cy="4075871"/>
+            <wp:effectExtent l="19050" t="19050" r="20955" b="20320"/>
+            <wp:docPr id="162236301" name="Рисунок 162236301"/>
             <wp:cNvGraphicFramePr>
               <a:graphicFrameLocks xmlns:a="http://schemas.openxmlformats.org/drawingml/2006/main" noChangeAspect="1"/>
             </wp:cNvGraphicFramePr>
@@ -2563,7 +2486,7 @@
               <a:graphicData uri="http://schemas.openxmlformats.org/drawingml/2006/picture">
                 <pic:pic xmlns:pic="http://schemas.openxmlformats.org/drawingml/2006/picture">
                   <pic:nvPicPr>
-                    <pic:cNvPr id="0" name="Picture 3"/>
+                    <pic:cNvPr id="0" name="Picture 17"/>
                     <pic:cNvPicPr>
                       <a:picLocks noChangeAspect="1" noChangeArrowheads="1"/>
                     </pic:cNvPicPr>
@@ -2584,7 +2507,7 @@
                   <pic:spPr bwMode="auto">
                     <a:xfrm>
                       <a:off x="0" y="0"/>
-                      <a:ext cx="5361737" cy="5168189"/>
+                      <a:ext cx="5767527" cy="4114635"/>
                     </a:xfrm>
                     <a:prstGeom prst="rect">
                       <a:avLst/>
@@ -2628,8 +2551,11 @@
     </w:p>
     <w:p>
       <w:r>
+        <w:t xml:space="preserve">Пользователь, инициировавший создание новой команды, или участник, назначенный на эту роль, получает доступ к расширенному функционалу управления. Администратор команды отвечает за жизненный цикл группы, </w:t>
+      </w:r>
+      <w:r>
         <w:lastRenderedPageBreak/>
-        <w:t>Пользователь, инициировавший создание новой команды, или участник, назначенный на эту роль, получает доступ к расширенному функционалу управления. Администратор команды отвечает за жизненный цикл группы, включая функции её создания и удаления. В его полномочия входит управление составом участников: приглашение новых членов, удаление пользователей, а также назначение и изменение ролей других участников в пределах данной команды.</w:t>
+        <w:t>включая функции её создания и удаления. В его полномочия входит управление составом участников: приглашение новых членов, удаление пользователей, а также назначение и изменение ролей других участников в пределах данной команды.</w:t>
       </w:r>
       <w:r>
         <w:t xml:space="preserve"> </w:t>
@@ -2704,68 +2630,74 @@
         <w:rPr>
           <w:lang w:eastAsia="ru-RU"/>
         </w:rPr>
-        <w:t xml:space="preserve"> — популярный сервис для управления личными задачами и командными проектами. Данное приложение предоставляет пользователю инструменты для создания проектов, добавления задач и подзадач, установки сроков выполнения и приоритетов. Система ориентирована на удобное повседневное планирование и позволяет быстро формировать списки задач с возможностью их фильтрации по различным </w:t>
+        <w:t xml:space="preserve"> </w:t>
       </w:r>
       <w:r>
         <w:rPr>
           <w:lang w:eastAsia="ru-RU"/>
         </w:rPr>
+        <w:t>–</w:t>
+      </w:r>
+      <w:r>
+        <w:rPr>
+          <w:lang w:eastAsia="ru-RU"/>
+        </w:rPr>
+        <w:t xml:space="preserve"> популярный сервис для управления личными задачами и командными проектами. Данное приложение предоставляет пользователю инструменты для создания проектов, добавления задач и подзадач, установки сроков выполнения и приоритетов. Система ориентирована на удобное повседневное планирование и позволяет быстро формировать списки задач с возможностью их фильтрации по различным параметрам, таким как дата, проект или метки. Интерфейс приложения обеспечивает наглядное представление текущих задач и позволяет отслеживать прогресс выполнения.</w:t>
+      </w:r>
+    </w:p>
+    <w:p>
+      <w:pPr>
+        <w:rPr>
+          <w:lang w:eastAsia="ru-RU"/>
+        </w:rPr>
+      </w:pPr>
+      <w:r>
+        <w:rPr>
+          <w:lang w:eastAsia="ru-RU"/>
+        </w:rPr>
         <w:lastRenderedPageBreak/>
-        <w:t>параметрам, таким как дата, проект или метки. Интерфейс приложения обеспечивает наглядное представление текущих задач и позволяет отслеживать прогресс выполнения.</w:t>
-      </w:r>
-    </w:p>
-    <w:p>
-      <w:pPr>
+        <w:t>На рисунках 1.</w:t>
+      </w:r>
+      <w:r>
         <w:rPr>
           <w:lang w:eastAsia="ru-RU"/>
         </w:rPr>
-      </w:pPr>
+        <w:t>4</w:t>
+      </w:r>
       <w:r>
         <w:rPr>
           <w:lang w:eastAsia="ru-RU"/>
         </w:rPr>
-        <w:t>На рисунках 1.</w:t>
+        <w:t xml:space="preserve"> и 1.</w:t>
       </w:r>
       <w:r>
         <w:rPr>
           <w:lang w:eastAsia="ru-RU"/>
         </w:rPr>
-        <w:t>4</w:t>
+        <w:t>5</w:t>
       </w:r>
       <w:r>
         <w:rPr>
           <w:lang w:eastAsia="ru-RU"/>
         </w:rPr>
-        <w:t xml:space="preserve"> и 1.</w:t>
-      </w:r>
-      <w:r>
+        <w:t xml:space="preserve"> представлены основные элементы интерфейса системы.</w:t>
+      </w:r>
+    </w:p>
+    <w:p>
+      <w:pPr>
+        <w:jc w:val="center"/>
         <w:rPr>
           <w:lang w:eastAsia="ru-RU"/>
         </w:rPr>
-        <w:t>5</w:t>
-      </w:r>
-      <w:r>
-        <w:rPr>
-          <w:lang w:eastAsia="ru-RU"/>
-        </w:rPr>
-        <w:t xml:space="preserve"> представлены основные элементы интерфейса системы.</w:t>
-      </w:r>
-    </w:p>
-    <w:p>
-      <w:pPr>
-        <w:jc w:val="center"/>
-        <w:rPr>
-          <w:lang w:eastAsia="ru-RU"/>
-        </w:rPr>
       </w:pPr>
       <w:r>
         <w:rPr>
           <w:noProof/>
         </w:rPr>
         <w:drawing>
-          <wp:inline distT="0" distB="0" distL="0" distR="0" wp14:anchorId="2CEFC4EE" wp14:editId="4152C3DD">
-            <wp:extent cx="3344019" cy="4210050"/>
-            <wp:effectExtent l="0" t="0" r="8890" b="0"/>
+          <wp:inline distT="0" distB="0" distL="0" distR="0" wp14:anchorId="2CEFC4EE" wp14:editId="65C9C769">
+            <wp:extent cx="3498574" cy="4404632"/>
+            <wp:effectExtent l="0" t="0" r="6985" b="0"/>
             <wp:docPr id="3" name="Рисунок 3"/>
             <wp:cNvGraphicFramePr>
               <a:graphicFrameLocks xmlns:a="http://schemas.openxmlformats.org/drawingml/2006/main" noChangeAspect="1"/>
@@ -2786,7 +2718,7 @@
                   <pic:spPr>
                     <a:xfrm>
                       <a:off x="0" y="0"/>
-                      <a:ext cx="3350546" cy="4218268"/>
+                      <a:ext cx="3510372" cy="4419486"/>
                     </a:xfrm>
                     <a:prstGeom prst="rect">
                       <a:avLst/>
@@ -2830,9 +2762,9 @@
           <w:noProof/>
         </w:rPr>
         <w:drawing>
-          <wp:inline distT="0" distB="0" distL="0" distR="0" wp14:anchorId="09EC1B8B" wp14:editId="400697E2">
-            <wp:extent cx="4642203" cy="2295525"/>
-            <wp:effectExtent l="0" t="0" r="6350" b="0"/>
+          <wp:inline distT="0" distB="0" distL="0" distR="0" wp14:anchorId="09EC1B8B" wp14:editId="5B253C9B">
+            <wp:extent cx="4856099" cy="2401294"/>
+            <wp:effectExtent l="0" t="0" r="1905" b="0"/>
             <wp:docPr id="5" name="Рисунок 5"/>
             <wp:cNvGraphicFramePr>
               <a:graphicFrameLocks xmlns:a="http://schemas.openxmlformats.org/drawingml/2006/main" noChangeAspect="1"/>
@@ -2853,7 +2785,7 @@
                   <pic:spPr>
                     <a:xfrm>
                       <a:off x="0" y="0"/>
-                      <a:ext cx="4650629" cy="2299691"/>
+                      <a:ext cx="4874231" cy="2410260"/>
                     </a:xfrm>
                     <a:prstGeom prst="rect">
                       <a:avLst/>
@@ -2882,10 +2814,14 @@
         <w:t>»</w:t>
       </w:r>
     </w:p>
+    <w:p/>
     <w:p>
       <w:r>
         <w:lastRenderedPageBreak/>
-        <w:t>Рассмотрим ключевые характеристики системы в обобщённом виде, представленные на таблице 1.1.</w:t>
+        <w:t>К</w:t>
+      </w:r>
+      <w:r>
+        <w:t>лючевые характеристики системы в обобщённом виде, представленные на таблице 1.1.</w:t>
       </w:r>
     </w:p>
     <w:p>
@@ -3278,7 +3214,19 @@
         <w:rPr>
           <w:lang w:eastAsia="ru-RU"/>
         </w:rPr>
-        <w:t>Дополнительной особенностью платформы является наличие встроенного ИИ-ассистента, который помогает в формировании и структурировании задач. Также система поддерживает совместную работу, управление доступом и хранение истории изменений.</w:t>
+        <w:t>Дополнительной особенностью платформы является наличие встроенного ИИ-ассистента</w:t>
+      </w:r>
+      <w:r>
+        <w:rPr>
+          <w:lang w:eastAsia="ru-RU"/>
+        </w:rPr>
+        <w:t xml:space="preserve"> (Искусственный интеллект)</w:t>
+      </w:r>
+      <w:r>
+        <w:rPr>
+          <w:lang w:eastAsia="ru-RU"/>
+        </w:rPr>
+        <w:t>, который помогает в формировании и структурировании задач. Также система поддерживает совместную работу, управление доступом и хранение истории изменений.</w:t>
       </w:r>
       <w:r>
         <w:t xml:space="preserve"> </w:t>
@@ -3318,9 +3266,9 @@
           <w:noProof/>
         </w:rPr>
         <w:drawing>
-          <wp:inline distT="0" distB="0" distL="0" distR="0" wp14:anchorId="59BB4F30" wp14:editId="1649A03D">
-            <wp:extent cx="5427150" cy="3543441"/>
-            <wp:effectExtent l="0" t="0" r="2540" b="0"/>
+          <wp:inline distT="0" distB="0" distL="0" distR="0" wp14:anchorId="59BB4F30" wp14:editId="25CFC219">
+            <wp:extent cx="5262061" cy="3569757"/>
+            <wp:effectExtent l="0" t="0" r="0" b="0"/>
             <wp:docPr id="12" name="Рисунок 12"/>
             <wp:cNvGraphicFramePr>
               <a:graphicFrameLocks xmlns:a="http://schemas.openxmlformats.org/drawingml/2006/main" noChangeAspect="1"/>
@@ -3341,7 +3289,7 @@
                   <pic:spPr>
                     <a:xfrm>
                       <a:off x="0" y="0"/>
-                      <a:ext cx="5431031" cy="3545975"/>
+                      <a:ext cx="5276915" cy="3579834"/>
                     </a:xfrm>
                     <a:prstGeom prst="rect">
                       <a:avLst/>
@@ -3394,9 +3342,9 @@
           <w:noProof/>
         </w:rPr>
         <w:drawing>
-          <wp:inline distT="0" distB="0" distL="0" distR="0" wp14:anchorId="3CC1A841" wp14:editId="47187DB5">
-            <wp:extent cx="5509396" cy="3581400"/>
-            <wp:effectExtent l="0" t="0" r="0" b="0"/>
+          <wp:inline distT="0" distB="0" distL="0" distR="0" wp14:anchorId="3CC1A841" wp14:editId="32DB4303">
+            <wp:extent cx="5309410" cy="3573522"/>
+            <wp:effectExtent l="0" t="0" r="5715" b="8255"/>
             <wp:docPr id="13" name="Рисунок 13"/>
             <wp:cNvGraphicFramePr>
               <a:graphicFrameLocks xmlns:a="http://schemas.openxmlformats.org/drawingml/2006/main" noChangeAspect="1"/>
@@ -3417,7 +3365,7 @@
                   <pic:spPr>
                     <a:xfrm>
                       <a:off x="0" y="0"/>
-                      <a:ext cx="5521586" cy="3589324"/>
+                      <a:ext cx="5330061" cy="3587421"/>
                     </a:xfrm>
                     <a:prstGeom prst="rect">
                       <a:avLst/>
@@ -3452,7 +3400,10 @@
     <w:p>
       <w:r>
         <w:lastRenderedPageBreak/>
-        <w:t>Рассмотрим ключевые характеристики системы в обобщённом виде, представленные на таблице 1.2.</w:t>
+        <w:t>К</w:t>
+      </w:r>
+      <w:r>
+        <w:t>лючевые характеристики системы в обобщённом виде, представленные на таблице 1.2.</w:t>
       </w:r>
     </w:p>
     <w:p>
@@ -4146,7 +4097,6 @@
         </w:tc>
       </w:tr>
     </w:tbl>
-    <w:p/>
     <w:p>
       <w:pPr>
         <w:rPr>
@@ -4157,21 +4107,21 @@
         <w:rPr>
           <w:lang w:eastAsia="ru-RU"/>
         </w:rPr>
+        <w:t>На рисунке 1.8 представлен пример интерфейса системы.</w:t>
+      </w:r>
+    </w:p>
+    <w:p>
+      <w:pPr>
+        <w:jc w:val="center"/>
+        <w:rPr>
+          <w:lang w:eastAsia="ru-RU"/>
+        </w:rPr>
+      </w:pPr>
+      <w:r>
+        <w:rPr>
+          <w:noProof/>
+        </w:rPr>
         <w:lastRenderedPageBreak/>
-        <w:t>На рисунке 1.8 представлен пример интерфейса системы.</w:t>
-      </w:r>
-    </w:p>
-    <w:p>
-      <w:pPr>
-        <w:jc w:val="center"/>
-        <w:rPr>
-          <w:lang w:eastAsia="ru-RU"/>
-        </w:rPr>
-      </w:pPr>
-      <w:r>
-        <w:rPr>
-          <w:noProof/>
-        </w:rPr>
         <w:drawing>
           <wp:inline distT="0" distB="0" distL="0" distR="0" wp14:anchorId="180F3B81" wp14:editId="2ED68F51">
             <wp:extent cx="5664218" cy="4543425"/>
@@ -5199,10 +5149,25 @@
         <w:jc w:val="center"/>
       </w:pPr>
       <w:r>
-        <w:t>Рисунок 1.7 – Диаграмма последовательности «</w:t>
-      </w:r>
-      <w:r>
-        <w:t>Генерация списка задач с использованием ИИ</w:t>
+        <w:t>Рисунок 1.7 – Диаграмма последовательности</w:t>
+      </w:r>
+      <w:r>
+        <w:t xml:space="preserve"> для функции</w:t>
+      </w:r>
+      <w:r>
+        <w:t xml:space="preserve"> </w:t>
+      </w:r>
+      <w:r>
+        <w:t>г</w:t>
+      </w:r>
+      <w:r>
+        <w:t>енераци</w:t>
+      </w:r>
+      <w:r>
+        <w:t>и</w:t>
+      </w:r>
+      <w:r>
+        <w:t xml:space="preserve"> списка задач с использованием ИИ</w:t>
       </w:r>
       <w:r>
         <w:t>»</w:t>
@@ -5210,13 +5175,28 @@
     </w:p>
     <w:p>
       <w:r>
-        <w:t>На диаграмме показано взаимодействие основных участников процесса: пользователя, клиентского веб-приложения, сервера и AI-сервиса. Пользователь формулирует цель и отправляет запрос через интерфейс веб-клиента. Клиентское приложение формирует запрос к серверу, представленному в виде API, который, в свою очередь, обращается к AI-сервису с подготовленным руководством общения с пользователем в виде набора текстовых правил.</w:t>
+        <w:t xml:space="preserve">На диаграмме показано взаимодействие основных участников процесса: пользователя, клиентского веб-приложения, сервера и </w:t>
+      </w:r>
+      <w:r>
+        <w:t>ИИ</w:t>
+      </w:r>
+      <w:r>
+        <w:t>-сервиса. Пользователь формулирует цель и отправляет запрос через интерфейс веб-клиента. Клиентское приложение формирует запрос к серверу, представленному в виде API, который, в свою очередь, обращается к сервису с подготовленным руководством общения с пользователем в виде набора текстовых правил.</w:t>
       </w:r>
       <w:r>
         <w:t xml:space="preserve"> </w:t>
       </w:r>
       <w:r>
-        <w:t>AI-сервис обрабатывает полученный текст цели и генерирует структурированный перечень этапов её достижения. Сервер принимает ответ от AI-сервиса и преобразует в формат, пригодный для хранения в базе данных. После получения структурированного ответа сервис сохраняет данные о цели, списке задач и истории запроса в базе данных и возвращает результат клиентскому приложению. В итоге пользователю отображается сформированный план, доступный для дальнейшего редактирования.</w:t>
+        <w:t>С</w:t>
+      </w:r>
+      <w:r>
+        <w:t>ервис обрабатывает полученный текст цели и генерирует структурированный перечень этапов её достижения. Сервер принимает ответ от</w:t>
+      </w:r>
+      <w:r>
+        <w:t xml:space="preserve"> </w:t>
+      </w:r>
+      <w:r>
+        <w:t>сервиса и преобразует в формат, пригодный для хранения в базе данных. После получения структурированного ответа сервис сохраняет данные о цели, списке задач и истории запроса в базе данных и возвращает результат клиентскому приложению. В итоге пользователю отображается сформированный план, доступный для дальнейшего редактирования.</w:t>
       </w:r>
     </w:p>
     <w:p>
@@ -5246,9 +5226,9 @@
           <w:noProof/>
         </w:rPr>
         <w:drawing>
-          <wp:inline distT="0" distB="0" distL="0" distR="0" wp14:anchorId="64E7EDE3" wp14:editId="2E9BAE62">
-            <wp:extent cx="5820819" cy="4657725"/>
-            <wp:effectExtent l="19050" t="19050" r="27940" b="9525"/>
+          <wp:inline distT="0" distB="0" distL="0" distR="0" wp14:anchorId="64E7EDE3" wp14:editId="2B555CE8">
+            <wp:extent cx="5537311" cy="4430866"/>
+            <wp:effectExtent l="19050" t="19050" r="25400" b="27305"/>
             <wp:docPr id="26" name="Рисунок 26"/>
             <wp:cNvGraphicFramePr>
               <a:graphicFrameLocks xmlns:a="http://schemas.openxmlformats.org/drawingml/2006/main" noChangeAspect="1"/>
@@ -5278,7 +5258,7 @@
                   <pic:spPr bwMode="auto">
                     <a:xfrm>
                       <a:off x="0" y="0"/>
-                      <a:ext cx="5848988" cy="4680265"/>
+                      <a:ext cx="5577060" cy="4462672"/>
                     </a:xfrm>
                     <a:prstGeom prst="rect">
                       <a:avLst/>
@@ -5308,18 +5288,36 @@
         <w:rPr>
           <w:color w:val="000000" w:themeColor="text1"/>
         </w:rPr>
-        <w:t>Рисунок 1.8 – Диаграмма деятельности «</w:t>
+        <w:t>Рисунок 1.8 – Диаграмма деятельности</w:t>
       </w:r>
       <w:r>
         <w:rPr>
           <w:color w:val="000000" w:themeColor="text1"/>
         </w:rPr>
-        <w:t>Вывод задач списка</w:t>
+        <w:t xml:space="preserve"> для функции в</w:t>
       </w:r>
       <w:r>
         <w:rPr>
           <w:color w:val="000000" w:themeColor="text1"/>
         </w:rPr>
+        <w:t>ывод</w:t>
+      </w:r>
+      <w:r>
+        <w:rPr>
+          <w:color w:val="000000" w:themeColor="text1"/>
+        </w:rPr>
+        <w:t>а</w:t>
+      </w:r>
+      <w:r>
+        <w:rPr>
+          <w:color w:val="000000" w:themeColor="text1"/>
+        </w:rPr>
+        <w:t xml:space="preserve"> задач списка</w:t>
+      </w:r>
+      <w:r>
+        <w:rPr>
+          <w:color w:val="000000" w:themeColor="text1"/>
+        </w:rPr>
         <w:t>»</w:t>
       </w:r>
     </w:p>
@@ -5373,15 +5371,12 @@
         <w:t xml:space="preserve"> </w:t>
       </w:r>
       <w:r>
-        <w:t xml:space="preserve">Наличие актуального перечня </w:t>
-      </w:r>
+        <w:t>Наличие актуального перечня задач в едином интерфейсе способствует формированию целостного представления о текущем состоянии работы</w:t>
+      </w:r>
+    </w:p>
+    <w:p>
       <w:r>
         <w:lastRenderedPageBreak/>
-        <w:t>задач в едином интерфейсе способствует формированию целостного представления о текущем состоянии работы</w:t>
-      </w:r>
-    </w:p>
-    <w:p>
-      <w:r>
         <w:t>На рисунке 1.9 представлена диаграмма развертывания системы, демонстрирующая физическое расположение и взаимодействие основных компонентов.</w:t>
       </w:r>
     </w:p>
@@ -5510,7 +5505,13 @@
       </w:r>
       <w:proofErr w:type="spellEnd"/>
       <w:r>
-        <w:t xml:space="preserve">, узел базы данных, а также внешний узел AI‑сервиса. Показаны сетевые связи между клиентом и </w:t>
+        <w:t xml:space="preserve">, узел базы данных, а также внешний узел </w:t>
+      </w:r>
+      <w:r>
+        <w:t>ИИ</w:t>
+      </w:r>
+      <w:r>
+        <w:t xml:space="preserve">‑сервиса. Показаны сетевые связи между клиентом и </w:t>
       </w:r>
       <w:proofErr w:type="spellStart"/>
       <w:r>
@@ -5534,7 +5535,13 @@
       </w:r>
       <w:proofErr w:type="spellEnd"/>
       <w:r>
-        <w:t>‑сервисом и AI‑сервисом при генерации списка задач. Такое представление позволяет наглядно показать архитектуру системы и распределение ответственности между её компонентами.</w:t>
+        <w:t xml:space="preserve">‑сервисом и </w:t>
+      </w:r>
+      <w:r>
+        <w:t>ИИ</w:t>
+      </w:r>
+      <w:r>
+        <w:t>‑сервисом при генерации списка задач. Такое представление позволяет наглядно показать архитектуру системы и распределение ответственности между её компонентами.</w:t>
       </w:r>
     </w:p>
     <w:p>
@@ -5654,32 +5661,35 @@
     </w:p>
     <w:p>
       <w:r>
-        <w:t>В качестве основного языка программирования серверной части выбран Python. Это связано с тем, что язык обладает простым и читаемым синтаксисом, что облегчает разработку и сопровождение проекта. Кроме того, Python имеет развитую экосистему библиотек, которые могут быть использованы для реализации аутентификации пользователей, взаимодействия с базой данных, обработки HTTP-запросов и интеграции с внешними API. В рамках проекта Python будет применяться для описания моделей данных, реализации бизнес-логики системы, а также для взаимодействия с внешним AI-сервисом (</w:t>
+        <w:t>В качестве основного языка программирования серверной части выбран Python. Это связано с тем, что язык обладает простым и читаемым синтаксисом, что облегчает разработку и сопровождение проекта. Кроме того, Python имеет развитую экосистему библиотек, которые могут быть использованы для реализации аутентификации пользователей, взаимодействия с базой данных, обработки HTTP-запросов и интеграции с внешними API. В рамках проекта Python будет применяться для описания моделей данных, реализации бизнес-логики системы, а также для взаимодействия с внешним</w:t>
+      </w:r>
+      <w:r>
+        <w:t xml:space="preserve"> ИИ</w:t>
+      </w:r>
+      <w:r>
+        <w:t>-сервисом</w:t>
+      </w:r>
+      <w:r>
+        <w:t>.</w:t>
+      </w:r>
+    </w:p>
+    <w:p>
+      <w:r>
+        <w:t>Для хранения данных планиру</w:t>
+      </w:r>
+      <w:r>
+        <w:t>ется</w:t>
+      </w:r>
+      <w:r>
+        <w:t xml:space="preserve"> использовать реляционную систему управления базами данных </w:t>
       </w:r>
       <w:proofErr w:type="spellStart"/>
       <w:r>
-        <w:t>Artificial</w:t>
+        <w:t>PostgreSQL</w:t>
       </w:r>
       <w:proofErr w:type="spellEnd"/>
       <w:r>
-        <w:t xml:space="preserve"> Intelligence </w:t>
-      </w:r>
-      <w:r>
-        <w:t xml:space="preserve">– </w:t>
-      </w:r>
-      <w:r>
-        <w:t>искусственный интеллект).</w:t>
-      </w:r>
-    </w:p>
-    <w:p>
-      <w:r>
-        <w:t>Для хранения данных планиру</w:t>
-      </w:r>
-      <w:r>
-        <w:t>ется</w:t>
-      </w:r>
-      <w:r>
-        <w:t xml:space="preserve"> использовать реляционную систему управления базами данных </w:t>
+        <w:t xml:space="preserve">. Этот выбор объясняется тем, что </w:t>
       </w:r>
       <w:proofErr w:type="spellStart"/>
       <w:r>
@@ -5687,16 +5697,11 @@
       </w:r>
       <w:proofErr w:type="spellEnd"/>
       <w:r>
-        <w:t xml:space="preserve">. Этот выбор объясняется тем, что </w:t>
-      </w:r>
-      <w:proofErr w:type="spellStart"/>
+        <w:t xml:space="preserve"> обеспечивает надежное хранение структурированных данных и </w:t>
+      </w:r>
       <w:r>
         <w:lastRenderedPageBreak/>
-        <w:t>PostgreSQL</w:t>
-      </w:r>
-      <w:proofErr w:type="spellEnd"/>
-      <w:r>
-        <w:t xml:space="preserve"> обеспечивает надежное хранение структурированных данных и поддерживает выполнение сложных запросов и транзакций. В контексте системы декомпозиции целей это важно, так как необходимо хранить информацию о пользователях, целях, списках задач, командах и правах доступа, а также историю взаимодействия с искусственным интеллектом. Использование реляционной модели позволяет обеспечить целостность данных и логическую связанность между различными сущностями системы. Взаимодействие с базой данных предполагается реализовать с использованием ORM (Object-</w:t>
+        <w:t>поддерживает выполнение сложных запросов и транзакций. В контексте системы декомпозиции целей это важно, так как необходимо хранить информацию о пользователях, целях, списках задач, командах и правах доступа, а также историю взаимодействия с искусственным интеллектом. Использование реляционной модели позволяет обеспечить целостность данных и логическую связанность между различными сущностями системы. Взаимодействие с базой данных предполагается реализовать с использованием ORM (Object-</w:t>
       </w:r>
       <w:proofErr w:type="spellStart"/>
       <w:r>
@@ -5863,7 +5868,13 @@
         <w:t xml:space="preserve"> </w:t>
       </w:r>
       <w:r>
-        <w:t xml:space="preserve">с поддержкой асинхронных запросов. Сервер будет отправлять текст цели и дополнительные параметры в AI-сервис и получать ответ в формате JSON. Далее полученные данные будут проходить валидацию, преобразовываться во внутренние структуры и сохраняться в базе данных. Такой подход позволяет разделить ответственность между компонентами системы: серверная часть отвечает за обработку данных и бизнес-логику, а внешний сервис </w:t>
+        <w:t xml:space="preserve">с поддержкой асинхронных запросов. Сервер будет отправлять текст цели и дополнительные параметры в </w:t>
+      </w:r>
+      <w:r>
+        <w:t>ИИ</w:t>
+      </w:r>
+      <w:r>
+        <w:t xml:space="preserve">-сервис и получать ответ в формате JSON. Далее полученные данные будут проходить валидацию, преобразовываться во внутренние структуры и сохраняться в базе данных. Такой подход позволяет разделить ответственность между компонентами системы: серверная часть отвечает за обработку данных и бизнес-логику, а внешний сервис </w:t>
       </w:r>
       <w:r>
         <w:t>–</w:t>
@@ -7195,7 +7206,7 @@
           <w:rFonts w:ascii="Times New Roman" w:hAnsi="Times New Roman"/>
           <w:szCs w:val="28"/>
         </w:rPr>
-        <w:t>страница аутентификации;</w:t>
+        <w:t>аутентификации;</w:t>
       </w:r>
     </w:p>
     <w:p>
@@ -7217,7 +7228,14 @@
           <w:rFonts w:ascii="Times New Roman" w:hAnsi="Times New Roman"/>
           <w:szCs w:val="28"/>
         </w:rPr>
-        <w:t>страница AI-помощника</w:t>
+        <w:t>ИИ</w:t>
+      </w:r>
+      <w:r>
+        <w:rPr>
+          <w:rFonts w:ascii="Times New Roman" w:hAnsi="Times New Roman"/>
+          <w:szCs w:val="28"/>
+        </w:rPr>
+        <w:t>-помощника</w:t>
       </w:r>
       <w:r>
         <w:rPr>
@@ -7247,7 +7265,7 @@
           <w:rFonts w:ascii="Times New Roman" w:hAnsi="Times New Roman"/>
           <w:szCs w:val="28"/>
         </w:rPr>
-        <w:t>страница управления списками задач;</w:t>
+        <w:t>управления списками задач;</w:t>
       </w:r>
     </w:p>
     <w:p>
@@ -7269,7 +7287,7 @@
           <w:rFonts w:ascii="Times New Roman" w:hAnsi="Times New Roman"/>
           <w:szCs w:val="28"/>
         </w:rPr>
-        <w:t>страница профиля пользователя;</w:t>
+        <w:t>профиля пользователя;</w:t>
       </w:r>
     </w:p>
     <w:p>
@@ -7291,7 +7309,7 @@
           <w:rFonts w:ascii="Times New Roman" w:hAnsi="Times New Roman"/>
           <w:szCs w:val="28"/>
         </w:rPr>
-        <w:t>страница для сообщений между пользователями</w:t>
+        <w:t>для сообщений между пользователями</w:t>
       </w:r>
       <w:r>
         <w:rPr>
@@ -7320,7 +7338,7 @@
           <w:rFonts w:ascii="Times New Roman" w:hAnsi="Times New Roman"/>
           <w:szCs w:val="28"/>
         </w:rPr>
-        <w:t>страница команд пользователя.</w:t>
+        <w:t>команд пользователя.</w:t>
       </w:r>
     </w:p>
     <w:p>
@@ -7363,9 +7381,9 @@
           <w:szCs w:val="28"/>
         </w:rPr>
         <w:drawing>
-          <wp:inline distT="0" distB="0" distL="0" distR="0" wp14:anchorId="5C439D7D" wp14:editId="2FE35BBB">
-            <wp:extent cx="3369446" cy="3343275"/>
-            <wp:effectExtent l="19050" t="19050" r="21590" b="9525"/>
+          <wp:inline distT="0" distB="0" distL="0" distR="0" wp14:anchorId="5C439D7D" wp14:editId="489A29EB">
+            <wp:extent cx="2136444" cy="2119850"/>
+            <wp:effectExtent l="19050" t="19050" r="16510" b="13970"/>
             <wp:docPr id="4" name="Рисунок 4"/>
             <wp:cNvGraphicFramePr>
               <a:graphicFrameLocks xmlns:a="http://schemas.openxmlformats.org/drawingml/2006/main" noChangeAspect="1"/>
@@ -7386,7 +7404,7 @@
                   <pic:spPr>
                     <a:xfrm>
                       <a:off x="0" y="0"/>
-                      <a:ext cx="3456312" cy="3429466"/>
+                      <a:ext cx="2224288" cy="2207012"/>
                     </a:xfrm>
                     <a:prstGeom prst="rect">
                       <a:avLst/>
@@ -7463,15 +7481,7 @@
           <w:rFonts w:ascii="Times New Roman" w:eastAsiaTheme="minorHAnsi" w:hAnsi="Times New Roman" w:cstheme="minorBidi"/>
           <w:color w:val="000000" w:themeColor="text1"/>
         </w:rPr>
-        <w:t xml:space="preserve">Логотип выполнен в виде стилизованного изображения планшета с чек-листом и мишени с стрелой, попадающей в центр, что символизирует постановку целей, выполнение задач и точное достижение результатов. Данный элемент </w:t>
-      </w:r>
-      <w:r>
-        <w:rPr>
-          <w:rFonts w:ascii="Times New Roman" w:eastAsiaTheme="minorHAnsi" w:hAnsi="Times New Roman" w:cstheme="minorBidi"/>
-          <w:color w:val="000000" w:themeColor="text1"/>
-        </w:rPr>
-        <w:lastRenderedPageBreak/>
-        <w:t xml:space="preserve">присутствует на всех основных страницах приложения и служит </w:t>
+        <w:t xml:space="preserve">Логотип выполнен в виде стилизованного изображения планшета с чек-листом и мишени с стрелой, попадающей в центр, что символизирует постановку целей, выполнение задач и точное достижение результатов. Данный элемент присутствует на всех основных страницах приложения и служит </w:t>
       </w:r>
       <w:r>
         <w:rPr>
@@ -7539,6 +7549,7 @@
         <w:pStyle w:val="a4"/>
         <w:spacing w:line="360" w:lineRule="auto"/>
         <w:ind w:left="0"/>
+        <w:jc w:val="center"/>
         <w:rPr>
           <w:rFonts w:ascii="Times New Roman" w:eastAsiaTheme="minorHAnsi" w:hAnsi="Times New Roman" w:cstheme="minorBidi"/>
           <w:color w:val="000000" w:themeColor="text1"/>
@@ -7550,10 +7561,11 @@
           <w:noProof/>
           <w:color w:val="000000" w:themeColor="text1"/>
         </w:rPr>
+        <w:lastRenderedPageBreak/>
         <w:drawing>
-          <wp:inline distT="0" distB="0" distL="0" distR="0" wp14:anchorId="7E9D1AF9" wp14:editId="5E41A1BF">
-            <wp:extent cx="5829369" cy="4417778"/>
-            <wp:effectExtent l="19050" t="19050" r="19050" b="20955"/>
+          <wp:inline distT="0" distB="0" distL="0" distR="0" wp14:anchorId="7E9D1AF9" wp14:editId="14A73538">
+            <wp:extent cx="5409691" cy="4099726"/>
+            <wp:effectExtent l="19050" t="19050" r="19685" b="15240"/>
             <wp:docPr id="9" name="Рисунок 9"/>
             <wp:cNvGraphicFramePr>
               <a:graphicFrameLocks xmlns:a="http://schemas.openxmlformats.org/drawingml/2006/main" noChangeAspect="1"/>
@@ -7574,7 +7586,7 @@
                   <pic:spPr>
                     <a:xfrm>
                       <a:off x="0" y="0"/>
-                      <a:ext cx="5866586" cy="4445983"/>
+                      <a:ext cx="5455364" cy="4134339"/>
                     </a:xfrm>
                     <a:prstGeom prst="rect">
                       <a:avLst/>
@@ -7798,7 +7810,10 @@
         <w:t xml:space="preserve">Для использования </w:t>
       </w:r>
       <w:r>
-        <w:t>AI-помощник</w:t>
+        <w:t>ИИ</w:t>
+      </w:r>
+      <w:r>
+        <w:t>-помощник</w:t>
       </w:r>
       <w:r>
         <w:t>а разработан экран необходимого чата</w:t>
@@ -7917,7 +7932,13 @@
         <w:t xml:space="preserve"> Экран </w:t>
       </w:r>
       <w:r>
-        <w:t>с AI-чатом и созданием целей</w:t>
+        <w:t xml:space="preserve">с </w:t>
+      </w:r>
+      <w:r>
+        <w:t>ИИ</w:t>
+      </w:r>
+      <w:r>
+        <w:t>-чатом и созданием целей</w:t>
       </w:r>
     </w:p>
     <w:p>
@@ -7935,7 +7956,21 @@
           <w:rFonts w:ascii="Times New Roman" w:hAnsi="Times New Roman"/>
           <w:szCs w:val="28"/>
         </w:rPr>
-        <w:t xml:space="preserve">На данном экране пользователь взаимодействует с AI-помощником, который помогает формировать и декомпозировать цели на отдельные задачи. Интерфейс </w:t>
+        <w:t xml:space="preserve">На данном экране пользователь взаимодействует с </w:t>
+      </w:r>
+      <w:r>
+        <w:rPr>
+          <w:rFonts w:ascii="Times New Roman" w:hAnsi="Times New Roman"/>
+          <w:szCs w:val="28"/>
+        </w:rPr>
+        <w:t>ИИ</w:t>
+      </w:r>
+      <w:r>
+        <w:rPr>
+          <w:rFonts w:ascii="Times New Roman" w:hAnsi="Times New Roman"/>
+          <w:szCs w:val="28"/>
+        </w:rPr>
+        <w:t xml:space="preserve">-помощником, который помогает формировать и декомпозировать цели на отдельные задачи. Интерфейс </w:t>
       </w:r>
       <w:r>
         <w:rPr>
@@ -7949,7 +7984,35 @@
           <w:rFonts w:ascii="Times New Roman" w:hAnsi="Times New Roman"/>
           <w:szCs w:val="28"/>
         </w:rPr>
-        <w:t xml:space="preserve"> разделён на две основные области: чат с AI-ассистентом и форма создания новой цели. В форме предусмотрены поля для ввода названия и описания цели, а также кнопка «Создать </w:t>
+        <w:t xml:space="preserve"> разделён на две основные области: чат с </w:t>
+      </w:r>
+      <w:r>
+        <w:rPr>
+          <w:rFonts w:ascii="Times New Roman" w:hAnsi="Times New Roman"/>
+          <w:szCs w:val="28"/>
+        </w:rPr>
+        <w:t>ИИ</w:t>
+      </w:r>
+      <w:r>
+        <w:rPr>
+          <w:rFonts w:ascii="Times New Roman" w:hAnsi="Times New Roman"/>
+          <w:szCs w:val="28"/>
+        </w:rPr>
+        <w:t>-</w:t>
+      </w:r>
+      <w:r>
+        <w:rPr>
+          <w:rFonts w:ascii="Times New Roman" w:hAnsi="Times New Roman"/>
+          <w:szCs w:val="28"/>
+        </w:rPr>
+        <w:t>помощником</w:t>
+      </w:r>
+      <w:r>
+        <w:rPr>
+          <w:rFonts w:ascii="Times New Roman" w:hAnsi="Times New Roman"/>
+          <w:szCs w:val="28"/>
+        </w:rPr>
+        <w:t xml:space="preserve"> и форма создания новой цели. В форме предусмотрены поля для ввода названия и описания цели, а также кнопка «Создать </w:t>
       </w:r>
       <w:r>
         <w:rPr>
@@ -8411,9 +8474,9 @@
         </w:rPr>
         <w:lastRenderedPageBreak/>
         <w:drawing>
-          <wp:inline distT="0" distB="0" distL="0" distR="0" wp14:anchorId="48712E1C" wp14:editId="57C9906A">
-            <wp:extent cx="5650699" cy="3790950"/>
-            <wp:effectExtent l="19050" t="19050" r="26670" b="19050"/>
+          <wp:inline distT="0" distB="0" distL="0" distR="0" wp14:anchorId="48712E1C" wp14:editId="315273C6">
+            <wp:extent cx="4675367" cy="3136617"/>
+            <wp:effectExtent l="19050" t="19050" r="11430" b="26035"/>
             <wp:docPr id="1" name="Рисунок 1"/>
             <wp:cNvGraphicFramePr>
               <a:graphicFrameLocks xmlns:a="http://schemas.openxmlformats.org/drawingml/2006/main" noChangeAspect="1"/>
@@ -8443,7 +8506,7 @@
                   <pic:spPr bwMode="auto">
                     <a:xfrm>
                       <a:off x="0" y="0"/>
-                      <a:ext cx="5657116" cy="3795255"/>
+                      <a:ext cx="4699797" cy="3153007"/>
                     </a:xfrm>
                     <a:prstGeom prst="rect">
                       <a:avLst/>
@@ -8517,14 +8580,14 @@
         <w:rPr>
           <w:color w:val="000000" w:themeColor="text1"/>
         </w:rPr>
-        <w:t xml:space="preserve">После успешной авторизации пользователю становится доступен основной функционал системы. Внутренняя часть включает разделы: «Профиль», «Смена пароля», «Списки задач», «Просмотр конкретного списка и его задач», «Команды», «Списки задач команды», «Чаты», «Просмотр конкретного чата», «Поиск пользователей», а также интерфейс общения с ИИ‑чатом и историю ИИ‑диалогов. В разделе «Профиль» пользователь просматривает и редактирует свои данные, а также может перейти к окну «Смена пароля» для обновления учетных данных. Раздел «Списки задач» отображает созданные пользователем планы и позволяет перейти к детальному просмотру конкретного списка, где выполняется управление задачами, их порядком и статусом выполнения. Через раздел «Команды» пользователь создает команды и переходит к их данным, а в окне «Списки задач команды» организуется совместная работа над планами. Раздел «Чаты» обеспечивает общение: пользователь выбирает диалог и переходит в окно конкретного чата для просмотра сообщений и отправки новых. Раздел «Поиск пользователей» служит для нахождения других участников </w:t>
+        <w:t xml:space="preserve">После успешной авторизации пользователю становится доступен основной функционал системы. Внутренняя часть включает разделы: «Профиль», «Смена пароля», «Списки задач», «Просмотр конкретного списка и его задач», «Команды», «Списки задач команды», «Чаты», «Просмотр конкретного чата», «Поиск пользователей», а также интерфейс общения с ИИ‑чатом и историю ИИ‑диалогов. В разделе «Профиль» пользователь просматривает и редактирует свои данные, а также может перейти к окну «Смена пароля» для обновления учетных данных. Раздел «Списки задач» отображает созданные пользователем планы и позволяет перейти к детальному просмотру конкретного списка, где выполняется управление задачами, их порядком и статусом выполнения. Через раздел «Команды» пользователь создает команды и переходит к их данным, а в окне «Списки задач команды» организуется совместная работа над планами. Раздел «Чаты» обеспечивает общение: пользователь выбирает диалог и переходит в окно конкретного чата для просмотра сообщений и отправки новых. Раздел «Поиск пользователей» служит для нахождения других участников системы. Отдельный блок составляет интерфейс ИИ‑чата, позволяющий вести диалог с ИИ, получать начальный список задач и просматривать историю </w:t>
       </w:r>
       <w:r>
         <w:rPr>
           <w:color w:val="000000" w:themeColor="text1"/>
         </w:rPr>
         <w:lastRenderedPageBreak/>
-        <w:t>системы. Отдельный блок составляет интерфейс ИИ‑чата, позволяющий вести диалог с ИИ, получать начальный список задач и просматривать историю предыдущих обращений. На рисунке 2.2 изображена функциональная схема внутренней части веб‑приложения.</w:t>
+        <w:t>предыдущих обращений. На рисунке 2.2 изображена функциональная схема внутренней части веб‑приложения.</w:t>
       </w:r>
     </w:p>
     <w:p>
@@ -8679,19 +8742,7 @@
     </w:p>
     <w:p>
       <w:r>
-        <w:t>Одной из ключевых функций системы является автоматическое формировани</w:t>
-      </w:r>
-      <w:r>
-        <w:t>е</w:t>
-      </w:r>
-      <w:r>
-        <w:t xml:space="preserve"> </w:t>
-      </w:r>
-      <w:r>
-        <w:t>списка задач</w:t>
-      </w:r>
-      <w:r>
-        <w:t xml:space="preserve"> с использованием искусственного интеллекта. Для реализации данной возможности был разработан сервис </w:t>
+        <w:t xml:space="preserve">Одной из ключевых функций системы является автоматическое формирование списка задач с использованием искусственного интеллекта. Для реализации данной возможности был разработан сервис </w:t>
       </w:r>
       <w:proofErr w:type="spellStart"/>
       <w:r>
@@ -8712,17 +8763,17 @@
         <w:t>,</w:t>
       </w:r>
       <w:r>
-        <w:t xml:space="preserve"> обеспечивающий взаимодействие серверной части приложения с внешним AI </w:t>
+        <w:t xml:space="preserve"> обеспечивающий взаимодействие серверной части приложения с внешним </w:t>
+      </w:r>
+      <w:r>
+        <w:t>ИИ</w:t>
+      </w:r>
+      <w:r>
+        <w:t xml:space="preserve"> API. Основной задачей сервиса является обработка пользовательского запроса, </w:t>
       </w:r>
       <w:r>
         <w:lastRenderedPageBreak/>
-        <w:t>API. Основной задачей сервиса является обработка пользовательского запроса, формирование контекста диалога и получение структурированного набора задач для будуще</w:t>
-      </w:r>
-      <w:r>
-        <w:t>го списка</w:t>
-      </w:r>
-      <w:r>
-        <w:t>.</w:t>
+        <w:t>формирование контекста диалога и получение структурированного набора задач для будущего списка.</w:t>
       </w:r>
     </w:p>
     <w:p>
@@ -8735,13 +8786,7 @@
       </w:r>
       <w:proofErr w:type="spellEnd"/>
       <w:r>
-        <w:t>, историю взаимодействия пользователя и текущее сообщение. Дополнительно задаются параметры генерации текста, включая используемую модель и ограничения на размер ответа. На рисунке 2.</w:t>
-      </w:r>
-      <w:r>
-        <w:t>10</w:t>
-      </w:r>
-      <w:r>
-        <w:t xml:space="preserve"> представлен фрагмент формирования запроса к сервису искусственного интеллекта.</w:t>
+        <w:t>, историю взаимодействия пользователя и текущее сообщение. Дополнительно задаются параметры генерации текста, включая используемую модель и ограничения на размер ответа. На рисунке 2.10 представлен фрагмент формирования запроса к сервису искусственного интеллекта.</w:t>
       </w:r>
     </w:p>
     <w:p>
@@ -8753,6 +8798,7 @@
       </w:pPr>
       <w:r>
         <w:rPr>
+          <w:noProof/>
           <w:lang w:eastAsia="ru-RU"/>
         </w:rPr>
         <w:drawing>
@@ -8833,26 +8879,32 @@
         <w:rPr>
           <w:color w:val="000000" w:themeColor="text1"/>
         </w:rPr>
-        <w:t xml:space="preserve"> </w:t>
-      </w:r>
-      <w:r>
+        <w:t xml:space="preserve"> Формирование запроса к сервису ИИ</w:t>
+      </w:r>
+    </w:p>
+    <w:p>
+      <w:pPr>
         <w:rPr>
           <w:color w:val="000000" w:themeColor="text1"/>
         </w:rPr>
-        <w:t>Формирование запроса к сервису ИИ</w:t>
-      </w:r>
-    </w:p>
-    <w:p>
-      <w:pPr>
+      </w:pPr>
+      <w:r>
         <w:rPr>
           <w:color w:val="000000" w:themeColor="text1"/>
         </w:rPr>
-      </w:pPr>
+        <w:t xml:space="preserve">После формирования объекта запроса выполняется асинхронное обращение к </w:t>
+      </w:r>
       <w:r>
         <w:rPr>
           <w:color w:val="000000" w:themeColor="text1"/>
         </w:rPr>
-        <w:t xml:space="preserve">После формирования объекта запроса выполняется асинхронное обращение к AI сервису с использованием библиотеки </w:t>
+        <w:t>ИИ</w:t>
+      </w:r>
+      <w:r>
+        <w:rPr>
+          <w:color w:val="000000" w:themeColor="text1"/>
+        </w:rPr>
+        <w:t xml:space="preserve"> сервису с использованием библиотеки </w:t>
       </w:r>
       <w:proofErr w:type="spellStart"/>
       <w:r>
@@ -8871,35 +8923,17 @@
     </w:p>
     <w:p>
       <w:r>
-        <w:t xml:space="preserve">Для обеспечения возможности редактирования уже существующих </w:t>
-      </w:r>
-      <w:r>
-        <w:t xml:space="preserve">списков задач </w:t>
-      </w:r>
-      <w:r>
-        <w:t xml:space="preserve">реализован механизм формирования контекста текущего </w:t>
-      </w:r>
-      <w:r>
-        <w:t>списка</w:t>
-      </w:r>
-      <w:r>
-        <w:t xml:space="preserve">. При повторном обращении пользователя к AI сервису система передает информацию о текущей цели, описании и уже созданных задачах. Это позволяет </w:t>
+        <w:t xml:space="preserve">Для обеспечения возможности редактирования уже существующих списков задач реализован механизм формирования контекста текущего списка. При повторном обращении пользователя к </w:t>
+      </w:r>
+      <w:r>
+        <w:t>ИИ</w:t>
+      </w:r>
+      <w:r>
+        <w:t xml:space="preserve"> сервису система передает информацию о текущей цели, описании и уже созданных задачах. Это позволяет искусственному интеллекту учитывать существующую структуру и корректно </w:t>
       </w:r>
       <w:r>
         <w:lastRenderedPageBreak/>
-        <w:t>искусственному интеллекту учитывать существующую структуру</w:t>
-      </w:r>
-      <w:r>
-        <w:t xml:space="preserve"> </w:t>
-      </w:r>
-      <w:r>
-        <w:t>и корректно дополнять либо изменять её содержимое. На рисунке 2.</w:t>
-      </w:r>
-      <w:r>
-        <w:t>11</w:t>
-      </w:r>
-      <w:r>
-        <w:t xml:space="preserve"> представлен фрагмент формирования контекста.</w:t>
+        <w:t>дополнять либо изменять её содержимое. На рисунке 2.11 представлен фрагмент формирования контекста.</w:t>
       </w:r>
     </w:p>
     <w:p>
@@ -8910,6 +8944,7 @@
       </w:pPr>
       <w:r>
         <w:rPr>
+          <w:noProof/>
           <w:color w:val="000000" w:themeColor="text1"/>
         </w:rPr>
         <w:drawing>
@@ -8996,72 +9031,54 @@
         <w:rPr>
           <w:color w:val="000000" w:themeColor="text1"/>
         </w:rPr>
-        <w:t xml:space="preserve"> Формирование </w:t>
-      </w:r>
-      <w:r>
+        <w:t xml:space="preserve"> Формирование контекста списка задач</w:t>
+      </w:r>
+    </w:p>
+    <w:p>
+      <w:pPr>
         <w:rPr>
           <w:color w:val="000000" w:themeColor="text1"/>
         </w:rPr>
-        <w:t>контекста списка задач</w:t>
-      </w:r>
-    </w:p>
-    <w:p>
-      <w:pPr>
+      </w:pPr>
+      <w:r>
         <w:rPr>
           <w:color w:val="000000" w:themeColor="text1"/>
         </w:rPr>
-      </w:pPr>
+        <w:t xml:space="preserve">Сформированный контекст добавляется к системному </w:t>
+      </w:r>
       <w:r>
         <w:rPr>
           <w:color w:val="000000" w:themeColor="text1"/>
         </w:rPr>
-        <w:t xml:space="preserve">Сформированный контекст добавляется к системному </w:t>
+        <w:t>своду правил</w:t>
       </w:r>
       <w:r>
         <w:rPr>
           <w:color w:val="000000" w:themeColor="text1"/>
         </w:rPr>
-        <w:t>своду правил</w:t>
+        <w:t xml:space="preserve"> перед отправкой запроса. Благодаря этому система способна не только создавать новые </w:t>
       </w:r>
       <w:r>
         <w:rPr>
           <w:color w:val="000000" w:themeColor="text1"/>
         </w:rPr>
-        <w:t xml:space="preserve"> перед отправкой запроса. Благодаря этому система способна не только создавать новые </w:t>
+        <w:t>списки задач</w:t>
       </w:r>
       <w:r>
         <w:rPr>
           <w:color w:val="000000" w:themeColor="text1"/>
         </w:rPr>
-        <w:t>списки задач</w:t>
-      </w:r>
-      <w:r>
+        <w:t>, но и выполнять редактирование уже существующих без потери ранее сформированных задач.</w:t>
+      </w:r>
+    </w:p>
+    <w:p>
+      <w:pPr>
         <w:rPr>
           <w:color w:val="000000" w:themeColor="text1"/>
         </w:rPr>
-        <w:t>, но и выполнять редактирование уже существующих без потери ранее сформированных задач.</w:t>
-      </w:r>
-    </w:p>
-    <w:p>
-      <w:pPr>
-        <w:rPr>
-          <w:color w:val="000000" w:themeColor="text1"/>
-        </w:rPr>
-      </w:pPr>
-      <w:r>
-        <w:t xml:space="preserve">Важной частью серверной логики является механизм проверки доступа пользователя к дорожной карте. Перед выполнением операций редактирования, удаления или получения задач система проверяет существование </w:t>
-      </w:r>
-      <w:r>
-        <w:t>списка задач</w:t>
-      </w:r>
-      <w:r>
-        <w:t xml:space="preserve"> и принадлежность его текущему пользователю. На рисунке 2.</w:t>
-      </w:r>
-      <w:r>
-        <w:t>12</w:t>
-      </w:r>
-      <w:r>
-        <w:t xml:space="preserve"> представлен фрагмент процедуры проверки доступа.</w:t>
+      </w:pPr>
+      <w:r>
+        <w:t>Важной частью серверной логики является механизм проверки доступа пользователя к дорожной карте. Перед выполнением операций редактирования, удаления или получения задач система проверяет существование списка задач и принадлежность его текущему пользователю. На рисунке 2.12 представлен фрагмент процедуры проверки доступа.</w:t>
       </w:r>
     </w:p>
     <w:p>
@@ -9073,6 +9090,7 @@
       </w:pPr>
       <w:r>
         <w:rPr>
+          <w:noProof/>
           <w:lang w:eastAsia="ru-RU"/>
         </w:rPr>
         <w:drawing>
@@ -9159,13 +9177,7 @@
         <w:rPr>
           <w:color w:val="000000" w:themeColor="text1"/>
         </w:rPr>
-        <w:t xml:space="preserve"> </w:t>
-      </w:r>
-      <w:r>
-        <w:rPr>
-          <w:color w:val="000000" w:themeColor="text1"/>
-        </w:rPr>
-        <w:t>Проверка доступа пользователя к списку задач</w:t>
+        <w:t xml:space="preserve"> Проверка доступа пользователя к списку задач</w:t>
       </w:r>
     </w:p>
     <w:p>
@@ -9285,6 +9297,7 @@
       </w:pPr>
       <w:r>
         <w:rPr>
+          <w:noProof/>
           <w:lang w:eastAsia="ru-RU"/>
         </w:rPr>
         <w:drawing>
@@ -9371,13 +9384,7 @@
         <w:rPr>
           <w:color w:val="000000" w:themeColor="text1"/>
         </w:rPr>
-        <w:t xml:space="preserve"> </w:t>
-      </w:r>
-      <w:r>
-        <w:rPr>
-          <w:color w:val="000000" w:themeColor="text1"/>
-        </w:rPr>
-        <w:t>Фрагмент создания задачи</w:t>
+        <w:t xml:space="preserve"> Фрагмент создания задачи</w:t>
       </w:r>
     </w:p>
     <w:p>
@@ -9387,19 +9394,7 @@
     </w:p>
     <w:p>
       <w:r>
-        <w:t xml:space="preserve">Для отслеживания прогресса выполнения </w:t>
-      </w:r>
-      <w:r>
-        <w:t xml:space="preserve">списка задач </w:t>
-      </w:r>
-      <w:r>
-        <w:t>реализована процедура изменения статуса задачи. При изменении состояния система автоматически фиксирует дату и время завершения задачи. На рисунке 2.</w:t>
-      </w:r>
-      <w:r>
-        <w:t>14</w:t>
-      </w:r>
-      <w:r>
-        <w:t xml:space="preserve"> представлен фрагмент обновления статуса выполнения.</w:t>
+        <w:t>Для отслеживания прогресса выполнения списка задач реализована процедура изменения статуса задачи. При изменении состояния система автоматически фиксирует дату и время завершения задачи. На рисунке 2.14 представлен фрагмент обновления статуса выполнения.</w:t>
       </w:r>
     </w:p>
     <w:p>
@@ -9407,6 +9402,9 @@
         <w:jc w:val="center"/>
       </w:pPr>
       <w:r>
+        <w:rPr>
+          <w:noProof/>
+        </w:rPr>
         <w:lastRenderedPageBreak/>
         <w:drawing>
           <wp:inline distT="0" distB="0" distL="0" distR="0" wp14:anchorId="01584CC0" wp14:editId="338513BA">
@@ -9492,13 +9490,7 @@
         <w:rPr>
           <w:color w:val="000000" w:themeColor="text1"/>
         </w:rPr>
-        <w:t xml:space="preserve"> Фрагмент </w:t>
-      </w:r>
-      <w:r>
-        <w:rPr>
-          <w:color w:val="000000" w:themeColor="text1"/>
-        </w:rPr>
-        <w:t>обновления статуса выполнения</w:t>
+        <w:t xml:space="preserve"> Фрагмент обновления статуса выполнения</w:t>
       </w:r>
     </w:p>
     <w:p>
@@ -9558,13 +9550,7 @@
       </w:r>
       <w:proofErr w:type="spellEnd"/>
       <w:r>
-        <w:t>. Для каждого типа операции был реализован отдельный маршрут, обеспечивающий обработку HTTP-запросов и передачу данных между клиентом и сервером. На рисунке 2.</w:t>
-      </w:r>
-      <w:r>
-        <w:t xml:space="preserve">15 </w:t>
-      </w:r>
-      <w:r>
-        <w:t>представлен пример маршрута создания задачи.</w:t>
+        <w:t>. Для каждого типа операции был реализован отдельный маршрут, обеспечивающий обработку HTTP-запросов и передачу данных между клиентом и сервером. На рисунке 2.15 представлен пример маршрута создания задачи.</w:t>
       </w:r>
     </w:p>
     <w:p>
@@ -9579,6 +9565,7 @@
       <w:r>
         <w:rPr>
           <w:rFonts w:cs="Times New Roman"/>
+          <w:noProof/>
           <w:color w:val="000000" w:themeColor="text1"/>
           <w:szCs w:val="28"/>
         </w:rPr>
@@ -9666,13 +9653,7 @@
         <w:rPr>
           <w:color w:val="000000" w:themeColor="text1"/>
         </w:rPr>
-        <w:t xml:space="preserve"> </w:t>
-      </w:r>
-      <w:r>
-        <w:rPr>
-          <w:color w:val="000000" w:themeColor="text1"/>
-        </w:rPr>
-        <w:t>Маршрут создания задачи</w:t>
+        <w:t xml:space="preserve"> Маршрут создания задачи</w:t>
       </w:r>
     </w:p>
     <w:p>
@@ -9685,13 +9666,7 @@
       </w:r>
       <w:proofErr w:type="spellEnd"/>
       <w:r>
-        <w:t xml:space="preserve"> обеспечивают автоматическую валидацию входных данных</w:t>
-      </w:r>
-      <w:r>
-        <w:t xml:space="preserve"> через специальную схему данных</w:t>
-      </w:r>
-      <w:r>
-        <w:t>, обработку авторизации пользователя и вызов соответствующих сервисов бизнес-логики. Использование REST архитектуры позволило разделить клиентскую и серверную части приложения, упростить масштабирование системы и обеспечить возможность дальнейшей интеграции с внешними сервисами.</w:t>
+        <w:t xml:space="preserve"> обеспечивают автоматическую валидацию входных данных через специальную схему данных, обработку авторизации пользователя и вызов соответствующих сервисов бизнес-логики. Использование REST архитектуры позволило разделить клиентскую и серверную части приложения, упростить масштабирование системы и обеспечить возможность дальнейшей интеграции с внешними сервисами.</w:t>
       </w:r>
     </w:p>
     <w:p>
@@ -9706,24 +9681,260 @@
         <w:t>Рекомендации по эксплуатации продукта</w:t>
       </w:r>
     </w:p>
+    <w:p>
+      <w:r>
+        <w:t>Система предназначена для автоматизации процесса декомпозиции целей, использование системы упрощает процесс планирования, контроля выполнения задач и совместной работы над проектами.</w:t>
+      </w:r>
+    </w:p>
+    <w:p>
+      <w:r>
+        <w:t>При запуске веб-приложения</w:t>
+      </w:r>
+      <w:r>
+        <w:t xml:space="preserve"> открывается</w:t>
+      </w:r>
+      <w:r>
+        <w:t xml:space="preserve"> начальная страница</w:t>
+      </w:r>
+      <w:r>
+        <w:t>, представленная на рисунке 3.1.</w:t>
+      </w:r>
+      <w:r>
+        <w:t xml:space="preserve"> </w:t>
+      </w:r>
+    </w:p>
+    <w:p>
+      <w:r>
+        <w:rPr>
+          <w:noProof/>
+        </w:rPr>
+        <w:drawing>
+          <wp:inline distT="0" distB="0" distL="0" distR="0" wp14:anchorId="1987B07E" wp14:editId="3849DCCF">
+            <wp:extent cx="5628640" cy="2576891"/>
+            <wp:effectExtent l="0" t="0" r="0" b="0"/>
+            <wp:docPr id="162236297" name="Рисунок 162236297"/>
+            <wp:cNvGraphicFramePr>
+              <a:graphicFrameLocks xmlns:a="http://schemas.openxmlformats.org/drawingml/2006/main" noChangeAspect="1"/>
+            </wp:cNvGraphicFramePr>
+            <a:graphic xmlns:a="http://schemas.openxmlformats.org/drawingml/2006/main">
+              <a:graphicData uri="http://schemas.openxmlformats.org/drawingml/2006/picture">
+                <pic:pic xmlns:pic="http://schemas.openxmlformats.org/drawingml/2006/picture">
+                  <pic:nvPicPr>
+                    <pic:cNvPr id="1" name=""/>
+                    <pic:cNvPicPr/>
+                  </pic:nvPicPr>
+                  <pic:blipFill>
+                    <a:blip r:embed="rId35"/>
+                    <a:stretch>
+                      <a:fillRect/>
+                    </a:stretch>
+                  </pic:blipFill>
+                  <pic:spPr>
+                    <a:xfrm>
+                      <a:off x="0" y="0"/>
+                      <a:ext cx="5632941" cy="2578860"/>
+                    </a:xfrm>
+                    <a:prstGeom prst="rect">
+                      <a:avLst/>
+                    </a:prstGeom>
+                  </pic:spPr>
+                </pic:pic>
+              </a:graphicData>
+            </a:graphic>
+          </wp:inline>
+        </w:drawing>
+      </w:r>
+    </w:p>
+    <w:p>
+      <w:pPr>
+        <w:jc w:val="center"/>
+      </w:pPr>
+      <w:r>
+        <w:t xml:space="preserve">Рисунок 3.1 – </w:t>
+      </w:r>
+      <w:r>
+        <w:t xml:space="preserve">Начальная страница </w:t>
+      </w:r>
+    </w:p>
+    <w:p>
+      <w:r>
+        <w:t>Начальная страница предназначена для перехода к</w:t>
+      </w:r>
+      <w:r>
+        <w:t xml:space="preserve"> </w:t>
+      </w:r>
+      <w:r>
+        <w:t>формам системы: регистрации новой учетной записи и аутентификации существующего пользователя. Для нового пользователя требуется перейти на экран регистрации с помощью кнопки «Начать». При последующих посещениях веб-приложения, если пользователь не прошел аутентификацию ранее, необходимо перейти на страницу авторизации</w:t>
+      </w:r>
+      <w:r>
+        <w:t xml:space="preserve"> по кнопке «Вход»</w:t>
+      </w:r>
+      <w:r>
+        <w:t xml:space="preserve"> и выполнить вход в систему с использованием существующей учетной записи.</w:t>
+      </w:r>
+    </w:p>
+    <w:p>
+      <w:r>
+        <w:t>При нажатии кнопки «Начать» выполняется переход на страницу регистрации пользователя, представленную на рисунке 3.2.</w:t>
+      </w:r>
+    </w:p>
     <w:p/>
-    <w:p>
-      <w:pPr>
-        <w:rPr>
-          <w:color w:val="000000" w:themeColor="text1"/>
-        </w:rPr>
-      </w:pPr>
-    </w:p>
+    <w:p/>
+    <w:p/>
+    <w:p/>
     <w:p>
       <w:pPr>
         <w:jc w:val="center"/>
+      </w:pPr>
+      <w:r>
+        <w:rPr>
+          <w:noProof/>
+        </w:rPr>
+        <w:lastRenderedPageBreak/>
+        <w:drawing>
+          <wp:inline distT="0" distB="0" distL="0" distR="0" wp14:anchorId="7CBEFBD4" wp14:editId="14B82192">
+            <wp:extent cx="2412538" cy="4857750"/>
+            <wp:effectExtent l="0" t="0" r="6985" b="0"/>
+            <wp:docPr id="162236298" name="Рисунок 162236298"/>
+            <wp:cNvGraphicFramePr>
+              <a:graphicFrameLocks xmlns:a="http://schemas.openxmlformats.org/drawingml/2006/main" noChangeAspect="1"/>
+            </wp:cNvGraphicFramePr>
+            <a:graphic xmlns:a="http://schemas.openxmlformats.org/drawingml/2006/main">
+              <a:graphicData uri="http://schemas.openxmlformats.org/drawingml/2006/picture">
+                <pic:pic xmlns:pic="http://schemas.openxmlformats.org/drawingml/2006/picture">
+                  <pic:nvPicPr>
+                    <pic:cNvPr id="1" name=""/>
+                    <pic:cNvPicPr/>
+                  </pic:nvPicPr>
+                  <pic:blipFill>
+                    <a:blip r:embed="rId36"/>
+                    <a:stretch>
+                      <a:fillRect/>
+                    </a:stretch>
+                  </pic:blipFill>
+                  <pic:spPr>
+                    <a:xfrm>
+                      <a:off x="0" y="0"/>
+                      <a:ext cx="2432153" cy="4897246"/>
+                    </a:xfrm>
+                    <a:prstGeom prst="rect">
+                      <a:avLst/>
+                    </a:prstGeom>
+                  </pic:spPr>
+                </pic:pic>
+              </a:graphicData>
+            </a:graphic>
+          </wp:inline>
+        </w:drawing>
+      </w:r>
+    </w:p>
+    <w:p>
+      <w:pPr>
+        <w:jc w:val="center"/>
+      </w:pPr>
+      <w:r>
+        <w:t>Рисунок 3.</w:t>
+      </w:r>
+      <w:r>
+        <w:t>2</w:t>
+      </w:r>
+      <w:r>
+        <w:t xml:space="preserve"> –</w:t>
+      </w:r>
+      <w:r>
+        <w:t xml:space="preserve"> Страница для регистрации пользователей</w:t>
+      </w:r>
+    </w:p>
+    <w:p>
+      <w:r>
+        <w:t>На странице регистрации пользователю необходимо заполнить обязательные поля учетной записи, включающие логин, имя, фамилию, адрес электронной почты и пароль. После заполнения данных требуется нажать кнопку «Создать аккаунт». В случае успешной регистрации будет выполнен автоматический переход к основному интерфейсу системы.</w:t>
+      </w:r>
+    </w:p>
+    <w:p>
+      <w:r>
+        <w:t>Для пользователей, уже имеющих учетную запись, в нижней части страницы предусмотрена кнопка «Войти», позволяющая перейти к форме авторизации пользователя.</w:t>
+      </w:r>
+    </w:p>
+    <w:p/>
+    <w:p/>
+    <w:p/>
+    <w:p/>
+    <w:p>
+      <w:pPr>
+        <w:pStyle w:val="1"/>
+      </w:pPr>
+      <w:r>
+        <w:lastRenderedPageBreak/>
+        <w:t xml:space="preserve">4 Тестирование программного продукта </w:t>
+      </w:r>
+    </w:p>
+    <w:p>
+      <w:pPr>
+        <w:pStyle w:val="2"/>
+      </w:pPr>
+      <w:r>
+        <w:t xml:space="preserve">4.1 Выбор стратегии тестирования </w:t>
+      </w:r>
+    </w:p>
+    <w:p>
+      <w:r>
+        <w:t>Для проверки работоспособности веб-приложения была выбрана стратегия функционального тестирования методом черного ящика. Данный подход основан на проверке работы системы без анализа внутренней структуры программного кода. Тестирование выполнялось с точки зрения конечного пользователя путем проверки корректности работы интерфейса, обработки пользовательских действий и соответствия получаемых результатов ожидаемому поведению системы.</w:t>
+      </w:r>
+    </w:p>
+    <w:p>
+      <w:r>
+        <w:t xml:space="preserve">Использование данного метода позволило оценить стабильность работы основных компонентов приложения, включая систему аутентификации пользователей, механизм генерации </w:t>
+      </w:r>
+      <w:r>
+        <w:t>списков задач</w:t>
+      </w:r>
+      <w:r>
+        <w:t>, управление задачами, командное взаимодействие и обмен сообщениями в режиме реального времени. Основное внимание уделялось корректности обработки входных данных, отображению информации в интерфейсе и устойчивости системы при различных пользовательских сценариях.</w:t>
+      </w:r>
+    </w:p>
+    <w:p>
+      <w:r>
+        <w:t>Процесс тестирования включал выполнение последовательности действий пользователя внутри системы: регистрацию учетной записи, авторизацию, создание целей, генерацию задач с использованием искусственного интеллекта, редактирование информации, создание команд, назначение задач участникам и работу встроенного чата. Для каждого сценария анализировалась корректность выполнения операций и соответствие результатов функциональным требованиям проекта.</w:t>
+      </w:r>
+    </w:p>
+    <w:p>
+      <w:r>
+        <w:t>Дополнительно выполнялась проверка обработки некорректных данных, включая ввод пустых полей, неверных учетных данных, повторяющихся адресов электронной почты. Это позволило проверить корректность работы механизмов валидации данных и обработки ошибок.</w:t>
+      </w:r>
+    </w:p>
+    <w:p>
+      <w:r>
+        <w:lastRenderedPageBreak/>
+        <w:t>Результаты тестирования показали, что реализованная система корректно выполняет основные функции, обеспечивает стабильное взаимодействие клиентской и серверной частей, а также поддерживает работу механизмов авторизации, декомпозиции целей и командного взаимодействия. Проведенное тестирование подтвердило соответствие функциональных возможностей веб-приложения поставленным требованиям и готовность системы к дальнейшей эксплуатации.</w:t>
+      </w:r>
+    </w:p>
+    <w:p/>
+    <w:p/>
+    <w:p/>
+    <w:p/>
+    <w:p/>
+    <w:p/>
+    <w:p/>
+    <w:p/>
+    <w:p/>
+    <w:p/>
+    <w:p>
+      <w:pPr>
+        <w:jc w:val="center"/>
         <w:rPr>
           <w:lang w:eastAsia="ru-RU"/>
         </w:rPr>
       </w:pPr>
     </w:p>
+    <w:p>
+      <w:pPr>
+        <w:rPr>
+          <w:lang w:eastAsia="ru-RU"/>
+        </w:rPr>
+      </w:pPr>
+    </w:p>
     <w:sectPr>
-      <w:headerReference w:type="default" r:id="rId35"/>
+      <w:headerReference w:type="default" r:id="rId37"/>
       <w:pgSz w:w="11906" w:h="16838"/>
       <w:pgMar w:top="992" w:right="709" w:bottom="1843" w:left="1418" w:header="0" w:footer="567" w:gutter="0"/>
       <w:cols w:space="708"/>
@@ -10015,7 +10226,23 @@
                                       <w:sz w:val="32"/>
                                       <w:szCs w:val="28"/>
                                     </w:rPr>
-                                    <w:t>НАТКиГ.20</w:t>
+                                    <w:t>НАТКиГ.</w:t>
+                                  </w:r>
+                                  <w:r>
+                                    <w:rPr>
+                                      <w:rFonts w:cs="Times New Roman"/>
+                                      <w:sz w:val="32"/>
+                                      <w:szCs w:val="28"/>
+                                    </w:rPr>
+                                    <w:t>1</w:t>
+                                  </w:r>
+                                  <w:r>
+                                    <w:rPr>
+                                      <w:rFonts w:cs="Times New Roman"/>
+                                      <w:sz w:val="32"/>
+                                      <w:szCs w:val="28"/>
+                                    </w:rPr>
+                                    <w:t>0</w:t>
                                   </w:r>
                                   <w:r>
                                     <w:rPr>
@@ -11755,7 +11982,23 @@
                                 <w:sz w:val="32"/>
                                 <w:szCs w:val="28"/>
                               </w:rPr>
-                              <w:t>НАТКиГ.20</w:t>
+                              <w:t>НАТКиГ.</w:t>
+                            </w:r>
+                            <w:r>
+                              <w:rPr>
+                                <w:rFonts w:cs="Times New Roman"/>
+                                <w:sz w:val="32"/>
+                                <w:szCs w:val="28"/>
+                              </w:rPr>
+                              <w:t>1</w:t>
+                            </w:r>
+                            <w:r>
+                              <w:rPr>
+                                <w:rFonts w:cs="Times New Roman"/>
+                                <w:sz w:val="32"/>
+                                <w:szCs w:val="28"/>
+                              </w:rPr>
+                              <w:t>0</w:t>
                             </w:r>
                             <w:r>
                               <w:rPr>
@@ -13742,7 +13985,17 @@
                                       <w:szCs w:val="32"/>
                                       <w:lang w:val="ru-RU"/>
                                     </w:rPr>
-                                    <w:t>20</w:t>
+                                    <w:t>1</w:t>
+                                  </w:r>
+                                  <w:r>
+                                    <w:rPr>
+                                      <w:rFonts w:ascii="Times New Roman" w:hAnsi="Times New Roman" w:cs="Times New Roman"/>
+                                      <w:i w:val="0"/>
+                                      <w:sz w:val="32"/>
+                                      <w:szCs w:val="32"/>
+                                      <w:lang w:val="ru-RU"/>
+                                    </w:rPr>
+                                    <w:t>0</w:t>
                                   </w:r>
                                   <w:r>
                                     <w:rPr>
@@ -14443,7 +14696,17 @@
                                 <w:szCs w:val="32"/>
                                 <w:lang w:val="ru-RU"/>
                               </w:rPr>
-                              <w:t>20</w:t>
+                              <w:t>1</w:t>
+                            </w:r>
+                            <w:r>
+                              <w:rPr>
+                                <w:rFonts w:ascii="Times New Roman" w:hAnsi="Times New Roman" w:cs="Times New Roman"/>
+                                <w:i w:val="0"/>
+                                <w:sz w:val="32"/>
+                                <w:szCs w:val="32"/>
+                                <w:lang w:val="ru-RU"/>
+                              </w:rPr>
+                              <w:t>0</w:t>
                             </w:r>
                             <w:r>
                               <w:rPr>
@@ -14939,6 +15202,120 @@
 <file path=word/numbering.xml><?xml version="1.0" encoding="utf-8"?>
 <w:numbering xmlns:wpc="http://schemas.microsoft.com/office/word/2010/wordprocessingCanvas" xmlns:cx="http://schemas.microsoft.com/office/drawing/2014/chartex" xmlns:cx1="http://schemas.microsoft.com/office/drawing/2015/9/8/chartex" xmlns:cx2="http://schemas.microsoft.com/office/drawing/2015/10/21/chartex" xmlns:cx3="http://schemas.microsoft.com/office/drawing/2016/5/9/chartex" xmlns:cx4="http://schemas.microsoft.com/office/drawing/2016/5/10/chartex" xmlns:cx5="http://schemas.microsoft.com/office/drawing/2016/5/11/chartex" xmlns:cx6="http://schemas.microsoft.com/office/drawing/2016/5/12/chartex" xmlns:cx7="http://schemas.microsoft.com/office/drawing/2016/5/13/chartex" xmlns:cx8="http://schemas.microsoft.com/office/drawing/2016/5/14/chartex" xmlns:mc="http://schemas.openxmlformats.org/markup-compatibility/2006" xmlns:aink="http://schemas.microsoft.com/office/drawing/2016/ink" xmlns:am3d="http://schemas.microsoft.com/office/drawing/2017/model3d" xmlns:o="urn:schemas-microsoft-com:office:office" xmlns:r="http://schemas.openxmlformats.org/officeDocument/2006/relationships" xmlns:m="http://schemas.openxmlformats.org/officeDocument/2006/math" xmlns:v="urn:schemas-microsoft-com:vml" xmlns:wp14="http://schemas.microsoft.com/office/word/2010/wordprocessingDrawing" xmlns:wp="http://schemas.openxmlformats.org/drawingml/2006/wordprocessingDrawing" xmlns:w10="urn:schemas-microsoft-com:office:word" xmlns:w="http://schemas.openxmlformats.org/wordprocessingml/2006/main" xmlns:w14="http://schemas.microsoft.com/office/word/2010/wordml" xmlns:w15="http://schemas.microsoft.com/office/word/2012/wordml" xmlns:w16cex="http://schemas.microsoft.com/office/word/2018/wordml/cex" xmlns:w16cid="http://schemas.microsoft.com/office/word/2016/wordml/cid" xmlns:w16="http://schemas.microsoft.com/office/word/2018/wordml" xmlns:w16sdtdh="http://schemas.microsoft.com/office/word/2020/wordml/sdtdatahash" xmlns:w16se="http://schemas.microsoft.com/office/word/2015/wordml/symex" xmlns:wpg="http://schemas.microsoft.com/office/word/2010/wordprocessingGroup" xmlns:wpi="http://schemas.microsoft.com/office/word/2010/wordprocessingInk" xmlns:wne="http://schemas.microsoft.com/office/word/2006/wordml" xmlns:wps="http://schemas.microsoft.com/office/word/2010/wordprocessingShape" mc:Ignorable="w14 w15 w16se w16cid w16 w16cex w16sdtdh wp14">
   <w:abstractNum w:abstractNumId="0" w15:restartNumberingAfterBreak="0">
+    <w:nsid w:val="009F76EB"/>
+    <w:multiLevelType w:val="hybridMultilevel"/>
+    <w:tmpl w:val="E8964E6E"/>
+    <w:lvl w:ilvl="0" w:tplc="C52253B6">
+      <w:start w:val="1"/>
+      <w:numFmt w:val="bullet"/>
+      <w:suff w:val="space"/>
+      <w:lvlText w:val=""/>
+      <w:lvlJc w:val="left"/>
+      <w:pPr>
+        <w:ind w:left="1429" w:hanging="360"/>
+      </w:pPr>
+      <w:rPr>
+        <w:rFonts w:ascii="Symbol" w:hAnsi="Symbol" w:hint="default"/>
+      </w:rPr>
+    </w:lvl>
+    <w:lvl w:ilvl="1" w:tplc="04190003" w:tentative="1">
+      <w:start w:val="1"/>
+      <w:numFmt w:val="bullet"/>
+      <w:lvlText w:val="o"/>
+      <w:lvlJc w:val="left"/>
+      <w:pPr>
+        <w:ind w:left="2149" w:hanging="360"/>
+      </w:pPr>
+      <w:rPr>
+        <w:rFonts w:ascii="Courier New" w:hAnsi="Courier New" w:cs="Courier New" w:hint="default"/>
+      </w:rPr>
+    </w:lvl>
+    <w:lvl w:ilvl="2" w:tplc="04190005" w:tentative="1">
+      <w:start w:val="1"/>
+      <w:numFmt w:val="bullet"/>
+      <w:lvlText w:val=""/>
+      <w:lvlJc w:val="left"/>
+      <w:pPr>
+        <w:ind w:left="2869" w:hanging="360"/>
+      </w:pPr>
+      <w:rPr>
+        <w:rFonts w:ascii="Wingdings" w:hAnsi="Wingdings" w:hint="default"/>
+      </w:rPr>
+    </w:lvl>
+    <w:lvl w:ilvl="3" w:tplc="04190001" w:tentative="1">
+      <w:start w:val="1"/>
+      <w:numFmt w:val="bullet"/>
+      <w:lvlText w:val=""/>
+      <w:lvlJc w:val="left"/>
+      <w:pPr>
+        <w:ind w:left="3589" w:hanging="360"/>
+      </w:pPr>
+      <w:rPr>
+        <w:rFonts w:ascii="Symbol" w:hAnsi="Symbol" w:hint="default"/>
+      </w:rPr>
+    </w:lvl>
+    <w:lvl w:ilvl="4" w:tplc="04190003" w:tentative="1">
+      <w:start w:val="1"/>
+      <w:numFmt w:val="bullet"/>
+      <w:lvlText w:val="o"/>
+      <w:lvlJc w:val="left"/>
+      <w:pPr>
+        <w:ind w:left="4309" w:hanging="360"/>
+      </w:pPr>
+      <w:rPr>
+        <w:rFonts w:ascii="Courier New" w:hAnsi="Courier New" w:cs="Courier New" w:hint="default"/>
+      </w:rPr>
+    </w:lvl>
+    <w:lvl w:ilvl="5" w:tplc="04190005" w:tentative="1">
+      <w:start w:val="1"/>
+      <w:numFmt w:val="bullet"/>
+      <w:lvlText w:val=""/>
+      <w:lvlJc w:val="left"/>
+      <w:pPr>
+        <w:ind w:left="5029" w:hanging="360"/>
+      </w:pPr>
+      <w:rPr>
+        <w:rFonts w:ascii="Wingdings" w:hAnsi="Wingdings" w:hint="default"/>
+      </w:rPr>
+    </w:lvl>
+    <w:lvl w:ilvl="6" w:tplc="04190001" w:tentative="1">
+      <w:start w:val="1"/>
+      <w:numFmt w:val="bullet"/>
+      <w:lvlText w:val=""/>
+      <w:lvlJc w:val="left"/>
+      <w:pPr>
+        <w:ind w:left="5749" w:hanging="360"/>
+      </w:pPr>
+      <w:rPr>
+        <w:rFonts w:ascii="Symbol" w:hAnsi="Symbol" w:hint="default"/>
+      </w:rPr>
+    </w:lvl>
+    <w:lvl w:ilvl="7" w:tplc="04190003" w:tentative="1">
+      <w:start w:val="1"/>
+      <w:numFmt w:val="bullet"/>
+      <w:lvlText w:val="o"/>
+      <w:lvlJc w:val="left"/>
+      <w:pPr>
+        <w:ind w:left="6469" w:hanging="360"/>
+      </w:pPr>
+      <w:rPr>
+        <w:rFonts w:ascii="Courier New" w:hAnsi="Courier New" w:cs="Courier New" w:hint="default"/>
+      </w:rPr>
+    </w:lvl>
+    <w:lvl w:ilvl="8" w:tplc="04190005" w:tentative="1">
+      <w:start w:val="1"/>
+      <w:numFmt w:val="bullet"/>
+      <w:lvlText w:val=""/>
+      <w:lvlJc w:val="left"/>
+      <w:pPr>
+        <w:ind w:left="7189" w:hanging="360"/>
+      </w:pPr>
+      <w:rPr>
+        <w:rFonts w:ascii="Wingdings" w:hAnsi="Wingdings" w:hint="default"/>
+      </w:rPr>
+    </w:lvl>
+  </w:abstractNum>
+  <w:abstractNum w:abstractNumId="1" w15:restartNumberingAfterBreak="0">
     <w:nsid w:val="03F16C25"/>
     <w:multiLevelType w:val="hybridMultilevel"/>
     <w:tmpl w:val="447CD720"/>
@@ -15052,7 +15429,7 @@
       </w:rPr>
     </w:lvl>
   </w:abstractNum>
-  <w:abstractNum w:abstractNumId="1" w15:restartNumberingAfterBreak="0">
+  <w:abstractNum w:abstractNumId="2" w15:restartNumberingAfterBreak="0">
     <w:nsid w:val="06F33CB4"/>
     <w:multiLevelType w:val="hybridMultilevel"/>
     <w:tmpl w:val="D910C774"/>
@@ -15165,7 +15542,7 @@
       </w:rPr>
     </w:lvl>
   </w:abstractNum>
-  <w:abstractNum w:abstractNumId="2" w15:restartNumberingAfterBreak="0">
+  <w:abstractNum w:abstractNumId="3" w15:restartNumberingAfterBreak="0">
     <w:nsid w:val="0CE85AD4"/>
     <w:multiLevelType w:val="hybridMultilevel"/>
     <w:tmpl w:val="7772AFD2"/>
@@ -15279,7 +15656,7 @@
       </w:rPr>
     </w:lvl>
   </w:abstractNum>
-  <w:abstractNum w:abstractNumId="3" w15:restartNumberingAfterBreak="0">
+  <w:abstractNum w:abstractNumId="4" w15:restartNumberingAfterBreak="0">
     <w:nsid w:val="234367D1"/>
     <w:multiLevelType w:val="hybridMultilevel"/>
     <w:tmpl w:val="0164C88A"/>
@@ -15392,7 +15769,7 @@
       </w:rPr>
     </w:lvl>
   </w:abstractNum>
-  <w:abstractNum w:abstractNumId="4" w15:restartNumberingAfterBreak="0">
+  <w:abstractNum w:abstractNumId="5" w15:restartNumberingAfterBreak="0">
     <w:nsid w:val="2A833014"/>
     <w:multiLevelType w:val="hybridMultilevel"/>
     <w:tmpl w:val="517455A2"/>
@@ -15506,7 +15883,7 @@
       </w:rPr>
     </w:lvl>
   </w:abstractNum>
-  <w:abstractNum w:abstractNumId="5" w15:restartNumberingAfterBreak="0">
+  <w:abstractNum w:abstractNumId="6" w15:restartNumberingAfterBreak="0">
     <w:nsid w:val="2BC30158"/>
     <w:multiLevelType w:val="hybridMultilevel"/>
     <w:tmpl w:val="71D0D208"/>
@@ -15620,7 +15997,7 @@
       </w:rPr>
     </w:lvl>
   </w:abstractNum>
-  <w:abstractNum w:abstractNumId="6" w15:restartNumberingAfterBreak="0">
+  <w:abstractNum w:abstractNumId="7" w15:restartNumberingAfterBreak="0">
     <w:nsid w:val="4236506B"/>
     <w:multiLevelType w:val="hybridMultilevel"/>
     <w:tmpl w:val="B632188C"/>
@@ -15733,7 +16110,121 @@
       </w:rPr>
     </w:lvl>
   </w:abstractNum>
-  <w:abstractNum w:abstractNumId="7" w15:restartNumberingAfterBreak="0">
+  <w:abstractNum w:abstractNumId="8" w15:restartNumberingAfterBreak="0">
+    <w:nsid w:val="4E792DB3"/>
+    <w:multiLevelType w:val="hybridMultilevel"/>
+    <w:tmpl w:val="ECBEF210"/>
+    <w:lvl w:ilvl="0" w:tplc="B5D2BC98">
+      <w:start w:val="1"/>
+      <w:numFmt w:val="bullet"/>
+      <w:suff w:val="space"/>
+      <w:lvlText w:val=""/>
+      <w:lvlJc w:val="left"/>
+      <w:pPr>
+        <w:ind w:left="1429" w:hanging="360"/>
+      </w:pPr>
+      <w:rPr>
+        <w:rFonts w:ascii="Symbol" w:hAnsi="Symbol" w:hint="default"/>
+      </w:rPr>
+    </w:lvl>
+    <w:lvl w:ilvl="1" w:tplc="04190003" w:tentative="1">
+      <w:start w:val="1"/>
+      <w:numFmt w:val="bullet"/>
+      <w:lvlText w:val="o"/>
+      <w:lvlJc w:val="left"/>
+      <w:pPr>
+        <w:ind w:left="2149" w:hanging="360"/>
+      </w:pPr>
+      <w:rPr>
+        <w:rFonts w:ascii="Courier New" w:hAnsi="Courier New" w:cs="Courier New" w:hint="default"/>
+      </w:rPr>
+    </w:lvl>
+    <w:lvl w:ilvl="2" w:tplc="04190005" w:tentative="1">
+      <w:start w:val="1"/>
+      <w:numFmt w:val="bullet"/>
+      <w:lvlText w:val=""/>
+      <w:lvlJc w:val="left"/>
+      <w:pPr>
+        <w:ind w:left="2869" w:hanging="360"/>
+      </w:pPr>
+      <w:rPr>
+        <w:rFonts w:ascii="Wingdings" w:hAnsi="Wingdings" w:hint="default"/>
+      </w:rPr>
+    </w:lvl>
+    <w:lvl w:ilvl="3" w:tplc="04190001" w:tentative="1">
+      <w:start w:val="1"/>
+      <w:numFmt w:val="bullet"/>
+      <w:lvlText w:val=""/>
+      <w:lvlJc w:val="left"/>
+      <w:pPr>
+        <w:ind w:left="3589" w:hanging="360"/>
+      </w:pPr>
+      <w:rPr>
+        <w:rFonts w:ascii="Symbol" w:hAnsi="Symbol" w:hint="default"/>
+      </w:rPr>
+    </w:lvl>
+    <w:lvl w:ilvl="4" w:tplc="04190003" w:tentative="1">
+      <w:start w:val="1"/>
+      <w:numFmt w:val="bullet"/>
+      <w:lvlText w:val="o"/>
+      <w:lvlJc w:val="left"/>
+      <w:pPr>
+        <w:ind w:left="4309" w:hanging="360"/>
+      </w:pPr>
+      <w:rPr>
+        <w:rFonts w:ascii="Courier New" w:hAnsi="Courier New" w:cs="Courier New" w:hint="default"/>
+      </w:rPr>
+    </w:lvl>
+    <w:lvl w:ilvl="5" w:tplc="04190005" w:tentative="1">
+      <w:start w:val="1"/>
+      <w:numFmt w:val="bullet"/>
+      <w:lvlText w:val=""/>
+      <w:lvlJc w:val="left"/>
+      <w:pPr>
+        <w:ind w:left="5029" w:hanging="360"/>
+      </w:pPr>
+      <w:rPr>
+        <w:rFonts w:ascii="Wingdings" w:hAnsi="Wingdings" w:hint="default"/>
+      </w:rPr>
+    </w:lvl>
+    <w:lvl w:ilvl="6" w:tplc="04190001" w:tentative="1">
+      <w:start w:val="1"/>
+      <w:numFmt w:val="bullet"/>
+      <w:lvlText w:val=""/>
+      <w:lvlJc w:val="left"/>
+      <w:pPr>
+        <w:ind w:left="5749" w:hanging="360"/>
+      </w:pPr>
+      <w:rPr>
+        <w:rFonts w:ascii="Symbol" w:hAnsi="Symbol" w:hint="default"/>
+      </w:rPr>
+    </w:lvl>
+    <w:lvl w:ilvl="7" w:tplc="04190003" w:tentative="1">
+      <w:start w:val="1"/>
+      <w:numFmt w:val="bullet"/>
+      <w:lvlText w:val="o"/>
+      <w:lvlJc w:val="left"/>
+      <w:pPr>
+        <w:ind w:left="6469" w:hanging="360"/>
+      </w:pPr>
+      <w:rPr>
+        <w:rFonts w:ascii="Courier New" w:hAnsi="Courier New" w:cs="Courier New" w:hint="default"/>
+      </w:rPr>
+    </w:lvl>
+    <w:lvl w:ilvl="8" w:tplc="04190005" w:tentative="1">
+      <w:start w:val="1"/>
+      <w:numFmt w:val="bullet"/>
+      <w:lvlText w:val=""/>
+      <w:lvlJc w:val="left"/>
+      <w:pPr>
+        <w:ind w:left="7189" w:hanging="360"/>
+      </w:pPr>
+      <w:rPr>
+        <w:rFonts w:ascii="Wingdings" w:hAnsi="Wingdings" w:hint="default"/>
+      </w:rPr>
+    </w:lvl>
+  </w:abstractNum>
+  <w:abstractNum w:abstractNumId="9" w15:restartNumberingAfterBreak="0">
     <w:nsid w:val="5AD2032B"/>
     <w:multiLevelType w:val="hybridMultilevel"/>
     <w:tmpl w:val="502C1680"/>
@@ -15847,7 +16338,7 @@
       </w:rPr>
     </w:lvl>
   </w:abstractNum>
-  <w:abstractNum w:abstractNumId="8" w15:restartNumberingAfterBreak="0">
+  <w:abstractNum w:abstractNumId="10" w15:restartNumberingAfterBreak="0">
     <w:nsid w:val="5E9D081E"/>
     <w:multiLevelType w:val="multilevel"/>
     <w:tmpl w:val="31FAC168"/>
@@ -15939,7 +16430,7 @@
       </w:pPr>
     </w:lvl>
   </w:abstractNum>
-  <w:abstractNum w:abstractNumId="9" w15:restartNumberingAfterBreak="0">
+  <w:abstractNum w:abstractNumId="11" w15:restartNumberingAfterBreak="0">
     <w:nsid w:val="67EC04CD"/>
     <w:multiLevelType w:val="hybridMultilevel"/>
     <w:tmpl w:val="B5DA1F26"/>
@@ -16052,7 +16543,7 @@
       </w:rPr>
     </w:lvl>
   </w:abstractNum>
-  <w:abstractNum w:abstractNumId="10" w15:restartNumberingAfterBreak="0">
+  <w:abstractNum w:abstractNumId="12" w15:restartNumberingAfterBreak="0">
     <w:nsid w:val="6AB437FC"/>
     <w:multiLevelType w:val="hybridMultilevel"/>
     <w:tmpl w:val="D8FE15E4"/>
@@ -16166,7 +16657,7 @@
       </w:rPr>
     </w:lvl>
   </w:abstractNum>
-  <w:abstractNum w:abstractNumId="11" w15:restartNumberingAfterBreak="0">
+  <w:abstractNum w:abstractNumId="13" w15:restartNumberingAfterBreak="0">
     <w:nsid w:val="77F84960"/>
     <w:multiLevelType w:val="hybridMultilevel"/>
     <w:tmpl w:val="6DF4AF4C"/>
@@ -16280,10 +16771,10 @@
       </w:rPr>
     </w:lvl>
   </w:abstractNum>
-  <w:abstractNum w:abstractNumId="12" w15:restartNumberingAfterBreak="0">
-    <w:nsid w:val="7E794327"/>
+  <w:abstractNum w:abstractNumId="14" w15:restartNumberingAfterBreak="0">
+    <w:nsid w:val="7D8A7628"/>
     <w:multiLevelType w:val="hybridMultilevel"/>
-    <w:tmpl w:val="BFF0D868"/>
+    <w:tmpl w:val="4FE8CB7A"/>
     <w:lvl w:ilvl="0" w:tplc="AC1C3610">
       <w:start w:val="1"/>
       <w:numFmt w:val="bullet"/>
@@ -16393,44 +16884,282 @@
       </w:rPr>
     </w:lvl>
   </w:abstractNum>
+  <w:abstractNum w:abstractNumId="15" w15:restartNumberingAfterBreak="0">
+    <w:nsid w:val="7DE75B9C"/>
+    <w:multiLevelType w:val="hybridMultilevel"/>
+    <w:tmpl w:val="72408CC0"/>
+    <w:lvl w:ilvl="0" w:tplc="AC1C3610">
+      <w:start w:val="1"/>
+      <w:numFmt w:val="bullet"/>
+      <w:lvlText w:val=""/>
+      <w:lvlJc w:val="left"/>
+      <w:pPr>
+        <w:ind w:left="1429" w:hanging="360"/>
+      </w:pPr>
+      <w:rPr>
+        <w:rFonts w:ascii="Symbol" w:hAnsi="Symbol" w:hint="default"/>
+      </w:rPr>
+    </w:lvl>
+    <w:lvl w:ilvl="1" w:tplc="04190003" w:tentative="1">
+      <w:start w:val="1"/>
+      <w:numFmt w:val="bullet"/>
+      <w:lvlText w:val="o"/>
+      <w:lvlJc w:val="left"/>
+      <w:pPr>
+        <w:ind w:left="2149" w:hanging="360"/>
+      </w:pPr>
+      <w:rPr>
+        <w:rFonts w:ascii="Courier New" w:hAnsi="Courier New" w:cs="Courier New" w:hint="default"/>
+      </w:rPr>
+    </w:lvl>
+    <w:lvl w:ilvl="2" w:tplc="04190005" w:tentative="1">
+      <w:start w:val="1"/>
+      <w:numFmt w:val="bullet"/>
+      <w:lvlText w:val=""/>
+      <w:lvlJc w:val="left"/>
+      <w:pPr>
+        <w:ind w:left="2869" w:hanging="360"/>
+      </w:pPr>
+      <w:rPr>
+        <w:rFonts w:ascii="Wingdings" w:hAnsi="Wingdings" w:hint="default"/>
+      </w:rPr>
+    </w:lvl>
+    <w:lvl w:ilvl="3" w:tplc="04190001" w:tentative="1">
+      <w:start w:val="1"/>
+      <w:numFmt w:val="bullet"/>
+      <w:lvlText w:val=""/>
+      <w:lvlJc w:val="left"/>
+      <w:pPr>
+        <w:ind w:left="3589" w:hanging="360"/>
+      </w:pPr>
+      <w:rPr>
+        <w:rFonts w:ascii="Symbol" w:hAnsi="Symbol" w:hint="default"/>
+      </w:rPr>
+    </w:lvl>
+    <w:lvl w:ilvl="4" w:tplc="04190003" w:tentative="1">
+      <w:start w:val="1"/>
+      <w:numFmt w:val="bullet"/>
+      <w:lvlText w:val="o"/>
+      <w:lvlJc w:val="left"/>
+      <w:pPr>
+        <w:ind w:left="4309" w:hanging="360"/>
+      </w:pPr>
+      <w:rPr>
+        <w:rFonts w:ascii="Courier New" w:hAnsi="Courier New" w:cs="Courier New" w:hint="default"/>
+      </w:rPr>
+    </w:lvl>
+    <w:lvl w:ilvl="5" w:tplc="04190005" w:tentative="1">
+      <w:start w:val="1"/>
+      <w:numFmt w:val="bullet"/>
+      <w:lvlText w:val=""/>
+      <w:lvlJc w:val="left"/>
+      <w:pPr>
+        <w:ind w:left="5029" w:hanging="360"/>
+      </w:pPr>
+      <w:rPr>
+        <w:rFonts w:ascii="Wingdings" w:hAnsi="Wingdings" w:hint="default"/>
+      </w:rPr>
+    </w:lvl>
+    <w:lvl w:ilvl="6" w:tplc="04190001" w:tentative="1">
+      <w:start w:val="1"/>
+      <w:numFmt w:val="bullet"/>
+      <w:lvlText w:val=""/>
+      <w:lvlJc w:val="left"/>
+      <w:pPr>
+        <w:ind w:left="5749" w:hanging="360"/>
+      </w:pPr>
+      <w:rPr>
+        <w:rFonts w:ascii="Symbol" w:hAnsi="Symbol" w:hint="default"/>
+      </w:rPr>
+    </w:lvl>
+    <w:lvl w:ilvl="7" w:tplc="04190003" w:tentative="1">
+      <w:start w:val="1"/>
+      <w:numFmt w:val="bullet"/>
+      <w:lvlText w:val="o"/>
+      <w:lvlJc w:val="left"/>
+      <w:pPr>
+        <w:ind w:left="6469" w:hanging="360"/>
+      </w:pPr>
+      <w:rPr>
+        <w:rFonts w:ascii="Courier New" w:hAnsi="Courier New" w:cs="Courier New" w:hint="default"/>
+      </w:rPr>
+    </w:lvl>
+    <w:lvl w:ilvl="8" w:tplc="04190005" w:tentative="1">
+      <w:start w:val="1"/>
+      <w:numFmt w:val="bullet"/>
+      <w:lvlText w:val=""/>
+      <w:lvlJc w:val="left"/>
+      <w:pPr>
+        <w:ind w:left="7189" w:hanging="360"/>
+      </w:pPr>
+      <w:rPr>
+        <w:rFonts w:ascii="Wingdings" w:hAnsi="Wingdings" w:hint="default"/>
+      </w:rPr>
+    </w:lvl>
+  </w:abstractNum>
+  <w:abstractNum w:abstractNumId="16" w15:restartNumberingAfterBreak="0">
+    <w:nsid w:val="7E794327"/>
+    <w:multiLevelType w:val="hybridMultilevel"/>
+    <w:tmpl w:val="BFF0D868"/>
+    <w:lvl w:ilvl="0" w:tplc="AC1C3610">
+      <w:start w:val="1"/>
+      <w:numFmt w:val="bullet"/>
+      <w:lvlText w:val=""/>
+      <w:lvlJc w:val="left"/>
+      <w:pPr>
+        <w:ind w:left="1429" w:hanging="360"/>
+      </w:pPr>
+      <w:rPr>
+        <w:rFonts w:ascii="Symbol" w:hAnsi="Symbol" w:hint="default"/>
+      </w:rPr>
+    </w:lvl>
+    <w:lvl w:ilvl="1" w:tplc="04190003" w:tentative="1">
+      <w:start w:val="1"/>
+      <w:numFmt w:val="bullet"/>
+      <w:lvlText w:val="o"/>
+      <w:lvlJc w:val="left"/>
+      <w:pPr>
+        <w:ind w:left="2149" w:hanging="360"/>
+      </w:pPr>
+      <w:rPr>
+        <w:rFonts w:ascii="Courier New" w:hAnsi="Courier New" w:cs="Courier New" w:hint="default"/>
+      </w:rPr>
+    </w:lvl>
+    <w:lvl w:ilvl="2" w:tplc="04190005" w:tentative="1">
+      <w:start w:val="1"/>
+      <w:numFmt w:val="bullet"/>
+      <w:lvlText w:val=""/>
+      <w:lvlJc w:val="left"/>
+      <w:pPr>
+        <w:ind w:left="2869" w:hanging="360"/>
+      </w:pPr>
+      <w:rPr>
+        <w:rFonts w:ascii="Wingdings" w:hAnsi="Wingdings" w:hint="default"/>
+      </w:rPr>
+    </w:lvl>
+    <w:lvl w:ilvl="3" w:tplc="04190001" w:tentative="1">
+      <w:start w:val="1"/>
+      <w:numFmt w:val="bullet"/>
+      <w:lvlText w:val=""/>
+      <w:lvlJc w:val="left"/>
+      <w:pPr>
+        <w:ind w:left="3589" w:hanging="360"/>
+      </w:pPr>
+      <w:rPr>
+        <w:rFonts w:ascii="Symbol" w:hAnsi="Symbol" w:hint="default"/>
+      </w:rPr>
+    </w:lvl>
+    <w:lvl w:ilvl="4" w:tplc="04190003" w:tentative="1">
+      <w:start w:val="1"/>
+      <w:numFmt w:val="bullet"/>
+      <w:lvlText w:val="o"/>
+      <w:lvlJc w:val="left"/>
+      <w:pPr>
+        <w:ind w:left="4309" w:hanging="360"/>
+      </w:pPr>
+      <w:rPr>
+        <w:rFonts w:ascii="Courier New" w:hAnsi="Courier New" w:cs="Courier New" w:hint="default"/>
+      </w:rPr>
+    </w:lvl>
+    <w:lvl w:ilvl="5" w:tplc="04190005" w:tentative="1">
+      <w:start w:val="1"/>
+      <w:numFmt w:val="bullet"/>
+      <w:lvlText w:val=""/>
+      <w:lvlJc w:val="left"/>
+      <w:pPr>
+        <w:ind w:left="5029" w:hanging="360"/>
+      </w:pPr>
+      <w:rPr>
+        <w:rFonts w:ascii="Wingdings" w:hAnsi="Wingdings" w:hint="default"/>
+      </w:rPr>
+    </w:lvl>
+    <w:lvl w:ilvl="6" w:tplc="04190001" w:tentative="1">
+      <w:start w:val="1"/>
+      <w:numFmt w:val="bullet"/>
+      <w:lvlText w:val=""/>
+      <w:lvlJc w:val="left"/>
+      <w:pPr>
+        <w:ind w:left="5749" w:hanging="360"/>
+      </w:pPr>
+      <w:rPr>
+        <w:rFonts w:ascii="Symbol" w:hAnsi="Symbol" w:hint="default"/>
+      </w:rPr>
+    </w:lvl>
+    <w:lvl w:ilvl="7" w:tplc="04190003" w:tentative="1">
+      <w:start w:val="1"/>
+      <w:numFmt w:val="bullet"/>
+      <w:lvlText w:val="o"/>
+      <w:lvlJc w:val="left"/>
+      <w:pPr>
+        <w:ind w:left="6469" w:hanging="360"/>
+      </w:pPr>
+      <w:rPr>
+        <w:rFonts w:ascii="Courier New" w:hAnsi="Courier New" w:cs="Courier New" w:hint="default"/>
+      </w:rPr>
+    </w:lvl>
+    <w:lvl w:ilvl="8" w:tplc="04190005" w:tentative="1">
+      <w:start w:val="1"/>
+      <w:numFmt w:val="bullet"/>
+      <w:lvlText w:val=""/>
+      <w:lvlJc w:val="left"/>
+      <w:pPr>
+        <w:ind w:left="7189" w:hanging="360"/>
+      </w:pPr>
+      <w:rPr>
+        <w:rFonts w:ascii="Wingdings" w:hAnsi="Wingdings" w:hint="default"/>
+      </w:rPr>
+    </w:lvl>
+  </w:abstractNum>
   <w:num w:numId="1">
+    <w:abstractNumId w:val="10"/>
+  </w:num>
+  <w:num w:numId="2">
+    <w:abstractNumId w:val="2"/>
+  </w:num>
+  <w:num w:numId="3">
+    <w:abstractNumId w:val="5"/>
+  </w:num>
+  <w:num w:numId="4">
+    <w:abstractNumId w:val="1"/>
+  </w:num>
+  <w:num w:numId="5">
+    <w:abstractNumId w:val="3"/>
+  </w:num>
+  <w:num w:numId="6">
+    <w:abstractNumId w:val="7"/>
+  </w:num>
+  <w:num w:numId="7">
+    <w:abstractNumId w:val="9"/>
+  </w:num>
+  <w:num w:numId="8">
+    <w:abstractNumId w:val="4"/>
+  </w:num>
+  <w:num w:numId="9">
+    <w:abstractNumId w:val="12"/>
+  </w:num>
+  <w:num w:numId="10">
+    <w:abstractNumId w:val="11"/>
+  </w:num>
+  <w:num w:numId="11">
+    <w:abstractNumId w:val="6"/>
+  </w:num>
+  <w:num w:numId="12">
+    <w:abstractNumId w:val="16"/>
+  </w:num>
+  <w:num w:numId="13">
+    <w:abstractNumId w:val="13"/>
+  </w:num>
+  <w:num w:numId="14">
+    <w:abstractNumId w:val="15"/>
+  </w:num>
+  <w:num w:numId="15">
     <w:abstractNumId w:val="8"/>
   </w:num>
-  <w:num w:numId="2">
-    <w:abstractNumId w:val="1"/>
+  <w:num w:numId="16">
+    <w:abstractNumId w:val="14"/>
   </w:num>
-  <w:num w:numId="3">
-    <w:abstractNumId w:val="4"/>
-  </w:num>
-  <w:num w:numId="4">
+  <w:num w:numId="17">
     <w:abstractNumId w:val="0"/>
-  </w:num>
-  <w:num w:numId="5">
-    <w:abstractNumId w:val="2"/>
-  </w:num>
-  <w:num w:numId="6">
-    <w:abstractNumId w:val="6"/>
-  </w:num>
-  <w:num w:numId="7">
-    <w:abstractNumId w:val="7"/>
-  </w:num>
-  <w:num w:numId="8">
-    <w:abstractNumId w:val="3"/>
-  </w:num>
-  <w:num w:numId="9">
-    <w:abstractNumId w:val="10"/>
-  </w:num>
-  <w:num w:numId="10">
-    <w:abstractNumId w:val="9"/>
-  </w:num>
-  <w:num w:numId="11">
-    <w:abstractNumId w:val="5"/>
-  </w:num>
-  <w:num w:numId="12">
-    <w:abstractNumId w:val="12"/>
-  </w:num>
-  <w:num w:numId="13">
-    <w:abstractNumId w:val="11"/>
   </w:num>
   <w:numIdMacAtCleanup w:val="4"/>
 </w:numbering>
@@ -16835,7 +17564,7 @@
   <w:style w:type="paragraph" w:default="1" w:styleId="a">
     <w:name w:val="Normal"/>
     <w:qFormat/>
-    <w:rsid w:val="00D21956"/>
+    <w:rsid w:val="00CC1A8B"/>
     <w:pPr>
       <w:ind w:firstLine="709"/>
     </w:pPr>

</xml_diff>

<commit_message>
razdel s testami delayu
</commit_message>
<xml_diff>
--- a/Диплом мешков 23.106.docx
+++ b/Диплом мешков 23.106.docx
@@ -9682,34 +9682,151 @@
       </w:r>
     </w:p>
     <w:p>
-      <w:r>
-        <w:t>Система предназначена для автоматизации процесса декомпозиции целей, использование системы упрощает процесс планирования, контроля выполнения задач и совместной работы над проектами.</w:t>
-      </w:r>
-    </w:p>
-    <w:p>
-      <w:r>
-        <w:t>При запуске веб-приложения</w:t>
-      </w:r>
-      <w:r>
-        <w:t xml:space="preserve"> открывается</w:t>
-      </w:r>
-      <w:r>
-        <w:t xml:space="preserve"> начальная страница, представленная на рисунке 3.1.</w:t>
-      </w:r>
-      <w:r>
+      <w:pPr>
+        <w:pStyle w:val="2"/>
+      </w:pPr>
+      <w:r>
+        <w:t>3.1 Назначение и условия применения</w:t>
+      </w:r>
+    </w:p>
+    <w:p>
+      <w:r>
+        <w:t xml:space="preserve">Веб-приложение </w:t>
+      </w:r>
+      <w:r>
+        <w:t>декомпозиции целей предназначен для автоматизации процессов планирования, структурирования и контроля выполнения пользовательских целей. Основной функционал системы включает обработку запросов на естественном языке, генерацию последовательности задач с использованием ИИ-ассистента, отображение сформированного плана в удобном формате для просмотра и редактирования, а также сохранение созданных списков задач в базе данных для последующего доступа и использования.</w:t>
+      </w:r>
+    </w:p>
+    <w:p>
+      <w:r>
+        <w:t>Система может применяться как для личного планирования, так и в образовательной и профессиональной деятельности. Веб-приложение позволяет формировать планы подготовки к обучению, освоению новых навыков, выполнению проектов и достижению долгосрочных целей. Использование ИИ-ассистента позволяет сократить время на ручное составление плана и повысить качество структурирования задач.</w:t>
+      </w:r>
+    </w:p>
+    <w:p>
+      <w:r>
+        <w:t xml:space="preserve">Для работы с веб-приложением требуется персональный компьютер, ноутбук или мобильное устройство с доступом к сети Интернет. Поддерживаются операционные системы Windows, </w:t>
+      </w:r>
+      <w:proofErr w:type="spellStart"/>
+      <w:r>
+        <w:t>macOS</w:t>
+      </w:r>
+      <w:proofErr w:type="spellEnd"/>
+      <w:r>
+        <w:t xml:space="preserve">, </w:t>
+      </w:r>
+      <w:proofErr w:type="spellStart"/>
+      <w:r>
+        <w:t>Android</w:t>
+      </w:r>
+      <w:proofErr w:type="spellEnd"/>
+      <w:r>
+        <w:t xml:space="preserve"> и </w:t>
+      </w:r>
+      <w:proofErr w:type="spellStart"/>
+      <w:r>
+        <w:t>iOS</w:t>
+      </w:r>
+      <w:proofErr w:type="spellEnd"/>
+      <w:r>
+        <w:t xml:space="preserve">. Корректное функционирование системы обеспечивается при использовании современных веб-браузеров с поддержкой актуальных веб-стандартов, включая Google </w:t>
+      </w:r>
+      <w:proofErr w:type="spellStart"/>
+      <w:r>
+        <w:t>Chrome</w:t>
+      </w:r>
+      <w:proofErr w:type="spellEnd"/>
+      <w:r>
+        <w:t>, Mozilla Firefox, Microsoft Edge и Safari. Для стабильной работы интерфейса и взаимодействия с ИИ-сервисом рекомендуется интернет-соединение со скоростью не менее 5 Мбит/с.</w:t>
+      </w:r>
+    </w:p>
+    <w:p>
+      <w:r>
+        <w:t>Работа с системой предполагает наличие базовых навыков взаимодействия с веб-интерфейсами, включая навигацию по страницам, заполнение текстовых форм и использование элементов управления. Эффективность формирования плана зависит от корректности и полноты введенного описания цели.</w:t>
+      </w:r>
+    </w:p>
+    <w:p>
+      <w:pPr>
+        <w:pStyle w:val="2"/>
+        <w:rPr>
+          <w:szCs w:val="28"/>
+        </w:rPr>
+      </w:pPr>
+      <w:r>
+        <w:rPr>
+          <w:szCs w:val="28"/>
+        </w:rPr>
+        <w:lastRenderedPageBreak/>
+        <w:t xml:space="preserve">3.2 Подготовка к работе </w:t>
+      </w:r>
+    </w:p>
+    <w:p>
+      <w:r>
+        <w:t xml:space="preserve">Хранение данных осуществляется на удаленном сервере, на котором развернуты серверная часть приложения </w:t>
+      </w:r>
+      <w:proofErr w:type="spellStart"/>
+      <w:r>
+        <w:t>FastAPI</w:t>
+      </w:r>
+      <w:proofErr w:type="spellEnd"/>
+      <w:r>
+        <w:t xml:space="preserve"> и база данных </w:t>
+      </w:r>
+      <w:proofErr w:type="spellStart"/>
+      <w:r>
+        <w:t>PostgreSQL</w:t>
+      </w:r>
+      <w:proofErr w:type="spellEnd"/>
+      <w:r>
+        <w:t>. Пользовательская информация, данные учетных записей и сформированные планы сохраняются в базе данных. Доступ к системе осуществляется через веб-браузер без необходимости установки дополнительного программного обеспечения.</w:t>
+      </w:r>
+    </w:p>
+    <w:p>
+      <w:pPr>
+        <w:rPr>
+          <w:szCs w:val="28"/>
+          <w:lang w:eastAsia="ru-RU"/>
+        </w:rPr>
+      </w:pPr>
+      <w:r>
+        <w:t xml:space="preserve">Для начала работы необходимо открыть веб-браузер и перейти по адресу </w:t>
+      </w:r>
+      <w:proofErr w:type="spellStart"/>
+      <w:proofErr w:type="gramStart"/>
+      <w:r>
+        <w:t>targetl.site</w:t>
+      </w:r>
+      <w:proofErr w:type="spellEnd"/>
+      <w:proofErr w:type="gramEnd"/>
+      <w:r>
+        <w:t>. На стартовой странице доступна форма авторизации и регистрации. При отсутствии учетной записи требуется выполнить регистрацию путем заполнения обязательных полей формы, представленной на рисунке 3.1.</w:t>
+      </w:r>
+      <w:r>
+        <w:rPr>
+          <w:szCs w:val="28"/>
+          <w:lang w:eastAsia="ru-RU"/>
+        </w:rPr>
         <w:t xml:space="preserve"> </w:t>
       </w:r>
     </w:p>
     <w:p>
+      <w:pPr>
+        <w:jc w:val="center"/>
+        <w:rPr>
+          <w:szCs w:val="28"/>
+          <w:lang w:eastAsia="ru-RU"/>
+        </w:rPr>
+      </w:pPr>
       <w:r>
         <w:rPr>
           <w:noProof/>
+          <w:szCs w:val="28"/>
+          <w:lang w:eastAsia="ru-RU"/>
         </w:rPr>
         <w:drawing>
-          <wp:inline distT="0" distB="0" distL="0" distR="0" wp14:anchorId="1987B07E" wp14:editId="3849DCCF">
-            <wp:extent cx="5628640" cy="2576891"/>
-            <wp:effectExtent l="0" t="0" r="0" b="0"/>
-            <wp:docPr id="162236297" name="Рисунок 162236297"/>
+          <wp:inline distT="0" distB="0" distL="0" distR="0" wp14:anchorId="0437ABAC" wp14:editId="1D4B9B08">
+            <wp:extent cx="2036747" cy="3896139"/>
+            <wp:effectExtent l="0" t="0" r="1905" b="0"/>
+            <wp:docPr id="7" name="Рисунок 7"/>
             <wp:cNvGraphicFramePr>
               <a:graphicFrameLocks xmlns:a="http://schemas.openxmlformats.org/drawingml/2006/main" noChangeAspect="1"/>
             </wp:cNvGraphicFramePr>
@@ -9729,7 +9846,7 @@
                   <pic:spPr>
                     <a:xfrm>
                       <a:off x="0" y="0"/>
-                      <a:ext cx="5632941" cy="2578860"/>
+                      <a:ext cx="2036747" cy="3896139"/>
                     </a:xfrm>
                     <a:prstGeom prst="rect">
                       <a:avLst/>
@@ -9745,39 +9862,357 @@
     <w:p>
       <w:pPr>
         <w:jc w:val="center"/>
-      </w:pPr>
-      <w:r>
-        <w:t xml:space="preserve">Рисунок 3.1 – Начальная страница </w:t>
-      </w:r>
-    </w:p>
-    <w:p>
-      <w:r>
-        <w:t>Начальная страница предназначена для перехода к формам системы: регистрации новой учетной записи и аутентификации существующего пользователя. Для нового пользователя требуется перейти на экран регистрации с помощью кнопки «Начать». При последующих посещениях веб-приложения, если пользователь не прошел аутентификацию ранее, необходимо перейти на страницу авторизации по кнопке «Вход» и выполнить вход в систему с использованием существующей учетной записи.</w:t>
-      </w:r>
-    </w:p>
-    <w:p>
-      <w:r>
-        <w:t>При нажатии кнопки «Начать» выполняется переход на страницу регистрации пользователя, представленную на рисунке 3.2.</w:t>
-      </w:r>
-    </w:p>
-    <w:p/>
-    <w:p/>
-    <w:p/>
-    <w:p/>
-    <w:p>
-      <w:pPr>
-        <w:jc w:val="center"/>
+        <w:rPr>
+          <w:color w:val="000000" w:themeColor="text1"/>
+        </w:rPr>
+      </w:pPr>
+      <w:r>
+        <w:rPr>
+          <w:color w:val="000000" w:themeColor="text1"/>
+        </w:rPr>
+        <w:t xml:space="preserve">Рисунок </w:t>
+      </w:r>
+      <w:r>
+        <w:rPr>
+          <w:color w:val="000000" w:themeColor="text1"/>
+        </w:rPr>
+        <w:t>3.1</w:t>
+      </w:r>
+      <w:r>
+        <w:rPr>
+          <w:color w:val="000000" w:themeColor="text1"/>
+        </w:rPr>
+        <w:t xml:space="preserve"> –</w:t>
+      </w:r>
+      <w:r>
+        <w:rPr>
+          <w:color w:val="000000" w:themeColor="text1"/>
+        </w:rPr>
+        <w:t xml:space="preserve"> Форма регистрации</w:t>
+      </w:r>
+    </w:p>
+    <w:p>
+      <w:pPr>
+        <w:ind w:firstLine="0"/>
+      </w:pPr>
+      <w:r>
+        <w:t xml:space="preserve">После успешной регистрации и авторизации открывается доступ к основному функционалу системы. Навигация по разделам приложения осуществляется через </w:t>
+      </w:r>
+      <w:r>
+        <w:lastRenderedPageBreak/>
+        <w:t>боковое меню, расположенное в левой части интерфейса. В состав навигационного меню входят следующие разделы:</w:t>
+      </w:r>
+    </w:p>
+    <w:p>
+      <w:pPr>
+        <w:pStyle w:val="a4"/>
+        <w:numPr>
+          <w:ilvl w:val="0"/>
+          <w:numId w:val="25"/>
+        </w:numPr>
+        <w:spacing w:line="360" w:lineRule="auto"/>
+        <w:ind w:left="0" w:firstLine="709"/>
+        <w:rPr>
+          <w:rFonts w:ascii="Times New Roman" w:hAnsi="Times New Roman"/>
+          <w:color w:val="000000" w:themeColor="text1"/>
+        </w:rPr>
+      </w:pPr>
+      <w:r>
+        <w:rPr>
+          <w:rFonts w:ascii="Times New Roman" w:hAnsi="Times New Roman"/>
+          <w:color w:val="000000" w:themeColor="text1"/>
+        </w:rPr>
+        <w:t>профиля</w:t>
+      </w:r>
+      <w:r>
+        <w:rPr>
+          <w:rFonts w:ascii="Times New Roman" w:hAnsi="Times New Roman"/>
+          <w:color w:val="000000" w:themeColor="text1"/>
+          <w:lang w:val="en-US"/>
+        </w:rPr>
+        <w:t>;</w:t>
+      </w:r>
+    </w:p>
+    <w:p>
+      <w:pPr>
+        <w:pStyle w:val="a4"/>
+        <w:numPr>
+          <w:ilvl w:val="0"/>
+          <w:numId w:val="23"/>
+        </w:numPr>
+        <w:spacing w:line="360" w:lineRule="auto"/>
+        <w:ind w:left="0" w:firstLine="709"/>
+        <w:rPr>
+          <w:rFonts w:ascii="Times New Roman" w:hAnsi="Times New Roman"/>
+          <w:color w:val="000000" w:themeColor="text1"/>
+        </w:rPr>
+      </w:pPr>
+      <w:r>
+        <w:rPr>
+          <w:rFonts w:ascii="Times New Roman" w:hAnsi="Times New Roman"/>
+          <w:color w:val="000000" w:themeColor="text1"/>
+        </w:rPr>
+        <w:t>команды</w:t>
+      </w:r>
+      <w:r>
+        <w:rPr>
+          <w:rFonts w:ascii="Times New Roman" w:hAnsi="Times New Roman"/>
+          <w:color w:val="000000" w:themeColor="text1"/>
+          <w:lang w:val="en-US"/>
+        </w:rPr>
+        <w:t>;</w:t>
+      </w:r>
+    </w:p>
+    <w:p>
+      <w:pPr>
+        <w:pStyle w:val="a4"/>
+        <w:numPr>
+          <w:ilvl w:val="0"/>
+          <w:numId w:val="23"/>
+        </w:numPr>
+        <w:spacing w:line="360" w:lineRule="auto"/>
+        <w:ind w:left="0" w:firstLine="709"/>
+        <w:rPr>
+          <w:rFonts w:ascii="Times New Roman" w:hAnsi="Times New Roman"/>
+          <w:color w:val="000000" w:themeColor="text1"/>
+        </w:rPr>
+      </w:pPr>
+      <w:r>
+        <w:rPr>
+          <w:rFonts w:ascii="Times New Roman" w:hAnsi="Times New Roman"/>
+          <w:color w:val="000000" w:themeColor="text1"/>
+        </w:rPr>
+        <w:t>поиска пользователей</w:t>
+      </w:r>
+      <w:r>
+        <w:rPr>
+          <w:rFonts w:ascii="Times New Roman" w:hAnsi="Times New Roman"/>
+          <w:color w:val="000000" w:themeColor="text1"/>
+          <w:lang w:val="en-US"/>
+        </w:rPr>
+        <w:t>;</w:t>
+      </w:r>
+    </w:p>
+    <w:p>
+      <w:pPr>
+        <w:pStyle w:val="a4"/>
+        <w:numPr>
+          <w:ilvl w:val="0"/>
+          <w:numId w:val="23"/>
+        </w:numPr>
+        <w:spacing w:line="360" w:lineRule="auto"/>
+        <w:ind w:left="0" w:firstLine="709"/>
+        <w:rPr>
+          <w:rFonts w:ascii="Times New Roman" w:hAnsi="Times New Roman"/>
+          <w:color w:val="000000" w:themeColor="text1"/>
+        </w:rPr>
+      </w:pPr>
+      <w:r>
+        <w:rPr>
+          <w:rFonts w:ascii="Times New Roman" w:hAnsi="Times New Roman"/>
+          <w:color w:val="000000" w:themeColor="text1"/>
+        </w:rPr>
+        <w:t>сообщений</w:t>
+      </w:r>
+      <w:r>
+        <w:rPr>
+          <w:rFonts w:ascii="Times New Roman" w:hAnsi="Times New Roman"/>
+          <w:color w:val="000000" w:themeColor="text1"/>
+          <w:lang w:val="en-US"/>
+        </w:rPr>
+        <w:t>;</w:t>
+      </w:r>
+    </w:p>
+    <w:p>
+      <w:pPr>
+        <w:pStyle w:val="a4"/>
+        <w:numPr>
+          <w:ilvl w:val="0"/>
+          <w:numId w:val="23"/>
+        </w:numPr>
+        <w:spacing w:line="360" w:lineRule="auto"/>
+        <w:ind w:left="0" w:firstLine="709"/>
+        <w:rPr>
+          <w:rFonts w:ascii="Times New Roman" w:hAnsi="Times New Roman"/>
+          <w:color w:val="000000" w:themeColor="text1"/>
+        </w:rPr>
+      </w:pPr>
+      <w:r>
+        <w:rPr>
+          <w:rFonts w:ascii="Times New Roman" w:hAnsi="Times New Roman"/>
+          <w:color w:val="000000" w:themeColor="text1"/>
+        </w:rPr>
+        <w:t>ИИ-помощника</w:t>
+      </w:r>
+      <w:r>
+        <w:rPr>
+          <w:rFonts w:ascii="Times New Roman" w:hAnsi="Times New Roman"/>
+          <w:color w:val="000000" w:themeColor="text1"/>
+          <w:lang w:val="en-US"/>
+        </w:rPr>
+        <w:t>;</w:t>
+      </w:r>
+    </w:p>
+    <w:p>
+      <w:pPr>
+        <w:pStyle w:val="a4"/>
+        <w:numPr>
+          <w:ilvl w:val="0"/>
+          <w:numId w:val="23"/>
+        </w:numPr>
+        <w:spacing w:line="360" w:lineRule="auto"/>
+        <w:ind w:left="0" w:firstLine="709"/>
+        <w:rPr>
+          <w:rFonts w:ascii="Times New Roman" w:hAnsi="Times New Roman"/>
+          <w:color w:val="000000" w:themeColor="text1"/>
+        </w:rPr>
+      </w:pPr>
+      <w:r>
+        <w:rPr>
+          <w:rFonts w:ascii="Times New Roman" w:hAnsi="Times New Roman"/>
+          <w:color w:val="000000" w:themeColor="text1"/>
+        </w:rPr>
+        <w:t>с</w:t>
+      </w:r>
+      <w:r>
+        <w:rPr>
+          <w:rFonts w:ascii="Times New Roman" w:hAnsi="Times New Roman"/>
+          <w:color w:val="000000" w:themeColor="text1"/>
+        </w:rPr>
+        <w:t>писк</w:t>
+      </w:r>
+      <w:r>
+        <w:rPr>
+          <w:rFonts w:ascii="Times New Roman" w:hAnsi="Times New Roman"/>
+          <w:color w:val="000000" w:themeColor="text1"/>
+        </w:rPr>
+        <w:t>и</w:t>
+      </w:r>
+      <w:r>
+        <w:rPr>
+          <w:rFonts w:ascii="Times New Roman" w:hAnsi="Times New Roman"/>
+          <w:color w:val="000000" w:themeColor="text1"/>
+        </w:rPr>
+        <w:t xml:space="preserve"> задач (</w:t>
+      </w:r>
+      <w:proofErr w:type="spellStart"/>
+      <w:r>
+        <w:rPr>
+          <w:rFonts w:ascii="Times New Roman" w:hAnsi="Times New Roman"/>
+          <w:color w:val="000000" w:themeColor="text1"/>
+        </w:rPr>
+        <w:t>роудмапов</w:t>
+      </w:r>
+      <w:proofErr w:type="spellEnd"/>
+      <w:r>
+        <w:rPr>
+          <w:rFonts w:ascii="Times New Roman" w:hAnsi="Times New Roman"/>
+          <w:color w:val="000000" w:themeColor="text1"/>
+        </w:rPr>
+        <w:t>)</w:t>
+      </w:r>
+      <w:r>
+        <w:rPr>
+          <w:rFonts w:ascii="Times New Roman" w:hAnsi="Times New Roman"/>
+          <w:color w:val="000000" w:themeColor="text1"/>
+          <w:lang w:val="en-US"/>
+        </w:rPr>
+        <w:t>.</w:t>
+      </w:r>
+    </w:p>
+    <w:p>
+      <w:pPr>
+        <w:pStyle w:val="a4"/>
+        <w:spacing w:line="360" w:lineRule="auto"/>
+        <w:ind w:left="0"/>
+        <w:rPr>
+          <w:rFonts w:ascii="Times New Roman" w:hAnsi="Times New Roman"/>
+          <w:color w:val="000000" w:themeColor="text1"/>
+        </w:rPr>
+      </w:pPr>
+      <w:r>
+        <w:rPr>
+          <w:rFonts w:ascii="Times New Roman" w:hAnsi="Times New Roman"/>
+          <w:color w:val="000000" w:themeColor="text1"/>
+        </w:rPr>
+        <w:t xml:space="preserve">Для </w:t>
+      </w:r>
+      <w:r>
+        <w:rPr>
+          <w:rFonts w:ascii="Times New Roman" w:hAnsi="Times New Roman"/>
+          <w:color w:val="000000" w:themeColor="text1"/>
+        </w:rPr>
+        <w:t xml:space="preserve">формирования </w:t>
+      </w:r>
+      <w:r>
+        <w:rPr>
+          <w:rFonts w:ascii="Times New Roman" w:hAnsi="Times New Roman"/>
+          <w:color w:val="000000" w:themeColor="text1"/>
+        </w:rPr>
+        <w:t xml:space="preserve">списка задач </w:t>
+      </w:r>
+      <w:r>
+        <w:rPr>
+          <w:rFonts w:ascii="Times New Roman" w:hAnsi="Times New Roman"/>
+          <w:color w:val="000000" w:themeColor="text1"/>
+        </w:rPr>
+        <w:t>необходимо</w:t>
+      </w:r>
+      <w:r>
+        <w:rPr>
+          <w:rFonts w:ascii="Times New Roman" w:hAnsi="Times New Roman"/>
+          <w:color w:val="000000" w:themeColor="text1"/>
+        </w:rPr>
+        <w:t xml:space="preserve"> перейти</w:t>
+      </w:r>
+      <w:r>
+        <w:rPr>
+          <w:rFonts w:ascii="Times New Roman" w:hAnsi="Times New Roman"/>
+          <w:color w:val="000000" w:themeColor="text1"/>
+        </w:rPr>
+        <w:t xml:space="preserve"> в раздел</w:t>
+      </w:r>
+      <w:r>
+        <w:rPr>
+          <w:rFonts w:ascii="Times New Roman" w:hAnsi="Times New Roman"/>
+          <w:color w:val="000000" w:themeColor="text1"/>
+        </w:rPr>
+        <w:t xml:space="preserve"> «ИИ-помощника», представлен</w:t>
+      </w:r>
+      <w:r>
+        <w:rPr>
+          <w:rFonts w:ascii="Times New Roman" w:hAnsi="Times New Roman"/>
+          <w:color w:val="000000" w:themeColor="text1"/>
+        </w:rPr>
+        <w:t>ный</w:t>
+      </w:r>
+      <w:r>
+        <w:rPr>
+          <w:rFonts w:ascii="Times New Roman" w:hAnsi="Times New Roman"/>
+          <w:color w:val="000000" w:themeColor="text1"/>
+        </w:rPr>
+        <w:t xml:space="preserve"> на рисунке 3.2.</w:t>
+      </w:r>
+    </w:p>
+    <w:p>
+      <w:pPr>
+        <w:pStyle w:val="a4"/>
+        <w:spacing w:after="0" w:line="360" w:lineRule="auto"/>
+        <w:ind w:left="0" w:firstLine="0"/>
+        <w:rPr>
+          <w:rFonts w:ascii="Times New Roman" w:hAnsi="Times New Roman"/>
+          <w:color w:val="000000" w:themeColor="text1"/>
+        </w:rPr>
       </w:pPr>
       <w:r>
         <w:rPr>
           <w:noProof/>
         </w:rPr>
-        <w:lastRenderedPageBreak/>
         <w:drawing>
-          <wp:inline distT="0" distB="0" distL="0" distR="0" wp14:anchorId="7CBEFBD4" wp14:editId="14B82192">
-            <wp:extent cx="2412538" cy="4857750"/>
-            <wp:effectExtent l="0" t="0" r="6985" b="0"/>
-            <wp:docPr id="162236298" name="Рисунок 162236298"/>
+          <wp:inline distT="0" distB="0" distL="0" distR="0" wp14:anchorId="42CC3463" wp14:editId="5026133C">
+            <wp:extent cx="6231341" cy="1424714"/>
+            <wp:effectExtent l="0" t="0" r="0" b="4445"/>
+            <wp:docPr id="23" name="Рисунок 23"/>
             <wp:cNvGraphicFramePr>
               <a:graphicFrameLocks xmlns:a="http://schemas.openxmlformats.org/drawingml/2006/main" noChangeAspect="1"/>
             </wp:cNvGraphicFramePr>
@@ -9785,23 +10220,36 @@
               <a:graphicData uri="http://schemas.openxmlformats.org/drawingml/2006/picture">
                 <pic:pic xmlns:pic="http://schemas.openxmlformats.org/drawingml/2006/picture">
                   <pic:nvPicPr>
-                    <pic:cNvPr id="1" name=""/>
-                    <pic:cNvPicPr/>
+                    <pic:cNvPr id="0" name="Picture 1"/>
+                    <pic:cNvPicPr>
+                      <a:picLocks noChangeAspect="1" noChangeArrowheads="1"/>
+                    </pic:cNvPicPr>
                   </pic:nvPicPr>
                   <pic:blipFill>
-                    <a:blip r:embed="rId36"/>
+                    <a:blip r:embed="rId36">
+                      <a:extLst>
+                        <a:ext uri="{28A0092B-C50C-407E-A947-70E740481C1C}">
+                          <a14:useLocalDpi xmlns:a14="http://schemas.microsoft.com/office/drawing/2010/main" val="0"/>
+                        </a:ext>
+                      </a:extLst>
+                    </a:blip>
+                    <a:srcRect/>
                     <a:stretch>
                       <a:fillRect/>
                     </a:stretch>
                   </pic:blipFill>
-                  <pic:spPr>
+                  <pic:spPr bwMode="auto">
                     <a:xfrm>
                       <a:off x="0" y="0"/>
-                      <a:ext cx="2432153" cy="4897246"/>
+                      <a:ext cx="6327372" cy="1446670"/>
                     </a:xfrm>
                     <a:prstGeom prst="rect">
                       <a:avLst/>
                     </a:prstGeom>
+                    <a:noFill/>
+                    <a:ln>
+                      <a:noFill/>
+                    </a:ln>
                   </pic:spPr>
                 </pic:pic>
               </a:graphicData>
@@ -9812,25 +10260,234 @@
     </w:p>
     <w:p>
       <w:pPr>
-        <w:jc w:val="center"/>
-      </w:pPr>
-      <w:r>
-        <w:t>Рисунок 3.2 – Страница для регистрации пользователей</w:t>
-      </w:r>
-    </w:p>
-    <w:p>
-      <w:r>
-        <w:t>На странице регистрации пользователю необходимо заполнить обязательные поля учетной записи, включающие логин, имя, фамилию, адрес электронной почты и пароль. После заполнения данных требуется нажать кнопку «Создать аккаунт». В случае успешной регистрации будет выполнен автоматический переход к основному интерфейсу системы.</w:t>
-      </w:r>
-    </w:p>
-    <w:p>
-      <w:r>
-        <w:t>Для пользователей, уже имеющих учетную запись, в нижней части страницы предусмотрена кнопка «Войти», позволяющая перейти к форме авторизации пользователя.</w:t>
-      </w:r>
-    </w:p>
-    <w:p/>
-    <w:p/>
-    <w:p/>
+        <w:ind w:firstLine="1560"/>
+        <w:rPr>
+          <w:color w:val="000000" w:themeColor="text1"/>
+        </w:rPr>
+      </w:pPr>
+      <w:r>
+        <w:rPr>
+          <w:color w:val="000000" w:themeColor="text1"/>
+        </w:rPr>
+        <w:t xml:space="preserve">Рисунок </w:t>
+      </w:r>
+      <w:r>
+        <w:rPr>
+          <w:color w:val="000000" w:themeColor="text1"/>
+        </w:rPr>
+        <w:t>3.</w:t>
+      </w:r>
+      <w:r>
+        <w:rPr>
+          <w:color w:val="000000" w:themeColor="text1"/>
+        </w:rPr>
+        <w:t>2</w:t>
+      </w:r>
+      <w:r>
+        <w:rPr>
+          <w:color w:val="000000" w:themeColor="text1"/>
+        </w:rPr>
+        <w:t xml:space="preserve"> –</w:t>
+      </w:r>
+      <w:r>
+        <w:rPr>
+          <w:color w:val="000000" w:themeColor="text1"/>
+        </w:rPr>
+        <w:t xml:space="preserve"> Интерфейс для общения с ИИ-помощником</w:t>
+      </w:r>
+    </w:p>
+    <w:p>
+      <w:pPr>
+        <w:jc w:val="left"/>
+        <w:rPr>
+          <w:rFonts w:cs="Times New Roman"/>
+          <w:color w:val="000000" w:themeColor="text1"/>
+        </w:rPr>
+      </w:pPr>
+      <w:r>
+        <w:rPr>
+          <w:rFonts w:cs="Times New Roman"/>
+        </w:rPr>
+        <w:t>Интерфейс ИИ-помощника реализован в виде диалогового окна и включает следующие элементы:</w:t>
+      </w:r>
+      <w:r>
+        <w:rPr>
+          <w:rFonts w:cs="Times New Roman"/>
+          <w:color w:val="000000" w:themeColor="text1"/>
+        </w:rPr>
+        <w:t xml:space="preserve"> </w:t>
+      </w:r>
+    </w:p>
+    <w:p>
+      <w:pPr>
+        <w:pStyle w:val="a4"/>
+        <w:numPr>
+          <w:ilvl w:val="0"/>
+          <w:numId w:val="26"/>
+        </w:numPr>
+        <w:ind w:left="0" w:firstLine="709"/>
+        <w:jc w:val="left"/>
+        <w:rPr>
+          <w:rFonts w:ascii="Times New Roman" w:hAnsi="Times New Roman"/>
+          <w:color w:val="000000" w:themeColor="text1"/>
+        </w:rPr>
+      </w:pPr>
+      <w:r>
+        <w:rPr>
+          <w:rFonts w:ascii="Times New Roman" w:hAnsi="Times New Roman"/>
+          <w:color w:val="000000" w:themeColor="text1"/>
+        </w:rPr>
+        <w:t>«1» строка ввода цели, которой необходима декомпозиция;</w:t>
+      </w:r>
+    </w:p>
+    <w:p>
+      <w:pPr>
+        <w:pStyle w:val="a4"/>
+        <w:numPr>
+          <w:ilvl w:val="0"/>
+          <w:numId w:val="26"/>
+        </w:numPr>
+        <w:spacing w:line="360" w:lineRule="auto"/>
+        <w:ind w:left="0" w:firstLine="709"/>
+        <w:rPr>
+          <w:rFonts w:ascii="Times New Roman" w:hAnsi="Times New Roman"/>
+          <w:color w:val="000000" w:themeColor="text1"/>
+        </w:rPr>
+      </w:pPr>
+      <w:r>
+        <w:rPr>
+          <w:rFonts w:ascii="Times New Roman" w:hAnsi="Times New Roman"/>
+          <w:color w:val="000000" w:themeColor="text1"/>
+        </w:rPr>
+        <w:t>«2» кнопка отправить, необходимая для отправления цели ИИ-сервису</w:t>
+      </w:r>
+      <w:r>
+        <w:rPr>
+          <w:rFonts w:ascii="Times New Roman" w:hAnsi="Times New Roman"/>
+          <w:color w:val="000000" w:themeColor="text1"/>
+        </w:rPr>
+        <w:t>.</w:t>
+      </w:r>
+    </w:p>
+    <w:p>
+      <w:r>
+        <w:t>В поле ввода указывается описание требуемой цели или результата. После отправки запроса выполняется обработка данных ИИ-сервисом и генерация структурированного списка задач. Продолжительность обработки зависит от сложности запроса и текущей загрузки сервера.</w:t>
+      </w:r>
+    </w:p>
+    <w:p>
+      <w:r>
+        <w:t xml:space="preserve">По завершении обработки на экране отображается сформированный список задач в виде последовательности этапов с кратким описанием необходимых действий. Полученный план может быть отредактирован или использован в дальнейшем для отслеживания выполнения поставленной цели. Для повышения </w:t>
+      </w:r>
+      <w:r>
+        <w:lastRenderedPageBreak/>
+        <w:t>качества генерации рекомендуется формулировать цель максимально подробно и указывать ключевые ограничения или пожелания.</w:t>
+      </w:r>
+    </w:p>
+    <w:p>
+      <w:pPr>
+        <w:rPr>
+          <w:color w:val="000000" w:themeColor="text1"/>
+        </w:rPr>
+      </w:pPr>
+      <w:r>
+        <w:rPr>
+          <w:color w:val="000000" w:themeColor="text1"/>
+        </w:rPr>
+        <w:t>Система функционирует в формате веб-приложения и не требует установки дополнительного программного обеспечения. Для корректного отображения интерфейса рекомендуется использование актуальных версий поддерживаемых браузеров.</w:t>
+      </w:r>
+    </w:p>
+    <w:p>
+      <w:pPr>
+        <w:pStyle w:val="2"/>
+        <w:rPr>
+          <w:color w:val="000000" w:themeColor="text1"/>
+        </w:rPr>
+      </w:pPr>
+      <w:r>
+        <w:rPr>
+          <w:color w:val="000000" w:themeColor="text1"/>
+        </w:rPr>
+        <w:t>3.3 Аварийные ситуации</w:t>
+      </w:r>
+    </w:p>
+    <w:p>
+      <w:r>
+        <w:t>В процессе эксплуатации системы возможно возникновение нештатных ситуаций, связанных с работой серверной части, сетевого соединения, внешних сервисов или особенностями функционирования ИИ-сервиса. Подобные ситуации могут приводить к временному ограничению функциональности системы, задержке обработки запросов или некорректному отображению данных.</w:t>
+      </w:r>
+    </w:p>
+    <w:p>
+      <w:r>
+        <w:t>При высокой нагрузке на сервер обработки запросов, недоступности ИИ-сервиса или возникновении внутренней ошибки генерации система может вернуть сообщение об ошибке либо не завершить обработку запроса в установленное время. В данном случае рекомендуется повторить отправку запроса через некоторое время или выполнить повторную авторизацию в системе.</w:t>
+      </w:r>
+    </w:p>
+    <w:p>
+      <w:r>
+        <w:t xml:space="preserve">В связи с особенностями работы </w:t>
+      </w:r>
+      <w:proofErr w:type="spellStart"/>
+      <w:r>
+        <w:t>нейросетевых</w:t>
+      </w:r>
+      <w:proofErr w:type="spellEnd"/>
+      <w:r>
+        <w:t xml:space="preserve"> моделей результат генерации может не полностью соответствовать ожидаемому содержанию. Возможны слишком общие формулировки, отсутствие детализации отдельных этапов или неполное соответствие исходному запросу. Для повышения качества результата рекомендуется уточнить описание цели, добавить дополнительные условия или выполнить повторную генерацию плана. При необходимости допускается последующее ручное редактирование сформированного списка задач.</w:t>
+      </w:r>
+    </w:p>
+    <w:p>
+      <w:r>
+        <w:t xml:space="preserve">При отсутствии интернет-соединения либо временной недоступности </w:t>
+      </w:r>
+      <w:proofErr w:type="spellStart"/>
+      <w:r>
+        <w:t>FastAPI</w:t>
+      </w:r>
+      <w:proofErr w:type="spellEnd"/>
+      <w:r>
+        <w:t xml:space="preserve">-сервера отдельные функции системы могут перестать отвечать на запросы. Возможны ошибки загрузки страниц, отсутствие ответа от ИИ-сервиса </w:t>
+      </w:r>
+      <w:r>
+        <w:lastRenderedPageBreak/>
+        <w:t>или невозможность сохранения изменений. Для восстановления работоспособности необходимо проверить подключение к сети Интернет и повторно загрузить страницу веб-приложения. Несохраненные изменения могут быть утрачены.</w:t>
+      </w:r>
+    </w:p>
+    <w:p>
+      <w:r>
+        <w:t>При отправке пустого запроса либо недостаточно информативного описания цели система может отклонить запрос и вывести сообщение о необходимости уточнения входных данных. Для корректной генерации рекомендуется указывать описание цели, сроки выполнения и дополнительные параметры, влияющие на построение плана.</w:t>
+      </w:r>
+    </w:p>
+    <w:p>
+      <w:r>
+        <w:t xml:space="preserve">В отдельных случаях возможны ошибки отображения элементов интерфейса, связанные с несовместимостью браузера, устаревшей версией программного обеспечения или сбоями во </w:t>
+      </w:r>
+      <w:proofErr w:type="spellStart"/>
+      <w:r>
+        <w:t>frontend</w:t>
+      </w:r>
+      <w:proofErr w:type="spellEnd"/>
+      <w:r>
+        <w:t>-части приложения. Подобные ситуации могут проявляться в виде неправильного отображения страниц, отсутствия отдельных элементов интерфейса или ошибок взаимодействия с компонентами системы. Для устранения проблемы рекомендуется обновить браузер до актуальной версии, очистить кэш и повторно открыть веб-приложение.</w:t>
+      </w:r>
+    </w:p>
+    <w:p>
+      <w:r>
+        <w:t>При высокой нагрузке на сервер базы данных либо возникновении внутренних ошибок сохранение изменений может быть выполнено некорректно. В результате отдельные данные, связанные с задачами, сообщениями или настройками пользователя, могут не сохраниться. Для предотвращения потери информации рекомендуется периодически проверять успешность сохранения изменений и при необходимости повторять выполнение операции.</w:t>
+      </w:r>
+    </w:p>
+    <w:p>
+      <w:pPr>
+        <w:rPr>
+          <w:color w:val="000000" w:themeColor="text1"/>
+        </w:rPr>
+      </w:pPr>
+      <w:r>
+        <w:t xml:space="preserve">Возможны ситуации, связанные с превышением допустимого объема входных данных или использованием некорректных символов в запросе. При вводе слишком длинного описания цели либо нестандартных данных система может обработать запрос некорректно или ограничить выполнение отдельных операций. В подобных случаях рекомендуется сократить объем вводимого текста, использовать корректные формулировки и повторно отправить запрос. </w:t>
+      </w:r>
+    </w:p>
+    <w:p>
+      <w:pPr>
+        <w:ind w:firstLine="0"/>
+      </w:pPr>
+    </w:p>
     <w:p>
       <w:pPr>
         <w:pStyle w:val="1"/>
@@ -9849,73 +10506,96 @@
       </w:r>
     </w:p>
     <w:p>
-      <w:pPr>
+      <w:r>
+        <w:t xml:space="preserve">Для проверки работоспособности веб-приложения была выбрана стратегия функционального тестирования методом черного ящика в сочетании с модульным тестированием отдельных компонентов серверной части. Данный подход позволяет оценить корректность работы системы как со стороны конечного пользователя, так и на уровне отдельных программных </w:t>
+      </w:r>
+      <w:r>
+        <w:t xml:space="preserve">модулей серверной </w:t>
+      </w:r>
+      <w:r>
+        <w:t>части приложения. Использование комбинации нескольких методов тестирования обеспечивает более полную проверку функциональности системы и позволяет выявлять ошибки как в пользовательских сценариях, так и во внутренней логике обработки данных.</w:t>
+      </w:r>
+    </w:p>
+    <w:p>
+      <w:pPr>
+        <w:rPr>
+          <w:lang w:val="en-US"/>
+        </w:rPr>
+      </w:pPr>
+      <w:r>
+        <w:t xml:space="preserve">Метод черного ящика основан на тестировании программного продукта без анализа внутренней структуры исходного кода. Проверка осуществляется путем выполнения пользовательских действий и анализа получаемых результатов. Такой подход позволяет оценить соответствие работы системы функциональным требованиям проекта, корректность обработки пользовательских запросов и стабильность взаимодействия компонентов интерфейса. </w:t>
+      </w:r>
+      <w:r>
         <w:rPr>
           <w:highlight w:val="yellow"/>
         </w:rPr>
-      </w:pPr>
-      <w:r>
-        <w:rPr>
-          <w:highlight w:val="yellow"/>
-        </w:rPr>
-        <w:t>Для проверки работоспособности веб-приложения была выбрана стратегия функционального тестирования методом черного ящика. Данный подход основан на проверке работы системы без анализа внутренней структуры программного кода. Тестирование выполнялось с точки зрения конечного пользователя путем проверки корректности работы интерфейса, обработки пользовательских действий и соответствия получаемых результатов ожидаемому поведению системы.</w:t>
-      </w:r>
-    </w:p>
-    <w:p>
-      <w:pPr>
-        <w:rPr>
-          <w:highlight w:val="yellow"/>
-        </w:rPr>
-      </w:pPr>
-      <w:r>
-        <w:rPr>
-          <w:highlight w:val="yellow"/>
-        </w:rPr>
-        <w:t>Использование данного метода позволило оценить стабильность работы основных компонентов приложения, включая систему аутентификации пользователей, механизм генерации списков задач, управление задачами, командное взаимодействие и обмен сообщениями в режиме реального времени. Основное внимание уделялось корректности обработки входных данных, отображению информации в интерфейсе и устойчивости системы при различных пользовательских сценариях.</w:t>
-      </w:r>
-    </w:p>
-    <w:p>
-      <w:pPr>
-        <w:rPr>
-          <w:highlight w:val="yellow"/>
-        </w:rPr>
-      </w:pPr>
-      <w:r>
-        <w:rPr>
-          <w:highlight w:val="yellow"/>
-        </w:rPr>
-        <w:t>Процесс тестирования включал выполнение последовательности действий пользователя внутри системы: регистрацию учетной записи, авторизацию, создание целей, генерацию задач с использованием искусственного интеллекта, редактирование информации, создание команд, назначение задач участникам и работу встроенного чата. Для каждого сценария анализировалась корректность выполнения операций и соответствие результатов функциональным требованиям проекта.</w:t>
-      </w:r>
-    </w:p>
-    <w:p>
-      <w:pPr>
-        <w:rPr>
-          <w:highlight w:val="yellow"/>
-        </w:rPr>
-      </w:pPr>
-      <w:r>
-        <w:rPr>
-          <w:highlight w:val="yellow"/>
-        </w:rPr>
-        <w:t>Дополнительно выполнялась проверка обработки некорректных данных, включая ввод пустых полей, неверных учетных данных, повторяющихся адресов электронной почты. Это позволило проверить корректность работы механизмов валидации данных и обработки ошибок.</w:t>
-      </w:r>
-      <w:r>
-        <w:rPr>
-          <w:highlight w:val="yellow"/>
-        </w:rPr>
-        <w:t xml:space="preserve"> </w:t>
-      </w:r>
-    </w:p>
-    <w:p>
-      <w:r>
-        <w:rPr>
-          <w:highlight w:val="yellow"/>
-        </w:rPr>
+        <w:t>Основное внимание уделялось проверке регистрации и авторизации пользователей, генерации списков задач с использованием ИИ-сервиса, управлению задачами, работе командного функционала, обмену сообщениями и корректности отображения данных в пользовательском интерфейсе.</w:t>
+      </w:r>
+    </w:p>
+    <w:p>
+      <w:r>
+        <w:t xml:space="preserve">Дополнительно для проверки серверной части приложения использовалось модульное тестирование </w:t>
+      </w:r>
+      <w:proofErr w:type="spellStart"/>
+      <w:r>
+        <w:t>backend</w:t>
+      </w:r>
+      <w:proofErr w:type="spellEnd"/>
+      <w:r>
+        <w:t xml:space="preserve">-компонентов. В процессе тестирования проверялась корректность работы API-методов </w:t>
+      </w:r>
+      <w:proofErr w:type="spellStart"/>
+      <w:r>
+        <w:t>FastAPI</w:t>
+      </w:r>
+      <w:proofErr w:type="spellEnd"/>
+      <w:r>
+        <w:t xml:space="preserve">, обработка HTTP-запросов, механизмы валидации данных, работа JWT-аутентификации, взаимодействие с базой данных </w:t>
+      </w:r>
+      <w:proofErr w:type="spellStart"/>
+      <w:r>
+        <w:t>PostgreSQL</w:t>
+      </w:r>
+      <w:proofErr w:type="spellEnd"/>
+      <w:r>
+        <w:t xml:space="preserve"> и обработка ошибок. Для этого были разработаны отдельные тесты, позволяющие проверить корректность работы функций при передаче как корректных, так и некорректных входных данных.</w:t>
+      </w:r>
+    </w:p>
+    <w:p>
+      <w:r>
         <w:lastRenderedPageBreak/>
-        <w:t>Результаты тестирования могут включать в себя отчеты о найденных ошибках, оценку покрытия тестами функциональности программы, а также рекомендации по улучшению качества программного продукта.</w:t>
-      </w:r>
-    </w:p>
-    <w:p/>
+        <w:t>Процесс тестирования включал выполнение различных пользовательских сценариев: регистрацию учетной записи, авторизацию в системе, создание целей, генерацию задач при помощи искусственного интеллекта, редактирование информации, создание команд и взаимодействие пользователей через встроенный чат. Дополнительно выполнялась проверка обработки ошибочных ситуаций, включая ввод пустых полей, некорректных учетных данных, отправку пустых запросов и попытки выполнения действий без авторизации.</w:t>
+      </w:r>
+    </w:p>
+    <w:p>
+      <w:r>
+        <w:t xml:space="preserve">Использование выбранной стратегии тестирования </w:t>
+      </w:r>
+      <w:r>
+        <w:t>позволяет</w:t>
+      </w:r>
+      <w:r>
+        <w:t xml:space="preserve"> оценить стабильность работы веб-приложения, проверить корректность взаимодействия между</w:t>
+      </w:r>
+      <w:r>
+        <w:t xml:space="preserve"> клиентской</w:t>
+      </w:r>
+      <w:r>
+        <w:t xml:space="preserve"> и </w:t>
+      </w:r>
+      <w:r>
+        <w:t xml:space="preserve">серверной </w:t>
+      </w:r>
+      <w:r>
+        <w:t>ч</w:t>
+      </w:r>
+      <w:r>
+        <w:t>астей</w:t>
+      </w:r>
+      <w:r>
+        <w:t xml:space="preserve"> системы, а также выявить возможные ошибки обработки пользовательских данных и работы отдельных компонентов программного продукта.</w:t>
+      </w:r>
+    </w:p>
     <w:p>
       <w:pPr>
         <w:pStyle w:val="2"/>
@@ -11180,33 +11860,17 @@
                                       <w:lang w:val="ru-RU"/>
                                     </w:rPr>
                                   </w:pPr>
-                                  <w:r>
-                                    <w:fldChar w:fldCharType="begin"/>
-                                  </w:r>
-                                  <w:r>
-                                    <w:instrText xml:space="preserve"> NUMPAGES   \* MERGEFORMAT </w:instrText>
-                                  </w:r>
-                                  <w:r>
-                                    <w:fldChar w:fldCharType="separate"/>
-                                  </w:r>
-                                  <w:r>
-                                    <w:rPr>
-                                      <w:rFonts w:ascii="Times New Roman" w:hAnsi="Times New Roman" w:cs="Times New Roman"/>
-                                      <w:noProof/>
-                                      <w:sz w:val="18"/>
-                                      <w:lang w:val="ru-RU"/>
-                                    </w:rPr>
-                                    <w:t>7</w:t>
-                                  </w:r>
-                                  <w:r>
-                                    <w:rPr>
-                                      <w:rFonts w:ascii="Times New Roman" w:hAnsi="Times New Roman" w:cs="Times New Roman"/>
-                                      <w:noProof/>
-                                      <w:sz w:val="18"/>
-                                      <w:lang w:val="ru-RU"/>
-                                    </w:rPr>
-                                    <w:fldChar w:fldCharType="end"/>
-                                  </w:r>
+                                  <w:fldSimple w:instr=" NUMPAGES   \* MERGEFORMAT ">
+                                    <w:r>
+                                      <w:rPr>
+                                        <w:rFonts w:ascii="Times New Roman" w:hAnsi="Times New Roman" w:cs="Times New Roman"/>
+                                        <w:noProof/>
+                                        <w:sz w:val="18"/>
+                                        <w:lang w:val="ru-RU"/>
+                                      </w:rPr>
+                                      <w:t>7</w:t>
+                                    </w:r>
+                                  </w:fldSimple>
                                 </w:p>
                               </w:tc>
                             </w:tr>
@@ -12952,33 +13616,17 @@
                                 <w:lang w:val="ru-RU"/>
                               </w:rPr>
                             </w:pPr>
-                            <w:r>
-                              <w:fldChar w:fldCharType="begin"/>
-                            </w:r>
-                            <w:r>
-                              <w:instrText xml:space="preserve"> NUMPAGES   \* MERGEFORMAT </w:instrText>
-                            </w:r>
-                            <w:r>
-                              <w:fldChar w:fldCharType="separate"/>
-                            </w:r>
-                            <w:r>
-                              <w:rPr>
-                                <w:rFonts w:ascii="Times New Roman" w:hAnsi="Times New Roman" w:cs="Times New Roman"/>
-                                <w:noProof/>
-                                <w:sz w:val="18"/>
-                                <w:lang w:val="ru-RU"/>
-                              </w:rPr>
-                              <w:t>7</w:t>
-                            </w:r>
-                            <w:r>
-                              <w:rPr>
-                                <w:rFonts w:ascii="Times New Roman" w:hAnsi="Times New Roman" w:cs="Times New Roman"/>
-                                <w:noProof/>
-                                <w:sz w:val="18"/>
-                                <w:lang w:val="ru-RU"/>
-                              </w:rPr>
-                              <w:fldChar w:fldCharType="end"/>
-                            </w:r>
+                            <w:fldSimple w:instr=" NUMPAGES   \* MERGEFORMAT ">
+                              <w:r>
+                                <w:rPr>
+                                  <w:rFonts w:ascii="Times New Roman" w:hAnsi="Times New Roman" w:cs="Times New Roman"/>
+                                  <w:noProof/>
+                                  <w:sz w:val="18"/>
+                                  <w:lang w:val="ru-RU"/>
+                                </w:rPr>
+                                <w:t>7</w:t>
+                              </w:r>
+                            </w:fldSimple>
                           </w:p>
                         </w:tc>
                       </w:tr>
@@ -13650,7 +14298,7 @@
             </wp:anchor>
           </w:drawing>
         </mc:Choice>
-        <mc:Fallback xmlns:w16sdtfl="http://schemas.microsoft.com/office/word/2024/wordml/sdtformatlock" xmlns:w16du="http://schemas.microsoft.com/office/word/2023/wordml/word16du" xmlns:oel="http://schemas.microsoft.com/office/2019/extlst">
+        <mc:Fallback xmlns:oel="http://schemas.microsoft.com/office/2019/extlst" xmlns:w16du="http://schemas.microsoft.com/office/word/2023/wordml/word16du" xmlns:w16sdtfl="http://schemas.microsoft.com/office/word/2024/wordml/sdtformatlock">
           <w:pict>
             <v:group w14:anchorId="2ED3E864" id="Группа 13" o:spid="_x0000_s1026" style="position:absolute;margin-left:56.85pt;margin-top:18.25pt;width:518.9pt;height:803.85pt;z-index:251656704;mso-position-horizontal-relative:page;mso-position-vertical-relative:page" coordorigin="1134,397" coordsize="10378,16044" o:gfxdata="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" o:allowincell="f">
               <v:line id="Line 4" o:spid="_x0000_s1027" style="position:absolute;visibility:visible;mso-wrap-style:square" from="1134,397" to="1134,16441" o:connectortype="straight" o:gfxdata="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" strokeweight="2.25pt"/>
@@ -16057,6 +16705,120 @@
     </w:lvl>
   </w:abstractNum>
   <w:abstractNum w:abstractNumId="7" w15:restartNumberingAfterBreak="0">
+    <w:nsid w:val="2EF2375D"/>
+    <w:multiLevelType w:val="hybridMultilevel"/>
+    <w:tmpl w:val="38E03ACE"/>
+    <w:lvl w:ilvl="0" w:tplc="382C4B18">
+      <w:start w:val="1"/>
+      <w:numFmt w:val="bullet"/>
+      <w:suff w:val="space"/>
+      <w:lvlText w:val=""/>
+      <w:lvlJc w:val="left"/>
+      <w:pPr>
+        <w:ind w:left="1429" w:hanging="360"/>
+      </w:pPr>
+      <w:rPr>
+        <w:rFonts w:ascii="Symbol" w:hAnsi="Symbol" w:hint="default"/>
+      </w:rPr>
+    </w:lvl>
+    <w:lvl w:ilvl="1" w:tplc="04190003" w:tentative="1">
+      <w:start w:val="1"/>
+      <w:numFmt w:val="bullet"/>
+      <w:lvlText w:val="o"/>
+      <w:lvlJc w:val="left"/>
+      <w:pPr>
+        <w:ind w:left="2149" w:hanging="360"/>
+      </w:pPr>
+      <w:rPr>
+        <w:rFonts w:ascii="Courier New" w:hAnsi="Courier New" w:cs="Courier New" w:hint="default"/>
+      </w:rPr>
+    </w:lvl>
+    <w:lvl w:ilvl="2" w:tplc="04190005" w:tentative="1">
+      <w:start w:val="1"/>
+      <w:numFmt w:val="bullet"/>
+      <w:lvlText w:val=""/>
+      <w:lvlJc w:val="left"/>
+      <w:pPr>
+        <w:ind w:left="2869" w:hanging="360"/>
+      </w:pPr>
+      <w:rPr>
+        <w:rFonts w:ascii="Wingdings" w:hAnsi="Wingdings" w:hint="default"/>
+      </w:rPr>
+    </w:lvl>
+    <w:lvl w:ilvl="3" w:tplc="04190001" w:tentative="1">
+      <w:start w:val="1"/>
+      <w:numFmt w:val="bullet"/>
+      <w:lvlText w:val=""/>
+      <w:lvlJc w:val="left"/>
+      <w:pPr>
+        <w:ind w:left="3589" w:hanging="360"/>
+      </w:pPr>
+      <w:rPr>
+        <w:rFonts w:ascii="Symbol" w:hAnsi="Symbol" w:hint="default"/>
+      </w:rPr>
+    </w:lvl>
+    <w:lvl w:ilvl="4" w:tplc="04190003" w:tentative="1">
+      <w:start w:val="1"/>
+      <w:numFmt w:val="bullet"/>
+      <w:lvlText w:val="o"/>
+      <w:lvlJc w:val="left"/>
+      <w:pPr>
+        <w:ind w:left="4309" w:hanging="360"/>
+      </w:pPr>
+      <w:rPr>
+        <w:rFonts w:ascii="Courier New" w:hAnsi="Courier New" w:cs="Courier New" w:hint="default"/>
+      </w:rPr>
+    </w:lvl>
+    <w:lvl w:ilvl="5" w:tplc="04190005" w:tentative="1">
+      <w:start w:val="1"/>
+      <w:numFmt w:val="bullet"/>
+      <w:lvlText w:val=""/>
+      <w:lvlJc w:val="left"/>
+      <w:pPr>
+        <w:ind w:left="5029" w:hanging="360"/>
+      </w:pPr>
+      <w:rPr>
+        <w:rFonts w:ascii="Wingdings" w:hAnsi="Wingdings" w:hint="default"/>
+      </w:rPr>
+    </w:lvl>
+    <w:lvl w:ilvl="6" w:tplc="04190001" w:tentative="1">
+      <w:start w:val="1"/>
+      <w:numFmt w:val="bullet"/>
+      <w:lvlText w:val=""/>
+      <w:lvlJc w:val="left"/>
+      <w:pPr>
+        <w:ind w:left="5749" w:hanging="360"/>
+      </w:pPr>
+      <w:rPr>
+        <w:rFonts w:ascii="Symbol" w:hAnsi="Symbol" w:hint="default"/>
+      </w:rPr>
+    </w:lvl>
+    <w:lvl w:ilvl="7" w:tplc="04190003" w:tentative="1">
+      <w:start w:val="1"/>
+      <w:numFmt w:val="bullet"/>
+      <w:lvlText w:val="o"/>
+      <w:lvlJc w:val="left"/>
+      <w:pPr>
+        <w:ind w:left="6469" w:hanging="360"/>
+      </w:pPr>
+      <w:rPr>
+        <w:rFonts w:ascii="Courier New" w:hAnsi="Courier New" w:cs="Courier New" w:hint="default"/>
+      </w:rPr>
+    </w:lvl>
+    <w:lvl w:ilvl="8" w:tplc="04190005" w:tentative="1">
+      <w:start w:val="1"/>
+      <w:numFmt w:val="bullet"/>
+      <w:lvlText w:val=""/>
+      <w:lvlJc w:val="left"/>
+      <w:pPr>
+        <w:ind w:left="7189" w:hanging="360"/>
+      </w:pPr>
+      <w:rPr>
+        <w:rFonts w:ascii="Wingdings" w:hAnsi="Wingdings" w:hint="default"/>
+      </w:rPr>
+    </w:lvl>
+  </w:abstractNum>
+  <w:abstractNum w:abstractNumId="8" w15:restartNumberingAfterBreak="0">
     <w:nsid w:val="4236506B"/>
     <w:multiLevelType w:val="hybridMultilevel"/>
     <w:tmpl w:val="B632188C"/>
@@ -16169,7 +16931,121 @@
       </w:rPr>
     </w:lvl>
   </w:abstractNum>
-  <w:abstractNum w:abstractNumId="8" w15:restartNumberingAfterBreak="0">
+  <w:abstractNum w:abstractNumId="9" w15:restartNumberingAfterBreak="0">
+    <w:nsid w:val="4BC03A67"/>
+    <w:multiLevelType w:val="hybridMultilevel"/>
+    <w:tmpl w:val="74DCBDE6"/>
+    <w:lvl w:ilvl="0" w:tplc="8F52A066">
+      <w:start w:val="1"/>
+      <w:numFmt w:val="bullet"/>
+      <w:suff w:val="space"/>
+      <w:lvlText w:val=""/>
+      <w:lvlJc w:val="left"/>
+      <w:pPr>
+        <w:ind w:left="1069" w:firstLine="0"/>
+      </w:pPr>
+      <w:rPr>
+        <w:rFonts w:ascii="Symbol" w:hAnsi="Symbol" w:hint="default"/>
+      </w:rPr>
+    </w:lvl>
+    <w:lvl w:ilvl="1" w:tplc="FFFFFFFF" w:tentative="1">
+      <w:start w:val="1"/>
+      <w:numFmt w:val="bullet"/>
+      <w:lvlText w:val="o"/>
+      <w:lvlJc w:val="left"/>
+      <w:pPr>
+        <w:ind w:left="2149" w:hanging="360"/>
+      </w:pPr>
+      <w:rPr>
+        <w:rFonts w:ascii="Courier New" w:hAnsi="Courier New" w:cs="Courier New" w:hint="default"/>
+      </w:rPr>
+    </w:lvl>
+    <w:lvl w:ilvl="2" w:tplc="FFFFFFFF" w:tentative="1">
+      <w:start w:val="1"/>
+      <w:numFmt w:val="bullet"/>
+      <w:lvlText w:val=""/>
+      <w:lvlJc w:val="left"/>
+      <w:pPr>
+        <w:ind w:left="2869" w:hanging="360"/>
+      </w:pPr>
+      <w:rPr>
+        <w:rFonts w:ascii="Wingdings" w:hAnsi="Wingdings" w:hint="default"/>
+      </w:rPr>
+    </w:lvl>
+    <w:lvl w:ilvl="3" w:tplc="FFFFFFFF" w:tentative="1">
+      <w:start w:val="1"/>
+      <w:numFmt w:val="bullet"/>
+      <w:lvlText w:val=""/>
+      <w:lvlJc w:val="left"/>
+      <w:pPr>
+        <w:ind w:left="3589" w:hanging="360"/>
+      </w:pPr>
+      <w:rPr>
+        <w:rFonts w:ascii="Symbol" w:hAnsi="Symbol" w:hint="default"/>
+      </w:rPr>
+    </w:lvl>
+    <w:lvl w:ilvl="4" w:tplc="FFFFFFFF" w:tentative="1">
+      <w:start w:val="1"/>
+      <w:numFmt w:val="bullet"/>
+      <w:lvlText w:val="o"/>
+      <w:lvlJc w:val="left"/>
+      <w:pPr>
+        <w:ind w:left="4309" w:hanging="360"/>
+      </w:pPr>
+      <w:rPr>
+        <w:rFonts w:ascii="Courier New" w:hAnsi="Courier New" w:cs="Courier New" w:hint="default"/>
+      </w:rPr>
+    </w:lvl>
+    <w:lvl w:ilvl="5" w:tplc="FFFFFFFF" w:tentative="1">
+      <w:start w:val="1"/>
+      <w:numFmt w:val="bullet"/>
+      <w:lvlText w:val=""/>
+      <w:lvlJc w:val="left"/>
+      <w:pPr>
+        <w:ind w:left="5029" w:hanging="360"/>
+      </w:pPr>
+      <w:rPr>
+        <w:rFonts w:ascii="Wingdings" w:hAnsi="Wingdings" w:hint="default"/>
+      </w:rPr>
+    </w:lvl>
+    <w:lvl w:ilvl="6" w:tplc="FFFFFFFF" w:tentative="1">
+      <w:start w:val="1"/>
+      <w:numFmt w:val="bullet"/>
+      <w:lvlText w:val=""/>
+      <w:lvlJc w:val="left"/>
+      <w:pPr>
+        <w:ind w:left="5749" w:hanging="360"/>
+      </w:pPr>
+      <w:rPr>
+        <w:rFonts w:ascii="Symbol" w:hAnsi="Symbol" w:hint="default"/>
+      </w:rPr>
+    </w:lvl>
+    <w:lvl w:ilvl="7" w:tplc="FFFFFFFF" w:tentative="1">
+      <w:start w:val="1"/>
+      <w:numFmt w:val="bullet"/>
+      <w:lvlText w:val="o"/>
+      <w:lvlJc w:val="left"/>
+      <w:pPr>
+        <w:ind w:left="6469" w:hanging="360"/>
+      </w:pPr>
+      <w:rPr>
+        <w:rFonts w:ascii="Courier New" w:hAnsi="Courier New" w:cs="Courier New" w:hint="default"/>
+      </w:rPr>
+    </w:lvl>
+    <w:lvl w:ilvl="8" w:tplc="FFFFFFFF" w:tentative="1">
+      <w:start w:val="1"/>
+      <w:numFmt w:val="bullet"/>
+      <w:lvlText w:val=""/>
+      <w:lvlJc w:val="left"/>
+      <w:pPr>
+        <w:ind w:left="7189" w:hanging="360"/>
+      </w:pPr>
+      <w:rPr>
+        <w:rFonts w:ascii="Wingdings" w:hAnsi="Wingdings" w:hint="default"/>
+      </w:rPr>
+    </w:lvl>
+  </w:abstractNum>
+  <w:abstractNum w:abstractNumId="10" w15:restartNumberingAfterBreak="0">
     <w:nsid w:val="4E792DB3"/>
     <w:multiLevelType w:val="hybridMultilevel"/>
     <w:tmpl w:val="ECBEF210"/>
@@ -16283,7 +17159,234 @@
       </w:rPr>
     </w:lvl>
   </w:abstractNum>
-  <w:abstractNum w:abstractNumId="9" w15:restartNumberingAfterBreak="0">
+  <w:abstractNum w:abstractNumId="11" w15:restartNumberingAfterBreak="0">
+    <w:nsid w:val="53831BAC"/>
+    <w:multiLevelType w:val="hybridMultilevel"/>
+    <w:tmpl w:val="D8585124"/>
+    <w:lvl w:ilvl="0" w:tplc="146E00BE">
+      <w:start w:val="1"/>
+      <w:numFmt w:val="bullet"/>
+      <w:suff w:val="space"/>
+      <w:lvlText w:val=""/>
+      <w:lvlJc w:val="left"/>
+      <w:pPr>
+        <w:ind w:left="1429" w:hanging="360"/>
+      </w:pPr>
+      <w:rPr>
+        <w:rFonts w:ascii="Symbol" w:hAnsi="Symbol" w:hint="default"/>
+      </w:rPr>
+    </w:lvl>
+    <w:lvl w:ilvl="1" w:tplc="04190003" w:tentative="1">
+      <w:start w:val="1"/>
+      <w:numFmt w:val="bullet"/>
+      <w:lvlText w:val="o"/>
+      <w:lvlJc w:val="left"/>
+      <w:pPr>
+        <w:ind w:left="1440" w:hanging="360"/>
+      </w:pPr>
+      <w:rPr>
+        <w:rFonts w:ascii="Courier New" w:hAnsi="Courier New" w:cs="Courier New" w:hint="default"/>
+      </w:rPr>
+    </w:lvl>
+    <w:lvl w:ilvl="2" w:tplc="04190005" w:tentative="1">
+      <w:start w:val="1"/>
+      <w:numFmt w:val="bullet"/>
+      <w:lvlText w:val=""/>
+      <w:lvlJc w:val="left"/>
+      <w:pPr>
+        <w:ind w:left="2160" w:hanging="360"/>
+      </w:pPr>
+      <w:rPr>
+        <w:rFonts w:ascii="Wingdings" w:hAnsi="Wingdings" w:hint="default"/>
+      </w:rPr>
+    </w:lvl>
+    <w:lvl w:ilvl="3" w:tplc="04190001" w:tentative="1">
+      <w:start w:val="1"/>
+      <w:numFmt w:val="bullet"/>
+      <w:lvlText w:val=""/>
+      <w:lvlJc w:val="left"/>
+      <w:pPr>
+        <w:ind w:left="2880" w:hanging="360"/>
+      </w:pPr>
+      <w:rPr>
+        <w:rFonts w:ascii="Symbol" w:hAnsi="Symbol" w:hint="default"/>
+      </w:rPr>
+    </w:lvl>
+    <w:lvl w:ilvl="4" w:tplc="04190003" w:tentative="1">
+      <w:start w:val="1"/>
+      <w:numFmt w:val="bullet"/>
+      <w:lvlText w:val="o"/>
+      <w:lvlJc w:val="left"/>
+      <w:pPr>
+        <w:ind w:left="3600" w:hanging="360"/>
+      </w:pPr>
+      <w:rPr>
+        <w:rFonts w:ascii="Courier New" w:hAnsi="Courier New" w:cs="Courier New" w:hint="default"/>
+      </w:rPr>
+    </w:lvl>
+    <w:lvl w:ilvl="5" w:tplc="04190005" w:tentative="1">
+      <w:start w:val="1"/>
+      <w:numFmt w:val="bullet"/>
+      <w:lvlText w:val=""/>
+      <w:lvlJc w:val="left"/>
+      <w:pPr>
+        <w:ind w:left="4320" w:hanging="360"/>
+      </w:pPr>
+      <w:rPr>
+        <w:rFonts w:ascii="Wingdings" w:hAnsi="Wingdings" w:hint="default"/>
+      </w:rPr>
+    </w:lvl>
+    <w:lvl w:ilvl="6" w:tplc="04190001" w:tentative="1">
+      <w:start w:val="1"/>
+      <w:numFmt w:val="bullet"/>
+      <w:lvlText w:val=""/>
+      <w:lvlJc w:val="left"/>
+      <w:pPr>
+        <w:ind w:left="5040" w:hanging="360"/>
+      </w:pPr>
+      <w:rPr>
+        <w:rFonts w:ascii="Symbol" w:hAnsi="Symbol" w:hint="default"/>
+      </w:rPr>
+    </w:lvl>
+    <w:lvl w:ilvl="7" w:tplc="04190003" w:tentative="1">
+      <w:start w:val="1"/>
+      <w:numFmt w:val="bullet"/>
+      <w:lvlText w:val="o"/>
+      <w:lvlJc w:val="left"/>
+      <w:pPr>
+        <w:ind w:left="5760" w:hanging="360"/>
+      </w:pPr>
+      <w:rPr>
+        <w:rFonts w:ascii="Courier New" w:hAnsi="Courier New" w:cs="Courier New" w:hint="default"/>
+      </w:rPr>
+    </w:lvl>
+    <w:lvl w:ilvl="8" w:tplc="04190005" w:tentative="1">
+      <w:start w:val="1"/>
+      <w:numFmt w:val="bullet"/>
+      <w:lvlText w:val=""/>
+      <w:lvlJc w:val="left"/>
+      <w:pPr>
+        <w:ind w:left="6480" w:hanging="360"/>
+      </w:pPr>
+      <w:rPr>
+        <w:rFonts w:ascii="Wingdings" w:hAnsi="Wingdings" w:hint="default"/>
+      </w:rPr>
+    </w:lvl>
+  </w:abstractNum>
+  <w:abstractNum w:abstractNumId="12" w15:restartNumberingAfterBreak="0">
+    <w:nsid w:val="59717DB0"/>
+    <w:multiLevelType w:val="hybridMultilevel"/>
+    <w:tmpl w:val="5F48DCB0"/>
+    <w:lvl w:ilvl="0" w:tplc="057E2DDE">
+      <w:start w:val="1"/>
+      <w:numFmt w:val="bullet"/>
+      <w:lvlText w:val=""/>
+      <w:lvlJc w:val="left"/>
+      <w:pPr>
+        <w:ind w:left="1429" w:hanging="360"/>
+      </w:pPr>
+      <w:rPr>
+        <w:rFonts w:ascii="Symbol" w:hAnsi="Symbol" w:hint="default"/>
+      </w:rPr>
+    </w:lvl>
+    <w:lvl w:ilvl="1" w:tplc="04190003" w:tentative="1">
+      <w:start w:val="1"/>
+      <w:numFmt w:val="bullet"/>
+      <w:lvlText w:val="o"/>
+      <w:lvlJc w:val="left"/>
+      <w:pPr>
+        <w:ind w:left="2149" w:hanging="360"/>
+      </w:pPr>
+      <w:rPr>
+        <w:rFonts w:ascii="Courier New" w:hAnsi="Courier New" w:cs="Courier New" w:hint="default"/>
+      </w:rPr>
+    </w:lvl>
+    <w:lvl w:ilvl="2" w:tplc="04190005" w:tentative="1">
+      <w:start w:val="1"/>
+      <w:numFmt w:val="bullet"/>
+      <w:lvlText w:val=""/>
+      <w:lvlJc w:val="left"/>
+      <w:pPr>
+        <w:ind w:left="2869" w:hanging="360"/>
+      </w:pPr>
+      <w:rPr>
+        <w:rFonts w:ascii="Wingdings" w:hAnsi="Wingdings" w:hint="default"/>
+      </w:rPr>
+    </w:lvl>
+    <w:lvl w:ilvl="3" w:tplc="04190001" w:tentative="1">
+      <w:start w:val="1"/>
+      <w:numFmt w:val="bullet"/>
+      <w:lvlText w:val=""/>
+      <w:lvlJc w:val="left"/>
+      <w:pPr>
+        <w:ind w:left="3589" w:hanging="360"/>
+      </w:pPr>
+      <w:rPr>
+        <w:rFonts w:ascii="Symbol" w:hAnsi="Symbol" w:hint="default"/>
+      </w:rPr>
+    </w:lvl>
+    <w:lvl w:ilvl="4" w:tplc="04190003" w:tentative="1">
+      <w:start w:val="1"/>
+      <w:numFmt w:val="bullet"/>
+      <w:lvlText w:val="o"/>
+      <w:lvlJc w:val="left"/>
+      <w:pPr>
+        <w:ind w:left="4309" w:hanging="360"/>
+      </w:pPr>
+      <w:rPr>
+        <w:rFonts w:ascii="Courier New" w:hAnsi="Courier New" w:cs="Courier New" w:hint="default"/>
+      </w:rPr>
+    </w:lvl>
+    <w:lvl w:ilvl="5" w:tplc="04190005" w:tentative="1">
+      <w:start w:val="1"/>
+      <w:numFmt w:val="bullet"/>
+      <w:lvlText w:val=""/>
+      <w:lvlJc w:val="left"/>
+      <w:pPr>
+        <w:ind w:left="5029" w:hanging="360"/>
+      </w:pPr>
+      <w:rPr>
+        <w:rFonts w:ascii="Wingdings" w:hAnsi="Wingdings" w:hint="default"/>
+      </w:rPr>
+    </w:lvl>
+    <w:lvl w:ilvl="6" w:tplc="04190001" w:tentative="1">
+      <w:start w:val="1"/>
+      <w:numFmt w:val="bullet"/>
+      <w:lvlText w:val=""/>
+      <w:lvlJc w:val="left"/>
+      <w:pPr>
+        <w:ind w:left="5749" w:hanging="360"/>
+      </w:pPr>
+      <w:rPr>
+        <w:rFonts w:ascii="Symbol" w:hAnsi="Symbol" w:hint="default"/>
+      </w:rPr>
+    </w:lvl>
+    <w:lvl w:ilvl="7" w:tplc="04190003" w:tentative="1">
+      <w:start w:val="1"/>
+      <w:numFmt w:val="bullet"/>
+      <w:lvlText w:val="o"/>
+      <w:lvlJc w:val="left"/>
+      <w:pPr>
+        <w:ind w:left="6469" w:hanging="360"/>
+      </w:pPr>
+      <w:rPr>
+        <w:rFonts w:ascii="Courier New" w:hAnsi="Courier New" w:cs="Courier New" w:hint="default"/>
+      </w:rPr>
+    </w:lvl>
+    <w:lvl w:ilvl="8" w:tplc="04190005" w:tentative="1">
+      <w:start w:val="1"/>
+      <w:numFmt w:val="bullet"/>
+      <w:lvlText w:val=""/>
+      <w:lvlJc w:val="left"/>
+      <w:pPr>
+        <w:ind w:left="7189" w:hanging="360"/>
+      </w:pPr>
+      <w:rPr>
+        <w:rFonts w:ascii="Wingdings" w:hAnsi="Wingdings" w:hint="default"/>
+      </w:rPr>
+    </w:lvl>
+  </w:abstractNum>
+  <w:abstractNum w:abstractNumId="13" w15:restartNumberingAfterBreak="0">
     <w:nsid w:val="5AD2032B"/>
     <w:multiLevelType w:val="hybridMultilevel"/>
     <w:tmpl w:val="502C1680"/>
@@ -16397,7 +17500,7 @@
       </w:rPr>
     </w:lvl>
   </w:abstractNum>
-  <w:abstractNum w:abstractNumId="10" w15:restartNumberingAfterBreak="0">
+  <w:abstractNum w:abstractNumId="14" w15:restartNumberingAfterBreak="0">
     <w:nsid w:val="5E9D081E"/>
     <w:multiLevelType w:val="multilevel"/>
     <w:tmpl w:val="31FAC168"/>
@@ -16489,7 +17592,7 @@
       </w:pPr>
     </w:lvl>
   </w:abstractNum>
-  <w:abstractNum w:abstractNumId="11" w15:restartNumberingAfterBreak="0">
+  <w:abstractNum w:abstractNumId="15" w15:restartNumberingAfterBreak="0">
     <w:nsid w:val="67EC04CD"/>
     <w:multiLevelType w:val="hybridMultilevel"/>
     <w:tmpl w:val="B5DA1F26"/>
@@ -16602,7 +17705,348 @@
       </w:rPr>
     </w:lvl>
   </w:abstractNum>
-  <w:abstractNum w:abstractNumId="12" w15:restartNumberingAfterBreak="0">
+  <w:abstractNum w:abstractNumId="16" w15:restartNumberingAfterBreak="0">
+    <w:nsid w:val="683624AC"/>
+    <w:multiLevelType w:val="hybridMultilevel"/>
+    <w:tmpl w:val="2A22B20A"/>
+    <w:lvl w:ilvl="0" w:tplc="057E2DDE">
+      <w:start w:val="1"/>
+      <w:numFmt w:val="bullet"/>
+      <w:lvlText w:val=""/>
+      <w:lvlJc w:val="left"/>
+      <w:pPr>
+        <w:ind w:left="720" w:hanging="360"/>
+      </w:pPr>
+      <w:rPr>
+        <w:rFonts w:ascii="Symbol" w:hAnsi="Symbol" w:hint="default"/>
+      </w:rPr>
+    </w:lvl>
+    <w:lvl w:ilvl="1" w:tplc="04190003" w:tentative="1">
+      <w:start w:val="1"/>
+      <w:numFmt w:val="bullet"/>
+      <w:lvlText w:val="o"/>
+      <w:lvlJc w:val="left"/>
+      <w:pPr>
+        <w:ind w:left="1440" w:hanging="360"/>
+      </w:pPr>
+      <w:rPr>
+        <w:rFonts w:ascii="Courier New" w:hAnsi="Courier New" w:cs="Courier New" w:hint="default"/>
+      </w:rPr>
+    </w:lvl>
+    <w:lvl w:ilvl="2" w:tplc="04190005" w:tentative="1">
+      <w:start w:val="1"/>
+      <w:numFmt w:val="bullet"/>
+      <w:lvlText w:val=""/>
+      <w:lvlJc w:val="left"/>
+      <w:pPr>
+        <w:ind w:left="2160" w:hanging="360"/>
+      </w:pPr>
+      <w:rPr>
+        <w:rFonts w:ascii="Wingdings" w:hAnsi="Wingdings" w:hint="default"/>
+      </w:rPr>
+    </w:lvl>
+    <w:lvl w:ilvl="3" w:tplc="04190001" w:tentative="1">
+      <w:start w:val="1"/>
+      <w:numFmt w:val="bullet"/>
+      <w:lvlText w:val=""/>
+      <w:lvlJc w:val="left"/>
+      <w:pPr>
+        <w:ind w:left="2880" w:hanging="360"/>
+      </w:pPr>
+      <w:rPr>
+        <w:rFonts w:ascii="Symbol" w:hAnsi="Symbol" w:hint="default"/>
+      </w:rPr>
+    </w:lvl>
+    <w:lvl w:ilvl="4" w:tplc="04190003" w:tentative="1">
+      <w:start w:val="1"/>
+      <w:numFmt w:val="bullet"/>
+      <w:lvlText w:val="o"/>
+      <w:lvlJc w:val="left"/>
+      <w:pPr>
+        <w:ind w:left="3600" w:hanging="360"/>
+      </w:pPr>
+      <w:rPr>
+        <w:rFonts w:ascii="Courier New" w:hAnsi="Courier New" w:cs="Courier New" w:hint="default"/>
+      </w:rPr>
+    </w:lvl>
+    <w:lvl w:ilvl="5" w:tplc="04190005" w:tentative="1">
+      <w:start w:val="1"/>
+      <w:numFmt w:val="bullet"/>
+      <w:lvlText w:val=""/>
+      <w:lvlJc w:val="left"/>
+      <w:pPr>
+        <w:ind w:left="4320" w:hanging="360"/>
+      </w:pPr>
+      <w:rPr>
+        <w:rFonts w:ascii="Wingdings" w:hAnsi="Wingdings" w:hint="default"/>
+      </w:rPr>
+    </w:lvl>
+    <w:lvl w:ilvl="6" w:tplc="04190001" w:tentative="1">
+      <w:start w:val="1"/>
+      <w:numFmt w:val="bullet"/>
+      <w:lvlText w:val=""/>
+      <w:lvlJc w:val="left"/>
+      <w:pPr>
+        <w:ind w:left="5040" w:hanging="360"/>
+      </w:pPr>
+      <w:rPr>
+        <w:rFonts w:ascii="Symbol" w:hAnsi="Symbol" w:hint="default"/>
+      </w:rPr>
+    </w:lvl>
+    <w:lvl w:ilvl="7" w:tplc="04190003" w:tentative="1">
+      <w:start w:val="1"/>
+      <w:numFmt w:val="bullet"/>
+      <w:lvlText w:val="o"/>
+      <w:lvlJc w:val="left"/>
+      <w:pPr>
+        <w:ind w:left="5760" w:hanging="360"/>
+      </w:pPr>
+      <w:rPr>
+        <w:rFonts w:ascii="Courier New" w:hAnsi="Courier New" w:cs="Courier New" w:hint="default"/>
+      </w:rPr>
+    </w:lvl>
+    <w:lvl w:ilvl="8" w:tplc="04190005" w:tentative="1">
+      <w:start w:val="1"/>
+      <w:numFmt w:val="bullet"/>
+      <w:lvlText w:val=""/>
+      <w:lvlJc w:val="left"/>
+      <w:pPr>
+        <w:ind w:left="6480" w:hanging="360"/>
+      </w:pPr>
+      <w:rPr>
+        <w:rFonts w:ascii="Wingdings" w:hAnsi="Wingdings" w:hint="default"/>
+      </w:rPr>
+    </w:lvl>
+  </w:abstractNum>
+  <w:abstractNum w:abstractNumId="17" w15:restartNumberingAfterBreak="0">
+    <w:nsid w:val="694712C6"/>
+    <w:multiLevelType w:val="hybridMultilevel"/>
+    <w:tmpl w:val="EAC2B37A"/>
+    <w:lvl w:ilvl="0" w:tplc="2ED4F196">
+      <w:start w:val="1"/>
+      <w:numFmt w:val="bullet"/>
+      <w:suff w:val="space"/>
+      <w:lvlText w:val=""/>
+      <w:lvlJc w:val="left"/>
+      <w:pPr>
+        <w:ind w:left="1429" w:hanging="360"/>
+      </w:pPr>
+      <w:rPr>
+        <w:rFonts w:ascii="Symbol" w:hAnsi="Symbol" w:hint="default"/>
+      </w:rPr>
+    </w:lvl>
+    <w:lvl w:ilvl="1" w:tplc="04190003" w:tentative="1">
+      <w:start w:val="1"/>
+      <w:numFmt w:val="bullet"/>
+      <w:lvlText w:val="o"/>
+      <w:lvlJc w:val="left"/>
+      <w:pPr>
+        <w:ind w:left="1440" w:hanging="360"/>
+      </w:pPr>
+      <w:rPr>
+        <w:rFonts w:ascii="Courier New" w:hAnsi="Courier New" w:cs="Courier New" w:hint="default"/>
+      </w:rPr>
+    </w:lvl>
+    <w:lvl w:ilvl="2" w:tplc="04190005" w:tentative="1">
+      <w:start w:val="1"/>
+      <w:numFmt w:val="bullet"/>
+      <w:lvlText w:val=""/>
+      <w:lvlJc w:val="left"/>
+      <w:pPr>
+        <w:ind w:left="2160" w:hanging="360"/>
+      </w:pPr>
+      <w:rPr>
+        <w:rFonts w:ascii="Wingdings" w:hAnsi="Wingdings" w:hint="default"/>
+      </w:rPr>
+    </w:lvl>
+    <w:lvl w:ilvl="3" w:tplc="04190001" w:tentative="1">
+      <w:start w:val="1"/>
+      <w:numFmt w:val="bullet"/>
+      <w:lvlText w:val=""/>
+      <w:lvlJc w:val="left"/>
+      <w:pPr>
+        <w:ind w:left="2880" w:hanging="360"/>
+      </w:pPr>
+      <w:rPr>
+        <w:rFonts w:ascii="Symbol" w:hAnsi="Symbol" w:hint="default"/>
+      </w:rPr>
+    </w:lvl>
+    <w:lvl w:ilvl="4" w:tplc="04190003" w:tentative="1">
+      <w:start w:val="1"/>
+      <w:numFmt w:val="bullet"/>
+      <w:lvlText w:val="o"/>
+      <w:lvlJc w:val="left"/>
+      <w:pPr>
+        <w:ind w:left="3600" w:hanging="360"/>
+      </w:pPr>
+      <w:rPr>
+        <w:rFonts w:ascii="Courier New" w:hAnsi="Courier New" w:cs="Courier New" w:hint="default"/>
+      </w:rPr>
+    </w:lvl>
+    <w:lvl w:ilvl="5" w:tplc="04190005" w:tentative="1">
+      <w:start w:val="1"/>
+      <w:numFmt w:val="bullet"/>
+      <w:lvlText w:val=""/>
+      <w:lvlJc w:val="left"/>
+      <w:pPr>
+        <w:ind w:left="4320" w:hanging="360"/>
+      </w:pPr>
+      <w:rPr>
+        <w:rFonts w:ascii="Wingdings" w:hAnsi="Wingdings" w:hint="default"/>
+      </w:rPr>
+    </w:lvl>
+    <w:lvl w:ilvl="6" w:tplc="04190001" w:tentative="1">
+      <w:start w:val="1"/>
+      <w:numFmt w:val="bullet"/>
+      <w:lvlText w:val=""/>
+      <w:lvlJc w:val="left"/>
+      <w:pPr>
+        <w:ind w:left="5040" w:hanging="360"/>
+      </w:pPr>
+      <w:rPr>
+        <w:rFonts w:ascii="Symbol" w:hAnsi="Symbol" w:hint="default"/>
+      </w:rPr>
+    </w:lvl>
+    <w:lvl w:ilvl="7" w:tplc="04190003" w:tentative="1">
+      <w:start w:val="1"/>
+      <w:numFmt w:val="bullet"/>
+      <w:lvlText w:val="o"/>
+      <w:lvlJc w:val="left"/>
+      <w:pPr>
+        <w:ind w:left="5760" w:hanging="360"/>
+      </w:pPr>
+      <w:rPr>
+        <w:rFonts w:ascii="Courier New" w:hAnsi="Courier New" w:cs="Courier New" w:hint="default"/>
+      </w:rPr>
+    </w:lvl>
+    <w:lvl w:ilvl="8" w:tplc="04190005" w:tentative="1">
+      <w:start w:val="1"/>
+      <w:numFmt w:val="bullet"/>
+      <w:lvlText w:val=""/>
+      <w:lvlJc w:val="left"/>
+      <w:pPr>
+        <w:ind w:left="6480" w:hanging="360"/>
+      </w:pPr>
+      <w:rPr>
+        <w:rFonts w:ascii="Wingdings" w:hAnsi="Wingdings" w:hint="default"/>
+      </w:rPr>
+    </w:lvl>
+  </w:abstractNum>
+  <w:abstractNum w:abstractNumId="18" w15:restartNumberingAfterBreak="0">
+    <w:nsid w:val="69E67D61"/>
+    <w:multiLevelType w:val="hybridMultilevel"/>
+    <w:tmpl w:val="383A52F8"/>
+    <w:lvl w:ilvl="0" w:tplc="619033F2">
+      <w:start w:val="1"/>
+      <w:numFmt w:val="bullet"/>
+      <w:suff w:val="space"/>
+      <w:lvlText w:val=""/>
+      <w:lvlJc w:val="left"/>
+      <w:pPr>
+        <w:ind w:left="1069" w:firstLine="0"/>
+      </w:pPr>
+      <w:rPr>
+        <w:rFonts w:ascii="Symbol" w:hAnsi="Symbol" w:hint="default"/>
+      </w:rPr>
+    </w:lvl>
+    <w:lvl w:ilvl="1" w:tplc="FFFFFFFF" w:tentative="1">
+      <w:start w:val="1"/>
+      <w:numFmt w:val="bullet"/>
+      <w:lvlText w:val="o"/>
+      <w:lvlJc w:val="left"/>
+      <w:pPr>
+        <w:ind w:left="2149" w:hanging="360"/>
+      </w:pPr>
+      <w:rPr>
+        <w:rFonts w:ascii="Courier New" w:hAnsi="Courier New" w:cs="Courier New" w:hint="default"/>
+      </w:rPr>
+    </w:lvl>
+    <w:lvl w:ilvl="2" w:tplc="FFFFFFFF" w:tentative="1">
+      <w:start w:val="1"/>
+      <w:numFmt w:val="bullet"/>
+      <w:lvlText w:val=""/>
+      <w:lvlJc w:val="left"/>
+      <w:pPr>
+        <w:ind w:left="2869" w:hanging="360"/>
+      </w:pPr>
+      <w:rPr>
+        <w:rFonts w:ascii="Wingdings" w:hAnsi="Wingdings" w:hint="default"/>
+      </w:rPr>
+    </w:lvl>
+    <w:lvl w:ilvl="3" w:tplc="FFFFFFFF" w:tentative="1">
+      <w:start w:val="1"/>
+      <w:numFmt w:val="bullet"/>
+      <w:lvlText w:val=""/>
+      <w:lvlJc w:val="left"/>
+      <w:pPr>
+        <w:ind w:left="3589" w:hanging="360"/>
+      </w:pPr>
+      <w:rPr>
+        <w:rFonts w:ascii="Symbol" w:hAnsi="Symbol" w:hint="default"/>
+      </w:rPr>
+    </w:lvl>
+    <w:lvl w:ilvl="4" w:tplc="FFFFFFFF" w:tentative="1">
+      <w:start w:val="1"/>
+      <w:numFmt w:val="bullet"/>
+      <w:lvlText w:val="o"/>
+      <w:lvlJc w:val="left"/>
+      <w:pPr>
+        <w:ind w:left="4309" w:hanging="360"/>
+      </w:pPr>
+      <w:rPr>
+        <w:rFonts w:ascii="Courier New" w:hAnsi="Courier New" w:cs="Courier New" w:hint="default"/>
+      </w:rPr>
+    </w:lvl>
+    <w:lvl w:ilvl="5" w:tplc="FFFFFFFF" w:tentative="1">
+      <w:start w:val="1"/>
+      <w:numFmt w:val="bullet"/>
+      <w:lvlText w:val=""/>
+      <w:lvlJc w:val="left"/>
+      <w:pPr>
+        <w:ind w:left="5029" w:hanging="360"/>
+      </w:pPr>
+      <w:rPr>
+        <w:rFonts w:ascii="Wingdings" w:hAnsi="Wingdings" w:hint="default"/>
+      </w:rPr>
+    </w:lvl>
+    <w:lvl w:ilvl="6" w:tplc="FFFFFFFF" w:tentative="1">
+      <w:start w:val="1"/>
+      <w:numFmt w:val="bullet"/>
+      <w:lvlText w:val=""/>
+      <w:lvlJc w:val="left"/>
+      <w:pPr>
+        <w:ind w:left="5749" w:hanging="360"/>
+      </w:pPr>
+      <w:rPr>
+        <w:rFonts w:ascii="Symbol" w:hAnsi="Symbol" w:hint="default"/>
+      </w:rPr>
+    </w:lvl>
+    <w:lvl w:ilvl="7" w:tplc="FFFFFFFF" w:tentative="1">
+      <w:start w:val="1"/>
+      <w:numFmt w:val="bullet"/>
+      <w:lvlText w:val="o"/>
+      <w:lvlJc w:val="left"/>
+      <w:pPr>
+        <w:ind w:left="6469" w:hanging="360"/>
+      </w:pPr>
+      <w:rPr>
+        <w:rFonts w:ascii="Courier New" w:hAnsi="Courier New" w:cs="Courier New" w:hint="default"/>
+      </w:rPr>
+    </w:lvl>
+    <w:lvl w:ilvl="8" w:tplc="FFFFFFFF" w:tentative="1">
+      <w:start w:val="1"/>
+      <w:numFmt w:val="bullet"/>
+      <w:lvlText w:val=""/>
+      <w:lvlJc w:val="left"/>
+      <w:pPr>
+        <w:ind w:left="7189" w:hanging="360"/>
+      </w:pPr>
+      <w:rPr>
+        <w:rFonts w:ascii="Wingdings" w:hAnsi="Wingdings" w:hint="default"/>
+      </w:rPr>
+    </w:lvl>
+  </w:abstractNum>
+  <w:abstractNum w:abstractNumId="19" w15:restartNumberingAfterBreak="0">
     <w:nsid w:val="6AB437FC"/>
     <w:multiLevelType w:val="hybridMultilevel"/>
     <w:tmpl w:val="D8FE15E4"/>
@@ -16716,7 +18160,120 @@
       </w:rPr>
     </w:lvl>
   </w:abstractNum>
-  <w:abstractNum w:abstractNumId="13" w15:restartNumberingAfterBreak="0">
+  <w:abstractNum w:abstractNumId="20" w15:restartNumberingAfterBreak="0">
+    <w:nsid w:val="7182502B"/>
+    <w:multiLevelType w:val="hybridMultilevel"/>
+    <w:tmpl w:val="9E3879AE"/>
+    <w:lvl w:ilvl="0" w:tplc="057E2DDE">
+      <w:start w:val="1"/>
+      <w:numFmt w:val="bullet"/>
+      <w:lvlText w:val=""/>
+      <w:lvlJc w:val="left"/>
+      <w:pPr>
+        <w:ind w:left="720" w:hanging="360"/>
+      </w:pPr>
+      <w:rPr>
+        <w:rFonts w:ascii="Symbol" w:hAnsi="Symbol" w:hint="default"/>
+      </w:rPr>
+    </w:lvl>
+    <w:lvl w:ilvl="1" w:tplc="04190003" w:tentative="1">
+      <w:start w:val="1"/>
+      <w:numFmt w:val="bullet"/>
+      <w:lvlText w:val="o"/>
+      <w:lvlJc w:val="left"/>
+      <w:pPr>
+        <w:ind w:left="1440" w:hanging="360"/>
+      </w:pPr>
+      <w:rPr>
+        <w:rFonts w:ascii="Courier New" w:hAnsi="Courier New" w:cs="Courier New" w:hint="default"/>
+      </w:rPr>
+    </w:lvl>
+    <w:lvl w:ilvl="2" w:tplc="04190005" w:tentative="1">
+      <w:start w:val="1"/>
+      <w:numFmt w:val="bullet"/>
+      <w:lvlText w:val=""/>
+      <w:lvlJc w:val="left"/>
+      <w:pPr>
+        <w:ind w:left="2160" w:hanging="360"/>
+      </w:pPr>
+      <w:rPr>
+        <w:rFonts w:ascii="Wingdings" w:hAnsi="Wingdings" w:hint="default"/>
+      </w:rPr>
+    </w:lvl>
+    <w:lvl w:ilvl="3" w:tplc="04190001" w:tentative="1">
+      <w:start w:val="1"/>
+      <w:numFmt w:val="bullet"/>
+      <w:lvlText w:val=""/>
+      <w:lvlJc w:val="left"/>
+      <w:pPr>
+        <w:ind w:left="2880" w:hanging="360"/>
+      </w:pPr>
+      <w:rPr>
+        <w:rFonts w:ascii="Symbol" w:hAnsi="Symbol" w:hint="default"/>
+      </w:rPr>
+    </w:lvl>
+    <w:lvl w:ilvl="4" w:tplc="04190003" w:tentative="1">
+      <w:start w:val="1"/>
+      <w:numFmt w:val="bullet"/>
+      <w:lvlText w:val="o"/>
+      <w:lvlJc w:val="left"/>
+      <w:pPr>
+        <w:ind w:left="3600" w:hanging="360"/>
+      </w:pPr>
+      <w:rPr>
+        <w:rFonts w:ascii="Courier New" w:hAnsi="Courier New" w:cs="Courier New" w:hint="default"/>
+      </w:rPr>
+    </w:lvl>
+    <w:lvl w:ilvl="5" w:tplc="04190005" w:tentative="1">
+      <w:start w:val="1"/>
+      <w:numFmt w:val="bullet"/>
+      <w:lvlText w:val=""/>
+      <w:lvlJc w:val="left"/>
+      <w:pPr>
+        <w:ind w:left="4320" w:hanging="360"/>
+      </w:pPr>
+      <w:rPr>
+        <w:rFonts w:ascii="Wingdings" w:hAnsi="Wingdings" w:hint="default"/>
+      </w:rPr>
+    </w:lvl>
+    <w:lvl w:ilvl="6" w:tplc="04190001" w:tentative="1">
+      <w:start w:val="1"/>
+      <w:numFmt w:val="bullet"/>
+      <w:lvlText w:val=""/>
+      <w:lvlJc w:val="left"/>
+      <w:pPr>
+        <w:ind w:left="5040" w:hanging="360"/>
+      </w:pPr>
+      <w:rPr>
+        <w:rFonts w:ascii="Symbol" w:hAnsi="Symbol" w:hint="default"/>
+      </w:rPr>
+    </w:lvl>
+    <w:lvl w:ilvl="7" w:tplc="04190003" w:tentative="1">
+      <w:start w:val="1"/>
+      <w:numFmt w:val="bullet"/>
+      <w:lvlText w:val="o"/>
+      <w:lvlJc w:val="left"/>
+      <w:pPr>
+        <w:ind w:left="5760" w:hanging="360"/>
+      </w:pPr>
+      <w:rPr>
+        <w:rFonts w:ascii="Courier New" w:hAnsi="Courier New" w:cs="Courier New" w:hint="default"/>
+      </w:rPr>
+    </w:lvl>
+    <w:lvl w:ilvl="8" w:tplc="04190005" w:tentative="1">
+      <w:start w:val="1"/>
+      <w:numFmt w:val="bullet"/>
+      <w:lvlText w:val=""/>
+      <w:lvlJc w:val="left"/>
+      <w:pPr>
+        <w:ind w:left="6480" w:hanging="360"/>
+      </w:pPr>
+      <w:rPr>
+        <w:rFonts w:ascii="Wingdings" w:hAnsi="Wingdings" w:hint="default"/>
+      </w:rPr>
+    </w:lvl>
+  </w:abstractNum>
+  <w:abstractNum w:abstractNumId="21" w15:restartNumberingAfterBreak="0">
     <w:nsid w:val="77F84960"/>
     <w:multiLevelType w:val="hybridMultilevel"/>
     <w:tmpl w:val="6DF4AF4C"/>
@@ -16830,7 +18387,121 @@
       </w:rPr>
     </w:lvl>
   </w:abstractNum>
-  <w:abstractNum w:abstractNumId="14" w15:restartNumberingAfterBreak="0">
+  <w:abstractNum w:abstractNumId="22" w15:restartNumberingAfterBreak="0">
+    <w:nsid w:val="7BF41D9C"/>
+    <w:multiLevelType w:val="hybridMultilevel"/>
+    <w:tmpl w:val="5A1665CE"/>
+    <w:lvl w:ilvl="0" w:tplc="62AE4058">
+      <w:start w:val="1"/>
+      <w:numFmt w:val="bullet"/>
+      <w:suff w:val="space"/>
+      <w:lvlText w:val=""/>
+      <w:lvlJc w:val="left"/>
+      <w:pPr>
+        <w:ind w:left="1429" w:hanging="360"/>
+      </w:pPr>
+      <w:rPr>
+        <w:rFonts w:ascii="Symbol" w:hAnsi="Symbol" w:hint="default"/>
+      </w:rPr>
+    </w:lvl>
+    <w:lvl w:ilvl="1" w:tplc="04190003" w:tentative="1">
+      <w:start w:val="1"/>
+      <w:numFmt w:val="bullet"/>
+      <w:lvlText w:val="o"/>
+      <w:lvlJc w:val="left"/>
+      <w:pPr>
+        <w:ind w:left="1440" w:hanging="360"/>
+      </w:pPr>
+      <w:rPr>
+        <w:rFonts w:ascii="Courier New" w:hAnsi="Courier New" w:cs="Courier New" w:hint="default"/>
+      </w:rPr>
+    </w:lvl>
+    <w:lvl w:ilvl="2" w:tplc="04190005" w:tentative="1">
+      <w:start w:val="1"/>
+      <w:numFmt w:val="bullet"/>
+      <w:lvlText w:val=""/>
+      <w:lvlJc w:val="left"/>
+      <w:pPr>
+        <w:ind w:left="2160" w:hanging="360"/>
+      </w:pPr>
+      <w:rPr>
+        <w:rFonts w:ascii="Wingdings" w:hAnsi="Wingdings" w:hint="default"/>
+      </w:rPr>
+    </w:lvl>
+    <w:lvl w:ilvl="3" w:tplc="04190001" w:tentative="1">
+      <w:start w:val="1"/>
+      <w:numFmt w:val="bullet"/>
+      <w:lvlText w:val=""/>
+      <w:lvlJc w:val="left"/>
+      <w:pPr>
+        <w:ind w:left="2880" w:hanging="360"/>
+      </w:pPr>
+      <w:rPr>
+        <w:rFonts w:ascii="Symbol" w:hAnsi="Symbol" w:hint="default"/>
+      </w:rPr>
+    </w:lvl>
+    <w:lvl w:ilvl="4" w:tplc="04190003" w:tentative="1">
+      <w:start w:val="1"/>
+      <w:numFmt w:val="bullet"/>
+      <w:lvlText w:val="o"/>
+      <w:lvlJc w:val="left"/>
+      <w:pPr>
+        <w:ind w:left="3600" w:hanging="360"/>
+      </w:pPr>
+      <w:rPr>
+        <w:rFonts w:ascii="Courier New" w:hAnsi="Courier New" w:cs="Courier New" w:hint="default"/>
+      </w:rPr>
+    </w:lvl>
+    <w:lvl w:ilvl="5" w:tplc="04190005" w:tentative="1">
+      <w:start w:val="1"/>
+      <w:numFmt w:val="bullet"/>
+      <w:lvlText w:val=""/>
+      <w:lvlJc w:val="left"/>
+      <w:pPr>
+        <w:ind w:left="4320" w:hanging="360"/>
+      </w:pPr>
+      <w:rPr>
+        <w:rFonts w:ascii="Wingdings" w:hAnsi="Wingdings" w:hint="default"/>
+      </w:rPr>
+    </w:lvl>
+    <w:lvl w:ilvl="6" w:tplc="04190001" w:tentative="1">
+      <w:start w:val="1"/>
+      <w:numFmt w:val="bullet"/>
+      <w:lvlText w:val=""/>
+      <w:lvlJc w:val="left"/>
+      <w:pPr>
+        <w:ind w:left="5040" w:hanging="360"/>
+      </w:pPr>
+      <w:rPr>
+        <w:rFonts w:ascii="Symbol" w:hAnsi="Symbol" w:hint="default"/>
+      </w:rPr>
+    </w:lvl>
+    <w:lvl w:ilvl="7" w:tplc="04190003" w:tentative="1">
+      <w:start w:val="1"/>
+      <w:numFmt w:val="bullet"/>
+      <w:lvlText w:val="o"/>
+      <w:lvlJc w:val="left"/>
+      <w:pPr>
+        <w:ind w:left="5760" w:hanging="360"/>
+      </w:pPr>
+      <w:rPr>
+        <w:rFonts w:ascii="Courier New" w:hAnsi="Courier New" w:cs="Courier New" w:hint="default"/>
+      </w:rPr>
+    </w:lvl>
+    <w:lvl w:ilvl="8" w:tplc="04190005" w:tentative="1">
+      <w:start w:val="1"/>
+      <w:numFmt w:val="bullet"/>
+      <w:lvlText w:val=""/>
+      <w:lvlJc w:val="left"/>
+      <w:pPr>
+        <w:ind w:left="6480" w:hanging="360"/>
+      </w:pPr>
+      <w:rPr>
+        <w:rFonts w:ascii="Wingdings" w:hAnsi="Wingdings" w:hint="default"/>
+      </w:rPr>
+    </w:lvl>
+  </w:abstractNum>
+  <w:abstractNum w:abstractNumId="23" w15:restartNumberingAfterBreak="0">
     <w:nsid w:val="7D8A7628"/>
     <w:multiLevelType w:val="hybridMultilevel"/>
     <w:tmpl w:val="4FE8CB7A"/>
@@ -16943,7 +18614,7 @@
       </w:rPr>
     </w:lvl>
   </w:abstractNum>
-  <w:abstractNum w:abstractNumId="15" w15:restartNumberingAfterBreak="0">
+  <w:abstractNum w:abstractNumId="24" w15:restartNumberingAfterBreak="0">
     <w:nsid w:val="7DE75B9C"/>
     <w:multiLevelType w:val="hybridMultilevel"/>
     <w:tmpl w:val="72408CC0"/>
@@ -17056,7 +18727,7 @@
       </w:rPr>
     </w:lvl>
   </w:abstractNum>
-  <w:abstractNum w:abstractNumId="16" w15:restartNumberingAfterBreak="0">
+  <w:abstractNum w:abstractNumId="25" w15:restartNumberingAfterBreak="0">
     <w:nsid w:val="7E794327"/>
     <w:multiLevelType w:val="hybridMultilevel"/>
     <w:tmpl w:val="BFF0D868"/>
@@ -17170,7 +18841,7 @@
     </w:lvl>
   </w:abstractNum>
   <w:num w:numId="1">
-    <w:abstractNumId w:val="10"/>
+    <w:abstractNumId w:val="14"/>
   </w:num>
   <w:num w:numId="2">
     <w:abstractNumId w:val="2"/>
@@ -17185,40 +18856,67 @@
     <w:abstractNumId w:val="3"/>
   </w:num>
   <w:num w:numId="6">
-    <w:abstractNumId w:val="7"/>
+    <w:abstractNumId w:val="8"/>
   </w:num>
   <w:num w:numId="7">
-    <w:abstractNumId w:val="9"/>
+    <w:abstractNumId w:val="13"/>
   </w:num>
   <w:num w:numId="8">
     <w:abstractNumId w:val="4"/>
   </w:num>
   <w:num w:numId="9">
-    <w:abstractNumId w:val="12"/>
+    <w:abstractNumId w:val="19"/>
   </w:num>
   <w:num w:numId="10">
-    <w:abstractNumId w:val="11"/>
+    <w:abstractNumId w:val="15"/>
   </w:num>
   <w:num w:numId="11">
     <w:abstractNumId w:val="6"/>
   </w:num>
   <w:num w:numId="12">
-    <w:abstractNumId w:val="16"/>
+    <w:abstractNumId w:val="25"/>
   </w:num>
   <w:num w:numId="13">
-    <w:abstractNumId w:val="13"/>
+    <w:abstractNumId w:val="21"/>
   </w:num>
   <w:num w:numId="14">
-    <w:abstractNumId w:val="15"/>
+    <w:abstractNumId w:val="24"/>
   </w:num>
   <w:num w:numId="15">
-    <w:abstractNumId w:val="8"/>
+    <w:abstractNumId w:val="10"/>
   </w:num>
   <w:num w:numId="16">
-    <w:abstractNumId w:val="14"/>
+    <w:abstractNumId w:val="23"/>
   </w:num>
   <w:num w:numId="17">
     <w:abstractNumId w:val="0"/>
+  </w:num>
+  <w:num w:numId="18">
+    <w:abstractNumId w:val="12"/>
+  </w:num>
+  <w:num w:numId="19">
+    <w:abstractNumId w:val="9"/>
+  </w:num>
+  <w:num w:numId="20">
+    <w:abstractNumId w:val="18"/>
+  </w:num>
+  <w:num w:numId="21">
+    <w:abstractNumId w:val="7"/>
+  </w:num>
+  <w:num w:numId="22">
+    <w:abstractNumId w:val="20"/>
+  </w:num>
+  <w:num w:numId="23">
+    <w:abstractNumId w:val="17"/>
+  </w:num>
+  <w:num w:numId="24">
+    <w:abstractNumId w:val="16"/>
+  </w:num>
+  <w:num w:numId="25">
+    <w:abstractNumId w:val="11"/>
+  </w:num>
+  <w:num w:numId="26">
+    <w:abstractNumId w:val="22"/>
   </w:num>
   <w:numIdMacAtCleanup w:val="4"/>
 </w:numbering>
@@ -17623,7 +19321,7 @@
   <w:style w:type="paragraph" w:default="1" w:styleId="a">
     <w:name w:val="Normal"/>
     <w:qFormat/>
-    <w:rsid w:val="00CC1A8B"/>
+    <w:rsid w:val="007D07C1"/>
     <w:pPr>
       <w:ind w:firstLine="709"/>
     </w:pPr>

</xml_diff>

<commit_message>
part 2 norm kontrol
</commit_message>
<xml_diff>
--- a/Диплом мешков 23.106.docx
+++ b/Диплом мешков 23.106.docx
@@ -1956,7 +1956,21 @@
                 <w:rStyle w:val="ae"/>
                 <w:noProof/>
               </w:rPr>
-              <w:t xml:space="preserve"> (Обязательное) </w:t>
+              <w:t xml:space="preserve"> (</w:t>
+            </w:r>
+            <w:r>
+              <w:rPr>
+                <w:rStyle w:val="ae"/>
+                <w:noProof/>
+              </w:rPr>
+              <w:t>о</w:t>
+            </w:r>
+            <w:r>
+              <w:rPr>
+                <w:rStyle w:val="ae"/>
+                <w:noProof/>
+              </w:rPr>
+              <w:t xml:space="preserve">бязательное) </w:t>
             </w:r>
             <w:r>
               <w:rPr>
@@ -2046,7 +2060,21 @@
                 <w:rStyle w:val="ae"/>
                 <w:noProof/>
               </w:rPr>
-              <w:t xml:space="preserve"> (Обязательное) Словарь данных</w:t>
+              <w:t xml:space="preserve"> (</w:t>
+            </w:r>
+            <w:r>
+              <w:rPr>
+                <w:rStyle w:val="ae"/>
+                <w:noProof/>
+              </w:rPr>
+              <w:t>о</w:t>
+            </w:r>
+            <w:r>
+              <w:rPr>
+                <w:rStyle w:val="ae"/>
+                <w:noProof/>
+              </w:rPr>
+              <w:t>бязательное) Словарь данных</w:t>
             </w:r>
             <w:r>
               <w:rPr>
@@ -2605,10 +2633,7 @@
         <w:t>Таким образом, решение перечисленных задач позволит в полном объёме достичь поставленной цели и разработать веб-приложение для декомпозиции целей и организации работы с задачами, включая командное взаимодействие.</w:t>
       </w:r>
       <w:r>
-        <w:t xml:space="preserve"> </w:t>
-      </w:r>
-      <w:r>
-        <w:t xml:space="preserve">Создаваемый продукт позволит снизить рутинную нагрузку на руководителей проектов при планировании. Благодаря гибкости настроек, пользователи смогут оперативно реагировать на любые изменения рабочих процессов. </w:t>
+        <w:t xml:space="preserve"> Создаваемый продукт позволит снизить рутинную нагрузку на руководителей проектов при планировании. Благодаря гибкости настроек, пользователи смогут оперативно реагировать на любые изменения рабочих процессов. </w:t>
       </w:r>
     </w:p>
     <w:p>
@@ -3073,7 +3098,7 @@
       <w:pPr>
         <w:pStyle w:val="a4"/>
         <w:spacing w:after="0" w:line="240" w:lineRule="auto"/>
-        <w:ind w:left="709" w:firstLine="0"/>
+        <w:ind w:left="0"/>
         <w:jc w:val="center"/>
       </w:pPr>
       <w:r>
@@ -3416,10 +3441,7 @@
         <w:t>Наличие механизмов автоматического формирования структуры достижения целей, совместной работы и встроенной коммуникации делает систему актуальной для использования как в образовательной, так и в профессиональной сфере. Синхронизация данных в реальном времени обеспечивает непрерывность рабочего процесса.</w:t>
       </w:r>
       <w:r>
-        <w:t xml:space="preserve"> </w:t>
-      </w:r>
-      <w:r>
-        <w:t>Такое технологическое решение позволяет системе оперативно подстраиваться под динамично меняющиеся внешние условия</w:t>
+        <w:t xml:space="preserve"> Такое технологическое решение позволяет системе оперативно подстраиваться под динамично меняющиеся внешние условия</w:t>
       </w:r>
     </w:p>
     <w:p>
@@ -6357,7 +6379,7 @@
     <w:p>
       <w:pPr>
         <w:spacing w:line="240" w:lineRule="auto"/>
-        <w:ind w:firstLine="1701"/>
+        <w:jc w:val="center"/>
       </w:pPr>
       <w:r>
         <w:rPr>
@@ -6548,7 +6570,7 @@
     <w:p>
       <w:pPr>
         <w:spacing w:line="240" w:lineRule="auto"/>
-        <w:ind w:firstLine="1985"/>
+        <w:jc w:val="center"/>
       </w:pPr>
       <w:r>
         <w:rPr>
@@ -8903,7 +8925,7 @@
     <w:p>
       <w:pPr>
         <w:spacing w:line="240" w:lineRule="auto"/>
-        <w:ind w:firstLine="992"/>
+        <w:jc w:val="center"/>
         <w:rPr>
           <w:color w:val="000000" w:themeColor="text1"/>
         </w:rPr>
@@ -9050,6 +9072,8 @@
     <w:p>
       <w:pPr>
         <w:spacing w:line="240" w:lineRule="auto"/>
+        <w:ind w:firstLine="426"/>
+        <w:jc w:val="center"/>
         <w:rPr>
           <w:color w:val="000000" w:themeColor="text1"/>
         </w:rPr>
@@ -9449,7 +9473,8 @@
     <w:p>
       <w:pPr>
         <w:spacing w:line="240" w:lineRule="auto"/>
-        <w:ind w:firstLine="567"/>
+        <w:ind w:firstLine="284"/>
+        <w:jc w:val="center"/>
         <w:rPr>
           <w:color w:val="000000" w:themeColor="text1"/>
         </w:rPr>
@@ -9906,7 +9931,6 @@
     <w:p>
       <w:pPr>
         <w:spacing w:line="240" w:lineRule="auto"/>
-        <w:ind w:firstLine="284"/>
         <w:jc w:val="center"/>
         <w:rPr>
           <w:color w:val="000000" w:themeColor="text1"/>
@@ -9969,6 +9993,7 @@
     <w:p>
       <w:pPr>
         <w:spacing w:after="360"/>
+        <w:jc w:val="center"/>
         <w:rPr>
           <w:color w:val="000000" w:themeColor="text1"/>
         </w:rPr>
@@ -10261,7 +10286,7 @@
     <w:p>
       <w:pPr>
         <w:spacing w:line="240" w:lineRule="auto"/>
-        <w:ind w:firstLine="1134"/>
+        <w:jc w:val="center"/>
         <w:rPr>
           <w:color w:val="000000" w:themeColor="text1"/>
         </w:rPr>
@@ -11275,6 +11300,7 @@
     <w:p>
       <w:pPr>
         <w:spacing w:line="240" w:lineRule="auto"/>
+        <w:jc w:val="center"/>
       </w:pPr>
       <w:r>
         <w:rPr>
@@ -11406,7 +11432,7 @@
       <w:pPr>
         <w:widowControl w:val="0"/>
         <w:spacing w:line="240" w:lineRule="auto"/>
-        <w:ind w:firstLine="1985"/>
+        <w:jc w:val="center"/>
         <w:rPr>
           <w:szCs w:val="28"/>
           <w:lang w:eastAsia="ru-RU"/>
@@ -11750,7 +11776,8 @@
       <w:pPr>
         <w:pStyle w:val="a4"/>
         <w:spacing w:after="0" w:line="240" w:lineRule="auto"/>
-        <w:ind w:left="0" w:firstLine="1276"/>
+        <w:ind w:left="0"/>
+        <w:jc w:val="center"/>
         <w:rPr>
           <w:rFonts w:ascii="Times New Roman" w:hAnsi="Times New Roman"/>
           <w:color w:val="000000" w:themeColor="text1"/>
@@ -12069,28 +12096,27 @@
       </w:r>
       <w:r>
         <w:rPr>
+          <w:color w:val="000000" w:themeColor="text1"/>
+        </w:rPr>
+        <w:t> </w:t>
+      </w:r>
+      <w:r>
+        <w:rPr>
+          <w:color w:val="000000" w:themeColor="text1"/>
+        </w:rPr>
+        <w:t>–</w:t>
+      </w:r>
+      <w:r>
+        <w:rPr>
+          <w:color w:val="000000" w:themeColor="text1"/>
+        </w:rPr>
+        <w:t> </w:t>
+      </w:r>
+      <w:r>
+        <w:rPr>
           <w:rFonts w:ascii="Times New Roman" w:hAnsi="Times New Roman"/>
           <w:color w:val="000000" w:themeColor="text1"/>
         </w:rPr>
-        <w:t xml:space="preserve"> </w:t>
-      </w:r>
-      <w:r>
-        <w:rPr>
-          <w:color w:val="000000" w:themeColor="text1"/>
-        </w:rPr>
-        <w:t>–</w:t>
-      </w:r>
-      <w:r>
-        <w:rPr>
-          <w:color w:val="000000" w:themeColor="text1"/>
-        </w:rPr>
-        <w:t xml:space="preserve"> </w:t>
-      </w:r>
-      <w:r>
-        <w:rPr>
-          <w:rFonts w:ascii="Times New Roman" w:hAnsi="Times New Roman"/>
-          <w:color w:val="000000" w:themeColor="text1"/>
-        </w:rPr>
         <w:t>функциональная кнопка «Отправить», расположенная непосредственно под полем ввода. Данный компонент служит для подтверждения и отправки сформированного текстового запроса на серверную часть для последующей обработки ИИ-сервисом.</w:t>
       </w:r>
     </w:p>
@@ -12110,7 +12136,8 @@
       <w:pPr>
         <w:pStyle w:val="a4"/>
         <w:spacing w:after="0" w:line="240" w:lineRule="auto"/>
-        <w:ind w:left="709" w:firstLine="2126"/>
+        <w:ind w:left="0"/>
+        <w:jc w:val="center"/>
         <w:rPr>
           <w:rFonts w:ascii="Times New Roman" w:hAnsi="Times New Roman"/>
           <w:color w:val="000000" w:themeColor="text1"/>
@@ -12247,6 +12274,7 @@
         <w:pStyle w:val="a4"/>
         <w:spacing w:after="0" w:line="240" w:lineRule="auto"/>
         <w:ind w:left="0" w:firstLine="284"/>
+        <w:jc w:val="center"/>
         <w:rPr>
           <w:rFonts w:ascii="Times New Roman" w:hAnsi="Times New Roman"/>
           <w:color w:val="000000" w:themeColor="text1"/>
@@ -13440,7 +13468,7 @@
     <w:p>
       <w:pPr>
         <w:spacing w:line="240" w:lineRule="auto"/>
-        <w:ind w:firstLine="2693"/>
+        <w:jc w:val="center"/>
       </w:pPr>
       <w:r>
         <w:rPr>
@@ -13722,13 +13750,13 @@
         <w:tblLook w:val="04A0" w:firstRow="1" w:lastRow="0" w:firstColumn="1" w:lastColumn="0" w:noHBand="0" w:noVBand="1"/>
       </w:tblPr>
       <w:tblGrid>
-        <w:gridCol w:w="3681"/>
-        <w:gridCol w:w="6237"/>
+        <w:gridCol w:w="3256"/>
+        <w:gridCol w:w="6662"/>
       </w:tblGrid>
       <w:tr>
         <w:tc>
           <w:tcPr>
-            <w:tcW w:w="3681" w:type="dxa"/>
+            <w:tcW w:w="3256" w:type="dxa"/>
           </w:tcPr>
           <w:p>
             <w:pPr>
@@ -13751,7 +13779,7 @@
         </w:tc>
         <w:tc>
           <w:tcPr>
-            <w:tcW w:w="6237" w:type="dxa"/>
+            <w:tcW w:w="6662" w:type="dxa"/>
           </w:tcPr>
           <w:p>
             <w:pPr>
@@ -13776,7 +13804,7 @@
       <w:tr>
         <w:tc>
           <w:tcPr>
-            <w:tcW w:w="3681" w:type="dxa"/>
+            <w:tcW w:w="3256" w:type="dxa"/>
           </w:tcPr>
           <w:p>
             <w:pPr>
@@ -13799,7 +13827,7 @@
         </w:tc>
         <w:tc>
           <w:tcPr>
-            <w:tcW w:w="6237" w:type="dxa"/>
+            <w:tcW w:w="6662" w:type="dxa"/>
           </w:tcPr>
           <w:p>
             <w:pPr>
@@ -13824,7 +13852,7 @@
       <w:tr>
         <w:tc>
           <w:tcPr>
-            <w:tcW w:w="3681" w:type="dxa"/>
+            <w:tcW w:w="3256" w:type="dxa"/>
           </w:tcPr>
           <w:p>
             <w:pPr>
@@ -13846,7 +13874,7 @@
         </w:tc>
         <w:tc>
           <w:tcPr>
-            <w:tcW w:w="6237" w:type="dxa"/>
+            <w:tcW w:w="6662" w:type="dxa"/>
           </w:tcPr>
           <w:p>
             <w:pPr>
@@ -13870,7 +13898,7 @@
       <w:tr>
         <w:tc>
           <w:tcPr>
-            <w:tcW w:w="3681" w:type="dxa"/>
+            <w:tcW w:w="3256" w:type="dxa"/>
           </w:tcPr>
           <w:p>
             <w:pPr>
@@ -13892,7 +13920,7 @@
         </w:tc>
         <w:tc>
           <w:tcPr>
-            <w:tcW w:w="6237" w:type="dxa"/>
+            <w:tcW w:w="6662" w:type="dxa"/>
           </w:tcPr>
           <w:p>
             <w:pPr>
@@ -13916,7 +13944,7 @@
       <w:tr>
         <w:tc>
           <w:tcPr>
-            <w:tcW w:w="3681" w:type="dxa"/>
+            <w:tcW w:w="3256" w:type="dxa"/>
           </w:tcPr>
           <w:p>
             <w:pPr>
@@ -13938,7 +13966,7 @@
         </w:tc>
         <w:tc>
           <w:tcPr>
-            <w:tcW w:w="6237" w:type="dxa"/>
+            <w:tcW w:w="6662" w:type="dxa"/>
           </w:tcPr>
           <w:p>
             <w:pPr>
@@ -14492,13 +14520,13 @@
         <w:tblLook w:val="04A0" w:firstRow="1" w:lastRow="0" w:firstColumn="1" w:lastColumn="0" w:noHBand="0" w:noVBand="1"/>
       </w:tblPr>
       <w:tblGrid>
-        <w:gridCol w:w="3681"/>
-        <w:gridCol w:w="6237"/>
+        <w:gridCol w:w="3256"/>
+        <w:gridCol w:w="6662"/>
       </w:tblGrid>
       <w:tr>
         <w:tc>
           <w:tcPr>
-            <w:tcW w:w="3681" w:type="dxa"/>
+            <w:tcW w:w="3256" w:type="dxa"/>
           </w:tcPr>
           <w:p>
             <w:pPr>
@@ -14520,7 +14548,7 @@
         </w:tc>
         <w:tc>
           <w:tcPr>
-            <w:tcW w:w="6237" w:type="dxa"/>
+            <w:tcW w:w="6662" w:type="dxa"/>
           </w:tcPr>
           <w:p>
             <w:pPr>
@@ -14544,7 +14572,7 @@
       <w:tr>
         <w:tc>
           <w:tcPr>
-            <w:tcW w:w="3681" w:type="dxa"/>
+            <w:tcW w:w="3256" w:type="dxa"/>
           </w:tcPr>
           <w:p>
             <w:pPr>
@@ -14567,7 +14595,7 @@
         </w:tc>
         <w:tc>
           <w:tcPr>
-            <w:tcW w:w="6237" w:type="dxa"/>
+            <w:tcW w:w="6662" w:type="dxa"/>
           </w:tcPr>
           <w:p>
             <w:pPr>
@@ -14590,7 +14618,7 @@
       <w:tr>
         <w:tc>
           <w:tcPr>
-            <w:tcW w:w="3681" w:type="dxa"/>
+            <w:tcW w:w="3256" w:type="dxa"/>
           </w:tcPr>
           <w:p>
             <w:pPr>
@@ -14611,7 +14639,7 @@
         </w:tc>
         <w:tc>
           <w:tcPr>
-            <w:tcW w:w="6237" w:type="dxa"/>
+            <w:tcW w:w="6662" w:type="dxa"/>
           </w:tcPr>
           <w:p>
             <w:pPr>
@@ -14634,7 +14662,7 @@
       <w:tr>
         <w:tc>
           <w:tcPr>
-            <w:tcW w:w="3681" w:type="dxa"/>
+            <w:tcW w:w="3256" w:type="dxa"/>
           </w:tcPr>
           <w:p>
             <w:pPr>
@@ -14658,7 +14686,7 @@
         </w:tc>
         <w:tc>
           <w:tcPr>
-            <w:tcW w:w="6237" w:type="dxa"/>
+            <w:tcW w:w="6662" w:type="dxa"/>
           </w:tcPr>
           <w:p>
             <w:pPr>
@@ -14681,7 +14709,7 @@
       <w:tr>
         <w:tc>
           <w:tcPr>
-            <w:tcW w:w="3681" w:type="dxa"/>
+            <w:tcW w:w="3256" w:type="dxa"/>
           </w:tcPr>
           <w:p>
             <w:pPr>
@@ -14702,7 +14730,7 @@
         </w:tc>
         <w:tc>
           <w:tcPr>
-            <w:tcW w:w="6237" w:type="dxa"/>
+            <w:tcW w:w="6662" w:type="dxa"/>
           </w:tcPr>
           <w:p>
             <w:pPr>
@@ -14891,7 +14919,7 @@
       <w:tr>
         <w:tc>
           <w:tcPr>
-            <w:tcW w:w="3681" w:type="dxa"/>
+            <w:tcW w:w="3256" w:type="dxa"/>
           </w:tcPr>
           <w:p>
             <w:pPr>
@@ -14912,7 +14940,7 @@
         </w:tc>
         <w:tc>
           <w:tcPr>
-            <w:tcW w:w="6237" w:type="dxa"/>
+            <w:tcW w:w="6662" w:type="dxa"/>
           </w:tcPr>
           <w:p>
             <w:pPr>
@@ -15031,7 +15059,7 @@
       <w:tr>
         <w:tc>
           <w:tcPr>
-            <w:tcW w:w="3681" w:type="dxa"/>
+            <w:tcW w:w="3256" w:type="dxa"/>
           </w:tcPr>
           <w:p>
             <w:pPr>
@@ -15052,7 +15080,7 @@
         </w:tc>
         <w:tc>
           <w:tcPr>
-            <w:tcW w:w="6237" w:type="dxa"/>
+            <w:tcW w:w="6662" w:type="dxa"/>
           </w:tcPr>
           <w:p>
             <w:pPr>
@@ -15075,7 +15103,7 @@
       <w:tr>
         <w:tc>
           <w:tcPr>
-            <w:tcW w:w="3681" w:type="dxa"/>
+            <w:tcW w:w="3256" w:type="dxa"/>
           </w:tcPr>
           <w:p>
             <w:pPr>
@@ -15096,7 +15124,7 @@
         </w:tc>
         <w:tc>
           <w:tcPr>
-            <w:tcW w:w="6237" w:type="dxa"/>
+            <w:tcW w:w="6662" w:type="dxa"/>
           </w:tcPr>
           <w:p>
             <w:pPr>
@@ -16535,13 +16563,13 @@
         <w:tblLook w:val="04A0" w:firstRow="1" w:lastRow="0" w:firstColumn="1" w:lastColumn="0" w:noHBand="0" w:noVBand="1"/>
       </w:tblPr>
       <w:tblGrid>
-        <w:gridCol w:w="3681"/>
-        <w:gridCol w:w="6237"/>
+        <w:gridCol w:w="3397"/>
+        <w:gridCol w:w="6521"/>
       </w:tblGrid>
       <w:tr>
         <w:tc>
           <w:tcPr>
-            <w:tcW w:w="3681" w:type="dxa"/>
+            <w:tcW w:w="3397" w:type="dxa"/>
           </w:tcPr>
           <w:p>
             <w:pPr>
@@ -16563,7 +16591,7 @@
         </w:tc>
         <w:tc>
           <w:tcPr>
-            <w:tcW w:w="6237" w:type="dxa"/>
+            <w:tcW w:w="6521" w:type="dxa"/>
           </w:tcPr>
           <w:p>
             <w:pPr>
@@ -16586,7 +16614,7 @@
       <w:tr>
         <w:tc>
           <w:tcPr>
-            <w:tcW w:w="3681" w:type="dxa"/>
+            <w:tcW w:w="3397" w:type="dxa"/>
           </w:tcPr>
           <w:p>
             <w:pPr>
@@ -16607,7 +16635,7 @@
         </w:tc>
         <w:tc>
           <w:tcPr>
-            <w:tcW w:w="6237" w:type="dxa"/>
+            <w:tcW w:w="6521" w:type="dxa"/>
           </w:tcPr>
           <w:p>
             <w:pPr>
@@ -16632,7 +16660,7 @@
       <w:tr>
         <w:tc>
           <w:tcPr>
-            <w:tcW w:w="3681" w:type="dxa"/>
+            <w:tcW w:w="3397" w:type="dxa"/>
           </w:tcPr>
           <w:p>
             <w:pPr>
@@ -16653,7 +16681,7 @@
         </w:tc>
         <w:tc>
           <w:tcPr>
-            <w:tcW w:w="6237" w:type="dxa"/>
+            <w:tcW w:w="6521" w:type="dxa"/>
           </w:tcPr>
           <w:p>
             <w:pPr>
@@ -16676,7 +16704,7 @@
       <w:tr>
         <w:tc>
           <w:tcPr>
-            <w:tcW w:w="3681" w:type="dxa"/>
+            <w:tcW w:w="3397" w:type="dxa"/>
           </w:tcPr>
           <w:p>
             <w:pPr>
@@ -16697,7 +16725,7 @@
         </w:tc>
         <w:tc>
           <w:tcPr>
-            <w:tcW w:w="6237" w:type="dxa"/>
+            <w:tcW w:w="6521" w:type="dxa"/>
           </w:tcPr>
           <w:p>
             <w:pPr>
@@ -16741,7 +16769,7 @@
       <w:tr>
         <w:tc>
           <w:tcPr>
-            <w:tcW w:w="3681" w:type="dxa"/>
+            <w:tcW w:w="3397" w:type="dxa"/>
           </w:tcPr>
           <w:p>
             <w:pPr>
@@ -16762,7 +16790,7 @@
         </w:tc>
         <w:tc>
           <w:tcPr>
-            <w:tcW w:w="6237" w:type="dxa"/>
+            <w:tcW w:w="6521" w:type="dxa"/>
           </w:tcPr>
           <w:p>
             <w:pPr>
@@ -16813,7 +16841,7 @@
       <w:tr>
         <w:tc>
           <w:tcPr>
-            <w:tcW w:w="3681" w:type="dxa"/>
+            <w:tcW w:w="3397" w:type="dxa"/>
           </w:tcPr>
           <w:p>
             <w:pPr>
@@ -16834,7 +16862,7 @@
         </w:tc>
         <w:tc>
           <w:tcPr>
-            <w:tcW w:w="6237" w:type="dxa"/>
+            <w:tcW w:w="6521" w:type="dxa"/>
           </w:tcPr>
           <w:p>
             <w:pPr>
@@ -17018,7 +17046,7 @@
       <w:tr>
         <w:tc>
           <w:tcPr>
-            <w:tcW w:w="3681" w:type="dxa"/>
+            <w:tcW w:w="3397" w:type="dxa"/>
           </w:tcPr>
           <w:p>
             <w:pPr>
@@ -17039,7 +17067,7 @@
         </w:tc>
         <w:tc>
           <w:tcPr>
-            <w:tcW w:w="6237" w:type="dxa"/>
+            <w:tcW w:w="6521" w:type="dxa"/>
           </w:tcPr>
           <w:p>
             <w:pPr>
@@ -17094,7 +17122,7 @@
       <w:tr>
         <w:tc>
           <w:tcPr>
-            <w:tcW w:w="3681" w:type="dxa"/>
+            <w:tcW w:w="3397" w:type="dxa"/>
           </w:tcPr>
           <w:p>
             <w:pPr>
@@ -17115,7 +17143,7 @@
         </w:tc>
         <w:tc>
           <w:tcPr>
-            <w:tcW w:w="6237" w:type="dxa"/>
+            <w:tcW w:w="6521" w:type="dxa"/>
           </w:tcPr>
           <w:p>
             <w:pPr>
@@ -17153,7 +17181,7 @@
       <w:tr>
         <w:tc>
           <w:tcPr>
-            <w:tcW w:w="3681" w:type="dxa"/>
+            <w:tcW w:w="3397" w:type="dxa"/>
           </w:tcPr>
           <w:p>
             <w:pPr>
@@ -17174,7 +17202,7 @@
         </w:tc>
         <w:tc>
           <w:tcPr>
-            <w:tcW w:w="6237" w:type="dxa"/>
+            <w:tcW w:w="6521" w:type="dxa"/>
           </w:tcPr>
           <w:p>
             <w:pPr>
@@ -17470,76 +17498,18 @@
           <w:p>
             <w:pPr>
               <w:ind w:firstLine="0"/>
-              <w:jc w:val="left"/>
-              <w:rPr>
-                <w:rFonts w:eastAsia="Times New Roman" w:cs="Times New Roman"/>
-                <w:vanish/>
-                <w:sz w:val="24"/>
-                <w:szCs w:val="24"/>
-                <w:lang w:eastAsia="ru-RU"/>
-              </w:rPr>
-            </w:pPr>
-          </w:p>
-          <w:tbl>
-            <w:tblPr>
-              <w:tblW w:w="0" w:type="auto"/>
-              <w:tblCellSpacing w:w="15" w:type="dxa"/>
-              <w:tblCellMar>
-                <w:top w:w="15" w:type="dxa"/>
-                <w:left w:w="15" w:type="dxa"/>
-                <w:bottom w:w="15" w:type="dxa"/>
-                <w:right w:w="15" w:type="dxa"/>
-              </w:tblCellMar>
-              <w:tblLook w:val="04A0" w:firstRow="1" w:lastRow="0" w:firstColumn="1" w:lastColumn="0" w:noHBand="0" w:noVBand="1"/>
-            </w:tblPr>
-            <w:tblGrid>
-              <w:gridCol w:w="2528"/>
-            </w:tblGrid>
-            <w:tr>
-              <w:trPr>
-                <w:trHeight w:val="20"/>
-                <w:tblCellSpacing w:w="15" w:type="dxa"/>
-              </w:trPr>
-              <w:tc>
-                <w:tcPr>
-                  <w:tcW w:w="0" w:type="auto"/>
-                  <w:vAlign w:val="center"/>
-                  <w:hideMark/>
-                </w:tcPr>
-                <w:p>
-                  <w:pPr>
-                    <w:widowControl w:val="0"/>
-                    <w:spacing w:line="240" w:lineRule="auto"/>
-                    <w:ind w:firstLine="0"/>
-                    <w:jc w:val="left"/>
-                    <w:rPr>
-                      <w:rFonts w:eastAsia="Times New Roman" w:cs="Times New Roman"/>
-                      <w:sz w:val="24"/>
-                      <w:szCs w:val="24"/>
-                      <w:lang w:eastAsia="ru-RU"/>
-                    </w:rPr>
-                  </w:pPr>
-                  <w:r>
-                    <w:rPr>
-                      <w:rFonts w:eastAsia="Times New Roman" w:cs="Times New Roman"/>
-                      <w:sz w:val="24"/>
-                      <w:szCs w:val="24"/>
-                      <w:lang w:eastAsia="ru-RU"/>
-                    </w:rPr>
-                    <w:t>Генерация списка задач</w:t>
-                  </w:r>
-                </w:p>
-              </w:tc>
-            </w:tr>
-          </w:tbl>
-          <w:p>
-            <w:pPr>
-              <w:ind w:firstLine="0"/>
-              <w:rPr>
-                <w:sz w:val="24"/>
-                <w:szCs w:val="24"/>
-              </w:rPr>
-            </w:pPr>
+              <w:rPr>
+                <w:sz w:val="24"/>
+                <w:szCs w:val="24"/>
+              </w:rPr>
+            </w:pPr>
+            <w:r>
+              <w:rPr>
+                <w:sz w:val="24"/>
+                <w:szCs w:val="24"/>
+              </w:rPr>
+              <w:t>Генерация задачи</w:t>
+            </w:r>
           </w:p>
         </w:tc>
       </w:tr>
@@ -17741,6 +17711,50 @@
                 <w:szCs w:val="24"/>
               </w:rPr>
               <w:t>1 Цель – «Изучить Python за 2 месяца, уделяя 5 часов в неделю»</w:t>
+            </w:r>
+          </w:p>
+        </w:tc>
+      </w:tr>
+      <w:tr>
+        <w:tc>
+          <w:tcPr>
+            <w:tcW w:w="3397" w:type="dxa"/>
+          </w:tcPr>
+          <w:p>
+            <w:pPr>
+              <w:ind w:firstLine="0"/>
+              <w:rPr>
+                <w:sz w:val="24"/>
+                <w:szCs w:val="24"/>
+              </w:rPr>
+            </w:pPr>
+            <w:r>
+              <w:rPr>
+                <w:sz w:val="24"/>
+                <w:szCs w:val="24"/>
+              </w:rPr>
+              <w:t>Ожидаемый результат</w:t>
+            </w:r>
+          </w:p>
+        </w:tc>
+        <w:tc>
+          <w:tcPr>
+            <w:tcW w:w="6521" w:type="dxa"/>
+          </w:tcPr>
+          <w:p>
+            <w:pPr>
+              <w:ind w:firstLine="0"/>
+              <w:rPr>
+                <w:sz w:val="24"/>
+                <w:szCs w:val="24"/>
+              </w:rPr>
+            </w:pPr>
+            <w:r>
+              <w:rPr>
+                <w:sz w:val="24"/>
+                <w:szCs w:val="24"/>
+              </w:rPr>
+              <w:t>Система генерирует структурированный список задач и отображает его на экране</w:t>
             </w:r>
           </w:p>
         </w:tc>
@@ -17830,50 +17844,6 @@
                 <w:sz w:val="24"/>
                 <w:szCs w:val="24"/>
               </w:rPr>
-              <w:t>Ожидаемый результат</w:t>
-            </w:r>
-          </w:p>
-        </w:tc>
-        <w:tc>
-          <w:tcPr>
-            <w:tcW w:w="6521" w:type="dxa"/>
-          </w:tcPr>
-          <w:p>
-            <w:pPr>
-              <w:ind w:firstLine="0"/>
-              <w:rPr>
-                <w:sz w:val="24"/>
-                <w:szCs w:val="24"/>
-              </w:rPr>
-            </w:pPr>
-            <w:r>
-              <w:rPr>
-                <w:sz w:val="24"/>
-                <w:szCs w:val="24"/>
-              </w:rPr>
-              <w:t>Система генерирует структурированный список задач и отображает его на экране</w:t>
-            </w:r>
-          </w:p>
-        </w:tc>
-      </w:tr>
-      <w:tr>
-        <w:tc>
-          <w:tcPr>
-            <w:tcW w:w="3397" w:type="dxa"/>
-          </w:tcPr>
-          <w:p>
-            <w:pPr>
-              <w:ind w:firstLine="0"/>
-              <w:rPr>
-                <w:sz w:val="24"/>
-                <w:szCs w:val="24"/>
-              </w:rPr>
-            </w:pPr>
-            <w:r>
-              <w:rPr>
-                <w:sz w:val="24"/>
-                <w:szCs w:val="24"/>
-              </w:rPr>
               <w:t>Фактический результат</w:t>
             </w:r>
           </w:p>
@@ -18588,6 +18558,12 @@
         </w:tc>
       </w:tr>
     </w:tbl>
+    <w:p>
+      <w:pPr>
+        <w:spacing w:before="240" w:line="240" w:lineRule="auto"/>
+        <w:ind w:firstLine="0"/>
+      </w:pPr>
+    </w:p>
     <w:p>
       <w:pPr>
         <w:spacing w:before="240" w:line="240" w:lineRule="auto"/>
@@ -19530,7 +19506,7 @@
     </w:tbl>
     <w:p>
       <w:pPr>
-        <w:spacing w:line="240" w:lineRule="auto"/>
+        <w:spacing w:before="360" w:line="240" w:lineRule="auto"/>
         <w:ind w:firstLine="0"/>
       </w:pPr>
       <w:r>
@@ -19927,7 +19903,7 @@
     </w:tbl>
     <w:p>
       <w:pPr>
-        <w:spacing w:before="240" w:line="240" w:lineRule="auto"/>
+        <w:spacing w:before="360" w:line="240" w:lineRule="auto"/>
         <w:ind w:firstLine="0"/>
       </w:pPr>
       <w:r>
@@ -20653,11 +20629,11 @@
         <w:widowControl w:val="0"/>
       </w:pPr>
       <w:r>
-        <w:t xml:space="preserve">По результатам выполненных проверок сформированы сводные протоколы, фиксирующие итоги верификации каждого эксплуатационного сценария. Данные документы включают идентификатор проверки, наименование процедуры, итоговый статус и краткое аналитическое заключение о соответствии фактического </w:t>
+        <w:t xml:space="preserve">По результатам выполненных проверок сформированы сводные протоколы, фиксирующие итоги верификации каждого эксплуатационного сценария. Данные документы включают идентификатор проверки, наименование процедуры, </w:t>
       </w:r>
       <w:r>
         <w:lastRenderedPageBreak/>
-        <w:t xml:space="preserve">поведения программного продукта запланированным требованиям. </w:t>
+        <w:t xml:space="preserve">итоговый статус и краткое аналитическое заключение о соответствии фактического поведения программного продукта запланированным требованиям. </w:t>
       </w:r>
     </w:p>
     <w:p>
@@ -21982,7 +21958,6 @@
     </w:p>
     <w:p>
       <w:r>
-        <w:lastRenderedPageBreak/>
         <w:t>Анализ результатов проведённого тестирования подтверждает функционирование разработанного веб-приложения и выполнение предусмотренных пользовательских сценариев. Все запланированные операции были выполнены без сбоев и аварийных завершений работы, а логика переходов между экранами и формами полностью соответствует ожидаемому поведению системы.</w:t>
       </w:r>
     </w:p>
@@ -22009,6 +21984,7 @@
     <w:p>
       <w:pPr>
         <w:pStyle w:val="11"/>
+        <w:spacing w:line="240" w:lineRule="auto"/>
         <w:ind w:hanging="851"/>
         <w:jc w:val="center"/>
       </w:pPr>
@@ -22056,7 +22032,8 @@
     <w:p>
       <w:pPr>
         <w:pStyle w:val="11"/>
-        <w:ind w:left="0" w:firstLine="3828"/>
+        <w:spacing w:line="240" w:lineRule="auto"/>
+        <w:ind w:left="0" w:firstLine="3827"/>
         <w:rPr>
           <w:rFonts w:eastAsia="Calibri"/>
         </w:rPr>
@@ -22668,7 +22645,8 @@
       <w:pPr>
         <w:pStyle w:val="11"/>
         <w:spacing w:line="240" w:lineRule="auto"/>
-        <w:ind w:left="0" w:firstLine="3544"/>
+        <w:ind w:left="0" w:firstLine="0"/>
+        <w:jc w:val="center"/>
       </w:pPr>
       <w:bookmarkStart w:id="26" w:name="_Toc230916007"/>
       <w:bookmarkStart w:id="27" w:name="_Toc231329493"/>
@@ -22682,7 +22660,8 @@
     <w:p>
       <w:pPr>
         <w:spacing w:after="360" w:line="240" w:lineRule="auto"/>
-        <w:ind w:firstLine="3686"/>
+        <w:ind w:firstLine="0"/>
+        <w:jc w:val="center"/>
         <w:rPr>
           <w:lang w:eastAsia="ru-RU"/>
         </w:rPr>
@@ -22691,13 +22670,26 @@
         <w:rPr>
           <w:lang w:eastAsia="ru-RU"/>
         </w:rPr>
-        <w:t>(Обязательное)</w:t>
+        <w:t>(</w:t>
+      </w:r>
+      <w:r>
+        <w:rPr>
+          <w:lang w:eastAsia="ru-RU"/>
+        </w:rPr>
+        <w:t>о</w:t>
+      </w:r>
+      <w:r>
+        <w:rPr>
+          <w:lang w:eastAsia="ru-RU"/>
+        </w:rPr>
+        <w:t>бязательное)</w:t>
       </w:r>
     </w:p>
     <w:p>
       <w:pPr>
         <w:spacing w:after="360" w:line="240" w:lineRule="auto"/>
-        <w:ind w:firstLine="3686"/>
+        <w:ind w:firstLine="0"/>
+        <w:jc w:val="center"/>
         <w:rPr>
           <w:b/>
           <w:bCs/>
@@ -22910,7 +22902,19 @@
         <w:rPr>
           <w:lang w:eastAsia="ru-RU"/>
         </w:rPr>
-        <w:t>(Обязательное)</w:t>
+        <w:t>(</w:t>
+      </w:r>
+      <w:r>
+        <w:rPr>
+          <w:lang w:eastAsia="ru-RU"/>
+        </w:rPr>
+        <w:t>о</w:t>
+      </w:r>
+      <w:r>
+        <w:rPr>
+          <w:lang w:eastAsia="ru-RU"/>
+        </w:rPr>
+        <w:t>бязательное)</w:t>
       </w:r>
     </w:p>
     <w:p>
@@ -26063,7 +26067,8 @@
       <w:pPr>
         <w:pStyle w:val="11"/>
         <w:spacing w:line="240" w:lineRule="auto"/>
-        <w:ind w:left="0" w:firstLine="3544"/>
+        <w:ind w:left="0" w:firstLine="0"/>
+        <w:jc w:val="center"/>
       </w:pPr>
       <w:bookmarkStart w:id="29" w:name="_Toc231329495"/>
       <w:r>
@@ -26078,7 +26083,8 @@
     <w:p>
       <w:pPr>
         <w:spacing w:after="360" w:line="240" w:lineRule="auto"/>
-        <w:ind w:firstLine="3686"/>
+        <w:ind w:firstLine="0"/>
+        <w:jc w:val="center"/>
         <w:rPr>
           <w:lang w:eastAsia="ru-RU"/>
         </w:rPr>
@@ -26093,13 +26099,13 @@
         <w:rPr>
           <w:lang w:eastAsia="ru-RU"/>
         </w:rPr>
-        <w:t>Продолжение</w:t>
+        <w:t>п</w:t>
       </w:r>
       <w:r>
         <w:rPr>
           <w:lang w:eastAsia="ru-RU"/>
         </w:rPr>
-        <w:t>)</w:t>
+        <w:t>родолжение)</w:t>
       </w:r>
     </w:p>
     <w:p>
@@ -29404,7 +29410,8 @@
       <w:pPr>
         <w:pStyle w:val="11"/>
         <w:spacing w:line="240" w:lineRule="auto"/>
-        <w:ind w:left="0" w:firstLine="3686"/>
+        <w:ind w:left="0" w:firstLine="0"/>
+        <w:jc w:val="center"/>
       </w:pPr>
       <w:bookmarkStart w:id="30" w:name="_Toc231329496"/>
       <w:r>
@@ -29419,7 +29426,8 @@
     <w:p>
       <w:pPr>
         <w:spacing w:after="360" w:line="240" w:lineRule="auto"/>
-        <w:ind w:firstLine="3969"/>
+        <w:ind w:firstLine="0"/>
+        <w:jc w:val="center"/>
         <w:rPr>
           <w:lang w:eastAsia="ru-RU"/>
         </w:rPr>
@@ -29434,7 +29442,13 @@
         <w:rPr>
           <w:lang w:eastAsia="ru-RU"/>
         </w:rPr>
-        <w:t>Окончание</w:t>
+        <w:t>о</w:t>
+      </w:r>
+      <w:r>
+        <w:rPr>
+          <w:lang w:eastAsia="ru-RU"/>
+        </w:rPr>
+        <w:t>кончание</w:t>
       </w:r>
       <w:r>
         <w:rPr>
@@ -33416,17 +33430,33 @@
                                       <w:lang w:val="ru-RU"/>
                                     </w:rPr>
                                   </w:pPr>
-                                  <w:fldSimple w:instr=" NUMPAGES   \* MERGEFORMAT ">
-                                    <w:r>
-                                      <w:rPr>
-                                        <w:rFonts w:ascii="Times New Roman" w:hAnsi="Times New Roman" w:cs="Times New Roman"/>
-                                        <w:noProof/>
-                                        <w:sz w:val="18"/>
-                                        <w:lang w:val="ru-RU"/>
-                                      </w:rPr>
-                                      <w:t>7</w:t>
-                                    </w:r>
-                                  </w:fldSimple>
+                                  <w:r>
+                                    <w:fldChar w:fldCharType="begin"/>
+                                  </w:r>
+                                  <w:r>
+                                    <w:instrText xml:space="preserve"> NUMPAGES   \* MERGEFORMAT </w:instrText>
+                                  </w:r>
+                                  <w:r>
+                                    <w:fldChar w:fldCharType="separate"/>
+                                  </w:r>
+                                  <w:r>
+                                    <w:rPr>
+                                      <w:rFonts w:ascii="Times New Roman" w:hAnsi="Times New Roman" w:cs="Times New Roman"/>
+                                      <w:noProof/>
+                                      <w:sz w:val="18"/>
+                                      <w:lang w:val="ru-RU"/>
+                                    </w:rPr>
+                                    <w:t>7</w:t>
+                                  </w:r>
+                                  <w:r>
+                                    <w:rPr>
+                                      <w:rFonts w:ascii="Times New Roman" w:hAnsi="Times New Roman" w:cs="Times New Roman"/>
+                                      <w:noProof/>
+                                      <w:sz w:val="18"/>
+                                      <w:lang w:val="ru-RU"/>
+                                    </w:rPr>
+                                    <w:fldChar w:fldCharType="end"/>
+                                  </w:r>
                                 </w:p>
                               </w:tc>
                             </w:tr>
@@ -35164,17 +35194,33 @@
                                 <w:lang w:val="ru-RU"/>
                               </w:rPr>
                             </w:pPr>
-                            <w:fldSimple w:instr=" NUMPAGES   \* MERGEFORMAT ">
-                              <w:r>
-                                <w:rPr>
-                                  <w:rFonts w:ascii="Times New Roman" w:hAnsi="Times New Roman" w:cs="Times New Roman"/>
-                                  <w:noProof/>
-                                  <w:sz w:val="18"/>
-                                  <w:lang w:val="ru-RU"/>
-                                </w:rPr>
-                                <w:t>7</w:t>
-                              </w:r>
-                            </w:fldSimple>
+                            <w:r>
+                              <w:fldChar w:fldCharType="begin"/>
+                            </w:r>
+                            <w:r>
+                              <w:instrText xml:space="preserve"> NUMPAGES   \* MERGEFORMAT </w:instrText>
+                            </w:r>
+                            <w:r>
+                              <w:fldChar w:fldCharType="separate"/>
+                            </w:r>
+                            <w:r>
+                              <w:rPr>
+                                <w:rFonts w:ascii="Times New Roman" w:hAnsi="Times New Roman" w:cs="Times New Roman"/>
+                                <w:noProof/>
+                                <w:sz w:val="18"/>
+                                <w:lang w:val="ru-RU"/>
+                              </w:rPr>
+                              <w:t>7</w:t>
+                            </w:r>
+                            <w:r>
+                              <w:rPr>
+                                <w:rFonts w:ascii="Times New Roman" w:hAnsi="Times New Roman" w:cs="Times New Roman"/>
+                                <w:noProof/>
+                                <w:sz w:val="18"/>
+                                <w:lang w:val="ru-RU"/>
+                              </w:rPr>
+                              <w:fldChar w:fldCharType="end"/>
+                            </w:r>
                           </w:p>
                         </w:tc>
                       </w:tr>
@@ -35845,7 +35891,7 @@
             </wp:anchor>
           </w:drawing>
         </mc:Choice>
-        <mc:Fallback xmlns:oel="http://schemas.microsoft.com/office/2019/extlst" xmlns:w16du="http://schemas.microsoft.com/office/word/2023/wordml/word16du" xmlns:w16sdtfl="http://schemas.microsoft.com/office/word/2024/wordml/sdtformatlock">
+        <mc:Fallback xmlns:w16sdtfl="http://schemas.microsoft.com/office/word/2024/wordml/sdtformatlock" xmlns:w16du="http://schemas.microsoft.com/office/word/2023/wordml/word16du" xmlns:oel="http://schemas.microsoft.com/office/2019/extlst">
           <w:pict>
             <v:group w14:anchorId="2ED3E864" id="Группа 13" o:spid="_x0000_s1026" style="position:absolute;margin-left:56.85pt;margin-top:18.25pt;width:518.9pt;height:803.85pt;z-index:251656704;mso-position-horizontal-relative:page;mso-position-vertical-relative:page" coordorigin="1134,397" coordsize="10378,16044" o:gfxdata="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" o:allowincell="f">
               <v:line id="Line 4" o:spid="_x0000_s1027" style="position:absolute;visibility:visible;mso-wrap-style:square" from="1134,397" to="1134,16441" o:connectortype="straight" o:gfxdata="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" strokeweight="2.25pt"/>

</xml_diff>

<commit_message>
adding norm kontrol, skazala vibe
</commit_message>
<xml_diff>
--- a/Диплом мешков 23.106.docx
+++ b/Диплом мешков 23.106.docx
@@ -1,6 +1,6 @@
 
 <file path=word/document.xml><?xml version="1.0" encoding="utf-8"?>
-<w:document xmlns:wpc="http://schemas.microsoft.com/office/word/2010/wordprocessingCanvas" xmlns:cx="http://schemas.microsoft.com/office/drawing/2014/chartex" xmlns:cx1="http://schemas.microsoft.com/office/drawing/2015/9/8/chartex" xmlns:cx2="http://schemas.microsoft.com/office/drawing/2015/10/21/chartex" xmlns:cx3="http://schemas.microsoft.com/office/drawing/2016/5/9/chartex" xmlns:cx4="http://schemas.microsoft.com/office/drawing/2016/5/10/chartex" xmlns:cx5="http://schemas.microsoft.com/office/drawing/2016/5/11/chartex" xmlns:cx6="http://schemas.microsoft.com/office/drawing/2016/5/12/chartex" xmlns:cx7="http://schemas.microsoft.com/office/drawing/2016/5/13/chartex" xmlns:cx8="http://schemas.microsoft.com/office/drawing/2016/5/14/chartex" xmlns:mc="http://schemas.openxmlformats.org/markup-compatibility/2006" xmlns:aink="http://schemas.microsoft.com/office/drawing/2016/ink" xmlns:am3d="http://schemas.microsoft.com/office/drawing/2017/model3d" xmlns:o="urn:schemas-microsoft-com:office:office" xmlns:r="http://schemas.openxmlformats.org/officeDocument/2006/relationships" xmlns:m="http://schemas.openxmlformats.org/officeDocument/2006/math" xmlns:v="urn:schemas-microsoft-com:vml" xmlns:wp14="http://schemas.microsoft.com/office/word/2010/wordprocessingDrawing" xmlns:wp="http://schemas.openxmlformats.org/drawingml/2006/wordprocessingDrawing" xmlns:w10="urn:schemas-microsoft-com:office:word" xmlns:w="http://schemas.openxmlformats.org/wordprocessingml/2006/main" xmlns:w14="http://schemas.microsoft.com/office/word/2010/wordml" xmlns:w15="http://schemas.microsoft.com/office/word/2012/wordml" xmlns:w16cex="http://schemas.microsoft.com/office/word/2018/wordml/cex" xmlns:w16cid="http://schemas.microsoft.com/office/word/2016/wordml/cid" xmlns:w16="http://schemas.microsoft.com/office/word/2018/wordml" xmlns:w16sdtdh="http://schemas.microsoft.com/office/word/2020/wordml/sdtdatahash" xmlns:w16se="http://schemas.microsoft.com/office/word/2015/wordml/symex" xmlns:wpg="http://schemas.microsoft.com/office/word/2010/wordprocessingGroup" xmlns:wpi="http://schemas.microsoft.com/office/word/2010/wordprocessingInk" xmlns:wne="http://schemas.microsoft.com/office/word/2006/wordml" xmlns:wps="http://schemas.microsoft.com/office/word/2010/wordprocessingShape" mc:Ignorable="w14 w15 w16se w16cid w16 w16cex w16sdtdh wp14">
+<w:document xmlns:wpc="http://schemas.microsoft.com/office/word/2010/wordprocessingCanvas" xmlns:cx="http://schemas.microsoft.com/office/drawing/2014/chartex" xmlns:cx1="http://schemas.microsoft.com/office/drawing/2015/9/8/chartex" xmlns:cx2="http://schemas.microsoft.com/office/drawing/2015/10/21/chartex" xmlns:cx3="http://schemas.microsoft.com/office/drawing/2016/5/9/chartex" xmlns:cx4="http://schemas.microsoft.com/office/drawing/2016/5/10/chartex" xmlns:cx5="http://schemas.microsoft.com/office/drawing/2016/5/11/chartex" xmlns:cx6="http://schemas.microsoft.com/office/drawing/2016/5/12/chartex" xmlns:cx7="http://schemas.microsoft.com/office/drawing/2016/5/13/chartex" xmlns:cx8="http://schemas.microsoft.com/office/drawing/2016/5/14/chartex" xmlns:mc="http://schemas.openxmlformats.org/markup-compatibility/2006" xmlns:aink="http://schemas.microsoft.com/office/drawing/2016/ink" xmlns:am3d="http://schemas.microsoft.com/office/drawing/2017/model3d" xmlns:o="urn:schemas-microsoft-com:office:office" xmlns:oel="http://schemas.microsoft.com/office/2019/extlst" xmlns:r="http://schemas.openxmlformats.org/officeDocument/2006/relationships" xmlns:m="http://schemas.openxmlformats.org/officeDocument/2006/math" xmlns:v="urn:schemas-microsoft-com:vml" xmlns:wp14="http://schemas.microsoft.com/office/word/2010/wordprocessingDrawing" xmlns:wp="http://schemas.openxmlformats.org/drawingml/2006/wordprocessingDrawing" xmlns:w10="urn:schemas-microsoft-com:office:word" xmlns:w="http://schemas.openxmlformats.org/wordprocessingml/2006/main" xmlns:w14="http://schemas.microsoft.com/office/word/2010/wordml" xmlns:w15="http://schemas.microsoft.com/office/word/2012/wordml" xmlns:w16cex="http://schemas.microsoft.com/office/word/2018/wordml/cex" xmlns:w16cid="http://schemas.microsoft.com/office/word/2016/wordml/cid" xmlns:w16="http://schemas.microsoft.com/office/word/2018/wordml" xmlns:w16du="http://schemas.microsoft.com/office/word/2023/wordml/word16du" xmlns:w16sdtdh="http://schemas.microsoft.com/office/word/2020/wordml/sdtdatahash" xmlns:w16sdtfl="http://schemas.microsoft.com/office/word/2024/wordml/sdtformatlock" xmlns:w16se="http://schemas.microsoft.com/office/word/2015/wordml/symex" xmlns:wpg="http://schemas.microsoft.com/office/word/2010/wordprocessingGroup" xmlns:wpi="http://schemas.microsoft.com/office/word/2010/wordprocessingInk" xmlns:wne="http://schemas.microsoft.com/office/word/2006/wordml" xmlns:wps="http://schemas.microsoft.com/office/word/2010/wordprocessingShape" mc:Ignorable="w14 w15 w16se w16cid w16 w16cex w16sdtdh w16sdtfl w16du wp14">
   <w:body>
     <w:p>
       <w:pPr>
@@ -663,6 +663,15 @@
           <w:szCs w:val="28"/>
           <w:lang w:eastAsia="ru-RU"/>
         </w:rPr>
+        <w:sectPr>
+          <w:headerReference w:type="default" r:id="rId8"/>
+          <w:headerReference w:type="first" r:id="rId9"/>
+          <w:pgSz w:w="11906" w:h="16838"/>
+          <w:pgMar w:top="567" w:right="567" w:bottom="851" w:left="1418" w:header="284" w:footer="284" w:gutter="0"/>
+          <w:cols w:space="708"/>
+          <w:titlePg/>
+          <w:docGrid w:linePitch="381"/>
+        </w:sectPr>
       </w:pPr>
       <w:r>
         <w:rPr>
@@ -716,11 +725,8 @@
       <w:sdtContent>
         <w:p>
           <w:pPr>
-            <w:tabs>
-              <w:tab w:val="left" w:pos="142"/>
-            </w:tabs>
-            <w:spacing w:after="360" w:line="480" w:lineRule="auto"/>
-            <w:ind w:firstLine="0"/>
+            <w:spacing w:before="240" w:after="360" w:line="240" w:lineRule="auto"/>
+            <w:ind w:left="709" w:firstLine="0"/>
             <w:jc w:val="center"/>
             <w:rPr>
               <w:b/>
@@ -2154,8 +2160,6 @@
         </w:tabs>
         <w:ind w:right="283"/>
         <w:sectPr>
-          <w:headerReference w:type="default" r:id="rId8"/>
-          <w:headerReference w:type="first" r:id="rId9"/>
           <w:pgSz w:w="11906" w:h="16838"/>
           <w:pgMar w:top="567" w:right="567" w:bottom="851" w:left="1418" w:header="284" w:footer="284" w:gutter="0"/>
           <w:cols w:space="708"/>
@@ -2624,7 +2628,10 @@
     </w:p>
     <w:p>
       <w:pPr>
-        <w:pStyle w:val="2"/>
+        <w:pStyle w:val="11"/>
+        <w:spacing w:line="240" w:lineRule="auto"/>
+        <w:ind w:left="0" w:firstLine="709"/>
+        <w:jc w:val="both"/>
       </w:pPr>
       <w:bookmarkStart w:id="6" w:name="_Toc231329475"/>
       <w:r>
@@ -2639,13 +2646,7 @@
       </w:pPr>
       <w:bookmarkStart w:id="7" w:name="_Toc231329476"/>
       <w:r>
-        <w:t>1</w:t>
-      </w:r>
-      <w:r>
-        <w:t>.1</w:t>
-      </w:r>
-      <w:r>
-        <w:t xml:space="preserve"> Описание предметной области</w:t>
+        <w:t>1.1 Описание предметной области</w:t>
       </w:r>
       <w:bookmarkEnd w:id="7"/>
     </w:p>
@@ -2937,18 +2938,12 @@
     </w:p>
     <w:p>
       <w:pPr>
-        <w:pStyle w:val="2"/>
+        <w:pStyle w:val="3"/>
       </w:pPr>
       <w:bookmarkStart w:id="8" w:name="_Toc231329477"/>
       <w:r>
         <w:lastRenderedPageBreak/>
-        <w:t>1</w:t>
-      </w:r>
-      <w:r>
-        <w:t>.</w:t>
-      </w:r>
-      <w:r>
-        <w:t>2 Определение функциональных задач</w:t>
+        <w:t>1.2 Определение функциональных задач</w:t>
       </w:r>
       <w:r>
         <w:t xml:space="preserve"> пользователей</w:t>
@@ -3315,13 +3310,7 @@
       </w:pPr>
       <w:bookmarkStart w:id="9" w:name="_Toc231329478"/>
       <w:r>
-        <w:t>1</w:t>
-      </w:r>
-      <w:r>
-        <w:t>.</w:t>
-      </w:r>
-      <w:r>
-        <w:t>3 Анализ аналогов и прототипов</w:t>
+        <w:t>1.3 Анализ аналогов и прототипов</w:t>
       </w:r>
       <w:bookmarkEnd w:id="9"/>
     </w:p>
@@ -6314,9 +6303,9 @@
         </w:rPr>
         <w:lastRenderedPageBreak/>
         <w:drawing>
-          <wp:inline distT="0" distB="0" distL="0" distR="0" wp14:anchorId="77749D4D" wp14:editId="75F6C81F">
+          <wp:inline distT="0" distB="0" distL="0" distR="0" wp14:anchorId="77749D4D" wp14:editId="6F2635BC">
             <wp:extent cx="4744629" cy="3384655"/>
-            <wp:effectExtent l="0" t="0" r="0" b="6350"/>
+            <wp:effectExtent l="19050" t="19050" r="18415" b="25400"/>
             <wp:docPr id="162236291" name="Рисунок 162236291"/>
             <wp:cNvGraphicFramePr>
               <a:graphicFrameLocks xmlns:a="http://schemas.openxmlformats.org/drawingml/2006/main" noChangeAspect="1"/>
@@ -6353,7 +6342,9 @@
                     </a:prstGeom>
                     <a:noFill/>
                     <a:ln>
-                      <a:noFill/>
+                      <a:solidFill>
+                        <a:schemeClr val="tx1"/>
+                      </a:solidFill>
                     </a:ln>
                   </pic:spPr>
                 </pic:pic>
@@ -6470,9 +6461,9 @@
         </w:rPr>
         <w:lastRenderedPageBreak/>
         <w:drawing>
-          <wp:inline distT="0" distB="0" distL="0" distR="0" wp14:anchorId="6C804164" wp14:editId="4A795C24">
+          <wp:inline distT="0" distB="0" distL="0" distR="0" wp14:anchorId="6C804164" wp14:editId="170EC3AB">
             <wp:extent cx="4284561" cy="3431943"/>
-            <wp:effectExtent l="0" t="0" r="1905" b="0"/>
+            <wp:effectExtent l="19050" t="19050" r="20955" b="16510"/>
             <wp:docPr id="25" name="Рисунок 25"/>
             <wp:cNvGraphicFramePr>
               <a:graphicFrameLocks xmlns:a="http://schemas.openxmlformats.org/drawingml/2006/main" noChangeAspect="1"/>
@@ -6509,7 +6500,9 @@
                     </a:prstGeom>
                     <a:noFill/>
                     <a:ln>
-                      <a:noFill/>
+                      <a:solidFill>
+                        <a:schemeClr val="tx1"/>
+                      </a:solidFill>
                     </a:ln>
                   </pic:spPr>
                 </pic:pic>
@@ -6679,7 +6672,7 @@
         </w:rPr>
         <w:lastRenderedPageBreak/>
         <w:drawing>
-          <wp:inline distT="0" distB="0" distL="0" distR="0" wp14:anchorId="4CF7630C" wp14:editId="49DA1FD2">
+          <wp:inline distT="0" distB="0" distL="0" distR="0" wp14:anchorId="4CF7630C" wp14:editId="2C753A1C">
             <wp:extent cx="4022414" cy="3258160"/>
             <wp:effectExtent l="19050" t="19050" r="16510" b="19050"/>
             <wp:docPr id="27" name="Рисунок 27"/>
@@ -7146,7 +7139,9 @@
     </w:p>
     <w:p>
       <w:pPr>
-        <w:pStyle w:val="2"/>
+        <w:pStyle w:val="11"/>
+        <w:spacing w:line="240" w:lineRule="auto"/>
+        <w:jc w:val="both"/>
       </w:pPr>
       <w:bookmarkStart w:id="12" w:name="_Toc231329481"/>
       <w:r>
@@ -8580,7 +8575,7 @@
           <w:rFonts w:ascii="Times New Roman" w:hAnsi="Times New Roman"/>
           <w:szCs w:val="28"/>
         </w:rPr>
-        <w:t>Для веб-приложения также разработан логотип, представленный на рисунке 2.1.</w:t>
+        <w:t>Для веб-приложения разработан логотип, представленный на рисунке 2.1.</w:t>
       </w:r>
     </w:p>
     <w:p>
@@ -8606,9 +8601,9 @@
           <w:szCs w:val="28"/>
         </w:rPr>
         <w:drawing>
-          <wp:inline distT="0" distB="0" distL="0" distR="0" wp14:anchorId="22363E80" wp14:editId="7F5EF094">
+          <wp:inline distT="0" distB="0" distL="0" distR="0" wp14:anchorId="22363E80" wp14:editId="055DA047">
             <wp:extent cx="2496212" cy="2496212"/>
-            <wp:effectExtent l="0" t="0" r="0" b="0"/>
+            <wp:effectExtent l="19050" t="19050" r="18415" b="18415"/>
             <wp:docPr id="2" name="Рисунок 2"/>
             <wp:cNvGraphicFramePr>
               <a:graphicFrameLocks xmlns:a="http://schemas.openxmlformats.org/drawingml/2006/main" noChangeAspect="1"/>
@@ -8645,7 +8640,9 @@
                     </a:prstGeom>
                     <a:noFill/>
                     <a:ln>
-                      <a:noFill/>
+                      <a:solidFill>
+                        <a:schemeClr val="tx1"/>
+                      </a:solidFill>
                     </a:ln>
                   </pic:spPr>
                 </pic:pic>
@@ -8750,15 +8747,7 @@
           <w:rFonts w:ascii="Georgia" w:hAnsi="Georgia"/>
           <w:color w:val="27251E"/>
         </w:rPr>
-        <w:t xml:space="preserve">Форма и композиция логотипа в рамках макета сохраняют читаемость </w:t>
-      </w:r>
-      <w:r>
-        <w:rPr>
-          <w:rFonts w:ascii="Georgia" w:hAnsi="Georgia"/>
-          <w:color w:val="27251E"/>
-        </w:rPr>
-        <w:lastRenderedPageBreak/>
-        <w:t xml:space="preserve">при масштабировании и размещении в различных частях интерфейса. </w:t>
+        <w:t xml:space="preserve">Форма и композиция логотипа в рамках макета сохраняют читаемость при масштабировании и размещении в различных частях интерфейса. </w:t>
       </w:r>
     </w:p>
     <w:p>
@@ -8778,6 +8767,7 @@
           <w:rFonts w:ascii="Georgia" w:hAnsi="Georgia"/>
           <w:color w:val="27251E"/>
         </w:rPr>
+        <w:lastRenderedPageBreak/>
         <w:t>Пропорции элементов подобраны таким образом, чтобы обеспечить визуальный баланс и чёткость контуров</w:t>
       </w:r>
     </w:p>
@@ -8847,7 +8837,7 @@
           <w:color w:val="000000" w:themeColor="text1"/>
         </w:rPr>
         <w:drawing>
-          <wp:inline distT="0" distB="0" distL="0" distR="0" wp14:anchorId="7E9D1AF9" wp14:editId="5E5C75EB">
+          <wp:inline distT="0" distB="0" distL="0" distR="0" wp14:anchorId="7E9D1AF9" wp14:editId="73DA75C4">
             <wp:extent cx="3874593" cy="2936354"/>
             <wp:effectExtent l="19050" t="19050" r="12065" b="16510"/>
             <wp:docPr id="9" name="Рисунок 9"/>
@@ -9019,14 +9009,14 @@
         <w:rPr>
           <w:color w:val="000000" w:themeColor="text1"/>
         </w:rPr>
-        <w:t xml:space="preserve">Яркая </w:t>
+        <w:t xml:space="preserve">Яркая фиолетовая кнопка действия «Войти» выступает главным композиционным </w:t>
       </w:r>
       <w:r>
         <w:rPr>
           <w:color w:val="000000" w:themeColor="text1"/>
         </w:rPr>
         <w:lastRenderedPageBreak/>
-        <w:t>фиолетовая кнопка действия «Войти» выступает главным композиционным акцентом экранной формы, побуждая к завершению целевого действия.</w:t>
+        <w:t>акцентом экранной формы, побуждая к завершению целевого действия.</w:t>
       </w:r>
     </w:p>
     <w:p>
@@ -9081,9 +9071,9 @@
           <w:color w:val="000000" w:themeColor="text1"/>
         </w:rPr>
         <w:drawing>
-          <wp:inline distT="0" distB="0" distL="0" distR="0" wp14:anchorId="71F55CCD" wp14:editId="0EC73089">
+          <wp:inline distT="0" distB="0" distL="0" distR="0" wp14:anchorId="71F55CCD" wp14:editId="4E64DD63">
             <wp:extent cx="5142840" cy="2079435"/>
-            <wp:effectExtent l="0" t="0" r="1270" b="0"/>
+            <wp:effectExtent l="19050" t="19050" r="20320" b="16510"/>
             <wp:docPr id="11" name="Рисунок 11"/>
             <wp:cNvGraphicFramePr>
               <a:graphicFrameLocks xmlns:a="http://schemas.openxmlformats.org/drawingml/2006/main" noChangeAspect="1"/>
@@ -9109,6 +9099,11 @@
                     <a:prstGeom prst="rect">
                       <a:avLst/>
                     </a:prstGeom>
+                    <a:ln>
+                      <a:solidFill>
+                        <a:schemeClr val="tx1"/>
+                      </a:solidFill>
+                    </a:ln>
                   </pic:spPr>
                 </pic:pic>
               </a:graphicData>
@@ -9346,7 +9341,7 @@
           <w:rFonts w:ascii="Times New Roman" w:hAnsi="Times New Roman"/>
           <w:szCs w:val="28"/>
         </w:rPr>
-        <w:t xml:space="preserve">-помощником, </w:t>
+        <w:t xml:space="preserve">-помощником, который помогает формировать и декомпозировать цели на отдельные задачи. </w:t>
       </w:r>
       <w:r>
         <w:rPr>
@@ -9354,7 +9349,7 @@
           <w:szCs w:val="28"/>
         </w:rPr>
         <w:lastRenderedPageBreak/>
-        <w:t xml:space="preserve">который помогает формировать и декомпозировать цели на отдельные задачи. Интерфейс </w:t>
+        <w:t xml:space="preserve">Интерфейс </w:t>
       </w:r>
       <w:r>
         <w:rPr>
@@ -9610,11 +9605,7 @@
         <w:t xml:space="preserve"> демонстрирующие </w:t>
       </w:r>
       <w:r>
-        <w:t xml:space="preserve">возможность взаимодействия пользователей в рамках команд. </w:t>
-      </w:r>
-      <w:r>
-        <w:lastRenderedPageBreak/>
-        <w:t>Для этого разработан отдельный экран команд, представленный на рисунке 2.6.</w:t>
+        <w:t>возможность взаимодействия пользователей в рамках команд. Для этого разработан отдельный экран команд, представленный на рисунке 2.6.</w:t>
       </w:r>
     </w:p>
     <w:p>
@@ -9631,6 +9622,7 @@
           <w:noProof/>
           <w:color w:val="000000" w:themeColor="text1"/>
         </w:rPr>
+        <w:lastRenderedPageBreak/>
         <w:drawing>
           <wp:inline distT="0" distB="0" distL="0" distR="0" wp14:anchorId="57F75C65" wp14:editId="57EE3353">
             <wp:extent cx="5762719" cy="2099462"/>
@@ -9862,28 +9854,22 @@
         <w:rPr>
           <w:rFonts w:cs="Times New Roman"/>
         </w:rPr>
-        <w:t xml:space="preserve">Таким образом, разработанные экраны интерфейса обеспечивают удобное взаимодействие пользователя с системой, поддерживают основные </w:t>
+        <w:t>Таким образом, разработанные экраны интерфейса обеспечивают удобное взаимодействие пользователя с системой, поддерживают основные пользовательские сценарии и создают единый современный стиль</w:t>
       </w:r>
       <w:r>
         <w:rPr>
           <w:rFonts w:cs="Times New Roman"/>
         </w:rPr>
+        <w:t>.</w:t>
+      </w:r>
+    </w:p>
+    <w:p>
+      <w:pPr>
+        <w:pStyle w:val="3"/>
+      </w:pPr>
+      <w:bookmarkStart w:id="15" w:name="_Toc231329484"/>
+      <w:r>
         <w:lastRenderedPageBreak/>
-        <w:t>пользовательские сценарии и создают единый современный стиль</w:t>
-      </w:r>
-      <w:r>
-        <w:rPr>
-          <w:rFonts w:cs="Times New Roman"/>
-        </w:rPr>
-        <w:t>.</w:t>
-      </w:r>
-    </w:p>
-    <w:p>
-      <w:pPr>
-        <w:pStyle w:val="3"/>
-      </w:pPr>
-      <w:bookmarkStart w:id="15" w:name="_Toc231329484"/>
-      <w:r>
         <w:t>2.3 Разработка структуры программного продукта</w:t>
       </w:r>
       <w:bookmarkEnd w:id="15"/>
@@ -9926,7 +9912,7 @@
           <w:noProof/>
         </w:rPr>
         <w:drawing>
-          <wp:inline distT="0" distB="0" distL="0" distR="0" wp14:anchorId="48C55381" wp14:editId="09F1FB9D">
+          <wp:inline distT="0" distB="0" distL="0" distR="0" wp14:anchorId="48C55381" wp14:editId="0E8DF3A3">
             <wp:extent cx="4116984" cy="2790748"/>
             <wp:effectExtent l="19050" t="19050" r="17145" b="10160"/>
             <wp:docPr id="162236288" name="Рисунок 162236288"/>
@@ -10047,14 +10033,14 @@
         <w:rPr>
           <w:color w:val="000000" w:themeColor="text1"/>
         </w:rPr>
-        <w:t xml:space="preserve">В разделе «Профиль» пользователь просматривает и редактирует свои данные, а также может перейти к окну «Смена пароля» для обновления учетных </w:t>
+        <w:t xml:space="preserve">В разделе «Профиль» пользователь просматривает и редактирует свои данные, а также может перейти к окну «Смена пароля» для обновления учетных данных. Раздел «Списки задач» отображает созданные пользователем планы и позволяет перейти к детальному просмотру конкретного списка, где выполняется </w:t>
       </w:r>
       <w:r>
         <w:rPr>
           <w:color w:val="000000" w:themeColor="text1"/>
         </w:rPr>
         <w:lastRenderedPageBreak/>
-        <w:t xml:space="preserve">данных. Раздел «Списки задач» отображает созданные пользователем планы и позволяет перейти к детальному просмотру конкретного списка, где выполняется управление задачами, их порядком и статусом выполнения. </w:t>
+        <w:t xml:space="preserve">управление задачами, их порядком и статусом выполнения. </w:t>
       </w:r>
     </w:p>
     <w:p>
@@ -10114,9 +10100,9 @@
           <w:noProof/>
         </w:rPr>
         <w:drawing>
-          <wp:inline distT="0" distB="0" distL="0" distR="0" wp14:anchorId="2F595525" wp14:editId="01295AF5">
+          <wp:inline distT="0" distB="0" distL="0" distR="0" wp14:anchorId="2F595525" wp14:editId="02B4722A">
             <wp:extent cx="5439950" cy="2633472"/>
-            <wp:effectExtent l="0" t="0" r="8890" b="0"/>
+            <wp:effectExtent l="19050" t="19050" r="27940" b="14605"/>
             <wp:docPr id="162236289" name="Рисунок 162236289"/>
             <wp:cNvGraphicFramePr>
               <a:graphicFrameLocks xmlns:a="http://schemas.openxmlformats.org/drawingml/2006/main" noChangeAspect="1"/>
@@ -10153,7 +10139,9 @@
                     </a:prstGeom>
                     <a:noFill/>
                     <a:ln>
-                      <a:noFill/>
+                      <a:solidFill>
+                        <a:schemeClr val="tx1"/>
+                      </a:solidFill>
                     </a:ln>
                   </pic:spPr>
                 </pic:pic>
@@ -10241,21 +10229,15 @@
         <w:rPr>
           <w:lang w:eastAsia="ru-RU"/>
         </w:rPr>
-        <w:t xml:space="preserve">, управление задачами, контроль доступа пользователей и взаимодействие с сервисом искусственного интеллекта. Архитектура приложения построена по принципу разделения ответственности между компонентами, благодаря чему обеспечивается </w:t>
-      </w:r>
-      <w:r>
-        <w:rPr>
-          <w:lang w:eastAsia="ru-RU"/>
-        </w:rPr>
+        <w:t>, управление задачами, контроль доступа пользователей и взаимодействие с сервисом искусственного интеллекта. Архитектура приложения построена по принципу разделения ответственности между компонентами, благодаря чему обеспечивается масштабируемость системы, удобство сопровождения и устойчивость работы приложения при одновременной работе нескольких пользователей.</w:t>
+      </w:r>
+    </w:p>
+    <w:p>
+      <w:pPr>
+        <w:widowControl w:val="0"/>
+      </w:pPr>
+      <w:r>
         <w:lastRenderedPageBreak/>
-        <w:t>масштабируемость системы, удобство сопровождения и устойчивость работы приложения при одновременной работе нескольких пользователей.</w:t>
-      </w:r>
-    </w:p>
-    <w:p>
-      <w:pPr>
-        <w:widowControl w:val="0"/>
-      </w:pPr>
-      <w:r>
         <w:t xml:space="preserve">Одной из ключевых функций системы является автоматическое формирование списка задач с использованием искусственного интеллекта. Для реализации данной возможности разработан сервис </w:t>
       </w:r>
       <w:proofErr w:type="spellStart"/>
@@ -10311,7 +10293,7 @@
           <w:lang w:eastAsia="ru-RU"/>
         </w:rPr>
         <w:drawing>
-          <wp:inline distT="0" distB="0" distL="0" distR="0" wp14:anchorId="5BC66B00" wp14:editId="0751FB35">
+          <wp:inline distT="0" distB="0" distL="0" distR="0" wp14:anchorId="5BC66B00" wp14:editId="3D53799B">
             <wp:extent cx="3999561" cy="2557149"/>
             <wp:effectExtent l="0" t="0" r="1270" b="0"/>
             <wp:docPr id="30" name="Рисунок 30"/>
@@ -10442,23 +10424,20 @@
         <w:rPr>
           <w:color w:val="000000" w:themeColor="text1"/>
         </w:rPr>
-        <w:t xml:space="preserve">. Применение асинхронных запросов позволяет избежать блокировки серверного потока во время ожидания ответа от внешнего сервиса. После получения ответа система извлекает </w:t>
+        <w:t>. Применение асинхронных запросов позволяет избежать блокировки серверного потока во время ожидания ответа от внешнего сервиса. После получения ответа система извлекает содержимое сообщения и преобразует его в JSON-структуру, содержащую название цели и список задач.</w:t>
       </w:r>
       <w:r>
         <w:rPr>
           <w:color w:val="000000" w:themeColor="text1"/>
         </w:rPr>
+        <w:t xml:space="preserve"> </w:t>
+      </w:r>
+      <w:r>
+        <w:t xml:space="preserve">На рисунке 2.11 представлен фрагмент </w:t>
+      </w:r>
+      <w:r>
         <w:lastRenderedPageBreak/>
-        <w:t>содержимое сообщения и преобразует его в JSON-структуру, содержащую название цели и список задач.</w:t>
-      </w:r>
-      <w:r>
-        <w:rPr>
-          <w:color w:val="000000" w:themeColor="text1"/>
-        </w:rPr>
-        <w:t xml:space="preserve"> </w:t>
-      </w:r>
-      <w:r>
-        <w:t>На рисунке 2.11 представлен фрагмент формирования контекста.</w:t>
+        <w:t>формирования контекста.</w:t>
       </w:r>
     </w:p>
     <w:p>
@@ -10644,7 +10623,7 @@
           <w:lang w:eastAsia="ru-RU"/>
         </w:rPr>
         <w:drawing>
-          <wp:inline distT="0" distB="0" distL="0" distR="0" wp14:anchorId="17FF21C9" wp14:editId="265E1032">
+          <wp:inline distT="0" distB="0" distL="0" distR="0" wp14:anchorId="17FF21C9" wp14:editId="6134B011">
             <wp:extent cx="3040100" cy="1808519"/>
             <wp:effectExtent l="0" t="0" r="8255" b="1270"/>
             <wp:docPr id="162236297" name="Рисунок 162236297"/>
@@ -10836,15 +10815,7 @@
           <w:rFonts w:cs="Times New Roman"/>
           <w:szCs w:val="28"/>
         </w:rPr>
-        <w:t xml:space="preserve">реализованы процедуры создания, </w:t>
-      </w:r>
-      <w:r>
-        <w:rPr>
-          <w:rFonts w:cs="Times New Roman"/>
-          <w:szCs w:val="28"/>
-        </w:rPr>
-        <w:lastRenderedPageBreak/>
-        <w:t xml:space="preserve">обновления и удаления задач. При создании новой задачи формируется объект типа </w:t>
+        <w:t xml:space="preserve">реализованы процедуры создания, обновления и удаления задач. При создании новой задачи формируется объект типа </w:t>
       </w:r>
       <w:r>
         <w:rPr>
@@ -10881,7 +10852,15 @@
           <w:rFonts w:cs="Times New Roman"/>
           <w:szCs w:val="28"/>
         </w:rPr>
-        <w:t xml:space="preserve"> представлен фрагмент создания задачи.</w:t>
+        <w:t xml:space="preserve"> представлен </w:t>
+      </w:r>
+      <w:r>
+        <w:rPr>
+          <w:rFonts w:cs="Times New Roman"/>
+          <w:szCs w:val="28"/>
+        </w:rPr>
+        <w:lastRenderedPageBreak/>
+        <w:t>фрагмент создания задачи.</w:t>
       </w:r>
     </w:p>
     <w:p>
@@ -11198,11 +11177,7 @@
         <w:t xml:space="preserve"> </w:t>
       </w:r>
       <w:r>
-        <w:t xml:space="preserve">Все изменения сразу же фиксируются в текущей рабочей сессии базы данных. На финальном этапе система безопасно сохраняет обновленные данные и синхронизирует их. Это гарантирует, что в </w:t>
-      </w:r>
-      <w:r>
-        <w:lastRenderedPageBreak/>
-        <w:t>приложении всегда будет отображаться только самая актуальная и корректная информация.</w:t>
+        <w:t>Все изменения сразу же фиксируются в текущей рабочей сессии базы данных. На финальном этапе система безопасно сохраняет обновленные данные и синхронизирует их. Это гарантирует, что в приложении всегда будет отображаться только самая актуальная и корректная информация.</w:t>
       </w:r>
     </w:p>
     <w:p>
@@ -11233,8 +11208,9 @@
           <w:color w:val="000000" w:themeColor="text1"/>
           <w:szCs w:val="28"/>
         </w:rPr>
+        <w:lastRenderedPageBreak/>
         <w:drawing>
-          <wp:inline distT="0" distB="0" distL="0" distR="0" wp14:anchorId="1B33B3FE" wp14:editId="399550AC">
+          <wp:inline distT="0" distB="0" distL="0" distR="0" wp14:anchorId="1B33B3FE" wp14:editId="56B7B8AD">
             <wp:extent cx="4024338" cy="2684679"/>
             <wp:effectExtent l="0" t="0" r="0" b="1905"/>
             <wp:docPr id="162236302" name="Рисунок 162236302"/>
@@ -11367,7 +11343,9 @@
     </w:p>
     <w:p>
       <w:pPr>
-        <w:pStyle w:val="2"/>
+        <w:pStyle w:val="11"/>
+        <w:spacing w:line="240" w:lineRule="auto"/>
+        <w:jc w:val="both"/>
       </w:pPr>
       <w:bookmarkStart w:id="17" w:name="_Toc231329486"/>
       <w:r>
@@ -13180,7 +13158,7 @@
     </w:p>
     <w:p>
       <w:pPr>
-        <w:pStyle w:val="2"/>
+        <w:pStyle w:val="af"/>
       </w:pPr>
       <w:bookmarkStart w:id="18" w:name="_Toc231329487"/>
       <w:r>
@@ -13276,10 +13254,7 @@
       <w:bookmarkStart w:id="20" w:name="_Toc231329489"/>
       <w:r>
         <w:lastRenderedPageBreak/>
-        <w:t xml:space="preserve">4.2 </w:t>
-      </w:r>
-      <w:r>
-        <w:t>Разработка методов тестирования</w:t>
+        <w:t>4.2 Разработка методов тестирования</w:t>
       </w:r>
       <w:bookmarkEnd w:id="20"/>
     </w:p>
@@ -13440,7 +13415,7 @@
           <w:noProof/>
         </w:rPr>
         <w:drawing>
-          <wp:inline distT="0" distB="0" distL="0" distR="0" wp14:anchorId="7A96717B" wp14:editId="03457C7D">
+          <wp:inline distT="0" distB="0" distL="0" distR="0" wp14:anchorId="7A96717B" wp14:editId="2FD9EF22">
             <wp:extent cx="2744080" cy="3967701"/>
             <wp:effectExtent l="0" t="0" r="0" b="0"/>
             <wp:docPr id="162236304" name="Рисунок 162236304"/>
@@ -13538,15 +13513,7 @@
         <w:widowControl w:val="0"/>
       </w:pPr>
       <w:r>
-        <w:t xml:space="preserve">Для проверки работы данного механизма использовался объект, имитирующий ответ </w:t>
-      </w:r>
-      <w:proofErr w:type="spellStart"/>
-      <w:r>
-        <w:t>нейросетевой</w:t>
-      </w:r>
-      <w:proofErr w:type="spellEnd"/>
-      <w:r>
-        <w:t xml:space="preserve"> модели, что позволило протестировать обработку данных без необходимости обращения к реальному внешнему API. </w:t>
+        <w:t xml:space="preserve">Для проверки работы данного механизма использовался объект, имитирующий ответ нейросетевой модели, что позволило протестировать обработку данных без необходимости обращения к реальному внешнему API. </w:t>
       </w:r>
     </w:p>
     <w:p>
@@ -13558,7 +13525,7 @@
       </w:r>
       <w:r>
         <w:lastRenderedPageBreak/>
-        <w:t>запроса, формирование списка и фиксация созданных задач в базе данных. Реализация проверки функции генерации списка задач представлена на рисунке 4.3.</w:t>
+        <w:t>запроса, формирование списка и фиксация созданных задач в базе данных. Реализация проверки функции генерации списка представлена на рисунке 4.3.</w:t>
       </w:r>
     </w:p>
     <w:p>
@@ -13571,7 +13538,7 @@
           <w:noProof/>
         </w:rPr>
         <w:drawing>
-          <wp:inline distT="0" distB="0" distL="0" distR="0" wp14:anchorId="271BF709" wp14:editId="694C1BD5">
+          <wp:inline distT="0" distB="0" distL="0" distR="0" wp14:anchorId="271BF709" wp14:editId="041189A3">
             <wp:extent cx="3401808" cy="5104738"/>
             <wp:effectExtent l="0" t="0" r="8255" b="1270"/>
             <wp:docPr id="162236305" name="Рисунок 162236305"/>
@@ -13678,7 +13645,7 @@
         </w:rPr>
         <w:lastRenderedPageBreak/>
         <w:drawing>
-          <wp:inline distT="0" distB="0" distL="0" distR="0" wp14:anchorId="7D280920" wp14:editId="23A8DFDD">
+          <wp:inline distT="0" distB="0" distL="0" distR="0" wp14:anchorId="7D280920" wp14:editId="2729A7A7">
             <wp:extent cx="3169148" cy="4118775"/>
             <wp:effectExtent l="0" t="0" r="0" b="0"/>
             <wp:docPr id="162236306" name="Рисунок 162236306"/>
@@ -13795,7 +13762,7 @@
     </w:p>
     <w:p>
       <w:r>
-        <w:t>Реализация проверки функции отправки сообщений представлена на рисунке 4.5.</w:t>
+        <w:t>Реализация проверки отправки сообщений представлена на рисунке 4.5.</w:t>
       </w:r>
     </w:p>
     <w:p>
@@ -13809,7 +13776,7 @@
         </w:rPr>
         <w:lastRenderedPageBreak/>
         <w:drawing>
-          <wp:inline distT="0" distB="0" distL="0" distR="0" wp14:anchorId="28B52A8D" wp14:editId="5321489D">
+          <wp:inline distT="0" distB="0" distL="0" distR="0" wp14:anchorId="28B52A8D" wp14:editId="52D0967A">
             <wp:extent cx="3093444" cy="4699572"/>
             <wp:effectExtent l="0" t="0" r="0" b="6350"/>
             <wp:docPr id="162236307" name="Рисунок 162236307"/>
@@ -14070,35 +14037,7 @@
                 <w:sz w:val="24"/>
                 <w:szCs w:val="24"/>
               </w:rPr>
-              <w:t>Номер</w:t>
-            </w:r>
-            <w:r>
-              <w:rPr>
-                <w:sz w:val="24"/>
-                <w:szCs w:val="24"/>
-              </w:rPr>
-              <w:t> </w:t>
-            </w:r>
-            <w:r>
-              <w:rPr>
-                <w:sz w:val="24"/>
-                <w:szCs w:val="24"/>
-              </w:rPr>
-              <w:t>протокола</w:t>
-            </w:r>
-            <w:r>
-              <w:rPr>
-                <w:sz w:val="24"/>
-                <w:szCs w:val="24"/>
-              </w:rPr>
-              <w:t> </w:t>
-            </w:r>
-            <w:r>
-              <w:rPr>
-                <w:sz w:val="24"/>
-                <w:szCs w:val="24"/>
-              </w:rPr>
-              <w:t>тестирования</w:t>
+              <w:t>Номер протокола тестирования</w:t>
             </w:r>
           </w:p>
         </w:tc>
@@ -14824,35 +14763,7 @@
                 <w:sz w:val="24"/>
                 <w:szCs w:val="24"/>
               </w:rPr>
-              <w:t>Номер</w:t>
-            </w:r>
-            <w:r>
-              <w:rPr>
-                <w:sz w:val="24"/>
-                <w:szCs w:val="24"/>
-              </w:rPr>
-              <w:t> </w:t>
-            </w:r>
-            <w:r>
-              <w:rPr>
-                <w:sz w:val="24"/>
-                <w:szCs w:val="24"/>
-              </w:rPr>
-              <w:t>протокола</w:t>
-            </w:r>
-            <w:r>
-              <w:rPr>
-                <w:sz w:val="24"/>
-                <w:szCs w:val="24"/>
-              </w:rPr>
-              <w:t> </w:t>
-            </w:r>
-            <w:r>
-              <w:rPr>
-                <w:sz w:val="24"/>
-                <w:szCs w:val="24"/>
-              </w:rPr>
-              <w:t>тестирования</w:t>
+              <w:t>Номер протокола тестирования</w:t>
             </w:r>
           </w:p>
         </w:tc>
@@ -16903,35 +16814,7 @@
                 <w:sz w:val="24"/>
                 <w:szCs w:val="24"/>
               </w:rPr>
-              <w:t>Номер</w:t>
-            </w:r>
-            <w:r>
-              <w:rPr>
-                <w:sz w:val="24"/>
-                <w:szCs w:val="24"/>
-              </w:rPr>
-              <w:t> </w:t>
-            </w:r>
-            <w:r>
-              <w:rPr>
-                <w:sz w:val="24"/>
-                <w:szCs w:val="24"/>
-              </w:rPr>
-              <w:t>протокола</w:t>
-            </w:r>
-            <w:r>
-              <w:rPr>
-                <w:sz w:val="24"/>
-                <w:szCs w:val="24"/>
-              </w:rPr>
-              <w:t> </w:t>
-            </w:r>
-            <w:r>
-              <w:rPr>
-                <w:sz w:val="24"/>
-                <w:szCs w:val="24"/>
-              </w:rPr>
-              <w:t>тестирования</w:t>
+              <w:t>Номер протокола тестирования</w:t>
             </w:r>
           </w:p>
         </w:tc>
@@ -17689,35 +17572,7 @@
                 <w:sz w:val="24"/>
                 <w:szCs w:val="24"/>
               </w:rPr>
-              <w:t>Номер</w:t>
-            </w:r>
-            <w:r>
-              <w:rPr>
-                <w:sz w:val="24"/>
-                <w:szCs w:val="24"/>
-              </w:rPr>
-              <w:t> </w:t>
-            </w:r>
-            <w:r>
-              <w:rPr>
-                <w:sz w:val="24"/>
-                <w:szCs w:val="24"/>
-              </w:rPr>
-              <w:t>протокола</w:t>
-            </w:r>
-            <w:r>
-              <w:rPr>
-                <w:sz w:val="24"/>
-                <w:szCs w:val="24"/>
-              </w:rPr>
-              <w:t> </w:t>
-            </w:r>
-            <w:r>
-              <w:rPr>
-                <w:sz w:val="24"/>
-                <w:szCs w:val="24"/>
-              </w:rPr>
-              <w:t>тестирования</w:t>
+              <w:t>Номер протокола тестирования</w:t>
             </w:r>
           </w:p>
         </w:tc>
@@ -20964,11 +20819,11 @@
         <w:widowControl w:val="0"/>
       </w:pPr>
       <w:r>
-        <w:t xml:space="preserve">По результатам выполненных проверок сформированы сводные протоколы, фиксирующие итоги верификации каждого эксплуатационного сценария. Данные документы включают идентификатор проверки, наименование процедуры, </w:t>
+        <w:t xml:space="preserve">По результатам выполненных проверок сформированы сводные протоколы, фиксирующие итоги верификации каждого эксплуатационного сценария. Данные документы включают идентификатор проверки, наименование процедуры, итоговый статус и краткое аналитическое заключение о соответствии фактического </w:t>
       </w:r>
       <w:r>
         <w:lastRenderedPageBreak/>
-        <w:t xml:space="preserve">итоговый статус и краткое аналитическое заключение о соответствии фактического поведения программного продукта запланированным требованиям. </w:t>
+        <w:t xml:space="preserve">поведения программного продукта запланированным требованиям. </w:t>
       </w:r>
     </w:p>
     <w:p>
@@ -21040,7 +20895,17 @@
                 <w:sz w:val="24"/>
                 <w:szCs w:val="24"/>
               </w:rPr>
-              <w:t>ID теста</w:t>
+              <w:t>Номер</w:t>
+            </w:r>
+            <w:r>
+              <w:rPr>
+                <w:rStyle w:val="afd"/>
+                <w:b w:val="0"/>
+                <w:bCs w:val="0"/>
+                <w:sz w:val="24"/>
+                <w:szCs w:val="24"/>
+              </w:rPr>
+              <w:t xml:space="preserve"> теста</w:t>
             </w:r>
           </w:p>
         </w:tc>
@@ -21783,25 +21648,8 @@
                 <w:sz w:val="24"/>
                 <w:szCs w:val="24"/>
               </w:rPr>
-              <w:t>ID теста</w:t>
-            </w:r>
-          </w:p>
-        </w:tc>
-        <w:tc>
-          <w:tcPr>
-            <w:tcW w:w="2268" w:type="dxa"/>
-            <w:vAlign w:val="center"/>
-          </w:tcPr>
-          <w:p>
-            <w:pPr>
-              <w:ind w:firstLine="0"/>
-              <w:rPr>
-                <w:b/>
-                <w:bCs/>
-                <w:sz w:val="24"/>
-                <w:szCs w:val="24"/>
-              </w:rPr>
-            </w:pPr>
+              <w:t>Номер</w:t>
+            </w:r>
             <w:r>
               <w:rPr>
                 <w:rStyle w:val="afd"/>
@@ -21810,13 +21658,13 @@
                 <w:sz w:val="24"/>
                 <w:szCs w:val="24"/>
               </w:rPr>
-              <w:t>Название теста</w:t>
-            </w:r>
-          </w:p>
-        </w:tc>
-        <w:tc>
-          <w:tcPr>
-            <w:tcW w:w="1560" w:type="dxa"/>
+              <w:t xml:space="preserve"> теста</w:t>
+            </w:r>
+          </w:p>
+        </w:tc>
+        <w:tc>
+          <w:tcPr>
+            <w:tcW w:w="2268" w:type="dxa"/>
             <w:vAlign w:val="center"/>
           </w:tcPr>
           <w:p>
@@ -21837,13 +21685,13 @@
                 <w:sz w:val="24"/>
                 <w:szCs w:val="24"/>
               </w:rPr>
-              <w:t>Статус</w:t>
-            </w:r>
-          </w:p>
-        </w:tc>
-        <w:tc>
-          <w:tcPr>
-            <w:tcW w:w="4394" w:type="dxa"/>
+              <w:t>Название теста</w:t>
+            </w:r>
+          </w:p>
+        </w:tc>
+        <w:tc>
+          <w:tcPr>
+            <w:tcW w:w="1560" w:type="dxa"/>
             <w:vAlign w:val="center"/>
           </w:tcPr>
           <w:p>
@@ -21864,6 +21712,33 @@
                 <w:sz w:val="24"/>
                 <w:szCs w:val="24"/>
               </w:rPr>
+              <w:t>Статус</w:t>
+            </w:r>
+          </w:p>
+        </w:tc>
+        <w:tc>
+          <w:tcPr>
+            <w:tcW w:w="4394" w:type="dxa"/>
+            <w:vAlign w:val="center"/>
+          </w:tcPr>
+          <w:p>
+            <w:pPr>
+              <w:ind w:firstLine="0"/>
+              <w:rPr>
+                <w:b/>
+                <w:bCs/>
+                <w:sz w:val="24"/>
+                <w:szCs w:val="24"/>
+              </w:rPr>
+            </w:pPr>
+            <w:r>
+              <w:rPr>
+                <w:rStyle w:val="afd"/>
+                <w:b w:val="0"/>
+                <w:bCs w:val="0"/>
+                <w:sz w:val="24"/>
+                <w:szCs w:val="24"/>
+              </w:rPr>
               <w:t>Комментарий</w:t>
             </w:r>
           </w:p>
@@ -22430,8 +22305,11 @@
         <w:spacing w:before="360"/>
       </w:pPr>
       <w:r>
+        <w:t xml:space="preserve">Анализ результатов проведённого тестирования подтверждает функционирование разработанного веб-приложения и выполнение </w:t>
+      </w:r>
+      <w:r>
         <w:lastRenderedPageBreak/>
-        <w:t>Анализ результатов проведённого тестирования подтверждает функционирование разработанного веб-приложения и выполнение предусмотренных пользовательских сценариев. Все запланированные операции были выполнены без сбоев и аварийных завершений работы, а логика переходов между экранами и формами полностью соответствует ожидаемому поведению системы.</w:t>
+        <w:t>предусмотренных пользовательских сценариев. Все запланированные операции были выполнены без сбоев и аварийных завершений работы, а логика переходов между экранами и формами полностью соответствует ожидаемому поведению системы.</w:t>
       </w:r>
     </w:p>
     <w:p>
@@ -22796,7 +22674,13 @@
         <w:rPr>
           <w:lang w:eastAsia="ru-RU"/>
         </w:rPr>
-        <w:t xml:space="preserve">4 Руководство </w:t>
+        <w:t>2</w:t>
+      </w:r>
+      <w:r>
+        <w:rPr>
+          <w:lang w:eastAsia="ru-RU"/>
+        </w:rPr>
+        <w:t xml:space="preserve"> Руководство </w:t>
       </w:r>
       <w:proofErr w:type="spellStart"/>
       <w:r>
@@ -22847,7 +22731,13 @@
         <w:rPr>
           <w:lang w:eastAsia="ru-RU"/>
         </w:rPr>
-        <w:t xml:space="preserve">8 Руководство </w:t>
+        <w:t>3</w:t>
+      </w:r>
+      <w:r>
+        <w:rPr>
+          <w:lang w:eastAsia="ru-RU"/>
+        </w:rPr>
+        <w:t xml:space="preserve"> Руководство </w:t>
       </w:r>
       <w:proofErr w:type="spellStart"/>
       <w:r>
@@ -22898,12 +22788,18 @@
         <w:rPr>
           <w:lang w:eastAsia="ru-RU"/>
         </w:rPr>
-        <w:t xml:space="preserve">9 NGINX документация. – URL: https://nginx.org/en/docs/ – Текст: электронный (дата обращения: </w:t>
+        <w:t>4</w:t>
       </w:r>
       <w:r>
         <w:rPr>
           <w:lang w:eastAsia="ru-RU"/>
         </w:rPr>
+        <w:t xml:space="preserve"> NGINX документация. – URL: https://nginx.org/en/docs/ – Текст: электронный (дата обращения: </w:t>
+      </w:r>
+      <w:r>
+        <w:rPr>
+          <w:lang w:eastAsia="ru-RU"/>
+        </w:rPr>
         <w:t>01</w:t>
       </w:r>
       <w:r>
@@ -22935,7 +22831,13 @@
         <w:rPr>
           <w:lang w:val="en-US" w:eastAsia="ru-RU"/>
         </w:rPr>
-        <w:t xml:space="preserve">10 JWT Introduction and Documentation. – URL: https://jwt.io/introduction – </w:t>
+        <w:t>5</w:t>
+      </w:r>
+      <w:r>
+        <w:rPr>
+          <w:lang w:val="en-US" w:eastAsia="ru-RU"/>
+        </w:rPr>
+        <w:t xml:space="preserve"> JWT Introduction and Documentation. – URL: https://jwt.io/introduction – </w:t>
       </w:r>
       <w:r>
         <w:rPr>
@@ -23020,7 +22922,13 @@
         <w:rPr>
           <w:lang w:eastAsia="ru-RU"/>
         </w:rPr>
-        <w:t xml:space="preserve">11 </w:t>
+        <w:t>6</w:t>
+      </w:r>
+      <w:r>
+        <w:rPr>
+          <w:lang w:eastAsia="ru-RU"/>
+        </w:rPr>
+        <w:t xml:space="preserve"> </w:t>
       </w:r>
       <w:proofErr w:type="spellStart"/>
       <w:r>
@@ -23071,7 +22979,13 @@
         <w:rPr>
           <w:lang w:eastAsia="ru-RU"/>
         </w:rPr>
-        <w:t xml:space="preserve">14 </w:t>
+        <w:t>7</w:t>
+      </w:r>
+      <w:r>
+        <w:rPr>
+          <w:lang w:eastAsia="ru-RU"/>
+        </w:rPr>
+        <w:t xml:space="preserve"> </w:t>
       </w:r>
       <w:proofErr w:type="spellStart"/>
       <w:r>
@@ -23423,7 +23337,13 @@
         </w:rPr>
       </w:pPr>
       <w:r>
-        <w:t xml:space="preserve">Таблица Б.1 – Сущность </w:t>
+        <w:t xml:space="preserve">Таблица Б.1 – </w:t>
+      </w:r>
+      <w:r>
+        <w:t>Описание сущности</w:t>
+      </w:r>
+      <w:r>
+        <w:t xml:space="preserve"> </w:t>
       </w:r>
       <w:proofErr w:type="spellStart"/>
       <w:r>
@@ -23991,7 +23911,6 @@
                 <w:lang w:eastAsia="ru-RU"/>
               </w:rPr>
             </w:pPr>
-            <w:proofErr w:type="spellStart"/>
             <w:r>
               <w:rPr>
                 <w:sz w:val="24"/>
@@ -23999,7 +23918,6 @@
               </w:rPr>
               <w:t>Yes</w:t>
             </w:r>
-            <w:proofErr w:type="spellEnd"/>
           </w:p>
         </w:tc>
         <w:tc>
@@ -24226,7 +24144,13 @@
         <w:ind w:firstLine="0"/>
       </w:pPr>
       <w:r>
-        <w:t xml:space="preserve">Таблица Б.2 – Сущность </w:t>
+        <w:t xml:space="preserve">Таблица Б.2 – </w:t>
+      </w:r>
+      <w:r>
+        <w:t>Описание сущности</w:t>
+      </w:r>
+      <w:r>
+        <w:t xml:space="preserve"> </w:t>
       </w:r>
       <w:proofErr w:type="spellStart"/>
       <w:r>
@@ -24697,7 +24621,6 @@
                 <w:lang w:eastAsia="ru-RU"/>
               </w:rPr>
             </w:pPr>
-            <w:proofErr w:type="spellStart"/>
             <w:r>
               <w:rPr>
                 <w:sz w:val="24"/>
@@ -24705,7 +24628,6 @@
               </w:rPr>
               <w:t>Yes</w:t>
             </w:r>
-            <w:proofErr w:type="spellEnd"/>
           </w:p>
         </w:tc>
         <w:tc>
@@ -25029,7 +24951,13 @@
         <w:ind w:firstLine="0"/>
       </w:pPr>
       <w:r>
-        <w:t xml:space="preserve">Таблица Б.3 – Сущность </w:t>
+        <w:t xml:space="preserve">Таблица Б.3 – </w:t>
+      </w:r>
+      <w:r>
+        <w:t>Описание сущности</w:t>
+      </w:r>
+      <w:r>
+        <w:t xml:space="preserve"> </w:t>
       </w:r>
       <w:proofErr w:type="spellStart"/>
       <w:r>
@@ -25403,7 +25331,6 @@
                 <w:lang w:eastAsia="ru-RU"/>
               </w:rPr>
             </w:pPr>
-            <w:proofErr w:type="spellStart"/>
             <w:r>
               <w:rPr>
                 <w:sz w:val="24"/>
@@ -25411,7 +25338,6 @@
               </w:rPr>
               <w:t>Yes</w:t>
             </w:r>
-            <w:proofErr w:type="spellEnd"/>
           </w:p>
         </w:tc>
         <w:tc>
@@ -25735,7 +25661,13 @@
         <w:ind w:firstLine="0"/>
       </w:pPr>
       <w:r>
-        <w:t xml:space="preserve">Таблица Б.4 – Сущность </w:t>
+        <w:t xml:space="preserve">Таблица Б.4 – </w:t>
+      </w:r>
+      <w:r>
+        <w:t>Описание сущности</w:t>
+      </w:r>
+      <w:r>
+        <w:t xml:space="preserve"> </w:t>
       </w:r>
       <w:proofErr w:type="spellStart"/>
       <w:r>
@@ -26206,7 +26138,6 @@
                 <w:lang w:eastAsia="ru-RU"/>
               </w:rPr>
             </w:pPr>
-            <w:proofErr w:type="spellStart"/>
             <w:r>
               <w:rPr>
                 <w:sz w:val="24"/>
@@ -26214,7 +26145,6 @@
               </w:rPr>
               <w:t>Yes</w:t>
             </w:r>
-            <w:proofErr w:type="spellEnd"/>
           </w:p>
         </w:tc>
         <w:tc>
@@ -26402,7 +26332,6 @@
                 <w:lang w:eastAsia="ru-RU"/>
               </w:rPr>
             </w:pPr>
-            <w:proofErr w:type="spellStart"/>
             <w:r>
               <w:rPr>
                 <w:sz w:val="24"/>
@@ -26410,7 +26339,6 @@
               </w:rPr>
               <w:t>Yes</w:t>
             </w:r>
-            <w:proofErr w:type="spellEnd"/>
           </w:p>
         </w:tc>
         <w:tc>
@@ -26587,7 +26515,13 @@
         <w:ind w:firstLine="0"/>
       </w:pPr>
       <w:r>
-        <w:t xml:space="preserve">Таблица Б.5 – Сущность </w:t>
+        <w:t xml:space="preserve">Таблица Б.5 – </w:t>
+      </w:r>
+      <w:r>
+        <w:t>Описание сущности</w:t>
+      </w:r>
+      <w:r>
+        <w:t xml:space="preserve"> </w:t>
       </w:r>
       <w:proofErr w:type="spellStart"/>
       <w:r>
@@ -26961,7 +26895,6 @@
                 <w:lang w:eastAsia="ru-RU"/>
               </w:rPr>
             </w:pPr>
-            <w:proofErr w:type="spellStart"/>
             <w:r>
               <w:rPr>
                 <w:sz w:val="24"/>
@@ -26969,7 +26902,6 @@
               </w:rPr>
               <w:t>Yes</w:t>
             </w:r>
-            <w:proofErr w:type="spellEnd"/>
           </w:p>
         </w:tc>
         <w:tc>
@@ -27196,7 +27128,13 @@
         <w:ind w:firstLine="0"/>
       </w:pPr>
       <w:r>
-        <w:t xml:space="preserve">Таблица Б.6 – Сущность </w:t>
+        <w:t xml:space="preserve">Таблица Б.6 – </w:t>
+      </w:r>
+      <w:r>
+        <w:t>Описание сущности</w:t>
+      </w:r>
+      <w:r>
+        <w:t xml:space="preserve"> </w:t>
       </w:r>
       <w:proofErr w:type="spellStart"/>
       <w:r>
@@ -27570,7 +27508,6 @@
                 <w:lang w:eastAsia="ru-RU"/>
               </w:rPr>
             </w:pPr>
-            <w:proofErr w:type="spellStart"/>
             <w:r>
               <w:rPr>
                 <w:sz w:val="24"/>
@@ -27578,7 +27515,6 @@
               </w:rPr>
               <w:t>Yes</w:t>
             </w:r>
-            <w:proofErr w:type="spellEnd"/>
           </w:p>
         </w:tc>
         <w:tc>
@@ -27611,7 +27547,13 @@
         <w:ind w:firstLine="0"/>
       </w:pPr>
       <w:r>
-        <w:t xml:space="preserve">Таблица Б.7 – Сущность </w:t>
+        <w:t xml:space="preserve">Таблица Б.7 – </w:t>
+      </w:r>
+      <w:r>
+        <w:t>Описание сущности</w:t>
+      </w:r>
+      <w:r>
+        <w:t xml:space="preserve"> </w:t>
       </w:r>
       <w:proofErr w:type="spellStart"/>
       <w:r>
@@ -28232,7 +28174,13 @@
         <w:t>Б</w:t>
       </w:r>
       <w:r>
-        <w:t xml:space="preserve">.8 – Сущность </w:t>
+        <w:t xml:space="preserve">.8 – </w:t>
+      </w:r>
+      <w:r>
+        <w:t>Описание сущности</w:t>
+      </w:r>
+      <w:r>
+        <w:t xml:space="preserve"> </w:t>
       </w:r>
       <w:proofErr w:type="spellStart"/>
       <w:r>
@@ -28742,7 +28690,13 @@
         <w:ind w:firstLine="0"/>
       </w:pPr>
       <w:r>
-        <w:t xml:space="preserve">Таблица Б.9 – Сущность </w:t>
+        <w:t xml:space="preserve">Таблица Б.9 – </w:t>
+      </w:r>
+      <w:r>
+        <w:t>Описание сущности</w:t>
+      </w:r>
+      <w:r>
+        <w:t xml:space="preserve"> </w:t>
       </w:r>
       <w:proofErr w:type="spellStart"/>
       <w:r>
@@ -29343,45 +29297,40 @@
       <w:pPr>
         <w:spacing w:before="360" w:line="240" w:lineRule="auto"/>
         <w:ind w:firstLine="0"/>
+      </w:pPr>
+      <w:r>
+        <w:t>Таблица</w:t>
+      </w:r>
+      <w:r>
+        <w:t xml:space="preserve"> </w:t>
+      </w:r>
+      <w:r>
+        <w:t>Б</w:t>
+      </w:r>
+      <w:r>
+        <w:t xml:space="preserve">.10 – </w:t>
+      </w:r>
+      <w:r>
+        <w:t>Описание сущности</w:t>
+      </w:r>
+      <w:r>
+        <w:t xml:space="preserve"> </w:t>
+      </w:r>
+      <w:r>
         <w:rPr>
           <w:lang w:val="en-US"/>
         </w:rPr>
-      </w:pPr>
-      <w:r>
-        <w:t>Таблица</w:t>
+        <w:t>Chat</w:t>
+      </w:r>
+      <w:r>
+        <w:t>_</w:t>
       </w:r>
       <w:r>
         <w:rPr>
           <w:lang w:val="en-US"/>
         </w:rPr>
-        <w:t xml:space="preserve"> </w:t>
-      </w:r>
-      <w:r>
-        <w:t>Б</w:t>
-      </w:r>
-      <w:r>
-        <w:rPr>
-          <w:lang w:val="en-US"/>
-        </w:rPr>
-        <w:t xml:space="preserve">.10 – </w:t>
-      </w:r>
-      <w:r>
-        <w:t>Сущность</w:t>
-      </w:r>
-      <w:r>
-        <w:rPr>
-          <w:lang w:val="en-US"/>
-        </w:rPr>
-        <w:t xml:space="preserve"> </w:t>
-      </w:r>
-      <w:proofErr w:type="spellStart"/>
-      <w:r>
-        <w:rPr>
-          <w:lang w:val="en-US"/>
-        </w:rPr>
-        <w:t>Chat_participants</w:t>
-      </w:r>
-      <w:proofErr w:type="spellEnd"/>
+        <w:t>participants</w:t>
+      </w:r>
     </w:p>
     <w:tbl>
       <w:tblPr>
@@ -29933,7 +29882,13 @@
         <w:ind w:firstLine="0"/>
       </w:pPr>
       <w:r>
-        <w:t xml:space="preserve">Таблица Б.11 – Сущность </w:t>
+        <w:t xml:space="preserve">Таблица Б.11 – </w:t>
+      </w:r>
+      <w:r>
+        <w:t>Описание сущности</w:t>
+      </w:r>
+      <w:r>
+        <w:t xml:space="preserve"> </w:t>
       </w:r>
       <w:proofErr w:type="spellStart"/>
       <w:r>
@@ -30564,7 +30519,13 @@
         <w:ind w:firstLine="0"/>
       </w:pPr>
       <w:r>
-        <w:t xml:space="preserve">Таблица Б.12 – Сущность </w:t>
+        <w:t xml:space="preserve">Таблица Б.12 – </w:t>
+      </w:r>
+      <w:r>
+        <w:t>Описание сущности</w:t>
+      </w:r>
+      <w:r>
+        <w:t xml:space="preserve"> </w:t>
       </w:r>
       <w:proofErr w:type="spellStart"/>
       <w:r>
@@ -31080,45 +31041,40 @@
       <w:pPr>
         <w:spacing w:before="360" w:line="240" w:lineRule="auto"/>
         <w:ind w:firstLine="0"/>
+      </w:pPr>
+      <w:r>
+        <w:t>Таблица</w:t>
+      </w:r>
+      <w:r>
+        <w:t xml:space="preserve"> </w:t>
+      </w:r>
+      <w:r>
+        <w:t>Б</w:t>
+      </w:r>
+      <w:r>
+        <w:t xml:space="preserve">.13 – </w:t>
+      </w:r>
+      <w:r>
+        <w:t>Описание сущности</w:t>
+      </w:r>
+      <w:r>
+        <w:t xml:space="preserve"> </w:t>
+      </w:r>
+      <w:r>
         <w:rPr>
           <w:lang w:val="en-US"/>
         </w:rPr>
-      </w:pPr>
-      <w:r>
-        <w:t>Таблица</w:t>
+        <w:t>AI</w:t>
+      </w:r>
+      <w:r>
+        <w:t>_</w:t>
       </w:r>
       <w:r>
         <w:rPr>
           <w:lang w:val="en-US"/>
         </w:rPr>
-        <w:t xml:space="preserve"> </w:t>
-      </w:r>
-      <w:r>
-        <w:t>Б</w:t>
-      </w:r>
-      <w:r>
-        <w:rPr>
-          <w:lang w:val="en-US"/>
-        </w:rPr>
-        <w:t xml:space="preserve">.13 – </w:t>
-      </w:r>
-      <w:r>
-        <w:t>Сущность</w:t>
-      </w:r>
-      <w:r>
-        <w:rPr>
-          <w:lang w:val="en-US"/>
-        </w:rPr>
-        <w:t xml:space="preserve"> </w:t>
-      </w:r>
-      <w:proofErr w:type="spellStart"/>
-      <w:r>
-        <w:rPr>
-          <w:lang w:val="en-US"/>
-        </w:rPr>
-        <w:t>AI_conversations</w:t>
-      </w:r>
-      <w:proofErr w:type="spellEnd"/>
+        <w:t>conversations</w:t>
+      </w:r>
     </w:p>
     <w:tbl>
       <w:tblPr>
@@ -31486,7 +31442,6 @@
                 <w:lang w:eastAsia="ru-RU"/>
               </w:rPr>
             </w:pPr>
-            <w:proofErr w:type="spellStart"/>
             <w:r>
               <w:rPr>
                 <w:sz w:val="24"/>
@@ -31494,7 +31449,6 @@
               </w:rPr>
               <w:t>Yes</w:t>
             </w:r>
-            <w:proofErr w:type="spellEnd"/>
           </w:p>
         </w:tc>
         <w:tc>
@@ -31622,45 +31576,49 @@
       <w:pPr>
         <w:spacing w:before="360" w:line="240" w:lineRule="auto"/>
         <w:ind w:firstLine="0"/>
+      </w:pPr>
+      <w:r>
+        <w:t>Таблица</w:t>
+      </w:r>
+      <w:r>
+        <w:t xml:space="preserve"> </w:t>
+      </w:r>
+      <w:r>
+        <w:t>Б</w:t>
+      </w:r>
+      <w:r>
+        <w:t xml:space="preserve">.14 – </w:t>
+      </w:r>
+      <w:r>
+        <w:t>Описание сущности</w:t>
+      </w:r>
+      <w:r>
+        <w:t xml:space="preserve"> </w:t>
+      </w:r>
+      <w:r>
         <w:rPr>
           <w:lang w:val="en-US"/>
         </w:rPr>
-      </w:pPr>
-      <w:r>
-        <w:t>Таблица</w:t>
+        <w:t>AI</w:t>
+      </w:r>
+      <w:r>
+        <w:t>_</w:t>
       </w:r>
       <w:r>
         <w:rPr>
           <w:lang w:val="en-US"/>
         </w:rPr>
-        <w:t xml:space="preserve"> </w:t>
-      </w:r>
-      <w:r>
-        <w:t>Б</w:t>
+        <w:t>message</w:t>
+      </w:r>
+      <w:r>
+        <w:t>_</w:t>
       </w:r>
       <w:r>
         <w:rPr>
           <w:lang w:val="en-US"/>
         </w:rPr>
-        <w:t xml:space="preserve">.14 – </w:t>
-      </w:r>
-      <w:r>
-        <w:t>Сущность</w:t>
-      </w:r>
-      <w:r>
-        <w:rPr>
-          <w:lang w:val="en-US"/>
-        </w:rPr>
-        <w:t xml:space="preserve"> </w:t>
-      </w:r>
-      <w:proofErr w:type="spellStart"/>
-      <w:r>
-        <w:rPr>
-          <w:lang w:val="en-US"/>
-        </w:rPr>
-        <w:t>AI_message_role</w:t>
-      </w:r>
-      <w:proofErr w:type="spellEnd"/>
+        <w:t>role</w:t>
+      </w:r>
     </w:p>
     <w:tbl>
       <w:tblPr>
@@ -32028,7 +31986,6 @@
                 <w:lang w:eastAsia="ru-RU"/>
               </w:rPr>
             </w:pPr>
-            <w:proofErr w:type="spellStart"/>
             <w:r>
               <w:rPr>
                 <w:sz w:val="24"/>
@@ -32036,7 +31993,6 @@
               </w:rPr>
               <w:t>Yes</w:t>
             </w:r>
-            <w:proofErr w:type="spellEnd"/>
           </w:p>
         </w:tc>
         <w:tc>
@@ -32075,7 +32031,19 @@
         <w:t>Б</w:t>
       </w:r>
       <w:r>
-        <w:t xml:space="preserve">.15 – Сущность </w:t>
+        <w:t xml:space="preserve">.15 – </w:t>
+      </w:r>
+      <w:r>
+        <w:t>Описание с</w:t>
+      </w:r>
+      <w:r>
+        <w:t>ущност</w:t>
+      </w:r>
+      <w:r>
+        <w:t>и</w:t>
+      </w:r>
+      <w:r>
+        <w:t xml:space="preserve"> </w:t>
       </w:r>
       <w:proofErr w:type="spellStart"/>
       <w:r>
@@ -32699,7 +32667,7 @@
 </file>
 
 <file path=word/endnotes.xml><?xml version="1.0" encoding="utf-8"?>
-<w:endnotes xmlns:wpc="http://schemas.microsoft.com/office/word/2010/wordprocessingCanvas" xmlns:cx="http://schemas.microsoft.com/office/drawing/2014/chartex" xmlns:cx1="http://schemas.microsoft.com/office/drawing/2015/9/8/chartex" xmlns:cx2="http://schemas.microsoft.com/office/drawing/2015/10/21/chartex" xmlns:cx3="http://schemas.microsoft.com/office/drawing/2016/5/9/chartex" xmlns:cx4="http://schemas.microsoft.com/office/drawing/2016/5/10/chartex" xmlns:cx5="http://schemas.microsoft.com/office/drawing/2016/5/11/chartex" xmlns:cx6="http://schemas.microsoft.com/office/drawing/2016/5/12/chartex" xmlns:cx7="http://schemas.microsoft.com/office/drawing/2016/5/13/chartex" xmlns:cx8="http://schemas.microsoft.com/office/drawing/2016/5/14/chartex" xmlns:mc="http://schemas.openxmlformats.org/markup-compatibility/2006" xmlns:aink="http://schemas.microsoft.com/office/drawing/2016/ink" xmlns:am3d="http://schemas.microsoft.com/office/drawing/2017/model3d" xmlns:o="urn:schemas-microsoft-com:office:office" xmlns:r="http://schemas.openxmlformats.org/officeDocument/2006/relationships" xmlns:m="http://schemas.openxmlformats.org/officeDocument/2006/math" xmlns:v="urn:schemas-microsoft-com:vml" xmlns:wp14="http://schemas.microsoft.com/office/word/2010/wordprocessingDrawing" xmlns:wp="http://schemas.openxmlformats.org/drawingml/2006/wordprocessingDrawing" xmlns:w10="urn:schemas-microsoft-com:office:word" xmlns:w="http://schemas.openxmlformats.org/wordprocessingml/2006/main" xmlns:w14="http://schemas.microsoft.com/office/word/2010/wordml" xmlns:w15="http://schemas.microsoft.com/office/word/2012/wordml" xmlns:w16cex="http://schemas.microsoft.com/office/word/2018/wordml/cex" xmlns:w16cid="http://schemas.microsoft.com/office/word/2016/wordml/cid" xmlns:w16="http://schemas.microsoft.com/office/word/2018/wordml" xmlns:w16sdtdh="http://schemas.microsoft.com/office/word/2020/wordml/sdtdatahash" xmlns:w16se="http://schemas.microsoft.com/office/word/2015/wordml/symex" xmlns:wpg="http://schemas.microsoft.com/office/word/2010/wordprocessingGroup" xmlns:wpi="http://schemas.microsoft.com/office/word/2010/wordprocessingInk" xmlns:wne="http://schemas.microsoft.com/office/word/2006/wordml" xmlns:wps="http://schemas.microsoft.com/office/word/2010/wordprocessingShape" mc:Ignorable="w14 w15 w16se w16cid w16 w16cex w16sdtdh wp14">
+<w:endnotes xmlns:wpc="http://schemas.microsoft.com/office/word/2010/wordprocessingCanvas" xmlns:cx="http://schemas.microsoft.com/office/drawing/2014/chartex" xmlns:cx1="http://schemas.microsoft.com/office/drawing/2015/9/8/chartex" xmlns:cx2="http://schemas.microsoft.com/office/drawing/2015/10/21/chartex" xmlns:cx3="http://schemas.microsoft.com/office/drawing/2016/5/9/chartex" xmlns:cx4="http://schemas.microsoft.com/office/drawing/2016/5/10/chartex" xmlns:cx5="http://schemas.microsoft.com/office/drawing/2016/5/11/chartex" xmlns:cx6="http://schemas.microsoft.com/office/drawing/2016/5/12/chartex" xmlns:cx7="http://schemas.microsoft.com/office/drawing/2016/5/13/chartex" xmlns:cx8="http://schemas.microsoft.com/office/drawing/2016/5/14/chartex" xmlns:mc="http://schemas.openxmlformats.org/markup-compatibility/2006" xmlns:aink="http://schemas.microsoft.com/office/drawing/2016/ink" xmlns:am3d="http://schemas.microsoft.com/office/drawing/2017/model3d" xmlns:o="urn:schemas-microsoft-com:office:office" xmlns:oel="http://schemas.microsoft.com/office/2019/extlst" xmlns:r="http://schemas.openxmlformats.org/officeDocument/2006/relationships" xmlns:m="http://schemas.openxmlformats.org/officeDocument/2006/math" xmlns:v="urn:schemas-microsoft-com:vml" xmlns:wp14="http://schemas.microsoft.com/office/word/2010/wordprocessingDrawing" xmlns:wp="http://schemas.openxmlformats.org/drawingml/2006/wordprocessingDrawing" xmlns:w10="urn:schemas-microsoft-com:office:word" xmlns:w="http://schemas.openxmlformats.org/wordprocessingml/2006/main" xmlns:w14="http://schemas.microsoft.com/office/word/2010/wordml" xmlns:w15="http://schemas.microsoft.com/office/word/2012/wordml" xmlns:w16cex="http://schemas.microsoft.com/office/word/2018/wordml/cex" xmlns:w16cid="http://schemas.microsoft.com/office/word/2016/wordml/cid" xmlns:w16="http://schemas.microsoft.com/office/word/2018/wordml" xmlns:w16du="http://schemas.microsoft.com/office/word/2023/wordml/word16du" xmlns:w16sdtdh="http://schemas.microsoft.com/office/word/2020/wordml/sdtdatahash" xmlns:w16sdtfl="http://schemas.microsoft.com/office/word/2024/wordml/sdtformatlock" xmlns:w16se="http://schemas.microsoft.com/office/word/2015/wordml/symex" xmlns:wpg="http://schemas.microsoft.com/office/word/2010/wordprocessingGroup" xmlns:wpi="http://schemas.microsoft.com/office/word/2010/wordprocessingInk" xmlns:wne="http://schemas.microsoft.com/office/word/2006/wordml" xmlns:wps="http://schemas.microsoft.com/office/word/2010/wordprocessingShape" mc:Ignorable="w14 w15 w16se w16cid w16 w16cex w16sdtdh w16sdtfl w16du wp14">
   <w:endnote w:type="separator" w:id="-1">
     <w:p>
       <w:pPr>
@@ -32724,7 +32692,7 @@
 </file>
 
 <file path=word/footnotes.xml><?xml version="1.0" encoding="utf-8"?>
-<w:footnotes xmlns:wpc="http://schemas.microsoft.com/office/word/2010/wordprocessingCanvas" xmlns:cx="http://schemas.microsoft.com/office/drawing/2014/chartex" xmlns:cx1="http://schemas.microsoft.com/office/drawing/2015/9/8/chartex" xmlns:cx2="http://schemas.microsoft.com/office/drawing/2015/10/21/chartex" xmlns:cx3="http://schemas.microsoft.com/office/drawing/2016/5/9/chartex" xmlns:cx4="http://schemas.microsoft.com/office/drawing/2016/5/10/chartex" xmlns:cx5="http://schemas.microsoft.com/office/drawing/2016/5/11/chartex" xmlns:cx6="http://schemas.microsoft.com/office/drawing/2016/5/12/chartex" xmlns:cx7="http://schemas.microsoft.com/office/drawing/2016/5/13/chartex" xmlns:cx8="http://schemas.microsoft.com/office/drawing/2016/5/14/chartex" xmlns:mc="http://schemas.openxmlformats.org/markup-compatibility/2006" xmlns:aink="http://schemas.microsoft.com/office/drawing/2016/ink" xmlns:am3d="http://schemas.microsoft.com/office/drawing/2017/model3d" xmlns:o="urn:schemas-microsoft-com:office:office" xmlns:r="http://schemas.openxmlformats.org/officeDocument/2006/relationships" xmlns:m="http://schemas.openxmlformats.org/officeDocument/2006/math" xmlns:v="urn:schemas-microsoft-com:vml" xmlns:wp14="http://schemas.microsoft.com/office/word/2010/wordprocessingDrawing" xmlns:wp="http://schemas.openxmlformats.org/drawingml/2006/wordprocessingDrawing" xmlns:w10="urn:schemas-microsoft-com:office:word" xmlns:w="http://schemas.openxmlformats.org/wordprocessingml/2006/main" xmlns:w14="http://schemas.microsoft.com/office/word/2010/wordml" xmlns:w15="http://schemas.microsoft.com/office/word/2012/wordml" xmlns:w16cex="http://schemas.microsoft.com/office/word/2018/wordml/cex" xmlns:w16cid="http://schemas.microsoft.com/office/word/2016/wordml/cid" xmlns:w16="http://schemas.microsoft.com/office/word/2018/wordml" xmlns:w16sdtdh="http://schemas.microsoft.com/office/word/2020/wordml/sdtdatahash" xmlns:w16se="http://schemas.microsoft.com/office/word/2015/wordml/symex" xmlns:wpg="http://schemas.microsoft.com/office/word/2010/wordprocessingGroup" xmlns:wpi="http://schemas.microsoft.com/office/word/2010/wordprocessingInk" xmlns:wne="http://schemas.microsoft.com/office/word/2006/wordml" xmlns:wps="http://schemas.microsoft.com/office/word/2010/wordprocessingShape" mc:Ignorable="w14 w15 w16se w16cid w16 w16cex w16sdtdh wp14">
+<w:footnotes xmlns:wpc="http://schemas.microsoft.com/office/word/2010/wordprocessingCanvas" xmlns:cx="http://schemas.microsoft.com/office/drawing/2014/chartex" xmlns:cx1="http://schemas.microsoft.com/office/drawing/2015/9/8/chartex" xmlns:cx2="http://schemas.microsoft.com/office/drawing/2015/10/21/chartex" xmlns:cx3="http://schemas.microsoft.com/office/drawing/2016/5/9/chartex" xmlns:cx4="http://schemas.microsoft.com/office/drawing/2016/5/10/chartex" xmlns:cx5="http://schemas.microsoft.com/office/drawing/2016/5/11/chartex" xmlns:cx6="http://schemas.microsoft.com/office/drawing/2016/5/12/chartex" xmlns:cx7="http://schemas.microsoft.com/office/drawing/2016/5/13/chartex" xmlns:cx8="http://schemas.microsoft.com/office/drawing/2016/5/14/chartex" xmlns:mc="http://schemas.openxmlformats.org/markup-compatibility/2006" xmlns:aink="http://schemas.microsoft.com/office/drawing/2016/ink" xmlns:am3d="http://schemas.microsoft.com/office/drawing/2017/model3d" xmlns:o="urn:schemas-microsoft-com:office:office" xmlns:oel="http://schemas.microsoft.com/office/2019/extlst" xmlns:r="http://schemas.openxmlformats.org/officeDocument/2006/relationships" xmlns:m="http://schemas.openxmlformats.org/officeDocument/2006/math" xmlns:v="urn:schemas-microsoft-com:vml" xmlns:wp14="http://schemas.microsoft.com/office/word/2010/wordprocessingDrawing" xmlns:wp="http://schemas.openxmlformats.org/drawingml/2006/wordprocessingDrawing" xmlns:w10="urn:schemas-microsoft-com:office:word" xmlns:w="http://schemas.openxmlformats.org/wordprocessingml/2006/main" xmlns:w14="http://schemas.microsoft.com/office/word/2010/wordml" xmlns:w15="http://schemas.microsoft.com/office/word/2012/wordml" xmlns:w16cex="http://schemas.microsoft.com/office/word/2018/wordml/cex" xmlns:w16cid="http://schemas.microsoft.com/office/word/2016/wordml/cid" xmlns:w16="http://schemas.microsoft.com/office/word/2018/wordml" xmlns:w16du="http://schemas.microsoft.com/office/word/2023/wordml/word16du" xmlns:w16sdtdh="http://schemas.microsoft.com/office/word/2020/wordml/sdtdatahash" xmlns:w16sdtfl="http://schemas.microsoft.com/office/word/2024/wordml/sdtformatlock" xmlns:w16se="http://schemas.microsoft.com/office/word/2015/wordml/symex" xmlns:wpg="http://schemas.microsoft.com/office/word/2010/wordprocessingGroup" xmlns:wpi="http://schemas.microsoft.com/office/word/2010/wordprocessingInk" xmlns:wne="http://schemas.microsoft.com/office/word/2006/wordml" xmlns:wps="http://schemas.microsoft.com/office/word/2010/wordprocessingShape" mc:Ignorable="w14 w15 w16se w16cid w16 w16cex w16sdtdh w16sdtfl w16du wp14">
   <w:footnote w:type="separator" w:id="-1">
     <w:p>
       <w:pPr>
@@ -32749,7 +32717,7 @@
 </file>
 
 <file path=word/header1.xml><?xml version="1.0" encoding="utf-8"?>
-<w:hdr xmlns:wpc="http://schemas.microsoft.com/office/word/2010/wordprocessingCanvas" xmlns:cx="http://schemas.microsoft.com/office/drawing/2014/chartex" xmlns:cx1="http://schemas.microsoft.com/office/drawing/2015/9/8/chartex" xmlns:cx2="http://schemas.microsoft.com/office/drawing/2015/10/21/chartex" xmlns:cx3="http://schemas.microsoft.com/office/drawing/2016/5/9/chartex" xmlns:cx4="http://schemas.microsoft.com/office/drawing/2016/5/10/chartex" xmlns:cx5="http://schemas.microsoft.com/office/drawing/2016/5/11/chartex" xmlns:cx6="http://schemas.microsoft.com/office/drawing/2016/5/12/chartex" xmlns:cx7="http://schemas.microsoft.com/office/drawing/2016/5/13/chartex" xmlns:cx8="http://schemas.microsoft.com/office/drawing/2016/5/14/chartex" xmlns:mc="http://schemas.openxmlformats.org/markup-compatibility/2006" xmlns:aink="http://schemas.microsoft.com/office/drawing/2016/ink" xmlns:am3d="http://schemas.microsoft.com/office/drawing/2017/model3d" xmlns:o="urn:schemas-microsoft-com:office:office" xmlns:r="http://schemas.openxmlformats.org/officeDocument/2006/relationships" xmlns:m="http://schemas.openxmlformats.org/officeDocument/2006/math" xmlns:v="urn:schemas-microsoft-com:vml" xmlns:wp14="http://schemas.microsoft.com/office/word/2010/wordprocessingDrawing" xmlns:wp="http://schemas.openxmlformats.org/drawingml/2006/wordprocessingDrawing" xmlns:w10="urn:schemas-microsoft-com:office:word" xmlns:w="http://schemas.openxmlformats.org/wordprocessingml/2006/main" xmlns:w14="http://schemas.microsoft.com/office/word/2010/wordml" xmlns:w15="http://schemas.microsoft.com/office/word/2012/wordml" xmlns:w16cex="http://schemas.microsoft.com/office/word/2018/wordml/cex" xmlns:w16cid="http://schemas.microsoft.com/office/word/2016/wordml/cid" xmlns:w16="http://schemas.microsoft.com/office/word/2018/wordml" xmlns:w16sdtdh="http://schemas.microsoft.com/office/word/2020/wordml/sdtdatahash" xmlns:w16se="http://schemas.microsoft.com/office/word/2015/wordml/symex" xmlns:wpg="http://schemas.microsoft.com/office/word/2010/wordprocessingGroup" xmlns:wpi="http://schemas.microsoft.com/office/word/2010/wordprocessingInk" xmlns:wne="http://schemas.microsoft.com/office/word/2006/wordml" xmlns:wps="http://schemas.microsoft.com/office/word/2010/wordprocessingShape" mc:Ignorable="w14 w15 w16se w16cid w16 w16cex w16sdtdh wp14">
+<w:hdr xmlns:wpc="http://schemas.microsoft.com/office/word/2010/wordprocessingCanvas" xmlns:cx="http://schemas.microsoft.com/office/drawing/2014/chartex" xmlns:cx1="http://schemas.microsoft.com/office/drawing/2015/9/8/chartex" xmlns:cx2="http://schemas.microsoft.com/office/drawing/2015/10/21/chartex" xmlns:cx3="http://schemas.microsoft.com/office/drawing/2016/5/9/chartex" xmlns:cx4="http://schemas.microsoft.com/office/drawing/2016/5/10/chartex" xmlns:cx5="http://schemas.microsoft.com/office/drawing/2016/5/11/chartex" xmlns:cx6="http://schemas.microsoft.com/office/drawing/2016/5/12/chartex" xmlns:cx7="http://schemas.microsoft.com/office/drawing/2016/5/13/chartex" xmlns:cx8="http://schemas.microsoft.com/office/drawing/2016/5/14/chartex" xmlns:mc="http://schemas.openxmlformats.org/markup-compatibility/2006" xmlns:aink="http://schemas.microsoft.com/office/drawing/2016/ink" xmlns:am3d="http://schemas.microsoft.com/office/drawing/2017/model3d" xmlns:o="urn:schemas-microsoft-com:office:office" xmlns:oel="http://schemas.microsoft.com/office/2019/extlst" xmlns:r="http://schemas.openxmlformats.org/officeDocument/2006/relationships" xmlns:m="http://schemas.openxmlformats.org/officeDocument/2006/math" xmlns:v="urn:schemas-microsoft-com:vml" xmlns:wp14="http://schemas.microsoft.com/office/word/2010/wordprocessingDrawing" xmlns:wp="http://schemas.openxmlformats.org/drawingml/2006/wordprocessingDrawing" xmlns:w10="urn:schemas-microsoft-com:office:word" xmlns:w="http://schemas.openxmlformats.org/wordprocessingml/2006/main" xmlns:w14="http://schemas.microsoft.com/office/word/2010/wordml" xmlns:w15="http://schemas.microsoft.com/office/word/2012/wordml" xmlns:w16cex="http://schemas.microsoft.com/office/word/2018/wordml/cex" xmlns:w16cid="http://schemas.microsoft.com/office/word/2016/wordml/cid" xmlns:w16="http://schemas.microsoft.com/office/word/2018/wordml" xmlns:w16du="http://schemas.microsoft.com/office/word/2023/wordml/word16du" xmlns:w16sdtdh="http://schemas.microsoft.com/office/word/2020/wordml/sdtdatahash" xmlns:w16sdtfl="http://schemas.microsoft.com/office/word/2024/wordml/sdtformatlock" xmlns:w16se="http://schemas.microsoft.com/office/word/2015/wordml/symex" xmlns:wpg="http://schemas.microsoft.com/office/word/2010/wordprocessingGroup" xmlns:wpi="http://schemas.microsoft.com/office/word/2010/wordprocessingInk" xmlns:wne="http://schemas.microsoft.com/office/word/2006/wordml" xmlns:wps="http://schemas.microsoft.com/office/word/2010/wordprocessingShape" mc:Ignorable="w14 w15 w16se w16cid w16 w16cex w16sdtdh w16sdtfl w16du wp14">
   <w:p>
     <w:pPr>
       <w:pStyle w:val="a8"/>
@@ -34553,7 +34521,7 @@
         </mc:Choice>
         <mc:Fallback>
           <w:pict>
-            <v:group w14:anchorId="3FF8DA0B" id="Группа 21" o:spid="_x0000_s1026" style="position:absolute;left:0;text-align:left;margin-left:56.7pt;margin-top:20.6pt;width:518.9pt;height:803.85pt;z-index:251657728;mso-position-horizontal-relative:page;mso-position-vertical-relative:page" coordorigin="1134,397" coordsize="10378,16044" o:gfxdata="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" o:allowincell="f">
+            <v:group w14:anchorId="3FF8DA0B" id="Группа 21" o:spid="_x0000_s1026" style="position:absolute;left:0;text-align:left;margin-left:56.7pt;margin-top:20.6pt;width:518.9pt;height:803.85pt;z-index:251657728;mso-position-horizontal-relative:page;mso-position-vertical-relative:page" coordorigin="1134,397" coordsize="10378,16044" o:gfxdata="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" o:allowincell="f">
               <v:shapetype id="_x0000_t202" coordsize="21600,21600" o:spt="202" path="m,l,21600r21600,l21600,xe">
                 <v:stroke joinstyle="miter"/>
                 <v:path gradientshapeok="t" o:connecttype="rect"/>
@@ -36175,7 +36143,7 @@
 </file>
 
 <file path=word/header2.xml><?xml version="1.0" encoding="utf-8"?>
-<w:hdr xmlns:wpc="http://schemas.microsoft.com/office/word/2010/wordprocessingCanvas" xmlns:cx="http://schemas.microsoft.com/office/drawing/2014/chartex" xmlns:cx1="http://schemas.microsoft.com/office/drawing/2015/9/8/chartex" xmlns:cx2="http://schemas.microsoft.com/office/drawing/2015/10/21/chartex" xmlns:cx3="http://schemas.microsoft.com/office/drawing/2016/5/9/chartex" xmlns:cx4="http://schemas.microsoft.com/office/drawing/2016/5/10/chartex" xmlns:cx5="http://schemas.microsoft.com/office/drawing/2016/5/11/chartex" xmlns:cx6="http://schemas.microsoft.com/office/drawing/2016/5/12/chartex" xmlns:cx7="http://schemas.microsoft.com/office/drawing/2016/5/13/chartex" xmlns:cx8="http://schemas.microsoft.com/office/drawing/2016/5/14/chartex" xmlns:mc="http://schemas.openxmlformats.org/markup-compatibility/2006" xmlns:aink="http://schemas.microsoft.com/office/drawing/2016/ink" xmlns:am3d="http://schemas.microsoft.com/office/drawing/2017/model3d" xmlns:o="urn:schemas-microsoft-com:office:office" xmlns:r="http://schemas.openxmlformats.org/officeDocument/2006/relationships" xmlns:m="http://schemas.openxmlformats.org/officeDocument/2006/math" xmlns:v="urn:schemas-microsoft-com:vml" xmlns:wp14="http://schemas.microsoft.com/office/word/2010/wordprocessingDrawing" xmlns:wp="http://schemas.openxmlformats.org/drawingml/2006/wordprocessingDrawing" xmlns:w10="urn:schemas-microsoft-com:office:word" xmlns:w="http://schemas.openxmlformats.org/wordprocessingml/2006/main" xmlns:w14="http://schemas.microsoft.com/office/word/2010/wordml" xmlns:w15="http://schemas.microsoft.com/office/word/2012/wordml" xmlns:w16cex="http://schemas.microsoft.com/office/word/2018/wordml/cex" xmlns:w16cid="http://schemas.microsoft.com/office/word/2016/wordml/cid" xmlns:w16="http://schemas.microsoft.com/office/word/2018/wordml" xmlns:w16sdtdh="http://schemas.microsoft.com/office/word/2020/wordml/sdtdatahash" xmlns:w16se="http://schemas.microsoft.com/office/word/2015/wordml/symex" xmlns:wpg="http://schemas.microsoft.com/office/word/2010/wordprocessingGroup" xmlns:wpi="http://schemas.microsoft.com/office/word/2010/wordprocessingInk" xmlns:wne="http://schemas.microsoft.com/office/word/2006/wordml" xmlns:wps="http://schemas.microsoft.com/office/word/2010/wordprocessingShape" mc:Ignorable="w14 w15 w16se w16cid w16 w16cex w16sdtdh wp14">
+<w:hdr xmlns:wpc="http://schemas.microsoft.com/office/word/2010/wordprocessingCanvas" xmlns:cx="http://schemas.microsoft.com/office/drawing/2014/chartex" xmlns:cx1="http://schemas.microsoft.com/office/drawing/2015/9/8/chartex" xmlns:cx2="http://schemas.microsoft.com/office/drawing/2015/10/21/chartex" xmlns:cx3="http://schemas.microsoft.com/office/drawing/2016/5/9/chartex" xmlns:cx4="http://schemas.microsoft.com/office/drawing/2016/5/10/chartex" xmlns:cx5="http://schemas.microsoft.com/office/drawing/2016/5/11/chartex" xmlns:cx6="http://schemas.microsoft.com/office/drawing/2016/5/12/chartex" xmlns:cx7="http://schemas.microsoft.com/office/drawing/2016/5/13/chartex" xmlns:cx8="http://schemas.microsoft.com/office/drawing/2016/5/14/chartex" xmlns:mc="http://schemas.openxmlformats.org/markup-compatibility/2006" xmlns:aink="http://schemas.microsoft.com/office/drawing/2016/ink" xmlns:am3d="http://schemas.microsoft.com/office/drawing/2017/model3d" xmlns:o="urn:schemas-microsoft-com:office:office" xmlns:oel="http://schemas.microsoft.com/office/2019/extlst" xmlns:r="http://schemas.openxmlformats.org/officeDocument/2006/relationships" xmlns:m="http://schemas.openxmlformats.org/officeDocument/2006/math" xmlns:v="urn:schemas-microsoft-com:vml" xmlns:wp14="http://schemas.microsoft.com/office/word/2010/wordprocessingDrawing" xmlns:wp="http://schemas.openxmlformats.org/drawingml/2006/wordprocessingDrawing" xmlns:w10="urn:schemas-microsoft-com:office:word" xmlns:w="http://schemas.openxmlformats.org/wordprocessingml/2006/main" xmlns:w14="http://schemas.microsoft.com/office/word/2010/wordml" xmlns:w15="http://schemas.microsoft.com/office/word/2012/wordml" xmlns:w16cex="http://schemas.microsoft.com/office/word/2018/wordml/cex" xmlns:w16cid="http://schemas.microsoft.com/office/word/2016/wordml/cid" xmlns:w16="http://schemas.microsoft.com/office/word/2018/wordml" xmlns:w16du="http://schemas.microsoft.com/office/word/2023/wordml/word16du" xmlns:w16sdtdh="http://schemas.microsoft.com/office/word/2020/wordml/sdtdatahash" xmlns:w16sdtfl="http://schemas.microsoft.com/office/word/2024/wordml/sdtformatlock" xmlns:w16se="http://schemas.microsoft.com/office/word/2015/wordml/symex" xmlns:wpg="http://schemas.microsoft.com/office/word/2010/wordprocessingGroup" xmlns:wpi="http://schemas.microsoft.com/office/word/2010/wordprocessingInk" xmlns:wne="http://schemas.microsoft.com/office/word/2006/wordml" xmlns:wps="http://schemas.microsoft.com/office/word/2010/wordprocessingShape" mc:Ignorable="w14 w15 w16se w16cid w16 w16cex w16sdtdh w16sdtfl w16du wp14">
   <w:p>
     <w:pPr>
       <w:pStyle w:val="a8"/>
@@ -36329,7 +36297,7 @@
             </wp:anchor>
           </w:drawing>
         </mc:Choice>
-        <mc:Fallback xmlns:oel="http://schemas.microsoft.com/office/2019/extlst" xmlns:w16du="http://schemas.microsoft.com/office/word/2023/wordml/word16du" xmlns:w16sdtfl="http://schemas.microsoft.com/office/word/2024/wordml/sdtformatlock">
+        <mc:Fallback>
           <w:pict>
             <v:group w14:anchorId="2ED3E864" id="Группа 13" o:spid="_x0000_s1026" style="position:absolute;margin-left:56.85pt;margin-top:18.25pt;width:518.9pt;height:803.85pt;z-index:251656704;mso-position-horizontal-relative:page;mso-position-vertical-relative:page" coordorigin="1134,397" coordsize="10378,16044" o:gfxdata="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" o:allowincell="f">
               <v:line id="Line 4" o:spid="_x0000_s1027" style="position:absolute;visibility:visible;mso-wrap-style:square" from="1134,397" to="1134,16441" o:connectortype="straight" o:gfxdata="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" strokeweight="2.25pt"/>
@@ -36347,7 +36315,7 @@
 </file>
 
 <file path=word/header3.xml><?xml version="1.0" encoding="utf-8"?>
-<w:hdr xmlns:wpc="http://schemas.microsoft.com/office/word/2010/wordprocessingCanvas" xmlns:cx="http://schemas.microsoft.com/office/drawing/2014/chartex" xmlns:cx1="http://schemas.microsoft.com/office/drawing/2015/9/8/chartex" xmlns:cx2="http://schemas.microsoft.com/office/drawing/2015/10/21/chartex" xmlns:cx3="http://schemas.microsoft.com/office/drawing/2016/5/9/chartex" xmlns:cx4="http://schemas.microsoft.com/office/drawing/2016/5/10/chartex" xmlns:cx5="http://schemas.microsoft.com/office/drawing/2016/5/11/chartex" xmlns:cx6="http://schemas.microsoft.com/office/drawing/2016/5/12/chartex" xmlns:cx7="http://schemas.microsoft.com/office/drawing/2016/5/13/chartex" xmlns:cx8="http://schemas.microsoft.com/office/drawing/2016/5/14/chartex" xmlns:mc="http://schemas.openxmlformats.org/markup-compatibility/2006" xmlns:aink="http://schemas.microsoft.com/office/drawing/2016/ink" xmlns:am3d="http://schemas.microsoft.com/office/drawing/2017/model3d" xmlns:o="urn:schemas-microsoft-com:office:office" xmlns:r="http://schemas.openxmlformats.org/officeDocument/2006/relationships" xmlns:m="http://schemas.openxmlformats.org/officeDocument/2006/math" xmlns:v="urn:schemas-microsoft-com:vml" xmlns:wp14="http://schemas.microsoft.com/office/word/2010/wordprocessingDrawing" xmlns:wp="http://schemas.openxmlformats.org/drawingml/2006/wordprocessingDrawing" xmlns:w10="urn:schemas-microsoft-com:office:word" xmlns:w="http://schemas.openxmlformats.org/wordprocessingml/2006/main" xmlns:w14="http://schemas.microsoft.com/office/word/2010/wordml" xmlns:w15="http://schemas.microsoft.com/office/word/2012/wordml" xmlns:w16cex="http://schemas.microsoft.com/office/word/2018/wordml/cex" xmlns:w16cid="http://schemas.microsoft.com/office/word/2016/wordml/cid" xmlns:w16="http://schemas.microsoft.com/office/word/2018/wordml" xmlns:w16sdtdh="http://schemas.microsoft.com/office/word/2020/wordml/sdtdatahash" xmlns:w16se="http://schemas.microsoft.com/office/word/2015/wordml/symex" xmlns:wpg="http://schemas.microsoft.com/office/word/2010/wordprocessingGroup" xmlns:wpi="http://schemas.microsoft.com/office/word/2010/wordprocessingInk" xmlns:wne="http://schemas.microsoft.com/office/word/2006/wordml" xmlns:wps="http://schemas.microsoft.com/office/word/2010/wordprocessingShape" mc:Ignorable="w14 w15 w16se w16cid w16 w16cex w16sdtdh wp14">
+<w:hdr xmlns:wpc="http://schemas.microsoft.com/office/word/2010/wordprocessingCanvas" xmlns:cx="http://schemas.microsoft.com/office/drawing/2014/chartex" xmlns:cx1="http://schemas.microsoft.com/office/drawing/2015/9/8/chartex" xmlns:cx2="http://schemas.microsoft.com/office/drawing/2015/10/21/chartex" xmlns:cx3="http://schemas.microsoft.com/office/drawing/2016/5/9/chartex" xmlns:cx4="http://schemas.microsoft.com/office/drawing/2016/5/10/chartex" xmlns:cx5="http://schemas.microsoft.com/office/drawing/2016/5/11/chartex" xmlns:cx6="http://schemas.microsoft.com/office/drawing/2016/5/12/chartex" xmlns:cx7="http://schemas.microsoft.com/office/drawing/2016/5/13/chartex" xmlns:cx8="http://schemas.microsoft.com/office/drawing/2016/5/14/chartex" xmlns:mc="http://schemas.openxmlformats.org/markup-compatibility/2006" xmlns:aink="http://schemas.microsoft.com/office/drawing/2016/ink" xmlns:am3d="http://schemas.microsoft.com/office/drawing/2017/model3d" xmlns:o="urn:schemas-microsoft-com:office:office" xmlns:oel="http://schemas.microsoft.com/office/2019/extlst" xmlns:r="http://schemas.openxmlformats.org/officeDocument/2006/relationships" xmlns:m="http://schemas.openxmlformats.org/officeDocument/2006/math" xmlns:v="urn:schemas-microsoft-com:vml" xmlns:wp14="http://schemas.microsoft.com/office/word/2010/wordprocessingDrawing" xmlns:wp="http://schemas.openxmlformats.org/drawingml/2006/wordprocessingDrawing" xmlns:w10="urn:schemas-microsoft-com:office:word" xmlns:w="http://schemas.openxmlformats.org/wordprocessingml/2006/main" xmlns:w14="http://schemas.microsoft.com/office/word/2010/wordml" xmlns:w15="http://schemas.microsoft.com/office/word/2012/wordml" xmlns:w16cex="http://schemas.microsoft.com/office/word/2018/wordml/cex" xmlns:w16cid="http://schemas.microsoft.com/office/word/2016/wordml/cid" xmlns:w16="http://schemas.microsoft.com/office/word/2018/wordml" xmlns:w16du="http://schemas.microsoft.com/office/word/2023/wordml/word16du" xmlns:w16sdtdh="http://schemas.microsoft.com/office/word/2020/wordml/sdtdatahash" xmlns:w16sdtfl="http://schemas.microsoft.com/office/word/2024/wordml/sdtformatlock" xmlns:w16se="http://schemas.microsoft.com/office/word/2015/wordml/symex" xmlns:wpg="http://schemas.microsoft.com/office/word/2010/wordprocessingGroup" xmlns:wpi="http://schemas.microsoft.com/office/word/2010/wordprocessingInk" xmlns:wne="http://schemas.microsoft.com/office/word/2006/wordml" xmlns:wps="http://schemas.microsoft.com/office/word/2010/wordprocessingShape" mc:Ignorable="w14 w15 w16se w16cid w16 w16cex w16sdtdh w16sdtfl w16du wp14">
   <w:p>
     <w:pPr>
       <w:pStyle w:val="a8"/>
@@ -37233,7 +37201,7 @@
         </mc:Choice>
         <mc:Fallback>
           <w:pict>
-            <v:group w14:anchorId="306C473C" id="Группа 8" o:spid="_x0000_s1033" style="position:absolute;left:0;text-align:left;margin-left:58.2pt;margin-top:22.85pt;width:518.9pt;height:802.2pt;z-index:251660800;mso-position-horizontal-relative:page;mso-position-vertical-relative:page" coordorigin="1134,397" coordsize="10378,16044" o:gfxdata="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" o:allowincell="f">
+            <v:group w14:anchorId="306C473C" id="Группа 8" o:spid="_x0000_s1033" style="position:absolute;left:0;text-align:left;margin-left:58.2pt;margin-top:22.85pt;width:518.9pt;height:802.2pt;z-index:251660800;mso-position-horizontal-relative:page;mso-position-vertical-relative:page" coordorigin="1134,397" coordsize="10378,16044" o:gfxdata="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" o:allowincell="f">
               <v:line id="Line 15" o:spid="_x0000_s1034" style="position:absolute;visibility:visible;mso-wrap-style:square" from="1134,397" to="1134,16441" o:connectortype="straight" o:gfxdata="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" strokeweight="2.25pt"/>
               <v:line id="Line 16" o:spid="_x0000_s1035" style="position:absolute;visibility:visible;mso-wrap-style:square" from="11509,397" to="11509,16441" o:connectortype="straight" o:gfxdata="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" strokeweight="2.25pt"/>
               <v:line id="Line 17" o:spid="_x0000_s1036" style="position:absolute;visibility:visible;mso-wrap-style:square" from="1137,16441" to="11512,16441" o:connectortype="straight" o:gfxdata="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" strokeweight="2.25pt"/>
@@ -37938,7 +37906,7 @@
 </file>
 
 <file path=word/numbering.xml><?xml version="1.0" encoding="utf-8"?>
-<w:numbering xmlns:wpc="http://schemas.microsoft.com/office/word/2010/wordprocessingCanvas" xmlns:cx="http://schemas.microsoft.com/office/drawing/2014/chartex" xmlns:cx1="http://schemas.microsoft.com/office/drawing/2015/9/8/chartex" xmlns:cx2="http://schemas.microsoft.com/office/drawing/2015/10/21/chartex" xmlns:cx3="http://schemas.microsoft.com/office/drawing/2016/5/9/chartex" xmlns:cx4="http://schemas.microsoft.com/office/drawing/2016/5/10/chartex" xmlns:cx5="http://schemas.microsoft.com/office/drawing/2016/5/11/chartex" xmlns:cx6="http://schemas.microsoft.com/office/drawing/2016/5/12/chartex" xmlns:cx7="http://schemas.microsoft.com/office/drawing/2016/5/13/chartex" xmlns:cx8="http://schemas.microsoft.com/office/drawing/2016/5/14/chartex" xmlns:mc="http://schemas.openxmlformats.org/markup-compatibility/2006" xmlns:aink="http://schemas.microsoft.com/office/drawing/2016/ink" xmlns:am3d="http://schemas.microsoft.com/office/drawing/2017/model3d" xmlns:o="urn:schemas-microsoft-com:office:office" xmlns:r="http://schemas.openxmlformats.org/officeDocument/2006/relationships" xmlns:m="http://schemas.openxmlformats.org/officeDocument/2006/math" xmlns:v="urn:schemas-microsoft-com:vml" xmlns:wp14="http://schemas.microsoft.com/office/word/2010/wordprocessingDrawing" xmlns:wp="http://schemas.openxmlformats.org/drawingml/2006/wordprocessingDrawing" xmlns:w10="urn:schemas-microsoft-com:office:word" xmlns:w="http://schemas.openxmlformats.org/wordprocessingml/2006/main" xmlns:w14="http://schemas.microsoft.com/office/word/2010/wordml" xmlns:w15="http://schemas.microsoft.com/office/word/2012/wordml" xmlns:w16cex="http://schemas.microsoft.com/office/word/2018/wordml/cex" xmlns:w16cid="http://schemas.microsoft.com/office/word/2016/wordml/cid" xmlns:w16="http://schemas.microsoft.com/office/word/2018/wordml" xmlns:w16sdtdh="http://schemas.microsoft.com/office/word/2020/wordml/sdtdatahash" xmlns:w16se="http://schemas.microsoft.com/office/word/2015/wordml/symex" xmlns:wpg="http://schemas.microsoft.com/office/word/2010/wordprocessingGroup" xmlns:wpi="http://schemas.microsoft.com/office/word/2010/wordprocessingInk" xmlns:wne="http://schemas.microsoft.com/office/word/2006/wordml" xmlns:wps="http://schemas.microsoft.com/office/word/2010/wordprocessingShape" mc:Ignorable="w14 w15 w16se w16cid w16 w16cex w16sdtdh wp14">
+<w:numbering xmlns:wpc="http://schemas.microsoft.com/office/word/2010/wordprocessingCanvas" xmlns:cx="http://schemas.microsoft.com/office/drawing/2014/chartex" xmlns:cx1="http://schemas.microsoft.com/office/drawing/2015/9/8/chartex" xmlns:cx2="http://schemas.microsoft.com/office/drawing/2015/10/21/chartex" xmlns:cx3="http://schemas.microsoft.com/office/drawing/2016/5/9/chartex" xmlns:cx4="http://schemas.microsoft.com/office/drawing/2016/5/10/chartex" xmlns:cx5="http://schemas.microsoft.com/office/drawing/2016/5/11/chartex" xmlns:cx6="http://schemas.microsoft.com/office/drawing/2016/5/12/chartex" xmlns:cx7="http://schemas.microsoft.com/office/drawing/2016/5/13/chartex" xmlns:cx8="http://schemas.microsoft.com/office/drawing/2016/5/14/chartex" xmlns:mc="http://schemas.openxmlformats.org/markup-compatibility/2006" xmlns:aink="http://schemas.microsoft.com/office/drawing/2016/ink" xmlns:am3d="http://schemas.microsoft.com/office/drawing/2017/model3d" xmlns:o="urn:schemas-microsoft-com:office:office" xmlns:oel="http://schemas.microsoft.com/office/2019/extlst" xmlns:r="http://schemas.openxmlformats.org/officeDocument/2006/relationships" xmlns:m="http://schemas.openxmlformats.org/officeDocument/2006/math" xmlns:v="urn:schemas-microsoft-com:vml" xmlns:wp14="http://schemas.microsoft.com/office/word/2010/wordprocessingDrawing" xmlns:wp="http://schemas.openxmlformats.org/drawingml/2006/wordprocessingDrawing" xmlns:w10="urn:schemas-microsoft-com:office:word" xmlns:w="http://schemas.openxmlformats.org/wordprocessingml/2006/main" xmlns:w14="http://schemas.microsoft.com/office/word/2010/wordml" xmlns:w15="http://schemas.microsoft.com/office/word/2012/wordml" xmlns:w16cex="http://schemas.microsoft.com/office/word/2018/wordml/cex" xmlns:w16cid="http://schemas.microsoft.com/office/word/2016/wordml/cid" xmlns:w16="http://schemas.microsoft.com/office/word/2018/wordml" xmlns:w16du="http://schemas.microsoft.com/office/word/2023/wordml/word16du" xmlns:w16sdtdh="http://schemas.microsoft.com/office/word/2020/wordml/sdtdatahash" xmlns:w16sdtfl="http://schemas.microsoft.com/office/word/2024/wordml/sdtformatlock" xmlns:w16se="http://schemas.microsoft.com/office/word/2015/wordml/symex" xmlns:wpg="http://schemas.microsoft.com/office/word/2010/wordprocessingGroup" xmlns:wpi="http://schemas.microsoft.com/office/word/2010/wordprocessingInk" xmlns:wne="http://schemas.microsoft.com/office/word/2006/wordml" xmlns:wps="http://schemas.microsoft.com/office/word/2010/wordprocessingShape" mc:Ignorable="w14 w15 w16se w16cid w16 w16cex w16sdtdh w16sdtfl w16du wp14">
   <w:abstractNum w:abstractNumId="0" w15:restartNumberingAfterBreak="0">
     <w:nsid w:val="009F76EB"/>
     <w:multiLevelType w:val="hybridMultilevel"/>
@@ -41682,106 +41650,106 @@
       </w:rPr>
     </w:lvl>
   </w:abstractNum>
-  <w:num w:numId="1">
+  <w:num w:numId="1" w16cid:durableId="2123916999">
     <w:abstractNumId w:val="21"/>
   </w:num>
-  <w:num w:numId="2">
+  <w:num w:numId="2" w16cid:durableId="1569879161">
     <w:abstractNumId w:val="3"/>
   </w:num>
-  <w:num w:numId="3">
+  <w:num w:numId="3" w16cid:durableId="944657917">
     <w:abstractNumId w:val="6"/>
   </w:num>
-  <w:num w:numId="4">
+  <w:num w:numId="4" w16cid:durableId="1709646882">
     <w:abstractNumId w:val="1"/>
   </w:num>
-  <w:num w:numId="5">
+  <w:num w:numId="5" w16cid:durableId="386614433">
     <w:abstractNumId w:val="4"/>
   </w:num>
-  <w:num w:numId="6">
+  <w:num w:numId="6" w16cid:durableId="840970669">
     <w:abstractNumId w:val="11"/>
   </w:num>
-  <w:num w:numId="7">
+  <w:num w:numId="7" w16cid:durableId="658655954">
     <w:abstractNumId w:val="20"/>
   </w:num>
-  <w:num w:numId="8">
+  <w:num w:numId="8" w16cid:durableId="2042242498">
     <w:abstractNumId w:val="5"/>
   </w:num>
-  <w:num w:numId="9">
+  <w:num w:numId="9" w16cid:durableId="386075492">
     <w:abstractNumId w:val="26"/>
   </w:num>
-  <w:num w:numId="10">
+  <w:num w:numId="10" w16cid:durableId="923756450">
     <w:abstractNumId w:val="22"/>
   </w:num>
-  <w:num w:numId="11">
+  <w:num w:numId="11" w16cid:durableId="1955667361">
     <w:abstractNumId w:val="8"/>
   </w:num>
-  <w:num w:numId="12">
+  <w:num w:numId="12" w16cid:durableId="1610237926">
     <w:abstractNumId w:val="33"/>
   </w:num>
-  <w:num w:numId="13">
+  <w:num w:numId="13" w16cid:durableId="738133040">
     <w:abstractNumId w:val="29"/>
   </w:num>
-  <w:num w:numId="14">
+  <w:num w:numId="14" w16cid:durableId="246696460">
     <w:abstractNumId w:val="32"/>
   </w:num>
-  <w:num w:numId="15">
+  <w:num w:numId="15" w16cid:durableId="157692669">
     <w:abstractNumId w:val="13"/>
   </w:num>
-  <w:num w:numId="16">
+  <w:num w:numId="16" w16cid:durableId="730541204">
     <w:abstractNumId w:val="31"/>
   </w:num>
-  <w:num w:numId="17">
+  <w:num w:numId="17" w16cid:durableId="93792362">
     <w:abstractNumId w:val="0"/>
   </w:num>
-  <w:num w:numId="18">
+  <w:num w:numId="18" w16cid:durableId="1159619827">
     <w:abstractNumId w:val="19"/>
   </w:num>
-  <w:num w:numId="19">
+  <w:num w:numId="19" w16cid:durableId="813907568">
     <w:abstractNumId w:val="12"/>
   </w:num>
-  <w:num w:numId="20">
+  <w:num w:numId="20" w16cid:durableId="1258172550">
     <w:abstractNumId w:val="25"/>
   </w:num>
-  <w:num w:numId="21">
+  <w:num w:numId="21" w16cid:durableId="62995934">
     <w:abstractNumId w:val="10"/>
   </w:num>
-  <w:num w:numId="22">
+  <w:num w:numId="22" w16cid:durableId="1671254033">
     <w:abstractNumId w:val="28"/>
   </w:num>
-  <w:num w:numId="23">
+  <w:num w:numId="23" w16cid:durableId="2093239626">
     <w:abstractNumId w:val="24"/>
   </w:num>
-  <w:num w:numId="24">
+  <w:num w:numId="24" w16cid:durableId="459693071">
     <w:abstractNumId w:val="23"/>
   </w:num>
-  <w:num w:numId="25">
+  <w:num w:numId="25" w16cid:durableId="1691251939">
     <w:abstractNumId w:val="15"/>
   </w:num>
-  <w:num w:numId="26">
+  <w:num w:numId="26" w16cid:durableId="1355112626">
     <w:abstractNumId w:val="30"/>
   </w:num>
-  <w:num w:numId="27">
+  <w:num w:numId="27" w16cid:durableId="745109393">
     <w:abstractNumId w:val="7"/>
   </w:num>
-  <w:num w:numId="28">
+  <w:num w:numId="28" w16cid:durableId="987980353">
     <w:abstractNumId w:val="18"/>
   </w:num>
-  <w:num w:numId="29">
+  <w:num w:numId="29" w16cid:durableId="128402493">
     <w:abstractNumId w:val="9"/>
   </w:num>
-  <w:num w:numId="30">
+  <w:num w:numId="30" w16cid:durableId="1809973526">
     <w:abstractNumId w:val="2"/>
   </w:num>
-  <w:num w:numId="31">
+  <w:num w:numId="31" w16cid:durableId="378359815">
     <w:abstractNumId w:val="27"/>
   </w:num>
-  <w:num w:numId="32">
+  <w:num w:numId="32" w16cid:durableId="1886527114">
     <w:abstractNumId w:val="14"/>
   </w:num>
-  <w:num w:numId="33">
+  <w:num w:numId="33" w16cid:durableId="1416047066">
     <w:abstractNumId w:val="16"/>
   </w:num>
-  <w:num w:numId="34">
+  <w:num w:numId="34" w16cid:durableId="1801796975">
     <w:abstractNumId w:val="17"/>
   </w:num>
   <w:numIdMacAtCleanup w:val="4"/>
@@ -41789,7 +41757,7 @@
 </file>
 
 <file path=word/styles.xml><?xml version="1.0" encoding="utf-8"?>
-<w:styles xmlns:mc="http://schemas.openxmlformats.org/markup-compatibility/2006" xmlns:r="http://schemas.openxmlformats.org/officeDocument/2006/relationships" xmlns:w="http://schemas.openxmlformats.org/wordprocessingml/2006/main" xmlns:w14="http://schemas.microsoft.com/office/word/2010/wordml" xmlns:w15="http://schemas.microsoft.com/office/word/2012/wordml" xmlns:w16cex="http://schemas.microsoft.com/office/word/2018/wordml/cex" xmlns:w16cid="http://schemas.microsoft.com/office/word/2016/wordml/cid" xmlns:w16="http://schemas.microsoft.com/office/word/2018/wordml" xmlns:w16sdtdh="http://schemas.microsoft.com/office/word/2020/wordml/sdtdatahash" xmlns:w16se="http://schemas.microsoft.com/office/word/2015/wordml/symex" mc:Ignorable="w14 w15 w16se w16cid w16 w16cex w16sdtdh">
+<w:styles xmlns:mc="http://schemas.openxmlformats.org/markup-compatibility/2006" xmlns:r="http://schemas.openxmlformats.org/officeDocument/2006/relationships" xmlns:w="http://schemas.openxmlformats.org/wordprocessingml/2006/main" xmlns:w14="http://schemas.microsoft.com/office/word/2010/wordml" xmlns:w15="http://schemas.microsoft.com/office/word/2012/wordml" xmlns:w16cex="http://schemas.microsoft.com/office/word/2018/wordml/cex" xmlns:w16cid="http://schemas.microsoft.com/office/word/2016/wordml/cid" xmlns:w16="http://schemas.microsoft.com/office/word/2018/wordml" xmlns:w16du="http://schemas.microsoft.com/office/word/2023/wordml/word16du" xmlns:w16sdtdh="http://schemas.microsoft.com/office/word/2020/wordml/sdtdatahash" xmlns:w16sdtfl="http://schemas.microsoft.com/office/word/2024/wordml/sdtformatlock" xmlns:w16se="http://schemas.microsoft.com/office/word/2015/wordml/symex" mc:Ignorable="w14 w15 w16se w16cid w16 w16cex w16sdtdh w16sdtfl w16du">
   <w:docDefaults>
     <w:rPrDefault>
       <w:rPr>
@@ -42235,7 +42203,7 @@
     <w:uiPriority w:val="9"/>
     <w:unhideWhenUsed/>
     <w:qFormat/>
-    <w:rsid w:val="003F34D9"/>
+    <w:rsid w:val="005D5616"/>
     <w:pPr>
       <w:keepNext/>
       <w:keepLines/>
@@ -42249,8 +42217,7 @@
     <w:rPr>
       <w:rFonts w:eastAsia="Times New Roman" w:cstheme="majorBidi"/>
       <w:b/>
-      <w:sz w:val="32"/>
-      <w:szCs w:val="32"/>
+      <w:szCs w:val="28"/>
       <w:lang w:eastAsia="ru-RU"/>
     </w:rPr>
   </w:style>
@@ -42639,12 +42606,12 @@
     <w:basedOn w:val="a0"/>
     <w:link w:val="2"/>
     <w:uiPriority w:val="9"/>
-    <w:rsid w:val="003F34D9"/>
+    <w:rsid w:val="005D5616"/>
     <w:rPr>
       <w:rFonts w:ascii="Times New Roman" w:eastAsia="Times New Roman" w:hAnsi="Times New Roman" w:cstheme="majorBidi"/>
       <w:b/>
-      <w:sz w:val="32"/>
-      <w:szCs w:val="32"/>
+      <w:sz w:val="28"/>
+      <w:szCs w:val="28"/>
       <w:lang w:eastAsia="ru-RU"/>
     </w:rPr>
   </w:style>
@@ -42781,11 +42748,12 @@
     <w:autoRedefine/>
     <w:uiPriority w:val="10"/>
     <w:qFormat/>
-    <w:rsid w:val="0002280F"/>
+    <w:rsid w:val="005D5616"/>
     <w:pPr>
       <w:tabs>
         <w:tab w:val="clear" w:pos="993"/>
       </w:tabs>
+      <w:ind w:firstLine="709"/>
       <w:contextualSpacing/>
       <w:jc w:val="both"/>
     </w:pPr>
@@ -42800,7 +42768,7 @@
     <w:basedOn w:val="a0"/>
     <w:link w:val="af"/>
     <w:uiPriority w:val="10"/>
-    <w:rsid w:val="0002280F"/>
+    <w:rsid w:val="005D5616"/>
     <w:rPr>
       <w:rFonts w:ascii="Times New Roman" w:eastAsiaTheme="majorEastAsia" w:hAnsi="Times New Roman" w:cstheme="majorBidi"/>
       <w:b/>
@@ -43619,6 +43587,40 @@
       <w:bCs/>
     </w:rPr>
   </w:style>
+  <w:style w:type="paragraph" w:customStyle="1" w:styleId="afe">
+    <w:name w:val="Заголовок содержание"/>
+    <w:basedOn w:val="a"/>
+    <w:link w:val="aff"/>
+    <w:qFormat/>
+    <w:rsid w:val="005D5616"/>
+    <w:pPr>
+      <w:tabs>
+        <w:tab w:val="left" w:pos="142"/>
+      </w:tabs>
+      <w:spacing w:before="240" w:after="360" w:line="480" w:lineRule="auto"/>
+      <w:ind w:firstLine="0"/>
+      <w:jc w:val="center"/>
+    </w:pPr>
+    <w:rPr>
+      <w:b/>
+      <w:bCs/>
+      <w:sz w:val="32"/>
+      <w:szCs w:val="32"/>
+    </w:rPr>
+  </w:style>
+  <w:style w:type="character" w:customStyle="1" w:styleId="aff">
+    <w:name w:val="Заголовок содержание Знак"/>
+    <w:basedOn w:val="a0"/>
+    <w:link w:val="afe"/>
+    <w:rsid w:val="005D5616"/>
+    <w:rPr>
+      <w:rFonts w:ascii="Times New Roman" w:hAnsi="Times New Roman"/>
+      <w:b/>
+      <w:bCs/>
+      <w:sz w:val="32"/>
+      <w:szCs w:val="32"/>
+    </w:rPr>
+  </w:style>
 </w:styles>
 </file>
 

</xml_diff>

<commit_message>
adding pochti ful gerber
</commit_message>
<xml_diff>
--- a/Диплом мешков 23.106.docx
+++ b/Диплом мешков 23.106.docx
@@ -631,83 +631,56 @@
         <w:rPr>
           <w:rFonts w:eastAsia="Times New Roman"/>
           <w:szCs w:val="28"/>
-          <w:lang w:eastAsia="ru-RU"/>
-        </w:rPr>
-      </w:pPr>
-    </w:p>
-    <w:p>
-      <w:pPr>
-        <w:tabs>
-          <w:tab w:val="left" w:pos="142"/>
-        </w:tabs>
-        <w:spacing w:line="240" w:lineRule="auto"/>
-        <w:ind w:right="227" w:firstLine="0"/>
+          <w:lang w:val="en-US" w:eastAsia="ru-RU"/>
+        </w:rPr>
+      </w:pPr>
+    </w:p>
+    <w:p>
+      <w:pPr>
+        <w:spacing w:before="240" w:after="360" w:line="240" w:lineRule="auto"/>
+        <w:ind w:left="709" w:firstLine="0"/>
+        <w:jc w:val="center"/>
         <w:rPr>
           <w:rFonts w:eastAsia="Times New Roman"/>
           <w:szCs w:val="28"/>
           <w:lang w:eastAsia="ru-RU"/>
         </w:rPr>
       </w:pPr>
-    </w:p>
-    <w:p>
-      <w:pPr>
-        <w:widowControl w:val="0"/>
-        <w:tabs>
-          <w:tab w:val="left" w:pos="142"/>
-        </w:tabs>
-        <w:spacing w:line="240" w:lineRule="auto"/>
-        <w:ind w:left="284" w:right="284" w:firstLine="0"/>
-        <w:jc w:val="center"/>
+      <w:r>
         <w:rPr>
           <w:rFonts w:eastAsia="Times New Roman"/>
           <w:szCs w:val="28"/>
           <w:lang w:eastAsia="ru-RU"/>
         </w:rPr>
-        <w:sectPr>
-          <w:headerReference w:type="default" r:id="rId8"/>
-          <w:headerReference w:type="first" r:id="rId9"/>
-          <w:pgSz w:w="11906" w:h="16838"/>
-          <w:pgMar w:top="567" w:right="567" w:bottom="851" w:left="1418" w:header="284" w:footer="284" w:gutter="0"/>
-          <w:cols w:space="708"/>
-          <w:titlePg/>
-          <w:docGrid w:linePitch="381"/>
-        </w:sectPr>
-      </w:pPr>
+        <w:t>20</w:t>
+      </w:r>
       <w:r>
         <w:rPr>
           <w:rFonts w:eastAsia="Times New Roman"/>
           <w:szCs w:val="28"/>
           <w:lang w:eastAsia="ru-RU"/>
         </w:rPr>
-        <w:t>20</w:t>
-      </w:r>
+        <w:t>2</w:t>
+      </w:r>
+      <w:bookmarkStart w:id="0" w:name="_Hlk26350142"/>
       <w:r>
         <w:rPr>
           <w:rFonts w:eastAsia="Times New Roman"/>
           <w:szCs w:val="28"/>
           <w:lang w:eastAsia="ru-RU"/>
         </w:rPr>
-        <w:t>2</w:t>
-      </w:r>
-      <w:bookmarkStart w:id="0" w:name="_Hlk26350142"/>
+        <w:t>6</w:t>
+      </w:r>
+      <w:bookmarkEnd w:id="0"/>
       <w:r>
         <w:rPr>
           <w:rFonts w:eastAsia="Times New Roman"/>
           <w:szCs w:val="28"/>
           <w:lang w:eastAsia="ru-RU"/>
         </w:rPr>
-        <w:t>6</w:t>
-      </w:r>
-      <w:r>
-        <w:rPr>
-          <w:rFonts w:eastAsia="Times New Roman"/>
-          <w:szCs w:val="28"/>
-          <w:lang w:eastAsia="ru-RU"/>
-        </w:rPr>
         <w:br w:type="page"/>
       </w:r>
     </w:p>
-    <w:bookmarkEnd w:id="0" w:displacedByCustomXml="next"/>
     <w:sdt>
       <w:sdtPr>
         <w:id w:val="1425534652"/>
@@ -725,8 +698,12 @@
       <w:sdtContent>
         <w:p>
           <w:pPr>
+            <w:widowControl w:val="0"/>
+            <w:tabs>
+              <w:tab w:val="left" w:pos="142"/>
+            </w:tabs>
             <w:spacing w:before="240" w:after="360" w:line="240" w:lineRule="auto"/>
-            <w:ind w:left="709" w:firstLine="0"/>
+            <w:ind w:left="284" w:right="284" w:firstLine="0"/>
             <w:jc w:val="center"/>
             <w:rPr>
               <w:b/>
@@ -2160,6 +2137,8 @@
         </w:tabs>
         <w:ind w:right="283"/>
         <w:sectPr>
+          <w:headerReference w:type="default" r:id="rId8"/>
+          <w:headerReference w:type="first" r:id="rId9"/>
           <w:pgSz w:w="11906" w:h="16838"/>
           <w:pgMar w:top="567" w:right="567" w:bottom="851" w:left="1418" w:header="284" w:footer="284" w:gutter="0"/>
           <w:cols w:space="708"/>
@@ -6449,6 +6428,9 @@
       <w:r>
         <w:t xml:space="preserve"> принадлежавших одному списку задач</w:t>
       </w:r>
+      <w:r>
+        <w:t>.</w:t>
+      </w:r>
     </w:p>
     <w:p>
       <w:pPr>
@@ -10293,7 +10275,7 @@
           <w:lang w:eastAsia="ru-RU"/>
         </w:rPr>
         <w:drawing>
-          <wp:inline distT="0" distB="0" distL="0" distR="0" wp14:anchorId="5BC66B00" wp14:editId="3D53799B">
+          <wp:inline distT="0" distB="0" distL="0" distR="0" wp14:anchorId="5BC66B00" wp14:editId="646F0CC6">
             <wp:extent cx="3999561" cy="2557149"/>
             <wp:effectExtent l="0" t="0" r="1270" b="0"/>
             <wp:docPr id="30" name="Рисунок 30"/>
@@ -10623,7 +10605,7 @@
           <w:lang w:eastAsia="ru-RU"/>
         </w:rPr>
         <w:drawing>
-          <wp:inline distT="0" distB="0" distL="0" distR="0" wp14:anchorId="17FF21C9" wp14:editId="6134B011">
+          <wp:inline distT="0" distB="0" distL="0" distR="0" wp14:anchorId="17FF21C9" wp14:editId="66123B05">
             <wp:extent cx="3040100" cy="1808519"/>
             <wp:effectExtent l="0" t="0" r="8255" b="1270"/>
             <wp:docPr id="162236297" name="Рисунок 162236297"/>
@@ -11210,7 +11192,7 @@
         </w:rPr>
         <w:lastRenderedPageBreak/>
         <w:drawing>
-          <wp:inline distT="0" distB="0" distL="0" distR="0" wp14:anchorId="1B33B3FE" wp14:editId="56B7B8AD">
+          <wp:inline distT="0" distB="0" distL="0" distR="0" wp14:anchorId="1B33B3FE" wp14:editId="4B57101E">
             <wp:extent cx="4024338" cy="2684679"/>
             <wp:effectExtent l="0" t="0" r="0" b="1905"/>
             <wp:docPr id="162236302" name="Рисунок 162236302"/>
@@ -12160,7 +12142,7 @@
           <w:rFonts w:ascii="Times New Roman" w:hAnsi="Times New Roman"/>
           <w:color w:val="000000" w:themeColor="text1"/>
         </w:rPr>
-        <w:t>.</w:t>
+        <w:t>;</w:t>
       </w:r>
     </w:p>
     <w:p>
@@ -12222,7 +12204,14 @@
           <w:rFonts w:ascii="Times New Roman" w:hAnsi="Times New Roman"/>
           <w:color w:val="000000" w:themeColor="text1"/>
         </w:rPr>
-        <w:t xml:space="preserve">Элемент находится в нижней части рабочей зоны активного чата и служит для ручного ввода подробного описания требуемой цели, </w:t>
+        <w:t>Элемент находится в нижней части рабочей зоны активного чата и служит для ручного ввода подробного описания требуемой цели</w:t>
+      </w:r>
+      <w:r>
+        <w:rPr>
+          <w:rFonts w:ascii="Times New Roman" w:hAnsi="Times New Roman"/>
+          <w:color w:val="000000" w:themeColor="text1"/>
+        </w:rPr>
+        <w:t>;</w:t>
       </w:r>
     </w:p>
     <w:p>
@@ -13415,7 +13404,7 @@
           <w:noProof/>
         </w:rPr>
         <w:drawing>
-          <wp:inline distT="0" distB="0" distL="0" distR="0" wp14:anchorId="7A96717B" wp14:editId="2FD9EF22">
+          <wp:inline distT="0" distB="0" distL="0" distR="0" wp14:anchorId="7A96717B" wp14:editId="7E1D767A">
             <wp:extent cx="2744080" cy="3967701"/>
             <wp:effectExtent l="0" t="0" r="0" b="0"/>
             <wp:docPr id="162236304" name="Рисунок 162236304"/>
@@ -13538,7 +13527,7 @@
           <w:noProof/>
         </w:rPr>
         <w:drawing>
-          <wp:inline distT="0" distB="0" distL="0" distR="0" wp14:anchorId="271BF709" wp14:editId="041189A3">
+          <wp:inline distT="0" distB="0" distL="0" distR="0" wp14:anchorId="271BF709" wp14:editId="6522AB96">
             <wp:extent cx="3401808" cy="5104738"/>
             <wp:effectExtent l="0" t="0" r="8255" b="1270"/>
             <wp:docPr id="162236305" name="Рисунок 162236305"/>
@@ -13645,7 +13634,7 @@
         </w:rPr>
         <w:lastRenderedPageBreak/>
         <w:drawing>
-          <wp:inline distT="0" distB="0" distL="0" distR="0" wp14:anchorId="7D280920" wp14:editId="2729A7A7">
+          <wp:inline distT="0" distB="0" distL="0" distR="0" wp14:anchorId="7D280920" wp14:editId="408FBBC1">
             <wp:extent cx="3169148" cy="4118775"/>
             <wp:effectExtent l="0" t="0" r="0" b="0"/>
             <wp:docPr id="162236306" name="Рисунок 162236306"/>
@@ -13776,7 +13765,7 @@
         </w:rPr>
         <w:lastRenderedPageBreak/>
         <w:drawing>
-          <wp:inline distT="0" distB="0" distL="0" distR="0" wp14:anchorId="28B52A8D" wp14:editId="52D0967A">
+          <wp:inline distT="0" distB="0" distL="0" distR="0" wp14:anchorId="28B52A8D" wp14:editId="1D542803">
             <wp:extent cx="3093444" cy="4699572"/>
             <wp:effectExtent l="0" t="0" r="0" b="6350"/>
             <wp:docPr id="162236307" name="Рисунок 162236307"/>
@@ -32732,16 +32721,16 @@
       <mc:AlternateContent>
         <mc:Choice Requires="wpg">
           <w:drawing>
-            <wp:anchor distT="0" distB="0" distL="114300" distR="114300" simplePos="0" relativeHeight="251657728" behindDoc="0" locked="0" layoutInCell="0" allowOverlap="1" wp14:anchorId="3FF8DA0B" wp14:editId="6A48EF63">
+            <wp:anchor distT="0" distB="0" distL="114300" distR="114300" simplePos="0" relativeHeight="251657728" behindDoc="0" locked="0" layoutInCell="0" allowOverlap="1" wp14:anchorId="3FF8DA0B" wp14:editId="2782B84E">
               <wp:simplePos x="0" y="0"/>
               <wp:positionH relativeFrom="page">
-                <wp:posOffset>720090</wp:posOffset>
+                <wp:posOffset>723900</wp:posOffset>
               </wp:positionH>
               <wp:positionV relativeFrom="page">
-                <wp:posOffset>261620</wp:posOffset>
+                <wp:posOffset>123825</wp:posOffset>
               </wp:positionV>
               <wp:extent cx="6590030" cy="10208895"/>
-              <wp:effectExtent l="19050" t="19050" r="1270" b="1905"/>
+              <wp:effectExtent l="19050" t="0" r="20320" b="20955"/>
               <wp:wrapNone/>
               <wp:docPr id="1265998343" name="Группа 21"/>
               <wp:cNvGraphicFramePr>
@@ -32768,7 +32757,7 @@
                       </wps:cNvSpPr>
                       <wps:spPr bwMode="auto">
                         <a:xfrm>
-                          <a:off x="1137" y="14173"/>
+                          <a:off x="1137" y="14143"/>
                           <a:ext cx="10375" cy="2268"/>
                         </a:xfrm>
                         <a:prstGeom prst="rect">
@@ -33146,21 +33135,12 @@
                                       <w:sz w:val="17"/>
                                     </w:rPr>
                                   </w:pPr>
-                                  <w:proofErr w:type="spellStart"/>
                                   <w:r>
                                     <w:rPr>
                                       <w:rFonts w:ascii="Times New Roman" w:hAnsi="Times New Roman" w:cs="Times New Roman"/>
                                       <w:sz w:val="17"/>
                                     </w:rPr>
-                                    <w:t>Изм</w:t>
-                                  </w:r>
-                                  <w:proofErr w:type="spellEnd"/>
-                                  <w:r>
-                                    <w:rPr>
-                                      <w:rFonts w:ascii="Times New Roman" w:hAnsi="Times New Roman" w:cs="Times New Roman"/>
-                                      <w:sz w:val="17"/>
-                                    </w:rPr>
-                                    <w:t>.</w:t>
+                                    <w:t>Изм.</w:t>
                                   </w:r>
                                 </w:p>
                               </w:tc>
@@ -33218,17 +33198,8 @@
                                       <w:rFonts w:ascii="Times New Roman" w:hAnsi="Times New Roman" w:cs="Times New Roman"/>
                                       <w:sz w:val="17"/>
                                     </w:rPr>
-                                    <w:t xml:space="preserve">№ </w:t>
+                                    <w:t>№ докум</w:t>
                                   </w:r>
-                                  <w:proofErr w:type="spellStart"/>
-                                  <w:r>
-                                    <w:rPr>
-                                      <w:rFonts w:ascii="Times New Roman" w:hAnsi="Times New Roman" w:cs="Times New Roman"/>
-                                      <w:sz w:val="17"/>
-                                    </w:rPr>
-                                    <w:t>докум</w:t>
-                                  </w:r>
-                                  <w:proofErr w:type="spellEnd"/>
                                 </w:p>
                               </w:tc>
                               <w:tc>
@@ -33251,7 +33222,6 @@
                                       <w:sz w:val="17"/>
                                     </w:rPr>
                                   </w:pPr>
-                                  <w:proofErr w:type="spellStart"/>
                                   <w:r>
                                     <w:rPr>
                                       <w:rFonts w:ascii="Times New Roman" w:hAnsi="Times New Roman" w:cs="Times New Roman"/>
@@ -33259,7 +33229,6 @@
                                     </w:rPr>
                                     <w:t>Подпись</w:t>
                                   </w:r>
-                                  <w:proofErr w:type="spellEnd"/>
                                 </w:p>
                               </w:tc>
                               <w:tc>
@@ -33339,7 +33308,6 @@
                                       <w:sz w:val="17"/>
                                     </w:rPr>
                                   </w:pPr>
-                                  <w:proofErr w:type="spellStart"/>
                                   <w:r>
                                     <w:rPr>
                                       <w:rFonts w:ascii="Times New Roman" w:hAnsi="Times New Roman" w:cs="Times New Roman"/>
@@ -33347,7 +33315,6 @@
                                     </w:rPr>
                                     <w:t>Разраб</w:t>
                                   </w:r>
-                                  <w:proofErr w:type="spellEnd"/>
                                 </w:p>
                               </w:tc>
                               <w:tc>
@@ -33498,7 +33465,6 @@
                                       <w:lang w:val="ru-RU"/>
                                     </w:rPr>
                                   </w:pPr>
-                                  <w:proofErr w:type="spellStart"/>
                                   <w:r>
                                     <w:rPr>
                                       <w:rFonts w:ascii="Times New Roman" w:hAnsi="Times New Roman" w:cs="Times New Roman"/>
@@ -33506,7 +33472,6 @@
                                     </w:rPr>
                                     <w:t>Лит</w:t>
                                   </w:r>
-                                  <w:proofErr w:type="spellEnd"/>
                                   <w:r>
                                     <w:rPr>
                                       <w:rFonts w:ascii="Times New Roman" w:hAnsi="Times New Roman" w:cs="Times New Roman"/>
@@ -34227,7 +34192,6 @@
                                       <w:lang w:val="ru-RU"/>
                                     </w:rPr>
                                   </w:pPr>
-                                  <w:proofErr w:type="spellStart"/>
                                   <w:r>
                                     <w:rPr>
                                       <w:rFonts w:ascii="Times New Roman" w:hAnsi="Times New Roman" w:cs="Times New Roman"/>
@@ -34235,7 +34199,6 @@
                                     </w:rPr>
                                     <w:t>Ут</w:t>
                                   </w:r>
-                                  <w:proofErr w:type="spellEnd"/>
                                   <w:r>
                                     <w:rPr>
                                       <w:rFonts w:ascii="Times New Roman" w:hAnsi="Times New Roman" w:cs="Times New Roman"/>
@@ -34489,7 +34452,7 @@
                       </wps:cNvCnPr>
                       <wps:spPr bwMode="auto">
                         <a:xfrm>
-                          <a:off x="1134" y="397"/>
+                          <a:off x="1134" y="425"/>
                           <a:ext cx="10375" cy="0"/>
                         </a:xfrm>
                         <a:prstGeom prst="line">
@@ -34521,12 +34484,12 @@
         </mc:Choice>
         <mc:Fallback>
           <w:pict>
-            <v:group w14:anchorId="3FF8DA0B" id="Группа 21" o:spid="_x0000_s1026" style="position:absolute;left:0;text-align:left;margin-left:56.7pt;margin-top:20.6pt;width:518.9pt;height:803.85pt;z-index:251657728;mso-position-horizontal-relative:page;mso-position-vertical-relative:page" coordorigin="1134,397" coordsize="10378,16044" o:gfxdata="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" o:allowincell="f">
+            <v:group w14:anchorId="3FF8DA0B" id="Группа 21" o:spid="_x0000_s1026" style="position:absolute;left:0;text-align:left;margin-left:57pt;margin-top:9.75pt;width:518.9pt;height:803.85pt;z-index:251657728;mso-position-horizontal-relative:page;mso-position-vertical-relative:page" coordorigin="1134,397" coordsize="10378,16044" o:gfxdata="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" o:allowincell="f">
               <v:shapetype id="_x0000_t202" coordsize="21600,21600" o:spt="202" path="m,l,21600r21600,l21600,xe">
                 <v:stroke joinstyle="miter"/>
                 <v:path gradientshapeok="t" o:connecttype="rect"/>
               </v:shapetype>
-              <v:shape id="Text Box 13" o:spid="_x0000_s1027" type="#_x0000_t202" style="position:absolute;left:1137;top:14173;width:10375;height:2268;visibility:visible;mso-wrap-style:square;v-text-anchor:top" o:gfxdata="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" filled="f" stroked="f">
+              <v:shape id="Text Box 13" o:spid="_x0000_s1027" type="#_x0000_t202" style="position:absolute;left:1137;top:14143;width:10375;height:2268;visibility:visible;mso-wrap-style:square;v-text-anchor:top" o:gfxdata="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" filled="f" stroked="f">
                 <v:textbox inset="0,0,0,0">
                   <w:txbxContent>
                     <w:tbl>
@@ -34894,21 +34857,12 @@
                                 <w:sz w:val="17"/>
                               </w:rPr>
                             </w:pPr>
-                            <w:proofErr w:type="spellStart"/>
                             <w:r>
                               <w:rPr>
                                 <w:rFonts w:ascii="Times New Roman" w:hAnsi="Times New Roman" w:cs="Times New Roman"/>
                                 <w:sz w:val="17"/>
                               </w:rPr>
-                              <w:t>Изм</w:t>
-                            </w:r>
-                            <w:proofErr w:type="spellEnd"/>
-                            <w:r>
-                              <w:rPr>
-                                <w:rFonts w:ascii="Times New Roman" w:hAnsi="Times New Roman" w:cs="Times New Roman"/>
-                                <w:sz w:val="17"/>
-                              </w:rPr>
-                              <w:t>.</w:t>
+                              <w:t>Изм.</w:t>
                             </w:r>
                           </w:p>
                         </w:tc>
@@ -34966,17 +34920,8 @@
                                 <w:rFonts w:ascii="Times New Roman" w:hAnsi="Times New Roman" w:cs="Times New Roman"/>
                                 <w:sz w:val="17"/>
                               </w:rPr>
-                              <w:t xml:space="preserve">№ </w:t>
+                              <w:t>№ докум</w:t>
                             </w:r>
-                            <w:proofErr w:type="spellStart"/>
-                            <w:r>
-                              <w:rPr>
-                                <w:rFonts w:ascii="Times New Roman" w:hAnsi="Times New Roman" w:cs="Times New Roman"/>
-                                <w:sz w:val="17"/>
-                              </w:rPr>
-                              <w:t>докум</w:t>
-                            </w:r>
-                            <w:proofErr w:type="spellEnd"/>
                           </w:p>
                         </w:tc>
                         <w:tc>
@@ -34999,7 +34944,6 @@
                                 <w:sz w:val="17"/>
                               </w:rPr>
                             </w:pPr>
-                            <w:proofErr w:type="spellStart"/>
                             <w:r>
                               <w:rPr>
                                 <w:rFonts w:ascii="Times New Roman" w:hAnsi="Times New Roman" w:cs="Times New Roman"/>
@@ -35007,7 +34951,6 @@
                               </w:rPr>
                               <w:t>Подпись</w:t>
                             </w:r>
-                            <w:proofErr w:type="spellEnd"/>
                           </w:p>
                         </w:tc>
                         <w:tc>
@@ -35087,7 +35030,6 @@
                                 <w:sz w:val="17"/>
                               </w:rPr>
                             </w:pPr>
-                            <w:proofErr w:type="spellStart"/>
                             <w:r>
                               <w:rPr>
                                 <w:rFonts w:ascii="Times New Roman" w:hAnsi="Times New Roman" w:cs="Times New Roman"/>
@@ -35095,7 +35037,6 @@
                               </w:rPr>
                               <w:t>Разраб</w:t>
                             </w:r>
-                            <w:proofErr w:type="spellEnd"/>
                           </w:p>
                         </w:tc>
                         <w:tc>
@@ -35246,7 +35187,6 @@
                                 <w:lang w:val="ru-RU"/>
                               </w:rPr>
                             </w:pPr>
-                            <w:proofErr w:type="spellStart"/>
                             <w:r>
                               <w:rPr>
                                 <w:rFonts w:ascii="Times New Roman" w:hAnsi="Times New Roman" w:cs="Times New Roman"/>
@@ -35254,7 +35194,6 @@
                               </w:rPr>
                               <w:t>Лит</w:t>
                             </w:r>
-                            <w:proofErr w:type="spellEnd"/>
                             <w:r>
                               <w:rPr>
                                 <w:rFonts w:ascii="Times New Roman" w:hAnsi="Times New Roman" w:cs="Times New Roman"/>
@@ -35975,7 +35914,6 @@
                                 <w:lang w:val="ru-RU"/>
                               </w:rPr>
                             </w:pPr>
-                            <w:proofErr w:type="spellStart"/>
                             <w:r>
                               <w:rPr>
                                 <w:rFonts w:ascii="Times New Roman" w:hAnsi="Times New Roman" w:cs="Times New Roman"/>
@@ -35983,7 +35921,6 @@
                               </w:rPr>
                               <w:t>Ут</w:t>
                             </w:r>
-                            <w:proofErr w:type="spellEnd"/>
                             <w:r>
                               <w:rPr>
                                 <w:rFonts w:ascii="Times New Roman" w:hAnsi="Times New Roman" w:cs="Times New Roman"/>
@@ -36131,7 +36068,7 @@
               <v:line id="Line 15" o:spid="_x0000_s1029" style="position:absolute;visibility:visible;mso-wrap-style:square" from="11509,397" to="11509,16441" o:connectortype="straight" o:gfxdata="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" strokeweight="2.25pt"/>
               <v:line id="Line 16" o:spid="_x0000_s1030" style="position:absolute;visibility:visible;mso-wrap-style:square" from="1137,16441" to="11512,16441" o:connectortype="straight" o:gfxdata="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" strokeweight="2.25pt"/>
               <v:line id="Line 17" o:spid="_x0000_s1031" style="position:absolute;visibility:visible;mso-wrap-style:square" from="1137,14173" to="11512,14173" o:connectortype="straight" o:gfxdata="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" strokeweight="2.25pt"/>
-              <v:line id="Line 18" o:spid="_x0000_s1032" style="position:absolute;visibility:visible;mso-wrap-style:square" from="1134,397" to="11509,397" o:connectortype="straight" o:gfxdata="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" strokeweight="2.25pt"/>
+              <v:line id="Line 18" o:spid="_x0000_s1032" style="position:absolute;visibility:visible;mso-wrap-style:square" from="1134,425" to="11509,425" o:connectortype="straight" o:gfxdata="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" strokeweight="2.25pt"/>
               <w10:wrap anchorx="page" anchory="page"/>
             </v:group>
           </w:pict>
@@ -36156,16 +36093,16 @@
       <mc:AlternateContent>
         <mc:Choice Requires="wpg">
           <w:drawing>
-            <wp:anchor distT="0" distB="0" distL="114300" distR="114300" simplePos="0" relativeHeight="251656704" behindDoc="0" locked="0" layoutInCell="0" allowOverlap="1" wp14:anchorId="48D1B728" wp14:editId="21D8B48B">
+            <wp:anchor distT="0" distB="0" distL="114300" distR="114300" simplePos="0" relativeHeight="251656704" behindDoc="0" locked="0" layoutInCell="0" allowOverlap="1" wp14:anchorId="48D1B728" wp14:editId="5E170B2A">
               <wp:simplePos x="0" y="0"/>
               <wp:positionH relativeFrom="page">
                 <wp:posOffset>721995</wp:posOffset>
               </wp:positionH>
               <wp:positionV relativeFrom="page">
-                <wp:posOffset>231775</wp:posOffset>
+                <wp:posOffset>182245</wp:posOffset>
               </wp:positionV>
               <wp:extent cx="6590030" cy="10208895"/>
-              <wp:effectExtent l="19050" t="19050" r="1270" b="1905"/>
+              <wp:effectExtent l="19050" t="19050" r="20320" b="20955"/>
               <wp:wrapNone/>
               <wp:docPr id="14" name="Группа 13"/>
               <wp:cNvGraphicFramePr>
@@ -36299,7 +36236,7 @@
         </mc:Choice>
         <mc:Fallback>
           <w:pict>
-            <v:group w14:anchorId="2ED3E864" id="Группа 13" o:spid="_x0000_s1026" style="position:absolute;margin-left:56.85pt;margin-top:18.25pt;width:518.9pt;height:803.85pt;z-index:251656704;mso-position-horizontal-relative:page;mso-position-vertical-relative:page" coordorigin="1134,397" coordsize="10378,16044" o:gfxdata="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" o:allowincell="f">
+            <v:group w14:anchorId="63112440" id="Группа 13" o:spid="_x0000_s1026" style="position:absolute;margin-left:56.85pt;margin-top:14.35pt;width:518.9pt;height:803.85pt;z-index:251656704;mso-position-horizontal-relative:page;mso-position-vertical-relative:page" coordorigin="1134,397" coordsize="10378,16044" o:gfxdata="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" o:allowincell="f">
               <v:line id="Line 4" o:spid="_x0000_s1027" style="position:absolute;visibility:visible;mso-wrap-style:square" from="1134,397" to="1134,16441" o:connectortype="straight" o:gfxdata="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" strokeweight="2.25pt"/>
               <v:line id="Line 5" o:spid="_x0000_s1028" style="position:absolute;visibility:visible;mso-wrap-style:square" from="11509,397" to="11509,16441" o:connectortype="straight" o:gfxdata="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" strokeweight="2.25pt"/>
               <v:line id="Line 6" o:spid="_x0000_s1029" style="position:absolute;visibility:visible;mso-wrap-style:square" from="1137,16441" to="11512,16441" o:connectortype="straight" o:gfxdata="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" strokeweight="2.25pt"/>
@@ -36329,16 +36266,16 @@
       <mc:AlternateContent>
         <mc:Choice Requires="wpg">
           <w:drawing>
-            <wp:anchor distT="0" distB="0" distL="114300" distR="114300" simplePos="0" relativeHeight="251660800" behindDoc="0" locked="0" layoutInCell="0" allowOverlap="1" wp14:anchorId="306C473C" wp14:editId="756B6BB9">
+            <wp:anchor distT="0" distB="0" distL="114300" distR="114300" simplePos="0" relativeHeight="251660800" behindDoc="0" locked="0" layoutInCell="0" allowOverlap="1" wp14:anchorId="306C473C" wp14:editId="52628384">
               <wp:simplePos x="0" y="0"/>
               <wp:positionH relativeFrom="page">
-                <wp:posOffset>739140</wp:posOffset>
+                <wp:posOffset>736600</wp:posOffset>
               </wp:positionH>
               <wp:positionV relativeFrom="page">
-                <wp:posOffset>290195</wp:posOffset>
+                <wp:posOffset>232121</wp:posOffset>
               </wp:positionV>
               <wp:extent cx="6590030" cy="10187940"/>
-              <wp:effectExtent l="19050" t="19050" r="1270" b="3810"/>
+              <wp:effectExtent l="19050" t="19050" r="20320" b="22860"/>
               <wp:wrapNone/>
               <wp:docPr id="162236290" name="Группа 8"/>
               <wp:cNvGraphicFramePr>
@@ -36490,7 +36427,7 @@
                       </wps:cNvSpPr>
                       <wps:spPr bwMode="auto">
                         <a:xfrm>
-                          <a:off x="1137" y="15591"/>
+                          <a:off x="1137" y="15561"/>
                           <a:ext cx="10375" cy="850"/>
                         </a:xfrm>
                         <a:prstGeom prst="rect">
@@ -36662,7 +36599,6 @@
                                     </w:rPr>
                                     <w:t>НАТК</w:t>
                                   </w:r>
-                                  <w:proofErr w:type="spellStart"/>
                                   <w:r>
                                     <w:rPr>
                                       <w:rFonts w:ascii="Times New Roman" w:hAnsi="Times New Roman" w:cs="Times New Roman"/>
@@ -36673,7 +36609,6 @@
                                     </w:rPr>
                                     <w:t>иГ</w:t>
                                   </w:r>
-                                  <w:proofErr w:type="spellEnd"/>
                                   <w:r>
                                     <w:rPr>
                                       <w:rFonts w:ascii="Times New Roman" w:hAnsi="Times New Roman" w:cs="Times New Roman"/>
@@ -36991,21 +36926,12 @@
                                       <w:sz w:val="17"/>
                                     </w:rPr>
                                   </w:pPr>
-                                  <w:proofErr w:type="spellStart"/>
                                   <w:r>
                                     <w:rPr>
                                       <w:rFonts w:ascii="Times New Roman" w:hAnsi="Times New Roman"/>
                                       <w:sz w:val="17"/>
                                     </w:rPr>
-                                    <w:t>Изм</w:t>
-                                  </w:r>
-                                  <w:proofErr w:type="spellEnd"/>
-                                  <w:r>
-                                    <w:rPr>
-                                      <w:rFonts w:ascii="Times New Roman" w:hAnsi="Times New Roman"/>
-                                      <w:sz w:val="17"/>
-                                    </w:rPr>
-                                    <w:t>.</w:t>
+                                    <w:t>Изм.</w:t>
                                   </w:r>
                                 </w:p>
                               </w:tc>
@@ -37063,17 +36989,8 @@
                                       <w:rFonts w:ascii="Times New Roman" w:hAnsi="Times New Roman"/>
                                       <w:sz w:val="17"/>
                                     </w:rPr>
-                                    <w:t xml:space="preserve">№ </w:t>
+                                    <w:t>№ докум</w:t>
                                   </w:r>
-                                  <w:proofErr w:type="spellStart"/>
-                                  <w:r>
-                                    <w:rPr>
-                                      <w:rFonts w:ascii="Times New Roman" w:hAnsi="Times New Roman"/>
-                                      <w:sz w:val="17"/>
-                                    </w:rPr>
-                                    <w:t>докум</w:t>
-                                  </w:r>
-                                  <w:proofErr w:type="spellEnd"/>
                                 </w:p>
                               </w:tc>
                               <w:tc>
@@ -37096,7 +37013,6 @@
                                       <w:sz w:val="17"/>
                                     </w:rPr>
                                   </w:pPr>
-                                  <w:proofErr w:type="spellStart"/>
                                   <w:r>
                                     <w:rPr>
                                       <w:rFonts w:ascii="Times New Roman" w:hAnsi="Times New Roman"/>
@@ -37104,7 +37020,6 @@
                                     </w:rPr>
                                     <w:t>Подпись</w:t>
                                   </w:r>
-                                  <w:proofErr w:type="spellEnd"/>
                                 </w:p>
                               </w:tc>
                               <w:tc>
@@ -37201,7 +37116,7 @@
         </mc:Choice>
         <mc:Fallback>
           <w:pict>
-            <v:group w14:anchorId="306C473C" id="Группа 8" o:spid="_x0000_s1033" style="position:absolute;left:0;text-align:left;margin-left:58.2pt;margin-top:22.85pt;width:518.9pt;height:802.2pt;z-index:251660800;mso-position-horizontal-relative:page;mso-position-vertical-relative:page" coordorigin="1134,397" coordsize="10378,16044" o:gfxdata="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" o:allowincell="f">
+            <v:group w14:anchorId="306C473C" id="Группа 8" o:spid="_x0000_s1033" style="position:absolute;left:0;text-align:left;margin-left:58pt;margin-top:18.3pt;width:518.9pt;height:802.2pt;z-index:251660800;mso-position-horizontal-relative:page;mso-position-vertical-relative:page" coordorigin="1134,397" coordsize="10378,16044" o:gfxdata="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" o:allowincell="f">
               <v:line id="Line 15" o:spid="_x0000_s1034" style="position:absolute;visibility:visible;mso-wrap-style:square" from="1134,397" to="1134,16441" o:connectortype="straight" o:gfxdata="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" strokeweight="2.25pt"/>
               <v:line id="Line 16" o:spid="_x0000_s1035" style="position:absolute;visibility:visible;mso-wrap-style:square" from="11509,397" to="11509,16441" o:connectortype="straight" o:gfxdata="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" strokeweight="2.25pt"/>
               <v:line id="Line 17" o:spid="_x0000_s1036" style="position:absolute;visibility:visible;mso-wrap-style:square" from="1137,16441" to="11512,16441" o:connectortype="straight" o:gfxdata="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" strokeweight="2.25pt"/>
@@ -37211,7 +37126,7 @@
                 <v:stroke joinstyle="miter"/>
                 <v:path gradientshapeok="t" o:connecttype="rect"/>
               </v:shapetype>
-              <v:shape id="Text Box 20" o:spid="_x0000_s1039" type="#_x0000_t202" style="position:absolute;left:1137;top:15591;width:10375;height:850;visibility:visible;mso-wrap-style:square;v-text-anchor:top" o:gfxdata="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" filled="f" stroked="f">
+              <v:shape id="Text Box 20" o:spid="_x0000_s1039" type="#_x0000_t202" style="position:absolute;left:1137;top:15561;width:10375;height:850;visibility:visible;mso-wrap-style:square;v-text-anchor:top" o:gfxdata="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" filled="f" stroked="f">
                 <v:textbox inset="0,0,0,0">
                   <w:txbxContent>
                     <w:tbl>
@@ -37373,7 +37288,6 @@
                               </w:rPr>
                               <w:t>НАТК</w:t>
                             </w:r>
-                            <w:proofErr w:type="spellStart"/>
                             <w:r>
                               <w:rPr>
                                 <w:rFonts w:ascii="Times New Roman" w:hAnsi="Times New Roman" w:cs="Times New Roman"/>
@@ -37384,7 +37298,6 @@
                               </w:rPr>
                               <w:t>иГ</w:t>
                             </w:r>
-                            <w:proofErr w:type="spellEnd"/>
                             <w:r>
                               <w:rPr>
                                 <w:rFonts w:ascii="Times New Roman" w:hAnsi="Times New Roman" w:cs="Times New Roman"/>
@@ -37702,21 +37615,12 @@
                                 <w:sz w:val="17"/>
                               </w:rPr>
                             </w:pPr>
-                            <w:proofErr w:type="spellStart"/>
                             <w:r>
                               <w:rPr>
                                 <w:rFonts w:ascii="Times New Roman" w:hAnsi="Times New Roman"/>
                                 <w:sz w:val="17"/>
                               </w:rPr>
-                              <w:t>Изм</w:t>
-                            </w:r>
-                            <w:proofErr w:type="spellEnd"/>
-                            <w:r>
-                              <w:rPr>
-                                <w:rFonts w:ascii="Times New Roman" w:hAnsi="Times New Roman"/>
-                                <w:sz w:val="17"/>
-                              </w:rPr>
-                              <w:t>.</w:t>
+                              <w:t>Изм.</w:t>
                             </w:r>
                           </w:p>
                         </w:tc>
@@ -37774,17 +37678,8 @@
                                 <w:rFonts w:ascii="Times New Roman" w:hAnsi="Times New Roman"/>
                                 <w:sz w:val="17"/>
                               </w:rPr>
-                              <w:t xml:space="preserve">№ </w:t>
+                              <w:t>№ докум</w:t>
                             </w:r>
-                            <w:proofErr w:type="spellStart"/>
-                            <w:r>
-                              <w:rPr>
-                                <w:rFonts w:ascii="Times New Roman" w:hAnsi="Times New Roman"/>
-                                <w:sz w:val="17"/>
-                              </w:rPr>
-                              <w:t>докум</w:t>
-                            </w:r>
-                            <w:proofErr w:type="spellEnd"/>
                           </w:p>
                         </w:tc>
                         <w:tc>
@@ -37807,7 +37702,6 @@
                                 <w:sz w:val="17"/>
                               </w:rPr>
                             </w:pPr>
-                            <w:proofErr w:type="spellStart"/>
                             <w:r>
                               <w:rPr>
                                 <w:rFonts w:ascii="Times New Roman" w:hAnsi="Times New Roman"/>
@@ -37815,7 +37709,6 @@
                               </w:rPr>
                               <w:t>Подпись</w:t>
                             </w:r>
-                            <w:proofErr w:type="spellEnd"/>
                           </w:p>
                         </w:tc>
                         <w:tc>

</xml_diff>